<commit_message>
docs: update hero quickstart and config examples
</commit_message>
<xml_diff>
--- a/docs/exports/Crawfish-PRD.docx
+++ b/docs/exports/Crawfish-PRD.docx
@@ -2779,6 +2779,332 @@
           <w:spacing w:val="0"/>
           <w:color w:val="102C4B"/>
         </w:rPr>
+        <w:t xml:space="preserve">Current Alpha Slice</w:t>
+      </w:r>
+    </w:p>
+    <w:p>
+      <w:pPr>
+        <w:spacing w:after="240"/>
+      </w:pPr>
+      <w:r>
+        <w:rPr>
+          <w:rFonts w:ascii="Helvetica Neue" w:hAnsi="Helvetica Neue" w:cs="Helvetica Neue"/>
+          <w:sz w:val="24"/>
+          <w:sz-cs w:val="24"/>
+          <w:spacing w:val="0"/>
+          <w:color w:val="181F26"/>
+        </w:rPr>
+        <w:t xml:space="preserve">The current Rust alpha already covers one runnable Hero P0 slice:</w:t>
+      </w:r>
+    </w:p>
+    <w:p>
+      <w:pPr>
+        <w:ind w:left="720" w:first-line="-720"/>
+      </w:pPr>
+      <w:r>
+        <w:rPr>
+          <w:rFonts w:ascii="Menlo" w:hAnsi="Menlo" w:cs="Menlo"/>
+          <w:sz w:val="24"/>
+          <w:sz-cs w:val="24"/>
+          <w:color w:val="181F26"/>
+        </w:rPr>
+        <w:t xml:space="preserve"/>
+        <w:tab/>
+        <w:t xml:space="preserve">•</w:t>
+        <w:tab/>
+        <w:t xml:space="preserve"/>
+      </w:r>
+      <w:r>
+        <w:rPr>
+          <w:rFonts w:ascii="Menlo" w:hAnsi="Menlo" w:cs="Menlo"/>
+          <w:sz w:val="24"/>
+          <w:sz-cs w:val="24"/>
+          <w:spacing w:val="0"/>
+          <w:color w:val="181F26"/>
+        </w:rPr>
+        <w:t xml:space="preserve">repo.index</w:t>
+      </w:r>
+      <w:r>
+        <w:rPr>
+          <w:rFonts w:ascii="Helvetica Neue" w:hAnsi="Helvetica Neue" w:cs="Helvetica Neue"/>
+          <w:sz w:val="24"/>
+          <w:sz-cs w:val="24"/>
+          <w:spacing w:val="0"/>
+          <w:color w:val="181F26"/>
+        </w:rPr>
+        <w:t xml:space="preserve"> scans a local workspace and emits </w:t>
+      </w:r>
+      <w:r>
+        <w:rPr>
+          <w:rFonts w:ascii="Menlo" w:hAnsi="Menlo" w:cs="Menlo"/>
+          <w:sz w:val="24"/>
+          <w:sz-cs w:val="24"/>
+          <w:spacing w:val="0"/>
+          <w:color w:val="181F26"/>
+        </w:rPr>
+        <w:t xml:space="preserve">repo_index.json</w:t>
+      </w:r>
+      <w:r>
+        <w:rPr>
+          <w:rFonts w:ascii="Helvetica Neue" w:hAnsi="Helvetica Neue" w:cs="Helvetica Neue"/>
+          <w:sz w:val="24"/>
+          <w:sz-cs w:val="24"/>
+          <w:spacing w:val="0"/>
+          <w:color w:val="181F26"/>
+        </w:rPr>
+        <w:t xml:space="preserve">.</w:t>
+      </w:r>
+    </w:p>
+    <w:p>
+      <w:pPr>
+        <w:ind w:left="720" w:first-line="-720"/>
+      </w:pPr>
+      <w:r>
+        <w:rPr>
+          <w:rFonts w:ascii="Menlo" w:hAnsi="Menlo" w:cs="Menlo"/>
+          <w:sz w:val="24"/>
+          <w:sz-cs w:val="24"/>
+          <w:color w:val="181F26"/>
+        </w:rPr>
+        <w:t xml:space="preserve"/>
+        <w:tab/>
+        <w:t xml:space="preserve">•</w:t>
+        <w:tab/>
+        <w:t xml:space="preserve"/>
+      </w:r>
+      <w:r>
+        <w:rPr>
+          <w:rFonts w:ascii="Menlo" w:hAnsi="Menlo" w:cs="Menlo"/>
+          <w:sz w:val="24"/>
+          <w:sz-cs w:val="24"/>
+          <w:spacing w:val="0"/>
+          <w:color w:val="181F26"/>
+        </w:rPr>
+        <w:t xml:space="preserve">repo.review</w:t>
+      </w:r>
+      <w:r>
+        <w:rPr>
+          <w:rFonts w:ascii="Helvetica Neue" w:hAnsi="Helvetica Neue" w:cs="Helvetica Neue"/>
+          <w:sz w:val="24"/>
+          <w:sz-cs w:val="24"/>
+          <w:spacing w:val="0"/>
+          <w:color w:val="181F26"/>
+        </w:rPr>
+        <w:t xml:space="preserve"> runs deterministic review checks and reuses or bootstraps the latest repo index.</w:t>
+      </w:r>
+    </w:p>
+    <w:p>
+      <w:pPr>
+        <w:ind w:left="720" w:first-line="-720"/>
+      </w:pPr>
+      <w:r>
+        <w:rPr>
+          <w:rFonts w:ascii="Menlo" w:hAnsi="Menlo" w:cs="Menlo"/>
+          <w:sz w:val="24"/>
+          <w:sz-cs w:val="24"/>
+          <w:color w:val="181F26"/>
+        </w:rPr>
+        <w:t xml:space="preserve"/>
+        <w:tab/>
+        <w:t xml:space="preserve">•</w:t>
+        <w:tab/>
+        <w:t xml:space="preserve"/>
+      </w:r>
+      <w:r>
+        <w:rPr>
+          <w:rFonts w:ascii="Menlo" w:hAnsi="Menlo" w:cs="Menlo"/>
+          <w:sz w:val="24"/>
+          <w:sz-cs w:val="24"/>
+          <w:spacing w:val="0"/>
+          <w:color w:val="181F26"/>
+        </w:rPr>
+        <w:t xml:space="preserve">ci.triage</w:t>
+      </w:r>
+      <w:r>
+        <w:rPr>
+          <w:rFonts w:ascii="Helvetica Neue" w:hAnsi="Helvetica Neue" w:cs="Helvetica Neue"/>
+          <w:sz w:val="24"/>
+          <w:sz-cs w:val="24"/>
+          <w:spacing w:val="0"/>
+          <w:color w:val="181F26"/>
+        </w:rPr>
+        <w:t xml:space="preserve"> classifies CI failures from direct logs or from an SSE MCP tool route.</w:t>
+      </w:r>
+    </w:p>
+    <w:p>
+      <w:pPr>
+        <w:ind w:left="720" w:first-line="-720"/>
+      </w:pPr>
+      <w:r>
+        <w:rPr>
+          <w:rFonts w:ascii="Menlo" w:hAnsi="Menlo" w:cs="Menlo"/>
+          <w:sz w:val="24"/>
+          <w:sz-cs w:val="24"/>
+          <w:color w:val="181F26"/>
+        </w:rPr>
+        <w:t xml:space="preserve"/>
+        <w:tab/>
+        <w:t xml:space="preserve">•</w:t>
+        <w:tab/>
+        <w:t xml:space="preserve"/>
+      </w:r>
+      <w:r>
+        <w:rPr>
+          <w:rFonts w:ascii="Menlo" w:hAnsi="Menlo" w:cs="Menlo"/>
+          <w:sz w:val="24"/>
+          <w:sz-cs w:val="24"/>
+          <w:spacing w:val="0"/>
+          <w:color w:val="181F26"/>
+        </w:rPr>
+        <w:t xml:space="preserve">inspect</w:t>
+      </w:r>
+      <w:r>
+        <w:rPr>
+          <w:rFonts w:ascii="Helvetica Neue" w:hAnsi="Helvetica Neue" w:cs="Helvetica Neue"/>
+          <w:sz w:val="24"/>
+          <w:sz-cs w:val="24"/>
+          <w:spacing w:val="0"/>
+          <w:color w:val="181F26"/>
+        </w:rPr>
+        <w:t xml:space="preserve"> surfaces artifact refs, checkpoint refs, recovery stage, continuity mode, encounter metadata, and external refs.</w:t>
+      </w:r>
+    </w:p>
+    <w:p>
+      <w:pPr>
+        <w:ind w:left="720" w:first-line="-720"/>
+      </w:pPr>
+      <w:r>
+        <w:rPr>
+          <w:rFonts w:ascii="Helvetica Neue" w:hAnsi="Helvetica Neue" w:cs="Helvetica Neue"/>
+          <w:sz w:val="24"/>
+          <w:sz-cs w:val="24"/>
+          <w:color w:val="181F26"/>
+        </w:rPr>
+        <w:t xml:space="preserve"/>
+        <w:tab/>
+        <w:t xml:space="preserve">•</w:t>
+        <w:tab/>
+        <w:t xml:space="preserve"/>
+      </w:r>
+      <w:r>
+        <w:rPr>
+          <w:rFonts w:ascii="Helvetica Neue" w:hAnsi="Helvetica Neue" w:cs="Helvetica Neue"/>
+          <w:sz w:val="24"/>
+          <w:sz-cs w:val="24"/>
+          <w:spacing w:val="0"/>
+          <w:color w:val="181F26"/>
+        </w:rPr>
+        <w:t xml:space="preserve">restart recovery requeues </w:t>
+      </w:r>
+      <w:r>
+        <w:rPr>
+          <w:rFonts w:ascii="Menlo" w:hAnsi="Menlo" w:cs="Menlo"/>
+          <w:sz w:val="24"/>
+          <w:sz-cs w:val="24"/>
+          <w:spacing w:val="0"/>
+          <w:color w:val="181F26"/>
+        </w:rPr>
+        <w:t xml:space="preserve">running</w:t>
+      </w:r>
+      <w:r>
+        <w:rPr>
+          <w:rFonts w:ascii="Helvetica Neue" w:hAnsi="Helvetica Neue" w:cs="Helvetica Neue"/>
+          <w:sz w:val="24"/>
+          <w:sz-cs w:val="24"/>
+          <w:spacing w:val="0"/>
+          <w:color w:val="181F26"/>
+        </w:rPr>
+        <w:t xml:space="preserve"> actions and resumes deterministic work from checkpoint metadata.</w:t>
+      </w:r>
+    </w:p>
+    <w:p>
+      <w:pPr>
+        <w:spacing w:after="240"/>
+      </w:pPr>
+      <w:r>
+        <w:rPr>
+          <w:rFonts w:ascii="Helvetica Neue" w:hAnsi="Helvetica Neue" w:cs="Helvetica Neue"/>
+          <w:sz w:val="24"/>
+          <w:sz-cs w:val="24"/>
+          <w:spacing w:val="0"/>
+          <w:color w:val="181F26"/>
+        </w:rPr>
+        <w:t xml:space="preserve">The first external tool transport implemented in code is </w:t>
+      </w:r>
+      <w:r>
+        <w:rPr>
+          <w:rFonts w:ascii="Menlo" w:hAnsi="Menlo" w:cs="Menlo"/>
+          <w:sz w:val="24"/>
+          <w:sz-cs w:val="24"/>
+          <w:spacing w:val="0"/>
+          <w:color w:val="181F26"/>
+        </w:rPr>
+        <w:t xml:space="preserve">MCP over SSE</w:t>
+      </w:r>
+      <w:r>
+        <w:rPr>
+          <w:rFonts w:ascii="Helvetica Neue" w:hAnsi="Helvetica Neue" w:cs="Helvetica Neue"/>
+          <w:sz w:val="24"/>
+          <w:sz-cs w:val="24"/>
+          <w:spacing w:val="0"/>
+          <w:color w:val="181F26"/>
+        </w:rPr>
+        <w:t xml:space="preserve">. </w:t>
+      </w:r>
+      <w:r>
+        <w:rPr>
+          <w:rFonts w:ascii="Menlo" w:hAnsi="Menlo" w:cs="Menlo"/>
+          <w:sz w:val="24"/>
+          <w:sz-cs w:val="24"/>
+          <w:spacing w:val="0"/>
+          <w:color w:val="181F26"/>
+        </w:rPr>
+        <w:t xml:space="preserve">repo_reviewer</w:t>
+      </w:r>
+      <w:r>
+        <w:rPr>
+          <w:rFonts w:ascii="Helvetica Neue" w:hAnsi="Helvetica Neue" w:cs="Helvetica Neue"/>
+          <w:sz w:val="24"/>
+          <w:sz-cs w:val="24"/>
+          <w:spacing w:val="0"/>
+          <w:color w:val="181F26"/>
+        </w:rPr>
+        <w:t xml:space="preserve"> remains deterministic-first, while </w:t>
+      </w:r>
+      <w:r>
+        <w:rPr>
+          <w:rFonts w:ascii="Menlo" w:hAnsi="Menlo" w:cs="Menlo"/>
+          <w:sz w:val="24"/>
+          <w:sz-cs w:val="24"/>
+          <w:spacing w:val="0"/>
+          <w:color w:val="181F26"/>
+        </w:rPr>
+        <w:t xml:space="preserve">ci_triage</w:t>
+      </w:r>
+      <w:r>
+        <w:rPr>
+          <w:rFonts w:ascii="Helvetica Neue" w:hAnsi="Helvetica Neue" w:cs="Helvetica Neue"/>
+          <w:sz w:val="24"/>
+          <w:sz-cs w:val="24"/>
+          <w:spacing w:val="0"/>
+          <w:color w:val="181F26"/>
+        </w:rPr>
+        <w:t xml:space="preserve"> can fetch remote log material through MCP and then complete the actual classification locally.</w:t>
+      </w:r>
+    </w:p>
+    <w:p>
+      <w:pPr>
+        <w:spacing w:after="197"/>
+      </w:pPr>
+      <w:r>
+        <w:rPr>
+          <w:rFonts w:ascii="Helvetica Neue" w:hAnsi="Helvetica Neue" w:cs="Helvetica Neue"/>
+          <w:sz w:val="44"/>
+          <w:sz-cs w:val="44"/>
+          <w:b/>
+          <w:spacing w:val="0"/>
+          <w:color w:val="102C4B"/>
+        </w:rPr>
         <w:t xml:space="preserve">Quickstart</w:t>
       </w:r>
     </w:p>
@@ -3147,7 +3473,124 @@
           <w:spacing w:val="0"/>
           <w:color w:val="DFE8F2"/>
         </w:rPr>
-        <w:t xml:space="preserve">  --goal "review pull request"</w:t>
+        <w:t xml:space="preserve">  --goal "review pull request" \</w:t>
+      </w:r>
+    </w:p>
+    <w:p>
+      <w:pPr/>
+      <w:r>
+        <w:rPr>
+          <w:rFonts w:ascii="Menlo" w:hAnsi="Menlo" w:cs="Menlo"/>
+          <w:sz w:val="24"/>
+          <w:sz-cs w:val="24"/>
+          <w:spacing w:val="0"/>
+          <w:color w:val="DFE8F2"/>
+        </w:rPr>
+        <w:t xml:space="preserve">  --inputs-json "{\"workspace_root\":\"$(pwd)\",\"changed_files\":[\"src/lib.rs\"]}" \</w:t>
+      </w:r>
+    </w:p>
+    <w:p>
+      <w:pPr/>
+      <w:r>
+        <w:rPr>
+          <w:rFonts w:ascii="Menlo" w:hAnsi="Menlo" w:cs="Menlo"/>
+          <w:sz w:val="24"/>
+          <w:sz-cs w:val="24"/>
+          <w:spacing w:val="0"/>
+          <w:color w:val="DFE8F2"/>
+        </w:rPr>
+        <w:t xml:space="preserve">  --json</w:t>
+      </w:r>
+    </w:p>
+    <w:p>
+      <w:pPr/>
+      <w:r>
+        <w:rPr>
+          <w:rFonts w:ascii="Menlo" w:hAnsi="Menlo" w:cs="Menlo"/>
+          <w:sz w:val="24"/>
+          <w:sz-cs w:val="24"/>
+          <w:spacing w:val="0"/>
+          <w:color w:val="DFE8F2"/>
+        </w:rPr>
+        <w:t xml:space="preserve">cargo run -p crawfish-cli --bin crawfish -- action submit \</w:t>
+      </w:r>
+    </w:p>
+    <w:p>
+      <w:pPr/>
+      <w:r>
+        <w:rPr>
+          <w:rFonts w:ascii="Menlo" w:hAnsi="Menlo" w:cs="Menlo"/>
+          <w:sz w:val="24"/>
+          <w:sz-cs w:val="24"/>
+          <w:spacing w:val="0"/>
+          <w:color w:val="DFE8F2"/>
+        </w:rPr>
+        <w:t xml:space="preserve">  --target-agent ci_triage \</w:t>
+      </w:r>
+    </w:p>
+    <w:p>
+      <w:pPr/>
+      <w:r>
+        <w:rPr>
+          <w:rFonts w:ascii="Menlo" w:hAnsi="Menlo" w:cs="Menlo"/>
+          <w:sz w:val="24"/>
+          <w:sz-cs w:val="24"/>
+          <w:spacing w:val="0"/>
+          <w:color w:val="DFE8F2"/>
+        </w:rPr>
+        <w:t xml:space="preserve">  --capability ci.triage \</w:t>
+      </w:r>
+    </w:p>
+    <w:p>
+      <w:pPr/>
+      <w:r>
+        <w:rPr>
+          <w:rFonts w:ascii="Menlo" w:hAnsi="Menlo" w:cs="Menlo"/>
+          <w:sz w:val="24"/>
+          <w:sz-cs w:val="24"/>
+          <w:spacing w:val="0"/>
+          <w:color w:val="DFE8F2"/>
+        </w:rPr>
+        <w:t xml:space="preserve">  --goal "triage local logs" \</w:t>
+      </w:r>
+    </w:p>
+    <w:p>
+      <w:pPr/>
+      <w:r>
+        <w:rPr>
+          <w:rFonts w:ascii="Menlo" w:hAnsi="Menlo" w:cs="Menlo"/>
+          <w:sz w:val="24"/>
+          <w:sz-cs w:val="24"/>
+          <w:spacing w:val="0"/>
+          <w:color w:val="DFE8F2"/>
+        </w:rPr>
+        <w:t xml:space="preserve">  --inputs-json "{\"log_text\":\"error: test failed, to rerun pass \`cargo test\`\"}" \</w:t>
+      </w:r>
+    </w:p>
+    <w:p>
+      <w:pPr/>
+      <w:r>
+        <w:rPr>
+          <w:rFonts w:ascii="Menlo" w:hAnsi="Menlo" w:cs="Menlo"/>
+          <w:sz w:val="24"/>
+          <w:sz-cs w:val="24"/>
+          <w:spacing w:val="0"/>
+          <w:color w:val="DFE8F2"/>
+        </w:rPr>
+        <w:t xml:space="preserve">  --json</w:t>
+      </w:r>
+    </w:p>
+    <w:p>
+      <w:pPr/>
+      <w:r>
+        <w:rPr>
+          <w:rFonts w:ascii="Menlo" w:hAnsi="Menlo" w:cs="Menlo"/>
+          <w:sz w:val="24"/>
+          <w:sz-cs w:val="24"/>
+          <w:spacing w:val="0"/>
+          <w:color w:val="DFE8F2"/>
+        </w:rPr>
+        <w:t xml:space="preserve">cargo run -p crawfish-cli --bin crawfish -- inspect &lt;action-id&gt; --json</w:t>
       </w:r>
     </w:p>
     <w:p>
@@ -3161,6 +3604,63 @@
           <w:color w:val="DFE8F2"/>
         </w:rPr>
         <w:t xml:space="preserve">kill $CRAWFISH_PID</w:t>
+      </w:r>
+    </w:p>
+    <w:p>
+      <w:pPr>
+        <w:spacing w:after="240"/>
+      </w:pPr>
+      <w:r>
+        <w:rPr>
+          <w:rFonts w:ascii="Helvetica Neue" w:hAnsi="Helvetica Neue" w:cs="Helvetica Neue"/>
+          <w:sz w:val="24"/>
+          <w:sz-cs w:val="24"/>
+          <w:spacing w:val="0"/>
+          <w:color w:val="181F26"/>
+        </w:rPr>
+        <w:t xml:space="preserve">For a full sample configuration, start from </w:t>
+      </w:r>
+      <w:r>
+        <w:rPr>
+          <w:rFonts w:ascii="Menlo" w:hAnsi="Menlo" w:cs="Menlo"/>
+          <w:sz w:val="24"/>
+          <w:sz-cs w:val="24"/>
+          <w:u w:val="single"/>
+          <w:spacing w:val="0"/>
+          <w:color w:val="0000E9"/>
+        </w:rPr>
+        <w:t xml:space="preserve">examples/hero-fleet/Crawfish.toml</w:t>
+      </w:r>
+      <w:r>
+        <w:rPr>
+          <w:rFonts w:ascii="Helvetica Neue" w:hAnsi="Helvetica Neue" w:cs="Helvetica Neue"/>
+          <w:sz w:val="24"/>
+          <w:sz-cs w:val="24"/>
+          <w:spacing w:val="0"/>
+          <w:color w:val="181F26"/>
+        </w:rPr>
+        <w:t xml:space="preserve"> and the agent manifests under </w:t>
+      </w:r>
+      <w:r>
+        <w:rPr>
+          <w:rFonts w:ascii="Menlo" w:hAnsi="Menlo" w:cs="Menlo"/>
+          <w:sz w:val="24"/>
+          <w:sz-cs w:val="24"/>
+          <w:u w:val="single"/>
+          <w:spacing w:val="0"/>
+          <w:color w:val="0000E9"/>
+        </w:rPr>
+        <w:t xml:space="preserve">examples/hero-fleet/agents/</w:t>
+      </w:r>
+      <w:r>
+        <w:rPr>
+          <w:rFonts w:ascii="Helvetica Neue" w:hAnsi="Helvetica Neue" w:cs="Helvetica Neue"/>
+          <w:sz w:val="24"/>
+          <w:sz-cs w:val="24"/>
+          <w:spacing w:val="0"/>
+          <w:color w:val="181F26"/>
+        </w:rPr>
+        <w:t xml:space="preserve">.</w:t>
       </w:r>
     </w:p>
     <w:p>
@@ -30807,7 +31307,7 @@
           <w:spacing w:val="0"/>
           <w:color w:val="102C4B"/>
         </w:rPr>
-        <w:t xml:space="preserve">P0 Scope</w:t>
+        <w:t xml:space="preserve">Current Implemented Slice</w:t>
       </w:r>
     </w:p>
     <w:p>
@@ -30822,241 +31322,287 @@
           <w:spacing w:val="0"/>
           <w:color w:val="181F26"/>
         </w:rPr>
-        <w:t xml:space="preserve">Only the following capabilities are in P0:</w:t>
-      </w:r>
-    </w:p>
-    <w:p>
-      <w:pPr>
-        <w:ind w:left="720" w:first-line="-720"/>
-      </w:pPr>
-      <w:r>
-        <w:rPr>
-          <w:rFonts w:ascii="Menlo" w:hAnsi="Menlo" w:cs="Menlo"/>
-          <w:sz w:val="24"/>
-          <w:sz-cs w:val="24"/>
-          <w:color w:val="181F26"/>
-        </w:rPr>
-        <w:t xml:space="preserve"/>
-        <w:tab/>
-        <w:t xml:space="preserve">1</w:t>
-        <w:tab/>
-        <w:t xml:space="preserve"/>
-      </w:r>
-      <w:r>
-        <w:rPr>
-          <w:rFonts w:ascii="Menlo" w:hAnsi="Menlo" w:cs="Menlo"/>
-          <w:sz w:val="24"/>
-          <w:sz-cs w:val="24"/>
-          <w:spacing w:val="0"/>
-          <w:color w:val="181F26"/>
-        </w:rPr>
-        <w:t xml:space="preserve">crawfishd</w:t>
-      </w:r>
-      <w:r>
-        <w:rPr>
-          <w:rFonts w:ascii="Helvetica Neue" w:hAnsi="Helvetica Neue" w:cs="Helvetica Neue"/>
-          <w:sz w:val="24"/>
-          <w:sz-cs w:val="24"/>
-          <w:spacing w:val="0"/>
-          <w:color w:val="181F26"/>
-        </w:rPr>
-        <w:t xml:space="preserve"> supervisor daemon</w:t>
-      </w:r>
-    </w:p>
-    <w:p>
-      <w:pPr>
-        <w:ind w:left="720" w:first-line="-720"/>
-      </w:pPr>
-      <w:r>
-        <w:rPr>
-          <w:rFonts w:ascii="Helvetica Neue" w:hAnsi="Helvetica Neue" w:cs="Helvetica Neue"/>
-          <w:sz w:val="24"/>
-          <w:sz-cs w:val="24"/>
-          <w:color w:val="181F26"/>
-        </w:rPr>
-        <w:t xml:space="preserve"/>
-        <w:tab/>
-        <w:t xml:space="preserve">2</w:t>
-        <w:tab/>
-        <w:t xml:space="preserve"/>
-      </w:r>
-      <w:r>
-        <w:rPr>
-          <w:rFonts w:ascii="Helvetica Neue" w:hAnsi="Helvetica Neue" w:cs="Helvetica Neue"/>
-          <w:sz w:val="24"/>
-          <w:sz-cs w:val="24"/>
-          <w:spacing w:val="0"/>
-          <w:color w:val="181F26"/>
-        </w:rPr>
-        <w:t xml:space="preserve">lifecycle manager</w:t>
-      </w:r>
-    </w:p>
-    <w:p>
-      <w:pPr>
-        <w:ind w:left="720" w:first-line="-720"/>
-      </w:pPr>
-      <w:r>
-        <w:rPr>
-          <w:rFonts w:ascii="Helvetica Neue" w:hAnsi="Helvetica Neue" w:cs="Helvetica Neue"/>
-          <w:sz w:val="24"/>
-          <w:sz-cs w:val="24"/>
-          <w:color w:val="181F26"/>
-        </w:rPr>
-        <w:t xml:space="preserve"/>
-        <w:tab/>
-        <w:t xml:space="preserve">3</w:t>
-        <w:tab/>
-        <w:t xml:space="preserve"/>
-      </w:r>
-      <w:r>
-        <w:rPr>
-          <w:rFonts w:ascii="Helvetica Neue" w:hAnsi="Helvetica Neue" w:cs="Helvetica Neue"/>
-          <w:sz w:val="24"/>
-          <w:sz-cs w:val="24"/>
-          <w:spacing w:val="0"/>
-          <w:color w:val="181F26"/>
-        </w:rPr>
-        <w:t xml:space="preserve">action execution</w:t>
-      </w:r>
-    </w:p>
-    <w:p>
-      <w:pPr>
-        <w:ind w:left="720" w:first-line="-720"/>
-      </w:pPr>
-      <w:r>
-        <w:rPr>
-          <w:rFonts w:ascii="Helvetica Neue" w:hAnsi="Helvetica Neue" w:cs="Helvetica Neue"/>
-          <w:sz w:val="24"/>
-          <w:sz-cs w:val="24"/>
-          <w:color w:val="181F26"/>
-        </w:rPr>
-        <w:t xml:space="preserve"/>
-        <w:tab/>
-        <w:t xml:space="preserve">4</w:t>
-        <w:tab/>
-        <w:t xml:space="preserve"/>
-      </w:r>
-      <w:r>
-        <w:rPr>
-          <w:rFonts w:ascii="Helvetica Neue" w:hAnsi="Helvetica Neue" w:cs="Helvetica Neue"/>
-          <w:sz w:val="24"/>
-          <w:sz-cs w:val="24"/>
-          <w:spacing w:val="0"/>
-          <w:color w:val="181F26"/>
-        </w:rPr>
-        <w:t xml:space="preserve">execution contract v1</w:t>
-      </w:r>
-    </w:p>
-    <w:p>
-      <w:pPr>
-        <w:ind w:left="720" w:first-line="-720"/>
-      </w:pPr>
-      <w:r>
-        <w:rPr>
-          <w:rFonts w:ascii="Helvetica Neue" w:hAnsi="Helvetica Neue" w:cs="Helvetica Neue"/>
-          <w:sz w:val="24"/>
-          <w:sz-cs w:val="24"/>
-          <w:color w:val="181F26"/>
-        </w:rPr>
-        <w:t xml:space="preserve"/>
-        <w:tab/>
-        <w:t xml:space="preserve">5</w:t>
-        <w:tab/>
-        <w:t xml:space="preserve"/>
-      </w:r>
-      <w:r>
-        <w:rPr>
-          <w:rFonts w:ascii="Helvetica Neue" w:hAnsi="Helvetica Neue" w:cs="Helvetica Neue"/>
-          <w:sz w:val="24"/>
-          <w:sz-cs w:val="24"/>
-          <w:spacing w:val="0"/>
-          <w:color w:val="181F26"/>
-        </w:rPr>
-        <w:t xml:space="preserve">MCP integration</w:t>
-      </w:r>
-    </w:p>
-    <w:p>
-      <w:pPr>
-        <w:ind w:left="720" w:first-line="-720"/>
-      </w:pPr>
-      <w:r>
-        <w:rPr>
-          <w:rFonts w:ascii="Helvetica Neue" w:hAnsi="Helvetica Neue" w:cs="Helvetica Neue"/>
-          <w:sz w:val="24"/>
-          <w:sz-cs w:val="24"/>
-          <w:color w:val="181F26"/>
-        </w:rPr>
-        <w:t xml:space="preserve"/>
-        <w:tab/>
-        <w:t xml:space="preserve">6</w:t>
-        <w:tab/>
-        <w:t xml:space="preserve"/>
-      </w:r>
-      <w:r>
-        <w:rPr>
-          <w:rFonts w:ascii="Helvetica Neue" w:hAnsi="Helvetica Neue" w:cs="Helvetica Neue"/>
-          <w:sz w:val="24"/>
-          <w:sz-cs w:val="24"/>
-          <w:spacing w:val="0"/>
-          <w:color w:val="181F26"/>
-        </w:rPr>
-        <w:t xml:space="preserve">checkpoint and resume</w:t>
-      </w:r>
-    </w:p>
-    <w:p>
-      <w:pPr>
-        <w:ind w:left="720" w:first-line="-720"/>
-      </w:pPr>
-      <w:r>
-        <w:rPr>
-          <w:rFonts w:ascii="Helvetica Neue" w:hAnsi="Helvetica Neue" w:cs="Helvetica Neue"/>
-          <w:sz w:val="24"/>
-          <w:sz-cs w:val="24"/>
-          <w:color w:val="181F26"/>
-        </w:rPr>
-        <w:t xml:space="preserve"/>
-        <w:tab/>
-        <w:t xml:space="preserve">7</w:t>
-        <w:tab/>
-        <w:t xml:space="preserve"/>
-      </w:r>
-      <w:r>
-        <w:rPr>
-          <w:rFonts w:ascii="Helvetica Neue" w:hAnsi="Helvetica Neue" w:cs="Helvetica Neue"/>
-          <w:sz w:val="24"/>
-          <w:sz-cs w:val="24"/>
-          <w:spacing w:val="0"/>
-          <w:color w:val="181F26"/>
-        </w:rPr>
-        <w:t xml:space="preserve">observability baseline</w:t>
-      </w:r>
-    </w:p>
-    <w:p>
-      <w:pPr>
-        <w:ind w:left="720" w:first-line="-720"/>
-      </w:pPr>
-      <w:r>
-        <w:rPr>
-          <w:rFonts w:ascii="Helvetica Neue" w:hAnsi="Helvetica Neue" w:cs="Helvetica Neue"/>
-          <w:sz w:val="24"/>
-          <w:sz-cs w:val="24"/>
-          <w:color w:val="181F26"/>
-        </w:rPr>
-        <w:t xml:space="preserve"/>
-        <w:tab/>
-        <w:t xml:space="preserve">8</w:t>
-        <w:tab/>
-        <w:t xml:space="preserve"/>
-      </w:r>
-      <w:r>
-        <w:rPr>
-          <w:rFonts w:ascii="Helvetica Neue" w:hAnsi="Helvetica Neue" w:cs="Helvetica Neue"/>
-          <w:sz w:val="24"/>
-          <w:sz-cs w:val="24"/>
-          <w:spacing w:val="0"/>
-          <w:color w:val="181F26"/>
-        </w:rPr>
-        <w:t xml:space="preserve">security baseline</w:t>
+        <w:t xml:space="preserve">The current Rust workspace already proves one concrete alpha slice:</w:t>
+      </w:r>
+    </w:p>
+    <w:p>
+      <w:pPr>
+        <w:ind w:left="720" w:first-line="-720"/>
+      </w:pPr>
+      <w:r>
+        <w:rPr>
+          <w:rFonts w:ascii="Menlo" w:hAnsi="Menlo" w:cs="Menlo"/>
+          <w:sz w:val="24"/>
+          <w:sz-cs w:val="24"/>
+          <w:color w:val="181F26"/>
+        </w:rPr>
+        <w:t xml:space="preserve"/>
+        <w:tab/>
+        <w:t xml:space="preserve">•</w:t>
+        <w:tab/>
+        <w:t xml:space="preserve"/>
+      </w:r>
+      <w:r>
+        <w:rPr>
+          <w:rFonts w:ascii="Menlo" w:hAnsi="Menlo" w:cs="Menlo"/>
+          <w:sz w:val="24"/>
+          <w:sz-cs w:val="24"/>
+          <w:spacing w:val="0"/>
+          <w:color w:val="181F26"/>
+        </w:rPr>
+        <w:t xml:space="preserve">repo_indexer</w:t>
+      </w:r>
+      <w:r>
+        <w:rPr>
+          <w:rFonts w:ascii="Helvetica Neue" w:hAnsi="Helvetica Neue" w:cs="Helvetica Neue"/>
+          <w:sz w:val="24"/>
+          <w:sz-cs w:val="24"/>
+          <w:spacing w:val="0"/>
+          <w:color w:val="181F26"/>
+        </w:rPr>
+        <w:t xml:space="preserve"> produces a typed </w:t>
+      </w:r>
+      <w:r>
+        <w:rPr>
+          <w:rFonts w:ascii="Menlo" w:hAnsi="Menlo" w:cs="Menlo"/>
+          <w:sz w:val="24"/>
+          <w:sz-cs w:val="24"/>
+          <w:spacing w:val="0"/>
+          <w:color w:val="181F26"/>
+        </w:rPr>
+        <w:t xml:space="preserve">repo_index.json</w:t>
+      </w:r>
+      <w:r>
+        <w:rPr>
+          <w:rFonts w:ascii="Helvetica Neue" w:hAnsi="Helvetica Neue" w:cs="Helvetica Neue"/>
+          <w:sz w:val="24"/>
+          <w:sz-cs w:val="24"/>
+          <w:spacing w:val="0"/>
+          <w:color w:val="181F26"/>
+        </w:rPr>
+        <w:t xml:space="preserve"> artifact from a local workspace.</w:t>
+      </w:r>
+    </w:p>
+    <w:p>
+      <w:pPr>
+        <w:ind w:left="720" w:first-line="-720"/>
+      </w:pPr>
+      <w:r>
+        <w:rPr>
+          <w:rFonts w:ascii="Menlo" w:hAnsi="Menlo" w:cs="Menlo"/>
+          <w:sz w:val="24"/>
+          <w:sz-cs w:val="24"/>
+          <w:color w:val="181F26"/>
+        </w:rPr>
+        <w:t xml:space="preserve"/>
+        <w:tab/>
+        <w:t xml:space="preserve">•</w:t>
+        <w:tab/>
+        <w:t xml:space="preserve"/>
+      </w:r>
+      <w:r>
+        <w:rPr>
+          <w:rFonts w:ascii="Menlo" w:hAnsi="Menlo" w:cs="Menlo"/>
+          <w:sz w:val="24"/>
+          <w:sz-cs w:val="24"/>
+          <w:spacing w:val="0"/>
+          <w:color w:val="181F26"/>
+        </w:rPr>
+        <w:t xml:space="preserve">repo_reviewer</w:t>
+      </w:r>
+      <w:r>
+        <w:rPr>
+          <w:rFonts w:ascii="Helvetica Neue" w:hAnsi="Helvetica Neue" w:cs="Helvetica Neue"/>
+          <w:sz w:val="24"/>
+          <w:sz-cs w:val="24"/>
+          <w:spacing w:val="0"/>
+          <w:color w:val="181F26"/>
+        </w:rPr>
+        <w:t xml:space="preserve"> consumes repository context and emits </w:t>
+      </w:r>
+      <w:r>
+        <w:rPr>
+          <w:rFonts w:ascii="Menlo" w:hAnsi="Menlo" w:cs="Menlo"/>
+          <w:sz w:val="24"/>
+          <w:sz-cs w:val="24"/>
+          <w:spacing w:val="0"/>
+          <w:color w:val="181F26"/>
+        </w:rPr>
+        <w:t xml:space="preserve">review_findings.json</w:t>
+      </w:r>
+      <w:r>
+        <w:rPr>
+          <w:rFonts w:ascii="Helvetica Neue" w:hAnsi="Helvetica Neue" w:cs="Helvetica Neue"/>
+          <w:sz w:val="24"/>
+          <w:sz-cs w:val="24"/>
+          <w:spacing w:val="0"/>
+          <w:color w:val="181F26"/>
+        </w:rPr>
+        <w:t xml:space="preserve"> plus </w:t>
+      </w:r>
+      <w:r>
+        <w:rPr>
+          <w:rFonts w:ascii="Menlo" w:hAnsi="Menlo" w:cs="Menlo"/>
+          <w:sz w:val="24"/>
+          <w:sz-cs w:val="24"/>
+          <w:spacing w:val="0"/>
+          <w:color w:val="181F26"/>
+        </w:rPr>
+        <w:t xml:space="preserve">review_summary.md</w:t>
+      </w:r>
+      <w:r>
+        <w:rPr>
+          <w:rFonts w:ascii="Helvetica Neue" w:hAnsi="Helvetica Neue" w:cs="Helvetica Neue"/>
+          <w:sz w:val="24"/>
+          <w:sz-cs w:val="24"/>
+          <w:spacing w:val="0"/>
+          <w:color w:val="181F26"/>
+        </w:rPr>
+        <w:t xml:space="preserve">.</w:t>
+      </w:r>
+    </w:p>
+    <w:p>
+      <w:pPr>
+        <w:ind w:left="720" w:first-line="-720"/>
+      </w:pPr>
+      <w:r>
+        <w:rPr>
+          <w:rFonts w:ascii="Menlo" w:hAnsi="Menlo" w:cs="Menlo"/>
+          <w:sz w:val="24"/>
+          <w:sz-cs w:val="24"/>
+          <w:color w:val="181F26"/>
+        </w:rPr>
+        <w:t xml:space="preserve"/>
+        <w:tab/>
+        <w:t xml:space="preserve">•</w:t>
+        <w:tab/>
+        <w:t xml:space="preserve"/>
+      </w:r>
+      <w:r>
+        <w:rPr>
+          <w:rFonts w:ascii="Menlo" w:hAnsi="Menlo" w:cs="Menlo"/>
+          <w:sz w:val="24"/>
+          <w:sz-cs w:val="24"/>
+          <w:spacing w:val="0"/>
+          <w:color w:val="181F26"/>
+        </w:rPr>
+        <w:t xml:space="preserve">ci_triage</w:t>
+      </w:r>
+      <w:r>
+        <w:rPr>
+          <w:rFonts w:ascii="Helvetica Neue" w:hAnsi="Helvetica Neue" w:cs="Helvetica Neue"/>
+          <w:sz w:val="24"/>
+          <w:sz-cs w:val="24"/>
+          <w:spacing w:val="0"/>
+          <w:color w:val="181F26"/>
+        </w:rPr>
+        <w:t xml:space="preserve"> emits </w:t>
+      </w:r>
+      <w:r>
+        <w:rPr>
+          <w:rFonts w:ascii="Menlo" w:hAnsi="Menlo" w:cs="Menlo"/>
+          <w:sz w:val="24"/>
+          <w:sz-cs w:val="24"/>
+          <w:spacing w:val="0"/>
+          <w:color w:val="181F26"/>
+        </w:rPr>
+        <w:t xml:space="preserve">ci_triage.json</w:t>
+      </w:r>
+      <w:r>
+        <w:rPr>
+          <w:rFonts w:ascii="Helvetica Neue" w:hAnsi="Helvetica Neue" w:cs="Helvetica Neue"/>
+          <w:sz w:val="24"/>
+          <w:sz-cs w:val="24"/>
+          <w:spacing w:val="0"/>
+          <w:color w:val="181F26"/>
+        </w:rPr>
+        <w:t xml:space="preserve"> plus </w:t>
+      </w:r>
+      <w:r>
+        <w:rPr>
+          <w:rFonts w:ascii="Menlo" w:hAnsi="Menlo" w:cs="Menlo"/>
+          <w:sz w:val="24"/>
+          <w:sz-cs w:val="24"/>
+          <w:spacing w:val="0"/>
+          <w:color w:val="181F26"/>
+        </w:rPr>
+        <w:t xml:space="preserve">ci_triage_summary.md</w:t>
+      </w:r>
+      <w:r>
+        <w:rPr>
+          <w:rFonts w:ascii="Helvetica Neue" w:hAnsi="Helvetica Neue" w:cs="Helvetica Neue"/>
+          <w:sz w:val="24"/>
+          <w:sz-cs w:val="24"/>
+          <w:spacing w:val="0"/>
+          <w:color w:val="181F26"/>
+        </w:rPr>
+        <w:t xml:space="preserve"> from either direct log input or an SSE MCP fetch path.</w:t>
+      </w:r>
+    </w:p>
+    <w:p>
+      <w:pPr>
+        <w:ind w:left="720" w:first-line="-720"/>
+      </w:pPr>
+      <w:r>
+        <w:rPr>
+          <w:rFonts w:ascii="Helvetica Neue" w:hAnsi="Helvetica Neue" w:cs="Helvetica Neue"/>
+          <w:sz w:val="24"/>
+          <w:sz-cs w:val="24"/>
+          <w:color w:val="181F26"/>
+        </w:rPr>
+        <w:t xml:space="preserve"/>
+        <w:tab/>
+        <w:t xml:space="preserve">•</w:t>
+        <w:tab/>
+        <w:t xml:space="preserve"/>
+      </w:r>
+      <w:r>
+        <w:rPr>
+          <w:rFonts w:ascii="Helvetica Neue" w:hAnsi="Helvetica Neue" w:cs="Helvetica Neue"/>
+          <w:sz w:val="24"/>
+          <w:sz-cs w:val="24"/>
+          <w:spacing w:val="0"/>
+          <w:color w:val="181F26"/>
+        </w:rPr>
+        <w:t xml:space="preserve">deterministic executors emit checkpoint metadata that can be inspected and reused during restart recovery.</w:t>
+      </w:r>
+    </w:p>
+    <w:p>
+      <w:pPr>
+        <w:ind w:left="720" w:first-line="-720"/>
+      </w:pPr>
+      <w:r>
+        <w:rPr>
+          <w:rFonts w:ascii="Menlo" w:hAnsi="Menlo" w:cs="Menlo"/>
+          <w:sz w:val="24"/>
+          <w:sz-cs w:val="24"/>
+          <w:color w:val="181F26"/>
+        </w:rPr>
+        <w:t xml:space="preserve"/>
+        <w:tab/>
+        <w:t xml:space="preserve">•</w:t>
+        <w:tab/>
+        <w:t xml:space="preserve"/>
+      </w:r>
+      <w:r>
+        <w:rPr>
+          <w:rFonts w:ascii="Menlo" w:hAnsi="Menlo" w:cs="Menlo"/>
+          <w:sz w:val="24"/>
+          <w:sz-cs w:val="24"/>
+          <w:spacing w:val="0"/>
+          <w:color w:val="181F26"/>
+        </w:rPr>
+        <w:t xml:space="preserve">inspect</w:t>
+      </w:r>
+      <w:r>
+        <w:rPr>
+          <w:rFonts w:ascii="Helvetica Neue" w:hAnsi="Helvetica Neue" w:cs="Helvetica Neue"/>
+          <w:sz w:val="24"/>
+          <w:sz-cs w:val="24"/>
+          <w:spacing w:val="0"/>
+          <w:color w:val="181F26"/>
+        </w:rPr>
+        <w:t xml:space="preserve"> already exposes artifact refs, checkpoint refs, recovery stage, encounter metadata, and external refs.</w:t>
       </w:r>
     </w:p>
     <w:p>
@@ -31071,7 +31617,7 @@
           <w:spacing w:val="0"/>
           <w:color w:val="181F26"/>
         </w:rPr>
-        <w:t xml:space="preserve">Continuity baseline is delivered through these same P0 systems, especially lifecycle, action execution, recovery policy, and inspection. It is not a separate subsystem bolted on later. Governance baseline is also delivered through these same P0 systems: manifests, action metadata, inspection, and policy validation must all understand owner, trust domain, encounter policy, and future lease-based execution.</w:t>
+        <w:t xml:space="preserve">This means the next implementation work is no longer “make Hero P0 exist at all”; it is “harden the current Hero P0 slice and extend it carefully.”</w:t>
       </w:r>
     </w:p>
     <w:p>
@@ -31087,427 +31633,271 @@
           <w:spacing w:val="0"/>
           <w:color w:val="102C4B"/>
         </w:rPr>
-        <w:t xml:space="preserve">P1 Scope</w:t>
-      </w:r>
-    </w:p>
-    <w:p>
-      <w:pPr>
-        <w:ind w:left="720" w:first-line="-720"/>
-      </w:pPr>
-      <w:r>
-        <w:rPr>
-          <w:rFonts w:ascii="Helvetica Neue" w:hAnsi="Helvetica Neue" w:cs="Helvetica Neue"/>
-          <w:sz w:val="24"/>
-          <w:sz-cs w:val="24"/>
-          <w:color w:val="181F26"/>
-        </w:rPr>
-        <w:t xml:space="preserve"/>
-        <w:tab/>
-        <w:t xml:space="preserve">•</w:t>
-        <w:tab/>
-        <w:t xml:space="preserve"/>
-      </w:r>
-      <w:r>
-        <w:rPr>
-          <w:rFonts w:ascii="Helvetica Neue" w:hAnsi="Helvetica Neue" w:cs="Helvetica Neue"/>
-          <w:sz w:val="24"/>
-          <w:sz-cs w:val="24"/>
-          <w:spacing w:val="0"/>
-          <w:color w:val="181F26"/>
-        </w:rPr>
-        <w:t xml:space="preserve">production same-device encounter enforcement</w:t>
-      </w:r>
-    </w:p>
-    <w:p>
-      <w:pPr>
-        <w:ind w:left="720" w:first-line="-720"/>
-      </w:pPr>
-      <w:r>
-        <w:rPr>
-          <w:rFonts w:ascii="Helvetica Neue" w:hAnsi="Helvetica Neue" w:cs="Helvetica Neue"/>
-          <w:sz w:val="24"/>
-          <w:sz-cs w:val="24"/>
-          <w:color w:val="181F26"/>
-        </w:rPr>
-        <w:t xml:space="preserve"/>
-        <w:tab/>
-        <w:t xml:space="preserve">•</w:t>
-        <w:tab/>
-        <w:t xml:space="preserve"/>
-      </w:r>
-      <w:r>
-        <w:rPr>
-          <w:rFonts w:ascii="Helvetica Neue" w:hAnsi="Helvetica Neue" w:cs="Helvetica Neue"/>
-          <w:sz w:val="24"/>
-          <w:sz-cs w:val="24"/>
-          <w:spacing w:val="0"/>
-          <w:color w:val="181F26"/>
-        </w:rPr>
-        <w:t xml:space="preserve">consent-grant and capability-lease issuance</w:t>
-      </w:r>
-    </w:p>
-    <w:p>
-      <w:pPr>
-        <w:ind w:left="720" w:first-line="-720"/>
-      </w:pPr>
-      <w:r>
-        <w:rPr>
-          <w:rFonts w:ascii="Helvetica Neue" w:hAnsi="Helvetica Neue" w:cs="Helvetica Neue"/>
-          <w:sz w:val="24"/>
-          <w:sz-cs w:val="24"/>
-          <w:color w:val="181F26"/>
-        </w:rPr>
-        <w:t xml:space="preserve"/>
-        <w:tab/>
-        <w:t xml:space="preserve">•</w:t>
-        <w:tab/>
-        <w:t xml:space="preserve"/>
-      </w:r>
-      <w:r>
-        <w:rPr>
-          <w:rFonts w:ascii="Helvetica Neue" w:hAnsi="Helvetica Neue" w:cs="Helvetica Neue"/>
-          <w:sz w:val="24"/>
-          <w:sz-cs w:val="24"/>
-          <w:spacing w:val="0"/>
-          <w:color w:val="181F26"/>
-        </w:rPr>
-        <w:t xml:space="preserve">audit receipt emission and revocation handling</w:t>
-      </w:r>
-    </w:p>
-    <w:p>
-      <w:pPr>
-        <w:ind w:left="720" w:first-line="-720"/>
-      </w:pPr>
-      <w:r>
-        <w:rPr>
-          <w:rFonts w:ascii="Helvetica Neue" w:hAnsi="Helvetica Neue" w:cs="Helvetica Neue"/>
-          <w:sz w:val="24"/>
-          <w:sz-cs w:val="24"/>
-          <w:color w:val="181F26"/>
-        </w:rPr>
-        <w:t xml:space="preserve"/>
-        <w:tab/>
-        <w:t xml:space="preserve">•</w:t>
-        <w:tab/>
-        <w:t xml:space="preserve"/>
-      </w:r>
-      <w:r>
-        <w:rPr>
-          <w:rFonts w:ascii="Helvetica Neue" w:hAnsi="Helvetica Neue" w:cs="Helvetica Neue"/>
-          <w:sz w:val="24"/>
-          <w:sz-cs w:val="24"/>
-          <w:spacing w:val="0"/>
-          <w:color w:val="181F26"/>
-        </w:rPr>
-        <w:t xml:space="preserve">OpenClaw inbound plugin and Gateway RPC bridge</w:t>
-      </w:r>
-    </w:p>
-    <w:p>
-      <w:pPr>
-        <w:ind w:left="720" w:first-line="-720"/>
-      </w:pPr>
-      <w:r>
-        <w:rPr>
-          <w:rFonts w:ascii="Helvetica Neue" w:hAnsi="Helvetica Neue" w:cs="Helvetica Neue"/>
-          <w:sz w:val="24"/>
-          <w:sz-cs w:val="24"/>
-          <w:color w:val="181F26"/>
-        </w:rPr>
-        <w:t xml:space="preserve"/>
-        <w:tab/>
-        <w:t xml:space="preserve">•</w:t>
-        <w:tab/>
-        <w:t xml:space="preserve"/>
-      </w:r>
-      <w:r>
-        <w:rPr>
-          <w:rFonts w:ascii="Helvetica Neue" w:hAnsi="Helvetica Neue" w:cs="Helvetica Neue"/>
-          <w:sz w:val="24"/>
-          <w:sz-cs w:val="24"/>
-          <w:spacing w:val="0"/>
-          <w:color w:val="181F26"/>
-        </w:rPr>
-        <w:t xml:space="preserve">OpenClaw outbound Gateway adapter for agent execution</w:t>
-      </w:r>
-    </w:p>
-    <w:p>
-      <w:pPr>
-        <w:ind w:left="720" w:first-line="-720"/>
-      </w:pPr>
-      <w:r>
-        <w:rPr>
-          <w:rFonts w:ascii="Helvetica Neue" w:hAnsi="Helvetica Neue" w:cs="Helvetica Neue"/>
-          <w:sz w:val="24"/>
-          <w:sz-cs w:val="24"/>
-          <w:color w:val="181F26"/>
-        </w:rPr>
-        <w:t xml:space="preserve"/>
-        <w:tab/>
-        <w:t xml:space="preserve">•</w:t>
-        <w:tab/>
-        <w:t xml:space="preserve"/>
-      </w:r>
-      <w:r>
-        <w:rPr>
-          <w:rFonts w:ascii="Helvetica Neue" w:hAnsi="Helvetica Neue" w:cs="Helvetica Neue"/>
-          <w:sz w:val="24"/>
-          <w:sz-cs w:val="24"/>
-          <w:spacing w:val="0"/>
-          <w:color w:val="181F26"/>
-        </w:rPr>
-        <w:t xml:space="preserve">Ralph-style verify loop for coding-heavy capability classes</w:t>
-      </w:r>
-    </w:p>
-    <w:p>
-      <w:pPr>
-        <w:ind w:left="720" w:first-line="-720"/>
-      </w:pPr>
-      <w:r>
-        <w:rPr>
-          <w:rFonts w:ascii="Helvetica Neue" w:hAnsi="Helvetica Neue" w:cs="Helvetica Neue"/>
-          <w:sz w:val="24"/>
-          <w:sz-cs w:val="24"/>
-          <w:color w:val="181F26"/>
-        </w:rPr>
-        <w:t xml:space="preserve"/>
-        <w:tab/>
-        <w:t xml:space="preserve">•</w:t>
-        <w:tab/>
-        <w:t xml:space="preserve"/>
-      </w:r>
-      <w:r>
-        <w:rPr>
-          <w:rFonts w:ascii="Helvetica Neue" w:hAnsi="Helvetica Neue" w:cs="Helvetica Neue"/>
-          <w:sz w:val="24"/>
-          <w:sz-cs w:val="24"/>
-          <w:spacing w:val="0"/>
-          <w:color w:val="181F26"/>
-        </w:rPr>
-        <w:t xml:space="preserve">deterministic verifiers for coding actions</w:t>
-      </w:r>
-    </w:p>
-    <w:p>
-      <w:pPr>
-        <w:ind w:left="720" w:first-line="-720"/>
-      </w:pPr>
-      <w:r>
-        <w:rPr>
-          <w:rFonts w:ascii="Helvetica Neue" w:hAnsi="Helvetica Neue" w:cs="Helvetica Neue"/>
-          <w:sz w:val="24"/>
-          <w:sz-cs w:val="24"/>
-          <w:color w:val="181F26"/>
-        </w:rPr>
-        <w:t xml:space="preserve"/>
-        <w:tab/>
-        <w:t xml:space="preserve">•</w:t>
-        <w:tab/>
-        <w:t xml:space="preserve"/>
-      </w:r>
-      <w:r>
-        <w:rPr>
-          <w:rFonts w:ascii="Helvetica Neue" w:hAnsi="Helvetica Neue" w:cs="Helvetica Neue"/>
-          <w:sz w:val="24"/>
-          <w:sz-cs w:val="24"/>
-          <w:spacing w:val="0"/>
-          <w:color w:val="181F26"/>
-        </w:rPr>
-        <w:t xml:space="preserve">ACP-compatible harness adapters</w:t>
-      </w:r>
-    </w:p>
-    <w:p>
-      <w:pPr>
-        <w:ind w:left="720" w:first-line="-720"/>
-      </w:pPr>
-      <w:r>
-        <w:rPr>
-          <w:rFonts w:ascii="Helvetica Neue" w:hAnsi="Helvetica Neue" w:cs="Helvetica Neue"/>
-          <w:sz w:val="24"/>
-          <w:sz-cs w:val="24"/>
-          <w:color w:val="181F26"/>
-        </w:rPr>
-        <w:t xml:space="preserve"/>
-        <w:tab/>
-        <w:t xml:space="preserve">•</w:t>
-        <w:tab/>
-        <w:t xml:space="preserve"/>
-      </w:r>
-      <w:r>
-        <w:rPr>
-          <w:rFonts w:ascii="Helvetica Neue" w:hAnsi="Helvetica Neue" w:cs="Helvetica Neue"/>
-          <w:sz w:val="24"/>
-          <w:sz-cs w:val="24"/>
-          <w:spacing w:val="0"/>
-          <w:color w:val="181F26"/>
-        </w:rPr>
-        <w:t xml:space="preserve">ACPX-like harness router or broker integration pattern</w:t>
-      </w:r>
-    </w:p>
-    <w:p>
-      <w:pPr>
-        <w:ind w:left="720" w:first-line="-720"/>
-      </w:pPr>
-      <w:r>
-        <w:rPr>
-          <w:rFonts w:ascii="Helvetica Neue" w:hAnsi="Helvetica Neue" w:cs="Helvetica Neue"/>
-          <w:sz w:val="24"/>
-          <w:sz-cs w:val="24"/>
-          <w:color w:val="181F26"/>
-        </w:rPr>
-        <w:t xml:space="preserve"/>
-        <w:tab/>
-        <w:t xml:space="preserve">•</w:t>
-        <w:tab/>
-        <w:t xml:space="preserve"/>
-      </w:r>
-      <w:r>
-        <w:rPr>
-          <w:rFonts w:ascii="Helvetica Neue" w:hAnsi="Helvetica Neue" w:cs="Helvetica Neue"/>
-          <w:sz w:val="24"/>
-          <w:sz-cs w:val="24"/>
-          <w:spacing w:val="0"/>
-          <w:color w:val="181F26"/>
-        </w:rPr>
-        <w:t xml:space="preserve">A2A connector with policy-preserving remote delegation</w:t>
-      </w:r>
-    </w:p>
-    <w:p>
-      <w:pPr>
-        <w:ind w:left="720" w:first-line="-720"/>
-      </w:pPr>
-      <w:r>
-        <w:rPr>
-          <w:rFonts w:ascii="Helvetica Neue" w:hAnsi="Helvetica Neue" w:cs="Helvetica Neue"/>
-          <w:sz w:val="24"/>
-          <w:sz-cs w:val="24"/>
-          <w:color w:val="181F26"/>
-        </w:rPr>
-        <w:t xml:space="preserve"/>
-        <w:tab/>
-        <w:t xml:space="preserve">•</w:t>
-        <w:tab/>
-        <w:t xml:space="preserve"/>
-      </w:r>
-      <w:r>
-        <w:rPr>
-          <w:rFonts w:ascii="Helvetica Neue" w:hAnsi="Helvetica Neue" w:cs="Helvetica Neue"/>
-          <w:sz w:val="24"/>
-          <w:sz-cs w:val="24"/>
-          <w:spacing w:val="0"/>
-          <w:color w:val="181F26"/>
-        </w:rPr>
-        <w:t xml:space="preserve">local subprocess wrappers where ACP is unavailable</w:t>
-      </w:r>
-    </w:p>
-    <w:p>
-      <w:pPr>
-        <w:ind w:left="720" w:first-line="-720"/>
-      </w:pPr>
-      <w:r>
-        <w:rPr>
-          <w:rFonts w:ascii="Helvetica Neue" w:hAnsi="Helvetica Neue" w:cs="Helvetica Neue"/>
-          <w:sz w:val="24"/>
-          <w:sz-cs w:val="24"/>
-          <w:color w:val="181F26"/>
-        </w:rPr>
-        <w:t xml:space="preserve"/>
-        <w:tab/>
-        <w:t xml:space="preserve">•</w:t>
-        <w:tab/>
-        <w:t xml:space="preserve"/>
-      </w:r>
-      <w:r>
-        <w:rPr>
-          <w:rFonts w:ascii="Helvetica Neue" w:hAnsi="Helvetica Neue" w:cs="Helvetica Neue"/>
-          <w:sz w:val="24"/>
-          <w:sz-cs w:val="24"/>
-          <w:spacing w:val="0"/>
-          <w:color w:val="181F26"/>
-        </w:rPr>
-        <w:t xml:space="preserve">visual fleet dashboard</w:t>
-      </w:r>
-    </w:p>
-    <w:p>
-      <w:pPr>
-        <w:ind w:left="720" w:first-line="-720"/>
-      </w:pPr>
-      <w:r>
-        <w:rPr>
-          <w:rFonts w:ascii="Helvetica Neue" w:hAnsi="Helvetica Neue" w:cs="Helvetica Neue"/>
-          <w:sz w:val="24"/>
-          <w:sz-cs w:val="24"/>
-          <w:color w:val="181F26"/>
-        </w:rPr>
-        <w:t xml:space="preserve"/>
-        <w:tab/>
-        <w:t xml:space="preserve">•</w:t>
-        <w:tab/>
-        <w:t xml:space="preserve"/>
-      </w:r>
-      <w:r>
-        <w:rPr>
-          <w:rFonts w:ascii="Helvetica Neue" w:hAnsi="Helvetica Neue" w:cs="Helvetica Neue"/>
-          <w:sz w:val="24"/>
-          <w:sz-cs w:val="24"/>
-          <w:spacing w:val="0"/>
-          <w:color w:val="181F26"/>
-        </w:rPr>
-        <w:t xml:space="preserve">multi-host supervisor and leased worker model</w:t>
-      </w:r>
-    </w:p>
-    <w:p>
-      <w:pPr>
-        <w:ind w:left="720" w:first-line="-720"/>
-      </w:pPr>
-      <w:r>
-        <w:rPr>
-          <w:rFonts w:ascii="Helvetica Neue" w:hAnsi="Helvetica Neue" w:cs="Helvetica Neue"/>
-          <w:sz w:val="24"/>
-          <w:sz-cs w:val="24"/>
-          <w:color w:val="181F26"/>
-        </w:rPr>
-        <w:t xml:space="preserve"/>
-        <w:tab/>
-        <w:t xml:space="preserve">•</w:t>
-        <w:tab/>
-        <w:t xml:space="preserve"/>
-      </w:r>
-      <w:r>
-        <w:rPr>
-          <w:rFonts w:ascii="Helvetica Neue" w:hAnsi="Helvetica Neue" w:cs="Helvetica Neue"/>
-          <w:sz w:val="24"/>
-          <w:sz-cs w:val="24"/>
-          <w:spacing w:val="0"/>
-          <w:color w:val="181F26"/>
-        </w:rPr>
-        <w:t xml:space="preserve">context compression and memory compaction hooks</w:t>
-      </w:r>
-    </w:p>
-    <w:p>
-      <w:pPr>
-        <w:ind w:left="720" w:first-line="-720"/>
-      </w:pPr>
-      <w:r>
-        <w:rPr>
-          <w:rFonts w:ascii="Helvetica Neue" w:hAnsi="Helvetica Neue" w:cs="Helvetica Neue"/>
-          <w:sz w:val="24"/>
-          <w:sz-cs w:val="24"/>
-          <w:color w:val="181F26"/>
-        </w:rPr>
-        <w:t xml:space="preserve"/>
-        <w:tab/>
-        <w:t xml:space="preserve">•</w:t>
-        <w:tab/>
-        <w:t xml:space="preserve"/>
-      </w:r>
-      <w:r>
-        <w:rPr>
-          <w:rFonts w:ascii="Helvetica Neue" w:hAnsi="Helvetica Neue" w:cs="Helvetica Neue"/>
-          <w:sz w:val="24"/>
-          <w:sz-cs w:val="24"/>
-          <w:spacing w:val="0"/>
-          <w:color w:val="181F26"/>
-        </w:rPr>
-        <w:t xml:space="preserve">evaluation and review hooks tied to quality policy</w:t>
+        <w:t xml:space="preserve">P0 Scope</w:t>
+      </w:r>
+    </w:p>
+    <w:p>
+      <w:pPr>
+        <w:spacing w:after="240"/>
+      </w:pPr>
+      <w:r>
+        <w:rPr>
+          <w:rFonts w:ascii="Helvetica Neue" w:hAnsi="Helvetica Neue" w:cs="Helvetica Neue"/>
+          <w:sz w:val="24"/>
+          <w:sz-cs w:val="24"/>
+          <w:spacing w:val="0"/>
+          <w:color w:val="181F26"/>
+        </w:rPr>
+        <w:t xml:space="preserve">Only the following capabilities are in P0:</w:t>
+      </w:r>
+    </w:p>
+    <w:p>
+      <w:pPr>
+        <w:ind w:left="720" w:first-line="-720"/>
+      </w:pPr>
+      <w:r>
+        <w:rPr>
+          <w:rFonts w:ascii="Menlo" w:hAnsi="Menlo" w:cs="Menlo"/>
+          <w:sz w:val="24"/>
+          <w:sz-cs w:val="24"/>
+          <w:color w:val="181F26"/>
+        </w:rPr>
+        <w:t xml:space="preserve"/>
+        <w:tab/>
+        <w:t xml:space="preserve">1</w:t>
+        <w:tab/>
+        <w:t xml:space="preserve"/>
+      </w:r>
+      <w:r>
+        <w:rPr>
+          <w:rFonts w:ascii="Menlo" w:hAnsi="Menlo" w:cs="Menlo"/>
+          <w:sz w:val="24"/>
+          <w:sz-cs w:val="24"/>
+          <w:spacing w:val="0"/>
+          <w:color w:val="181F26"/>
+        </w:rPr>
+        <w:t xml:space="preserve">crawfishd</w:t>
+      </w:r>
+      <w:r>
+        <w:rPr>
+          <w:rFonts w:ascii="Helvetica Neue" w:hAnsi="Helvetica Neue" w:cs="Helvetica Neue"/>
+          <w:sz w:val="24"/>
+          <w:sz-cs w:val="24"/>
+          <w:spacing w:val="0"/>
+          <w:color w:val="181F26"/>
+        </w:rPr>
+        <w:t xml:space="preserve"> supervisor daemon</w:t>
+      </w:r>
+    </w:p>
+    <w:p>
+      <w:pPr>
+        <w:ind w:left="720" w:first-line="-720"/>
+      </w:pPr>
+      <w:r>
+        <w:rPr>
+          <w:rFonts w:ascii="Helvetica Neue" w:hAnsi="Helvetica Neue" w:cs="Helvetica Neue"/>
+          <w:sz w:val="24"/>
+          <w:sz-cs w:val="24"/>
+          <w:color w:val="181F26"/>
+        </w:rPr>
+        <w:t xml:space="preserve"/>
+        <w:tab/>
+        <w:t xml:space="preserve">2</w:t>
+        <w:tab/>
+        <w:t xml:space="preserve"/>
+      </w:r>
+      <w:r>
+        <w:rPr>
+          <w:rFonts w:ascii="Helvetica Neue" w:hAnsi="Helvetica Neue" w:cs="Helvetica Neue"/>
+          <w:sz w:val="24"/>
+          <w:sz-cs w:val="24"/>
+          <w:spacing w:val="0"/>
+          <w:color w:val="181F26"/>
+        </w:rPr>
+        <w:t xml:space="preserve">lifecycle manager</w:t>
+      </w:r>
+    </w:p>
+    <w:p>
+      <w:pPr>
+        <w:ind w:left="720" w:first-line="-720"/>
+      </w:pPr>
+      <w:r>
+        <w:rPr>
+          <w:rFonts w:ascii="Helvetica Neue" w:hAnsi="Helvetica Neue" w:cs="Helvetica Neue"/>
+          <w:sz w:val="24"/>
+          <w:sz-cs w:val="24"/>
+          <w:color w:val="181F26"/>
+        </w:rPr>
+        <w:t xml:space="preserve"/>
+        <w:tab/>
+        <w:t xml:space="preserve">3</w:t>
+        <w:tab/>
+        <w:t xml:space="preserve"/>
+      </w:r>
+      <w:r>
+        <w:rPr>
+          <w:rFonts w:ascii="Helvetica Neue" w:hAnsi="Helvetica Neue" w:cs="Helvetica Neue"/>
+          <w:sz w:val="24"/>
+          <w:sz-cs w:val="24"/>
+          <w:spacing w:val="0"/>
+          <w:color w:val="181F26"/>
+        </w:rPr>
+        <w:t xml:space="preserve">action execution</w:t>
+      </w:r>
+    </w:p>
+    <w:p>
+      <w:pPr>
+        <w:ind w:left="720" w:first-line="-720"/>
+      </w:pPr>
+      <w:r>
+        <w:rPr>
+          <w:rFonts w:ascii="Helvetica Neue" w:hAnsi="Helvetica Neue" w:cs="Helvetica Neue"/>
+          <w:sz w:val="24"/>
+          <w:sz-cs w:val="24"/>
+          <w:color w:val="181F26"/>
+        </w:rPr>
+        <w:t xml:space="preserve"/>
+        <w:tab/>
+        <w:t xml:space="preserve">4</w:t>
+        <w:tab/>
+        <w:t xml:space="preserve"/>
+      </w:r>
+      <w:r>
+        <w:rPr>
+          <w:rFonts w:ascii="Helvetica Neue" w:hAnsi="Helvetica Neue" w:cs="Helvetica Neue"/>
+          <w:sz w:val="24"/>
+          <w:sz-cs w:val="24"/>
+          <w:spacing w:val="0"/>
+          <w:color w:val="181F26"/>
+        </w:rPr>
+        <w:t xml:space="preserve">execution contract v1</w:t>
+      </w:r>
+    </w:p>
+    <w:p>
+      <w:pPr>
+        <w:ind w:left="720" w:first-line="-720"/>
+      </w:pPr>
+      <w:r>
+        <w:rPr>
+          <w:rFonts w:ascii="Helvetica Neue" w:hAnsi="Helvetica Neue" w:cs="Helvetica Neue"/>
+          <w:sz w:val="24"/>
+          <w:sz-cs w:val="24"/>
+          <w:color w:val="181F26"/>
+        </w:rPr>
+        <w:t xml:space="preserve"/>
+        <w:tab/>
+        <w:t xml:space="preserve">5</w:t>
+        <w:tab/>
+        <w:t xml:space="preserve"/>
+      </w:r>
+      <w:r>
+        <w:rPr>
+          <w:rFonts w:ascii="Helvetica Neue" w:hAnsi="Helvetica Neue" w:cs="Helvetica Neue"/>
+          <w:sz w:val="24"/>
+          <w:sz-cs w:val="24"/>
+          <w:spacing w:val="0"/>
+          <w:color w:val="181F26"/>
+        </w:rPr>
+        <w:t xml:space="preserve">MCP integration</w:t>
+      </w:r>
+    </w:p>
+    <w:p>
+      <w:pPr>
+        <w:ind w:left="720" w:first-line="-720"/>
+      </w:pPr>
+      <w:r>
+        <w:rPr>
+          <w:rFonts w:ascii="Helvetica Neue" w:hAnsi="Helvetica Neue" w:cs="Helvetica Neue"/>
+          <w:sz w:val="24"/>
+          <w:sz-cs w:val="24"/>
+          <w:color w:val="181F26"/>
+        </w:rPr>
+        <w:t xml:space="preserve"/>
+        <w:tab/>
+        <w:t xml:space="preserve">6</w:t>
+        <w:tab/>
+        <w:t xml:space="preserve"/>
+      </w:r>
+      <w:r>
+        <w:rPr>
+          <w:rFonts w:ascii="Helvetica Neue" w:hAnsi="Helvetica Neue" w:cs="Helvetica Neue"/>
+          <w:sz w:val="24"/>
+          <w:sz-cs w:val="24"/>
+          <w:spacing w:val="0"/>
+          <w:color w:val="181F26"/>
+        </w:rPr>
+        <w:t xml:space="preserve">checkpoint and resume</w:t>
+      </w:r>
+    </w:p>
+    <w:p>
+      <w:pPr>
+        <w:ind w:left="720" w:first-line="-720"/>
+      </w:pPr>
+      <w:r>
+        <w:rPr>
+          <w:rFonts w:ascii="Helvetica Neue" w:hAnsi="Helvetica Neue" w:cs="Helvetica Neue"/>
+          <w:sz w:val="24"/>
+          <w:sz-cs w:val="24"/>
+          <w:color w:val="181F26"/>
+        </w:rPr>
+        <w:t xml:space="preserve"/>
+        <w:tab/>
+        <w:t xml:space="preserve">7</w:t>
+        <w:tab/>
+        <w:t xml:space="preserve"/>
+      </w:r>
+      <w:r>
+        <w:rPr>
+          <w:rFonts w:ascii="Helvetica Neue" w:hAnsi="Helvetica Neue" w:cs="Helvetica Neue"/>
+          <w:sz w:val="24"/>
+          <w:sz-cs w:val="24"/>
+          <w:spacing w:val="0"/>
+          <w:color w:val="181F26"/>
+        </w:rPr>
+        <w:t xml:space="preserve">observability baseline</w:t>
+      </w:r>
+    </w:p>
+    <w:p>
+      <w:pPr>
+        <w:ind w:left="720" w:first-line="-720"/>
+      </w:pPr>
+      <w:r>
+        <w:rPr>
+          <w:rFonts w:ascii="Helvetica Neue" w:hAnsi="Helvetica Neue" w:cs="Helvetica Neue"/>
+          <w:sz w:val="24"/>
+          <w:sz-cs w:val="24"/>
+          <w:color w:val="181F26"/>
+        </w:rPr>
+        <w:t xml:space="preserve"/>
+        <w:tab/>
+        <w:t xml:space="preserve">8</w:t>
+        <w:tab/>
+        <w:t xml:space="preserve"/>
+      </w:r>
+      <w:r>
+        <w:rPr>
+          <w:rFonts w:ascii="Helvetica Neue" w:hAnsi="Helvetica Neue" w:cs="Helvetica Neue"/>
+          <w:sz w:val="24"/>
+          <w:sz-cs w:val="24"/>
+          <w:spacing w:val="0"/>
+          <w:color w:val="181F26"/>
+        </w:rPr>
+        <w:t xml:space="preserve">security baseline</w:t>
+      </w:r>
+    </w:p>
+    <w:p>
+      <w:pPr>
+        <w:spacing w:after="240"/>
+      </w:pPr>
+      <w:r>
+        <w:rPr>
+          <w:rFonts w:ascii="Helvetica Neue" w:hAnsi="Helvetica Neue" w:cs="Helvetica Neue"/>
+          <w:sz w:val="24"/>
+          <w:sz-cs w:val="24"/>
+          <w:spacing w:val="0"/>
+          <w:color w:val="181F26"/>
+        </w:rPr>
+        <w:t xml:space="preserve">Continuity baseline is delivered through these same P0 systems, especially lifecycle, action execution, recovery policy, and inspection. It is not a separate subsystem bolted on later. Governance baseline is also delivered through these same P0 systems: manifests, action metadata, inspection, and policy validation must all understand owner, trust domain, encounter policy, and future lease-based execution.</w:t>
       </w:r>
     </w:p>
     <w:p>
@@ -31523,203 +31913,427 @@
           <w:spacing w:val="0"/>
           <w:color w:val="102C4B"/>
         </w:rPr>
-        <w:t xml:space="preserve">P2 Scope</w:t>
-      </w:r>
-    </w:p>
-    <w:p>
-      <w:pPr>
-        <w:ind w:left="720" w:first-line="-720"/>
-      </w:pPr>
-      <w:r>
-        <w:rPr>
-          <w:rFonts w:ascii="Helvetica Neue" w:hAnsi="Helvetica Neue" w:cs="Helvetica Neue"/>
-          <w:sz w:val="24"/>
-          <w:sz-cs w:val="24"/>
-          <w:color w:val="181F26"/>
-        </w:rPr>
-        <w:t xml:space="preserve"/>
-        <w:tab/>
-        <w:t xml:space="preserve">•</w:t>
-        <w:tab/>
-        <w:t xml:space="preserve"/>
-      </w:r>
-      <w:r>
-        <w:rPr>
-          <w:rFonts w:ascii="Helvetica Neue" w:hAnsi="Helvetica Neue" w:cs="Helvetica Neue"/>
-          <w:sz w:val="24"/>
-          <w:sz-cs w:val="24"/>
-          <w:spacing w:val="0"/>
-          <w:color w:val="181F26"/>
-        </w:rPr>
-        <w:t xml:space="preserve">marketplace and reusable capability packs</w:t>
-      </w:r>
-    </w:p>
-    <w:p>
-      <w:pPr>
-        <w:ind w:left="720" w:first-line="-720"/>
-      </w:pPr>
-      <w:r>
-        <w:rPr>
-          <w:rFonts w:ascii="Helvetica Neue" w:hAnsi="Helvetica Neue" w:cs="Helvetica Neue"/>
-          <w:sz w:val="24"/>
-          <w:sz-cs w:val="24"/>
-          <w:color w:val="181F26"/>
-        </w:rPr>
-        <w:t xml:space="preserve"/>
-        <w:tab/>
-        <w:t xml:space="preserve">•</w:t>
-        <w:tab/>
-        <w:t xml:space="preserve"/>
-      </w:r>
-      <w:r>
-        <w:rPr>
-          <w:rFonts w:ascii="Helvetica Neue" w:hAnsi="Helvetica Neue" w:cs="Helvetica Neue"/>
-          <w:sz w:val="24"/>
-          <w:sz-cs w:val="24"/>
-          <w:spacing w:val="0"/>
-          <w:color w:val="181F26"/>
-        </w:rPr>
-        <w:t xml:space="preserve">policy DSL and simulation mode</w:t>
-      </w:r>
-    </w:p>
-    <w:p>
-      <w:pPr>
-        <w:ind w:left="720" w:first-line="-720"/>
-      </w:pPr>
-      <w:r>
-        <w:rPr>
-          <w:rFonts w:ascii="Helvetica Neue" w:hAnsi="Helvetica Neue" w:cs="Helvetica Neue"/>
-          <w:sz w:val="24"/>
-          <w:sz-cs w:val="24"/>
-          <w:color w:val="181F26"/>
-        </w:rPr>
-        <w:t xml:space="preserve"/>
-        <w:tab/>
-        <w:t xml:space="preserve">•</w:t>
-        <w:tab/>
-        <w:t xml:space="preserve"/>
-      </w:r>
-      <w:r>
-        <w:rPr>
-          <w:rFonts w:ascii="Helvetica Neue" w:hAnsi="Helvetica Neue" w:cs="Helvetica Neue"/>
-          <w:sz w:val="24"/>
-          <w:sz-cs w:val="24"/>
-          <w:spacing w:val="0"/>
-          <w:color w:val="181F26"/>
-        </w:rPr>
-        <w:t xml:space="preserve">advanced multi-tenant control plane</w:t>
-      </w:r>
-    </w:p>
-    <w:p>
-      <w:pPr>
-        <w:ind w:left="720" w:first-line="-720"/>
-      </w:pPr>
-      <w:r>
-        <w:rPr>
-          <w:rFonts w:ascii="Helvetica Neue" w:hAnsi="Helvetica Neue" w:cs="Helvetica Neue"/>
-          <w:sz w:val="24"/>
-          <w:sz-cs w:val="24"/>
-          <w:color w:val="181F26"/>
-        </w:rPr>
-        <w:t xml:space="preserve"/>
-        <w:tab/>
-        <w:t xml:space="preserve">•</w:t>
-        <w:tab/>
-        <w:t xml:space="preserve"/>
-      </w:r>
-      <w:r>
-        <w:rPr>
-          <w:rFonts w:ascii="Helvetica Neue" w:hAnsi="Helvetica Neue" w:cs="Helvetica Neue"/>
-          <w:sz w:val="24"/>
-          <w:sz-cs w:val="24"/>
-          <w:spacing w:val="0"/>
-          <w:color w:val="181F26"/>
-        </w:rPr>
-        <w:t xml:space="preserve">remote governance treaties and federation policy packs</w:t>
-      </w:r>
-    </w:p>
-    <w:p>
-      <w:pPr>
-        <w:ind w:left="720" w:first-line="-720"/>
-      </w:pPr>
-      <w:r>
-        <w:rPr>
-          <w:rFonts w:ascii="Helvetica Neue" w:hAnsi="Helvetica Neue" w:cs="Helvetica Neue"/>
-          <w:sz w:val="24"/>
-          <w:sz-cs w:val="24"/>
-          <w:color w:val="181F26"/>
-        </w:rPr>
-        <w:t xml:space="preserve"/>
-        <w:tab/>
-        <w:t xml:space="preserve">•</w:t>
-        <w:tab/>
-        <w:t xml:space="preserve"/>
-      </w:r>
-      <w:r>
-        <w:rPr>
-          <w:rFonts w:ascii="Helvetica Neue" w:hAnsi="Helvetica Neue" w:cs="Helvetica Neue"/>
-          <w:sz w:val="24"/>
-          <w:sz-cs w:val="24"/>
-          <w:spacing w:val="0"/>
-          <w:color w:val="181F26"/>
-        </w:rPr>
-        <w:t xml:space="preserve">additional transport plugins</w:t>
-      </w:r>
-    </w:p>
-    <w:p>
-      <w:pPr>
-        <w:ind w:left="720" w:first-line="-720"/>
-      </w:pPr>
-      <w:r>
-        <w:rPr>
-          <w:rFonts w:ascii="Helvetica Neue" w:hAnsi="Helvetica Neue" w:cs="Helvetica Neue"/>
-          <w:sz w:val="24"/>
-          <w:sz-cs w:val="24"/>
-          <w:color w:val="181F26"/>
-        </w:rPr>
-        <w:t xml:space="preserve"/>
-        <w:tab/>
-        <w:t xml:space="preserve">•</w:t>
-        <w:tab/>
-        <w:t xml:space="preserve"/>
-      </w:r>
-      <w:r>
-        <w:rPr>
-          <w:rFonts w:ascii="Helvetica Neue" w:hAnsi="Helvetica Neue" w:cs="Helvetica Neue"/>
-          <w:sz w:val="24"/>
-          <w:sz-cs w:val="24"/>
-          <w:spacing w:val="0"/>
-          <w:color w:val="181F26"/>
-        </w:rPr>
-        <w:t xml:space="preserve">adaptive scheduling based on historical cost and success curves</w:t>
-      </w:r>
-    </w:p>
-    <w:p>
-      <w:pPr>
-        <w:ind w:left="720" w:first-line="-720"/>
-      </w:pPr>
-      <w:r>
-        <w:rPr>
-          <w:rFonts w:ascii="Helvetica Neue" w:hAnsi="Helvetica Neue" w:cs="Helvetica Neue"/>
-          <w:sz w:val="24"/>
-          <w:sz-cs w:val="24"/>
-          <w:color w:val="181F26"/>
-        </w:rPr>
-        <w:t xml:space="preserve"/>
-        <w:tab/>
-        <w:t xml:space="preserve">•</w:t>
-        <w:tab/>
-        <w:t xml:space="preserve"/>
-      </w:r>
-      <w:r>
-        <w:rPr>
-          <w:rFonts w:ascii="Helvetica Neue" w:hAnsi="Helvetica Neue" w:cs="Helvetica Neue"/>
-          <w:sz w:val="24"/>
-          <w:sz-cs w:val="24"/>
-          <w:spacing w:val="0"/>
-          <w:color w:val="181F26"/>
-        </w:rPr>
-        <w:t xml:space="preserve">controlled self-evolution tooling for routing, thresholds, and rule proposals</w:t>
+        <w:t xml:space="preserve">P1 Scope</w:t>
+      </w:r>
+    </w:p>
+    <w:p>
+      <w:pPr>
+        <w:ind w:left="720" w:first-line="-720"/>
+      </w:pPr>
+      <w:r>
+        <w:rPr>
+          <w:rFonts w:ascii="Helvetica Neue" w:hAnsi="Helvetica Neue" w:cs="Helvetica Neue"/>
+          <w:sz w:val="24"/>
+          <w:sz-cs w:val="24"/>
+          <w:color w:val="181F26"/>
+        </w:rPr>
+        <w:t xml:space="preserve"/>
+        <w:tab/>
+        <w:t xml:space="preserve">•</w:t>
+        <w:tab/>
+        <w:t xml:space="preserve"/>
+      </w:r>
+      <w:r>
+        <w:rPr>
+          <w:rFonts w:ascii="Helvetica Neue" w:hAnsi="Helvetica Neue" w:cs="Helvetica Neue"/>
+          <w:sz w:val="24"/>
+          <w:sz-cs w:val="24"/>
+          <w:spacing w:val="0"/>
+          <w:color w:val="181F26"/>
+        </w:rPr>
+        <w:t xml:space="preserve">production same-device encounter enforcement</w:t>
+      </w:r>
+    </w:p>
+    <w:p>
+      <w:pPr>
+        <w:ind w:left="720" w:first-line="-720"/>
+      </w:pPr>
+      <w:r>
+        <w:rPr>
+          <w:rFonts w:ascii="Helvetica Neue" w:hAnsi="Helvetica Neue" w:cs="Helvetica Neue"/>
+          <w:sz w:val="24"/>
+          <w:sz-cs w:val="24"/>
+          <w:color w:val="181F26"/>
+        </w:rPr>
+        <w:t xml:space="preserve"/>
+        <w:tab/>
+        <w:t xml:space="preserve">•</w:t>
+        <w:tab/>
+        <w:t xml:space="preserve"/>
+      </w:r>
+      <w:r>
+        <w:rPr>
+          <w:rFonts w:ascii="Helvetica Neue" w:hAnsi="Helvetica Neue" w:cs="Helvetica Neue"/>
+          <w:sz w:val="24"/>
+          <w:sz-cs w:val="24"/>
+          <w:spacing w:val="0"/>
+          <w:color w:val="181F26"/>
+        </w:rPr>
+        <w:t xml:space="preserve">consent-grant and capability-lease issuance</w:t>
+      </w:r>
+    </w:p>
+    <w:p>
+      <w:pPr>
+        <w:ind w:left="720" w:first-line="-720"/>
+      </w:pPr>
+      <w:r>
+        <w:rPr>
+          <w:rFonts w:ascii="Helvetica Neue" w:hAnsi="Helvetica Neue" w:cs="Helvetica Neue"/>
+          <w:sz w:val="24"/>
+          <w:sz-cs w:val="24"/>
+          <w:color w:val="181F26"/>
+        </w:rPr>
+        <w:t xml:space="preserve"/>
+        <w:tab/>
+        <w:t xml:space="preserve">•</w:t>
+        <w:tab/>
+        <w:t xml:space="preserve"/>
+      </w:r>
+      <w:r>
+        <w:rPr>
+          <w:rFonts w:ascii="Helvetica Neue" w:hAnsi="Helvetica Neue" w:cs="Helvetica Neue"/>
+          <w:sz w:val="24"/>
+          <w:sz-cs w:val="24"/>
+          <w:spacing w:val="0"/>
+          <w:color w:val="181F26"/>
+        </w:rPr>
+        <w:t xml:space="preserve">audit receipt emission and revocation handling</w:t>
+      </w:r>
+    </w:p>
+    <w:p>
+      <w:pPr>
+        <w:ind w:left="720" w:first-line="-720"/>
+      </w:pPr>
+      <w:r>
+        <w:rPr>
+          <w:rFonts w:ascii="Helvetica Neue" w:hAnsi="Helvetica Neue" w:cs="Helvetica Neue"/>
+          <w:sz w:val="24"/>
+          <w:sz-cs w:val="24"/>
+          <w:color w:val="181F26"/>
+        </w:rPr>
+        <w:t xml:space="preserve"/>
+        <w:tab/>
+        <w:t xml:space="preserve">•</w:t>
+        <w:tab/>
+        <w:t xml:space="preserve"/>
+      </w:r>
+      <w:r>
+        <w:rPr>
+          <w:rFonts w:ascii="Helvetica Neue" w:hAnsi="Helvetica Neue" w:cs="Helvetica Neue"/>
+          <w:sz w:val="24"/>
+          <w:sz-cs w:val="24"/>
+          <w:spacing w:val="0"/>
+          <w:color w:val="181F26"/>
+        </w:rPr>
+        <w:t xml:space="preserve">OpenClaw inbound plugin and Gateway RPC bridge</w:t>
+      </w:r>
+    </w:p>
+    <w:p>
+      <w:pPr>
+        <w:ind w:left="720" w:first-line="-720"/>
+      </w:pPr>
+      <w:r>
+        <w:rPr>
+          <w:rFonts w:ascii="Helvetica Neue" w:hAnsi="Helvetica Neue" w:cs="Helvetica Neue"/>
+          <w:sz w:val="24"/>
+          <w:sz-cs w:val="24"/>
+          <w:color w:val="181F26"/>
+        </w:rPr>
+        <w:t xml:space="preserve"/>
+        <w:tab/>
+        <w:t xml:space="preserve">•</w:t>
+        <w:tab/>
+        <w:t xml:space="preserve"/>
+      </w:r>
+      <w:r>
+        <w:rPr>
+          <w:rFonts w:ascii="Helvetica Neue" w:hAnsi="Helvetica Neue" w:cs="Helvetica Neue"/>
+          <w:sz w:val="24"/>
+          <w:sz-cs w:val="24"/>
+          <w:spacing w:val="0"/>
+          <w:color w:val="181F26"/>
+        </w:rPr>
+        <w:t xml:space="preserve">OpenClaw outbound Gateway adapter for agent execution</w:t>
+      </w:r>
+    </w:p>
+    <w:p>
+      <w:pPr>
+        <w:ind w:left="720" w:first-line="-720"/>
+      </w:pPr>
+      <w:r>
+        <w:rPr>
+          <w:rFonts w:ascii="Helvetica Neue" w:hAnsi="Helvetica Neue" w:cs="Helvetica Neue"/>
+          <w:sz w:val="24"/>
+          <w:sz-cs w:val="24"/>
+          <w:color w:val="181F26"/>
+        </w:rPr>
+        <w:t xml:space="preserve"/>
+        <w:tab/>
+        <w:t xml:space="preserve">•</w:t>
+        <w:tab/>
+        <w:t xml:space="preserve"/>
+      </w:r>
+      <w:r>
+        <w:rPr>
+          <w:rFonts w:ascii="Helvetica Neue" w:hAnsi="Helvetica Neue" w:cs="Helvetica Neue"/>
+          <w:sz w:val="24"/>
+          <w:sz-cs w:val="24"/>
+          <w:spacing w:val="0"/>
+          <w:color w:val="181F26"/>
+        </w:rPr>
+        <w:t xml:space="preserve">Ralph-style verify loop for coding-heavy capability classes</w:t>
+      </w:r>
+    </w:p>
+    <w:p>
+      <w:pPr>
+        <w:ind w:left="720" w:first-line="-720"/>
+      </w:pPr>
+      <w:r>
+        <w:rPr>
+          <w:rFonts w:ascii="Helvetica Neue" w:hAnsi="Helvetica Neue" w:cs="Helvetica Neue"/>
+          <w:sz w:val="24"/>
+          <w:sz-cs w:val="24"/>
+          <w:color w:val="181F26"/>
+        </w:rPr>
+        <w:t xml:space="preserve"/>
+        <w:tab/>
+        <w:t xml:space="preserve">•</w:t>
+        <w:tab/>
+        <w:t xml:space="preserve"/>
+      </w:r>
+      <w:r>
+        <w:rPr>
+          <w:rFonts w:ascii="Helvetica Neue" w:hAnsi="Helvetica Neue" w:cs="Helvetica Neue"/>
+          <w:sz w:val="24"/>
+          <w:sz-cs w:val="24"/>
+          <w:spacing w:val="0"/>
+          <w:color w:val="181F26"/>
+        </w:rPr>
+        <w:t xml:space="preserve">deterministic verifiers for coding actions</w:t>
+      </w:r>
+    </w:p>
+    <w:p>
+      <w:pPr>
+        <w:ind w:left="720" w:first-line="-720"/>
+      </w:pPr>
+      <w:r>
+        <w:rPr>
+          <w:rFonts w:ascii="Helvetica Neue" w:hAnsi="Helvetica Neue" w:cs="Helvetica Neue"/>
+          <w:sz w:val="24"/>
+          <w:sz-cs w:val="24"/>
+          <w:color w:val="181F26"/>
+        </w:rPr>
+        <w:t xml:space="preserve"/>
+        <w:tab/>
+        <w:t xml:space="preserve">•</w:t>
+        <w:tab/>
+        <w:t xml:space="preserve"/>
+      </w:r>
+      <w:r>
+        <w:rPr>
+          <w:rFonts w:ascii="Helvetica Neue" w:hAnsi="Helvetica Neue" w:cs="Helvetica Neue"/>
+          <w:sz w:val="24"/>
+          <w:sz-cs w:val="24"/>
+          <w:spacing w:val="0"/>
+          <w:color w:val="181F26"/>
+        </w:rPr>
+        <w:t xml:space="preserve">ACP-compatible harness adapters</w:t>
+      </w:r>
+    </w:p>
+    <w:p>
+      <w:pPr>
+        <w:ind w:left="720" w:first-line="-720"/>
+      </w:pPr>
+      <w:r>
+        <w:rPr>
+          <w:rFonts w:ascii="Helvetica Neue" w:hAnsi="Helvetica Neue" w:cs="Helvetica Neue"/>
+          <w:sz w:val="24"/>
+          <w:sz-cs w:val="24"/>
+          <w:color w:val="181F26"/>
+        </w:rPr>
+        <w:t xml:space="preserve"/>
+        <w:tab/>
+        <w:t xml:space="preserve">•</w:t>
+        <w:tab/>
+        <w:t xml:space="preserve"/>
+      </w:r>
+      <w:r>
+        <w:rPr>
+          <w:rFonts w:ascii="Helvetica Neue" w:hAnsi="Helvetica Neue" w:cs="Helvetica Neue"/>
+          <w:sz w:val="24"/>
+          <w:sz-cs w:val="24"/>
+          <w:spacing w:val="0"/>
+          <w:color w:val="181F26"/>
+        </w:rPr>
+        <w:t xml:space="preserve">ACPX-like harness router or broker integration pattern</w:t>
+      </w:r>
+    </w:p>
+    <w:p>
+      <w:pPr>
+        <w:ind w:left="720" w:first-line="-720"/>
+      </w:pPr>
+      <w:r>
+        <w:rPr>
+          <w:rFonts w:ascii="Helvetica Neue" w:hAnsi="Helvetica Neue" w:cs="Helvetica Neue"/>
+          <w:sz w:val="24"/>
+          <w:sz-cs w:val="24"/>
+          <w:color w:val="181F26"/>
+        </w:rPr>
+        <w:t xml:space="preserve"/>
+        <w:tab/>
+        <w:t xml:space="preserve">•</w:t>
+        <w:tab/>
+        <w:t xml:space="preserve"/>
+      </w:r>
+      <w:r>
+        <w:rPr>
+          <w:rFonts w:ascii="Helvetica Neue" w:hAnsi="Helvetica Neue" w:cs="Helvetica Neue"/>
+          <w:sz w:val="24"/>
+          <w:sz-cs w:val="24"/>
+          <w:spacing w:val="0"/>
+          <w:color w:val="181F26"/>
+        </w:rPr>
+        <w:t xml:space="preserve">A2A connector with policy-preserving remote delegation</w:t>
+      </w:r>
+    </w:p>
+    <w:p>
+      <w:pPr>
+        <w:ind w:left="720" w:first-line="-720"/>
+      </w:pPr>
+      <w:r>
+        <w:rPr>
+          <w:rFonts w:ascii="Helvetica Neue" w:hAnsi="Helvetica Neue" w:cs="Helvetica Neue"/>
+          <w:sz w:val="24"/>
+          <w:sz-cs w:val="24"/>
+          <w:color w:val="181F26"/>
+        </w:rPr>
+        <w:t xml:space="preserve"/>
+        <w:tab/>
+        <w:t xml:space="preserve">•</w:t>
+        <w:tab/>
+        <w:t xml:space="preserve"/>
+      </w:r>
+      <w:r>
+        <w:rPr>
+          <w:rFonts w:ascii="Helvetica Neue" w:hAnsi="Helvetica Neue" w:cs="Helvetica Neue"/>
+          <w:sz w:val="24"/>
+          <w:sz-cs w:val="24"/>
+          <w:spacing w:val="0"/>
+          <w:color w:val="181F26"/>
+        </w:rPr>
+        <w:t xml:space="preserve">local subprocess wrappers where ACP is unavailable</w:t>
+      </w:r>
+    </w:p>
+    <w:p>
+      <w:pPr>
+        <w:ind w:left="720" w:first-line="-720"/>
+      </w:pPr>
+      <w:r>
+        <w:rPr>
+          <w:rFonts w:ascii="Helvetica Neue" w:hAnsi="Helvetica Neue" w:cs="Helvetica Neue"/>
+          <w:sz w:val="24"/>
+          <w:sz-cs w:val="24"/>
+          <w:color w:val="181F26"/>
+        </w:rPr>
+        <w:t xml:space="preserve"/>
+        <w:tab/>
+        <w:t xml:space="preserve">•</w:t>
+        <w:tab/>
+        <w:t xml:space="preserve"/>
+      </w:r>
+      <w:r>
+        <w:rPr>
+          <w:rFonts w:ascii="Helvetica Neue" w:hAnsi="Helvetica Neue" w:cs="Helvetica Neue"/>
+          <w:sz w:val="24"/>
+          <w:sz-cs w:val="24"/>
+          <w:spacing w:val="0"/>
+          <w:color w:val="181F26"/>
+        </w:rPr>
+        <w:t xml:space="preserve">visual fleet dashboard</w:t>
+      </w:r>
+    </w:p>
+    <w:p>
+      <w:pPr>
+        <w:ind w:left="720" w:first-line="-720"/>
+      </w:pPr>
+      <w:r>
+        <w:rPr>
+          <w:rFonts w:ascii="Helvetica Neue" w:hAnsi="Helvetica Neue" w:cs="Helvetica Neue"/>
+          <w:sz w:val="24"/>
+          <w:sz-cs w:val="24"/>
+          <w:color w:val="181F26"/>
+        </w:rPr>
+        <w:t xml:space="preserve"/>
+        <w:tab/>
+        <w:t xml:space="preserve">•</w:t>
+        <w:tab/>
+        <w:t xml:space="preserve"/>
+      </w:r>
+      <w:r>
+        <w:rPr>
+          <w:rFonts w:ascii="Helvetica Neue" w:hAnsi="Helvetica Neue" w:cs="Helvetica Neue"/>
+          <w:sz w:val="24"/>
+          <w:sz-cs w:val="24"/>
+          <w:spacing w:val="0"/>
+          <w:color w:val="181F26"/>
+        </w:rPr>
+        <w:t xml:space="preserve">multi-host supervisor and leased worker model</w:t>
+      </w:r>
+    </w:p>
+    <w:p>
+      <w:pPr>
+        <w:ind w:left="720" w:first-line="-720"/>
+      </w:pPr>
+      <w:r>
+        <w:rPr>
+          <w:rFonts w:ascii="Helvetica Neue" w:hAnsi="Helvetica Neue" w:cs="Helvetica Neue"/>
+          <w:sz w:val="24"/>
+          <w:sz-cs w:val="24"/>
+          <w:color w:val="181F26"/>
+        </w:rPr>
+        <w:t xml:space="preserve"/>
+        <w:tab/>
+        <w:t xml:space="preserve">•</w:t>
+        <w:tab/>
+        <w:t xml:space="preserve"/>
+      </w:r>
+      <w:r>
+        <w:rPr>
+          <w:rFonts w:ascii="Helvetica Neue" w:hAnsi="Helvetica Neue" w:cs="Helvetica Neue"/>
+          <w:sz w:val="24"/>
+          <w:sz-cs w:val="24"/>
+          <w:spacing w:val="0"/>
+          <w:color w:val="181F26"/>
+        </w:rPr>
+        <w:t xml:space="preserve">context compression and memory compaction hooks</w:t>
+      </w:r>
+    </w:p>
+    <w:p>
+      <w:pPr>
+        <w:ind w:left="720" w:first-line="-720"/>
+      </w:pPr>
+      <w:r>
+        <w:rPr>
+          <w:rFonts w:ascii="Helvetica Neue" w:hAnsi="Helvetica Neue" w:cs="Helvetica Neue"/>
+          <w:sz w:val="24"/>
+          <w:sz-cs w:val="24"/>
+          <w:color w:val="181F26"/>
+        </w:rPr>
+        <w:t xml:space="preserve"/>
+        <w:tab/>
+        <w:t xml:space="preserve">•</w:t>
+        <w:tab/>
+        <w:t xml:space="preserve"/>
+      </w:r>
+      <w:r>
+        <w:rPr>
+          <w:rFonts w:ascii="Helvetica Neue" w:hAnsi="Helvetica Neue" w:cs="Helvetica Neue"/>
+          <w:sz w:val="24"/>
+          <w:sz-cs w:val="24"/>
+          <w:spacing w:val="0"/>
+          <w:color w:val="181F26"/>
+        </w:rPr>
+        <w:t xml:space="preserve">evaluation and review hooks tied to quality policy</w:t>
       </w:r>
     </w:p>
     <w:p>
@@ -31735,203 +32349,203 @@
           <w:spacing w:val="0"/>
           <w:color w:val="102C4B"/>
         </w:rPr>
-        <w:t xml:space="preserve">Out Of Scope For v0.1</w:t>
-      </w:r>
-    </w:p>
-    <w:p>
-      <w:pPr>
-        <w:ind w:left="720" w:first-line="-720"/>
-      </w:pPr>
-      <w:r>
-        <w:rPr>
-          <w:rFonts w:ascii="Helvetica Neue" w:hAnsi="Helvetica Neue" w:cs="Helvetica Neue"/>
-          <w:sz w:val="24"/>
-          <w:sz-cs w:val="24"/>
-          <w:color w:val="181F26"/>
-        </w:rPr>
-        <w:t xml:space="preserve"/>
-        <w:tab/>
-        <w:t xml:space="preserve">•</w:t>
-        <w:tab/>
-        <w:t xml:space="preserve"/>
-      </w:r>
-      <w:r>
-        <w:rPr>
-          <w:rFonts w:ascii="Helvetica Neue" w:hAnsi="Helvetica Neue" w:cs="Helvetica Neue"/>
-          <w:sz w:val="24"/>
-          <w:sz-cs w:val="24"/>
-          <w:spacing w:val="0"/>
-          <w:color w:val="181F26"/>
-        </w:rPr>
-        <w:t xml:space="preserve">consumer assistant experiences</w:t>
-      </w:r>
-    </w:p>
-    <w:p>
-      <w:pPr>
-        <w:ind w:left="720" w:first-line="-720"/>
-      </w:pPr>
-      <w:r>
-        <w:rPr>
-          <w:rFonts w:ascii="Helvetica Neue" w:hAnsi="Helvetica Neue" w:cs="Helvetica Neue"/>
-          <w:sz w:val="24"/>
-          <w:sz-cs w:val="24"/>
-          <w:color w:val="181F26"/>
-        </w:rPr>
-        <w:t xml:space="preserve"/>
-        <w:tab/>
-        <w:t xml:space="preserve">•</w:t>
-        <w:tab/>
-        <w:t xml:space="preserve"/>
-      </w:r>
-      <w:r>
-        <w:rPr>
-          <w:rFonts w:ascii="Helvetica Neue" w:hAnsi="Helvetica Neue" w:cs="Helvetica Neue"/>
-          <w:sz w:val="24"/>
-          <w:sz-cs w:val="24"/>
-          <w:spacing w:val="0"/>
-          <w:color w:val="181F26"/>
-        </w:rPr>
-        <w:t xml:space="preserve">visual-first builders</w:t>
-      </w:r>
-    </w:p>
-    <w:p>
-      <w:pPr>
-        <w:ind w:left="720" w:first-line="-720"/>
-      </w:pPr>
-      <w:r>
-        <w:rPr>
-          <w:rFonts w:ascii="Helvetica Neue" w:hAnsi="Helvetica Neue" w:cs="Helvetica Neue"/>
-          <w:sz w:val="24"/>
-          <w:sz-cs w:val="24"/>
-          <w:color w:val="181F26"/>
-        </w:rPr>
-        <w:t xml:space="preserve"/>
-        <w:tab/>
-        <w:t xml:space="preserve">•</w:t>
-        <w:tab/>
-        <w:t xml:space="preserve"/>
-      </w:r>
-      <w:r>
-        <w:rPr>
-          <w:rFonts w:ascii="Helvetica Neue" w:hAnsi="Helvetica Neue" w:cs="Helvetica Neue"/>
-          <w:sz w:val="24"/>
-          <w:sz-cs w:val="24"/>
-          <w:spacing w:val="0"/>
-          <w:color w:val="181F26"/>
-        </w:rPr>
-        <w:t xml:space="preserve">cluster orchestration beyond the single-host reference architecture</w:t>
-      </w:r>
-    </w:p>
-    <w:p>
-      <w:pPr>
-        <w:ind w:left="720" w:first-line="-720"/>
-      </w:pPr>
-      <w:r>
-        <w:rPr>
-          <w:rFonts w:ascii="Helvetica Neue" w:hAnsi="Helvetica Neue" w:cs="Helvetica Neue"/>
-          <w:sz w:val="24"/>
-          <w:sz-cs w:val="24"/>
-          <w:color w:val="181F26"/>
-        </w:rPr>
-        <w:t xml:space="preserve"/>
-        <w:tab/>
-        <w:t xml:space="preserve">•</w:t>
-        <w:tab/>
-        <w:t xml:space="preserve"/>
-      </w:r>
-      <w:r>
-        <w:rPr>
-          <w:rFonts w:ascii="Helvetica Neue" w:hAnsi="Helvetica Neue" w:cs="Helvetica Neue"/>
-          <w:sz w:val="24"/>
-          <w:sz-cs w:val="24"/>
-          <w:spacing w:val="0"/>
-          <w:color w:val="181F26"/>
-        </w:rPr>
-        <w:t xml:space="preserve">OpenClaw, ACP, or A2A execution in production paths</w:t>
-      </w:r>
-    </w:p>
-    <w:p>
-      <w:pPr>
-        <w:ind w:left="720" w:first-line="-720"/>
-      </w:pPr>
-      <w:r>
-        <w:rPr>
-          <w:rFonts w:ascii="Helvetica Neue" w:hAnsi="Helvetica Neue" w:cs="Helvetica Neue"/>
-          <w:sz w:val="24"/>
-          <w:sz-cs w:val="24"/>
-          <w:color w:val="181F26"/>
-        </w:rPr>
-        <w:t xml:space="preserve"/>
-        <w:tab/>
-        <w:t xml:space="preserve">•</w:t>
-        <w:tab/>
-        <w:t xml:space="preserve"/>
-      </w:r>
-      <w:r>
-        <w:rPr>
-          <w:rFonts w:ascii="Helvetica Neue" w:hAnsi="Helvetica Neue" w:cs="Helvetica Neue"/>
-          <w:sz w:val="24"/>
-          <w:sz-cs w:val="24"/>
-          <w:spacing w:val="0"/>
-          <w:color w:val="181F26"/>
-        </w:rPr>
-        <w:t xml:space="preserve">reputation systems, marketplaces, or dispute resolution between owners</w:t>
-      </w:r>
-    </w:p>
-    <w:p>
-      <w:pPr>
-        <w:ind w:left="720" w:first-line="-720"/>
-      </w:pPr>
-      <w:r>
-        <w:rPr>
-          <w:rFonts w:ascii="Helvetica Neue" w:hAnsi="Helvetica Neue" w:cs="Helvetica Neue"/>
-          <w:sz w:val="24"/>
-          <w:sz-cs w:val="24"/>
-          <w:color w:val="181F26"/>
-        </w:rPr>
-        <w:t xml:space="preserve"/>
-        <w:tab/>
-        <w:t xml:space="preserve">•</w:t>
-        <w:tab/>
-        <w:t xml:space="preserve"/>
-      </w:r>
-      <w:r>
-        <w:rPr>
-          <w:rFonts w:ascii="Helvetica Neue" w:hAnsi="Helvetica Neue" w:cs="Helvetica Neue"/>
-          <w:sz w:val="24"/>
-          <w:sz-cs w:val="24"/>
-          <w:spacing w:val="0"/>
-          <w:color w:val="181F26"/>
-        </w:rPr>
-        <w:t xml:space="preserve">enterprise multi-tenancy beyond foundational propagation rules</w:t>
-      </w:r>
-    </w:p>
-    <w:p>
-      <w:pPr>
-        <w:ind w:left="720" w:first-line="-720"/>
-      </w:pPr>
-      <w:r>
-        <w:rPr>
-          <w:rFonts w:ascii="Helvetica Neue" w:hAnsi="Helvetica Neue" w:cs="Helvetica Neue"/>
-          <w:sz w:val="24"/>
-          <w:sz-cs w:val="24"/>
-          <w:color w:val="181F26"/>
-        </w:rPr>
-        <w:t xml:space="preserve"/>
-        <w:tab/>
-        <w:t xml:space="preserve">•</w:t>
-        <w:tab/>
-        <w:t xml:space="preserve"/>
-      </w:r>
-      <w:r>
-        <w:rPr>
-          <w:rFonts w:ascii="Helvetica Neue" w:hAnsi="Helvetica Neue" w:cs="Helvetica Neue"/>
-          <w:sz w:val="24"/>
-          <w:sz-cs w:val="24"/>
-          <w:spacing w:val="0"/>
-          <w:color w:val="181F26"/>
-        </w:rPr>
-        <w:t xml:space="preserve">unrestricted runtime self-modification</w:t>
+        <w:t xml:space="preserve">P2 Scope</w:t>
+      </w:r>
+    </w:p>
+    <w:p>
+      <w:pPr>
+        <w:ind w:left="720" w:first-line="-720"/>
+      </w:pPr>
+      <w:r>
+        <w:rPr>
+          <w:rFonts w:ascii="Helvetica Neue" w:hAnsi="Helvetica Neue" w:cs="Helvetica Neue"/>
+          <w:sz w:val="24"/>
+          <w:sz-cs w:val="24"/>
+          <w:color w:val="181F26"/>
+        </w:rPr>
+        <w:t xml:space="preserve"/>
+        <w:tab/>
+        <w:t xml:space="preserve">•</w:t>
+        <w:tab/>
+        <w:t xml:space="preserve"/>
+      </w:r>
+      <w:r>
+        <w:rPr>
+          <w:rFonts w:ascii="Helvetica Neue" w:hAnsi="Helvetica Neue" w:cs="Helvetica Neue"/>
+          <w:sz w:val="24"/>
+          <w:sz-cs w:val="24"/>
+          <w:spacing w:val="0"/>
+          <w:color w:val="181F26"/>
+        </w:rPr>
+        <w:t xml:space="preserve">marketplace and reusable capability packs</w:t>
+      </w:r>
+    </w:p>
+    <w:p>
+      <w:pPr>
+        <w:ind w:left="720" w:first-line="-720"/>
+      </w:pPr>
+      <w:r>
+        <w:rPr>
+          <w:rFonts w:ascii="Helvetica Neue" w:hAnsi="Helvetica Neue" w:cs="Helvetica Neue"/>
+          <w:sz w:val="24"/>
+          <w:sz-cs w:val="24"/>
+          <w:color w:val="181F26"/>
+        </w:rPr>
+        <w:t xml:space="preserve"/>
+        <w:tab/>
+        <w:t xml:space="preserve">•</w:t>
+        <w:tab/>
+        <w:t xml:space="preserve"/>
+      </w:r>
+      <w:r>
+        <w:rPr>
+          <w:rFonts w:ascii="Helvetica Neue" w:hAnsi="Helvetica Neue" w:cs="Helvetica Neue"/>
+          <w:sz w:val="24"/>
+          <w:sz-cs w:val="24"/>
+          <w:spacing w:val="0"/>
+          <w:color w:val="181F26"/>
+        </w:rPr>
+        <w:t xml:space="preserve">policy DSL and simulation mode</w:t>
+      </w:r>
+    </w:p>
+    <w:p>
+      <w:pPr>
+        <w:ind w:left="720" w:first-line="-720"/>
+      </w:pPr>
+      <w:r>
+        <w:rPr>
+          <w:rFonts w:ascii="Helvetica Neue" w:hAnsi="Helvetica Neue" w:cs="Helvetica Neue"/>
+          <w:sz w:val="24"/>
+          <w:sz-cs w:val="24"/>
+          <w:color w:val="181F26"/>
+        </w:rPr>
+        <w:t xml:space="preserve"/>
+        <w:tab/>
+        <w:t xml:space="preserve">•</w:t>
+        <w:tab/>
+        <w:t xml:space="preserve"/>
+      </w:r>
+      <w:r>
+        <w:rPr>
+          <w:rFonts w:ascii="Helvetica Neue" w:hAnsi="Helvetica Neue" w:cs="Helvetica Neue"/>
+          <w:sz w:val="24"/>
+          <w:sz-cs w:val="24"/>
+          <w:spacing w:val="0"/>
+          <w:color w:val="181F26"/>
+        </w:rPr>
+        <w:t xml:space="preserve">advanced multi-tenant control plane</w:t>
+      </w:r>
+    </w:p>
+    <w:p>
+      <w:pPr>
+        <w:ind w:left="720" w:first-line="-720"/>
+      </w:pPr>
+      <w:r>
+        <w:rPr>
+          <w:rFonts w:ascii="Helvetica Neue" w:hAnsi="Helvetica Neue" w:cs="Helvetica Neue"/>
+          <w:sz w:val="24"/>
+          <w:sz-cs w:val="24"/>
+          <w:color w:val="181F26"/>
+        </w:rPr>
+        <w:t xml:space="preserve"/>
+        <w:tab/>
+        <w:t xml:space="preserve">•</w:t>
+        <w:tab/>
+        <w:t xml:space="preserve"/>
+      </w:r>
+      <w:r>
+        <w:rPr>
+          <w:rFonts w:ascii="Helvetica Neue" w:hAnsi="Helvetica Neue" w:cs="Helvetica Neue"/>
+          <w:sz w:val="24"/>
+          <w:sz-cs w:val="24"/>
+          <w:spacing w:val="0"/>
+          <w:color w:val="181F26"/>
+        </w:rPr>
+        <w:t xml:space="preserve">remote governance treaties and federation policy packs</w:t>
+      </w:r>
+    </w:p>
+    <w:p>
+      <w:pPr>
+        <w:ind w:left="720" w:first-line="-720"/>
+      </w:pPr>
+      <w:r>
+        <w:rPr>
+          <w:rFonts w:ascii="Helvetica Neue" w:hAnsi="Helvetica Neue" w:cs="Helvetica Neue"/>
+          <w:sz w:val="24"/>
+          <w:sz-cs w:val="24"/>
+          <w:color w:val="181F26"/>
+        </w:rPr>
+        <w:t xml:space="preserve"/>
+        <w:tab/>
+        <w:t xml:space="preserve">•</w:t>
+        <w:tab/>
+        <w:t xml:space="preserve"/>
+      </w:r>
+      <w:r>
+        <w:rPr>
+          <w:rFonts w:ascii="Helvetica Neue" w:hAnsi="Helvetica Neue" w:cs="Helvetica Neue"/>
+          <w:sz w:val="24"/>
+          <w:sz-cs w:val="24"/>
+          <w:spacing w:val="0"/>
+          <w:color w:val="181F26"/>
+        </w:rPr>
+        <w:t xml:space="preserve">additional transport plugins</w:t>
+      </w:r>
+    </w:p>
+    <w:p>
+      <w:pPr>
+        <w:ind w:left="720" w:first-line="-720"/>
+      </w:pPr>
+      <w:r>
+        <w:rPr>
+          <w:rFonts w:ascii="Helvetica Neue" w:hAnsi="Helvetica Neue" w:cs="Helvetica Neue"/>
+          <w:sz w:val="24"/>
+          <w:sz-cs w:val="24"/>
+          <w:color w:val="181F26"/>
+        </w:rPr>
+        <w:t xml:space="preserve"/>
+        <w:tab/>
+        <w:t xml:space="preserve">•</w:t>
+        <w:tab/>
+        <w:t xml:space="preserve"/>
+      </w:r>
+      <w:r>
+        <w:rPr>
+          <w:rFonts w:ascii="Helvetica Neue" w:hAnsi="Helvetica Neue" w:cs="Helvetica Neue"/>
+          <w:sz w:val="24"/>
+          <w:sz-cs w:val="24"/>
+          <w:spacing w:val="0"/>
+          <w:color w:val="181F26"/>
+        </w:rPr>
+        <w:t xml:space="preserve">adaptive scheduling based on historical cost and success curves</w:t>
+      </w:r>
+    </w:p>
+    <w:p>
+      <w:pPr>
+        <w:ind w:left="720" w:first-line="-720"/>
+      </w:pPr>
+      <w:r>
+        <w:rPr>
+          <w:rFonts w:ascii="Helvetica Neue" w:hAnsi="Helvetica Neue" w:cs="Helvetica Neue"/>
+          <w:sz w:val="24"/>
+          <w:sz-cs w:val="24"/>
+          <w:color w:val="181F26"/>
+        </w:rPr>
+        <w:t xml:space="preserve"/>
+        <w:tab/>
+        <w:t xml:space="preserve">•</w:t>
+        <w:tab/>
+        <w:t xml:space="preserve"/>
+      </w:r>
+      <w:r>
+        <w:rPr>
+          <w:rFonts w:ascii="Helvetica Neue" w:hAnsi="Helvetica Neue" w:cs="Helvetica Neue"/>
+          <w:sz w:val="24"/>
+          <w:sz-cs w:val="24"/>
+          <w:spacing w:val="0"/>
+          <w:color w:val="181F26"/>
+        </w:rPr>
+        <w:t xml:space="preserve">controlled self-evolution tooling for routing, thresholds, and rule proposals</w:t>
       </w:r>
     </w:p>
     <w:p>
@@ -31947,6 +32561,218 @@
           <w:spacing w:val="0"/>
           <w:color w:val="102C4B"/>
         </w:rPr>
+        <w:t xml:space="preserve">Out Of Scope For v0.1</w:t>
+      </w:r>
+    </w:p>
+    <w:p>
+      <w:pPr>
+        <w:ind w:left="720" w:first-line="-720"/>
+      </w:pPr>
+      <w:r>
+        <w:rPr>
+          <w:rFonts w:ascii="Helvetica Neue" w:hAnsi="Helvetica Neue" w:cs="Helvetica Neue"/>
+          <w:sz w:val="24"/>
+          <w:sz-cs w:val="24"/>
+          <w:color w:val="181F26"/>
+        </w:rPr>
+        <w:t xml:space="preserve"/>
+        <w:tab/>
+        <w:t xml:space="preserve">•</w:t>
+        <w:tab/>
+        <w:t xml:space="preserve"/>
+      </w:r>
+      <w:r>
+        <w:rPr>
+          <w:rFonts w:ascii="Helvetica Neue" w:hAnsi="Helvetica Neue" w:cs="Helvetica Neue"/>
+          <w:sz w:val="24"/>
+          <w:sz-cs w:val="24"/>
+          <w:spacing w:val="0"/>
+          <w:color w:val="181F26"/>
+        </w:rPr>
+        <w:t xml:space="preserve">consumer assistant experiences</w:t>
+      </w:r>
+    </w:p>
+    <w:p>
+      <w:pPr>
+        <w:ind w:left="720" w:first-line="-720"/>
+      </w:pPr>
+      <w:r>
+        <w:rPr>
+          <w:rFonts w:ascii="Helvetica Neue" w:hAnsi="Helvetica Neue" w:cs="Helvetica Neue"/>
+          <w:sz w:val="24"/>
+          <w:sz-cs w:val="24"/>
+          <w:color w:val="181F26"/>
+        </w:rPr>
+        <w:t xml:space="preserve"/>
+        <w:tab/>
+        <w:t xml:space="preserve">•</w:t>
+        <w:tab/>
+        <w:t xml:space="preserve"/>
+      </w:r>
+      <w:r>
+        <w:rPr>
+          <w:rFonts w:ascii="Helvetica Neue" w:hAnsi="Helvetica Neue" w:cs="Helvetica Neue"/>
+          <w:sz w:val="24"/>
+          <w:sz-cs w:val="24"/>
+          <w:spacing w:val="0"/>
+          <w:color w:val="181F26"/>
+        </w:rPr>
+        <w:t xml:space="preserve">visual-first builders</w:t>
+      </w:r>
+    </w:p>
+    <w:p>
+      <w:pPr>
+        <w:ind w:left="720" w:first-line="-720"/>
+      </w:pPr>
+      <w:r>
+        <w:rPr>
+          <w:rFonts w:ascii="Helvetica Neue" w:hAnsi="Helvetica Neue" w:cs="Helvetica Neue"/>
+          <w:sz w:val="24"/>
+          <w:sz-cs w:val="24"/>
+          <w:color w:val="181F26"/>
+        </w:rPr>
+        <w:t xml:space="preserve"/>
+        <w:tab/>
+        <w:t xml:space="preserve">•</w:t>
+        <w:tab/>
+        <w:t xml:space="preserve"/>
+      </w:r>
+      <w:r>
+        <w:rPr>
+          <w:rFonts w:ascii="Helvetica Neue" w:hAnsi="Helvetica Neue" w:cs="Helvetica Neue"/>
+          <w:sz w:val="24"/>
+          <w:sz-cs w:val="24"/>
+          <w:spacing w:val="0"/>
+          <w:color w:val="181F26"/>
+        </w:rPr>
+        <w:t xml:space="preserve">cluster orchestration beyond the single-host reference architecture</w:t>
+      </w:r>
+    </w:p>
+    <w:p>
+      <w:pPr>
+        <w:ind w:left="720" w:first-line="-720"/>
+      </w:pPr>
+      <w:r>
+        <w:rPr>
+          <w:rFonts w:ascii="Helvetica Neue" w:hAnsi="Helvetica Neue" w:cs="Helvetica Neue"/>
+          <w:sz w:val="24"/>
+          <w:sz-cs w:val="24"/>
+          <w:color w:val="181F26"/>
+        </w:rPr>
+        <w:t xml:space="preserve"/>
+        <w:tab/>
+        <w:t xml:space="preserve">•</w:t>
+        <w:tab/>
+        <w:t xml:space="preserve"/>
+      </w:r>
+      <w:r>
+        <w:rPr>
+          <w:rFonts w:ascii="Helvetica Neue" w:hAnsi="Helvetica Neue" w:cs="Helvetica Neue"/>
+          <w:sz w:val="24"/>
+          <w:sz-cs w:val="24"/>
+          <w:spacing w:val="0"/>
+          <w:color w:val="181F26"/>
+        </w:rPr>
+        <w:t xml:space="preserve">OpenClaw, ACP, or A2A execution in production paths</w:t>
+      </w:r>
+    </w:p>
+    <w:p>
+      <w:pPr>
+        <w:ind w:left="720" w:first-line="-720"/>
+      </w:pPr>
+      <w:r>
+        <w:rPr>
+          <w:rFonts w:ascii="Helvetica Neue" w:hAnsi="Helvetica Neue" w:cs="Helvetica Neue"/>
+          <w:sz w:val="24"/>
+          <w:sz-cs w:val="24"/>
+          <w:color w:val="181F26"/>
+        </w:rPr>
+        <w:t xml:space="preserve"/>
+        <w:tab/>
+        <w:t xml:space="preserve">•</w:t>
+        <w:tab/>
+        <w:t xml:space="preserve"/>
+      </w:r>
+      <w:r>
+        <w:rPr>
+          <w:rFonts w:ascii="Helvetica Neue" w:hAnsi="Helvetica Neue" w:cs="Helvetica Neue"/>
+          <w:sz w:val="24"/>
+          <w:sz-cs w:val="24"/>
+          <w:spacing w:val="0"/>
+          <w:color w:val="181F26"/>
+        </w:rPr>
+        <w:t xml:space="preserve">reputation systems, marketplaces, or dispute resolution between owners</w:t>
+      </w:r>
+    </w:p>
+    <w:p>
+      <w:pPr>
+        <w:ind w:left="720" w:first-line="-720"/>
+      </w:pPr>
+      <w:r>
+        <w:rPr>
+          <w:rFonts w:ascii="Helvetica Neue" w:hAnsi="Helvetica Neue" w:cs="Helvetica Neue"/>
+          <w:sz w:val="24"/>
+          <w:sz-cs w:val="24"/>
+          <w:color w:val="181F26"/>
+        </w:rPr>
+        <w:t xml:space="preserve"/>
+        <w:tab/>
+        <w:t xml:space="preserve">•</w:t>
+        <w:tab/>
+        <w:t xml:space="preserve"/>
+      </w:r>
+      <w:r>
+        <w:rPr>
+          <w:rFonts w:ascii="Helvetica Neue" w:hAnsi="Helvetica Neue" w:cs="Helvetica Neue"/>
+          <w:sz w:val="24"/>
+          <w:sz-cs w:val="24"/>
+          <w:spacing w:val="0"/>
+          <w:color w:val="181F26"/>
+        </w:rPr>
+        <w:t xml:space="preserve">enterprise multi-tenancy beyond foundational propagation rules</w:t>
+      </w:r>
+    </w:p>
+    <w:p>
+      <w:pPr>
+        <w:ind w:left="720" w:first-line="-720"/>
+      </w:pPr>
+      <w:r>
+        <w:rPr>
+          <w:rFonts w:ascii="Helvetica Neue" w:hAnsi="Helvetica Neue" w:cs="Helvetica Neue"/>
+          <w:sz w:val="24"/>
+          <w:sz-cs w:val="24"/>
+          <w:color w:val="181F26"/>
+        </w:rPr>
+        <w:t xml:space="preserve"/>
+        <w:tab/>
+        <w:t xml:space="preserve">•</w:t>
+        <w:tab/>
+        <w:t xml:space="preserve"/>
+      </w:r>
+      <w:r>
+        <w:rPr>
+          <w:rFonts w:ascii="Helvetica Neue" w:hAnsi="Helvetica Neue" w:cs="Helvetica Neue"/>
+          <w:sz w:val="24"/>
+          <w:sz-cs w:val="24"/>
+          <w:spacing w:val="0"/>
+          <w:color w:val="181F26"/>
+        </w:rPr>
+        <w:t xml:space="preserve">unrestricted runtime self-modification</w:t>
+      </w:r>
+    </w:p>
+    <w:p>
+      <w:pPr>
+        <w:spacing w:after="197"/>
+      </w:pPr>
+      <w:r>
+        <w:rPr>
+          <w:rFonts w:ascii="Helvetica Neue" w:hAnsi="Helvetica Neue" w:cs="Helvetica Neue"/>
+          <w:sz w:val="44"/>
+          <w:sz-cs w:val="44"/>
+          <w:b/>
+          <w:spacing w:val="0"/>
+          <w:color w:val="102C4B"/>
+        </w:rPr>
         <w:t xml:space="preserve">Hero Demo</w:t>
       </w:r>
     </w:p>
@@ -33406,6 +34232,54 @@
           <w:color w:val="181F26"/>
         </w:rPr>
         <w:t xml:space="preserve">MCP tool failures are surfaced with action id, capability namespace, and failure taxonomy.</w:t>
+      </w:r>
+    </w:p>
+    <w:p>
+      <w:pPr>
+        <w:ind w:left="720" w:first-line="-720"/>
+      </w:pPr>
+      <w:r>
+        <w:rPr>
+          <w:rFonts w:ascii="Helvetica Neue" w:hAnsi="Helvetica Neue" w:cs="Helvetica Neue"/>
+          <w:sz w:val="24"/>
+          <w:sz-cs w:val="24"/>
+          <w:color w:val="181F26"/>
+        </w:rPr>
+        <w:t xml:space="preserve"/>
+        <w:tab/>
+        <w:t xml:space="preserve">•</w:t>
+        <w:tab/>
+        <w:t xml:space="preserve"/>
+      </w:r>
+      <w:r>
+        <w:rPr>
+          <w:rFonts w:ascii="Helvetica Neue" w:hAnsi="Helvetica Neue" w:cs="Helvetica Neue"/>
+          <w:sz w:val="24"/>
+          <w:sz-cs w:val="24"/>
+          <w:spacing w:val="0"/>
+          <w:color w:val="181F26"/>
+        </w:rPr>
+        <w:t xml:space="preserve">v0.1 transport support is SSE-only. The reference hero path uses MCP to fetch remote CI material for </w:t>
+      </w:r>
+      <w:r>
+        <w:rPr>
+          <w:rFonts w:ascii="Menlo" w:hAnsi="Menlo" w:cs="Menlo"/>
+          <w:sz w:val="24"/>
+          <w:sz-cs w:val="24"/>
+          <w:spacing w:val="0"/>
+          <w:color w:val="181F26"/>
+        </w:rPr>
+        <w:t xml:space="preserve">ci_triage</w:t>
+      </w:r>
+      <w:r>
+        <w:rPr>
+          <w:rFonts w:ascii="Helvetica Neue" w:hAnsi="Helvetica Neue" w:cs="Helvetica Neue"/>
+          <w:sz w:val="24"/>
+          <w:sz-cs w:val="24"/>
+          <w:spacing w:val="0"/>
+          <w:color w:val="181F26"/>
+        </w:rPr>
+        <w:t xml:space="preserve">, while keeping the final classification deterministic and local.</w:t>
       </w:r>
     </w:p>
     <w:p>

</xml_diff>

<commit_message>
docs: document alpha2 runtime hardening
</commit_message>
<xml_diff>
--- a/docs/exports/Crawfish-PRD.docx
+++ b/docs/exports/Crawfish-PRD.docx
@@ -1648,7 +1648,20 @@
           <w:spacing w:val="0"/>
           <w:color w:val="DFE8F2"/>
         </w:rPr>
-        <w:t xml:space="preserve">        W4["Agent worker: incident_enricher"]</w:t>
+        <w:t xml:space="preserve">        W4["Agent worker: workspace_editor"]</w:t>
+      </w:r>
+    </w:p>
+    <w:p>
+      <w:pPr/>
+      <w:r>
+        <w:rPr>
+          <w:rFonts w:ascii="Menlo" w:hAnsi="Menlo" w:cs="Menlo"/>
+          <w:sz w:val="24"/>
+          <w:sz-cs w:val="24"/>
+          <w:spacing w:val="0"/>
+          <w:color w:val="DFE8F2"/>
+        </w:rPr>
+        <w:t xml:space="preserve">        W5["Agent worker: incident_enricher"]</w:t>
       </w:r>
     </w:p>
     <w:p>
@@ -1999,6 +2012,19 @@
           <w:spacing w:val="0"/>
           <w:color w:val="DFE8F2"/>
         </w:rPr>
+        <w:t xml:space="preserve">    SCH --&gt; W5</w:t>
+      </w:r>
+    </w:p>
+    <w:p>
+      <w:pPr/>
+      <w:r>
+        <w:rPr>
+          <w:rFonts w:ascii="Menlo" w:hAnsi="Menlo" w:cs="Menlo"/>
+          <w:sz w:val="24"/>
+          <w:sz-cs w:val="24"/>
+          <w:spacing w:val="0"/>
+          <w:color w:val="DFE8F2"/>
+        </w:rPr>
         <w:t xml:space="preserve">    W1 --&gt; MCP</w:t>
       </w:r>
     </w:p>
@@ -2038,7 +2064,7 @@
           <w:spacing w:val="0"/>
           <w:color w:val="DFE8F2"/>
         </w:rPr>
-        <w:t xml:space="preserve">    W4 --&gt; MCP</w:t>
+        <w:t xml:space="preserve">    W5 --&gt; MCP</w:t>
       </w:r>
     </w:p>
     <w:p>
@@ -2194,6 +2220,19 @@
           <w:spacing w:val="0"/>
           <w:color w:val="DFE8F2"/>
         </w:rPr>
+        <w:t xml:space="preserve">    W5 --&gt; CKPT</w:t>
+      </w:r>
+    </w:p>
+    <w:p>
+      <w:pPr/>
+      <w:r>
+        <w:rPr>
+          <w:rFonts w:ascii="Menlo" w:hAnsi="Menlo" w:cs="Menlo"/>
+          <w:sz w:val="24"/>
+          <w:sz-cs w:val="24"/>
+          <w:spacing w:val="0"/>
+          <w:color w:val="DFE8F2"/>
+        </w:rPr>
         <w:t xml:space="preserve">    SD --&gt; OBS</w:t>
       </w:r>
     </w:p>
@@ -2247,6 +2286,19 @@
           <w:color w:val="DFE8F2"/>
         </w:rPr>
         <w:t xml:space="preserve">    W4 --&gt; OBS</w:t>
+      </w:r>
+    </w:p>
+    <w:p>
+      <w:pPr/>
+      <w:r>
+        <w:rPr>
+          <w:rFonts w:ascii="Menlo" w:hAnsi="Menlo" w:cs="Menlo"/>
+          <w:sz w:val="24"/>
+          <w:sz-cs w:val="24"/>
+          <w:spacing w:val="0"/>
+          <w:color w:val="DFE8F2"/>
+        </w:rPr>
+        <w:t xml:space="preserve">    W5 --&gt; OBS</w:t>
       </w:r>
     </w:p>
     <w:p>
@@ -2851,6 +2903,44 @@
           <w:spacing w:val="0"/>
           <w:color w:val="181F26"/>
         </w:rPr>
+        <w:t xml:space="preserve">workspace_editor</w:t>
+      </w:r>
+      <w:r>
+        <w:rPr>
+          <w:rFonts w:ascii="Helvetica Neue" w:hAnsi="Helvetica Neue" w:cs="Helvetica Neue"/>
+          <w:sz w:val="24"/>
+          <w:sz-cs w:val="24"/>
+          <w:spacing w:val="0"/>
+          <w:color w:val="181F26"/>
+        </w:rPr>
+        <w:t xml:space="preserve"> performs approval-gated local workspace mutation through a deterministic path.</w:t>
+      </w:r>
+    </w:p>
+    <w:p>
+      <w:pPr>
+        <w:ind w:left="720" w:first-line="-720"/>
+      </w:pPr>
+      <w:r>
+        <w:rPr>
+          <w:rFonts w:ascii="Menlo" w:hAnsi="Menlo" w:cs="Menlo"/>
+          <w:sz w:val="24"/>
+          <w:sz-cs w:val="24"/>
+          <w:color w:val="181F26"/>
+        </w:rPr>
+        <w:t xml:space="preserve"/>
+        <w:tab/>
+        <w:t xml:space="preserve">•</w:t>
+        <w:tab/>
+        <w:t xml:space="preserve"/>
+      </w:r>
+      <w:r>
+        <w:rPr>
+          <w:rFonts w:ascii="Menlo" w:hAnsi="Menlo" w:cs="Menlo"/>
+          <w:sz w:val="24"/>
+          <w:sz-cs w:val="24"/>
+          <w:spacing w:val="0"/>
+          <w:color w:val="181F26"/>
+        </w:rPr>
         <w:t xml:space="preserve">incident_enricher</w:t>
       </w:r>
       <w:r>
@@ -2980,7 +3070,7 @@
           <w:spacing w:val="0"/>
           <w:color w:val="181F26"/>
         </w:rPr>
-        <w:t xml:space="preserve">Approval-gated mutating actions for workspace or ticket updates.</w:t>
+        <w:t xml:space="preserve">Approval-gated local workspace mutation with explicit grant, lease, and revoke control.</w:t>
       </w:r>
     </w:p>
     <w:p>
@@ -3629,6 +3719,44 @@
           <w:spacing w:val="0"/>
           <w:color w:val="181F26"/>
         </w:rPr>
+        <w:t xml:space="preserve">workspace.patch.apply</w:t>
+      </w:r>
+      <w:r>
+        <w:rPr>
+          <w:rFonts w:ascii="Helvetica Neue" w:hAnsi="Helvetica Neue" w:cs="Helvetica Neue"/>
+          <w:sz w:val="24"/>
+          <w:sz-cs w:val="24"/>
+          <w:spacing w:val="0"/>
+          <w:color w:val="181F26"/>
+        </w:rPr>
+        <w:t xml:space="preserve"> performs deterministic local file edits under explicit approval, grant, and lease control.</w:t>
+      </w:r>
+    </w:p>
+    <w:p>
+      <w:pPr>
+        <w:ind w:left="720" w:first-line="-720"/>
+      </w:pPr>
+      <w:r>
+        <w:rPr>
+          <w:rFonts w:ascii="Menlo" w:hAnsi="Menlo" w:cs="Menlo"/>
+          <w:sz w:val="24"/>
+          <w:sz-cs w:val="24"/>
+          <w:color w:val="181F26"/>
+        </w:rPr>
+        <w:t xml:space="preserve"/>
+        <w:tab/>
+        <w:t xml:space="preserve">•</w:t>
+        <w:tab/>
+        <w:t xml:space="preserve"/>
+      </w:r>
+      <w:r>
+        <w:rPr>
+          <w:rFonts w:ascii="Menlo" w:hAnsi="Menlo" w:cs="Menlo"/>
+          <w:sz w:val="24"/>
+          <w:sz-cs w:val="24"/>
+          <w:spacing w:val="0"/>
+          <w:color w:val="181F26"/>
+        </w:rPr>
         <w:t xml:space="preserve">inspect</w:t>
       </w:r>
       <w:r>
@@ -3648,6 +3776,104 @@
       </w:pPr>
       <w:r>
         <w:rPr>
+          <w:rFonts w:ascii="Menlo" w:hAnsi="Menlo" w:cs="Menlo"/>
+          <w:sz w:val="24"/>
+          <w:sz-cs w:val="24"/>
+          <w:color w:val="181F26"/>
+        </w:rPr>
+        <w:t xml:space="preserve"/>
+        <w:tab/>
+        <w:t xml:space="preserve">•</w:t>
+        <w:tab/>
+        <w:t xml:space="preserve"/>
+      </w:r>
+      <w:r>
+        <w:rPr>
+          <w:rFonts w:ascii="Menlo" w:hAnsi="Menlo" w:cs="Menlo"/>
+          <w:sz w:val="24"/>
+          <w:sz-cs w:val="24"/>
+          <w:spacing w:val="0"/>
+          <w:color w:val="181F26"/>
+        </w:rPr>
+        <w:t xml:space="preserve">action list</w:t>
+      </w:r>
+      <w:r>
+        <w:rPr>
+          <w:rFonts w:ascii="Helvetica Neue" w:hAnsi="Helvetica Neue" w:cs="Helvetica Neue"/>
+          <w:sz w:val="24"/>
+          <w:sz-cs w:val="24"/>
+          <w:spacing w:val="0"/>
+          <w:color w:val="181F26"/>
+        </w:rPr>
+        <w:t xml:space="preserve">, </w:t>
+      </w:r>
+      <w:r>
+        <w:rPr>
+          <w:rFonts w:ascii="Menlo" w:hAnsi="Menlo" w:cs="Menlo"/>
+          <w:sz w:val="24"/>
+          <w:sz-cs w:val="24"/>
+          <w:spacing w:val="0"/>
+          <w:color w:val="181F26"/>
+        </w:rPr>
+        <w:t xml:space="preserve">action approve</w:t>
+      </w:r>
+      <w:r>
+        <w:rPr>
+          <w:rFonts w:ascii="Helvetica Neue" w:hAnsi="Helvetica Neue" w:cs="Helvetica Neue"/>
+          <w:sz w:val="24"/>
+          <w:sz-cs w:val="24"/>
+          <w:spacing w:val="0"/>
+          <w:color w:val="181F26"/>
+        </w:rPr>
+        <w:t xml:space="preserve">, </w:t>
+      </w:r>
+      <w:r>
+        <w:rPr>
+          <w:rFonts w:ascii="Menlo" w:hAnsi="Menlo" w:cs="Menlo"/>
+          <w:sz w:val="24"/>
+          <w:sz-cs w:val="24"/>
+          <w:spacing w:val="0"/>
+          <w:color w:val="181F26"/>
+        </w:rPr>
+        <w:t xml:space="preserve">action reject</w:t>
+      </w:r>
+      <w:r>
+        <w:rPr>
+          <w:rFonts w:ascii="Helvetica Neue" w:hAnsi="Helvetica Neue" w:cs="Helvetica Neue"/>
+          <w:sz w:val="24"/>
+          <w:sz-cs w:val="24"/>
+          <w:spacing w:val="0"/>
+          <w:color w:val="181F26"/>
+        </w:rPr>
+        <w:t xml:space="preserve">, and </w:t>
+      </w:r>
+      <w:r>
+        <w:rPr>
+          <w:rFonts w:ascii="Menlo" w:hAnsi="Menlo" w:cs="Menlo"/>
+          <w:sz w:val="24"/>
+          <w:sz-cs w:val="24"/>
+          <w:spacing w:val="0"/>
+          <w:color w:val="181F26"/>
+        </w:rPr>
+        <w:t xml:space="preserve">lease revoke</w:t>
+      </w:r>
+      <w:r>
+        <w:rPr>
+          <w:rFonts w:ascii="Helvetica Neue" w:hAnsi="Helvetica Neue" w:cs="Helvetica Neue"/>
+          <w:sz w:val="24"/>
+          <w:sz-cs w:val="24"/>
+          <w:spacing w:val="0"/>
+          <w:color w:val="181F26"/>
+        </w:rPr>
+        <w:t xml:space="preserve"> expose the operator control path over the local UDS API.</w:t>
+      </w:r>
+    </w:p>
+    <w:p>
+      <w:pPr>
+        <w:ind w:left="720" w:first-line="-720"/>
+      </w:pPr>
+      <w:r>
+        <w:rPr>
           <w:rFonts w:ascii="Helvetica Neue" w:hAnsi="Helvetica Neue" w:cs="Helvetica Neue"/>
           <w:sz w:val="24"/>
           <w:sz-cs w:val="24"/>
@@ -3688,6 +3914,34 @@
           <w:color w:val="181F26"/>
         </w:rPr>
         <w:t xml:space="preserve"> actions and resumes deterministic work from checkpoint metadata.</w:t>
+      </w:r>
+    </w:p>
+    <w:p>
+      <w:pPr>
+        <w:ind w:left="720" w:first-line="-720"/>
+      </w:pPr>
+      <w:r>
+        <w:rPr>
+          <w:rFonts w:ascii="Helvetica Neue" w:hAnsi="Helvetica Neue" w:cs="Helvetica Neue"/>
+          <w:sz w:val="24"/>
+          <w:sz-cs w:val="24"/>
+          <w:color w:val="181F26"/>
+        </w:rPr>
+        <w:t xml:space="preserve"/>
+        <w:tab/>
+        <w:t xml:space="preserve">•</w:t>
+        <w:tab/>
+        <w:t xml:space="preserve"/>
+      </w:r>
+      <w:r>
+        <w:rPr>
+          <w:rFonts w:ascii="Helvetica Neue" w:hAnsi="Helvetica Neue" w:cs="Helvetica Neue"/>
+          <w:sz w:val="24"/>
+          <w:sz-cs w:val="24"/>
+          <w:spacing w:val="0"/>
+          <w:color w:val="181F26"/>
+        </w:rPr>
+        <w:t xml:space="preserve">same-owner local read-only actions can be leased automatically, while same-device foreign-owner mutation remains denied by default.</w:t>
       </w:r>
     </w:p>
     <w:p>
@@ -4159,6 +4413,19 @@
           <w:spacing w:val="0"/>
           <w:color w:val="DFE8F2"/>
         </w:rPr>
+        <w:t xml:space="preserve">  --caller-owner local-dev \</w:t>
+      </w:r>
+    </w:p>
+    <w:p>
+      <w:pPr/>
+      <w:r>
+        <w:rPr>
+          <w:rFonts w:ascii="Menlo" w:hAnsi="Menlo" w:cs="Menlo"/>
+          <w:sz w:val="24"/>
+          <w:sz-cs w:val="24"/>
+          <w:spacing w:val="0"/>
+          <w:color w:val="DFE8F2"/>
+        </w:rPr>
         <w:t xml:space="preserve">  --inputs-json "{\"workspace_root\":\"$(pwd)\",\"changed_files\":[\"src/lib.rs\"]}" \</w:t>
       </w:r>
     </w:p>
@@ -4237,6 +4504,19 @@
           <w:spacing w:val="0"/>
           <w:color w:val="DFE8F2"/>
         </w:rPr>
+        <w:t xml:space="preserve">  --caller-owner local-dev \</w:t>
+      </w:r>
+    </w:p>
+    <w:p>
+      <w:pPr/>
+      <w:r>
+        <w:rPr>
+          <w:rFonts w:ascii="Menlo" w:hAnsi="Menlo" w:cs="Menlo"/>
+          <w:sz w:val="24"/>
+          <w:sz-cs w:val="24"/>
+          <w:spacing w:val="0"/>
+          <w:color w:val="DFE8F2"/>
+        </w:rPr>
         <w:t xml:space="preserve">  --inputs-json "{\"log_text\":\"error: test failed, to rerun pass \`cargo test\`\"}" \</w:t>
       </w:r>
     </w:p>
@@ -4263,7 +4543,150 @@
           <w:spacing w:val="0"/>
           <w:color w:val="DFE8F2"/>
         </w:rPr>
-        <w:t xml:space="preserve">cargo run -p crawfish-cli --bin crawfish -- inspect &lt;action-id&gt; --json</w:t>
+        <w:t xml:space="preserve">MUTATION_ID=$(cargo run -p crawfish-cli --bin crawfish -- action submit \</w:t>
+      </w:r>
+    </w:p>
+    <w:p>
+      <w:pPr/>
+      <w:r>
+        <w:rPr>
+          <w:rFonts w:ascii="Menlo" w:hAnsi="Menlo" w:cs="Menlo"/>
+          <w:sz w:val="24"/>
+          <w:sz-cs w:val="24"/>
+          <w:spacing w:val="0"/>
+          <w:color w:val="DFE8F2"/>
+        </w:rPr>
+        <w:t xml:space="preserve">  --target-agent workspace_editor \</w:t>
+      </w:r>
+    </w:p>
+    <w:p>
+      <w:pPr/>
+      <w:r>
+        <w:rPr>
+          <w:rFonts w:ascii="Menlo" w:hAnsi="Menlo" w:cs="Menlo"/>
+          <w:sz w:val="24"/>
+          <w:sz-cs w:val="24"/>
+          <w:spacing w:val="0"/>
+          <w:color w:val="DFE8F2"/>
+        </w:rPr>
+        <w:t xml:space="preserve">  --capability workspace.patch.apply \</w:t>
+      </w:r>
+    </w:p>
+    <w:p>
+      <w:pPr/>
+      <w:r>
+        <w:rPr>
+          <w:rFonts w:ascii="Menlo" w:hAnsi="Menlo" w:cs="Menlo"/>
+          <w:sz w:val="24"/>
+          <w:sz-cs w:val="24"/>
+          <w:spacing w:val="0"/>
+          <w:color w:val="DFE8F2"/>
+        </w:rPr>
+        <w:t xml:space="preserve">  --goal "apply local patch" \</w:t>
+      </w:r>
+    </w:p>
+    <w:p>
+      <w:pPr/>
+      <w:r>
+        <w:rPr>
+          <w:rFonts w:ascii="Menlo" w:hAnsi="Menlo" w:cs="Menlo"/>
+          <w:sz w:val="24"/>
+          <w:sz-cs w:val="24"/>
+          <w:spacing w:val="0"/>
+          <w:color w:val="DFE8F2"/>
+        </w:rPr>
+        <w:t xml:space="preserve">  --caller-owner local-dev \</w:t>
+      </w:r>
+    </w:p>
+    <w:p>
+      <w:pPr/>
+      <w:r>
+        <w:rPr>
+          <w:rFonts w:ascii="Menlo" w:hAnsi="Menlo" w:cs="Menlo"/>
+          <w:sz w:val="24"/>
+          <w:sz-cs w:val="24"/>
+          <w:spacing w:val="0"/>
+          <w:color w:val="DFE8F2"/>
+        </w:rPr>
+        <w:t xml:space="preserve">  --workspace-write \</w:t>
+      </w:r>
+    </w:p>
+    <w:p>
+      <w:pPr/>
+      <w:r>
+        <w:rPr>
+          <w:rFonts w:ascii="Menlo" w:hAnsi="Menlo" w:cs="Menlo"/>
+          <w:sz w:val="24"/>
+          <w:sz-cs w:val="24"/>
+          <w:spacing w:val="0"/>
+          <w:color w:val="DFE8F2"/>
+        </w:rPr>
+        <w:t xml:space="preserve">  --mutating \</w:t>
+      </w:r>
+    </w:p>
+    <w:p>
+      <w:pPr/>
+      <w:r>
+        <w:rPr>
+          <w:rFonts w:ascii="Menlo" w:hAnsi="Menlo" w:cs="Menlo"/>
+          <w:sz w:val="24"/>
+          <w:sz-cs w:val="24"/>
+          <w:spacing w:val="0"/>
+          <w:color w:val="DFE8F2"/>
+        </w:rPr>
+        <w:t xml:space="preserve">  --inputs-json "{\"workspace_root\":\"$(pwd)\",\"edits\":[{\"path\":\"notes.txt\",\"op\":\"create\",\"contents\":\"hello from crawfish\\n\"}]}" \</w:t>
+      </w:r>
+    </w:p>
+    <w:p>
+      <w:pPr/>
+      <w:r>
+        <w:rPr>
+          <w:rFonts w:ascii="Menlo" w:hAnsi="Menlo" w:cs="Menlo"/>
+          <w:sz w:val="24"/>
+          <w:sz-cs w:val="24"/>
+          <w:spacing w:val="0"/>
+          <w:color w:val="DFE8F2"/>
+        </w:rPr>
+        <w:t xml:space="preserve">  --json | python3 -c 'import json,sys; print(json.load(sys.stdin)["action_id"])')</w:t>
+      </w:r>
+    </w:p>
+    <w:p>
+      <w:pPr/>
+      <w:r>
+        <w:rPr>
+          <w:rFonts w:ascii="Menlo" w:hAnsi="Menlo" w:cs="Menlo"/>
+          <w:sz w:val="24"/>
+          <w:sz-cs w:val="24"/>
+          <w:spacing w:val="0"/>
+          <w:color w:val="DFE8F2"/>
+        </w:rPr>
+        <w:t xml:space="preserve">cargo run -p crawfish-cli --bin crawfish -- action list --phase awaiting_approval --json</w:t>
+      </w:r>
+    </w:p>
+    <w:p>
+      <w:pPr/>
+      <w:r>
+        <w:rPr>
+          <w:rFonts w:ascii="Menlo" w:hAnsi="Menlo" w:cs="Menlo"/>
+          <w:sz w:val="24"/>
+          <w:sz-cs w:val="24"/>
+          <w:spacing w:val="0"/>
+          <w:color w:val="DFE8F2"/>
+        </w:rPr>
+        <w:t xml:space="preserve">cargo run -p crawfish-cli --bin crawfish -- action approve "$MUTATION_ID" --approver local-dev --json</w:t>
+      </w:r>
+    </w:p>
+    <w:p>
+      <w:pPr/>
+      <w:r>
+        <w:rPr>
+          <w:rFonts w:ascii="Menlo" w:hAnsi="Menlo" w:cs="Menlo"/>
+          <w:sz w:val="24"/>
+          <w:sz-cs w:val="24"/>
+          <w:spacing w:val="0"/>
+          <w:color w:val="DFE8F2"/>
+        </w:rPr>
+        <w:t xml:space="preserve">cargo run -p crawfish-cli --bin crawfish -- inspect "$MUTATION_ID" --json</w:t>
       </w:r>
     </w:p>
     <w:p>
@@ -31899,6 +32322,26 @@
           <w:spacing w:val="0"/>
           <w:color w:val="181F26"/>
         </w:rPr>
+        <w:t xml:space="preserve">, </w:t>
+      </w:r>
+      <w:r>
+        <w:rPr>
+          <w:rFonts w:ascii="Menlo" w:hAnsi="Menlo" w:cs="Menlo"/>
+          <w:sz w:val="24"/>
+          <w:sz-cs w:val="24"/>
+          <w:spacing w:val="0"/>
+          <w:color w:val="181F26"/>
+        </w:rPr>
+        <w:t xml:space="preserve">workspace_editor</w:t>
+      </w:r>
+      <w:r>
+        <w:rPr>
+          <w:rFonts w:ascii="Helvetica Neue" w:hAnsi="Helvetica Neue" w:cs="Helvetica Neue"/>
+          <w:sz w:val="24"/>
+          <w:sz-cs w:val="24"/>
+          <w:spacing w:val="0"/>
+          <w:color w:val="181F26"/>
+        </w:rPr>
         <w:t xml:space="preserve">, and </w:t>
       </w:r>
       <w:r>
@@ -32658,6 +33101,64 @@
       </w:pPr>
       <w:r>
         <w:rPr>
+          <w:rFonts w:ascii="Menlo" w:hAnsi="Menlo" w:cs="Menlo"/>
+          <w:sz w:val="24"/>
+          <w:sz-cs w:val="24"/>
+          <w:color w:val="181F26"/>
+        </w:rPr>
+        <w:t xml:space="preserve"/>
+        <w:tab/>
+        <w:t xml:space="preserve">•</w:t>
+        <w:tab/>
+        <w:t xml:space="preserve"/>
+      </w:r>
+      <w:r>
+        <w:rPr>
+          <w:rFonts w:ascii="Menlo" w:hAnsi="Menlo" w:cs="Menlo"/>
+          <w:sz w:val="24"/>
+          <w:sz-cs w:val="24"/>
+          <w:spacing w:val="0"/>
+          <w:color w:val="181F26"/>
+        </w:rPr>
+        <w:t xml:space="preserve">workspace_editor</w:t>
+      </w:r>
+      <w:r>
+        <w:rPr>
+          <w:rFonts w:ascii="Helvetica Neue" w:hAnsi="Helvetica Neue" w:cs="Helvetica Neue"/>
+          <w:sz w:val="24"/>
+          <w:sz-cs w:val="24"/>
+          <w:spacing w:val="0"/>
+          <w:color w:val="181F26"/>
+        </w:rPr>
+        <w:t xml:space="preserve"> executes approval-gated </w:t>
+      </w:r>
+      <w:r>
+        <w:rPr>
+          <w:rFonts w:ascii="Menlo" w:hAnsi="Menlo" w:cs="Menlo"/>
+          <w:sz w:val="24"/>
+          <w:sz-cs w:val="24"/>
+          <w:spacing w:val="0"/>
+          <w:color w:val="181F26"/>
+        </w:rPr>
+        <w:t xml:space="preserve">workspace.patch.apply</w:t>
+      </w:r>
+      <w:r>
+        <w:rPr>
+          <w:rFonts w:ascii="Helvetica Neue" w:hAnsi="Helvetica Neue" w:cs="Helvetica Neue"/>
+          <w:sz w:val="24"/>
+          <w:sz-cs w:val="24"/>
+          <w:spacing w:val="0"/>
+          <w:color w:val="181F26"/>
+        </w:rPr>
+        <w:t xml:space="preserve"> with deterministic local file operations.</w:t>
+      </w:r>
+    </w:p>
+    <w:p>
+      <w:pPr>
+        <w:ind w:left="720" w:first-line="-720"/>
+      </w:pPr>
+      <w:r>
+        <w:rPr>
           <w:rFonts w:ascii="Helvetica Neue" w:hAnsi="Helvetica Neue" w:cs="Helvetica Neue"/>
           <w:sz w:val="24"/>
           <w:sz-cs w:val="24"/>
@@ -32715,7 +33216,7 @@
           <w:spacing w:val="0"/>
           <w:color w:val="181F26"/>
         </w:rPr>
-        <w:t xml:space="preserve"> already exposes artifact refs, checkpoint refs, recovery stage, encounter metadata, and external refs.</w:t>
+        <w:t xml:space="preserve"> already exposes artifact refs, checkpoint refs, recovery stage, encounter metadata, grant details, lease detail, and external refs.</w:t>
       </w:r>
     </w:p>
     <w:p>
@@ -32731,6 +33232,341 @@
           <w:color w:val="181F26"/>
         </w:rPr>
         <w:t xml:space="preserve">This means the next implementation work is no longer “make Hero P0 exist at all”; it is “harden the current Hero P0 slice and extend it carefully.”</w:t>
+      </w:r>
+    </w:p>
+    <w:p>
+      <w:pPr>
+        <w:spacing w:after="240"/>
+      </w:pPr>
+      <w:r>
+        <w:rPr>
+          <w:rFonts w:ascii="Helvetica Neue" w:hAnsi="Helvetica Neue" w:cs="Helvetica Neue"/>
+          <w:sz w:val="24"/>
+          <w:sz-cs w:val="24"/>
+          <w:spacing w:val="0"/>
+          <w:color w:val="181F26"/>
+        </w:rPr>
+        <w:t xml:space="preserve">The current </w:t>
+      </w:r>
+      <w:r>
+        <w:rPr>
+          <w:rFonts w:ascii="Menlo" w:hAnsi="Menlo" w:cs="Menlo"/>
+          <w:sz w:val="24"/>
+          <w:sz-cs w:val="24"/>
+          <w:spacing w:val="0"/>
+          <w:color w:val="181F26"/>
+        </w:rPr>
+        <w:t xml:space="preserve">0.1.0-alpha.2</w:t>
+      </w:r>
+      <w:r>
+        <w:rPr>
+          <w:rFonts w:ascii="Helvetica Neue" w:hAnsi="Helvetica Neue" w:cs="Helvetica Neue"/>
+          <w:sz w:val="24"/>
+          <w:sz-cs w:val="24"/>
+          <w:spacing w:val="0"/>
+          <w:color w:val="181F26"/>
+        </w:rPr>
+        <w:t xml:space="preserve"> runtime-hardening slice adds:</w:t>
+      </w:r>
+    </w:p>
+    <w:p>
+      <w:pPr>
+        <w:ind w:left="720" w:first-line="-720"/>
+      </w:pPr>
+      <w:r>
+        <w:rPr>
+          <w:rFonts w:ascii="Helvetica Neue" w:hAnsi="Helvetica Neue" w:cs="Helvetica Neue"/>
+          <w:sz w:val="24"/>
+          <w:sz-cs w:val="24"/>
+          <w:color w:val="181F26"/>
+        </w:rPr>
+        <w:t xml:space="preserve"/>
+        <w:tab/>
+        <w:t xml:space="preserve">•</w:t>
+        <w:tab/>
+        <w:t xml:space="preserve"/>
+      </w:r>
+      <w:r>
+        <w:rPr>
+          <w:rFonts w:ascii="Helvetica Neue" w:hAnsi="Helvetica Neue" w:cs="Helvetica Neue"/>
+          <w:sz w:val="24"/>
+          <w:sz-cs w:val="24"/>
+          <w:spacing w:val="0"/>
+          <w:color w:val="181F26"/>
+        </w:rPr>
+        <w:t xml:space="preserve">approval-gated </w:t>
+      </w:r>
+      <w:r>
+        <w:rPr>
+          <w:rFonts w:ascii="Menlo" w:hAnsi="Menlo" w:cs="Menlo"/>
+          <w:sz w:val="24"/>
+          <w:sz-cs w:val="24"/>
+          <w:spacing w:val="0"/>
+          <w:color w:val="181F26"/>
+        </w:rPr>
+        <w:t xml:space="preserve">workspace.patch.apply</w:t>
+      </w:r>
+      <w:r>
+        <w:rPr>
+          <w:rFonts w:ascii="Helvetica Neue" w:hAnsi="Helvetica Neue" w:cs="Helvetica Neue"/>
+          <w:sz w:val="24"/>
+          <w:sz-cs w:val="24"/>
+          <w:spacing w:val="0"/>
+          <w:color w:val="181F26"/>
+        </w:rPr>
+        <w:t xml:space="preserve"> through </w:t>
+      </w:r>
+      <w:r>
+        <w:rPr>
+          <w:rFonts w:ascii="Menlo" w:hAnsi="Menlo" w:cs="Menlo"/>
+          <w:sz w:val="24"/>
+          <w:sz-cs w:val="24"/>
+          <w:spacing w:val="0"/>
+          <w:color w:val="181F26"/>
+        </w:rPr>
+        <w:t xml:space="preserve">workspace_editor</w:t>
+      </w:r>
+      <w:r>
+        <w:rPr>
+          <w:rFonts w:ascii="Helvetica Neue" w:hAnsi="Helvetica Neue" w:cs="Helvetica Neue"/>
+          <w:sz w:val="24"/>
+          <w:sz-cs w:val="24"/>
+          <w:spacing w:val="0"/>
+          <w:color w:val="181F26"/>
+        </w:rPr>
+        <w:t xml:space="preserve"/>
+      </w:r>
+    </w:p>
+    <w:p>
+      <w:pPr>
+        <w:ind w:left="720" w:first-line="-720"/>
+      </w:pPr>
+      <w:r>
+        <w:rPr>
+          <w:rFonts w:ascii="Helvetica Neue" w:hAnsi="Helvetica Neue" w:cs="Helvetica Neue"/>
+          <w:sz w:val="24"/>
+          <w:sz-cs w:val="24"/>
+          <w:color w:val="181F26"/>
+        </w:rPr>
+        <w:t xml:space="preserve"/>
+        <w:tab/>
+        <w:t xml:space="preserve">•</w:t>
+        <w:tab/>
+        <w:t xml:space="preserve"/>
+      </w:r>
+      <w:r>
+        <w:rPr>
+          <w:rFonts w:ascii="Helvetica Neue" w:hAnsi="Helvetica Neue" w:cs="Helvetica Neue"/>
+          <w:sz w:val="24"/>
+          <w:sz-cs w:val="24"/>
+          <w:spacing w:val="0"/>
+          <w:color w:val="181F26"/>
+        </w:rPr>
+        <w:t xml:space="preserve">real </w:t>
+      </w:r>
+      <w:r>
+        <w:rPr>
+          <w:rFonts w:ascii="Menlo" w:hAnsi="Menlo" w:cs="Menlo"/>
+          <w:sz w:val="24"/>
+          <w:sz-cs w:val="24"/>
+          <w:spacing w:val="0"/>
+          <w:color w:val="181F26"/>
+        </w:rPr>
+        <w:t xml:space="preserve">EncounterRecord -&gt; ConsentGrant -&gt; CapabilityLease -&gt; AuditReceipt</w:t>
+      </w:r>
+      <w:r>
+        <w:rPr>
+          <w:rFonts w:ascii="Helvetica Neue" w:hAnsi="Helvetica Neue" w:cs="Helvetica Neue"/>
+          <w:sz w:val="24"/>
+          <w:sz-cs w:val="24"/>
+          <w:spacing w:val="0"/>
+          <w:color w:val="181F26"/>
+        </w:rPr>
+        <w:t xml:space="preserve"> runtime flow</w:t>
+      </w:r>
+    </w:p>
+    <w:p>
+      <w:pPr>
+        <w:ind w:left="720" w:first-line="-720"/>
+      </w:pPr>
+      <w:r>
+        <w:rPr>
+          <w:rFonts w:ascii="Helvetica Neue" w:hAnsi="Helvetica Neue" w:cs="Helvetica Neue"/>
+          <w:sz w:val="24"/>
+          <w:sz-cs w:val="24"/>
+          <w:color w:val="181F26"/>
+        </w:rPr>
+        <w:t xml:space="preserve"/>
+        <w:tab/>
+        <w:t xml:space="preserve">•</w:t>
+        <w:tab/>
+        <w:t xml:space="preserve"/>
+      </w:r>
+      <w:r>
+        <w:rPr>
+          <w:rFonts w:ascii="Helvetica Neue" w:hAnsi="Helvetica Neue" w:cs="Helvetica Neue"/>
+          <w:sz w:val="24"/>
+          <w:sz-cs w:val="24"/>
+          <w:spacing w:val="0"/>
+          <w:color w:val="181F26"/>
+        </w:rPr>
+        <w:t xml:space="preserve">operator actions for </w:t>
+      </w:r>
+      <w:r>
+        <w:rPr>
+          <w:rFonts w:ascii="Menlo" w:hAnsi="Menlo" w:cs="Menlo"/>
+          <w:sz w:val="24"/>
+          <w:sz-cs w:val="24"/>
+          <w:spacing w:val="0"/>
+          <w:color w:val="181F26"/>
+        </w:rPr>
+        <w:t xml:space="preserve">list</w:t>
+      </w:r>
+      <w:r>
+        <w:rPr>
+          <w:rFonts w:ascii="Helvetica Neue" w:hAnsi="Helvetica Neue" w:cs="Helvetica Neue"/>
+          <w:sz w:val="24"/>
+          <w:sz-cs w:val="24"/>
+          <w:spacing w:val="0"/>
+          <w:color w:val="181F26"/>
+        </w:rPr>
+        <w:t xml:space="preserve">, </w:t>
+      </w:r>
+      <w:r>
+        <w:rPr>
+          <w:rFonts w:ascii="Menlo" w:hAnsi="Menlo" w:cs="Menlo"/>
+          <w:sz w:val="24"/>
+          <w:sz-cs w:val="24"/>
+          <w:spacing w:val="0"/>
+          <w:color w:val="181F26"/>
+        </w:rPr>
+        <w:t xml:space="preserve">approve</w:t>
+      </w:r>
+      <w:r>
+        <w:rPr>
+          <w:rFonts w:ascii="Helvetica Neue" w:hAnsi="Helvetica Neue" w:cs="Helvetica Neue"/>
+          <w:sz w:val="24"/>
+          <w:sz-cs w:val="24"/>
+          <w:spacing w:val="0"/>
+          <w:color w:val="181F26"/>
+        </w:rPr>
+        <w:t xml:space="preserve">, </w:t>
+      </w:r>
+      <w:r>
+        <w:rPr>
+          <w:rFonts w:ascii="Menlo" w:hAnsi="Menlo" w:cs="Menlo"/>
+          <w:sz w:val="24"/>
+          <w:sz-cs w:val="24"/>
+          <w:spacing w:val="0"/>
+          <w:color w:val="181F26"/>
+        </w:rPr>
+        <w:t xml:space="preserve">reject</w:t>
+      </w:r>
+      <w:r>
+        <w:rPr>
+          <w:rFonts w:ascii="Helvetica Neue" w:hAnsi="Helvetica Neue" w:cs="Helvetica Neue"/>
+          <w:sz w:val="24"/>
+          <w:sz-cs w:val="24"/>
+          <w:spacing w:val="0"/>
+          <w:color w:val="181F26"/>
+        </w:rPr>
+        <w:t xml:space="preserve">, and </w:t>
+      </w:r>
+      <w:r>
+        <w:rPr>
+          <w:rFonts w:ascii="Menlo" w:hAnsi="Menlo" w:cs="Menlo"/>
+          <w:sz w:val="24"/>
+          <w:sz-cs w:val="24"/>
+          <w:spacing w:val="0"/>
+          <w:color w:val="181F26"/>
+        </w:rPr>
+        <w:t xml:space="preserve">revoke</w:t>
+      </w:r>
+      <w:r>
+        <w:rPr>
+          <w:rFonts w:ascii="Helvetica Neue" w:hAnsi="Helvetica Neue" w:cs="Helvetica Neue"/>
+          <w:sz w:val="24"/>
+          <w:sz-cs w:val="24"/>
+          <w:spacing w:val="0"/>
+          <w:color w:val="181F26"/>
+        </w:rPr>
+        <w:t xml:space="preserve"/>
+      </w:r>
+    </w:p>
+    <w:p>
+      <w:pPr>
+        <w:ind w:left="720" w:first-line="-720"/>
+      </w:pPr>
+      <w:r>
+        <w:rPr>
+          <w:rFonts w:ascii="Helvetica Neue" w:hAnsi="Helvetica Neue" w:cs="Helvetica Neue"/>
+          <w:sz w:val="24"/>
+          <w:sz-cs w:val="24"/>
+          <w:color w:val="181F26"/>
+        </w:rPr>
+        <w:t xml:space="preserve"/>
+        <w:tab/>
+        <w:t xml:space="preserve">•</w:t>
+        <w:tab/>
+        <w:t xml:space="preserve"/>
+      </w:r>
+      <w:r>
+        <w:rPr>
+          <w:rFonts w:ascii="Helvetica Neue" w:hAnsi="Helvetica Neue" w:cs="Helvetica Neue"/>
+          <w:sz w:val="24"/>
+          <w:sz-cs w:val="24"/>
+          <w:spacing w:val="0"/>
+          <w:color w:val="181F26"/>
+        </w:rPr>
+        <w:t xml:space="preserve">dry-run </w:t>
+      </w:r>
+      <w:r>
+        <w:rPr>
+          <w:rFonts w:ascii="Menlo" w:hAnsi="Menlo" w:cs="Menlo"/>
+          <w:sz w:val="24"/>
+          <w:sz-cs w:val="24"/>
+          <w:spacing w:val="0"/>
+          <w:color w:val="181F26"/>
+        </w:rPr>
+        <w:t xml:space="preserve">policy validate</w:t>
+      </w:r>
+      <w:r>
+        <w:rPr>
+          <w:rFonts w:ascii="Helvetica Neue" w:hAnsi="Helvetica Neue" w:cs="Helvetica Neue"/>
+          <w:sz w:val="24"/>
+          <w:sz-cs w:val="24"/>
+          <w:spacing w:val="0"/>
+          <w:color w:val="181F26"/>
+        </w:rPr>
+        <w:t xml:space="preserve"> with no persistence side effects</w:t>
+      </w:r>
+    </w:p>
+    <w:p>
+      <w:pPr>
+        <w:ind w:left="720" w:first-line="-720"/>
+      </w:pPr>
+      <w:r>
+        <w:rPr>
+          <w:rFonts w:ascii="Helvetica Neue" w:hAnsi="Helvetica Neue" w:cs="Helvetica Neue"/>
+          <w:sz w:val="24"/>
+          <w:sz-cs w:val="24"/>
+          <w:color w:val="181F26"/>
+        </w:rPr>
+        <w:t xml:space="preserve"/>
+        <w:tab/>
+        <w:t xml:space="preserve">•</w:t>
+        <w:tab/>
+        <w:t xml:space="preserve"/>
+      </w:r>
+      <w:r>
+        <w:rPr>
+          <w:rFonts w:ascii="Helvetica Neue" w:hAnsi="Helvetica Neue" w:cs="Helvetica Neue"/>
+          <w:sz w:val="24"/>
+          <w:sz-cs w:val="24"/>
+          <w:spacing w:val="0"/>
+          <w:color w:val="181F26"/>
+        </w:rPr>
+        <w:t xml:space="preserve">lease enforcement before execution and before local mutation commit</w:t>
       </w:r>
     </w:p>
     <w:p>
@@ -33054,90 +33890,6 @@
           <w:spacing w:val="0"/>
           <w:color w:val="181F26"/>
         </w:rPr>
-        <w:t xml:space="preserve">production same-device encounter enforcement</w:t>
-      </w:r>
-    </w:p>
-    <w:p>
-      <w:pPr>
-        <w:ind w:left="720" w:first-line="-720"/>
-      </w:pPr>
-      <w:r>
-        <w:rPr>
-          <w:rFonts w:ascii="Helvetica Neue" w:hAnsi="Helvetica Neue" w:cs="Helvetica Neue"/>
-          <w:sz w:val="24"/>
-          <w:sz-cs w:val="24"/>
-          <w:color w:val="181F26"/>
-        </w:rPr>
-        <w:t xml:space="preserve"/>
-        <w:tab/>
-        <w:t xml:space="preserve">•</w:t>
-        <w:tab/>
-        <w:t xml:space="preserve"/>
-      </w:r>
-      <w:r>
-        <w:rPr>
-          <w:rFonts w:ascii="Helvetica Neue" w:hAnsi="Helvetica Neue" w:cs="Helvetica Neue"/>
-          <w:sz w:val="24"/>
-          <w:sz-cs w:val="24"/>
-          <w:spacing w:val="0"/>
-          <w:color w:val="181F26"/>
-        </w:rPr>
-        <w:t xml:space="preserve">consent-grant and capability-lease issuance</w:t>
-      </w:r>
-    </w:p>
-    <w:p>
-      <w:pPr>
-        <w:ind w:left="720" w:first-line="-720"/>
-      </w:pPr>
-      <w:r>
-        <w:rPr>
-          <w:rFonts w:ascii="Helvetica Neue" w:hAnsi="Helvetica Neue" w:cs="Helvetica Neue"/>
-          <w:sz w:val="24"/>
-          <w:sz-cs w:val="24"/>
-          <w:color w:val="181F26"/>
-        </w:rPr>
-        <w:t xml:space="preserve"/>
-        <w:tab/>
-        <w:t xml:space="preserve">•</w:t>
-        <w:tab/>
-        <w:t xml:space="preserve"/>
-      </w:r>
-      <w:r>
-        <w:rPr>
-          <w:rFonts w:ascii="Helvetica Neue" w:hAnsi="Helvetica Neue" w:cs="Helvetica Neue"/>
-          <w:sz w:val="24"/>
-          <w:sz-cs w:val="24"/>
-          <w:spacing w:val="0"/>
-          <w:color w:val="181F26"/>
-        </w:rPr>
-        <w:t xml:space="preserve">audit receipt emission and revocation handling</w:t>
-      </w:r>
-    </w:p>
-    <w:p>
-      <w:pPr>
-        <w:ind w:left="720" w:first-line="-720"/>
-      </w:pPr>
-      <w:r>
-        <w:rPr>
-          <w:rFonts w:ascii="Helvetica Neue" w:hAnsi="Helvetica Neue" w:cs="Helvetica Neue"/>
-          <w:sz w:val="24"/>
-          <w:sz-cs w:val="24"/>
-          <w:color w:val="181F26"/>
-        </w:rPr>
-        <w:t xml:space="preserve"/>
-        <w:tab/>
-        <w:t xml:space="preserve">•</w:t>
-        <w:tab/>
-        <w:t xml:space="preserve"/>
-      </w:r>
-      <w:r>
-        <w:rPr>
-          <w:rFonts w:ascii="Helvetica Neue" w:hAnsi="Helvetica Neue" w:cs="Helvetica Neue"/>
-          <w:sz w:val="24"/>
-          <w:sz-cs w:val="24"/>
-          <w:spacing w:val="0"/>
-          <w:color w:val="181F26"/>
-        </w:rPr>
         <w:t xml:space="preserve">OpenClaw inbound plugin and Gateway RPC bridge</w:t>
       </w:r>
     </w:p>
@@ -34043,6 +34795,44 @@
           <w:spacing w:val="0"/>
           <w:color w:val="181F26"/>
         </w:rPr>
+        <w:t xml:space="preserve">workspace_editor</w:t>
+      </w:r>
+      <w:r>
+        <w:rPr>
+          <w:rFonts w:ascii="Helvetica Neue" w:hAnsi="Helvetica Neue" w:cs="Helvetica Neue"/>
+          <w:sz w:val="24"/>
+          <w:sz-cs w:val="24"/>
+          <w:spacing w:val="0"/>
+          <w:color w:val="181F26"/>
+        </w:rPr>
+        <w:t xml:space="preserve"/>
+      </w:r>
+    </w:p>
+    <w:p>
+      <w:pPr>
+        <w:ind w:left="720" w:first-line="-720"/>
+      </w:pPr>
+      <w:r>
+        <w:rPr>
+          <w:rFonts w:ascii="Menlo" w:hAnsi="Menlo" w:cs="Menlo"/>
+          <w:sz w:val="24"/>
+          <w:sz-cs w:val="24"/>
+          <w:color w:val="181F26"/>
+        </w:rPr>
+        <w:t xml:space="preserve"/>
+        <w:tab/>
+        <w:t xml:space="preserve">•</w:t>
+        <w:tab/>
+        <w:t xml:space="preserve"/>
+      </w:r>
+      <w:r>
+        <w:rPr>
+          <w:rFonts w:ascii="Menlo" w:hAnsi="Menlo" w:cs="Menlo"/>
+          <w:sz w:val="24"/>
+          <w:sz-cs w:val="24"/>
+          <w:spacing w:val="0"/>
+          <w:color w:val="181F26"/>
+        </w:rPr>
         <w:t xml:space="preserve">incident_enricher</w:t>
       </w:r>
       <w:r>
@@ -34239,7 +35029,27 @@
           <w:spacing w:val="0"/>
           <w:color w:val="181F26"/>
         </w:rPr>
-        <w:t xml:space="preserve">A mutating step, such as posting a write-back comment or editing a local workspace, requires approval.</w:t>
+        <w:t xml:space="preserve">A mutating local workspace step is held in </w:t>
+      </w:r>
+      <w:r>
+        <w:rPr>
+          <w:rFonts w:ascii="Menlo" w:hAnsi="Menlo" w:cs="Menlo"/>
+          <w:sz w:val="24"/>
+          <w:sz-cs w:val="24"/>
+          <w:spacing w:val="0"/>
+          <w:color w:val="181F26"/>
+        </w:rPr>
+        <w:t xml:space="preserve">awaiting_approval</w:t>
+      </w:r>
+      <w:r>
+        <w:rPr>
+          <w:rFonts w:ascii="Helvetica Neue" w:hAnsi="Helvetica Neue" w:cs="Helvetica Neue"/>
+          <w:sz w:val="24"/>
+          <w:sz-cs w:val="24"/>
+          <w:spacing w:val="0"/>
+          <w:color w:val="181F26"/>
+        </w:rPr>
+        <w:t xml:space="preserve">, then either approved into a lease-bound action or rejected with an audit trail.</w:t>
       </w:r>
     </w:p>
     <w:p>
@@ -35019,6 +35829,44 @@
     </w:p>
     <w:p>
       <w:pPr>
+        <w:ind w:left="720" w:first-line="-720"/>
+      </w:pPr>
+      <w:r>
+        <w:rPr>
+          <w:rFonts w:ascii="Menlo" w:hAnsi="Menlo" w:cs="Menlo"/>
+          <w:sz w:val="24"/>
+          <w:sz-cs w:val="24"/>
+          <w:color w:val="181F26"/>
+        </w:rPr>
+        <w:t xml:space="preserve"/>
+        <w:tab/>
+        <w:t xml:space="preserve">•</w:t>
+        <w:tab/>
+        <w:t xml:space="preserve"/>
+      </w:r>
+      <w:r>
+        <w:rPr>
+          <w:rFonts w:ascii="Menlo" w:hAnsi="Menlo" w:cs="Menlo"/>
+          <w:sz w:val="24"/>
+          <w:sz-cs w:val="24"/>
+          <w:spacing w:val="0"/>
+          <w:color w:val="181F26"/>
+        </w:rPr>
+        <w:t xml:space="preserve">workspace.patch.apply</w:t>
+      </w:r>
+      <w:r>
+        <w:rPr>
+          <w:rFonts w:ascii="Helvetica Neue" w:hAnsi="Helvetica Neue" w:cs="Helvetica Neue"/>
+          <w:sz w:val="24"/>
+          <w:sz-cs w:val="24"/>
+          <w:spacing w:val="0"/>
+          <w:color w:val="181F26"/>
+        </w:rPr>
+        <w:t xml:space="preserve"> is supported as a local deterministic mutation path and only executes after approval and lease validation.</w:t>
+      </w:r>
+    </w:p>
+    <w:p>
+      <w:pPr>
         <w:spacing w:after="152"/>
       </w:pPr>
       <w:r>
@@ -35249,6 +36097,34 @@
     </w:p>
     <w:p>
       <w:pPr>
+        <w:ind w:left="720" w:first-line="-720"/>
+      </w:pPr>
+      <w:r>
+        <w:rPr>
+          <w:rFonts w:ascii="Helvetica Neue" w:hAnsi="Helvetica Neue" w:cs="Helvetica Neue"/>
+          <w:sz w:val="24"/>
+          <w:sz-cs w:val="24"/>
+          <w:color w:val="181F26"/>
+        </w:rPr>
+        <w:t xml:space="preserve"/>
+        <w:tab/>
+        <w:t xml:space="preserve">•</w:t>
+        <w:tab/>
+        <w:t xml:space="preserve"/>
+      </w:r>
+      <w:r>
+        <w:rPr>
+          <w:rFonts w:ascii="Helvetica Neue" w:hAnsi="Helvetica Neue" w:cs="Helvetica Neue"/>
+          <w:sz w:val="24"/>
+          <w:sz-cs w:val="24"/>
+          <w:spacing w:val="0"/>
+          <w:color w:val="181F26"/>
+        </w:rPr>
+        <w:t xml:space="preserve">Same-owner local read-only work can be leased automatically; approval-gated mutation creates grants, leases, and audit receipts through operator flow.</w:t>
+      </w:r>
+    </w:p>
+    <w:p>
+      <w:pPr>
         <w:spacing w:after="152"/>
       </w:pPr>
       <w:r>
@@ -35732,6 +36608,74 @@
           <w:spacing w:val="0"/>
           <w:color w:val="181F26"/>
         </w:rPr>
+        <w:t xml:space="preserve">Approved mutation steps issue </w:t>
+      </w:r>
+      <w:r>
+        <w:rPr>
+          <w:rFonts w:ascii="Menlo" w:hAnsi="Menlo" w:cs="Menlo"/>
+          <w:sz w:val="24"/>
+          <w:sz-cs w:val="24"/>
+          <w:spacing w:val="0"/>
+          <w:color w:val="181F26"/>
+        </w:rPr>
+        <w:t xml:space="preserve">ConsentGrant</w:t>
+      </w:r>
+      <w:r>
+        <w:rPr>
+          <w:rFonts w:ascii="Helvetica Neue" w:hAnsi="Helvetica Neue" w:cs="Helvetica Neue"/>
+          <w:sz w:val="24"/>
+          <w:sz-cs w:val="24"/>
+          <w:spacing w:val="0"/>
+          <w:color w:val="181F26"/>
+        </w:rPr>
+        <w:t xml:space="preserve"> and </w:t>
+      </w:r>
+      <w:r>
+        <w:rPr>
+          <w:rFonts w:ascii="Menlo" w:hAnsi="Menlo" w:cs="Menlo"/>
+          <w:sz w:val="24"/>
+          <w:sz-cs w:val="24"/>
+          <w:spacing w:val="0"/>
+          <w:color w:val="181F26"/>
+        </w:rPr>
+        <w:t xml:space="preserve">CapabilityLease</w:t>
+      </w:r>
+      <w:r>
+        <w:rPr>
+          <w:rFonts w:ascii="Helvetica Neue" w:hAnsi="Helvetica Neue" w:cs="Helvetica Neue"/>
+          <w:sz w:val="24"/>
+          <w:sz-cs w:val="24"/>
+          <w:spacing w:val="0"/>
+          <w:color w:val="181F26"/>
+        </w:rPr>
+        <w:t xml:space="preserve">; revoked leases fail pending work before mutation commit.</w:t>
+      </w:r>
+    </w:p>
+    <w:p>
+      <w:pPr>
+        <w:ind w:left="720" w:first-line="-720"/>
+      </w:pPr>
+      <w:r>
+        <w:rPr>
+          <w:rFonts w:ascii="Helvetica Neue" w:hAnsi="Helvetica Neue" w:cs="Helvetica Neue"/>
+          <w:sz w:val="24"/>
+          <w:sz-cs w:val="24"/>
+          <w:color w:val="181F26"/>
+        </w:rPr>
+        <w:t xml:space="preserve"/>
+        <w:tab/>
+        <w:t xml:space="preserve">•</w:t>
+        <w:tab/>
+        <w:t xml:space="preserve"/>
+      </w:r>
+      <w:r>
+        <w:rPr>
+          <w:rFonts w:ascii="Helvetica Neue" w:hAnsi="Helvetica Neue" w:cs="Helvetica Neue"/>
+          <w:sz w:val="24"/>
+          <w:sz-cs w:val="24"/>
+          <w:spacing w:val="0"/>
+          <w:color w:val="181F26"/>
+        </w:rPr>
         <w:t xml:space="preserve">Secret references are resolved only for adapters and scopes allowed by the compiled contract.</w:t>
       </w:r>
     </w:p>
@@ -36728,7 +37672,7 @@
           <w:spacing w:val="0"/>
           <w:color w:val="181F26"/>
         </w:rPr>
-        <w:t xml:space="preserve">Verify approval continues execution and rejection terminates or expires it according to policy.</w:t>
+        <w:t xml:space="preserve">Verify approval issues grant and lease state, rejection terminates it, and lease revocation blocks later mutation commit.</w:t>
       </w:r>
     </w:p>
     <w:p>

</xml_diff>

<commit_message>
docs: publish alpha3 operator demo flow
</commit_message>
<xml_diff>
--- a/docs/exports/Crawfish-PRD.docx
+++ b/docs/exports/Crawfish-PRD.docx
@@ -3719,6 +3719,44 @@
           <w:spacing w:val="0"/>
           <w:color w:val="181F26"/>
         </w:rPr>
+        <w:t xml:space="preserve">incident.enrich</w:t>
+      </w:r>
+      <w:r>
+        <w:rPr>
+          <w:rFonts w:ascii="Helvetica Neue" w:hAnsi="Helvetica Neue" w:cs="Helvetica Neue"/>
+          <w:sz w:val="24"/>
+          <w:sz-cs w:val="24"/>
+          <w:spacing w:val="0"/>
+          <w:color w:val="181F26"/>
+        </w:rPr>
+        <w:t xml:space="preserve"> turns local logs plus service topology into deterministic blast-radius and next-step artifacts.</w:t>
+      </w:r>
+    </w:p>
+    <w:p>
+      <w:pPr>
+        <w:ind w:left="720" w:first-line="-720"/>
+      </w:pPr>
+      <w:r>
+        <w:rPr>
+          <w:rFonts w:ascii="Menlo" w:hAnsi="Menlo" w:cs="Menlo"/>
+          <w:sz w:val="24"/>
+          <w:sz-cs w:val="24"/>
+          <w:color w:val="181F26"/>
+        </w:rPr>
+        <w:t xml:space="preserve"/>
+        <w:tab/>
+        <w:t xml:space="preserve">•</w:t>
+        <w:tab/>
+        <w:t xml:space="preserve"/>
+      </w:r>
+      <w:r>
+        <w:rPr>
+          <w:rFonts w:ascii="Menlo" w:hAnsi="Menlo" w:cs="Menlo"/>
+          <w:sz w:val="24"/>
+          <w:sz-cs w:val="24"/>
+          <w:spacing w:val="0"/>
+          <w:color w:val="181F26"/>
+        </w:rPr>
         <w:t xml:space="preserve">workspace.patch.apply</w:t>
       </w:r>
       <w:r>
@@ -3815,6 +3853,26 @@
           <w:spacing w:val="0"/>
           <w:color w:val="181F26"/>
         </w:rPr>
+        <w:t xml:space="preserve">action events</w:t>
+      </w:r>
+      <w:r>
+        <w:rPr>
+          <w:rFonts w:ascii="Helvetica Neue" w:hAnsi="Helvetica Neue" w:cs="Helvetica Neue"/>
+          <w:sz w:val="24"/>
+          <w:sz-cs w:val="24"/>
+          <w:spacing w:val="0"/>
+          <w:color w:val="181F26"/>
+        </w:rPr>
+        <w:t xml:space="preserve">, </w:t>
+      </w:r>
+      <w:r>
+        <w:rPr>
+          <w:rFonts w:ascii="Menlo" w:hAnsi="Menlo" w:cs="Menlo"/>
+          <w:sz w:val="24"/>
+          <w:sz-cs w:val="24"/>
+          <w:spacing w:val="0"/>
+          <w:color w:val="181F26"/>
+        </w:rPr>
         <w:t xml:space="preserve">action approve</w:t>
       </w:r>
       <w:r>
@@ -3946,6 +4004,44 @@
     </w:p>
     <w:p>
       <w:pPr>
+        <w:ind w:left="720" w:first-line="-720"/>
+      </w:pPr>
+      <w:r>
+        <w:rPr>
+          <w:rFonts w:ascii="Menlo" w:hAnsi="Menlo" w:cs="Menlo"/>
+          <w:sz w:val="24"/>
+          <w:sz-cs w:val="24"/>
+          <w:color w:val="181F26"/>
+        </w:rPr>
+        <w:t xml:space="preserve"/>
+        <w:tab/>
+        <w:t xml:space="preserve">•</w:t>
+        <w:tab/>
+        <w:t xml:space="preserve"/>
+      </w:r>
+      <w:r>
+        <w:rPr>
+          <w:rFonts w:ascii="Menlo" w:hAnsi="Menlo" w:cs="Menlo"/>
+          <w:sz w:val="24"/>
+          <w:sz-cs w:val="24"/>
+          <w:spacing w:val="0"/>
+          <w:color w:val="181F26"/>
+        </w:rPr>
+        <w:t xml:space="preserve">workspace_editor</w:t>
+      </w:r>
+      <w:r>
+        <w:rPr>
+          <w:rFonts w:ascii="Helvetica Neue" w:hAnsi="Helvetica Neue" w:cs="Helvetica Neue"/>
+          <w:sz w:val="24"/>
+          <w:sz-cs w:val="24"/>
+          <w:spacing w:val="0"/>
+          <w:color w:val="181F26"/>
+        </w:rPr>
+        <w:t xml:space="preserve"> now enforces workspace-scoped file locks and surfaces lock conflict and lease-expiry failures as stable operator-visible metadata.</w:t>
+      </w:r>
+    </w:p>
+    <w:p>
+      <w:pPr>
         <w:spacing w:after="240"/>
       </w:pPr>
       <w:r>
@@ -4017,6 +4113,61 @@
           <w:color w:val="181F26"/>
         </w:rPr>
         <w:t xml:space="preserve"> can fetch remote log material through MCP and then complete the actual classification locally.</w:t>
+      </w:r>
+    </w:p>
+    <w:p>
+      <w:pPr>
+        <w:spacing w:after="240"/>
+      </w:pPr>
+      <w:r>
+        <w:rPr>
+          <w:rFonts w:ascii="Helvetica Neue" w:hAnsi="Helvetica Neue" w:cs="Helvetica Neue"/>
+          <w:sz w:val="24"/>
+          <w:sz-cs w:val="24"/>
+          <w:spacing w:val="0"/>
+          <w:color w:val="181F26"/>
+        </w:rPr>
+        <w:t xml:space="preserve">With this </w:t>
+      </w:r>
+      <w:r>
+        <w:rPr>
+          <w:rFonts w:ascii="Menlo" w:hAnsi="Menlo" w:cs="Menlo"/>
+          <w:sz w:val="24"/>
+          <w:sz-cs w:val="24"/>
+          <w:spacing w:val="0"/>
+          <w:color w:val="181F26"/>
+        </w:rPr>
+        <w:t xml:space="preserve">alpha.3</w:t>
+      </w:r>
+      <w:r>
+        <w:rPr>
+          <w:rFonts w:ascii="Helvetica Neue" w:hAnsi="Helvetica Neue" w:cs="Helvetica Neue"/>
+          <w:sz w:val="24"/>
+          <w:sz-cs w:val="24"/>
+          <w:spacing w:val="0"/>
+          <w:color w:val="181F26"/>
+        </w:rPr>
+        <w:t xml:space="preserve"> slice in place, the next planned milestone is </w:t>
+      </w:r>
+      <w:r>
+        <w:rPr>
+          <w:rFonts w:ascii="Menlo" w:hAnsi="Menlo" w:cs="Menlo"/>
+          <w:sz w:val="24"/>
+          <w:sz-cs w:val="24"/>
+          <w:spacing w:val="0"/>
+          <w:color w:val="181F26"/>
+        </w:rPr>
+        <w:t xml:space="preserve">P1a OpenClaw inbound</w:t>
+      </w:r>
+      <w:r>
+        <w:rPr>
+          <w:rFonts w:ascii="Helvetica Neue" w:hAnsi="Helvetica Neue" w:cs="Helvetica Neue"/>
+          <w:sz w:val="24"/>
+          <w:sz-cs w:val="24"/>
+          <w:spacing w:val="0"/>
+          <w:color w:val="181F26"/>
+        </w:rPr>
+        <w:t xml:space="preserve">.</w:t>
       </w:r>
     </w:p>
     <w:p>
@@ -4543,6 +4694,97 @@
           <w:spacing w:val="0"/>
           <w:color w:val="DFE8F2"/>
         </w:rPr>
+        <w:t xml:space="preserve">cargo run -p crawfish-cli --bin crawfish -- action submit \</w:t>
+      </w:r>
+    </w:p>
+    <w:p>
+      <w:pPr/>
+      <w:r>
+        <w:rPr>
+          <w:rFonts w:ascii="Menlo" w:hAnsi="Menlo" w:cs="Menlo"/>
+          <w:sz w:val="24"/>
+          <w:sz-cs w:val="24"/>
+          <w:spacing w:val="0"/>
+          <w:color w:val="DFE8F2"/>
+        </w:rPr>
+        <w:t xml:space="preserve">  --target-agent incident_enricher \</w:t>
+      </w:r>
+    </w:p>
+    <w:p>
+      <w:pPr/>
+      <w:r>
+        <w:rPr>
+          <w:rFonts w:ascii="Menlo" w:hAnsi="Menlo" w:cs="Menlo"/>
+          <w:sz w:val="24"/>
+          <w:sz-cs w:val="24"/>
+          <w:spacing w:val="0"/>
+          <w:color w:val="DFE8F2"/>
+        </w:rPr>
+        <w:t xml:space="preserve">  --capability incident.enrich \</w:t>
+      </w:r>
+    </w:p>
+    <w:p>
+      <w:pPr/>
+      <w:r>
+        <w:rPr>
+          <w:rFonts w:ascii="Menlo" w:hAnsi="Menlo" w:cs="Menlo"/>
+          <w:sz w:val="24"/>
+          <w:sz-cs w:val="24"/>
+          <w:spacing w:val="0"/>
+          <w:color w:val="DFE8F2"/>
+        </w:rPr>
+        <w:t xml:space="preserve">  --goal "enrich local incident" \</w:t>
+      </w:r>
+    </w:p>
+    <w:p>
+      <w:pPr/>
+      <w:r>
+        <w:rPr>
+          <w:rFonts w:ascii="Menlo" w:hAnsi="Menlo" w:cs="Menlo"/>
+          <w:sz w:val="24"/>
+          <w:sz-cs w:val="24"/>
+          <w:spacing w:val="0"/>
+          <w:color w:val="DFE8F2"/>
+        </w:rPr>
+        <w:t xml:space="preserve">  --caller-owner local-dev \</w:t>
+      </w:r>
+    </w:p>
+    <w:p>
+      <w:pPr/>
+      <w:r>
+        <w:rPr>
+          <w:rFonts w:ascii="Menlo" w:hAnsi="Menlo" w:cs="Menlo"/>
+          <w:sz w:val="24"/>
+          <w:sz-cs w:val="24"/>
+          <w:spacing w:val="0"/>
+          <w:color w:val="DFE8F2"/>
+        </w:rPr>
+        <w:t xml:space="preserve">  --inputs-json "{\"service_name\":\"api\",\"log_text\":\"ERROR api timeout contacting db\\nWARN web received 503 service unavailable from api\\n\"}" \</w:t>
+      </w:r>
+    </w:p>
+    <w:p>
+      <w:pPr/>
+      <w:r>
+        <w:rPr>
+          <w:rFonts w:ascii="Menlo" w:hAnsi="Menlo" w:cs="Menlo"/>
+          <w:sz w:val="24"/>
+          <w:sz-cs w:val="24"/>
+          <w:spacing w:val="0"/>
+          <w:color w:val="DFE8F2"/>
+        </w:rPr>
+        <w:t xml:space="preserve">  --json</w:t>
+      </w:r>
+    </w:p>
+    <w:p>
+      <w:pPr/>
+      <w:r>
+        <w:rPr>
+          <w:rFonts w:ascii="Menlo" w:hAnsi="Menlo" w:cs="Menlo"/>
+          <w:sz w:val="24"/>
+          <w:sz-cs w:val="24"/>
+          <w:spacing w:val="0"/>
+          <w:color w:val="DFE8F2"/>
+        </w:rPr>
         <w:t xml:space="preserve">MUTATION_ID=$(cargo run -p crawfish-cli --bin crawfish -- action submit \</w:t>
       </w:r>
     </w:p>
@@ -4699,6 +4941,19 @@
           <w:spacing w:val="0"/>
           <w:color w:val="DFE8F2"/>
         </w:rPr>
+        <w:t xml:space="preserve">cargo run -p crawfish-cli --bin crawfish -- action events "$MUTATION_ID" --json</w:t>
+      </w:r>
+    </w:p>
+    <w:p>
+      <w:pPr/>
+      <w:r>
+        <w:rPr>
+          <w:rFonts w:ascii="Menlo" w:hAnsi="Menlo" w:cs="Menlo"/>
+          <w:sz w:val="24"/>
+          <w:sz-cs w:val="24"/>
+          <w:spacing w:val="0"/>
+          <w:color w:val="DFE8F2"/>
+        </w:rPr>
         <w:t xml:space="preserve">kill $CRAWFISH_PID</w:t>
       </w:r>
     </w:p>
@@ -4747,6 +5002,27 @@
           <w:color w:val="0000E9"/>
         </w:rPr>
         <w:t xml:space="preserve">examples/hero-fleet/agents/</w:t>
+      </w:r>
+      <w:r>
+        <w:rPr>
+          <w:rFonts w:ascii="Helvetica Neue" w:hAnsi="Helvetica Neue" w:cs="Helvetica Neue"/>
+          <w:sz w:val="24"/>
+          <w:sz-cs w:val="24"/>
+          <w:spacing w:val="0"/>
+          <w:color w:val="181F26"/>
+        </w:rPr>
+        <w:t xml:space="preserve">. For a repeatable local demo that exercises review, incident enrichment, approval-gated mutation, and operator event inspection, run </w:t>
+      </w:r>
+      <w:r>
+        <w:rPr>
+          <w:rFonts w:ascii="Menlo" w:hAnsi="Menlo" w:cs="Menlo"/>
+          <w:sz w:val="24"/>
+          <w:sz-cs w:val="24"/>
+          <w:u w:val="single"/>
+          <w:spacing w:val="0"/>
+          <w:color w:val="0000E9"/>
+        </w:rPr>
+        <w:t xml:space="preserve">examples/hero-fleet/demo.sh</w:t>
       </w:r>
       <w:r>
         <w:rPr>
@@ -33120,6 +33396,84 @@
           <w:spacing w:val="0"/>
           <w:color w:val="181F26"/>
         </w:rPr>
+        <w:t xml:space="preserve">incident_enricher</w:t>
+      </w:r>
+      <w:r>
+        <w:rPr>
+          <w:rFonts w:ascii="Helvetica Neue" w:hAnsi="Helvetica Neue" w:cs="Helvetica Neue"/>
+          <w:sz w:val="24"/>
+          <w:sz-cs w:val="24"/>
+          <w:spacing w:val="0"/>
+          <w:color w:val="181F26"/>
+        </w:rPr>
+        <w:t xml:space="preserve"> emits </w:t>
+      </w:r>
+      <w:r>
+        <w:rPr>
+          <w:rFonts w:ascii="Menlo" w:hAnsi="Menlo" w:cs="Menlo"/>
+          <w:sz w:val="24"/>
+          <w:sz-cs w:val="24"/>
+          <w:spacing w:val="0"/>
+          <w:color w:val="181F26"/>
+        </w:rPr>
+        <w:t xml:space="preserve">incident_enrichment.json</w:t>
+      </w:r>
+      <w:r>
+        <w:rPr>
+          <w:rFonts w:ascii="Helvetica Neue" w:hAnsi="Helvetica Neue" w:cs="Helvetica Neue"/>
+          <w:sz w:val="24"/>
+          <w:sz-cs w:val="24"/>
+          <w:spacing w:val="0"/>
+          <w:color w:val="181F26"/>
+        </w:rPr>
+        <w:t xml:space="preserve"> plus </w:t>
+      </w:r>
+      <w:r>
+        <w:rPr>
+          <w:rFonts w:ascii="Menlo" w:hAnsi="Menlo" w:cs="Menlo"/>
+          <w:sz w:val="24"/>
+          <w:sz-cs w:val="24"/>
+          <w:spacing w:val="0"/>
+          <w:color w:val="181F26"/>
+        </w:rPr>
+        <w:t xml:space="preserve">incident_summary.md</w:t>
+      </w:r>
+      <w:r>
+        <w:rPr>
+          <w:rFonts w:ascii="Helvetica Neue" w:hAnsi="Helvetica Neue" w:cs="Helvetica Neue"/>
+          <w:sz w:val="24"/>
+          <w:sz-cs w:val="24"/>
+          <w:spacing w:val="0"/>
+          <w:color w:val="181F26"/>
+        </w:rPr>
+        <w:t xml:space="preserve"> from local logs and optional service topology input.</w:t>
+      </w:r>
+    </w:p>
+    <w:p>
+      <w:pPr>
+        <w:ind w:left="720" w:first-line="-720"/>
+      </w:pPr>
+      <w:r>
+        <w:rPr>
+          <w:rFonts w:ascii="Menlo" w:hAnsi="Menlo" w:cs="Menlo"/>
+          <w:sz w:val="24"/>
+          <w:sz-cs w:val="24"/>
+          <w:color w:val="181F26"/>
+        </w:rPr>
+        <w:t xml:space="preserve"/>
+        <w:tab/>
+        <w:t xml:space="preserve">•</w:t>
+        <w:tab/>
+        <w:t xml:space="preserve"/>
+      </w:r>
+      <w:r>
+        <w:rPr>
+          <w:rFonts w:ascii="Menlo" w:hAnsi="Menlo" w:cs="Menlo"/>
+          <w:sz w:val="24"/>
+          <w:sz-cs w:val="24"/>
+          <w:spacing w:val="0"/>
+          <w:color w:val="181F26"/>
+        </w:rPr>
         <w:t xml:space="preserve">workspace_editor</w:t>
       </w:r>
       <w:r>
@@ -33216,7 +33570,7 @@
           <w:spacing w:val="0"/>
           <w:color w:val="181F26"/>
         </w:rPr>
-        <w:t xml:space="preserve"> already exposes artifact refs, checkpoint refs, recovery stage, encounter metadata, grant details, lease detail, and external refs.</w:t>
+        <w:t xml:space="preserve"> already exposes artifact refs, checkpoint refs, recovery stage, encounter metadata, grant details, lease detail, blocked reason, terminal code, lock detail, and external refs.</w:t>
       </w:r>
     </w:p>
     <w:p>
@@ -33567,6 +33921,299 @@
           <w:color w:val="181F26"/>
         </w:rPr>
         <w:t xml:space="preserve">lease enforcement before execution and before local mutation commit</w:t>
+      </w:r>
+    </w:p>
+    <w:p>
+      <w:pPr>
+        <w:spacing w:after="240"/>
+      </w:pPr>
+      <w:r>
+        <w:rPr>
+          <w:rFonts w:ascii="Helvetica Neue" w:hAnsi="Helvetica Neue" w:cs="Helvetica Neue"/>
+          <w:sz w:val="24"/>
+          <w:sz-cs w:val="24"/>
+          <w:spacing w:val="0"/>
+          <w:color w:val="181F26"/>
+        </w:rPr>
+        <w:t xml:space="preserve">The current </w:t>
+      </w:r>
+      <w:r>
+        <w:rPr>
+          <w:rFonts w:ascii="Menlo" w:hAnsi="Menlo" w:cs="Menlo"/>
+          <w:sz w:val="24"/>
+          <w:sz-cs w:val="24"/>
+          <w:spacing w:val="0"/>
+          <w:color w:val="181F26"/>
+        </w:rPr>
+        <w:t xml:space="preserve">0.1.0-alpha.3</w:t>
+      </w:r>
+      <w:r>
+        <w:rPr>
+          <w:rFonts w:ascii="Helvetica Neue" w:hAnsi="Helvetica Neue" w:cs="Helvetica Neue"/>
+          <w:sz w:val="24"/>
+          <w:sz-cs w:val="24"/>
+          <w:spacing w:val="0"/>
+          <w:color w:val="181F26"/>
+        </w:rPr>
+        <w:t xml:space="preserve"> readiness slice adds:</w:t>
+      </w:r>
+    </w:p>
+    <w:p>
+      <w:pPr>
+        <w:ind w:left="720" w:first-line="-720"/>
+      </w:pPr>
+      <w:r>
+        <w:rPr>
+          <w:rFonts w:ascii="Menlo" w:hAnsi="Menlo" w:cs="Menlo"/>
+          <w:sz w:val="24"/>
+          <w:sz-cs w:val="24"/>
+          <w:color w:val="181F26"/>
+        </w:rPr>
+        <w:t xml:space="preserve"/>
+        <w:tab/>
+        <w:t xml:space="preserve">•</w:t>
+        <w:tab/>
+        <w:t xml:space="preserve"/>
+      </w:r>
+      <w:r>
+        <w:rPr>
+          <w:rFonts w:ascii="Menlo" w:hAnsi="Menlo" w:cs="Menlo"/>
+          <w:sz w:val="24"/>
+          <w:sz-cs w:val="24"/>
+          <w:spacing w:val="0"/>
+          <w:color w:val="181F26"/>
+        </w:rPr>
+        <w:t xml:space="preserve">action events</w:t>
+      </w:r>
+      <w:r>
+        <w:rPr>
+          <w:rFonts w:ascii="Helvetica Neue" w:hAnsi="Helvetica Neue" w:cs="Helvetica Neue"/>
+          <w:sz w:val="24"/>
+          <w:sz-cs w:val="24"/>
+          <w:spacing w:val="0"/>
+          <w:color w:val="181F26"/>
+        </w:rPr>
+        <w:t xml:space="preserve"> as a first-class operator timeline over the local UDS API</w:t>
+      </w:r>
+    </w:p>
+    <w:p>
+      <w:pPr>
+        <w:ind w:left="720" w:first-line="-720"/>
+      </w:pPr>
+      <w:r>
+        <w:rPr>
+          <w:rFonts w:ascii="Helvetica Neue" w:hAnsi="Helvetica Neue" w:cs="Helvetica Neue"/>
+          <w:sz w:val="24"/>
+          <w:sz-cs w:val="24"/>
+          <w:color w:val="181F26"/>
+        </w:rPr>
+        <w:t xml:space="preserve"/>
+        <w:tab/>
+        <w:t xml:space="preserve">•</w:t>
+        <w:tab/>
+        <w:t xml:space="preserve"/>
+      </w:r>
+      <w:r>
+        <w:rPr>
+          <w:rFonts w:ascii="Helvetica Neue" w:hAnsi="Helvetica Neue" w:cs="Helvetica Neue"/>
+          <w:sz w:val="24"/>
+          <w:sz-cs w:val="24"/>
+          <w:spacing w:val="0"/>
+          <w:color w:val="181F26"/>
+        </w:rPr>
+        <w:t xml:space="preserve">deterministic </w:t>
+      </w:r>
+      <w:r>
+        <w:rPr>
+          <w:rFonts w:ascii="Menlo" w:hAnsi="Menlo" w:cs="Menlo"/>
+          <w:sz w:val="24"/>
+          <w:sz-cs w:val="24"/>
+          <w:spacing w:val="0"/>
+          <w:color w:val="181F26"/>
+        </w:rPr>
+        <w:t xml:space="preserve">incident.enrich</w:t>
+      </w:r>
+      <w:r>
+        <w:rPr>
+          <w:rFonts w:ascii="Helvetica Neue" w:hAnsi="Helvetica Neue" w:cs="Helvetica Neue"/>
+          <w:sz w:val="24"/>
+          <w:sz-cs w:val="24"/>
+          <w:spacing w:val="0"/>
+          <w:color w:val="181F26"/>
+        </w:rPr>
+        <w:t xml:space="preserve"> execution for the hero fleet</w:t>
+      </w:r>
+    </w:p>
+    <w:p>
+      <w:pPr>
+        <w:ind w:left="720" w:first-line="-720"/>
+      </w:pPr>
+      <w:r>
+        <w:rPr>
+          <w:rFonts w:ascii="Helvetica Neue" w:hAnsi="Helvetica Neue" w:cs="Helvetica Neue"/>
+          <w:sz w:val="24"/>
+          <w:sz-cs w:val="24"/>
+          <w:color w:val="181F26"/>
+        </w:rPr>
+        <w:t xml:space="preserve"/>
+        <w:tab/>
+        <w:t xml:space="preserve">•</w:t>
+        <w:tab/>
+        <w:t xml:space="preserve"/>
+      </w:r>
+      <w:r>
+        <w:rPr>
+          <w:rFonts w:ascii="Helvetica Neue" w:hAnsi="Helvetica Neue" w:cs="Helvetica Neue"/>
+          <w:sz w:val="24"/>
+          <w:sz-cs w:val="24"/>
+          <w:spacing w:val="0"/>
+          <w:color w:val="181F26"/>
+        </w:rPr>
+        <w:t xml:space="preserve">workspace-scoped file locking for approval-gated mutation</w:t>
+      </w:r>
+    </w:p>
+    <w:p>
+      <w:pPr>
+        <w:ind w:left="720" w:first-line="-720"/>
+      </w:pPr>
+      <w:r>
+        <w:rPr>
+          <w:rFonts w:ascii="Helvetica Neue" w:hAnsi="Helvetica Neue" w:cs="Helvetica Neue"/>
+          <w:sz w:val="24"/>
+          <w:sz-cs w:val="24"/>
+          <w:color w:val="181F26"/>
+        </w:rPr>
+        <w:t xml:space="preserve"/>
+        <w:tab/>
+        <w:t xml:space="preserve">•</w:t>
+        <w:tab/>
+        <w:t xml:space="preserve"/>
+      </w:r>
+      <w:r>
+        <w:rPr>
+          <w:rFonts w:ascii="Helvetica Neue" w:hAnsi="Helvetica Neue" w:cs="Helvetica Neue"/>
+          <w:sz w:val="24"/>
+          <w:sz-cs w:val="24"/>
+          <w:spacing w:val="0"/>
+          <w:color w:val="181F26"/>
+        </w:rPr>
+        <w:t xml:space="preserve">stable operator-visible failure taxonomy for approval, lease, lock, route, executor, and recovery outcomes</w:t>
+      </w:r>
+    </w:p>
+    <w:p>
+      <w:pPr>
+        <w:ind w:left="720" w:first-line="-720"/>
+      </w:pPr>
+      <w:r>
+        <w:rPr>
+          <w:rFonts w:ascii="Helvetica Neue" w:hAnsi="Helvetica Neue" w:cs="Helvetica Neue"/>
+          <w:sz w:val="24"/>
+          <w:sz-cs w:val="24"/>
+          <w:color w:val="181F26"/>
+        </w:rPr>
+        <w:t xml:space="preserve"/>
+        <w:tab/>
+        <w:t xml:space="preserve">•</w:t>
+        <w:tab/>
+        <w:t xml:space="preserve"/>
+      </w:r>
+      <w:r>
+        <w:rPr>
+          <w:rFonts w:ascii="Helvetica Neue" w:hAnsi="Helvetica Neue" w:cs="Helvetica Neue"/>
+          <w:sz w:val="24"/>
+          <w:sz-cs w:val="24"/>
+          <w:spacing w:val="0"/>
+          <w:color w:val="181F26"/>
+        </w:rPr>
+        <w:t xml:space="preserve">reference example assets and a repeatable </w:t>
+      </w:r>
+      <w:r>
+        <w:rPr>
+          <w:rFonts w:ascii="Menlo" w:hAnsi="Menlo" w:cs="Menlo"/>
+          <w:sz w:val="24"/>
+          <w:sz-cs w:val="24"/>
+          <w:spacing w:val="0"/>
+          <w:color w:val="181F26"/>
+        </w:rPr>
+        <w:t xml:space="preserve">examples/hero-fleet/demo.sh</w:t>
+      </w:r>
+      <w:r>
+        <w:rPr>
+          <w:rFonts w:ascii="Helvetica Neue" w:hAnsi="Helvetica Neue" w:cs="Helvetica Neue"/>
+          <w:sz w:val="24"/>
+          <w:sz-cs w:val="24"/>
+          <w:spacing w:val="0"/>
+          <w:color w:val="181F26"/>
+        </w:rPr>
+        <w:t xml:space="preserve"> flow</w:t>
+      </w:r>
+    </w:p>
+    <w:p>
+      <w:pPr>
+        <w:ind w:left="720" w:first-line="-720"/>
+      </w:pPr>
+      <w:r>
+        <w:rPr>
+          <w:rFonts w:ascii="Helvetica Neue" w:hAnsi="Helvetica Neue" w:cs="Helvetica Neue"/>
+          <w:sz w:val="24"/>
+          <w:sz-cs w:val="24"/>
+          <w:color w:val="181F26"/>
+        </w:rPr>
+        <w:t xml:space="preserve"/>
+        <w:tab/>
+        <w:t xml:space="preserve">•</w:t>
+        <w:tab/>
+        <w:t xml:space="preserve"/>
+      </w:r>
+      <w:r>
+        <w:rPr>
+          <w:rFonts w:ascii="Helvetica Neue" w:hAnsi="Helvetica Neue" w:cs="Helvetica Neue"/>
+          <w:sz w:val="24"/>
+          <w:sz-cs w:val="24"/>
+          <w:spacing w:val="0"/>
+          <w:color w:val="181F26"/>
+        </w:rPr>
+        <w:t xml:space="preserve">an explicit handoff point: the next planned milestone after </w:t>
+      </w:r>
+      <w:r>
+        <w:rPr>
+          <w:rFonts w:ascii="Menlo" w:hAnsi="Menlo" w:cs="Menlo"/>
+          <w:sz w:val="24"/>
+          <w:sz-cs w:val="24"/>
+          <w:spacing w:val="0"/>
+          <w:color w:val="181F26"/>
+        </w:rPr>
+        <w:t xml:space="preserve">alpha.3</w:t>
+      </w:r>
+      <w:r>
+        <w:rPr>
+          <w:rFonts w:ascii="Helvetica Neue" w:hAnsi="Helvetica Neue" w:cs="Helvetica Neue"/>
+          <w:sz w:val="24"/>
+          <w:sz-cs w:val="24"/>
+          <w:spacing w:val="0"/>
+          <w:color w:val="181F26"/>
+        </w:rPr>
+        <w:t xml:space="preserve"> is </w:t>
+      </w:r>
+      <w:r>
+        <w:rPr>
+          <w:rFonts w:ascii="Menlo" w:hAnsi="Menlo" w:cs="Menlo"/>
+          <w:sz w:val="24"/>
+          <w:sz-cs w:val="24"/>
+          <w:spacing w:val="0"/>
+          <w:color w:val="181F26"/>
+        </w:rPr>
+        <w:t xml:space="preserve">P1a OpenClaw inbound</w:t>
+      </w:r>
+      <w:r>
+        <w:rPr>
+          <w:rFonts w:ascii="Helvetica Neue" w:hAnsi="Helvetica Neue" w:cs="Helvetica Neue"/>
+          <w:sz w:val="24"/>
+          <w:sz-cs w:val="24"/>
+          <w:spacing w:val="0"/>
+          <w:color w:val="181F26"/>
+        </w:rPr>
+        <w:t xml:space="preserve"/>
       </w:r>
     </w:p>
     <w:p>
@@ -36478,6 +37125,44 @@
           <w:spacing w:val="0"/>
           <w:color w:val="181F26"/>
         </w:rPr>
+        <w:t xml:space="preserve">crawfish action events &lt;action-id&gt;</w:t>
+      </w:r>
+      <w:r>
+        <w:rPr>
+          <w:rFonts w:ascii="Helvetica Neue" w:hAnsi="Helvetica Neue" w:cs="Helvetica Neue"/>
+          <w:sz w:val="24"/>
+          <w:sz-cs w:val="24"/>
+          <w:spacing w:val="0"/>
+          <w:color w:val="181F26"/>
+        </w:rPr>
+        <w:t xml:space="preserve"> returns the operator timeline for admission, approval, lease, execution, checkpoint, artifact, recovery, and terminal transitions.</w:t>
+      </w:r>
+    </w:p>
+    <w:p>
+      <w:pPr>
+        <w:ind w:left="720" w:first-line="-720"/>
+      </w:pPr>
+      <w:r>
+        <w:rPr>
+          <w:rFonts w:ascii="Menlo" w:hAnsi="Menlo" w:cs="Menlo"/>
+          <w:sz w:val="24"/>
+          <w:sz-cs w:val="24"/>
+          <w:color w:val="181F26"/>
+        </w:rPr>
+        <w:t xml:space="preserve"/>
+        <w:tab/>
+        <w:t xml:space="preserve">•</w:t>
+        <w:tab/>
+        <w:t xml:space="preserve"/>
+      </w:r>
+      <w:r>
+        <w:rPr>
+          <w:rFonts w:ascii="Menlo" w:hAnsi="Menlo" w:cs="Menlo"/>
+          <w:sz w:val="24"/>
+          <w:sz-cs w:val="24"/>
+          <w:spacing w:val="0"/>
+          <w:color w:val="181F26"/>
+        </w:rPr>
         <w:t xml:space="preserve">crawfish inspect &lt;agent-id&gt;</w:t>
       </w:r>
       <w:r>
@@ -36649,6 +37334,74 @@
           <w:color w:val="181F26"/>
         </w:rPr>
         <w:t xml:space="preserve">; revoked leases fail pending work before mutation commit.</w:t>
+      </w:r>
+    </w:p>
+    <w:p>
+      <w:pPr>
+        <w:ind w:left="720" w:first-line="-720"/>
+      </w:pPr>
+      <w:r>
+        <w:rPr>
+          <w:rFonts w:ascii="Helvetica Neue" w:hAnsi="Helvetica Neue" w:cs="Helvetica Neue"/>
+          <w:sz w:val="24"/>
+          <w:sz-cs w:val="24"/>
+          <w:color w:val="181F26"/>
+        </w:rPr>
+        <w:t xml:space="preserve"/>
+        <w:tab/>
+        <w:t xml:space="preserve">•</w:t>
+        <w:tab/>
+        <w:t xml:space="preserve"/>
+      </w:r>
+      <w:r>
+        <w:rPr>
+          <w:rFonts w:ascii="Helvetica Neue" w:hAnsi="Helvetica Neue" w:cs="Helvetica Neue"/>
+          <w:sz w:val="24"/>
+          <w:sz-cs w:val="24"/>
+          <w:spacing w:val="0"/>
+          <w:color w:val="181F26"/>
+        </w:rPr>
+        <w:t xml:space="preserve">Workspace mutation under </w:t>
+      </w:r>
+      <w:r>
+        <w:rPr>
+          <w:rFonts w:ascii="Menlo" w:hAnsi="Menlo" w:cs="Menlo"/>
+          <w:sz w:val="24"/>
+          <w:sz-cs w:val="24"/>
+          <w:spacing w:val="0"/>
+          <w:color w:val="181F26"/>
+        </w:rPr>
+        <w:t xml:space="preserve">lock_mode = file</w:t>
+      </w:r>
+      <w:r>
+        <w:rPr>
+          <w:rFonts w:ascii="Helvetica Neue" w:hAnsi="Helvetica Neue" w:cs="Helvetica Neue"/>
+          <w:sz w:val="24"/>
+          <w:sz-cs w:val="24"/>
+          <w:spacing w:val="0"/>
+          <w:color w:val="181F26"/>
+        </w:rPr>
+        <w:t xml:space="preserve"> must either acquire a workspace-scoped file lock or enter </w:t>
+      </w:r>
+      <w:r>
+        <w:rPr>
+          <w:rFonts w:ascii="Menlo" w:hAnsi="Menlo" w:cs="Menlo"/>
+          <w:sz w:val="24"/>
+          <w:sz-cs w:val="24"/>
+          <w:spacing w:val="0"/>
+          <w:color w:val="181F26"/>
+        </w:rPr>
+        <w:t xml:space="preserve">blocked</w:t>
+      </w:r>
+      <w:r>
+        <w:rPr>
+          <w:rFonts w:ascii="Helvetica Neue" w:hAnsi="Helvetica Neue" w:cs="Helvetica Neue"/>
+          <w:sz w:val="24"/>
+          <w:sz-cs w:val="24"/>
+          <w:spacing w:val="0"/>
+          <w:color w:val="181F26"/>
+        </w:rPr>
+        <w:t xml:space="preserve"> with an explicit lock-conflict reason.</w:t>
       </w:r>
     </w:p>
     <w:p>

</xml_diff>

<commit_message>
docs: publish p1a openclaw inbound docs
</commit_message>
<xml_diff>
--- a/docs/exports/Crawfish-PRD.docx
+++ b/docs/exports/Crawfish-PRD.docx
@@ -395,6 +395,26 @@
           <w:spacing w:val="0"/>
           <w:color w:val="181F26"/>
         </w:rPr>
+        <w:t xml:space="preserve">. To compile and test the OpenClaw inbound bridge, run </w:t>
+      </w:r>
+      <w:r>
+        <w:rPr>
+          <w:rFonts w:ascii="Menlo" w:hAnsi="Menlo" w:cs="Menlo"/>
+          <w:sz w:val="24"/>
+          <w:sz-cs w:val="24"/>
+          <w:spacing w:val="0"/>
+          <w:color w:val="181F26"/>
+        </w:rPr>
+        <w:t xml:space="preserve">npm test --prefix integrations/openclaw-inbound</w:t>
+      </w:r>
+      <w:r>
+        <w:rPr>
+          <w:rFonts w:ascii="Helvetica Neue" w:hAnsi="Helvetica Neue" w:cs="Helvetica Neue"/>
+          <w:sz w:val="24"/>
+          <w:sz-cs w:val="24"/>
+          <w:spacing w:val="0"/>
+          <w:color w:val="181F26"/>
+        </w:rPr>
         <w:t xml:space="preserve">.</w:t>
       </w:r>
     </w:p>
@@ -3557,7 +3577,27 @@
           <w:spacing w:val="0"/>
           <w:color w:val="181F26"/>
         </w:rPr>
-        <w:t xml:space="preserve">The current Rust alpha already covers one runnable Hero P0 slice:</w:t>
+        <w:t xml:space="preserve">The current Rust alpha now covers one runnable Hero P0 slice plus the first </w:t>
+      </w:r>
+      <w:r>
+        <w:rPr>
+          <w:rFonts w:ascii="Menlo" w:hAnsi="Menlo" w:cs="Menlo"/>
+          <w:sz w:val="24"/>
+          <w:sz-cs w:val="24"/>
+          <w:spacing w:val="0"/>
+          <w:color w:val="181F26"/>
+        </w:rPr>
+        <w:t xml:space="preserve">P1a</w:t>
+      </w:r>
+      <w:r>
+        <w:rPr>
+          <w:rFonts w:ascii="Helvetica Neue" w:hAnsi="Helvetica Neue" w:cs="Helvetica Neue"/>
+          <w:sz w:val="24"/>
+          <w:sz-cs w:val="24"/>
+          <w:spacing w:val="0"/>
+          <w:color w:val="181F26"/>
+        </w:rPr>
+        <w:t xml:space="preserve"> OpenClaw inbound surface:</w:t>
       </w:r>
     </w:p>
     <w:p>
@@ -3795,6 +3835,234 @@
           <w:spacing w:val="0"/>
           <w:color w:val="181F26"/>
         </w:rPr>
+        <w:t xml:space="preserve">P1a</w:t>
+      </w:r>
+      <w:r>
+        <w:rPr>
+          <w:rFonts w:ascii="Helvetica Neue" w:hAnsi="Helvetica Neue" w:cs="Helvetica Neue"/>
+          <w:sz w:val="24"/>
+          <w:sz-cs w:val="24"/>
+          <w:spacing w:val="0"/>
+          <w:color w:val="181F26"/>
+        </w:rPr>
+        <w:t xml:space="preserve"> adds a thin OpenClaw inbound Gateway RPC bridge under </w:t>
+      </w:r>
+      <w:r>
+        <w:rPr>
+          <w:rFonts w:ascii="Menlo" w:hAnsi="Menlo" w:cs="Menlo"/>
+          <w:sz w:val="24"/>
+          <w:sz-cs w:val="24"/>
+          <w:u w:val="single"/>
+          <w:spacing w:val="0"/>
+          <w:color w:val="0000E9"/>
+        </w:rPr>
+        <w:t xml:space="preserve">integrations/openclaw-inbound/</w:t>
+      </w:r>
+      <w:r>
+        <w:rPr>
+          <w:rFonts w:ascii="Helvetica Neue" w:hAnsi="Helvetica Neue" w:cs="Helvetica Neue"/>
+          <w:sz w:val="24"/>
+          <w:sz-cs w:val="24"/>
+          <w:spacing w:val="0"/>
+          <w:color w:val="181F26"/>
+        </w:rPr>
+        <w:t xml:space="preserve"> with </w:t>
+      </w:r>
+      <w:r>
+        <w:rPr>
+          <w:rFonts w:ascii="Menlo" w:hAnsi="Menlo" w:cs="Menlo"/>
+          <w:sz w:val="24"/>
+          <w:sz-cs w:val="24"/>
+          <w:spacing w:val="0"/>
+          <w:color w:val="181F26"/>
+        </w:rPr>
+        <w:t xml:space="preserve">crawfish.action.submit</w:t>
+      </w:r>
+      <w:r>
+        <w:rPr>
+          <w:rFonts w:ascii="Helvetica Neue" w:hAnsi="Helvetica Neue" w:cs="Helvetica Neue"/>
+          <w:sz w:val="24"/>
+          <w:sz-cs w:val="24"/>
+          <w:spacing w:val="0"/>
+          <w:color w:val="181F26"/>
+        </w:rPr>
+        <w:t xml:space="preserve">, </w:t>
+      </w:r>
+      <w:r>
+        <w:rPr>
+          <w:rFonts w:ascii="Menlo" w:hAnsi="Menlo" w:cs="Menlo"/>
+          <w:sz w:val="24"/>
+          <w:sz-cs w:val="24"/>
+          <w:spacing w:val="0"/>
+          <w:color w:val="181F26"/>
+        </w:rPr>
+        <w:t xml:space="preserve">crawfish.action.inspect</w:t>
+      </w:r>
+      <w:r>
+        <w:rPr>
+          <w:rFonts w:ascii="Helvetica Neue" w:hAnsi="Helvetica Neue" w:cs="Helvetica Neue"/>
+          <w:sz w:val="24"/>
+          <w:sz-cs w:val="24"/>
+          <w:spacing w:val="0"/>
+          <w:color w:val="181F26"/>
+        </w:rPr>
+        <w:t xml:space="preserve">, </w:t>
+      </w:r>
+      <w:r>
+        <w:rPr>
+          <w:rFonts w:ascii="Menlo" w:hAnsi="Menlo" w:cs="Menlo"/>
+          <w:sz w:val="24"/>
+          <w:sz-cs w:val="24"/>
+          <w:spacing w:val="0"/>
+          <w:color w:val="181F26"/>
+        </w:rPr>
+        <w:t xml:space="preserve">crawfish.action.events</w:t>
+      </w:r>
+      <w:r>
+        <w:rPr>
+          <w:rFonts w:ascii="Helvetica Neue" w:hAnsi="Helvetica Neue" w:cs="Helvetica Neue"/>
+          <w:sz w:val="24"/>
+          <w:sz-cs w:val="24"/>
+          <w:spacing w:val="0"/>
+          <w:color w:val="181F26"/>
+        </w:rPr>
+        <w:t xml:space="preserve">, and </w:t>
+      </w:r>
+      <w:r>
+        <w:rPr>
+          <w:rFonts w:ascii="Menlo" w:hAnsi="Menlo" w:cs="Menlo"/>
+          <w:sz w:val="24"/>
+          <w:sz-cs w:val="24"/>
+          <w:spacing w:val="0"/>
+          <w:color w:val="181F26"/>
+        </w:rPr>
+        <w:t xml:space="preserve">crawfish.agent.status</w:t>
+      </w:r>
+      <w:r>
+        <w:rPr>
+          <w:rFonts w:ascii="Helvetica Neue" w:hAnsi="Helvetica Neue" w:cs="Helvetica Neue"/>
+          <w:sz w:val="24"/>
+          <w:sz-cs w:val="24"/>
+          <w:spacing w:val="0"/>
+          <w:color w:val="181F26"/>
+        </w:rPr>
+        <w:t xml:space="preserve">.</w:t>
+      </w:r>
+    </w:p>
+    <w:p>
+      <w:pPr>
+        <w:ind w:left="720" w:first-line="-720"/>
+      </w:pPr>
+      <w:r>
+        <w:rPr>
+          <w:rFonts w:ascii="Helvetica Neue" w:hAnsi="Helvetica Neue" w:cs="Helvetica Neue"/>
+          <w:sz w:val="24"/>
+          <w:sz-cs w:val="24"/>
+          <w:color w:val="181F26"/>
+        </w:rPr>
+        <w:t xml:space="preserve"/>
+        <w:tab/>
+        <w:t xml:space="preserve">•</w:t>
+        <w:tab/>
+        <w:t xml:space="preserve"/>
+      </w:r>
+      <w:r>
+        <w:rPr>
+          <w:rFonts w:ascii="Helvetica Neue" w:hAnsi="Helvetica Neue" w:cs="Helvetica Neue"/>
+          <w:sz w:val="24"/>
+          <w:sz-cs w:val="24"/>
+          <w:spacing w:val="0"/>
+          <w:color w:val="181F26"/>
+        </w:rPr>
+        <w:t xml:space="preserve">OpenClaw inbound caller mapping is configured under </w:t>
+      </w:r>
+      <w:r>
+        <w:rPr>
+          <w:rFonts w:ascii="Menlo" w:hAnsi="Menlo" w:cs="Menlo"/>
+          <w:sz w:val="24"/>
+          <w:sz-cs w:val="24"/>
+          <w:spacing w:val="0"/>
+          <w:color w:val="181F26"/>
+        </w:rPr>
+        <w:t xml:space="preserve">[openclaw.inbound]</w:t>
+      </w:r>
+      <w:r>
+        <w:rPr>
+          <w:rFonts w:ascii="Helvetica Neue" w:hAnsi="Helvetica Neue" w:cs="Helvetica Neue"/>
+          <w:sz w:val="24"/>
+          <w:sz-cs w:val="24"/>
+          <w:spacing w:val="0"/>
+          <w:color w:val="181F26"/>
+        </w:rPr>
+        <w:t xml:space="preserve"> in </w:t>
+      </w:r>
+      <w:r>
+        <w:rPr>
+          <w:rFonts w:ascii="Menlo" w:hAnsi="Menlo" w:cs="Menlo"/>
+          <w:sz w:val="24"/>
+          <w:sz-cs w:val="24"/>
+          <w:u w:val="single"/>
+          <w:spacing w:val="0"/>
+          <w:color w:val="0000E9"/>
+        </w:rPr>
+        <w:t xml:space="preserve">examples/hero-fleet/Crawfish.toml</w:t>
+      </w:r>
+      <w:r>
+        <w:rPr>
+          <w:rFonts w:ascii="Helvetica Neue" w:hAnsi="Helvetica Neue" w:cs="Helvetica Neue"/>
+          <w:sz w:val="24"/>
+          <w:sz-cs w:val="24"/>
+          <w:spacing w:val="0"/>
+          <w:color w:val="181F26"/>
+        </w:rPr>
+        <w:t xml:space="preserve">, and governance remains enforced in </w:t>
+      </w:r>
+      <w:r>
+        <w:rPr>
+          <w:rFonts w:ascii="Menlo" w:hAnsi="Menlo" w:cs="Menlo"/>
+          <w:sz w:val="24"/>
+          <w:sz-cs w:val="24"/>
+          <w:spacing w:val="0"/>
+          <w:color w:val="181F26"/>
+        </w:rPr>
+        <w:t xml:space="preserve">crawfishd</w:t>
+      </w:r>
+      <w:r>
+        <w:rPr>
+          <w:rFonts w:ascii="Helvetica Neue" w:hAnsi="Helvetica Neue" w:cs="Helvetica Neue"/>
+          <w:sz w:val="24"/>
+          <w:sz-cs w:val="24"/>
+          <w:spacing w:val="0"/>
+          <w:color w:val="181F26"/>
+        </w:rPr>
+        <w:t xml:space="preserve">, not in the bridge.</w:t>
+      </w:r>
+    </w:p>
+    <w:p>
+      <w:pPr>
+        <w:ind w:left="720" w:first-line="-720"/>
+      </w:pPr>
+      <w:r>
+        <w:rPr>
+          <w:rFonts w:ascii="Menlo" w:hAnsi="Menlo" w:cs="Menlo"/>
+          <w:sz w:val="24"/>
+          <w:sz-cs w:val="24"/>
+          <w:color w:val="181F26"/>
+        </w:rPr>
+        <w:t xml:space="preserve"/>
+        <w:tab/>
+        <w:t xml:space="preserve">•</w:t>
+        <w:tab/>
+        <w:t xml:space="preserve"/>
+      </w:r>
+      <w:r>
+        <w:rPr>
+          <w:rFonts w:ascii="Menlo" w:hAnsi="Menlo" w:cs="Menlo"/>
+          <w:sz w:val="24"/>
+          <w:sz-cs w:val="24"/>
+          <w:spacing w:val="0"/>
+          <w:color w:val="181F26"/>
+        </w:rPr>
         <w:t xml:space="preserve">inspect</w:t>
       </w:r>
       <w:r>
@@ -4137,27 +4405,27 @@
           <w:spacing w:val="0"/>
           <w:color w:val="181F26"/>
         </w:rPr>
-        <w:t xml:space="preserve">alpha.3</w:t>
-      </w:r>
-      <w:r>
-        <w:rPr>
-          <w:rFonts w:ascii="Helvetica Neue" w:hAnsi="Helvetica Neue" w:cs="Helvetica Neue"/>
-          <w:sz w:val="24"/>
-          <w:sz-cs w:val="24"/>
-          <w:spacing w:val="0"/>
-          <w:color w:val="181F26"/>
-        </w:rPr>
-        <w:t xml:space="preserve"> slice in place, the next planned milestone is </w:t>
-      </w:r>
-      <w:r>
-        <w:rPr>
-          <w:rFonts w:ascii="Menlo" w:hAnsi="Menlo" w:cs="Menlo"/>
-          <w:sz w:val="24"/>
-          <w:sz-cs w:val="24"/>
-          <w:spacing w:val="0"/>
-          <w:color w:val="181F26"/>
-        </w:rPr>
-        <w:t xml:space="preserve">P1a OpenClaw inbound</w:t>
+        <w:t xml:space="preserve">P1a</w:t>
+      </w:r>
+      <w:r>
+        <w:rPr>
+          <w:rFonts w:ascii="Helvetica Neue" w:hAnsi="Helvetica Neue" w:cs="Helvetica Neue"/>
+          <w:sz w:val="24"/>
+          <w:sz-cs w:val="24"/>
+          <w:spacing w:val="0"/>
+          <w:color w:val="181F26"/>
+        </w:rPr>
+        <w:t xml:space="preserve"> inbound slice in place, the next planned milestone is </w:t>
+      </w:r>
+      <w:r>
+        <w:rPr>
+          <w:rFonts w:ascii="Menlo" w:hAnsi="Menlo" w:cs="Menlo"/>
+          <w:sz w:val="24"/>
+          <w:sz-cs w:val="24"/>
+          <w:spacing w:val="0"/>
+          <w:color w:val="181F26"/>
+        </w:rPr>
+        <w:t xml:space="preserve">P1b OpenClaw outbound</w:t>
       </w:r>
       <w:r>
         <w:rPr>
@@ -26555,34 +26823,63 @@
       </w:pPr>
       <w:r>
         <w:rPr>
-          <w:rFonts w:ascii="Helvetica Neue" w:hAnsi="Helvetica Neue" w:cs="Helvetica Neue"/>
-          <w:sz w:val="24"/>
-          <w:sz-cs w:val="24"/>
-          <w:spacing w:val="0"/>
-          <w:color w:val="181F26"/>
-        </w:rPr>
-        <w:t xml:space="preserve">An </w:t>
-      </w:r>
-      <w:r>
-        <w:rPr>
-          <w:rFonts w:ascii="Helvetica Neue" w:hAnsi="Helvetica Neue" w:cs="Helvetica Neue"/>
-          <w:sz w:val="24"/>
-          <w:sz-cs w:val="24"/>
-          <w:u w:val="single"/>
-          <w:spacing w:val="0"/>
-          <w:color w:val="0000E9"/>
-        </w:rPr>
-        <w:t xml:space="preserve">OpenClaw plugin</w:t>
-      </w:r>
-      <w:r>
-        <w:rPr>
-          <w:rFonts w:ascii="Helvetica Neue" w:hAnsi="Helvetica Neue" w:cs="Helvetica Neue"/>
-          <w:sz w:val="24"/>
-          <w:sz-cs w:val="24"/>
-          <w:spacing w:val="0"/>
-          <w:color w:val="181F26"/>
-        </w:rPr>
-        <w:t xml:space="preserve"> should expose Crawfish as both an agent tool and a Gateway RPC surface for durable fleet work.</w:t>
+          <w:rFonts w:ascii="Menlo" w:hAnsi="Menlo" w:cs="Menlo"/>
+          <w:sz w:val="24"/>
+          <w:sz-cs w:val="24"/>
+          <w:spacing w:val="0"/>
+          <w:color w:val="181F26"/>
+        </w:rPr>
+        <w:t xml:space="preserve">P1a</w:t>
+      </w:r>
+      <w:r>
+        <w:rPr>
+          <w:rFonts w:ascii="Helvetica Neue" w:hAnsi="Helvetica Neue" w:cs="Helvetica Neue"/>
+          <w:sz w:val="24"/>
+          <w:sz-cs w:val="24"/>
+          <w:spacing w:val="0"/>
+          <w:color w:val="181F26"/>
+        </w:rPr>
+        <w:t xml:space="preserve"> is Gateway-RPC-first. The implemented inbound surface is a thin bridge package under </w:t>
+      </w:r>
+      <w:r>
+        <w:rPr>
+          <w:rFonts w:ascii="Menlo" w:hAnsi="Menlo" w:cs="Menlo"/>
+          <w:sz w:val="24"/>
+          <w:sz-cs w:val="24"/>
+          <w:spacing w:val="0"/>
+          <w:color w:val="181F26"/>
+        </w:rPr>
+        <w:t xml:space="preserve">integrations/openclaw-inbound/</w:t>
+      </w:r>
+      <w:r>
+        <w:rPr>
+          <w:rFonts w:ascii="Helvetica Neue" w:hAnsi="Helvetica Neue" w:cs="Helvetica Neue"/>
+          <w:sz w:val="24"/>
+          <w:sz-cs w:val="24"/>
+          <w:spacing w:val="0"/>
+          <w:color w:val="181F26"/>
+        </w:rPr>
+        <w:t xml:space="preserve"> that forwards OpenClaw RPC calls to </w:t>
+      </w:r>
+      <w:r>
+        <w:rPr>
+          <w:rFonts w:ascii="Menlo" w:hAnsi="Menlo" w:cs="Menlo"/>
+          <w:sz w:val="24"/>
+          <w:sz-cs w:val="24"/>
+          <w:spacing w:val="0"/>
+          <w:color w:val="181F26"/>
+        </w:rPr>
+        <w:t xml:space="preserve">crawfishd</w:t>
+      </w:r>
+      <w:r>
+        <w:rPr>
+          <w:rFonts w:ascii="Helvetica Neue" w:hAnsi="Helvetica Neue" w:cs="Helvetica Neue"/>
+          <w:sz w:val="24"/>
+          <w:sz-cs w:val="24"/>
+          <w:spacing w:val="0"/>
+          <w:color w:val="181F26"/>
+        </w:rPr>
+        <w:t xml:space="preserve"> over the local Unix socket. It does not own policy, state, or retries.</w:t>
       </w:r>
     </w:p>
     <w:p>
@@ -26597,7 +26894,7 @@
           <w:spacing w:val="0"/>
           <w:color w:val="181F26"/>
         </w:rPr>
-        <w:t xml:space="preserve">Minimum RPC surface:</w:t>
+        <w:t xml:space="preserve">Current minimum RPC surface:</w:t>
       </w:r>
     </w:p>
     <w:p>
@@ -26701,6 +26998,44 @@
           <w:spacing w:val="0"/>
           <w:color w:val="181F26"/>
         </w:rPr>
+        <w:t xml:space="preserve">crawfish.action.events</w:t>
+      </w:r>
+      <w:r>
+        <w:rPr>
+          <w:rFonts w:ascii="Helvetica Neue" w:hAnsi="Helvetica Neue" w:cs="Helvetica Neue"/>
+          <w:sz w:val="24"/>
+          <w:sz-cs w:val="24"/>
+          <w:spacing w:val="0"/>
+          <w:color w:val="181F26"/>
+        </w:rPr>
+        <w:t xml:space="preserve"/>
+      </w:r>
+    </w:p>
+    <w:p>
+      <w:pPr>
+        <w:ind w:left="720" w:first-line="-720"/>
+      </w:pPr>
+      <w:r>
+        <w:rPr>
+          <w:rFonts w:ascii="Menlo" w:hAnsi="Menlo" w:cs="Menlo"/>
+          <w:sz w:val="24"/>
+          <w:sz-cs w:val="24"/>
+          <w:color w:val="181F26"/>
+        </w:rPr>
+        <w:t xml:space="preserve"/>
+        <w:tab/>
+        <w:t xml:space="preserve">•</w:t>
+        <w:tab/>
+        <w:t xml:space="preserve"/>
+      </w:r>
+      <w:r>
+        <w:rPr>
+          <w:rFonts w:ascii="Menlo" w:hAnsi="Menlo" w:cs="Menlo"/>
+          <w:sz w:val="24"/>
+          <w:sz-cs w:val="24"/>
+          <w:spacing w:val="0"/>
+          <w:color w:val="181F26"/>
+        </w:rPr>
         <w:t xml:space="preserve">crawfish.agent.status</w:t>
       </w:r>
       <w:r>
@@ -26716,82 +27051,6 @@
     </w:p>
     <w:p>
       <w:pPr>
-        <w:ind w:left="720" w:first-line="-720"/>
-      </w:pPr>
-      <w:r>
-        <w:rPr>
-          <w:rFonts w:ascii="Menlo" w:hAnsi="Menlo" w:cs="Menlo"/>
-          <w:sz w:val="24"/>
-          <w:sz-cs w:val="24"/>
-          <w:color w:val="181F26"/>
-        </w:rPr>
-        <w:t xml:space="preserve"/>
-        <w:tab/>
-        <w:t xml:space="preserve">•</w:t>
-        <w:tab/>
-        <w:t xml:space="preserve"/>
-      </w:r>
-      <w:r>
-        <w:rPr>
-          <w:rFonts w:ascii="Menlo" w:hAnsi="Menlo" w:cs="Menlo"/>
-          <w:sz w:val="24"/>
-          <w:sz-cs w:val="24"/>
-          <w:spacing w:val="0"/>
-          <w:color w:val="181F26"/>
-        </w:rPr>
-        <w:t xml:space="preserve">crawfish.action.resume</w:t>
-      </w:r>
-      <w:r>
-        <w:rPr>
-          <w:rFonts w:ascii="Helvetica Neue" w:hAnsi="Helvetica Neue" w:cs="Helvetica Neue"/>
-          <w:sz w:val="24"/>
-          <w:sz-cs w:val="24"/>
-          <w:spacing w:val="0"/>
-          <w:color w:val="181F26"/>
-        </w:rPr>
-        <w:t xml:space="preserve"/>
-      </w:r>
-    </w:p>
-    <w:p>
-      <w:pPr>
-        <w:ind w:left="720" w:first-line="-720"/>
-      </w:pPr>
-      <w:r>
-        <w:rPr>
-          <w:rFonts w:ascii="Menlo" w:hAnsi="Menlo" w:cs="Menlo"/>
-          <w:sz w:val="24"/>
-          <w:sz-cs w:val="24"/>
-          <w:color w:val="181F26"/>
-        </w:rPr>
-        <w:t xml:space="preserve"/>
-        <w:tab/>
-        <w:t xml:space="preserve">•</w:t>
-        <w:tab/>
-        <w:t xml:space="preserve"/>
-      </w:r>
-      <w:r>
-        <w:rPr>
-          <w:rFonts w:ascii="Menlo" w:hAnsi="Menlo" w:cs="Menlo"/>
-          <w:sz w:val="24"/>
-          <w:sz-cs w:val="24"/>
-          <w:spacing w:val="0"/>
-          <w:color w:val="181F26"/>
-        </w:rPr>
-        <w:t xml:space="preserve">crawfish.action.cancel</w:t>
-      </w:r>
-      <w:r>
-        <w:rPr>
-          <w:rFonts w:ascii="Helvetica Neue" w:hAnsi="Helvetica Neue" w:cs="Helvetica Neue"/>
-          <w:sz w:val="24"/>
-          <w:sz-cs w:val="24"/>
-          <w:spacing w:val="0"/>
-          <w:color w:val="181F26"/>
-        </w:rPr>
-        <w:t xml:space="preserve"/>
-      </w:r>
-    </w:p>
-    <w:p>
-      <w:pPr>
         <w:spacing w:after="240"/>
       </w:pPr>
       <w:r>
@@ -26983,6 +27242,84 @@
           <w:color w:val="181F26"/>
         </w:rPr>
         <w:t xml:space="preserve">OpenClaw does not own Crawfish lifecycle state; it is an external caller</w:t>
+      </w:r>
+    </w:p>
+    <w:p>
+      <w:pPr>
+        <w:ind w:left="720" w:first-line="-720"/>
+      </w:pPr>
+      <w:r>
+        <w:rPr>
+          <w:rFonts w:ascii="Menlo" w:hAnsi="Menlo" w:cs="Menlo"/>
+          <w:sz w:val="24"/>
+          <w:sz-cs w:val="24"/>
+          <w:color w:val="181F26"/>
+        </w:rPr>
+        <w:t xml:space="preserve"/>
+        <w:tab/>
+        <w:t xml:space="preserve">•</w:t>
+        <w:tab/>
+        <w:t xml:space="preserve"/>
+      </w:r>
+      <w:r>
+        <w:rPr>
+          <w:rFonts w:ascii="Menlo" w:hAnsi="Menlo" w:cs="Menlo"/>
+          <w:sz w:val="24"/>
+          <w:sz-cs w:val="24"/>
+          <w:spacing w:val="0"/>
+          <w:color w:val="181F26"/>
+        </w:rPr>
+        <w:t xml:space="preserve">P1a</w:t>
+      </w:r>
+      <w:r>
+        <w:rPr>
+          <w:rFonts w:ascii="Helvetica Neue" w:hAnsi="Helvetica Neue" w:cs="Helvetica Neue"/>
+          <w:sz w:val="24"/>
+          <w:sz-cs w:val="24"/>
+          <w:spacing w:val="0"/>
+          <w:color w:val="181F26"/>
+        </w:rPr>
+        <w:t xml:space="preserve"> keeps </w:t>
+      </w:r>
+      <w:r>
+        <w:rPr>
+          <w:rFonts w:ascii="Menlo" w:hAnsi="Menlo" w:cs="Menlo"/>
+          <w:sz w:val="24"/>
+          <w:sz-cs w:val="24"/>
+          <w:spacing w:val="0"/>
+          <w:color w:val="181F26"/>
+        </w:rPr>
+        <w:t xml:space="preserve">cancel</w:t>
+      </w:r>
+      <w:r>
+        <w:rPr>
+          <w:rFonts w:ascii="Helvetica Neue" w:hAnsi="Helvetica Neue" w:cs="Helvetica Neue"/>
+          <w:sz w:val="24"/>
+          <w:sz-cs w:val="24"/>
+          <w:spacing w:val="0"/>
+          <w:color w:val="181F26"/>
+        </w:rPr>
+        <w:t xml:space="preserve"> and </w:t>
+      </w:r>
+      <w:r>
+        <w:rPr>
+          <w:rFonts w:ascii="Menlo" w:hAnsi="Menlo" w:cs="Menlo"/>
+          <w:sz w:val="24"/>
+          <w:sz-cs w:val="24"/>
+          <w:spacing w:val="0"/>
+          <w:color w:val="181F26"/>
+        </w:rPr>
+        <w:t xml:space="preserve">resume</w:t>
+      </w:r>
+      <w:r>
+        <w:rPr>
+          <w:rFonts w:ascii="Helvetica Neue" w:hAnsi="Helvetica Neue" w:cs="Helvetica Neue"/>
+          <w:sz w:val="24"/>
+          <w:sz-cs w:val="24"/>
+          <w:spacing w:val="0"/>
+          <w:color w:val="181F26"/>
+        </w:rPr>
+        <w:t xml:space="preserve"> out of the OpenClaw surface until Crawfish exposes stable action-level operator semantics for them</w:t>
       </w:r>
     </w:p>
     <w:p>
@@ -34173,27 +34510,7 @@
           <w:spacing w:val="0"/>
           <w:color w:val="181F26"/>
         </w:rPr>
-        <w:t xml:space="preserve">an explicit handoff point: the next planned milestone after </w:t>
-      </w:r>
-      <w:r>
-        <w:rPr>
-          <w:rFonts w:ascii="Menlo" w:hAnsi="Menlo" w:cs="Menlo"/>
-          <w:sz w:val="24"/>
-          <w:sz-cs w:val="24"/>
-          <w:spacing w:val="0"/>
-          <w:color w:val="181F26"/>
-        </w:rPr>
-        <w:t xml:space="preserve">alpha.3</w:t>
-      </w:r>
-      <w:r>
-        <w:rPr>
-          <w:rFonts w:ascii="Helvetica Neue" w:hAnsi="Helvetica Neue" w:cs="Helvetica Neue"/>
-          <w:sz w:val="24"/>
-          <w:sz-cs w:val="24"/>
-          <w:spacing w:val="0"/>
-          <w:color w:val="181F26"/>
-        </w:rPr>
-        <w:t xml:space="preserve"> is </w:t>
+        <w:t xml:space="preserve">an explicit handoff point that has now been completed as </w:t>
       </w:r>
       <w:r>
         <w:rPr>
@@ -34204,6 +34521,341 @@
           <w:color w:val="181F26"/>
         </w:rPr>
         <w:t xml:space="preserve">P1a OpenClaw inbound</w:t>
+      </w:r>
+      <w:r>
+        <w:rPr>
+          <w:rFonts w:ascii="Helvetica Neue" w:hAnsi="Helvetica Neue" w:cs="Helvetica Neue"/>
+          <w:sz w:val="24"/>
+          <w:sz-cs w:val="24"/>
+          <w:spacing w:val="0"/>
+          <w:color w:val="181F26"/>
+        </w:rPr>
+        <w:t xml:space="preserve">; the next planned milestone is </w:t>
+      </w:r>
+      <w:r>
+        <w:rPr>
+          <w:rFonts w:ascii="Menlo" w:hAnsi="Menlo" w:cs="Menlo"/>
+          <w:sz w:val="24"/>
+          <w:sz-cs w:val="24"/>
+          <w:spacing w:val="0"/>
+          <w:color w:val="181F26"/>
+        </w:rPr>
+        <w:t xml:space="preserve">P1b OpenClaw outbound</w:t>
+      </w:r>
+      <w:r>
+        <w:rPr>
+          <w:rFonts w:ascii="Helvetica Neue" w:hAnsi="Helvetica Neue" w:cs="Helvetica Neue"/>
+          <w:sz w:val="24"/>
+          <w:sz-cs w:val="24"/>
+          <w:spacing w:val="0"/>
+          <w:color w:val="181F26"/>
+        </w:rPr>
+        <w:t xml:space="preserve"/>
+      </w:r>
+    </w:p>
+    <w:p>
+      <w:pPr>
+        <w:spacing w:after="240"/>
+      </w:pPr>
+      <w:r>
+        <w:rPr>
+          <w:rFonts w:ascii="Helvetica Neue" w:hAnsi="Helvetica Neue" w:cs="Helvetica Neue"/>
+          <w:sz w:val="24"/>
+          <w:sz-cs w:val="24"/>
+          <w:spacing w:val="0"/>
+          <w:color w:val="181F26"/>
+        </w:rPr>
+        <w:t xml:space="preserve">The current </w:t>
+      </w:r>
+      <w:r>
+        <w:rPr>
+          <w:rFonts w:ascii="Menlo" w:hAnsi="Menlo" w:cs="Menlo"/>
+          <w:sz w:val="24"/>
+          <w:sz-cs w:val="24"/>
+          <w:spacing w:val="0"/>
+          <w:color w:val="181F26"/>
+        </w:rPr>
+        <w:t xml:space="preserve">P1a</w:t>
+      </w:r>
+      <w:r>
+        <w:rPr>
+          <w:rFonts w:ascii="Helvetica Neue" w:hAnsi="Helvetica Neue" w:cs="Helvetica Neue"/>
+          <w:sz w:val="24"/>
+          <w:sz-cs w:val="24"/>
+          <w:spacing w:val="0"/>
+          <w:color w:val="181F26"/>
+        </w:rPr>
+        <w:t xml:space="preserve"> inbound slice adds:</w:t>
+      </w:r>
+    </w:p>
+    <w:p>
+      <w:pPr>
+        <w:ind w:left="720" w:first-line="-720"/>
+      </w:pPr>
+      <w:r>
+        <w:rPr>
+          <w:rFonts w:ascii="Helvetica Neue" w:hAnsi="Helvetica Neue" w:cs="Helvetica Neue"/>
+          <w:sz w:val="24"/>
+          <w:sz-cs w:val="24"/>
+          <w:color w:val="181F26"/>
+        </w:rPr>
+        <w:t xml:space="preserve"/>
+        <w:tab/>
+        <w:t xml:space="preserve">•</w:t>
+        <w:tab/>
+        <w:t xml:space="preserve"/>
+      </w:r>
+      <w:r>
+        <w:rPr>
+          <w:rFonts w:ascii="Helvetica Neue" w:hAnsi="Helvetica Neue" w:cs="Helvetica Neue"/>
+          <w:sz w:val="24"/>
+          <w:sz-cs w:val="24"/>
+          <w:spacing w:val="0"/>
+          <w:color w:val="181F26"/>
+        </w:rPr>
+        <w:t xml:space="preserve">a Rust inbound surface on </w:t>
+      </w:r>
+      <w:r>
+        <w:rPr>
+          <w:rFonts w:ascii="Menlo" w:hAnsi="Menlo" w:cs="Menlo"/>
+          <w:sz w:val="24"/>
+          <w:sz-cs w:val="24"/>
+          <w:spacing w:val="0"/>
+          <w:color w:val="181F26"/>
+        </w:rPr>
+        <w:t xml:space="preserve">crawfishd</w:t>
+      </w:r>
+      <w:r>
+        <w:rPr>
+          <w:rFonts w:ascii="Helvetica Neue" w:hAnsi="Helvetica Neue" w:cs="Helvetica Neue"/>
+          <w:sz w:val="24"/>
+          <w:sz-cs w:val="24"/>
+          <w:spacing w:val="0"/>
+          <w:color w:val="181F26"/>
+        </w:rPr>
+        <w:t xml:space="preserve"> for normalized OpenClaw caller context</w:t>
+      </w:r>
+    </w:p>
+    <w:p>
+      <w:pPr>
+        <w:ind w:left="720" w:first-line="-720"/>
+      </w:pPr>
+      <w:r>
+        <w:rPr>
+          <w:rFonts w:ascii="Helvetica Neue" w:hAnsi="Helvetica Neue" w:cs="Helvetica Neue"/>
+          <w:sz w:val="24"/>
+          <w:sz-cs w:val="24"/>
+          <w:color w:val="181F26"/>
+        </w:rPr>
+        <w:t xml:space="preserve"/>
+        <w:tab/>
+        <w:t xml:space="preserve">•</w:t>
+        <w:tab/>
+        <w:t xml:space="preserve"/>
+      </w:r>
+      <w:r>
+        <w:rPr>
+          <w:rFonts w:ascii="Helvetica Neue" w:hAnsi="Helvetica Neue" w:cs="Helvetica Neue"/>
+          <w:sz w:val="24"/>
+          <w:sz-cs w:val="24"/>
+          <w:spacing w:val="0"/>
+          <w:color w:val="181F26"/>
+        </w:rPr>
+        <w:t xml:space="preserve">required caller-to-owner mapping and trust-domain resolution under </w:t>
+      </w:r>
+      <w:r>
+        <w:rPr>
+          <w:rFonts w:ascii="Menlo" w:hAnsi="Menlo" w:cs="Menlo"/>
+          <w:sz w:val="24"/>
+          <w:sz-cs w:val="24"/>
+          <w:spacing w:val="0"/>
+          <w:color w:val="181F26"/>
+        </w:rPr>
+        <w:t xml:space="preserve">[openclaw.inbound]</w:t>
+      </w:r>
+      <w:r>
+        <w:rPr>
+          <w:rFonts w:ascii="Helvetica Neue" w:hAnsi="Helvetica Neue" w:cs="Helvetica Neue"/>
+          <w:sz w:val="24"/>
+          <w:sz-cs w:val="24"/>
+          <w:spacing w:val="0"/>
+          <w:color w:val="181F26"/>
+        </w:rPr>
+        <w:t xml:space="preserve"/>
+      </w:r>
+    </w:p>
+    <w:p>
+      <w:pPr>
+        <w:ind w:left="720" w:first-line="-720"/>
+      </w:pPr>
+      <w:r>
+        <w:rPr>
+          <w:rFonts w:ascii="Helvetica Neue" w:hAnsi="Helvetica Neue" w:cs="Helvetica Neue"/>
+          <w:sz w:val="24"/>
+          <w:sz-cs w:val="24"/>
+          <w:color w:val="181F26"/>
+        </w:rPr>
+        <w:t xml:space="preserve"/>
+        <w:tab/>
+        <w:t xml:space="preserve">•</w:t>
+        <w:tab/>
+        <w:t xml:space="preserve"/>
+      </w:r>
+      <w:r>
+        <w:rPr>
+          <w:rFonts w:ascii="Helvetica Neue" w:hAnsi="Helvetica Neue" w:cs="Helvetica Neue"/>
+          <w:sz w:val="24"/>
+          <w:sz-cs w:val="24"/>
+          <w:spacing w:val="0"/>
+          <w:color w:val="181F26"/>
+        </w:rPr>
+        <w:t xml:space="preserve">scoped OpenClaw submission, action inspection, action event inspection, and agent status</w:t>
+      </w:r>
+    </w:p>
+    <w:p>
+      <w:pPr>
+        <w:ind w:left="720" w:first-line="-720"/>
+      </w:pPr>
+      <w:r>
+        <w:rPr>
+          <w:rFonts w:ascii="Helvetica Neue" w:hAnsi="Helvetica Neue" w:cs="Helvetica Neue"/>
+          <w:sz w:val="24"/>
+          <w:sz-cs w:val="24"/>
+          <w:color w:val="181F26"/>
+        </w:rPr>
+        <w:t xml:space="preserve"/>
+        <w:tab/>
+        <w:t xml:space="preserve">•</w:t>
+        <w:tab/>
+        <w:t xml:space="preserve"/>
+      </w:r>
+      <w:r>
+        <w:rPr>
+          <w:rFonts w:ascii="Helvetica Neue" w:hAnsi="Helvetica Neue" w:cs="Helvetica Neue"/>
+          <w:sz w:val="24"/>
+          <w:sz-cs w:val="24"/>
+          <w:spacing w:val="0"/>
+          <w:color w:val="181F26"/>
+        </w:rPr>
+        <w:t xml:space="preserve">a thin TypeScript Gateway RPC bridge under </w:t>
+      </w:r>
+      <w:r>
+        <w:rPr>
+          <w:rFonts w:ascii="Menlo" w:hAnsi="Menlo" w:cs="Menlo"/>
+          <w:sz w:val="24"/>
+          <w:sz-cs w:val="24"/>
+          <w:spacing w:val="0"/>
+          <w:color w:val="181F26"/>
+        </w:rPr>
+        <w:t xml:space="preserve">integrations/openclaw-inbound/</w:t>
+      </w:r>
+      <w:r>
+        <w:rPr>
+          <w:rFonts w:ascii="Helvetica Neue" w:hAnsi="Helvetica Neue" w:cs="Helvetica Neue"/>
+          <w:sz w:val="24"/>
+          <w:sz-cs w:val="24"/>
+          <w:spacing w:val="0"/>
+          <w:color w:val="181F26"/>
+        </w:rPr>
+        <w:t xml:space="preserve"/>
+      </w:r>
+    </w:p>
+    <w:p>
+      <w:pPr>
+        <w:ind w:left="720" w:first-line="-720"/>
+      </w:pPr>
+      <w:r>
+        <w:rPr>
+          <w:rFonts w:ascii="Helvetica Neue" w:hAnsi="Helvetica Neue" w:cs="Helvetica Neue"/>
+          <w:sz w:val="24"/>
+          <w:sz-cs w:val="24"/>
+          <w:color w:val="181F26"/>
+        </w:rPr>
+        <w:t xml:space="preserve"/>
+        <w:tab/>
+        <w:t xml:space="preserve">•</w:t>
+        <w:tab/>
+        <w:t xml:space="preserve"/>
+      </w:r>
+      <w:r>
+        <w:rPr>
+          <w:rFonts w:ascii="Helvetica Neue" w:hAnsi="Helvetica Neue" w:cs="Helvetica Neue"/>
+          <w:sz w:val="24"/>
+          <w:sz-cs w:val="24"/>
+          <w:spacing w:val="0"/>
+          <w:color w:val="181F26"/>
+        </w:rPr>
+        <w:t xml:space="preserve">explicit narrowing of the current inbound method set to </w:t>
+      </w:r>
+      <w:r>
+        <w:rPr>
+          <w:rFonts w:ascii="Menlo" w:hAnsi="Menlo" w:cs="Menlo"/>
+          <w:sz w:val="24"/>
+          <w:sz-cs w:val="24"/>
+          <w:spacing w:val="0"/>
+          <w:color w:val="181F26"/>
+        </w:rPr>
+        <w:t xml:space="preserve">submit</w:t>
+      </w:r>
+      <w:r>
+        <w:rPr>
+          <w:rFonts w:ascii="Helvetica Neue" w:hAnsi="Helvetica Neue" w:cs="Helvetica Neue"/>
+          <w:sz w:val="24"/>
+          <w:sz-cs w:val="24"/>
+          <w:spacing w:val="0"/>
+          <w:color w:val="181F26"/>
+        </w:rPr>
+        <w:t xml:space="preserve">, </w:t>
+      </w:r>
+      <w:r>
+        <w:rPr>
+          <w:rFonts w:ascii="Menlo" w:hAnsi="Menlo" w:cs="Menlo"/>
+          <w:sz w:val="24"/>
+          <w:sz-cs w:val="24"/>
+          <w:spacing w:val="0"/>
+          <w:color w:val="181F26"/>
+        </w:rPr>
+        <w:t xml:space="preserve">inspect</w:t>
+      </w:r>
+      <w:r>
+        <w:rPr>
+          <w:rFonts w:ascii="Helvetica Neue" w:hAnsi="Helvetica Neue" w:cs="Helvetica Neue"/>
+          <w:sz w:val="24"/>
+          <w:sz-cs w:val="24"/>
+          <w:spacing w:val="0"/>
+          <w:color w:val="181F26"/>
+        </w:rPr>
+        <w:t xml:space="preserve">, </w:t>
+      </w:r>
+      <w:r>
+        <w:rPr>
+          <w:rFonts w:ascii="Menlo" w:hAnsi="Menlo" w:cs="Menlo"/>
+          <w:sz w:val="24"/>
+          <w:sz-cs w:val="24"/>
+          <w:spacing w:val="0"/>
+          <w:color w:val="181F26"/>
+        </w:rPr>
+        <w:t xml:space="preserve">events</w:t>
+      </w:r>
+      <w:r>
+        <w:rPr>
+          <w:rFonts w:ascii="Helvetica Neue" w:hAnsi="Helvetica Neue" w:cs="Helvetica Neue"/>
+          <w:sz w:val="24"/>
+          <w:sz-cs w:val="24"/>
+          <w:spacing w:val="0"/>
+          <w:color w:val="181F26"/>
+        </w:rPr>
+        <w:t xml:space="preserve">, and </w:t>
+      </w:r>
+      <w:r>
+        <w:rPr>
+          <w:rFonts w:ascii="Menlo" w:hAnsi="Menlo" w:cs="Menlo"/>
+          <w:sz w:val="24"/>
+          <w:sz-cs w:val="24"/>
+          <w:spacing w:val="0"/>
+          <w:color w:val="181F26"/>
+        </w:rPr>
+        <w:t xml:space="preserve">agent.status</w:t>
       </w:r>
       <w:r>
         <w:rPr>
@@ -34537,7 +35189,7 @@
           <w:spacing w:val="0"/>
           <w:color w:val="181F26"/>
         </w:rPr>
-        <w:t xml:space="preserve">OpenClaw inbound plugin and Gateway RPC bridge</w:t>
+        <w:t xml:space="preserve">OpenClaw inbound Gateway RPC bridge, with plugin-tool UX deferred until after the RPC path is stable</w:t>
       </w:r>
     </w:p>
     <w:p>
@@ -38854,6 +39506,34 @@
     </w:p>
     <w:p>
       <w:pPr>
+        <w:ind w:left="720" w:first-line="-720"/>
+      </w:pPr>
+      <w:r>
+        <w:rPr>
+          <w:rFonts w:ascii="Helvetica Neue" w:hAnsi="Helvetica Neue" w:cs="Helvetica Neue"/>
+          <w:sz w:val="24"/>
+          <w:sz-cs w:val="24"/>
+          <w:color w:val="181F26"/>
+        </w:rPr>
+        <w:t xml:space="preserve"/>
+        <w:tab/>
+        <w:t xml:space="preserve">•</w:t>
+        <w:tab/>
+        <w:t xml:space="preserve"/>
+      </w:r>
+      <w:r>
+        <w:rPr>
+          <w:rFonts w:ascii="Helvetica Neue" w:hAnsi="Helvetica Neue" w:cs="Helvetica Neue"/>
+          <w:sz w:val="24"/>
+          <w:sz-cs w:val="24"/>
+          <w:spacing w:val="0"/>
+          <w:color w:val="181F26"/>
+        </w:rPr>
+        <w:t xml:space="preserve">Verify unmapped callers fail before action creation and do not leave durable action records behind.</w:t>
+      </w:r>
+    </w:p>
+    <w:p>
+      <w:pPr>
         <w:spacing w:after="152"/>
       </w:pPr>
       <w:r>
@@ -40493,7 +41173,7 @@
           <w:spacing w:val="0"/>
           <w:color w:val="181F26"/>
         </w:rPr>
-        <w:t xml:space="preserve">design OpenClaw plugin, RPC, and Gateway adapter interfaces so P1 can add bidirectional OpenClaw interop without changing the action model</w:t>
+        <w:t xml:space="preserve">keep the implemented OpenClaw inbound bridge thin so future plugin or outbound work does not change the action model</w:t>
       </w:r>
     </w:p>
     <w:p>

</xml_diff>

<commit_message>
docs: publish openclaw outbound milestone
</commit_message>
<xml_diff>
--- a/docs/exports/Crawfish-PRD.docx
+++ b/docs/exports/Crawfish-PRD.docx
@@ -3176,7 +3176,7 @@
           <w:spacing w:val="0"/>
           <w:color w:val="181F26"/>
         </w:rPr>
-        <w:t xml:space="preserve">Future versions of the same demo should also show bidirectional OpenClaw interop and Ralph-style verified coding actions: OpenClaw can submit work into Crawfish as an external control surface, while selected coding actions such as </w:t>
+        <w:t xml:space="preserve">The same demo can now also show bidirectional OpenClaw interop when a local Gateway is available: OpenClaw can submit work into Crawfish as an external control surface, while </w:t>
       </w:r>
       <w:r>
         <w:rPr>
@@ -3196,7 +3196,7 @@
           <w:spacing w:val="0"/>
           <w:color w:val="181F26"/>
         </w:rPr>
-        <w:t xml:space="preserve"> route out through the OpenClaw Gateway agent loop and complete only after deterministic verification passes.</w:t>
+        <w:t xml:space="preserve"> routes out through the OpenClaw Gateway agent loop and returns a proposal-only patch plan. Ralph-style verified coding loops remain a later milestone.</w:t>
       </w:r>
     </w:p>
     <w:p>
@@ -3577,7 +3577,7 @@
           <w:spacing w:val="0"/>
           <w:color w:val="181F26"/>
         </w:rPr>
-        <w:t xml:space="preserve">The current Rust alpha now covers one runnable Hero P0 slice plus the first </w:t>
+        <w:t xml:space="preserve">The current Rust alpha now covers one runnable Hero P0 slice plus </w:t>
       </w:r>
       <w:r>
         <w:rPr>
@@ -3597,7 +3597,27 @@
           <w:spacing w:val="0"/>
           <w:color w:val="181F26"/>
         </w:rPr>
-        <w:t xml:space="preserve"> OpenClaw inbound surface:</w:t>
+        <w:t xml:space="preserve"> OpenClaw inbound and the first </w:t>
+      </w:r>
+      <w:r>
+        <w:rPr>
+          <w:rFonts w:ascii="Menlo" w:hAnsi="Menlo" w:cs="Menlo"/>
+          <w:sz w:val="24"/>
+          <w:sz-cs w:val="24"/>
+          <w:spacing w:val="0"/>
+          <w:color w:val="181F26"/>
+        </w:rPr>
+        <w:t xml:space="preserve">P1b</w:t>
+      </w:r>
+      <w:r>
+        <w:rPr>
+          <w:rFonts w:ascii="Helvetica Neue" w:hAnsi="Helvetica Neue" w:cs="Helvetica Neue"/>
+          <w:sz w:val="24"/>
+          <w:sz-cs w:val="24"/>
+          <w:spacing w:val="0"/>
+          <w:color w:val="181F26"/>
+        </w:rPr>
+        <w:t xml:space="preserve"> outbound harness slice:</w:t>
       </w:r>
     </w:p>
     <w:p>
@@ -4063,6 +4083,200 @@
           <w:spacing w:val="0"/>
           <w:color w:val="181F26"/>
         </w:rPr>
+        <w:t xml:space="preserve">coding.patch.plan</w:t>
+      </w:r>
+      <w:r>
+        <w:rPr>
+          <w:rFonts w:ascii="Helvetica Neue" w:hAnsi="Helvetica Neue" w:cs="Helvetica Neue"/>
+          <w:sz w:val="24"/>
+          <w:sz-cs w:val="24"/>
+          <w:spacing w:val="0"/>
+          <w:color w:val="181F26"/>
+        </w:rPr>
+        <w:t xml:space="preserve"> now uses the new </w:t>
+      </w:r>
+      <w:r>
+        <w:rPr>
+          <w:rFonts w:ascii="Menlo" w:hAnsi="Menlo" w:cs="Menlo"/>
+          <w:sz w:val="24"/>
+          <w:sz-cs w:val="24"/>
+          <w:spacing w:val="0"/>
+          <w:color w:val="181F26"/>
+        </w:rPr>
+        <w:t xml:space="preserve">coding_planner</w:t>
+      </w:r>
+      <w:r>
+        <w:rPr>
+          <w:rFonts w:ascii="Helvetica Neue" w:hAnsi="Helvetica Neue" w:cs="Helvetica Neue"/>
+          <w:sz w:val="24"/>
+          <w:sz-cs w:val="24"/>
+          <w:spacing w:val="0"/>
+          <w:color w:val="181F26"/>
+        </w:rPr>
+        <w:t xml:space="preserve"> agent and can route out through the OpenClaw Gateway with streamed lifecycle, assistant, and tool events.</w:t>
+      </w:r>
+    </w:p>
+    <w:p>
+      <w:pPr>
+        <w:ind w:left="720" w:first-line="-720"/>
+      </w:pPr>
+      <w:r>
+        <w:rPr>
+          <w:rFonts w:ascii="Helvetica Neue" w:hAnsi="Helvetica Neue" w:cs="Helvetica Neue"/>
+          <w:sz w:val="24"/>
+          <w:sz-cs w:val="24"/>
+          <w:color w:val="181F26"/>
+        </w:rPr>
+        <w:t xml:space="preserve"/>
+        <w:tab/>
+        <w:t xml:space="preserve">•</w:t>
+        <w:tab/>
+        <w:t xml:space="preserve"/>
+      </w:r>
+      <w:r>
+        <w:rPr>
+          <w:rFonts w:ascii="Helvetica Neue" w:hAnsi="Helvetica Neue" w:cs="Helvetica Neue"/>
+          <w:sz w:val="24"/>
+          <w:sz-cs w:val="24"/>
+          <w:spacing w:val="0"/>
+          <w:color w:val="181F26"/>
+        </w:rPr>
+        <w:t xml:space="preserve">when OpenClaw outbound is unavailable, </w:t>
+      </w:r>
+      <w:r>
+        <w:rPr>
+          <w:rFonts w:ascii="Menlo" w:hAnsi="Menlo" w:cs="Menlo"/>
+          <w:sz w:val="24"/>
+          <w:sz-cs w:val="24"/>
+          <w:spacing w:val="0"/>
+          <w:color w:val="181F26"/>
+        </w:rPr>
+        <w:t xml:space="preserve">coding.patch.plan</w:t>
+      </w:r>
+      <w:r>
+        <w:rPr>
+          <w:rFonts w:ascii="Helvetica Neue" w:hAnsi="Helvetica Neue" w:cs="Helvetica Neue"/>
+          <w:sz w:val="24"/>
+          <w:sz-cs w:val="24"/>
+          <w:spacing w:val="0"/>
+          <w:color w:val="181F26"/>
+        </w:rPr>
+        <w:t xml:space="preserve"> falls back to a deterministic planner when the contract fallback chain permits it.</w:t>
+      </w:r>
+    </w:p>
+    <w:p>
+      <w:pPr>
+        <w:ind w:left="720" w:first-line="-720"/>
+      </w:pPr>
+      <w:r>
+        <w:rPr>
+          <w:rFonts w:ascii="Helvetica Neue" w:hAnsi="Helvetica Neue" w:cs="Helvetica Neue"/>
+          <w:sz w:val="24"/>
+          <w:sz-cs w:val="24"/>
+          <w:color w:val="181F26"/>
+        </w:rPr>
+        <w:t xml:space="preserve"/>
+        <w:tab/>
+        <w:t xml:space="preserve">•</w:t>
+        <w:tab/>
+        <w:t xml:space="preserve"/>
+      </w:r>
+      <w:r>
+        <w:rPr>
+          <w:rFonts w:ascii="Helvetica Neue" w:hAnsi="Helvetica Neue" w:cs="Helvetica Neue"/>
+          <w:sz w:val="24"/>
+          <w:sz-cs w:val="24"/>
+          <w:spacing w:val="0"/>
+          <w:color w:val="181F26"/>
+        </w:rPr>
+        <w:t xml:space="preserve">current OpenClaw outbound support is intentionally narrow: </w:t>
+      </w:r>
+      <w:r>
+        <w:rPr>
+          <w:rFonts w:ascii="Menlo" w:hAnsi="Menlo" w:cs="Menlo"/>
+          <w:sz w:val="24"/>
+          <w:sz-cs w:val="24"/>
+          <w:spacing w:val="0"/>
+          <w:color w:val="181F26"/>
+        </w:rPr>
+        <w:t xml:space="preserve">auth_ref</w:t>
+      </w:r>
+      <w:r>
+        <w:rPr>
+          <w:rFonts w:ascii="Helvetica Neue" w:hAnsi="Helvetica Neue" w:cs="Helvetica Neue"/>
+          <w:sz w:val="24"/>
+          <w:sz-cs w:val="24"/>
+          <w:spacing w:val="0"/>
+          <w:color w:val="181F26"/>
+        </w:rPr>
+        <w:t xml:space="preserve"> resolves to an environment variable, </w:t>
+      </w:r>
+      <w:r>
+        <w:rPr>
+          <w:rFonts w:ascii="Menlo" w:hAnsi="Menlo" w:cs="Menlo"/>
+          <w:sz w:val="24"/>
+          <w:sz-cs w:val="24"/>
+          <w:spacing w:val="0"/>
+          <w:color w:val="181F26"/>
+        </w:rPr>
+        <w:t xml:space="preserve">session_mode = ephemeral</w:t>
+      </w:r>
+      <w:r>
+        <w:rPr>
+          <w:rFonts w:ascii="Helvetica Neue" w:hAnsi="Helvetica Neue" w:cs="Helvetica Neue"/>
+          <w:sz w:val="24"/>
+          <w:sz-cs w:val="24"/>
+          <w:spacing w:val="0"/>
+          <w:color w:val="181F26"/>
+        </w:rPr>
+        <w:t xml:space="preserve"> is supported, and </w:t>
+      </w:r>
+      <w:r>
+        <w:rPr>
+          <w:rFonts w:ascii="Menlo" w:hAnsi="Menlo" w:cs="Menlo"/>
+          <w:sz w:val="24"/>
+          <w:sz-cs w:val="24"/>
+          <w:spacing w:val="0"/>
+          <w:color w:val="181F26"/>
+        </w:rPr>
+        <w:t xml:space="preserve">workspace_policy = inherit | crawfish_managed</w:t>
+      </w:r>
+      <w:r>
+        <w:rPr>
+          <w:rFonts w:ascii="Helvetica Neue" w:hAnsi="Helvetica Neue" w:cs="Helvetica Neue"/>
+          <w:sz w:val="24"/>
+          <w:sz-cs w:val="24"/>
+          <w:spacing w:val="0"/>
+          <w:color w:val="181F26"/>
+        </w:rPr>
+        <w:t xml:space="preserve"> is supported.</w:t>
+      </w:r>
+    </w:p>
+    <w:p>
+      <w:pPr>
+        <w:ind w:left="720" w:first-line="-720"/>
+      </w:pPr>
+      <w:r>
+        <w:rPr>
+          <w:rFonts w:ascii="Menlo" w:hAnsi="Menlo" w:cs="Menlo"/>
+          <w:sz w:val="24"/>
+          <w:sz-cs w:val="24"/>
+          <w:color w:val="181F26"/>
+        </w:rPr>
+        <w:t xml:space="preserve"/>
+        <w:tab/>
+        <w:t xml:space="preserve">•</w:t>
+        <w:tab/>
+        <w:t xml:space="preserve"/>
+      </w:r>
+      <w:r>
+        <w:rPr>
+          <w:rFonts w:ascii="Menlo" w:hAnsi="Menlo" w:cs="Menlo"/>
+          <w:sz w:val="24"/>
+          <w:sz-cs w:val="24"/>
+          <w:spacing w:val="0"/>
+          <w:color w:val="181F26"/>
+        </w:rPr>
         <w:t xml:space="preserve">inspect</w:t>
       </w:r>
       <w:r>
@@ -4267,6 +4481,34 @@
           <w:spacing w:val="0"/>
           <w:color w:val="181F26"/>
         </w:rPr>
+        <w:t xml:space="preserve">restart recovery records when an in-flight OpenClaw run was abandoned and a fresh local attempt was requeued.</w:t>
+      </w:r>
+    </w:p>
+    <w:p>
+      <w:pPr>
+        <w:ind w:left="720" w:first-line="-720"/>
+      </w:pPr>
+      <w:r>
+        <w:rPr>
+          <w:rFonts w:ascii="Helvetica Neue" w:hAnsi="Helvetica Neue" w:cs="Helvetica Neue"/>
+          <w:sz w:val="24"/>
+          <w:sz-cs w:val="24"/>
+          <w:color w:val="181F26"/>
+        </w:rPr>
+        <w:t xml:space="preserve"/>
+        <w:tab/>
+        <w:t xml:space="preserve">•</w:t>
+        <w:tab/>
+        <w:t xml:space="preserve"/>
+      </w:r>
+      <w:r>
+        <w:rPr>
+          <w:rFonts w:ascii="Helvetica Neue" w:hAnsi="Helvetica Neue" w:cs="Helvetica Neue"/>
+          <w:sz w:val="24"/>
+          <w:sz-cs w:val="24"/>
+          <w:spacing w:val="0"/>
+          <w:color w:val="181F26"/>
+        </w:rPr>
         <w:t xml:space="preserve">same-owner local read-only actions can be leased automatically, while same-device foreign-owner mutation remains denied by default.</w:t>
       </w:r>
     </w:p>
@@ -4395,47 +4637,47 @@
           <w:spacing w:val="0"/>
           <w:color w:val="181F26"/>
         </w:rPr>
-        <w:t xml:space="preserve">With this </w:t>
-      </w:r>
-      <w:r>
-        <w:rPr>
-          <w:rFonts w:ascii="Menlo" w:hAnsi="Menlo" w:cs="Menlo"/>
-          <w:sz w:val="24"/>
-          <w:sz-cs w:val="24"/>
-          <w:spacing w:val="0"/>
-          <w:color w:val="181F26"/>
-        </w:rPr>
-        <w:t xml:space="preserve">P1a</w:t>
-      </w:r>
-      <w:r>
-        <w:rPr>
-          <w:rFonts w:ascii="Helvetica Neue" w:hAnsi="Helvetica Neue" w:cs="Helvetica Neue"/>
-          <w:sz w:val="24"/>
-          <w:sz-cs w:val="24"/>
-          <w:spacing w:val="0"/>
-          <w:color w:val="181F26"/>
-        </w:rPr>
-        <w:t xml:space="preserve"> inbound slice in place, the next planned milestone is </w:t>
-      </w:r>
-      <w:r>
-        <w:rPr>
-          <w:rFonts w:ascii="Menlo" w:hAnsi="Menlo" w:cs="Menlo"/>
-          <w:sz w:val="24"/>
-          <w:sz-cs w:val="24"/>
-          <w:spacing w:val="0"/>
-          <w:color w:val="181F26"/>
-        </w:rPr>
-        <w:t xml:space="preserve">P1b OpenClaw outbound</w:t>
-      </w:r>
-      <w:r>
-        <w:rPr>
-          <w:rFonts w:ascii="Helvetica Neue" w:hAnsi="Helvetica Neue" w:cs="Helvetica Neue"/>
-          <w:sz w:val="24"/>
-          <w:sz-cs w:val="24"/>
-          <w:spacing w:val="0"/>
-          <w:color w:val="181F26"/>
-        </w:rPr>
-        <w:t xml:space="preserve">.</w:t>
+        <w:t xml:space="preserve">The next planned milestone after this </w:t>
+      </w:r>
+      <w:r>
+        <w:rPr>
+          <w:rFonts w:ascii="Menlo" w:hAnsi="Menlo" w:cs="Menlo"/>
+          <w:sz w:val="24"/>
+          <w:sz-cs w:val="24"/>
+          <w:spacing w:val="0"/>
+          <w:color w:val="181F26"/>
+        </w:rPr>
+        <w:t xml:space="preserve">P1b</w:t>
+      </w:r>
+      <w:r>
+        <w:rPr>
+          <w:rFonts w:ascii="Helvetica Neue" w:hAnsi="Helvetica Neue" w:cs="Helvetica Neue"/>
+          <w:sz w:val="24"/>
+          <w:sz-cs w:val="24"/>
+          <w:spacing w:val="0"/>
+          <w:color w:val="181F26"/>
+        </w:rPr>
+        <w:t xml:space="preserve"> outbound slice is </w:t>
+      </w:r>
+      <w:r>
+        <w:rPr>
+          <w:rFonts w:ascii="Menlo" w:hAnsi="Menlo" w:cs="Menlo"/>
+          <w:sz w:val="24"/>
+          <w:sz-cs w:val="24"/>
+          <w:spacing w:val="0"/>
+          <w:color w:val="181F26"/>
+        </w:rPr>
+        <w:t xml:space="preserve">P1c</w:t>
+      </w:r>
+      <w:r>
+        <w:rPr>
+          <w:rFonts w:ascii="Helvetica Neue" w:hAnsi="Helvetica Neue" w:cs="Helvetica Neue"/>
+          <w:sz w:val="24"/>
+          <w:sz-cs w:val="24"/>
+          <w:spacing w:val="0"/>
+          <w:color w:val="181F26"/>
+        </w:rPr>
+        <w:t xml:space="preserve"> runtime verification for coding-heavy actions, starting with Ralph-style verify-loop support on top of the existing OpenClaw route.</w:t>
       </w:r>
     </w:p>
     <w:p>
@@ -27631,6 +27873,238 @@
     </w:p>
     <w:p>
       <w:pPr>
+        <w:ind w:left="720" w:first-line="-720"/>
+      </w:pPr>
+      <w:r>
+        <w:rPr>
+          <w:rFonts w:ascii="Helvetica Neue" w:hAnsi="Helvetica Neue" w:cs="Helvetica Neue"/>
+          <w:sz w:val="24"/>
+          <w:sz-cs w:val="24"/>
+          <w:color w:val="181F26"/>
+        </w:rPr>
+        <w:t xml:space="preserve"/>
+        <w:tab/>
+        <w:t xml:space="preserve">•</w:t>
+        <w:tab/>
+        <w:t xml:space="preserve"/>
+      </w:r>
+      <w:r>
+        <w:rPr>
+          <w:rFonts w:ascii="Helvetica Neue" w:hAnsi="Helvetica Neue" w:cs="Helvetica Neue"/>
+          <w:sz w:val="24"/>
+          <w:sz-cs w:val="24"/>
+          <w:spacing w:val="0"/>
+          <w:color w:val="181F26"/>
+        </w:rPr>
+        <w:t xml:space="preserve">the current </w:t>
+      </w:r>
+      <w:r>
+        <w:rPr>
+          <w:rFonts w:ascii="Menlo" w:hAnsi="Menlo" w:cs="Menlo"/>
+          <w:sz w:val="24"/>
+          <w:sz-cs w:val="24"/>
+          <w:spacing w:val="0"/>
+          <w:color w:val="181F26"/>
+        </w:rPr>
+        <w:t xml:space="preserve">P1b</w:t>
+      </w:r>
+      <w:r>
+        <w:rPr>
+          <w:rFonts w:ascii="Helvetica Neue" w:hAnsi="Helvetica Neue" w:cs="Helvetica Neue"/>
+          <w:sz w:val="24"/>
+          <w:sz-cs w:val="24"/>
+          <w:spacing w:val="0"/>
+          <w:color w:val="181F26"/>
+        </w:rPr>
+        <w:t xml:space="preserve"> implementation supports </w:t>
+      </w:r>
+      <w:r>
+        <w:rPr>
+          <w:rFonts w:ascii="Menlo" w:hAnsi="Menlo" w:cs="Menlo"/>
+          <w:sz w:val="24"/>
+          <w:sz-cs w:val="24"/>
+          <w:spacing w:val="0"/>
+          <w:color w:val="181F26"/>
+        </w:rPr>
+        <w:t xml:space="preserve">session_mode = ephemeral</w:t>
+      </w:r>
+      <w:r>
+        <w:rPr>
+          <w:rFonts w:ascii="Helvetica Neue" w:hAnsi="Helvetica Neue" w:cs="Helvetica Neue"/>
+          <w:sz w:val="24"/>
+          <w:sz-cs w:val="24"/>
+          <w:spacing w:val="0"/>
+          <w:color w:val="181F26"/>
+        </w:rPr>
+        <w:t xml:space="preserve"> only</w:t>
+      </w:r>
+    </w:p>
+    <w:p>
+      <w:pPr>
+        <w:ind w:left="720" w:first-line="-720"/>
+      </w:pPr>
+      <w:r>
+        <w:rPr>
+          <w:rFonts w:ascii="Helvetica Neue" w:hAnsi="Helvetica Neue" w:cs="Helvetica Neue"/>
+          <w:sz w:val="24"/>
+          <w:sz-cs w:val="24"/>
+          <w:color w:val="181F26"/>
+        </w:rPr>
+        <w:t xml:space="preserve"/>
+        <w:tab/>
+        <w:t xml:space="preserve">•</w:t>
+        <w:tab/>
+        <w:t xml:space="preserve"/>
+      </w:r>
+      <w:r>
+        <w:rPr>
+          <w:rFonts w:ascii="Helvetica Neue" w:hAnsi="Helvetica Neue" w:cs="Helvetica Neue"/>
+          <w:sz w:val="24"/>
+          <w:sz-cs w:val="24"/>
+          <w:spacing w:val="0"/>
+          <w:color w:val="181F26"/>
+        </w:rPr>
+        <w:t xml:space="preserve">the current </w:t>
+      </w:r>
+      <w:r>
+        <w:rPr>
+          <w:rFonts w:ascii="Menlo" w:hAnsi="Menlo" w:cs="Menlo"/>
+          <w:sz w:val="24"/>
+          <w:sz-cs w:val="24"/>
+          <w:spacing w:val="0"/>
+          <w:color w:val="181F26"/>
+        </w:rPr>
+        <w:t xml:space="preserve">P1b</w:t>
+      </w:r>
+      <w:r>
+        <w:rPr>
+          <w:rFonts w:ascii="Helvetica Neue" w:hAnsi="Helvetica Neue" w:cs="Helvetica Neue"/>
+          <w:sz w:val="24"/>
+          <w:sz-cs w:val="24"/>
+          <w:spacing w:val="0"/>
+          <w:color w:val="181F26"/>
+        </w:rPr>
+        <w:t xml:space="preserve"> implementation supports </w:t>
+      </w:r>
+      <w:r>
+        <w:rPr>
+          <w:rFonts w:ascii="Menlo" w:hAnsi="Menlo" w:cs="Menlo"/>
+          <w:sz w:val="24"/>
+          <w:sz-cs w:val="24"/>
+          <w:spacing w:val="0"/>
+          <w:color w:val="181F26"/>
+        </w:rPr>
+        <w:t xml:space="preserve">workspace_policy = inherit | crawfish_managed</w:t>
+      </w:r>
+      <w:r>
+        <w:rPr>
+          <w:rFonts w:ascii="Helvetica Neue" w:hAnsi="Helvetica Neue" w:cs="Helvetica Neue"/>
+          <w:sz w:val="24"/>
+          <w:sz-cs w:val="24"/>
+          <w:spacing w:val="0"/>
+          <w:color w:val="181F26"/>
+        </w:rPr>
+        <w:t xml:space="preserve">; </w:t>
+      </w:r>
+      <w:r>
+        <w:rPr>
+          <w:rFonts w:ascii="Menlo" w:hAnsi="Menlo" w:cs="Menlo"/>
+          <w:sz w:val="24"/>
+          <w:sz-cs w:val="24"/>
+          <w:spacing w:val="0"/>
+          <w:color w:val="181F26"/>
+        </w:rPr>
+        <w:t xml:space="preserve">openclaw_managed</w:t>
+      </w:r>
+      <w:r>
+        <w:rPr>
+          <w:rFonts w:ascii="Helvetica Neue" w:hAnsi="Helvetica Neue" w:cs="Helvetica Neue"/>
+          <w:sz w:val="24"/>
+          <w:sz-cs w:val="24"/>
+          <w:spacing w:val="0"/>
+          <w:color w:val="181F26"/>
+        </w:rPr>
+        <w:t xml:space="preserve"> is parsed but rejected at runtime</w:t>
+      </w:r>
+    </w:p>
+    <w:p>
+      <w:pPr>
+        <w:ind w:left="720" w:first-line="-720"/>
+      </w:pPr>
+      <w:r>
+        <w:rPr>
+          <w:rFonts w:ascii="Menlo" w:hAnsi="Menlo" w:cs="Menlo"/>
+          <w:sz w:val="24"/>
+          <w:sz-cs w:val="24"/>
+          <w:color w:val="181F26"/>
+        </w:rPr>
+        <w:t xml:space="preserve"/>
+        <w:tab/>
+        <w:t xml:space="preserve">•</w:t>
+        <w:tab/>
+        <w:t xml:space="preserve"/>
+      </w:r>
+      <w:r>
+        <w:rPr>
+          <w:rFonts w:ascii="Menlo" w:hAnsi="Menlo" w:cs="Menlo"/>
+          <w:sz w:val="24"/>
+          <w:sz-cs w:val="24"/>
+          <w:spacing w:val="0"/>
+          <w:color w:val="181F26"/>
+        </w:rPr>
+        <w:t xml:space="preserve">auth_ref</w:t>
+      </w:r>
+      <w:r>
+        <w:rPr>
+          <w:rFonts w:ascii="Helvetica Neue" w:hAnsi="Helvetica Neue" w:cs="Helvetica Neue"/>
+          <w:sz w:val="24"/>
+          <w:sz-cs w:val="24"/>
+          <w:spacing w:val="0"/>
+          <w:color w:val="181F26"/>
+        </w:rPr>
+        <w:t xml:space="preserve"> currently resolves to an environment variable name containing the Gateway bearer token</w:t>
+      </w:r>
+    </w:p>
+    <w:p>
+      <w:pPr>
+        <w:ind w:left="720" w:first-line="-720"/>
+      </w:pPr>
+      <w:r>
+        <w:rPr>
+          <w:rFonts w:ascii="Menlo" w:hAnsi="Menlo" w:cs="Menlo"/>
+          <w:sz w:val="24"/>
+          <w:sz-cs w:val="24"/>
+          <w:color w:val="181F26"/>
+        </w:rPr>
+        <w:t xml:space="preserve"/>
+        <w:tab/>
+        <w:t xml:space="preserve">•</w:t>
+        <w:tab/>
+        <w:t xml:space="preserve"/>
+      </w:r>
+      <w:r>
+        <w:rPr>
+          <w:rFonts w:ascii="Menlo" w:hAnsi="Menlo" w:cs="Menlo"/>
+          <w:sz w:val="24"/>
+          <w:sz-cs w:val="24"/>
+          <w:spacing w:val="0"/>
+          <w:color w:val="181F26"/>
+        </w:rPr>
+        <w:t xml:space="preserve">coding.patch.plan</w:t>
+      </w:r>
+      <w:r>
+        <w:rPr>
+          <w:rFonts w:ascii="Helvetica Neue" w:hAnsi="Helvetica Neue" w:cs="Helvetica Neue"/>
+          <w:sz w:val="24"/>
+          <w:sz-cs w:val="24"/>
+          <w:spacing w:val="0"/>
+          <w:color w:val="181F26"/>
+        </w:rPr>
+        <w:t xml:space="preserve"> is the first outbound capability and remains proposal-only; mutation and verify-loop semantics are deferred</w:t>
+      </w:r>
+    </w:p>
+    <w:p>
+      <w:pPr>
         <w:spacing w:after="152"/>
       </w:pPr>
       <w:r>
@@ -34870,6 +35344,389 @@
     </w:p>
     <w:p>
       <w:pPr>
+        <w:spacing w:after="240"/>
+      </w:pPr>
+      <w:r>
+        <w:rPr>
+          <w:rFonts w:ascii="Helvetica Neue" w:hAnsi="Helvetica Neue" w:cs="Helvetica Neue"/>
+          <w:sz w:val="24"/>
+          <w:sz-cs w:val="24"/>
+          <w:spacing w:val="0"/>
+          <w:color w:val="181F26"/>
+        </w:rPr>
+        <w:t xml:space="preserve">The current </w:t>
+      </w:r>
+      <w:r>
+        <w:rPr>
+          <w:rFonts w:ascii="Menlo" w:hAnsi="Menlo" w:cs="Menlo"/>
+          <w:sz w:val="24"/>
+          <w:sz-cs w:val="24"/>
+          <w:spacing w:val="0"/>
+          <w:color w:val="181F26"/>
+        </w:rPr>
+        <w:t xml:space="preserve">P1b</w:t>
+      </w:r>
+      <w:r>
+        <w:rPr>
+          <w:rFonts w:ascii="Helvetica Neue" w:hAnsi="Helvetica Neue" w:cs="Helvetica Neue"/>
+          <w:sz w:val="24"/>
+          <w:sz-cs w:val="24"/>
+          <w:spacing w:val="0"/>
+          <w:color w:val="181F26"/>
+        </w:rPr>
+        <w:t xml:space="preserve"> outbound slice adds:</w:t>
+      </w:r>
+    </w:p>
+    <w:p>
+      <w:pPr>
+        <w:ind w:left="720" w:first-line="-720"/>
+      </w:pPr>
+      <w:r>
+        <w:rPr>
+          <w:rFonts w:ascii="Menlo" w:hAnsi="Menlo" w:cs="Menlo"/>
+          <w:sz w:val="24"/>
+          <w:sz-cs w:val="24"/>
+          <w:color w:val="181F26"/>
+        </w:rPr>
+        <w:t xml:space="preserve"/>
+        <w:tab/>
+        <w:t xml:space="preserve">•</w:t>
+        <w:tab/>
+        <w:t xml:space="preserve"/>
+      </w:r>
+      <w:r>
+        <w:rPr>
+          <w:rFonts w:ascii="Menlo" w:hAnsi="Menlo" w:cs="Menlo"/>
+          <w:sz w:val="24"/>
+          <w:sz-cs w:val="24"/>
+          <w:spacing w:val="0"/>
+          <w:color w:val="181F26"/>
+        </w:rPr>
+        <w:t xml:space="preserve">coding.patch.plan</w:t>
+      </w:r>
+      <w:r>
+        <w:rPr>
+          <w:rFonts w:ascii="Helvetica Neue" w:hAnsi="Helvetica Neue" w:cs="Helvetica Neue"/>
+          <w:sz w:val="24"/>
+          <w:sz-cs w:val="24"/>
+          <w:spacing w:val="0"/>
+          <w:color w:val="181F26"/>
+        </w:rPr>
+        <w:t xml:space="preserve"> as the first OpenClaw-routed capability through the new </w:t>
+      </w:r>
+      <w:r>
+        <w:rPr>
+          <w:rFonts w:ascii="Menlo" w:hAnsi="Menlo" w:cs="Menlo"/>
+          <w:sz w:val="24"/>
+          <w:sz-cs w:val="24"/>
+          <w:spacing w:val="0"/>
+          <w:color w:val="181F26"/>
+        </w:rPr>
+        <w:t xml:space="preserve">coding_planner</w:t>
+      </w:r>
+      <w:r>
+        <w:rPr>
+          <w:rFonts w:ascii="Helvetica Neue" w:hAnsi="Helvetica Neue" w:cs="Helvetica Neue"/>
+          <w:sz w:val="24"/>
+          <w:sz-cs w:val="24"/>
+          <w:spacing w:val="0"/>
+          <w:color w:val="181F26"/>
+        </w:rPr>
+        <w:t xml:space="preserve"> agent</w:t>
+      </w:r>
+    </w:p>
+    <w:p>
+      <w:pPr>
+        <w:ind w:left="720" w:first-line="-720"/>
+      </w:pPr>
+      <w:r>
+        <w:rPr>
+          <w:rFonts w:ascii="Helvetica Neue" w:hAnsi="Helvetica Neue" w:cs="Helvetica Neue"/>
+          <w:sz w:val="24"/>
+          <w:sz-cs w:val="24"/>
+          <w:color w:val="181F26"/>
+        </w:rPr>
+        <w:t xml:space="preserve"/>
+        <w:tab/>
+        <w:t xml:space="preserve">•</w:t>
+        <w:tab/>
+        <w:t xml:space="preserve"/>
+      </w:r>
+      <w:r>
+        <w:rPr>
+          <w:rFonts w:ascii="Helvetica Neue" w:hAnsi="Helvetica Neue" w:cs="Helvetica Neue"/>
+          <w:sz w:val="24"/>
+          <w:sz-cs w:val="24"/>
+          <w:spacing w:val="0"/>
+          <w:color w:val="181F26"/>
+        </w:rPr>
+        <w:t xml:space="preserve">OpenClaw Gateway </w:t>
+      </w:r>
+      <w:r>
+        <w:rPr>
+          <w:rFonts w:ascii="Menlo" w:hAnsi="Menlo" w:cs="Menlo"/>
+          <w:sz w:val="24"/>
+          <w:sz-cs w:val="24"/>
+          <w:spacing w:val="0"/>
+          <w:color w:val="181F26"/>
+        </w:rPr>
+        <w:t xml:space="preserve">agent</w:t>
+      </w:r>
+      <w:r>
+        <w:rPr>
+          <w:rFonts w:ascii="Helvetica Neue" w:hAnsi="Helvetica Neue" w:cs="Helvetica Neue"/>
+          <w:sz w:val="24"/>
+          <w:sz-cs w:val="24"/>
+          <w:spacing w:val="0"/>
+          <w:color w:val="181F26"/>
+        </w:rPr>
+        <w:t xml:space="preserve"> and </w:t>
+      </w:r>
+      <w:r>
+        <w:rPr>
+          <w:rFonts w:ascii="Menlo" w:hAnsi="Menlo" w:cs="Menlo"/>
+          <w:sz w:val="24"/>
+          <w:sz-cs w:val="24"/>
+          <w:spacing w:val="0"/>
+          <w:color w:val="181F26"/>
+        </w:rPr>
+        <w:t xml:space="preserve">agent.wait</w:t>
+      </w:r>
+      <w:r>
+        <w:rPr>
+          <w:rFonts w:ascii="Helvetica Neue" w:hAnsi="Helvetica Neue" w:cs="Helvetica Neue"/>
+          <w:sz w:val="24"/>
+          <w:sz-cs w:val="24"/>
+          <w:spacing w:val="0"/>
+          <w:color w:val="181F26"/>
+        </w:rPr>
+        <w:t xml:space="preserve"> execution with streamed lifecycle, assistant, and tool events mapped into normal action events</w:t>
+      </w:r>
+    </w:p>
+    <w:p>
+      <w:pPr>
+        <w:ind w:left="720" w:first-line="-720"/>
+      </w:pPr>
+      <w:r>
+        <w:rPr>
+          <w:rFonts w:ascii="Menlo" w:hAnsi="Menlo" w:cs="Menlo"/>
+          <w:sz w:val="24"/>
+          <w:sz-cs w:val="24"/>
+          <w:color w:val="181F26"/>
+        </w:rPr>
+        <w:t xml:space="preserve"/>
+        <w:tab/>
+        <w:t xml:space="preserve">•</w:t>
+        <w:tab/>
+        <w:t xml:space="preserve"/>
+      </w:r>
+      <w:r>
+        <w:rPr>
+          <w:rFonts w:ascii="Menlo" w:hAnsi="Menlo" w:cs="Menlo"/>
+          <w:sz w:val="24"/>
+          <w:sz-cs w:val="24"/>
+          <w:spacing w:val="0"/>
+          <w:color w:val="181F26"/>
+        </w:rPr>
+        <w:t xml:space="preserve">openclaw.run_id</w:t>
+      </w:r>
+      <w:r>
+        <w:rPr>
+          <w:rFonts w:ascii="Helvetica Neue" w:hAnsi="Helvetica Neue" w:cs="Helvetica Neue"/>
+          <w:sz w:val="24"/>
+          <w:sz-cs w:val="24"/>
+          <w:spacing w:val="0"/>
+          <w:color w:val="181F26"/>
+        </w:rPr>
+        <w:t xml:space="preserve">, target agent, session key, and gateway URL lineage in </w:t>
+      </w:r>
+      <w:r>
+        <w:rPr>
+          <w:rFonts w:ascii="Menlo" w:hAnsi="Menlo" w:cs="Menlo"/>
+          <w:sz w:val="24"/>
+          <w:sz-cs w:val="24"/>
+          <w:spacing w:val="0"/>
+          <w:color w:val="181F26"/>
+        </w:rPr>
+        <w:t xml:space="preserve">external_refs</w:t>
+      </w:r>
+      <w:r>
+        <w:rPr>
+          <w:rFonts w:ascii="Helvetica Neue" w:hAnsi="Helvetica Neue" w:cs="Helvetica Neue"/>
+          <w:sz w:val="24"/>
+          <w:sz-cs w:val="24"/>
+          <w:spacing w:val="0"/>
+          <w:color w:val="181F26"/>
+        </w:rPr>
+        <w:t xml:space="preserve"/>
+      </w:r>
+    </w:p>
+    <w:p>
+      <w:pPr>
+        <w:ind w:left="720" w:first-line="-720"/>
+      </w:pPr>
+      <w:r>
+        <w:rPr>
+          <w:rFonts w:ascii="Helvetica Neue" w:hAnsi="Helvetica Neue" w:cs="Helvetica Neue"/>
+          <w:sz w:val="24"/>
+          <w:sz-cs w:val="24"/>
+          <w:color w:val="181F26"/>
+        </w:rPr>
+        <w:t xml:space="preserve"/>
+        <w:tab/>
+        <w:t xml:space="preserve">•</w:t>
+        <w:tab/>
+        <w:t xml:space="preserve"/>
+      </w:r>
+      <w:r>
+        <w:rPr>
+          <w:rFonts w:ascii="Helvetica Neue" w:hAnsi="Helvetica Neue" w:cs="Helvetica Neue"/>
+          <w:sz w:val="24"/>
+          <w:sz-cs w:val="24"/>
+          <w:spacing w:val="0"/>
+          <w:color w:val="181F26"/>
+        </w:rPr>
+        <w:t xml:space="preserve">deterministic fallback planning when OpenClaw is unavailable and the contract fallback chain includes </w:t>
+      </w:r>
+      <w:r>
+        <w:rPr>
+          <w:rFonts w:ascii="Menlo" w:hAnsi="Menlo" w:cs="Menlo"/>
+          <w:sz w:val="24"/>
+          <w:sz-cs w:val="24"/>
+          <w:spacing w:val="0"/>
+          <w:color w:val="181F26"/>
+        </w:rPr>
+        <w:t xml:space="preserve">deterministic</w:t>
+      </w:r>
+      <w:r>
+        <w:rPr>
+          <w:rFonts w:ascii="Helvetica Neue" w:hAnsi="Helvetica Neue" w:cs="Helvetica Neue"/>
+          <w:sz w:val="24"/>
+          <w:sz-cs w:val="24"/>
+          <w:spacing w:val="0"/>
+          <w:color w:val="181F26"/>
+        </w:rPr>
+        <w:t xml:space="preserve"/>
+      </w:r>
+    </w:p>
+    <w:p>
+      <w:pPr>
+        <w:ind w:left="720" w:first-line="-720"/>
+      </w:pPr>
+      <w:r>
+        <w:rPr>
+          <w:rFonts w:ascii="Helvetica Neue" w:hAnsi="Helvetica Neue" w:cs="Helvetica Neue"/>
+          <w:sz w:val="24"/>
+          <w:sz-cs w:val="24"/>
+          <w:color w:val="181F26"/>
+        </w:rPr>
+        <w:t xml:space="preserve"/>
+        <w:tab/>
+        <w:t xml:space="preserve">•</w:t>
+        <w:tab/>
+        <w:t xml:space="preserve"/>
+      </w:r>
+      <w:r>
+        <w:rPr>
+          <w:rFonts w:ascii="Helvetica Neue" w:hAnsi="Helvetica Neue" w:cs="Helvetica Neue"/>
+          <w:sz w:val="24"/>
+          <w:sz-cs w:val="24"/>
+          <w:spacing w:val="0"/>
+          <w:color w:val="181F26"/>
+        </w:rPr>
+        <w:t xml:space="preserve">explicit restart behavior for in-flight OpenClaw work: abandoned remote runs are recorded and the action is requeued as a fresh attempt</w:t>
+      </w:r>
+    </w:p>
+    <w:p>
+      <w:pPr>
+        <w:ind w:left="720" w:first-line="-720"/>
+      </w:pPr>
+      <w:r>
+        <w:rPr>
+          <w:rFonts w:ascii="Helvetica Neue" w:hAnsi="Helvetica Neue" w:cs="Helvetica Neue"/>
+          <w:sz w:val="24"/>
+          <w:sz-cs w:val="24"/>
+          <w:color w:val="181F26"/>
+        </w:rPr>
+        <w:t xml:space="preserve"/>
+        <w:tab/>
+        <w:t xml:space="preserve">•</w:t>
+        <w:tab/>
+        <w:t xml:space="preserve"/>
+      </w:r>
+      <w:r>
+        <w:rPr>
+          <w:rFonts w:ascii="Helvetica Neue" w:hAnsi="Helvetica Neue" w:cs="Helvetica Neue"/>
+          <w:sz w:val="24"/>
+          <w:sz-cs w:val="24"/>
+          <w:spacing w:val="0"/>
+          <w:color w:val="181F26"/>
+        </w:rPr>
+        <w:t xml:space="preserve">a deliberately narrow outbound support matrix: </w:t>
+      </w:r>
+      <w:r>
+        <w:rPr>
+          <w:rFonts w:ascii="Menlo" w:hAnsi="Menlo" w:cs="Menlo"/>
+          <w:sz w:val="24"/>
+          <w:sz-cs w:val="24"/>
+          <w:spacing w:val="0"/>
+          <w:color w:val="181F26"/>
+        </w:rPr>
+        <w:t xml:space="preserve">auth_ref</w:t>
+      </w:r>
+      <w:r>
+        <w:rPr>
+          <w:rFonts w:ascii="Helvetica Neue" w:hAnsi="Helvetica Neue" w:cs="Helvetica Neue"/>
+          <w:sz w:val="24"/>
+          <w:sz-cs w:val="24"/>
+          <w:spacing w:val="0"/>
+          <w:color w:val="181F26"/>
+        </w:rPr>
+        <w:t xml:space="preserve"> resolves to an environment variable, </w:t>
+      </w:r>
+      <w:r>
+        <w:rPr>
+          <w:rFonts w:ascii="Menlo" w:hAnsi="Menlo" w:cs="Menlo"/>
+          <w:sz w:val="24"/>
+          <w:sz-cs w:val="24"/>
+          <w:spacing w:val="0"/>
+          <w:color w:val="181F26"/>
+        </w:rPr>
+        <w:t xml:space="preserve">session_mode = ephemeral</w:t>
+      </w:r>
+      <w:r>
+        <w:rPr>
+          <w:rFonts w:ascii="Helvetica Neue" w:hAnsi="Helvetica Neue" w:cs="Helvetica Neue"/>
+          <w:sz w:val="24"/>
+          <w:sz-cs w:val="24"/>
+          <w:spacing w:val="0"/>
+          <w:color w:val="181F26"/>
+        </w:rPr>
+        <w:t xml:space="preserve"> is supported, and </w:t>
+      </w:r>
+      <w:r>
+        <w:rPr>
+          <w:rFonts w:ascii="Menlo" w:hAnsi="Menlo" w:cs="Menlo"/>
+          <w:sz w:val="24"/>
+          <w:sz-cs w:val="24"/>
+          <w:spacing w:val="0"/>
+          <w:color w:val="181F26"/>
+        </w:rPr>
+        <w:t xml:space="preserve">workspace_policy = inherit | crawfish_managed</w:t>
+      </w:r>
+      <w:r>
+        <w:rPr>
+          <w:rFonts w:ascii="Helvetica Neue" w:hAnsi="Helvetica Neue" w:cs="Helvetica Neue"/>
+          <w:sz w:val="24"/>
+          <w:sz-cs w:val="24"/>
+          <w:spacing w:val="0"/>
+          <w:color w:val="181F26"/>
+        </w:rPr>
+        <w:t xml:space="preserve"> is supported</w:t>
+      </w:r>
+    </w:p>
+    <w:p>
+      <w:pPr>
         <w:spacing w:after="197"/>
       </w:pPr>
       <w:r>
@@ -39694,6 +40551,74 @@
     </w:p>
     <w:p>
       <w:pPr>
+        <w:ind w:left="720" w:first-line="-720"/>
+      </w:pPr>
+      <w:r>
+        <w:rPr>
+          <w:rFonts w:ascii="Helvetica Neue" w:hAnsi="Helvetica Neue" w:cs="Helvetica Neue"/>
+          <w:sz w:val="24"/>
+          <w:sz-cs w:val="24"/>
+          <w:color w:val="181F26"/>
+        </w:rPr>
+        <w:t xml:space="preserve"/>
+        <w:tab/>
+        <w:t xml:space="preserve">•</w:t>
+        <w:tab/>
+        <w:t xml:space="preserve"/>
+      </w:r>
+      <w:r>
+        <w:rPr>
+          <w:rFonts w:ascii="Helvetica Neue" w:hAnsi="Helvetica Neue" w:cs="Helvetica Neue"/>
+          <w:sz w:val="24"/>
+          <w:sz-cs w:val="24"/>
+          <w:spacing w:val="0"/>
+          <w:color w:val="181F26"/>
+        </w:rPr>
+        <w:t xml:space="preserve">Verify unsupported </w:t>
+      </w:r>
+      <w:r>
+        <w:rPr>
+          <w:rFonts w:ascii="Menlo" w:hAnsi="Menlo" w:cs="Menlo"/>
+          <w:sz w:val="24"/>
+          <w:sz-cs w:val="24"/>
+          <w:spacing w:val="0"/>
+          <w:color w:val="181F26"/>
+        </w:rPr>
+        <w:t xml:space="preserve">sticky</w:t>
+      </w:r>
+      <w:r>
+        <w:rPr>
+          <w:rFonts w:ascii="Helvetica Neue" w:hAnsi="Helvetica Neue" w:cs="Helvetica Neue"/>
+          <w:sz w:val="24"/>
+          <w:sz-cs w:val="24"/>
+          <w:spacing w:val="0"/>
+          <w:color w:val="181F26"/>
+        </w:rPr>
+        <w:t xml:space="preserve"> sessions and </w:t>
+      </w:r>
+      <w:r>
+        <w:rPr>
+          <w:rFonts w:ascii="Menlo" w:hAnsi="Menlo" w:cs="Menlo"/>
+          <w:sz w:val="24"/>
+          <w:sz-cs w:val="24"/>
+          <w:spacing w:val="0"/>
+          <w:color w:val="181F26"/>
+        </w:rPr>
+        <w:t xml:space="preserve">openclaw_managed</w:t>
+      </w:r>
+      <w:r>
+        <w:rPr>
+          <w:rFonts w:ascii="Helvetica Neue" w:hAnsi="Helvetica Neue" w:cs="Helvetica Neue"/>
+          <w:sz w:val="24"/>
+          <w:sz-cs w:val="24"/>
+          <w:spacing w:val="0"/>
+          <w:color w:val="181F26"/>
+        </w:rPr>
+        <w:t xml:space="preserve"> workspace mode fail before dispatch.</w:t>
+      </w:r>
+    </w:p>
+    <w:p>
+      <w:pPr>
         <w:spacing w:after="152"/>
       </w:pPr>
       <w:r>
@@ -39997,27 +40922,35 @@
           <w:spacing w:val="0"/>
           <w:color w:val="181F26"/>
         </w:rPr>
-        <w:t xml:space="preserve">Verify the runtime contracts into </w:t>
-      </w:r>
-      <w:r>
-        <w:rPr>
-          <w:rFonts w:ascii="Menlo" w:hAnsi="Menlo" w:cs="Menlo"/>
-          <w:sz w:val="24"/>
-          <w:sz-cs w:val="24"/>
-          <w:spacing w:val="0"/>
-          <w:color w:val="181F26"/>
-        </w:rPr>
-        <w:t xml:space="preserve">deterministic_only</w:t>
-      </w:r>
-      <w:r>
-        <w:rPr>
-          <w:rFonts w:ascii="Helvetica Neue" w:hAnsi="Helvetica Neue" w:cs="Helvetica Neue"/>
-          <w:sz w:val="24"/>
-          <w:sz-cs w:val="24"/>
-          <w:spacing w:val="0"/>
-          <w:color w:val="181F26"/>
-        </w:rPr>
-        <w:t xml:space="preserve">, </w:t>
+        <w:t xml:space="preserve">Verify the runtime falls back to deterministic planning when the contract fallback chain permits it.</w:t>
+      </w:r>
+    </w:p>
+    <w:p>
+      <w:pPr>
+        <w:ind w:left="720" w:first-line="-720"/>
+      </w:pPr>
+      <w:r>
+        <w:rPr>
+          <w:rFonts w:ascii="Helvetica Neue" w:hAnsi="Helvetica Neue" w:cs="Helvetica Neue"/>
+          <w:sz w:val="24"/>
+          <w:sz-cs w:val="24"/>
+          <w:color w:val="181F26"/>
+        </w:rPr>
+        <w:t xml:space="preserve"/>
+        <w:tab/>
+        <w:t xml:space="preserve">•</w:t>
+        <w:tab/>
+        <w:t xml:space="preserve"/>
+      </w:r>
+      <w:r>
+        <w:rPr>
+          <w:rFonts w:ascii="Helvetica Neue" w:hAnsi="Helvetica Neue" w:cs="Helvetica Neue"/>
+          <w:sz w:val="24"/>
+          <w:sz-cs w:val="24"/>
+          <w:spacing w:val="0"/>
+          <w:color w:val="181F26"/>
+        </w:rPr>
+        <w:t xml:space="preserve">Verify otherwise the runtime contracts into </w:t>
       </w:r>
       <w:r>
         <w:rPr>
@@ -40037,27 +40970,7 @@
           <w:spacing w:val="0"/>
           <w:color w:val="181F26"/>
         </w:rPr>
-        <w:t xml:space="preserve">, or </w:t>
-      </w:r>
-      <w:r>
-        <w:rPr>
-          <w:rFonts w:ascii="Menlo" w:hAnsi="Menlo" w:cs="Menlo"/>
-          <w:sz w:val="24"/>
-          <w:sz-cs w:val="24"/>
-          <w:spacing w:val="0"/>
-          <w:color w:val="181F26"/>
-        </w:rPr>
-        <w:t xml:space="preserve">human_handoff</w:t>
-      </w:r>
-      <w:r>
-        <w:rPr>
-          <w:rFonts w:ascii="Helvetica Neue" w:hAnsi="Helvetica Neue" w:cs="Helvetica Neue"/>
-          <w:sz w:val="24"/>
-          <w:sz-cs w:val="24"/>
-          <w:spacing w:val="0"/>
-          <w:color w:val="181F26"/>
-        </w:rPr>
-        <w:t xml:space="preserve"> according to policy.</w:t>
+        <w:t xml:space="preserve"> or another configured continuity mode.</w:t>
       </w:r>
     </w:p>
     <w:p>
@@ -40105,7 +41018,27 @@
           <w:spacing w:val="0"/>
           <w:color w:val="181F26"/>
         </w:rPr>
-        <w:t xml:space="preserve"> explains the trigger, current continuity mode, and restoration condition.</w:t>
+        <w:t xml:space="preserve"> and </w:t>
+      </w:r>
+      <w:r>
+        <w:rPr>
+          <w:rFonts w:ascii="Menlo" w:hAnsi="Menlo" w:cs="Menlo"/>
+          <w:sz w:val="24"/>
+          <w:sz-cs w:val="24"/>
+          <w:spacing w:val="0"/>
+          <w:color w:val="181F26"/>
+        </w:rPr>
+        <w:t xml:space="preserve">events</w:t>
+      </w:r>
+      <w:r>
+        <w:rPr>
+          <w:rFonts w:ascii="Helvetica Neue" w:hAnsi="Helvetica Neue" w:cs="Helvetica Neue"/>
+          <w:sz w:val="24"/>
+          <w:sz-cs w:val="24"/>
+          <w:spacing w:val="0"/>
+          <w:color w:val="181F26"/>
+        </w:rPr>
+        <w:t xml:space="preserve"> explain the trigger, current continuity behavior, and restoration condition.</w:t>
       </w:r>
     </w:p>
     <w:p>

</xml_diff>

<commit_message>
docs: reframe public language around swarm
</commit_message>
<xml_diff>
--- a/docs/exports/Crawfish-PRD.docx
+++ b/docs/exports/Crawfish-PRD.docx
@@ -1462,7 +1462,7 @@
           <w:spacing w:val="0"/>
           <w:color w:val="181F26"/>
         </w:rPr>
-        <w:t xml:space="preserve">, Crawfish is centered on operating agent fleets under policy and failure pressure, not only composing agent logic or durable control flow. Compared with </w:t>
+        <w:t xml:space="preserve">, Crawfish is centered on operating agent swarms under policy and failure pressure, not only composing agent logic or durable control flow. Compared with </w:t>
       </w:r>
       <w:r>
         <w:rPr>
@@ -2781,7 +2781,7 @@
           <w:spacing w:val="0"/>
           <w:color w:val="181F26"/>
         </w:rPr>
-        <w:t xml:space="preserve">The first public story is a small engineering and operations fleet running under one supervisor:</w:t>
+        <w:t xml:space="preserve">The first public story is a small engineering and operations swarm running under one supervisor:</w:t>
       </w:r>
     </w:p>
     <w:p>
@@ -3161,7 +3161,7 @@
           <w:spacing w:val="0"/>
           <w:color w:val="181F26"/>
         </w:rPr>
-        <w:t xml:space="preserve">The same demo should also prove a harder claim: if every external model route is unavailable, the fleet does not simply disappear. It keeps the control plane alive, continues deterministic work where possible, queues or hands off the rest, and makes the contraction explicit.</w:t>
+        <w:t xml:space="preserve">The same demo should also prove a harder claim: if every external model route is unavailable, the swarm does not simply disappear. It keeps the control plane alive, continues deterministic work where possible, queues or hands off the rest, and makes the contraction explicit.</w:t>
       </w:r>
     </w:p>
     <w:p>
@@ -3186,17 +3186,17 @@
           <w:spacing w:val="0"/>
           <w:color w:val="181F26"/>
         </w:rPr>
-        <w:t xml:space="preserve">coding.patch.plan</w:t>
-      </w:r>
-      <w:r>
-        <w:rPr>
-          <w:rFonts w:ascii="Helvetica Neue" w:hAnsi="Helvetica Neue" w:cs="Helvetica Neue"/>
-          <w:sz w:val="24"/>
-          <w:sz-cs w:val="24"/>
-          <w:spacing w:val="0"/>
-          <w:color w:val="181F26"/>
-        </w:rPr>
-        <w:t xml:space="preserve"> routes out through the OpenClaw Gateway agent loop and returns a proposal-only patch plan. Ralph-style verified coding loops remain a later milestone.</w:t>
+        <w:t xml:space="preserve">task.plan</w:t>
+      </w:r>
+      <w:r>
+        <w:rPr>
+          <w:rFonts w:ascii="Helvetica Neue" w:hAnsi="Helvetica Neue" w:cs="Helvetica Neue"/>
+          <w:sz w:val="24"/>
+          <w:sz-cs w:val="24"/>
+          <w:spacing w:val="0"/>
+          <w:color w:val="181F26"/>
+        </w:rPr>
+        <w:t xml:space="preserve"> routes out through the OpenClaw Gateway agent loop and returns a proposal-only task plan. Ralph-style verified execution loops remain a later milestone.</w:t>
       </w:r>
     </w:p>
     <w:p>
@@ -4025,7 +4025,7 @@
           <w:spacing w:val="0"/>
           <w:color w:val="0000E9"/>
         </w:rPr>
-        <w:t xml:space="preserve">examples/hero-fleet/Crawfish.toml</w:t>
+        <w:t xml:space="preserve">examples/hero-swarm/Crawfish.toml</w:t>
       </w:r>
       <w:r>
         <w:rPr>
@@ -4083,7 +4083,7 @@
           <w:spacing w:val="0"/>
           <w:color w:val="181F26"/>
         </w:rPr>
-        <w:t xml:space="preserve">coding.patch.plan</w:t>
+        <w:t xml:space="preserve">task.plan</w:t>
       </w:r>
       <w:r>
         <w:rPr>
@@ -4103,7 +4103,7 @@
           <w:spacing w:val="0"/>
           <w:color w:val="181F26"/>
         </w:rPr>
-        <w:t xml:space="preserve">coding_planner</w:t>
+        <w:t xml:space="preserve">task_planner</w:t>
       </w:r>
       <w:r>
         <w:rPr>
@@ -4151,7 +4151,7 @@
           <w:spacing w:val="0"/>
           <w:color w:val="181F26"/>
         </w:rPr>
-        <w:t xml:space="preserve">coding.patch.plan</w:t>
+        <w:t xml:space="preserve">task.plan</w:t>
       </w:r>
       <w:r>
         <w:rPr>
@@ -4637,47 +4637,27 @@
           <w:spacing w:val="0"/>
           <w:color w:val="181F26"/>
         </w:rPr>
-        <w:t xml:space="preserve">The next planned milestone after this </w:t>
-      </w:r>
-      <w:r>
-        <w:rPr>
-          <w:rFonts w:ascii="Menlo" w:hAnsi="Menlo" w:cs="Menlo"/>
-          <w:sz w:val="24"/>
-          <w:sz-cs w:val="24"/>
-          <w:spacing w:val="0"/>
-          <w:color w:val="181F26"/>
-        </w:rPr>
-        <w:t xml:space="preserve">P1b</w:t>
-      </w:r>
-      <w:r>
-        <w:rPr>
-          <w:rFonts w:ascii="Helvetica Neue" w:hAnsi="Helvetica Neue" w:cs="Helvetica Neue"/>
-          <w:sz w:val="24"/>
-          <w:sz-cs w:val="24"/>
-          <w:spacing w:val="0"/>
-          <w:color w:val="181F26"/>
-        </w:rPr>
-        <w:t xml:space="preserve"> outbound slice is </w:t>
-      </w:r>
-      <w:r>
-        <w:rPr>
-          <w:rFonts w:ascii="Menlo" w:hAnsi="Menlo" w:cs="Menlo"/>
-          <w:sz w:val="24"/>
-          <w:sz-cs w:val="24"/>
-          <w:spacing w:val="0"/>
-          <w:color w:val="181F26"/>
-        </w:rPr>
-        <w:t xml:space="preserve">P1c</w:t>
-      </w:r>
-      <w:r>
-        <w:rPr>
-          <w:rFonts w:ascii="Helvetica Neue" w:hAnsi="Helvetica Neue" w:cs="Helvetica Neue"/>
-          <w:sz w:val="24"/>
-          <w:sz-cs w:val="24"/>
-          <w:spacing w:val="0"/>
-          <w:color w:val="181F26"/>
-        </w:rPr>
-        <w:t xml:space="preserve"> runtime verification for coding-heavy actions, starting with Ralph-style verify-loop support on top of the existing OpenClaw route.</w:t>
+        <w:t xml:space="preserve">The next planned milestone after this scope-corrected outbound slice is </w:t>
+      </w:r>
+      <w:r>
+        <w:rPr>
+          <w:rFonts w:ascii="Menlo" w:hAnsi="Menlo" w:cs="Menlo"/>
+          <w:sz w:val="24"/>
+          <w:sz-cs w:val="24"/>
+          <w:spacing w:val="0"/>
+          <w:color w:val="181F26"/>
+        </w:rPr>
+        <w:t xml:space="preserve">P1d</w:t>
+      </w:r>
+      <w:r>
+        <w:rPr>
+          <w:rFonts w:ascii="Helvetica Neue" w:hAnsi="Helvetica Neue" w:cs="Helvetica Neue"/>
+          <w:sz w:val="24"/>
+          <w:sz-cs w:val="24"/>
+          <w:spacing w:val="0"/>
+          <w:color w:val="181F26"/>
+        </w:rPr>
+        <w:t xml:space="preserve"> verified execution strategies, starting with Ralph-style verify-loop support as one optional strategy on top of the existing OpenClaw route.</w:t>
       </w:r>
     </w:p>
     <w:p>
@@ -5490,7 +5470,7 @@
           <w:spacing w:val="0"/>
           <w:color w:val="0000E9"/>
         </w:rPr>
-        <w:t xml:space="preserve">examples/hero-fleet/Crawfish.toml</w:t>
+        <w:t xml:space="preserve">examples/hero-swarm/Crawfish.toml</w:t>
       </w:r>
       <w:r>
         <w:rPr>
@@ -5511,17 +5491,17 @@
           <w:spacing w:val="0"/>
           <w:color w:val="0000E9"/>
         </w:rPr>
-        <w:t xml:space="preserve">examples/hero-fleet/agents/</w:t>
-      </w:r>
-      <w:r>
-        <w:rPr>
-          <w:rFonts w:ascii="Helvetica Neue" w:hAnsi="Helvetica Neue" w:cs="Helvetica Neue"/>
-          <w:sz w:val="24"/>
-          <w:sz-cs w:val="24"/>
-          <w:spacing w:val="0"/>
-          <w:color w:val="181F26"/>
-        </w:rPr>
-        <w:t xml:space="preserve">. For a repeatable local demo that exercises review, incident enrichment, approval-gated mutation, and operator event inspection, run </w:t>
+        <w:t xml:space="preserve">examples/hero-swarm/agents/</w:t>
+      </w:r>
+      <w:r>
+        <w:rPr>
+          <w:rFonts w:ascii="Helvetica Neue" w:hAnsi="Helvetica Neue" w:cs="Helvetica Neue"/>
+          <w:sz w:val="24"/>
+          <w:sz-cs w:val="24"/>
+          <w:spacing w:val="0"/>
+          <w:color w:val="181F26"/>
+        </w:rPr>
+        <w:t xml:space="preserve">. For a repeatable local demo that exercises review, incident enrichment, approval-gated mutation, operator event inspection, and OpenClaw task planning, run </w:t>
       </w:r>
       <w:r>
         <w:rPr>
@@ -5532,7 +5512,7 @@
           <w:spacing w:val="0"/>
           <w:color w:val="0000E9"/>
         </w:rPr>
-        <w:t xml:space="preserve">examples/hero-fleet/demo.sh</w:t>
+        <w:t xml:space="preserve">examples/hero-swarm/demo.sh</w:t>
       </w:r>
       <w:r>
         <w:rPr>
@@ -6626,7 +6606,7 @@
           <w:spacing w:val="0"/>
           <w:color w:val="181F26"/>
         </w:rPr>
-        <w:t xml:space="preserve"> OpenClaw Gateway and ACP-compatible harnesses for specialized execution surfaces, especially coding agents.</w:t>
+        <w:t xml:space="preserve"> OpenClaw Gateway and ACP-compatible harnesses for specialized execution surfaces, including planning, research, operations, investigation, and coding agents.</w:t>
       </w:r>
     </w:p>
     <w:p>
@@ -7465,7 +7445,7 @@
           <w:spacing w:val="0"/>
           <w:color w:val="181F26"/>
         </w:rPr>
-        <w:t xml:space="preserve">how should a harness failure affect other agents in the fleet</w:t>
+        <w:t xml:space="preserve">how should a harness failure affect other agents in the swarm</w:t>
       </w:r>
     </w:p>
     <w:p>
@@ -7875,7 +7855,7 @@
           <w:spacing w:val="0"/>
           <w:color w:val="181F26"/>
         </w:rPr>
-        <w:t xml:space="preserve">fleet-wide policy and dependency semantics across many execution surfaces</w:t>
+        <w:t xml:space="preserve">swarm-wide policy and dependency semantics across many execution surfaces</w:t>
       </w:r>
     </w:p>
     <w:p>
@@ -7918,35 +7898,35 @@
           <w:spacing w:val="0"/>
           <w:color w:val="181F26"/>
         </w:rPr>
-        <w:t xml:space="preserve">OpenClaw can call Crawfish when a session needs durable, policy-bound fleet work.</w:t>
-      </w:r>
-    </w:p>
-    <w:p>
-      <w:pPr>
-        <w:ind w:left="720" w:first-line="-720"/>
-      </w:pPr>
-      <w:r>
-        <w:rPr>
-          <w:rFonts w:ascii="Helvetica Neue" w:hAnsi="Helvetica Neue" w:cs="Helvetica Neue"/>
-          <w:sz w:val="24"/>
-          <w:sz-cs w:val="24"/>
-          <w:color w:val="181F26"/>
-        </w:rPr>
-        <w:t xml:space="preserve"/>
-        <w:tab/>
-        <w:t xml:space="preserve">•</w:t>
-        <w:tab/>
-        <w:t xml:space="preserve"/>
-      </w:r>
-      <w:r>
-        <w:rPr>
-          <w:rFonts w:ascii="Helvetica Neue" w:hAnsi="Helvetica Neue" w:cs="Helvetica Neue"/>
-          <w:sz w:val="24"/>
-          <w:sz-cs w:val="24"/>
-          <w:spacing w:val="0"/>
-          <w:color w:val="181F26"/>
-        </w:rPr>
-        <w:t xml:space="preserve">Crawfish can call OpenClaw when an action needs an interactive coding loop or gateway-native agent surface.</w:t>
+        <w:t xml:space="preserve">OpenClaw can call Crawfish when a session needs durable, policy-bound swarm work.</w:t>
+      </w:r>
+    </w:p>
+    <w:p>
+      <w:pPr>
+        <w:ind w:left="720" w:first-line="-720"/>
+      </w:pPr>
+      <w:r>
+        <w:rPr>
+          <w:rFonts w:ascii="Helvetica Neue" w:hAnsi="Helvetica Neue" w:cs="Helvetica Neue"/>
+          <w:sz w:val="24"/>
+          <w:sz-cs w:val="24"/>
+          <w:color w:val="181F26"/>
+        </w:rPr>
+        <w:t xml:space="preserve"/>
+        <w:tab/>
+        <w:t xml:space="preserve">•</w:t>
+        <w:tab/>
+        <w:t xml:space="preserve"/>
+      </w:r>
+      <w:r>
+        <w:rPr>
+          <w:rFonts w:ascii="Helvetica Neue" w:hAnsi="Helvetica Neue" w:cs="Helvetica Neue"/>
+          <w:sz w:val="24"/>
+          <w:sz-cs w:val="24"/>
+          <w:spacing w:val="0"/>
+          <w:color w:val="181F26"/>
+        </w:rPr>
+        <w:t xml:space="preserve">Crawfish can call OpenClaw when an action needs a specialized interactive or gateway-native agent surface.</w:t>
       </w:r>
     </w:p>
     <w:p>
@@ -9820,7 +9800,7 @@
           <w:spacing w:val="0"/>
           <w:color w:val="181F26"/>
         </w:rPr>
-        <w:t xml:space="preserve">usually request-scoped, thin on lifecycle, budgets, health, and fleet operations</w:t>
+        <w:t xml:space="preserve">usually request-scoped, thin on lifecycle, budgets, health, and swarm operations</w:t>
       </w:r>
     </w:p>
     <w:p>
@@ -10028,7 +10008,7 @@
           <w:spacing w:val="0"/>
           <w:color w:val="181F26"/>
         </w:rPr>
-        <w:t xml:space="preserve">do not by themselves define lifecycle-managed fleet semantics, contract compilation, deterministic continuity, or repair policy</w:t>
+        <w:t xml:space="preserve">do not by themselves define lifecycle-managed swarm semantics, contract compilation, deterministic continuity, or repair policy</w:t>
       </w:r>
     </w:p>
     <w:p>
@@ -10216,7 +10196,7 @@
           <w:spacing w:val="0"/>
           <w:color w:val="181F26"/>
         </w:rPr>
-        <w:t xml:space="preserve">desired-state supervision, degradation profiles, policy compiler, fleet inspection, admission control</w:t>
+        <w:t xml:space="preserve">desired-state supervision, degradation profiles, policy compiler, swarm inspection, admission control</w:t>
       </w:r>
     </w:p>
     <w:p>
@@ -10366,7 +10346,7 @@
           <w:spacing w:val="0"/>
           <w:color w:val="181F26"/>
         </w:rPr>
-        <w:t xml:space="preserve">fleet lifecycle, continuity semantics, deterministic fallback, repair loops, and cross-surface contract enforcement</w:t>
+        <w:t xml:space="preserve">swarm lifecycle, continuity semantics, deterministic fallback, repair loops, and cross-surface contract enforcement</w:t>
       </w:r>
     </w:p>
     <w:p>
@@ -10477,7 +10457,7 @@
           <w:spacing w:val="0"/>
           <w:color w:val="181F26"/>
         </w:rPr>
-        <w:t xml:space="preserve">: both are valuable agent-building frameworks, but neither is primarily a lifecycle-managed control plane for multi-agent fleet operations.</w:t>
+        <w:t xml:space="preserve">: both are valuable agent-building frameworks, but neither is primarily a lifecycle-managed control plane for multi-agent swarm operations.</w:t>
       </w:r>
     </w:p>
     <w:p>
@@ -10534,7 +10514,7 @@
           <w:spacing w:val="0"/>
           <w:color w:val="181F26"/>
         </w:rPr>
-        <w:t xml:space="preserve"> create a standard way for clients to talk to coding agents and other harnesses. </w:t>
+        <w:t xml:space="preserve"> create a standard way for clients to talk to specialized agents and other harnesses. </w:t>
       </w:r>
       <w:r>
         <w:rPr>
@@ -10555,7 +10535,7 @@
           <w:spacing w:val="0"/>
           <w:color w:val="181F26"/>
         </w:rPr>
-        <w:t xml:space="preserve"> create another practical integration surface for interactive agent loops. Those are valuable, but they still do not answer which harness should run, under which policy, with which fallback, or how its failure should affect the rest of a fleet. Crawfish exists above that layer.</w:t>
+        <w:t xml:space="preserve"> create another practical integration surface for interactive agent loops. Those are valuable, but they still do not answer which harness should run, under which policy, with which fallback, or how its failure should affect the rest of a swarm. Crawfish exists above that layer.</w:t>
       </w:r>
     </w:p>
     <w:p>
@@ -10866,7 +10846,7 @@
           <w:spacing w:val="0"/>
           <w:color w:val="181F26"/>
         </w:rPr>
-        <w:t xml:space="preserve">The first public story should be a small engineering and operations fleet:</w:t>
+        <w:t xml:space="preserve">The first public story should be a small engineering and operations swarm:</w:t>
       </w:r>
     </w:p>
     <w:p>
@@ -11216,27 +11196,27 @@
           <w:spacing w:val="0"/>
           <w:color w:val="181F26"/>
         </w:rPr>
-        <w:t xml:space="preserve">coding-heavy actions such as </w:t>
-      </w:r>
-      <w:r>
-        <w:rPr>
-          <w:rFonts w:ascii="Menlo" w:hAnsi="Menlo" w:cs="Menlo"/>
-          <w:sz w:val="24"/>
-          <w:sz-cs w:val="24"/>
-          <w:spacing w:val="0"/>
-          <w:color w:val="181F26"/>
-        </w:rPr>
-        <w:t xml:space="preserve">coding.patch.plan</w:t>
-      </w:r>
-      <w:r>
-        <w:rPr>
-          <w:rFonts w:ascii="Helvetica Neue" w:hAnsi="Helvetica Neue" w:cs="Helvetica Neue"/>
-          <w:sz w:val="24"/>
-          <w:sz-cs w:val="24"/>
-          <w:spacing w:val="0"/>
-          <w:color w:val="181F26"/>
-        </w:rPr>
-        <w:t xml:space="preserve"> can route out to OpenClaw or another harness and run under a Ralph-style verify loop</w:t>
+        <w:t xml:space="preserve">proposal-only actions such as </w:t>
+      </w:r>
+      <w:r>
+        <w:rPr>
+          <w:rFonts w:ascii="Menlo" w:hAnsi="Menlo" w:cs="Menlo"/>
+          <w:sz w:val="24"/>
+          <w:sz-cs w:val="24"/>
+          <w:spacing w:val="0"/>
+          <w:color w:val="181F26"/>
+        </w:rPr>
+        <w:t xml:space="preserve">task.plan</w:t>
+      </w:r>
+      <w:r>
+        <w:rPr>
+          <w:rFonts w:ascii="Helvetica Neue" w:hAnsi="Helvetica Neue" w:cs="Helvetica Neue"/>
+          <w:sz w:val="24"/>
+          <w:sz-cs w:val="24"/>
+          <w:spacing w:val="0"/>
+          <w:color w:val="181F26"/>
+        </w:rPr>
+        <w:t xml:space="preserve"> can route out to OpenClaw or another harness and later run under a Ralph-style verify loop when verification is required</w:t>
       </w:r>
     </w:p>
     <w:p>
@@ -11420,7 +11400,7 @@
           <w:spacing w:val="0"/>
           <w:color w:val="181F26"/>
         </w:rPr>
-        <w:t xml:space="preserve">Prefer verified loops over unverifiable success claims for coding-heavy work.</w:t>
+        <w:t xml:space="preserve">Prefer verified loops over unverifiable success claims for verification-sensitive work.</w:t>
       </w:r>
     </w:p>
     <w:p>
@@ -12517,35 +12497,35 @@
           <w:spacing w:val="0"/>
           <w:color w:val="181F26"/>
         </w:rPr>
-        <w:t xml:space="preserve"> for coding-heavy actions</w:t>
-      </w:r>
-    </w:p>
-    <w:p>
-      <w:pPr>
-        <w:ind w:left="720" w:first-line="-720"/>
-      </w:pPr>
-      <w:r>
-        <w:rPr>
-          <w:rFonts w:ascii="Helvetica Neue" w:hAnsi="Helvetica Neue" w:cs="Helvetica Neue"/>
-          <w:sz w:val="24"/>
-          <w:sz-cs w:val="24"/>
-          <w:color w:val="181F26"/>
-        </w:rPr>
-        <w:t xml:space="preserve"/>
-        <w:tab/>
-        <w:t xml:space="preserve">•</w:t>
-        <w:tab/>
-        <w:t xml:space="preserve"/>
-      </w:r>
-      <w:r>
-        <w:rPr>
-          <w:rFonts w:ascii="Helvetica Neue" w:hAnsi="Helvetica Neue" w:cs="Helvetica Neue"/>
-          <w:sz w:val="24"/>
-          <w:sz-cs w:val="24"/>
-          <w:spacing w:val="0"/>
-          <w:color w:val="181F26"/>
-        </w:rPr>
-        <w:t xml:space="preserve">lifecycle, contract, repair, continuity, and fleet supervision remain runtime concerns</w:t>
+        <w:t xml:space="preserve"> for verification-sensitive actions</w:t>
+      </w:r>
+    </w:p>
+    <w:p>
+      <w:pPr>
+        <w:ind w:left="720" w:first-line="-720"/>
+      </w:pPr>
+      <w:r>
+        <w:rPr>
+          <w:rFonts w:ascii="Helvetica Neue" w:hAnsi="Helvetica Neue" w:cs="Helvetica Neue"/>
+          <w:sz w:val="24"/>
+          <w:sz-cs w:val="24"/>
+          <w:color w:val="181F26"/>
+        </w:rPr>
+        <w:t xml:space="preserve"/>
+        <w:tab/>
+        <w:t xml:space="preserve">•</w:t>
+        <w:tab/>
+        <w:t xml:space="preserve"/>
+      </w:r>
+      <w:r>
+        <w:rPr>
+          <w:rFonts w:ascii="Helvetica Neue" w:hAnsi="Helvetica Neue" w:cs="Helvetica Neue"/>
+          <w:sz w:val="24"/>
+          <w:sz-cs w:val="24"/>
+          <w:spacing w:val="0"/>
+          <w:color w:val="181F26"/>
+        </w:rPr>
+        <w:t xml:space="preserve">lifecycle, contract, repair, continuity, and swarm supervision remain runtime concerns</w:t>
       </w:r>
     </w:p>
     <w:p>
@@ -13167,7 +13147,7 @@
           <w:spacing w:val="0"/>
           <w:color w:val="181F26"/>
         </w:rPr>
-        <w:t xml:space="preserve">verified coding completion rate</w:t>
+        <w:t xml:space="preserve">verified execution completion rate</w:t>
       </w:r>
     </w:p>
     <w:p>
@@ -13219,7 +13199,7 @@
           <w:spacing w:val="0"/>
           <w:color w:val="181F26"/>
         </w:rPr>
-        <w:t xml:space="preserve">measures whether specialized harnesses can fail without collapsing the fleet</w:t>
+        <w:t xml:space="preserve">measures whether specialized harnesses can fail without collapsing the swarm</w:t>
       </w:r>
     </w:p>
     <w:p>
@@ -20007,7 +19987,7 @@
           <w:spacing w:val="0"/>
           <w:color w:val="181F26"/>
         </w:rPr>
-        <w:t xml:space="preserve">action or fleet approaches spend threshold</w:t>
+        <w:t xml:space="preserve">action or swarm approaches spend threshold</w:t>
       </w:r>
     </w:p>
     <w:p>
@@ -24093,7 +24073,7 @@
           <w:spacing w:val="0"/>
           <w:color w:val="181F26"/>
         </w:rPr>
-        <w:t xml:space="preserve"> is mandatory for the documented coding-heavy capability classes unless a higher-level hard policy blocks that action entirely</w:t>
+        <w:t xml:space="preserve"> is mandatory for the documented verification-sensitive capability classes unless a higher-level hard policy blocks that action entirely</w:t>
       </w:r>
     </w:p>
     <w:p>
@@ -26856,7 +26836,7 @@
           <w:spacing w:val="0"/>
           <w:color w:val="181F26"/>
         </w:rPr>
-        <w:t xml:space="preserve">invoke specialized execution harnesses such as coding agents</w:t>
+        <w:t xml:space="preserve">invoke specialized execution harnesses for planning, research, operations, investigation, or coding</w:t>
       </w:r>
     </w:p>
     <w:p>
@@ -26910,7 +26890,7 @@
           <w:spacing w:val="0"/>
           <w:color w:val="181F26"/>
         </w:rPr>
-        <w:t xml:space="preserve">The harness plane matters because a specialized coding harness is neither just a tool nor just a remote agent. It has richer session semantics, permission prompts, workspace expectations, and cancellation behavior. Crawfish should treat that difference explicitly. See </w:t>
+        <w:t xml:space="preserve">The harness plane matters because a specialized agent harness is neither just a tool nor just a remote agent. It has richer session semantics, permission prompts, workspace expectations, and cancellation behavior. Crawfish should treat that difference explicitly. See </w:t>
       </w:r>
       <w:r>
         <w:rPr>
@@ -28090,7 +28070,7 @@
           <w:spacing w:val="0"/>
           <w:color w:val="181F26"/>
         </w:rPr>
-        <w:t xml:space="preserve">coding.patch.plan</w:t>
+        <w:t xml:space="preserve">task.plan</w:t>
       </w:r>
       <w:r>
         <w:rPr>
@@ -28302,7 +28282,7 @@
           <w:spacing w:val="0"/>
           <w:color w:val="181F26"/>
         </w:rPr>
-        <w:t xml:space="preserve">Execution strategy is orthogonal to adapter choice. A coding action might run through OpenClaw, an ACP-compatible harness, or a local executor and still choose either a single pass or a verify loop.</w:t>
+        <w:t xml:space="preserve">Execution strategy is orthogonal to adapter choice. A task might run through OpenClaw, an ACP-compatible harness, or a local executor and still choose either a single pass or a verify loop.</w:t>
       </w:r>
     </w:p>
     <w:p>
@@ -28598,45 +28578,45 @@
           <w:spacing w:val="0"/>
           <w:color w:val="181F26"/>
         </w:rPr>
-        <w:t xml:space="preserve">coding.patch.plan</w:t>
-      </w:r>
-      <w:r>
-        <w:rPr>
-          <w:rFonts w:ascii="Helvetica Neue" w:hAnsi="Helvetica Neue" w:cs="Helvetica Neue"/>
-          <w:sz w:val="24"/>
-          <w:sz-cs w:val="24"/>
-          <w:spacing w:val="0"/>
-          <w:color w:val="181F26"/>
-        </w:rPr>
-        <w:t xml:space="preserve"/>
-      </w:r>
-    </w:p>
-    <w:p>
-      <w:pPr>
-        <w:ind w:left="720" w:first-line="-720"/>
-      </w:pPr>
-      <w:r>
-        <w:rPr>
-          <w:rFonts w:ascii="Menlo" w:hAnsi="Menlo" w:cs="Menlo"/>
-          <w:sz w:val="24"/>
-          <w:sz-cs w:val="24"/>
-          <w:color w:val="181F26"/>
-        </w:rPr>
-        <w:t xml:space="preserve"/>
-        <w:tab/>
-        <w:t xml:space="preserve">•</w:t>
-        <w:tab/>
-        <w:t xml:space="preserve"/>
-      </w:r>
-      <w:r>
-        <w:rPr>
-          <w:rFonts w:ascii="Menlo" w:hAnsi="Menlo" w:cs="Menlo"/>
-          <w:sz w:val="24"/>
-          <w:sz-cs w:val="24"/>
-          <w:spacing w:val="0"/>
-          <w:color w:val="181F26"/>
-        </w:rPr>
-        <w:t xml:space="preserve">coding.patch.apply</w:t>
+        <w:t xml:space="preserve">task.plan</w:t>
+      </w:r>
+      <w:r>
+        <w:rPr>
+          <w:rFonts w:ascii="Helvetica Neue" w:hAnsi="Helvetica Neue" w:cs="Helvetica Neue"/>
+          <w:sz w:val="24"/>
+          <w:sz-cs w:val="24"/>
+          <w:spacing w:val="0"/>
+          <w:color w:val="181F26"/>
+        </w:rPr>
+        <w:t xml:space="preserve"/>
+      </w:r>
+    </w:p>
+    <w:p>
+      <w:pPr>
+        <w:ind w:left="720" w:first-line="-720"/>
+      </w:pPr>
+      <w:r>
+        <w:rPr>
+          <w:rFonts w:ascii="Menlo" w:hAnsi="Menlo" w:cs="Menlo"/>
+          <w:sz w:val="24"/>
+          <w:sz-cs w:val="24"/>
+          <w:color w:val="181F26"/>
+        </w:rPr>
+        <w:t xml:space="preserve"/>
+        <w:tab/>
+        <w:t xml:space="preserve">•</w:t>
+        <w:tab/>
+        <w:t xml:space="preserve"/>
+      </w:r>
+      <w:r>
+        <w:rPr>
+          <w:rFonts w:ascii="Menlo" w:hAnsi="Menlo" w:cs="Menlo"/>
+          <w:sz w:val="24"/>
+          <w:sz-cs w:val="24"/>
+          <w:spacing w:val="0"/>
+          <w:color w:val="181F26"/>
+        </w:rPr>
+        <w:t xml:space="preserve">workspace.patch.apply</w:t>
       </w:r>
       <w:r>
         <w:rPr>
@@ -29152,7 +29132,7 @@
           <w:spacing w:val="0"/>
           <w:color w:val="181F26"/>
         </w:rPr>
-        <w:t xml:space="preserve">For the hero fleet, the minimum deterministic continuity set should look like this:</w:t>
+        <w:t xml:space="preserve">For the hero swarm, the minimum deterministic continuity set should look like this:</w:t>
       </w:r>
     </w:p>
     <w:p>
@@ -33349,7 +33329,7 @@
           <w:spacing w:val="0"/>
           <w:color w:val="181F26"/>
         </w:rPr>
-        <w:t xml:space="preserve">The alpha must do this through one consistent public story: the engineering and operations fleet made up of </w:t>
+        <w:t xml:space="preserve">The alpha must do this through one consistent public story: the engineering and operations swarm made up of </w:t>
       </w:r>
       <w:r>
         <w:rPr>
@@ -33429,6 +33409,26 @@
           <w:spacing w:val="0"/>
           <w:color w:val="181F26"/>
         </w:rPr>
+        <w:t xml:space="preserve">, </w:t>
+      </w:r>
+      <w:r>
+        <w:rPr>
+          <w:rFonts w:ascii="Menlo" w:hAnsi="Menlo" w:cs="Menlo"/>
+          <w:sz w:val="24"/>
+          <w:sz-cs w:val="24"/>
+          <w:spacing w:val="0"/>
+          <w:color w:val="181F26"/>
+        </w:rPr>
+        <w:t xml:space="preserve">incident_enricher</w:t>
+      </w:r>
+      <w:r>
+        <w:rPr>
+          <w:rFonts w:ascii="Helvetica Neue" w:hAnsi="Helvetica Neue" w:cs="Helvetica Neue"/>
+          <w:sz w:val="24"/>
+          <w:sz-cs w:val="24"/>
+          <w:spacing w:val="0"/>
+          <w:color w:val="181F26"/>
+        </w:rPr>
         <w:t xml:space="preserve">, and </w:t>
       </w:r>
       <w:r>
@@ -33439,7 +33439,7 @@
           <w:spacing w:val="0"/>
           <w:color w:val="181F26"/>
         </w:rPr>
-        <w:t xml:space="preserve">incident_enricher</w:t>
+        <w:t xml:space="preserve">task_planner</w:t>
       </w:r>
       <w:r>
         <w:rPr>
@@ -34852,7 +34852,7 @@
           <w:spacing w:val="0"/>
           <w:color w:val="181F26"/>
         </w:rPr>
-        <w:t xml:space="preserve"> execution for the hero fleet</w:t>
+        <w:t xml:space="preserve"> execution for the hero swarm</w:t>
       </w:r>
     </w:p>
     <w:p>
@@ -34946,7 +34946,7 @@
           <w:spacing w:val="0"/>
           <w:color w:val="181F26"/>
         </w:rPr>
-        <w:t xml:space="preserve">examples/hero-fleet/demo.sh</w:t>
+        <w:t xml:space="preserve">examples/hero-swarm/demo.sh</w:t>
       </w:r>
       <w:r>
         <w:rPr>
@@ -35004,17 +35004,17 @@
           <w:spacing w:val="0"/>
           <w:color w:val="181F26"/>
         </w:rPr>
-        <w:t xml:space="preserve">; the next planned milestone is </w:t>
-      </w:r>
-      <w:r>
-        <w:rPr>
-          <w:rFonts w:ascii="Menlo" w:hAnsi="Menlo" w:cs="Menlo"/>
-          <w:sz w:val="24"/>
-          <w:sz-cs w:val="24"/>
-          <w:spacing w:val="0"/>
-          <w:color w:val="181F26"/>
-        </w:rPr>
-        <w:t xml:space="preserve">P1b OpenClaw outbound</w:t>
+        <w:t xml:space="preserve">; the next planned milestone after this scope correction is </w:t>
+      </w:r>
+      <w:r>
+        <w:rPr>
+          <w:rFonts w:ascii="Menlo" w:hAnsi="Menlo" w:cs="Menlo"/>
+          <w:sz w:val="24"/>
+          <w:sz-cs w:val="24"/>
+          <w:spacing w:val="0"/>
+          <w:color w:val="181F26"/>
+        </w:rPr>
+        <w:t xml:space="preserve">P1d Verified Execution Strategies</w:t>
       </w:r>
       <w:r>
         <w:rPr>
@@ -35402,7 +35402,7 @@
           <w:spacing w:val="0"/>
           <w:color w:val="181F26"/>
         </w:rPr>
-        <w:t xml:space="preserve">coding.patch.plan</w:t>
+        <w:t xml:space="preserve">task.plan</w:t>
       </w:r>
       <w:r>
         <w:rPr>
@@ -35422,7 +35422,7 @@
           <w:spacing w:val="0"/>
           <w:color w:val="181F26"/>
         </w:rPr>
-        <w:t xml:space="preserve">coding_planner</w:t>
+        <w:t xml:space="preserve">task_planner</w:t>
       </w:r>
       <w:r>
         <w:rPr>
@@ -36102,35 +36102,35 @@
           <w:spacing w:val="0"/>
           <w:color w:val="181F26"/>
         </w:rPr>
-        <w:t xml:space="preserve">Ralph-style verify loop for coding-heavy capability classes</w:t>
-      </w:r>
-    </w:p>
-    <w:p>
-      <w:pPr>
-        <w:ind w:left="720" w:first-line="-720"/>
-      </w:pPr>
-      <w:r>
-        <w:rPr>
-          <w:rFonts w:ascii="Helvetica Neue" w:hAnsi="Helvetica Neue" w:cs="Helvetica Neue"/>
-          <w:sz w:val="24"/>
-          <w:sz-cs w:val="24"/>
-          <w:color w:val="181F26"/>
-        </w:rPr>
-        <w:t xml:space="preserve"/>
-        <w:tab/>
-        <w:t xml:space="preserve">•</w:t>
-        <w:tab/>
-        <w:t xml:space="preserve"/>
-      </w:r>
-      <w:r>
-        <w:rPr>
-          <w:rFonts w:ascii="Helvetica Neue" w:hAnsi="Helvetica Neue" w:cs="Helvetica Neue"/>
-          <w:sz w:val="24"/>
-          <w:sz-cs w:val="24"/>
-          <w:spacing w:val="0"/>
-          <w:color w:val="181F26"/>
-        </w:rPr>
-        <w:t xml:space="preserve">deterministic verifiers for coding actions</w:t>
+        <w:t xml:space="preserve">Ralph-style verify loop for verification-sensitive capability classes</w:t>
+      </w:r>
+    </w:p>
+    <w:p>
+      <w:pPr>
+        <w:ind w:left="720" w:first-line="-720"/>
+      </w:pPr>
+      <w:r>
+        <w:rPr>
+          <w:rFonts w:ascii="Helvetica Neue" w:hAnsi="Helvetica Neue" w:cs="Helvetica Neue"/>
+          <w:sz w:val="24"/>
+          <w:sz-cs w:val="24"/>
+          <w:color w:val="181F26"/>
+        </w:rPr>
+        <w:t xml:space="preserve"/>
+        <w:tab/>
+        <w:t xml:space="preserve">•</w:t>
+        <w:tab/>
+        <w:t xml:space="preserve"/>
+      </w:r>
+      <w:r>
+        <w:rPr>
+          <w:rFonts w:ascii="Helvetica Neue" w:hAnsi="Helvetica Neue" w:cs="Helvetica Neue"/>
+          <w:sz w:val="24"/>
+          <w:sz-cs w:val="24"/>
+          <w:spacing w:val="0"/>
+          <w:color w:val="181F26"/>
+        </w:rPr>
+        <w:t xml:space="preserve">deterministic verifiers for proposal, investigation, and mutation-heavy actions</w:t>
       </w:r>
     </w:p>
     <w:p>
@@ -36270,7 +36270,7 @@
           <w:spacing w:val="0"/>
           <w:color w:val="181F26"/>
         </w:rPr>
-        <w:t xml:space="preserve">visual fleet dashboard</w:t>
+        <w:t xml:space="preserve">visual swarm dashboard</w:t>
       </w:r>
     </w:p>
     <w:p>
@@ -36809,7 +36809,7 @@
           <w:spacing w:val="0"/>
           <w:color w:val="181F26"/>
         </w:rPr>
-        <w:t xml:space="preserve">The alpha demo must use the same fleet across docs and demos:</w:t>
+        <w:t xml:space="preserve">The alpha demo must use the same swarm across docs and demos:</w:t>
       </w:r>
     </w:p>
     <w:p>
@@ -36990,6 +36990,44 @@
           <w:color w:val="181F26"/>
         </w:rPr>
         <w:t xml:space="preserve">incident_enricher</w:t>
+      </w:r>
+      <w:r>
+        <w:rPr>
+          <w:rFonts w:ascii="Helvetica Neue" w:hAnsi="Helvetica Neue" w:cs="Helvetica Neue"/>
+          <w:sz w:val="24"/>
+          <w:sz-cs w:val="24"/>
+          <w:spacing w:val="0"/>
+          <w:color w:val="181F26"/>
+        </w:rPr>
+        <w:t xml:space="preserve"/>
+      </w:r>
+    </w:p>
+    <w:p>
+      <w:pPr>
+        <w:ind w:left="720" w:first-line="-720"/>
+      </w:pPr>
+      <w:r>
+        <w:rPr>
+          <w:rFonts w:ascii="Menlo" w:hAnsi="Menlo" w:cs="Menlo"/>
+          <w:sz w:val="24"/>
+          <w:sz-cs w:val="24"/>
+          <w:color w:val="181F26"/>
+        </w:rPr>
+        <w:t xml:space="preserve"/>
+        <w:tab/>
+        <w:t xml:space="preserve">•</w:t>
+        <w:tab/>
+        <w:t xml:space="preserve"/>
+      </w:r>
+      <w:r>
+        <w:rPr>
+          <w:rFonts w:ascii="Menlo" w:hAnsi="Menlo" w:cs="Menlo"/>
+          <w:sz w:val="24"/>
+          <w:sz-cs w:val="24"/>
+          <w:spacing w:val="0"/>
+          <w:color w:val="181F26"/>
+        </w:rPr>
+        <w:t xml:space="preserve">task_planner</w:t>
       </w:r>
       <w:r>
         <w:rPr>
@@ -37043,7 +37081,7 @@
           <w:spacing w:val="0"/>
           <w:color w:val="181F26"/>
         </w:rPr>
-        <w:t xml:space="preserve">The supervisor boots the fleet in dependency order.</w:t>
+        <w:t xml:space="preserve">The supervisor boots the swarm in dependency order.</w:t>
       </w:r>
     </w:p>
     <w:p>
@@ -37261,7 +37299,7 @@
           <w:spacing w:val="0"/>
           <w:color w:val="181F26"/>
         </w:rPr>
-        <w:t xml:space="preserve">A total external model outage contracts the fleet into deterministic continuity or store-and-forward behavior instead of opaque failure.</w:t>
+        <w:t xml:space="preserve">A total external model outage contracts the swarm into deterministic continuity or store-and-forward behavior instead of opaque failure.</w:t>
       </w:r>
     </w:p>
     <w:p>
@@ -37332,35 +37370,55 @@
           <w:spacing w:val="0"/>
           <w:color w:val="181F26"/>
         </w:rPr>
-        <w:t xml:space="preserve">an OpenClaw session or plugin can submit work into Crawfish and inspect long-running fleet actions</w:t>
-      </w:r>
-    </w:p>
-    <w:p>
-      <w:pPr>
-        <w:ind w:left="720" w:first-line="-720"/>
-      </w:pPr>
-      <w:r>
-        <w:rPr>
-          <w:rFonts w:ascii="Helvetica Neue" w:hAnsi="Helvetica Neue" w:cs="Helvetica Neue"/>
-          <w:sz w:val="24"/>
-          <w:sz-cs w:val="24"/>
-          <w:color w:val="181F26"/>
-        </w:rPr>
-        <w:t xml:space="preserve"/>
-        <w:tab/>
-        <w:t xml:space="preserve">•</w:t>
-        <w:tab/>
-        <w:t xml:space="preserve"/>
-      </w:r>
-      <w:r>
-        <w:rPr>
-          <w:rFonts w:ascii="Helvetica Neue" w:hAnsi="Helvetica Neue" w:cs="Helvetica Neue"/>
-          <w:sz w:val="24"/>
-          <w:sz-cs w:val="24"/>
-          <w:spacing w:val="0"/>
-          <w:color w:val="181F26"/>
-        </w:rPr>
-        <w:t xml:space="preserve">selected coding actions, such as patch planning or deep code editing, can route into OpenClaw or another harness and run under a Ralph-style verify loop</w:t>
+        <w:t xml:space="preserve">an OpenClaw session or plugin can submit work into Crawfish and inspect long-running swarm actions</w:t>
+      </w:r>
+    </w:p>
+    <w:p>
+      <w:pPr>
+        <w:ind w:left="720" w:first-line="-720"/>
+      </w:pPr>
+      <w:r>
+        <w:rPr>
+          <w:rFonts w:ascii="Helvetica Neue" w:hAnsi="Helvetica Neue" w:cs="Helvetica Neue"/>
+          <w:sz w:val="24"/>
+          <w:sz-cs w:val="24"/>
+          <w:color w:val="181F26"/>
+        </w:rPr>
+        <w:t xml:space="preserve"/>
+        <w:tab/>
+        <w:t xml:space="preserve">•</w:t>
+        <w:tab/>
+        <w:t xml:space="preserve"/>
+      </w:r>
+      <w:r>
+        <w:rPr>
+          <w:rFonts w:ascii="Helvetica Neue" w:hAnsi="Helvetica Neue" w:cs="Helvetica Neue"/>
+          <w:sz w:val="24"/>
+          <w:sz-cs w:val="24"/>
+          <w:spacing w:val="0"/>
+          <w:color w:val="181F26"/>
+        </w:rPr>
+        <w:t xml:space="preserve">selected proposal or high-context actions, such as </w:t>
+      </w:r>
+      <w:r>
+        <w:rPr>
+          <w:rFonts w:ascii="Menlo" w:hAnsi="Menlo" w:cs="Menlo"/>
+          <w:sz w:val="24"/>
+          <w:sz-cs w:val="24"/>
+          <w:spacing w:val="0"/>
+          <w:color w:val="181F26"/>
+        </w:rPr>
+        <w:t xml:space="preserve">task.plan</w:t>
+      </w:r>
+      <w:r>
+        <w:rPr>
+          <w:rFonts w:ascii="Helvetica Neue" w:hAnsi="Helvetica Neue" w:cs="Helvetica Neue"/>
+          <w:sz w:val="24"/>
+          <w:sz-cs w:val="24"/>
+          <w:spacing w:val="0"/>
+          <w:color w:val="181F26"/>
+        </w:rPr>
+        <w:t xml:space="preserve">, can route into OpenClaw or another harness and later run under a Ralph-style verify loop when verification is required</w:t>
       </w:r>
     </w:p>
     <w:p>
@@ -37420,7 +37478,7 @@
           <w:spacing w:val="0"/>
           <w:color w:val="181F26"/>
         </w:rPr>
-        <w:t xml:space="preserve">Given a valid fleet manifest, </w:t>
+        <w:t xml:space="preserve">Given a valid swarm manifest, </w:t>
       </w:r>
       <w:r>
         <w:rPr>
@@ -39026,7 +39084,7 @@
           <w:spacing w:val="0"/>
           <w:color w:val="181F26"/>
         </w:rPr>
-        <w:t xml:space="preserve">Start the hero fleet with </w:t>
+        <w:t xml:space="preserve">Start the hero swarm with </w:t>
       </w:r>
       <w:r>
         <w:rPr>
@@ -39282,7 +39340,7 @@
           <w:spacing w:val="0"/>
           <w:color w:val="181F26"/>
         </w:rPr>
-        <w:t xml:space="preserve">Submit actions that move the fleet near the configured budget threshold.</w:t>
+        <w:t xml:space="preserve">Submit actions that move the swarm near the configured budget threshold.</w:t>
       </w:r>
     </w:p>
     <w:p>
@@ -39998,7 +40056,7 @@
           <w:spacing w:val="0"/>
           <w:color w:val="181F26"/>
         </w:rPr>
-        <w:t xml:space="preserve"> shows the full fleet at a glance.</w:t>
+        <w:t xml:space="preserve"> shows the full swarm at a glance.</w:t>
       </w:r>
     </w:p>
     <w:p>
@@ -42350,7 +42408,7 @@
           <w:spacing w:val="0"/>
           <w:color w:val="181F26"/>
         </w:rPr>
-        <w:t xml:space="preserve">record external run ids and verify-loop iteration state for coding actions</w:t>
+        <w:t xml:space="preserve">record external run ids and verify-loop iteration state for verification-sensitive actions</w:t>
       </w:r>
     </w:p>
     <w:p>
@@ -42475,7 +42533,7 @@
           <w:spacing w:val="0"/>
           <w:color w:val="181F26"/>
         </w:rPr>
-        <w:t xml:space="preserve">fleet manifests load and reconcile to </w:t>
+        <w:t xml:space="preserve">swarm manifests load and reconcile to </w:t>
       </w:r>
       <w:r>
         <w:rPr>
@@ -43104,6 +43162,43 @@
           <w:spacing w:val="0"/>
           <w:color w:val="181F26"/>
         </w:rPr>
+        <w:t xml:space="preserve">swarm</w:t>
+      </w:r>
+      <w:r>
+        <w:rPr>
+          <w:rFonts w:ascii="Helvetica Neue" w:hAnsi="Helvetica Neue" w:cs="Helvetica Neue"/>
+          <w:sz w:val="26"/>
+          <w:sz-cs w:val="26"/>
+          <w:spacing w:val="0"/>
+          <w:color w:val="181F26"/>
+        </w:rPr>
+        <w:t xml:space="preserve"/>
+      </w:r>
+    </w:p>
+    <w:p>
+      <w:pPr/>
+      <w:r>
+        <w:rPr>
+          <w:rFonts w:ascii="Helvetica Neue" w:hAnsi="Helvetica Neue" w:cs="Helvetica Neue"/>
+          <w:sz w:val="26"/>
+          <w:sz-cs w:val="26"/>
+          <w:spacing w:val="0"/>
+          <w:color w:val="181F26"/>
+        </w:rPr>
+        <w:t xml:space="preserve">A governed set of agents and harness-backed workers operating under one Crawfish control plane. A swarm does not imply shared trust, shared memory, or automatic context sharing.</w:t>
+      </w:r>
+    </w:p>
+    <w:p>
+      <w:pPr/>
+      <w:r>
+        <w:rPr>
+          <w:rFonts w:ascii="Helvetica Neue" w:hAnsi="Helvetica Neue" w:cs="Helvetica Neue"/>
+          <w:sz w:val="26"/>
+          <w:sz-cs w:val="26"/>
+          <w:b/>
+          <w:spacing w:val="0"/>
+          <w:color w:val="181F26"/>
+        </w:rPr>
         <w:t xml:space="preserve">agent</w:t>
       </w:r>
       <w:r>
@@ -43258,7 +43353,7 @@
           <w:spacing w:val="0"/>
           <w:color w:val="181F26"/>
         </w:rPr>
-        <w:t xml:space="preserve">A specialized agent runtime or execution surface, typically optimized for a class of work such as coding. Examples include ACP-compatible coding agents and harness-specific CLIs.</w:t>
+        <w:t xml:space="preserve">A specialized agent runtime or execution surface optimized for a class of work such as planning, research, investigation, operations, or coding. Examples include OpenClaw, ACP-compatible agents, and harness-specific CLIs.</w:t>
       </w:r>
     </w:p>
     <w:p>
@@ -44760,7 +44855,7 @@
           <w:spacing w:val="0"/>
           <w:color w:val="181F26"/>
         </w:rPr>
-        <w:t xml:space="preserve">A Ralph-style execution pattern in which a coding-heavy action iterates through work, deterministic verification, feedback injection, and retry until success or stop budget exhaustion.</w:t>
+        <w:t xml:space="preserve">A Ralph-style execution pattern in which a verification-sensitive action iterates through work, deterministic verification, feedback injection, and retry until success or stop budget exhaustion.</w:t>
       </w:r>
     </w:p>
     <w:p>
@@ -44797,7 +44892,7 @@
           <w:spacing w:val="0"/>
           <w:color w:val="181F26"/>
         </w:rPr>
-        <w:t xml:space="preserve">The canonical public example for Crawfish: an engineering and operations fleet made up of </w:t>
+        <w:t xml:space="preserve">The canonical public example for Crawfish: an engineering and operations swarm made up of </w:t>
       </w:r>
       <w:r>
         <w:rPr>
@@ -44857,6 +44952,46 @@
           <w:spacing w:val="0"/>
           <w:color w:val="181F26"/>
         </w:rPr>
+        <w:t xml:space="preserve">, </w:t>
+      </w:r>
+      <w:r>
+        <w:rPr>
+          <w:rFonts w:ascii="Menlo" w:hAnsi="Menlo" w:cs="Menlo"/>
+          <w:sz w:val="26"/>
+          <w:sz-cs w:val="26"/>
+          <w:spacing w:val="0"/>
+          <w:color w:val="181F26"/>
+        </w:rPr>
+        <w:t xml:space="preserve">incident_enricher</w:t>
+      </w:r>
+      <w:r>
+        <w:rPr>
+          <w:rFonts w:ascii="Helvetica Neue" w:hAnsi="Helvetica Neue" w:cs="Helvetica Neue"/>
+          <w:sz w:val="26"/>
+          <w:sz-cs w:val="26"/>
+          <w:spacing w:val="0"/>
+          <w:color w:val="181F26"/>
+        </w:rPr>
+        <w:t xml:space="preserve">, </w:t>
+      </w:r>
+      <w:r>
+        <w:rPr>
+          <w:rFonts w:ascii="Menlo" w:hAnsi="Menlo" w:cs="Menlo"/>
+          <w:sz w:val="26"/>
+          <w:sz-cs w:val="26"/>
+          <w:spacing w:val="0"/>
+          <w:color w:val="181F26"/>
+        </w:rPr>
+        <w:t xml:space="preserve">workspace_editor</w:t>
+      </w:r>
+      <w:r>
+        <w:rPr>
+          <w:rFonts w:ascii="Helvetica Neue" w:hAnsi="Helvetica Neue" w:cs="Helvetica Neue"/>
+          <w:sz w:val="26"/>
+          <w:sz-cs w:val="26"/>
+          <w:spacing w:val="0"/>
+          <w:color w:val="181F26"/>
+        </w:rPr>
         <w:t xml:space="preserve">, and </w:t>
       </w:r>
       <w:r>
@@ -44867,7 +45002,7 @@
           <w:spacing w:val="0"/>
           <w:color w:val="181F26"/>
         </w:rPr>
-        <w:t xml:space="preserve">incident_enricher</w:t>
+        <w:t xml:space="preserve">task_planner</w:t>
       </w:r>
       <w:r>
         <w:rPr>

</xml_diff>

<commit_message>
docs: publish local-first harness routing
</commit_message>
<xml_diff>
--- a/docs/exports/Crawfish-PRD.docx
+++ b/docs/exports/Crawfish-PRD.docx
@@ -1604,6 +1604,66 @@
           <w:spacing w:val="0"/>
           <w:color w:val="181F26"/>
         </w:rPr>
+        <w:t xml:space="preserve">Local-first harness routing</w:t>
+      </w:r>
+      <w:r>
+        <w:rPr>
+          <w:rFonts w:ascii="Helvetica Neue" w:hAnsi="Helvetica Neue" w:cs="Helvetica Neue"/>
+          <w:sz w:val="24"/>
+          <w:sz-cs w:val="24"/>
+          <w:spacing w:val="0"/>
+          <w:color w:val="181F26"/>
+        </w:rPr>
+        <w:t xml:space="preserve">: </w:t>
+      </w:r>
+      <w:r>
+        <w:rPr>
+          <w:rFonts w:ascii="Menlo" w:hAnsi="Menlo" w:cs="Menlo"/>
+          <w:sz w:val="24"/>
+          <w:sz-cs w:val="24"/>
+          <w:spacing w:val="0"/>
+          <w:color w:val="181F26"/>
+        </w:rPr>
+        <w:t xml:space="preserve">task.plan</w:t>
+      </w:r>
+      <w:r>
+        <w:rPr>
+          <w:rFonts w:ascii="Helvetica Neue" w:hAnsi="Helvetica Neue" w:cs="Helvetica Neue"/>
+          <w:sz w:val="24"/>
+          <w:sz-cs w:val="24"/>
+          <w:spacing w:val="0"/>
+          <w:color w:val="181F26"/>
+        </w:rPr>
+        <w:t xml:space="preserve"> now prefers local Claude Code and Codex wrappers before any remote harness route</w:t>
+      </w:r>
+    </w:p>
+    <w:p>
+      <w:pPr>
+        <w:ind w:left="720" w:first-line="-720"/>
+      </w:pPr>
+      <w:r>
+        <w:rPr>
+          <w:rFonts w:ascii="Helvetica Neue" w:hAnsi="Helvetica Neue" w:cs="Helvetica Neue"/>
+          <w:sz w:val="24"/>
+          <w:sz-cs w:val="24"/>
+          <w:b/>
+          <w:color w:val="181F26"/>
+        </w:rPr>
+        <w:t xml:space="preserve"/>
+        <w:tab/>
+        <w:t xml:space="preserve">•</w:t>
+        <w:tab/>
+        <w:t xml:space="preserve"/>
+      </w:r>
+      <w:r>
+        <w:rPr>
+          <w:rFonts w:ascii="Helvetica Neue" w:hAnsi="Helvetica Neue" w:cs="Helvetica Neue"/>
+          <w:sz w:val="24"/>
+          <w:sz-cs w:val="24"/>
+          <w:b/>
+          <w:spacing w:val="0"/>
+          <w:color w:val="181F26"/>
+        </w:rPr>
         <w:t xml:space="preserve">OpenClaw inbound</w:t>
       </w:r>
       <w:r>
@@ -1674,7 +1734,7 @@
           <w:spacing w:val="0"/>
           <w:color w:val="181F26"/>
         </w:rPr>
-        <w:t xml:space="preserve"> can route out through OpenClaw as a proposal-only execution surface</w:t>
+        <w:t xml:space="preserve"> can still route out through OpenClaw as a proposal-only execution surface when local harnesses are absent or unsuitable</w:t>
       </w:r>
     </w:p>
     <w:p>
@@ -1714,7 +1774,7 @@
           <w:spacing w:val="0"/>
           <w:color w:val="181F26"/>
         </w:rPr>
-        <w:t xml:space="preserve">: if OpenClaw is unavailable, </w:t>
+        <w:t xml:space="preserve">: if no approved harness route is available, </w:t>
       </w:r>
       <w:r>
         <w:rPr>
@@ -1774,47 +1834,7 @@
           <w:spacing w:val="0"/>
           <w:color w:val="181F26"/>
         </w:rPr>
-        <w:t xml:space="preserve">: </w:t>
-      </w:r>
-      <w:r>
-        <w:rPr>
-          <w:rFonts w:ascii="Menlo" w:hAnsi="Menlo" w:cs="Menlo"/>
-          <w:sz w:val="24"/>
-          <w:sz-cs w:val="24"/>
-          <w:spacing w:val="0"/>
-          <w:color w:val="181F26"/>
-        </w:rPr>
-        <w:t xml:space="preserve">task.plan</w:t>
-      </w:r>
-      <w:r>
-        <w:rPr>
-          <w:rFonts w:ascii="Helvetica Neue" w:hAnsi="Helvetica Neue" w:cs="Helvetica Neue"/>
-          <w:sz w:val="24"/>
-          <w:sz-cs w:val="24"/>
-          <w:spacing w:val="0"/>
-          <w:color w:val="181F26"/>
-        </w:rPr>
-        <w:t xml:space="preserve"> now supports </w:t>
-      </w:r>
-      <w:r>
-        <w:rPr>
-          <w:rFonts w:ascii="Menlo" w:hAnsi="Menlo" w:cs="Menlo"/>
-          <w:sz w:val="24"/>
-          <w:sz-cs w:val="24"/>
-          <w:spacing w:val="0"/>
-          <w:color w:val="181F26"/>
-        </w:rPr>
-        <w:t xml:space="preserve">verify_loop</w:t>
-      </w:r>
-      <w:r>
-        <w:rPr>
-          <w:rFonts w:ascii="Helvetica Neue" w:hAnsi="Helvetica Neue" w:cs="Helvetica Neue"/>
-          <w:sz w:val="24"/>
-          <w:sz-cs w:val="24"/>
-          <w:spacing w:val="0"/>
-          <w:color w:val="181F26"/>
-        </w:rPr>
-        <w:t xml:space="preserve">, so OpenClaw and deterministic fallback are both forced through the same deterministic verifier</w:t>
+        <w:t xml:space="preserve">: local wrappers, OpenClaw, and deterministic fallback are all forced through the same deterministic verifier</w:t>
       </w:r>
     </w:p>
     <w:p>
@@ -2065,6 +2085,133 @@
           <w:spacing w:val="0"/>
           <w:color w:val="181F26"/>
         </w:rPr>
+        <w:t xml:space="preserve">Today that surface can be:</w:t>
+      </w:r>
+    </w:p>
+    <w:p>
+      <w:pPr>
+        <w:ind w:left="720" w:first-line="-720"/>
+      </w:pPr>
+      <w:r>
+        <w:rPr>
+          <w:rFonts w:ascii="Helvetica Neue" w:hAnsi="Helvetica Neue" w:cs="Helvetica Neue"/>
+          <w:sz w:val="24"/>
+          <w:sz-cs w:val="24"/>
+          <w:color w:val="181F26"/>
+        </w:rPr>
+        <w:t xml:space="preserve"/>
+        <w:tab/>
+        <w:t xml:space="preserve">•</w:t>
+        <w:tab/>
+        <w:t xml:space="preserve"/>
+      </w:r>
+      <w:r>
+        <w:rPr>
+          <w:rFonts w:ascii="Helvetica Neue" w:hAnsi="Helvetica Neue" w:cs="Helvetica Neue"/>
+          <w:sz w:val="24"/>
+          <w:sz-cs w:val="24"/>
+          <w:spacing w:val="0"/>
+          <w:color w:val="181F26"/>
+        </w:rPr>
+        <w:t xml:space="preserve">a local Claude Code process</w:t>
+      </w:r>
+    </w:p>
+    <w:p>
+      <w:pPr>
+        <w:ind w:left="720" w:first-line="-720"/>
+      </w:pPr>
+      <w:r>
+        <w:rPr>
+          <w:rFonts w:ascii="Helvetica Neue" w:hAnsi="Helvetica Neue" w:cs="Helvetica Neue"/>
+          <w:sz w:val="24"/>
+          <w:sz-cs w:val="24"/>
+          <w:color w:val="181F26"/>
+        </w:rPr>
+        <w:t xml:space="preserve"/>
+        <w:tab/>
+        <w:t xml:space="preserve">•</w:t>
+        <w:tab/>
+        <w:t xml:space="preserve"/>
+      </w:r>
+      <w:r>
+        <w:rPr>
+          <w:rFonts w:ascii="Helvetica Neue" w:hAnsi="Helvetica Neue" w:cs="Helvetica Neue"/>
+          <w:sz w:val="24"/>
+          <w:sz-cs w:val="24"/>
+          <w:spacing w:val="0"/>
+          <w:color w:val="181F26"/>
+        </w:rPr>
+        <w:t xml:space="preserve">a local Codex process</w:t>
+      </w:r>
+    </w:p>
+    <w:p>
+      <w:pPr>
+        <w:ind w:left="720" w:first-line="-720"/>
+      </w:pPr>
+      <w:r>
+        <w:rPr>
+          <w:rFonts w:ascii="Helvetica Neue" w:hAnsi="Helvetica Neue" w:cs="Helvetica Neue"/>
+          <w:sz w:val="24"/>
+          <w:sz-cs w:val="24"/>
+          <w:color w:val="181F26"/>
+        </w:rPr>
+        <w:t xml:space="preserve"/>
+        <w:tab/>
+        <w:t xml:space="preserve">•</w:t>
+        <w:tab/>
+        <w:t xml:space="preserve"/>
+      </w:r>
+      <w:r>
+        <w:rPr>
+          <w:rFonts w:ascii="Helvetica Neue" w:hAnsi="Helvetica Neue" w:cs="Helvetica Neue"/>
+          <w:sz w:val="24"/>
+          <w:sz-cs w:val="24"/>
+          <w:spacing w:val="0"/>
+          <w:color w:val="181F26"/>
+        </w:rPr>
+        <w:t xml:space="preserve">an OpenClaw outbound run</w:t>
+      </w:r>
+    </w:p>
+    <w:p>
+      <w:pPr>
+        <w:ind w:left="720" w:first-line="-720"/>
+      </w:pPr>
+      <w:r>
+        <w:rPr>
+          <w:rFonts w:ascii="Helvetica Neue" w:hAnsi="Helvetica Neue" w:cs="Helvetica Neue"/>
+          <w:sz w:val="24"/>
+          <w:sz-cs w:val="24"/>
+          <w:color w:val="181F26"/>
+        </w:rPr>
+        <w:t xml:space="preserve"/>
+        <w:tab/>
+        <w:t xml:space="preserve">•</w:t>
+        <w:tab/>
+        <w:t xml:space="preserve"/>
+      </w:r>
+      <w:r>
+        <w:rPr>
+          <w:rFonts w:ascii="Helvetica Neue" w:hAnsi="Helvetica Neue" w:cs="Helvetica Neue"/>
+          <w:sz w:val="24"/>
+          <w:sz-cs w:val="24"/>
+          <w:spacing w:val="0"/>
+          <w:color w:val="181F26"/>
+        </w:rPr>
+        <w:t xml:space="preserve">a deterministic fallback planner</w:t>
+      </w:r>
+    </w:p>
+    <w:p>
+      <w:pPr>
+        <w:spacing w:after="240"/>
+      </w:pPr>
+      <w:r>
+        <w:rPr>
+          <w:rFonts w:ascii="Helvetica Neue" w:hAnsi="Helvetica Neue" w:cs="Helvetica Neue"/>
+          <w:sz w:val="24"/>
+          <w:sz-cs w:val="24"/>
+          <w:spacing w:val="0"/>
+          <w:color w:val="181F26"/>
+        </w:rPr>
         <w:t xml:space="preserve">This is where the project starts to look beyond the current generation of agent demos.</w:t>
         <w:br/>
         <w:t xml:space="preserve">Reasoning quality will keep changing. Verification and control have to outlive that churn.</w:t>
@@ -2757,7 +2904,7 @@
           <w:spacing w:val="0"/>
           <w:color w:val="DFE8F2"/>
         </w:rPr>
-        <w:t xml:space="preserve">    "files_of_interest": ["src/lib.rs"],</w:t>
+        <w:t xml:space="preserve">    "context_files": ["src/lib.rs"],</w:t>
       </w:r>
     </w:p>
     <w:p>
@@ -2833,6 +2980,81 @@
           <w:color w:val="181F26"/>
         </w:rPr>
         <w:t xml:space="preserve">.</w:t>
+      </w:r>
+    </w:p>
+    <w:p>
+      <w:pPr>
+        <w:spacing w:after="240"/>
+      </w:pPr>
+      <w:r>
+        <w:rPr>
+          <w:rFonts w:ascii="Helvetica Neue" w:hAnsi="Helvetica Neue" w:cs="Helvetica Neue"/>
+          <w:sz w:val="24"/>
+          <w:sz-cs w:val="24"/>
+          <w:spacing w:val="0"/>
+          <w:color w:val="181F26"/>
+        </w:rPr>
+        <w:t xml:space="preserve">If </w:t>
+      </w:r>
+      <w:r>
+        <w:rPr>
+          <w:rFonts w:ascii="Menlo" w:hAnsi="Menlo" w:cs="Menlo"/>
+          <w:sz w:val="24"/>
+          <w:sz-cs w:val="24"/>
+          <w:spacing w:val="0"/>
+          <w:color w:val="181F26"/>
+        </w:rPr>
+        <w:t xml:space="preserve">claude</w:t>
+      </w:r>
+      <w:r>
+        <w:rPr>
+          <w:rFonts w:ascii="Helvetica Neue" w:hAnsi="Helvetica Neue" w:cs="Helvetica Neue"/>
+          <w:sz w:val="24"/>
+          <w:sz-cs w:val="24"/>
+          <w:spacing w:val="0"/>
+          <w:color w:val="181F26"/>
+        </w:rPr>
+        <w:t xml:space="preserve"> or </w:t>
+      </w:r>
+      <w:r>
+        <w:rPr>
+          <w:rFonts w:ascii="Menlo" w:hAnsi="Menlo" w:cs="Menlo"/>
+          <w:sz w:val="24"/>
+          <w:sz-cs w:val="24"/>
+          <w:spacing w:val="0"/>
+          <w:color w:val="181F26"/>
+        </w:rPr>
+        <w:t xml:space="preserve">codex</w:t>
+      </w:r>
+      <w:r>
+        <w:rPr>
+          <w:rFonts w:ascii="Helvetica Neue" w:hAnsi="Helvetica Neue" w:cs="Helvetica Neue"/>
+          <w:sz w:val="24"/>
+          <w:sz-cs w:val="24"/>
+          <w:spacing w:val="0"/>
+          <w:color w:val="181F26"/>
+        </w:rPr>
+        <w:t xml:space="preserve"> is installed locally, </w:t>
+      </w:r>
+      <w:r>
+        <w:rPr>
+          <w:rFonts w:ascii="Menlo" w:hAnsi="Menlo" w:cs="Menlo"/>
+          <w:sz w:val="24"/>
+          <w:sz-cs w:val="24"/>
+          <w:spacing w:val="0"/>
+          <w:color w:val="181F26"/>
+        </w:rPr>
+        <w:t xml:space="preserve">task_planner</w:t>
+      </w:r>
+      <w:r>
+        <w:rPr>
+          <w:rFonts w:ascii="Helvetica Neue" w:hAnsi="Helvetica Neue" w:cs="Helvetica Neue"/>
+          <w:sz w:val="24"/>
+          <w:sz-cs w:val="24"/>
+          <w:spacing w:val="0"/>
+          <w:color w:val="181F26"/>
+        </w:rPr>
+        <w:t xml:space="preserve"> will prefer those harnesses first. If neither local wrapper is available, Crawfish falls back to OpenClaw when configured, then to deterministic planning when the contract allows it.</w:t>
       </w:r>
     </w:p>
     <w:p>
@@ -16675,6 +16897,19 @@
           <w:spacing w:val="0"/>
           <w:color w:val="DFE8F2"/>
         </w:rPr>
+        <w:t xml:space="preserve">  | LocalHarnessBinding</w:t>
+      </w:r>
+    </w:p>
+    <w:p>
+      <w:pPr/>
+      <w:r>
+        <w:rPr>
+          <w:rFonts w:ascii="Menlo" w:hAnsi="Menlo" w:cs="Menlo"/>
+          <w:sz w:val="24"/>
+          <w:sz-cs w:val="24"/>
+          <w:spacing w:val="0"/>
+          <w:color w:val="DFE8F2"/>
+        </w:rPr>
         <w:t xml:space="preserve">  | OpenClawBinding</w:t>
       </w:r>
     </w:p>
@@ -16767,6 +17002,175 @@
           <w:color w:val="DFE8F2"/>
         </w:rPr>
         <w:t xml:space="preserve">  default_scope: string[];</w:t>
+      </w:r>
+    </w:p>
+    <w:p>
+      <w:pPr/>
+      <w:r>
+        <w:rPr>
+          <w:rFonts w:ascii="Menlo" w:hAnsi="Menlo" w:cs="Menlo"/>
+          <w:sz w:val="24"/>
+          <w:sz-cs w:val="24"/>
+          <w:spacing w:val="0"/>
+          <w:color w:val="DFE8F2"/>
+        </w:rPr>
+        <w:t xml:space="preserve">};</w:t>
+      </w:r>
+    </w:p>
+    <w:p>
+      <w:pPr/>
+      <w:r>
+        <w:rPr>
+          <w:rFonts w:ascii="Menlo" w:hAnsi="Menlo" w:cs="Menlo"/>
+          <w:sz w:val="24"/>
+          <w:sz-cs w:val="24"/>
+          <w:spacing w:val="0"/>
+          <w:color w:val="DFE8F2"/>
+        </w:rPr>
+        <w:t xml:space="preserve"/>
+      </w:r>
+    </w:p>
+    <w:p>
+      <w:pPr/>
+      <w:r>
+        <w:rPr>
+          <w:rFonts w:ascii="Menlo" w:hAnsi="Menlo" w:cs="Menlo"/>
+          <w:sz w:val="24"/>
+          <w:sz-cs w:val="24"/>
+          <w:spacing w:val="0"/>
+          <w:color w:val="DFE8F2"/>
+        </w:rPr>
+        <w:t xml:space="preserve">type LocalHarnessBinding = {</w:t>
+      </w:r>
+    </w:p>
+    <w:p>
+      <w:pPr/>
+      <w:r>
+        <w:rPr>
+          <w:rFonts w:ascii="Menlo" w:hAnsi="Menlo" w:cs="Menlo"/>
+          <w:sz w:val="24"/>
+          <w:sz-cs w:val="24"/>
+          <w:spacing w:val="0"/>
+          <w:color w:val="DFE8F2"/>
+        </w:rPr>
+        <w:t xml:space="preserve">  adapter: "local_harness";</w:t>
+      </w:r>
+    </w:p>
+    <w:p>
+      <w:pPr/>
+      <w:r>
+        <w:rPr>
+          <w:rFonts w:ascii="Menlo" w:hAnsi="Menlo" w:cs="Menlo"/>
+          <w:sz w:val="24"/>
+          <w:sz-cs w:val="24"/>
+          <w:spacing w:val="0"/>
+          <w:color w:val="DFE8F2"/>
+        </w:rPr>
+        <w:t xml:space="preserve">  capability: string;</w:t>
+      </w:r>
+    </w:p>
+    <w:p>
+      <w:pPr/>
+      <w:r>
+        <w:rPr>
+          <w:rFonts w:ascii="Menlo" w:hAnsi="Menlo" w:cs="Menlo"/>
+          <w:sz w:val="24"/>
+          <w:sz-cs w:val="24"/>
+          <w:spacing w:val="0"/>
+          <w:color w:val="DFE8F2"/>
+        </w:rPr>
+        <w:t xml:space="preserve">  harness: "claude_code" | "codex";</w:t>
+      </w:r>
+    </w:p>
+    <w:p>
+      <w:pPr/>
+      <w:r>
+        <w:rPr>
+          <w:rFonts w:ascii="Menlo" w:hAnsi="Menlo" w:cs="Menlo"/>
+          <w:sz w:val="24"/>
+          <w:sz-cs w:val="24"/>
+          <w:spacing w:val="0"/>
+          <w:color w:val="DFE8F2"/>
+        </w:rPr>
+        <w:t xml:space="preserve">  command: string;</w:t>
+      </w:r>
+    </w:p>
+    <w:p>
+      <w:pPr/>
+      <w:r>
+        <w:rPr>
+          <w:rFonts w:ascii="Menlo" w:hAnsi="Menlo" w:cs="Menlo"/>
+          <w:sz w:val="24"/>
+          <w:sz-cs w:val="24"/>
+          <w:spacing w:val="0"/>
+          <w:color w:val="DFE8F2"/>
+        </w:rPr>
+        <w:t xml:space="preserve">  args: string[];</w:t>
+      </w:r>
+    </w:p>
+    <w:p>
+      <w:pPr/>
+      <w:r>
+        <w:rPr>
+          <w:rFonts w:ascii="Menlo" w:hAnsi="Menlo" w:cs="Menlo"/>
+          <w:sz w:val="24"/>
+          <w:sz-cs w:val="24"/>
+          <w:spacing w:val="0"/>
+          <w:color w:val="DFE8F2"/>
+        </w:rPr>
+        <w:t xml:space="preserve">  required_scopes: string[];</w:t>
+      </w:r>
+    </w:p>
+    <w:p>
+      <w:pPr/>
+      <w:r>
+        <w:rPr>
+          <w:rFonts w:ascii="Menlo" w:hAnsi="Menlo" w:cs="Menlo"/>
+          <w:sz w:val="24"/>
+          <w:sz-cs w:val="24"/>
+          <w:spacing w:val="0"/>
+          <w:color w:val="DFE8F2"/>
+        </w:rPr>
+        <w:t xml:space="preserve">  lease_required: boolean;</w:t>
+      </w:r>
+    </w:p>
+    <w:p>
+      <w:pPr/>
+      <w:r>
+        <w:rPr>
+          <w:rFonts w:ascii="Menlo" w:hAnsi="Menlo" w:cs="Menlo"/>
+          <w:sz w:val="24"/>
+          <w:sz-cs w:val="24"/>
+          <w:spacing w:val="0"/>
+          <w:color w:val="DFE8F2"/>
+        </w:rPr>
+        <w:t xml:space="preserve">  workspace_policy: "inherit" | "crawfish_managed";</w:t>
+      </w:r>
+    </w:p>
+    <w:p>
+      <w:pPr/>
+      <w:r>
+        <w:rPr>
+          <w:rFonts w:ascii="Menlo" w:hAnsi="Menlo" w:cs="Menlo"/>
+          <w:sz w:val="24"/>
+          <w:sz-cs w:val="24"/>
+          <w:spacing w:val="0"/>
+          <w:color w:val="DFE8F2"/>
+        </w:rPr>
+        <w:t xml:space="preserve">  env_allowlist: string[];</w:t>
+      </w:r>
+    </w:p>
+    <w:p>
+      <w:pPr/>
+      <w:r>
+        <w:rPr>
+          <w:rFonts w:ascii="Menlo" w:hAnsi="Menlo" w:cs="Menlo"/>
+          <w:sz w:val="24"/>
+          <w:sz-cs w:val="24"/>
+          <w:spacing w:val="0"/>
+          <w:color w:val="DFE8F2"/>
+        </w:rPr>
+        <w:t xml:space="preserve">  timeout_seconds: number;</w:t>
       </w:r>
     </w:p>
     <w:p>
@@ -26788,6 +27192,34 @@
           <w:spacing w:val="0"/>
           <w:color w:val="181F26"/>
         </w:rPr>
+        <w:t xml:space="preserve">local CLI-backed wrappers such as Claude Code and Codex are also treated as harness execution surfaces rather than privileged runtime components</w:t>
+      </w:r>
+    </w:p>
+    <w:p>
+      <w:pPr>
+        <w:ind w:left="720" w:first-line="-720"/>
+      </w:pPr>
+      <w:r>
+        <w:rPr>
+          <w:rFonts w:ascii="Helvetica Neue" w:hAnsi="Helvetica Neue" w:cs="Helvetica Neue"/>
+          <w:sz w:val="24"/>
+          <w:sz-cs w:val="24"/>
+          <w:color w:val="181F26"/>
+        </w:rPr>
+        <w:t xml:space="preserve"/>
+        <w:tab/>
+        <w:t xml:space="preserve">•</w:t>
+        <w:tab/>
+        <w:t xml:space="preserve"/>
+      </w:r>
+      <w:r>
+        <w:rPr>
+          <w:rFonts w:ascii="Helvetica Neue" w:hAnsi="Helvetica Neue" w:cs="Helvetica Neue"/>
+          <w:sz w:val="24"/>
+          <w:sz-cs w:val="24"/>
+          <w:spacing w:val="0"/>
+          <w:color w:val="181F26"/>
+        </w:rPr>
         <w:t xml:space="preserve">ACP-compatible harnesses are normalized as execution surfaces, not as generic tools; they may expose session semantics, permission prompts, and richer cancellation behavior than MCP tools</w:t>
       </w:r>
     </w:p>
@@ -26928,42 +27360,28 @@
       </w:r>
     </w:p>
     <w:p>
-      <w:pPr/>
-      <w:r>
-        <w:rPr>
-          <w:rFonts w:ascii="Helvetica Neue" w:hAnsi="Helvetica Neue" w:cs="Helvetica Neue"/>
-          <w:sz w:val="26"/>
-          <w:sz-cs w:val="26"/>
-          <w:spacing w:val="0"/>
-          <w:color w:val="181F26"/>
-        </w:rPr>
-        <w:t xml:space="preserve">agent plane</w:t>
-      </w:r>
-    </w:p>
-    <w:p>
-      <w:pPr/>
-      <w:r>
-        <w:rPr>
-          <w:rFonts w:ascii="Helvetica Neue" w:hAnsi="Helvetica Neue" w:cs="Helvetica Neue"/>
-          <w:sz w:val="26"/>
-          <w:sz-cs w:val="26"/>
-          <w:spacing w:val="0"/>
-          <w:color w:val="181F26"/>
-        </w:rPr>
-        <w:t xml:space="preserve">A2A</w:t>
-      </w:r>
-    </w:p>
-    <w:p>
-      <w:pPr/>
-      <w:r>
-        <w:rPr>
-          <w:rFonts w:ascii="Helvetica Neue" w:hAnsi="Helvetica Neue" w:cs="Helvetica Neue"/>
-          <w:sz w:val="26"/>
-          <w:sz-cs w:val="26"/>
-          <w:spacing w:val="0"/>
-          <w:color w:val="181F26"/>
-        </w:rPr>
-        <w:t xml:space="preserve">delegate work to remote agent systems</w:t>
+      <w:pPr>
+        <w:spacing w:after="240"/>
+      </w:pPr>
+      <w:r>
+        <w:rPr>
+          <w:rFonts w:ascii="Menlo" w:hAnsi="Menlo" w:cs="Menlo"/>
+          <w:sz w:val="24"/>
+          <w:sz-cs w:val="24"/>
+          <w:spacing w:val="0"/>
+          <w:color w:val="181F26"/>
+        </w:rPr>
+        <w:t xml:space="preserve">P1e</w:t>
+      </w:r>
+      <w:r>
+        <w:rPr>
+          <w:rFonts w:ascii="Helvetica Neue" w:hAnsi="Helvetica Neue" w:cs="Helvetica Neue"/>
+          <w:sz w:val="24"/>
+          <w:sz-cs w:val="24"/>
+          <w:spacing w:val="0"/>
+          <w:color w:val="181F26"/>
+        </w:rPr>
+        <w:t xml:space="preserve"> adds a native local harness sub-surface inside the harness plane. Claude Code and Codex are wrapped as per-action ephemeral subprocesses under Rust control, with allowlisted environment propagation, workspace inheritance rules, and normalized event and failure reporting. | agent plane | A2A | delegate work to remote agent systems |</w:t>
       </w:r>
     </w:p>
     <w:p>
@@ -36161,6 +36579,281 @@
     </w:p>
     <w:p>
       <w:pPr>
+        <w:spacing w:after="240"/>
+      </w:pPr>
+      <w:r>
+        <w:rPr>
+          <w:rFonts w:ascii="Helvetica Neue" w:hAnsi="Helvetica Neue" w:cs="Helvetica Neue"/>
+          <w:sz w:val="24"/>
+          <w:sz-cs w:val="24"/>
+          <w:spacing w:val="0"/>
+          <w:color w:val="181F26"/>
+        </w:rPr>
+        <w:t xml:space="preserve">The current </w:t>
+      </w:r>
+      <w:r>
+        <w:rPr>
+          <w:rFonts w:ascii="Menlo" w:hAnsi="Menlo" w:cs="Menlo"/>
+          <w:sz w:val="24"/>
+          <w:sz-cs w:val="24"/>
+          <w:spacing w:val="0"/>
+          <w:color w:val="181F26"/>
+        </w:rPr>
+        <w:t xml:space="preserve">P1e</w:t>
+      </w:r>
+      <w:r>
+        <w:rPr>
+          <w:rFonts w:ascii="Helvetica Neue" w:hAnsi="Helvetica Neue" w:cs="Helvetica Neue"/>
+          <w:sz w:val="24"/>
+          <w:sz-cs w:val="24"/>
+          <w:spacing w:val="0"/>
+          <w:color w:val="181F26"/>
+        </w:rPr>
+        <w:t xml:space="preserve"> local-harness slice adds:</w:t>
+      </w:r>
+    </w:p>
+    <w:p>
+      <w:pPr>
+        <w:ind w:left="720" w:first-line="-720"/>
+      </w:pPr>
+      <w:r>
+        <w:rPr>
+          <w:rFonts w:ascii="Helvetica Neue" w:hAnsi="Helvetica Neue" w:cs="Helvetica Neue"/>
+          <w:sz w:val="24"/>
+          <w:sz-cs w:val="24"/>
+          <w:color w:val="181F26"/>
+        </w:rPr>
+        <w:t xml:space="preserve"/>
+        <w:tab/>
+        <w:t xml:space="preserve">•</w:t>
+        <w:tab/>
+        <w:t xml:space="preserve"/>
+      </w:r>
+      <w:r>
+        <w:rPr>
+          <w:rFonts w:ascii="Helvetica Neue" w:hAnsi="Helvetica Neue" w:cs="Helvetica Neue"/>
+          <w:sz w:val="24"/>
+          <w:sz-cs w:val="24"/>
+          <w:spacing w:val="0"/>
+          <w:color w:val="181F26"/>
+        </w:rPr>
+        <w:t xml:space="preserve">native Rust local harness adapters for Claude Code and Codex under </w:t>
+      </w:r>
+      <w:r>
+        <w:rPr>
+          <w:rFonts w:ascii="Menlo" w:hAnsi="Menlo" w:cs="Menlo"/>
+          <w:sz w:val="24"/>
+          <w:sz-cs w:val="24"/>
+          <w:spacing w:val="0"/>
+          <w:color w:val="181F26"/>
+        </w:rPr>
+        <w:t xml:space="preserve">crawfish-harness-local</w:t>
+      </w:r>
+      <w:r>
+        <w:rPr>
+          <w:rFonts w:ascii="Helvetica Neue" w:hAnsi="Helvetica Neue" w:cs="Helvetica Neue"/>
+          <w:sz w:val="24"/>
+          <w:sz-cs w:val="24"/>
+          <w:spacing w:val="0"/>
+          <w:color w:val="181F26"/>
+        </w:rPr>
+        <w:t xml:space="preserve"/>
+      </w:r>
+    </w:p>
+    <w:p>
+      <w:pPr>
+        <w:ind w:left="720" w:first-line="-720"/>
+      </w:pPr>
+      <w:r>
+        <w:rPr>
+          <w:rFonts w:ascii="Helvetica Neue" w:hAnsi="Helvetica Neue" w:cs="Helvetica Neue"/>
+          <w:sz w:val="24"/>
+          <w:sz-cs w:val="24"/>
+          <w:color w:val="181F26"/>
+        </w:rPr>
+        <w:t xml:space="preserve"/>
+        <w:tab/>
+        <w:t xml:space="preserve">•</w:t>
+        <w:tab/>
+        <w:t xml:space="preserve"/>
+      </w:r>
+      <w:r>
+        <w:rPr>
+          <w:rFonts w:ascii="Helvetica Neue" w:hAnsi="Helvetica Neue" w:cs="Helvetica Neue"/>
+          <w:sz w:val="24"/>
+          <w:sz-cs w:val="24"/>
+          <w:spacing w:val="0"/>
+          <w:color w:val="181F26"/>
+        </w:rPr>
+        <w:t xml:space="preserve">local-first </w:t>
+      </w:r>
+      <w:r>
+        <w:rPr>
+          <w:rFonts w:ascii="Menlo" w:hAnsi="Menlo" w:cs="Menlo"/>
+          <w:sz w:val="24"/>
+          <w:sz-cs w:val="24"/>
+          <w:spacing w:val="0"/>
+          <w:color w:val="181F26"/>
+        </w:rPr>
+        <w:t xml:space="preserve">task.plan</w:t>
+      </w:r>
+      <w:r>
+        <w:rPr>
+          <w:rFonts w:ascii="Helvetica Neue" w:hAnsi="Helvetica Neue" w:cs="Helvetica Neue"/>
+          <w:sz w:val="24"/>
+          <w:sz-cs w:val="24"/>
+          <w:spacing w:val="0"/>
+          <w:color w:val="181F26"/>
+        </w:rPr>
+        <w:t xml:space="preserve"> routing with the preference chain </w:t>
+      </w:r>
+      <w:r>
+        <w:rPr>
+          <w:rFonts w:ascii="Menlo" w:hAnsi="Menlo" w:cs="Menlo"/>
+          <w:sz w:val="24"/>
+          <w:sz-cs w:val="24"/>
+          <w:spacing w:val="0"/>
+          <w:color w:val="181F26"/>
+        </w:rPr>
+        <w:t xml:space="preserve">claude_code -&gt; codex -&gt; openclaw -&gt; deterministic</w:t>
+      </w:r>
+      <w:r>
+        <w:rPr>
+          <w:rFonts w:ascii="Helvetica Neue" w:hAnsi="Helvetica Neue" w:cs="Helvetica Neue"/>
+          <w:sz w:val="24"/>
+          <w:sz-cs w:val="24"/>
+          <w:spacing w:val="0"/>
+          <w:color w:val="181F26"/>
+        </w:rPr>
+        <w:t xml:space="preserve"/>
+      </w:r>
+    </w:p>
+    <w:p>
+      <w:pPr>
+        <w:ind w:left="720" w:first-line="-720"/>
+      </w:pPr>
+      <w:r>
+        <w:rPr>
+          <w:rFonts w:ascii="Helvetica Neue" w:hAnsi="Helvetica Neue" w:cs="Helvetica Neue"/>
+          <w:sz w:val="24"/>
+          <w:sz-cs w:val="24"/>
+          <w:color w:val="181F26"/>
+        </w:rPr>
+        <w:t xml:space="preserve"/>
+        <w:tab/>
+        <w:t xml:space="preserve">•</w:t>
+        <w:tab/>
+        <w:t xml:space="preserve"/>
+      </w:r>
+      <w:r>
+        <w:rPr>
+          <w:rFonts w:ascii="Helvetica Neue" w:hAnsi="Helvetica Neue" w:cs="Helvetica Neue"/>
+          <w:sz w:val="24"/>
+          <w:sz-cs w:val="24"/>
+          <w:spacing w:val="0"/>
+          <w:color w:val="181F26"/>
+        </w:rPr>
+        <w:t xml:space="preserve">shared </w:t>
+      </w:r>
+      <w:r>
+        <w:rPr>
+          <w:rFonts w:ascii="Menlo" w:hAnsi="Menlo" w:cs="Menlo"/>
+          <w:sz w:val="24"/>
+          <w:sz-cs w:val="24"/>
+          <w:spacing w:val="0"/>
+          <w:color w:val="181F26"/>
+        </w:rPr>
+        <w:t xml:space="preserve">verify_loop</w:t>
+      </w:r>
+      <w:r>
+        <w:rPr>
+          <w:rFonts w:ascii="Helvetica Neue" w:hAnsi="Helvetica Neue" w:cs="Helvetica Neue"/>
+          <w:sz w:val="24"/>
+          <w:sz-cs w:val="24"/>
+          <w:spacing w:val="0"/>
+          <w:color w:val="181F26"/>
+        </w:rPr>
+        <w:t xml:space="preserve"> execution across local wrappers, OpenClaw outbound, and deterministic fallback</w:t>
+      </w:r>
+    </w:p>
+    <w:p>
+      <w:pPr>
+        <w:ind w:left="720" w:first-line="-720"/>
+      </w:pPr>
+      <w:r>
+        <w:rPr>
+          <w:rFonts w:ascii="Helvetica Neue" w:hAnsi="Helvetica Neue" w:cs="Helvetica Neue"/>
+          <w:sz w:val="24"/>
+          <w:sz-cs w:val="24"/>
+          <w:color w:val="181F26"/>
+        </w:rPr>
+        <w:t xml:space="preserve"/>
+        <w:tab/>
+        <w:t xml:space="preserve">•</w:t>
+        <w:tab/>
+        <w:t xml:space="preserve"/>
+      </w:r>
+      <w:r>
+        <w:rPr>
+          <w:rFonts w:ascii="Helvetica Neue" w:hAnsi="Helvetica Neue" w:cs="Helvetica Neue"/>
+          <w:sz w:val="24"/>
+          <w:sz-cs w:val="24"/>
+          <w:spacing w:val="0"/>
+          <w:color w:val="181F26"/>
+        </w:rPr>
+        <w:t xml:space="preserve">stable local harness failure taxonomy for missing binaries, spawn failures, timeouts, non-zero exits, and protocol errors</w:t>
+      </w:r>
+    </w:p>
+    <w:p>
+      <w:pPr>
+        <w:ind w:left="720" w:first-line="-720"/>
+      </w:pPr>
+      <w:r>
+        <w:rPr>
+          <w:rFonts w:ascii="Helvetica Neue" w:hAnsi="Helvetica Neue" w:cs="Helvetica Neue"/>
+          <w:sz w:val="24"/>
+          <w:sz-cs w:val="24"/>
+          <w:color w:val="181F26"/>
+        </w:rPr>
+        <w:t xml:space="preserve"/>
+        <w:tab/>
+        <w:t xml:space="preserve">•</w:t>
+        <w:tab/>
+        <w:t xml:space="preserve"/>
+      </w:r>
+      <w:r>
+        <w:rPr>
+          <w:rFonts w:ascii="Helvetica Neue" w:hAnsi="Helvetica Neue" w:cs="Helvetica Neue"/>
+          <w:sz w:val="24"/>
+          <w:sz-cs w:val="24"/>
+          <w:spacing w:val="0"/>
+          <w:color w:val="181F26"/>
+        </w:rPr>
+        <w:t xml:space="preserve">a reference </w:t>
+      </w:r>
+      <w:r>
+        <w:rPr>
+          <w:rFonts w:ascii="Menlo" w:hAnsi="Menlo" w:cs="Menlo"/>
+          <w:sz w:val="24"/>
+          <w:sz-cs w:val="24"/>
+          <w:spacing w:val="0"/>
+          <w:color w:val="181F26"/>
+        </w:rPr>
+        <w:t xml:space="preserve">task_planner</w:t>
+      </w:r>
+      <w:r>
+        <w:rPr>
+          <w:rFonts w:ascii="Helvetica Neue" w:hAnsi="Helvetica Neue" w:cs="Helvetica Neue"/>
+          <w:sz w:val="24"/>
+          <w:sz-cs w:val="24"/>
+          <w:spacing w:val="0"/>
+          <w:color w:val="181F26"/>
+        </w:rPr>
+        <w:t xml:space="preserve"> manifest that models harness abundance without treating any one harness as the product center</w:t>
+      </w:r>
+    </w:p>
+    <w:p>
+      <w:pPr>
         <w:spacing w:after="197"/>
       </w:pPr>
       <w:r>
@@ -36696,7 +37389,7 @@
           <w:spacing w:val="0"/>
           <w:color w:val="181F26"/>
         </w:rPr>
-        <w:t xml:space="preserve">local subprocess wrappers where ACP is unavailable</w:t>
+        <w:t xml:space="preserve">additional local harness adapters beyond Claude Code and Codex</w:t>
       </w:r>
     </w:p>
     <w:p>

</xml_diff>

<commit_message>
docs: publish evaluation ops philosophy and examples
</commit_message>
<xml_diff>
--- a/docs/exports/Crawfish-PRD.docx
+++ b/docs/exports/Crawfish-PRD.docx
@@ -2702,17 +2702,17 @@
           <w:spacing w:val="0"/>
           <w:color w:val="0000E9"/>
         </w:rPr>
-        <w:t xml:space="preserve">observability</w:t>
-      </w:r>
-      <w:r>
-        <w:rPr>
-          <w:rFonts w:ascii="Helvetica Neue" w:hAnsi="Helvetica Neue" w:cs="Helvetica Neue"/>
-          <w:sz w:val="24"/>
-          <w:sz-cs w:val="24"/>
-          <w:spacing w:val="0"/>
-          <w:color w:val="181F26"/>
-        </w:rPr>
-        <w:t xml:space="preserve"> and </w:t>
+        <w:t xml:space="preserve">observability concepts</w:t>
+      </w:r>
+      <w:r>
+        <w:rPr>
+          <w:rFonts w:ascii="Helvetica Neue" w:hAnsi="Helvetica Neue" w:cs="Helvetica Neue"/>
+          <w:sz w:val="24"/>
+          <w:sz-cs w:val="24"/>
+          <w:spacing w:val="0"/>
+          <w:color w:val="181F26"/>
+        </w:rPr>
+        <w:t xml:space="preserve">, </w:t>
       </w:r>
       <w:r>
         <w:rPr>
@@ -2723,17 +2723,38 @@
           <w:spacing w:val="0"/>
           <w:color w:val="0000E9"/>
         </w:rPr>
-        <w:t xml:space="preserve">evaluation</w:t>
-      </w:r>
-      <w:r>
-        <w:rPr>
-          <w:rFonts w:ascii="Helvetica Neue" w:hAnsi="Helvetica Neue" w:cs="Helvetica Neue"/>
-          <w:sz w:val="24"/>
-          <w:sz-cs w:val="24"/>
-          <w:spacing w:val="0"/>
-          <w:color w:val="181F26"/>
-        </w:rPr>
-        <w:t xml:space="preserve"> model: traces, datasets, evaluators, review, and alerts. Crawfish does not copy LangSmith's product. It lifts that shape into swarm runtime infrastructure.</w:t>
+        <w:t xml:space="preserve">annotation queues</w:t>
+      </w:r>
+      <w:r>
+        <w:rPr>
+          <w:rFonts w:ascii="Helvetica Neue" w:hAnsi="Helvetica Neue" w:cs="Helvetica Neue"/>
+          <w:sz w:val="24"/>
+          <w:sz-cs w:val="24"/>
+          <w:spacing w:val="0"/>
+          <w:color w:val="181F26"/>
+        </w:rPr>
+        <w:t xml:space="preserve">, and </w:t>
+      </w:r>
+      <w:r>
+        <w:rPr>
+          <w:rFonts w:ascii="Helvetica Neue" w:hAnsi="Helvetica Neue" w:cs="Helvetica Neue"/>
+          <w:sz w:val="24"/>
+          <w:sz-cs w:val="24"/>
+          <w:u w:val="single"/>
+          <w:spacing w:val="0"/>
+          <w:color w:val="0000E9"/>
+        </w:rPr>
+        <w:t xml:space="preserve">automation rules</w:t>
+      </w:r>
+      <w:r>
+        <w:rPr>
+          <w:rFonts w:ascii="Helvetica Neue" w:hAnsi="Helvetica Neue" w:cs="Helvetica Neue"/>
+          <w:sz w:val="24"/>
+          <w:sz-cs w:val="24"/>
+          <w:spacing w:val="0"/>
+          <w:color w:val="181F26"/>
+        </w:rPr>
+        <w:t xml:space="preserve">: traces, datasets, evaluators, review, and alerts belong to one operational loop. Crawfish does not copy LangSmith's product. It lifts that shape into swarm runtime infrastructure.</w:t>
       </w:r>
     </w:p>
     <w:p>
@@ -2797,7 +2818,7 @@
           <w:spacing w:val="0"/>
           <w:color w:val="181F26"/>
         </w:rPr>
-        <w:t xml:space="preserve">trace -&gt; evaluation -&gt; review queue -&gt; feedback note -&gt; alert</w:t>
+        <w:t xml:space="preserve">trace -&gt; scorecard -&gt; review queue -&gt; alert -&gt; dataset -&gt; replay</w:t>
       </w:r>
       <w:r>
         <w:rPr>
@@ -2966,6 +2987,21 @@
           <w:spacing w:val="0"/>
           <w:color w:val="181F26"/>
         </w:rPr>
+        <w:t xml:space="preserve">Observability is the rear-view mirror. Evaluation is the learning loop.</w:t>
+      </w:r>
+    </w:p>
+    <w:p>
+      <w:pPr>
+        <w:spacing w:after="240"/>
+      </w:pPr>
+      <w:r>
+        <w:rPr>
+          <w:rFonts w:ascii="Helvetica Neue" w:hAnsi="Helvetica Neue" w:cs="Helvetica Neue"/>
+          <w:sz w:val="24"/>
+          <w:sz-cs w:val="24"/>
+          <w:spacing w:val="0"/>
+          <w:color w:val="181F26"/>
+        </w:rPr>
         <w:t xml:space="preserve">In Crawfish:</w:t>
       </w:r>
     </w:p>
@@ -3157,6 +3193,82 @@
           <w:color w:val="181F26"/>
         </w:rPr>
         <w:t xml:space="preserve"> turns governance or evaluation failures into visible operator signals</w:t>
+      </w:r>
+    </w:p>
+    <w:p>
+      <w:pPr>
+        <w:ind w:left="720" w:first-line="-720"/>
+      </w:pPr>
+      <w:r>
+        <w:rPr>
+          <w:rFonts w:ascii="Menlo" w:hAnsi="Menlo" w:cs="Menlo"/>
+          <w:sz w:val="24"/>
+          <w:sz-cs w:val="24"/>
+          <w:color w:val="181F26"/>
+        </w:rPr>
+        <w:t xml:space="preserve"/>
+        <w:tab/>
+        <w:t xml:space="preserve">•</w:t>
+        <w:tab/>
+        <w:t xml:space="preserve"/>
+      </w:r>
+      <w:r>
+        <w:rPr>
+          <w:rFonts w:ascii="Menlo" w:hAnsi="Menlo" w:cs="Menlo"/>
+          <w:sz w:val="24"/>
+          <w:sz-cs w:val="24"/>
+          <w:spacing w:val="0"/>
+          <w:color w:val="181F26"/>
+        </w:rPr>
+        <w:t xml:space="preserve">DatasetCase</w:t>
+      </w:r>
+      <w:r>
+        <w:rPr>
+          <w:rFonts w:ascii="Helvetica Neue" w:hAnsi="Helvetica Neue" w:cs="Helvetica Neue"/>
+          <w:sz w:val="24"/>
+          <w:sz-cs w:val="24"/>
+          <w:spacing w:val="0"/>
+          <w:color w:val="181F26"/>
+        </w:rPr>
+        <w:t xml:space="preserve"> freezes completed actions into replayable evaluation datasets with doctrine and jurisdiction metadata</w:t>
+      </w:r>
+    </w:p>
+    <w:p>
+      <w:pPr>
+        <w:ind w:left="720" w:first-line="-720"/>
+      </w:pPr>
+      <w:r>
+        <w:rPr>
+          <w:rFonts w:ascii="Menlo" w:hAnsi="Menlo" w:cs="Menlo"/>
+          <w:sz w:val="24"/>
+          <w:sz-cs w:val="24"/>
+          <w:color w:val="181F26"/>
+        </w:rPr>
+        <w:t xml:space="preserve"/>
+        <w:tab/>
+        <w:t xml:space="preserve">•</w:t>
+        <w:tab/>
+        <w:t xml:space="preserve"/>
+      </w:r>
+      <w:r>
+        <w:rPr>
+          <w:rFonts w:ascii="Menlo" w:hAnsi="Menlo" w:cs="Menlo"/>
+          <w:sz w:val="24"/>
+          <w:sz-cs w:val="24"/>
+          <w:spacing w:val="0"/>
+          <w:color w:val="181F26"/>
+        </w:rPr>
+        <w:t xml:space="preserve">ExperimentRun</w:t>
+      </w:r>
+      <w:r>
+        <w:rPr>
+          <w:rFonts w:ascii="Helvetica Neue" w:hAnsi="Helvetica Neue" w:cs="Helvetica Neue"/>
+          <w:sz w:val="24"/>
+          <w:sz-cs w:val="24"/>
+          <w:spacing w:val="0"/>
+          <w:color w:val="181F26"/>
+        </w:rPr>
+        <w:t xml:space="preserve"> replays those cases against one executor surface so the swarm can learn without polluting production review queues</w:t>
       </w:r>
     </w:p>
     <w:p>
@@ -3391,6 +3503,34 @@
           <w:spacing w:val="0"/>
           <w:color w:val="181F26"/>
         </w:rPr>
+        <w:t xml:space="preserve">constitutions guide models; institutions govern swarms</w:t>
+      </w:r>
+    </w:p>
+    <w:p>
+      <w:pPr>
+        <w:ind w:left="720" w:first-line="-720"/>
+      </w:pPr>
+      <w:r>
+        <w:rPr>
+          <w:rFonts w:ascii="Helvetica Neue" w:hAnsi="Helvetica Neue" w:cs="Helvetica Neue"/>
+          <w:sz w:val="24"/>
+          <w:sz-cs w:val="24"/>
+          <w:color w:val="181F26"/>
+        </w:rPr>
+        <w:t xml:space="preserve"/>
+        <w:tab/>
+        <w:t xml:space="preserve">•</w:t>
+        <w:tab/>
+        <w:t xml:space="preserve"/>
+      </w:r>
+      <w:r>
+        <w:rPr>
+          <w:rFonts w:ascii="Helvetica Neue" w:hAnsi="Helvetica Neue" w:cs="Helvetica Neue"/>
+          <w:sz w:val="24"/>
+          <w:sz-cs w:val="24"/>
+          <w:spacing w:val="0"/>
+          <w:color w:val="181F26"/>
+        </w:rPr>
         <w:t xml:space="preserve">frontier enforcement gaps are runtime failures, not merely policy failures</w:t>
       </w:r>
     </w:p>
@@ -4038,6 +4178,45 @@
       </w:r>
     </w:p>
     <w:p>
+      <w:pPr/>
+      <w:r>
+        <w:rPr>
+          <w:rFonts w:ascii="Menlo" w:hAnsi="Menlo" w:cs="Menlo"/>
+          <w:sz w:val="24"/>
+          <w:sz-cs w:val="24"/>
+          <w:spacing w:val="0"/>
+          <w:color w:val="DFE8F2"/>
+        </w:rPr>
+        <w:t xml:space="preserve">cargo run -p crawfish-cli --bin crawfish -- eval dataset list --json</w:t>
+      </w:r>
+    </w:p>
+    <w:p>
+      <w:pPr/>
+      <w:r>
+        <w:rPr>
+          <w:rFonts w:ascii="Menlo" w:hAnsi="Menlo" w:cs="Menlo"/>
+          <w:sz w:val="24"/>
+          <w:sz-cs w:val="24"/>
+          <w:spacing w:val="0"/>
+          <w:color w:val="DFE8F2"/>
+        </w:rPr>
+        <w:t xml:space="preserve">cargo run -p crawfish-cli --bin crawfish -- eval run task_plan_dataset --executor deterministic --json</w:t>
+      </w:r>
+    </w:p>
+    <w:p>
+      <w:pPr/>
+      <w:r>
+        <w:rPr>
+          <w:rFonts w:ascii="Menlo" w:hAnsi="Menlo" w:cs="Menlo"/>
+          <w:sz w:val="24"/>
+          <w:sz-cs w:val="24"/>
+          <w:spacing w:val="0"/>
+          <w:color w:val="DFE8F2"/>
+        </w:rPr>
+        <w:t xml:space="preserve">cargo run -p crawfish-cli --bin crawfish -- alert list --json</w:t>
+      </w:r>
+    </w:p>
+    <w:p>
       <w:pPr>
         <w:spacing w:after="240"/>
       </w:pPr>
@@ -4641,6 +4820,97 @@
           <w:spacing w:val="0"/>
           <w:color w:val="181F26"/>
         </w:rPr>
+        <w:t xml:space="preserve">Primary alpha config direction:</w:t>
+      </w:r>
+    </w:p>
+    <w:p>
+      <w:pPr>
+        <w:ind w:left="720" w:first-line="-720"/>
+      </w:pPr>
+      <w:r>
+        <w:rPr>
+          <w:rFonts w:ascii="Menlo" w:hAnsi="Menlo" w:cs="Menlo"/>
+          <w:sz w:val="24"/>
+          <w:sz-cs w:val="24"/>
+          <w:color w:val="181F26"/>
+        </w:rPr>
+        <w:t xml:space="preserve"/>
+        <w:tab/>
+        <w:t xml:space="preserve">•</w:t>
+        <w:tab/>
+        <w:t xml:space="preserve"/>
+      </w:r>
+      <w:r>
+        <w:rPr>
+          <w:rFonts w:ascii="Menlo" w:hAnsi="Menlo" w:cs="Menlo"/>
+          <w:sz w:val="24"/>
+          <w:sz-cs w:val="24"/>
+          <w:spacing w:val="0"/>
+          <w:color w:val="181F26"/>
+        </w:rPr>
+        <w:t xml:space="preserve">quality.evaluation_profile</w:t>
+      </w:r>
+      <w:r>
+        <w:rPr>
+          <w:rFonts w:ascii="Helvetica Neue" w:hAnsi="Helvetica Neue" w:cs="Helvetica Neue"/>
+          <w:sz w:val="24"/>
+          <w:sz-cs w:val="24"/>
+          <w:spacing w:val="0"/>
+          <w:color w:val="181F26"/>
+        </w:rPr>
+        <w:t xml:space="preserve"> is the primary evaluation selector</w:t>
+      </w:r>
+    </w:p>
+    <w:p>
+      <w:pPr>
+        <w:ind w:left="720" w:first-line="-720"/>
+      </w:pPr>
+      <w:r>
+        <w:rPr>
+          <w:rFonts w:ascii="Menlo" w:hAnsi="Menlo" w:cs="Menlo"/>
+          <w:sz w:val="24"/>
+          <w:sz-cs w:val="24"/>
+          <w:color w:val="181F26"/>
+        </w:rPr>
+        <w:t xml:space="preserve"/>
+        <w:tab/>
+        <w:t xml:space="preserve">•</w:t>
+        <w:tab/>
+        <w:t xml:space="preserve"/>
+      </w:r>
+      <w:r>
+        <w:rPr>
+          <w:rFonts w:ascii="Menlo" w:hAnsi="Menlo" w:cs="Menlo"/>
+          <w:sz w:val="24"/>
+          <w:sz-cs w:val="24"/>
+          <w:spacing w:val="0"/>
+          <w:color w:val="181F26"/>
+        </w:rPr>
+        <w:t xml:space="preserve">quality.evaluation_hook</w:t>
+      </w:r>
+      <w:r>
+        <w:rPr>
+          <w:rFonts w:ascii="Helvetica Neue" w:hAnsi="Helvetica Neue" w:cs="Helvetica Neue"/>
+          <w:sz w:val="24"/>
+          <w:sz-cs w:val="24"/>
+          <w:spacing w:val="0"/>
+          <w:color w:val="181F26"/>
+        </w:rPr>
+        <w:t xml:space="preserve"> still parses during alpha, but it is deprecated and only normalized for legacy built-ins</w:t>
+      </w:r>
+    </w:p>
+    <w:p>
+      <w:pPr>
+        <w:spacing w:after="240"/>
+      </w:pPr>
+      <w:r>
+        <w:rPr>
+          <w:rFonts w:ascii="Helvetica Neue" w:hAnsi="Helvetica Neue" w:cs="Helvetica Neue"/>
+          <w:sz w:val="24"/>
+          <w:sz-cs w:val="24"/>
+          <w:spacing w:val="0"/>
+          <w:color w:val="181F26"/>
+        </w:rPr>
         <w:t xml:space="preserve">Project maintenance policy lives in:</w:t>
       </w:r>
     </w:p>
@@ -6424,6 +6694,21 @@
           <w:spacing w:val="0"/>
           <w:color w:val="181F26"/>
         </w:rPr>
+        <w:t xml:space="preserve">Observability is the rear-view mirror. Evaluation is the learning loop.</w:t>
+      </w:r>
+    </w:p>
+    <w:p>
+      <w:pPr>
+        <w:spacing w:after="240"/>
+      </w:pPr>
+      <w:r>
+        <w:rPr>
+          <w:rFonts w:ascii="Helvetica Neue" w:hAnsi="Helvetica Neue" w:cs="Helvetica Neue"/>
+          <w:sz w:val="24"/>
+          <w:sz-cs w:val="24"/>
+          <w:spacing w:val="0"/>
+          <w:color w:val="181F26"/>
+        </w:rPr>
         <w:t xml:space="preserve">LangSmith provides a useful reference shape for this through its </w:t>
       </w:r>
       <w:r>
@@ -6435,17 +6720,17 @@
           <w:spacing w:val="0"/>
           <w:color w:val="0000E9"/>
         </w:rPr>
-        <w:t xml:space="preserve">observability</w:t>
-      </w:r>
-      <w:r>
-        <w:rPr>
-          <w:rFonts w:ascii="Helvetica Neue" w:hAnsi="Helvetica Neue" w:cs="Helvetica Neue"/>
-          <w:sz w:val="24"/>
-          <w:sz-cs w:val="24"/>
-          <w:spacing w:val="0"/>
-          <w:color w:val="181F26"/>
-        </w:rPr>
-        <w:t xml:space="preserve"> and </w:t>
+        <w:t xml:space="preserve">observability concepts</w:t>
+      </w:r>
+      <w:r>
+        <w:rPr>
+          <w:rFonts w:ascii="Helvetica Neue" w:hAnsi="Helvetica Neue" w:cs="Helvetica Neue"/>
+          <w:sz w:val="24"/>
+          <w:sz-cs w:val="24"/>
+          <w:spacing w:val="0"/>
+          <w:color w:val="181F26"/>
+        </w:rPr>
+        <w:t xml:space="preserve">, </w:t>
       </w:r>
       <w:r>
         <w:rPr>
@@ -6456,17 +6741,38 @@
           <w:spacing w:val="0"/>
           <w:color w:val="0000E9"/>
         </w:rPr>
-        <w:t xml:space="preserve">evaluation</w:t>
-      </w:r>
-      <w:r>
-        <w:rPr>
-          <w:rFonts w:ascii="Helvetica Neue" w:hAnsi="Helvetica Neue" w:cs="Helvetica Neue"/>
-          <w:sz w:val="24"/>
-          <w:sz-cs w:val="24"/>
-          <w:spacing w:val="0"/>
-          <w:color w:val="181F26"/>
-        </w:rPr>
-        <w:t xml:space="preserve"> model: traces, evaluation, review, and feedback loops. Crawfish should absorb that lesson at the runtime layer.</w:t>
+        <w:t xml:space="preserve">annotation queues</w:t>
+      </w:r>
+      <w:r>
+        <w:rPr>
+          <w:rFonts w:ascii="Helvetica Neue" w:hAnsi="Helvetica Neue" w:cs="Helvetica Neue"/>
+          <w:sz w:val="24"/>
+          <w:sz-cs w:val="24"/>
+          <w:spacing w:val="0"/>
+          <w:color w:val="181F26"/>
+        </w:rPr>
+        <w:t xml:space="preserve">, and </w:t>
+      </w:r>
+      <w:r>
+        <w:rPr>
+          <w:rFonts w:ascii="Helvetica Neue" w:hAnsi="Helvetica Neue" w:cs="Helvetica Neue"/>
+          <w:sz w:val="24"/>
+          <w:sz-cs w:val="24"/>
+          <w:u w:val="single"/>
+          <w:spacing w:val="0"/>
+          <w:color w:val="0000E9"/>
+        </w:rPr>
+        <w:t xml:space="preserve">automation rules</w:t>
+      </w:r>
+      <w:r>
+        <w:rPr>
+          <w:rFonts w:ascii="Helvetica Neue" w:hAnsi="Helvetica Neue" w:cs="Helvetica Neue"/>
+          <w:sz w:val="24"/>
+          <w:sz-cs w:val="24"/>
+          <w:spacing w:val="0"/>
+          <w:color w:val="181F26"/>
+        </w:rPr>
+        <w:t xml:space="preserve">: traces, evaluation, review, and operator automation belong to one system. Crawfish should absorb that lesson at the runtime layer.</w:t>
       </w:r>
     </w:p>
     <w:p>
@@ -6594,6 +6900,62 @@
           <w:color w:val="181F26"/>
         </w:rPr>
         <w:t xml:space="preserve">feedback should be structured and reusable, not trapped in ad-hoc operator memory</w:t>
+      </w:r>
+    </w:p>
+    <w:p>
+      <w:pPr>
+        <w:ind w:left="720" w:first-line="-720"/>
+      </w:pPr>
+      <w:r>
+        <w:rPr>
+          <w:rFonts w:ascii="Helvetica Neue" w:hAnsi="Helvetica Neue" w:cs="Helvetica Neue"/>
+          <w:sz w:val="24"/>
+          <w:sz-cs w:val="24"/>
+          <w:color w:val="181F26"/>
+        </w:rPr>
+        <w:t xml:space="preserve"/>
+        <w:tab/>
+        <w:t xml:space="preserve">•</w:t>
+        <w:tab/>
+        <w:t xml:space="preserve"/>
+      </w:r>
+      <w:r>
+        <w:rPr>
+          <w:rFonts w:ascii="Helvetica Neue" w:hAnsi="Helvetica Neue" w:cs="Helvetica Neue"/>
+          <w:sz w:val="24"/>
+          <w:sz-cs w:val="24"/>
+          <w:spacing w:val="0"/>
+          <w:color w:val="181F26"/>
+        </w:rPr>
+        <w:t xml:space="preserve">dataset cases should turn production traces into replayable institutional memory</w:t>
+      </w:r>
+    </w:p>
+    <w:p>
+      <w:pPr>
+        <w:ind w:left="720" w:first-line="-720"/>
+      </w:pPr>
+      <w:r>
+        <w:rPr>
+          <w:rFonts w:ascii="Helvetica Neue" w:hAnsi="Helvetica Neue" w:cs="Helvetica Neue"/>
+          <w:sz w:val="24"/>
+          <w:sz-cs w:val="24"/>
+          <w:color w:val="181F26"/>
+        </w:rPr>
+        <w:t xml:space="preserve"/>
+        <w:tab/>
+        <w:t xml:space="preserve">•</w:t>
+        <w:tab/>
+        <w:t xml:space="preserve"/>
+      </w:r>
+      <w:r>
+        <w:rPr>
+          <w:rFonts w:ascii="Helvetica Neue" w:hAnsi="Helvetica Neue" w:cs="Helvetica Neue"/>
+          <w:sz w:val="24"/>
+          <w:sz-cs w:val="24"/>
+          <w:spacing w:val="0"/>
+          <w:color w:val="181F26"/>
+        </w:rPr>
+        <w:t xml:space="preserve">replay experiments should let the swarm learn from prior work without contaminating production operator queues</w:t>
       </w:r>
     </w:p>
     <w:p>
@@ -6624,7 +6986,7 @@
           <w:spacing w:val="0"/>
           <w:color w:val="102C4B"/>
         </w:rPr>
-        <w:t xml:space="preserve">Principle 8: Design For Future Multi-Owner Encounters, Not Yesterday's App Sandbox</w:t>
+        <w:t xml:space="preserve">Principle 8: Institutions Lag Capability Growth</w:t>
       </w:r>
     </w:p>
     <w:p>
@@ -6639,7 +7001,7 @@
           <w:spacing w:val="0"/>
           <w:color w:val="181F26"/>
         </w:rPr>
-        <w:t xml:space="preserve">The same laptop is already a frontier.</w:t>
+        <w:t xml:space="preserve">Capability growth outruns process. That is not a temporary bug in the market; it is the normal order of technological change.</w:t>
       </w:r>
     </w:p>
     <w:p>
@@ -6654,7 +7016,7 @@
           <w:spacing w:val="0"/>
           <w:color w:val="181F26"/>
         </w:rPr>
-        <w:t xml:space="preserve">A local swarm can contain a personal agent, a company-bound agent, a tool-driven ops agent, and a roaming harness-backed session, each with different owners, context, and rights. The runtime should therefore assume that future federation problems are already visible locally in smaller form.</w:t>
+        <w:t xml:space="preserve">The relevant system question is therefore not whether constitutions, enterprise processes, and norms matter. They do. The question is whether the runtime can keep order while those institutions are still catching up.</w:t>
       </w:r>
     </w:p>
     <w:p>
@@ -6669,119 +7031,119 @@
           <w:spacing w:val="0"/>
           <w:color w:val="181F26"/>
         </w:rPr>
-        <w:t xml:space="preserve">That means:</w:t>
-      </w:r>
-    </w:p>
-    <w:p>
-      <w:pPr>
-        <w:ind w:left="720" w:first-line="-720"/>
-      </w:pPr>
-      <w:r>
-        <w:rPr>
-          <w:rFonts w:ascii="Helvetica Neue" w:hAnsi="Helvetica Neue" w:cs="Helvetica Neue"/>
-          <w:sz w:val="24"/>
-          <w:sz-cs w:val="24"/>
-          <w:color w:val="181F26"/>
-        </w:rPr>
-        <w:t xml:space="preserve"/>
-        <w:tab/>
-        <w:t xml:space="preserve">•</w:t>
-        <w:tab/>
-        <w:t xml:space="preserve"/>
-      </w:r>
-      <w:r>
-        <w:rPr>
-          <w:rFonts w:ascii="Helvetica Neue" w:hAnsi="Helvetica Neue" w:cs="Helvetica Neue"/>
-          <w:sz w:val="24"/>
-          <w:sz-cs w:val="24"/>
-          <w:spacing w:val="0"/>
-          <w:color w:val="181F26"/>
-        </w:rPr>
-        <w:t xml:space="preserve">same-device foreign-owner encounters are first-class</w:t>
-      </w:r>
-    </w:p>
-    <w:p>
-      <w:pPr>
-        <w:ind w:left="720" w:first-line="-720"/>
-      </w:pPr>
-      <w:r>
-        <w:rPr>
-          <w:rFonts w:ascii="Helvetica Neue" w:hAnsi="Helvetica Neue" w:cs="Helvetica Neue"/>
-          <w:sz w:val="24"/>
-          <w:sz-cs w:val="24"/>
-          <w:color w:val="181F26"/>
-        </w:rPr>
-        <w:t xml:space="preserve"/>
-        <w:tab/>
-        <w:t xml:space="preserve">•</w:t>
-        <w:tab/>
-        <w:t xml:space="preserve"/>
-      </w:r>
-      <w:r>
-        <w:rPr>
-          <w:rFonts w:ascii="Helvetica Neue" w:hAnsi="Helvetica Neue" w:cs="Helvetica Neue"/>
-          <w:sz w:val="24"/>
-          <w:sz-cs w:val="24"/>
-          <w:spacing w:val="0"/>
-          <w:color w:val="181F26"/>
-        </w:rPr>
-        <w:t xml:space="preserve">workspace, memory, secrets, and network access are boundary objects</w:t>
-      </w:r>
-    </w:p>
-    <w:p>
-      <w:pPr>
-        <w:ind w:left="720" w:first-line="-720"/>
-      </w:pPr>
-      <w:r>
-        <w:rPr>
-          <w:rFonts w:ascii="Helvetica Neue" w:hAnsi="Helvetica Neue" w:cs="Helvetica Neue"/>
-          <w:sz w:val="24"/>
-          <w:sz-cs w:val="24"/>
-          <w:color w:val="181F26"/>
-        </w:rPr>
-        <w:t xml:space="preserve"/>
-        <w:tab/>
-        <w:t xml:space="preserve">•</w:t>
-        <w:tab/>
-        <w:t xml:space="preserve"/>
-      </w:r>
-      <w:r>
-        <w:rPr>
-          <w:rFonts w:ascii="Helvetica Neue" w:hAnsi="Helvetica Neue" w:cs="Helvetica Neue"/>
-          <w:sz w:val="24"/>
-          <w:sz-cs w:val="24"/>
-          <w:spacing w:val="0"/>
-          <w:color w:val="181F26"/>
-        </w:rPr>
-        <w:t xml:space="preserve">cooperation is leased, not implied</w:t>
-      </w:r>
-    </w:p>
-    <w:p>
-      <w:pPr>
-        <w:ind w:left="720" w:first-line="-720"/>
-      </w:pPr>
-      <w:r>
-        <w:rPr>
-          <w:rFonts w:ascii="Helvetica Neue" w:hAnsi="Helvetica Neue" w:cs="Helvetica Neue"/>
-          <w:sz w:val="24"/>
-          <w:sz-cs w:val="24"/>
-          <w:color w:val="181F26"/>
-        </w:rPr>
-        <w:t xml:space="preserve"/>
-        <w:tab/>
-        <w:t xml:space="preserve">•</w:t>
-        <w:tab/>
-        <w:t xml:space="preserve"/>
-      </w:r>
-      <w:r>
-        <w:rPr>
-          <w:rFonts w:ascii="Helvetica Neue" w:hAnsi="Helvetica Neue" w:cs="Helvetica Neue"/>
-          <w:sz w:val="24"/>
-          <w:sz-cs w:val="24"/>
-          <w:spacing w:val="0"/>
-          <w:color w:val="181F26"/>
-        </w:rPr>
-        <w:t xml:space="preserve">inspection and audit are product behavior, not incident response afterthoughts</w:t>
+        <w:t xml:space="preserve">Crawfish should assume:</w:t>
+      </w:r>
+    </w:p>
+    <w:p>
+      <w:pPr>
+        <w:ind w:left="720" w:first-line="-720"/>
+      </w:pPr>
+      <w:r>
+        <w:rPr>
+          <w:rFonts w:ascii="Helvetica Neue" w:hAnsi="Helvetica Neue" w:cs="Helvetica Neue"/>
+          <w:sz w:val="24"/>
+          <w:sz-cs w:val="24"/>
+          <w:color w:val="181F26"/>
+        </w:rPr>
+        <w:t xml:space="preserve"/>
+        <w:tab/>
+        <w:t xml:space="preserve">•</w:t>
+        <w:tab/>
+        <w:t xml:space="preserve"/>
+      </w:r>
+      <w:r>
+        <w:rPr>
+          <w:rFonts w:ascii="Helvetica Neue" w:hAnsi="Helvetica Neue" w:cs="Helvetica Neue"/>
+          <w:sz w:val="24"/>
+          <w:sz-cs w:val="24"/>
+          <w:spacing w:val="0"/>
+          <w:color w:val="181F26"/>
+        </w:rPr>
+        <w:t xml:space="preserve">model behavior standards will remain partial and uneven</w:t>
+      </w:r>
+    </w:p>
+    <w:p>
+      <w:pPr>
+        <w:ind w:left="720" w:first-line="-720"/>
+      </w:pPr>
+      <w:r>
+        <w:rPr>
+          <w:rFonts w:ascii="Helvetica Neue" w:hAnsi="Helvetica Neue" w:cs="Helvetica Neue"/>
+          <w:sz w:val="24"/>
+          <w:sz-cs w:val="24"/>
+          <w:color w:val="181F26"/>
+        </w:rPr>
+        <w:t xml:space="preserve"/>
+        <w:tab/>
+        <w:t xml:space="preserve">•</w:t>
+        <w:tab/>
+        <w:t xml:space="preserve"/>
+      </w:r>
+      <w:r>
+        <w:rPr>
+          <w:rFonts w:ascii="Helvetica Neue" w:hAnsi="Helvetica Neue" w:cs="Helvetica Neue"/>
+          <w:sz w:val="24"/>
+          <w:sz-cs w:val="24"/>
+          <w:spacing w:val="0"/>
+          <w:color w:val="181F26"/>
+        </w:rPr>
+        <w:t xml:space="preserve">organizational review capacity will be limited</w:t>
+      </w:r>
+    </w:p>
+    <w:p>
+      <w:pPr>
+        <w:ind w:left="720" w:first-line="-720"/>
+      </w:pPr>
+      <w:r>
+        <w:rPr>
+          <w:rFonts w:ascii="Helvetica Neue" w:hAnsi="Helvetica Neue" w:cs="Helvetica Neue"/>
+          <w:sz w:val="24"/>
+          <w:sz-cs w:val="24"/>
+          <w:color w:val="181F26"/>
+        </w:rPr>
+        <w:t xml:space="preserve"/>
+        <w:tab/>
+        <w:t xml:space="preserve">•</w:t>
+        <w:tab/>
+        <w:t xml:space="preserve"/>
+      </w:r>
+      <w:r>
+        <w:rPr>
+          <w:rFonts w:ascii="Helvetica Neue" w:hAnsi="Helvetica Neue" w:cs="Helvetica Neue"/>
+          <w:sz w:val="24"/>
+          <w:sz-cs w:val="24"/>
+          <w:spacing w:val="0"/>
+          <w:color w:val="181F26"/>
+        </w:rPr>
+        <w:t xml:space="preserve">multi-owner swarm encounters will arrive before ecosystem-wide treaties do</w:t>
+      </w:r>
+    </w:p>
+    <w:p>
+      <w:pPr>
+        <w:ind w:left="720" w:first-line="-720"/>
+      </w:pPr>
+      <w:r>
+        <w:rPr>
+          <w:rFonts w:ascii="Helvetica Neue" w:hAnsi="Helvetica Neue" w:cs="Helvetica Neue"/>
+          <w:sz w:val="24"/>
+          <w:sz-cs w:val="24"/>
+          <w:color w:val="181F26"/>
+        </w:rPr>
+        <w:t xml:space="preserve"/>
+        <w:tab/>
+        <w:t xml:space="preserve">•</w:t>
+        <w:tab/>
+        <w:t xml:space="preserve"/>
+      </w:r>
+      <w:r>
+        <w:rPr>
+          <w:rFonts w:ascii="Helvetica Neue" w:hAnsi="Helvetica Neue" w:cs="Helvetica Neue"/>
+          <w:sz w:val="24"/>
+          <w:sz-cs w:val="24"/>
+          <w:spacing w:val="0"/>
+          <w:color w:val="181F26"/>
+        </w:rPr>
+        <w:t xml:space="preserve">evaluation and doctrine will need to serve as provisional institutional memory</w:t>
       </w:r>
     </w:p>
     <w:p>
@@ -6796,7 +7158,7 @@
           <w:spacing w:val="0"/>
           <w:color w:val="181F26"/>
         </w:rPr>
-        <w:t xml:space="preserve">If the local model is coherent, it can extend outward. If it is not coherent locally, no federation story will save it later.</w:t>
+        <w:t xml:space="preserve">This is why review queues, alerts, dataset capture, replay, and checkpoint evidence belong in the runtime itself rather than in post hoc dashboards alone.</w:t>
       </w:r>
     </w:p>
     <w:p>
@@ -6812,7 +7174,7 @@
           <w:spacing w:val="0"/>
           <w:color w:val="102C4B"/>
         </w:rPr>
-        <w:t xml:space="preserve">Design Consequences</w:t>
+        <w:t xml:space="preserve">Principle 9: Design For Future Multi-Owner Encounters, Not Yesterday's App Sandbox</w:t>
       </w:r>
     </w:p>
     <w:p>
@@ -6827,538 +7189,164 @@
           <w:spacing w:val="0"/>
           <w:color w:val="181F26"/>
         </w:rPr>
-        <w:t xml:space="preserve">These principles imply concrete architectural choices:</w:t>
-      </w:r>
-    </w:p>
-    <w:p>
-      <w:pPr>
-        <w:ind w:left="720" w:first-line="-720"/>
-      </w:pPr>
-      <w:r>
-        <w:rPr>
-          <w:rFonts w:ascii="Helvetica Neue" w:hAnsi="Helvetica Neue" w:cs="Helvetica Neue"/>
-          <w:sz w:val="24"/>
-          <w:sz-cs w:val="24"/>
-          <w:color w:val="181F26"/>
-        </w:rPr>
-        <w:t xml:space="preserve"/>
-        <w:tab/>
-        <w:t xml:space="preserve">•</w:t>
-        <w:tab/>
-        <w:t xml:space="preserve"/>
-      </w:r>
-      <w:r>
-        <w:rPr>
-          <w:rFonts w:ascii="Helvetica Neue" w:hAnsi="Helvetica Neue" w:cs="Helvetica Neue"/>
-          <w:sz w:val="24"/>
-          <w:sz-cs w:val="24"/>
-          <w:spacing w:val="0"/>
-          <w:color w:val="181F26"/>
-        </w:rPr>
-        <w:t xml:space="preserve">Crawfish is </w:t>
-      </w:r>
-      <w:r>
-        <w:rPr>
-          <w:rFonts w:ascii="Helvetica Neue" w:hAnsi="Helvetica Neue" w:cs="Helvetica Neue"/>
-          <w:sz w:val="24"/>
-          <w:sz-cs w:val="24"/>
-          <w:b/>
-          <w:spacing w:val="0"/>
-          <w:color w:val="181F26"/>
-        </w:rPr>
-        <w:t xml:space="preserve">Rust-first, not Rust-only</w:t>
-      </w:r>
-      <w:r>
-        <w:rPr>
-          <w:rFonts w:ascii="Helvetica Neue" w:hAnsi="Helvetica Neue" w:cs="Helvetica Neue"/>
-          <w:sz w:val="24"/>
-          <w:sz-cs w:val="24"/>
-          <w:spacing w:val="0"/>
-          <w:color w:val="181F26"/>
-        </w:rPr>
-        <w:t xml:space="preserve"/>
-      </w:r>
-    </w:p>
-    <w:p>
-      <w:pPr>
-        <w:ind w:left="720" w:first-line="-720"/>
-      </w:pPr>
-      <w:r>
-        <w:rPr>
-          <w:rFonts w:ascii="Helvetica Neue" w:hAnsi="Helvetica Neue" w:cs="Helvetica Neue"/>
-          <w:sz w:val="24"/>
-          <w:sz-cs w:val="24"/>
-          <w:color w:val="181F26"/>
-        </w:rPr>
-        <w:t xml:space="preserve"/>
-        <w:tab/>
-        <w:t xml:space="preserve">•</w:t>
-        <w:tab/>
-        <w:t xml:space="preserve"/>
-      </w:r>
-      <w:r>
-        <w:rPr>
-          <w:rFonts w:ascii="Helvetica Neue" w:hAnsi="Helvetica Neue" w:cs="Helvetica Neue"/>
-          <w:sz w:val="24"/>
-          <w:sz-cs w:val="24"/>
-          <w:spacing w:val="0"/>
-          <w:color w:val="181F26"/>
-        </w:rPr>
-        <w:t xml:space="preserve">the runtime spine lives in Rust</w:t>
-      </w:r>
-    </w:p>
-    <w:p>
-      <w:pPr>
-        <w:ind w:left="720" w:first-line="-720"/>
-      </w:pPr>
-      <w:r>
-        <w:rPr>
-          <w:rFonts w:ascii="Helvetica Neue" w:hAnsi="Helvetica Neue" w:cs="Helvetica Neue"/>
-          <w:sz w:val="24"/>
-          <w:sz-cs w:val="24"/>
-          <w:color w:val="181F26"/>
-        </w:rPr>
-        <w:t xml:space="preserve"/>
-        <w:tab/>
-        <w:t xml:space="preserve">•</w:t>
-        <w:tab/>
-        <w:t xml:space="preserve"/>
-      </w:r>
-      <w:r>
-        <w:rPr>
-          <w:rFonts w:ascii="Helvetica Neue" w:hAnsi="Helvetica Neue" w:cs="Helvetica Neue"/>
-          <w:sz w:val="24"/>
-          <w:sz-cs w:val="24"/>
-          <w:spacing w:val="0"/>
-          <w:color w:val="181F26"/>
-        </w:rPr>
-        <w:t xml:space="preserve">isolated edge bridges may use other languages when that lowers integration friction</w:t>
-      </w:r>
-    </w:p>
-    <w:p>
-      <w:pPr>
-        <w:ind w:left="720" w:first-line="-720"/>
-      </w:pPr>
-      <w:r>
-        <w:rPr>
-          <w:rFonts w:ascii="Helvetica Neue" w:hAnsi="Helvetica Neue" w:cs="Helvetica Neue"/>
-          <w:sz w:val="24"/>
-          <w:sz-cs w:val="24"/>
-          <w:color w:val="181F26"/>
-        </w:rPr>
-        <w:t xml:space="preserve"/>
-        <w:tab/>
-        <w:t xml:space="preserve">•</w:t>
-        <w:tab/>
-        <w:t xml:space="preserve"/>
-      </w:r>
-      <w:r>
-        <w:rPr>
-          <w:rFonts w:ascii="Helvetica Neue" w:hAnsi="Helvetica Neue" w:cs="Helvetica Neue"/>
-          <w:sz w:val="24"/>
-          <w:sz-cs w:val="24"/>
-          <w:spacing w:val="0"/>
-          <w:color w:val="181F26"/>
-        </w:rPr>
-        <w:t xml:space="preserve">execution strategy is separate from harness selection</w:t>
-      </w:r>
-    </w:p>
-    <w:p>
-      <w:pPr>
-        <w:ind w:left="720" w:first-line="-720"/>
-      </w:pPr>
-      <w:r>
-        <w:rPr>
-          <w:rFonts w:ascii="Menlo" w:hAnsi="Menlo" w:cs="Menlo"/>
-          <w:sz w:val="24"/>
-          <w:sz-cs w:val="24"/>
-          <w:color w:val="181F26"/>
-        </w:rPr>
-        <w:t xml:space="preserve"/>
-        <w:tab/>
-        <w:t xml:space="preserve">•</w:t>
-        <w:tab/>
-        <w:t xml:space="preserve"/>
-      </w:r>
-      <w:r>
-        <w:rPr>
-          <w:rFonts w:ascii="Menlo" w:hAnsi="Menlo" w:cs="Menlo"/>
-          <w:sz w:val="24"/>
-          <w:sz-cs w:val="24"/>
-          <w:spacing w:val="0"/>
-          <w:color w:val="181F26"/>
-        </w:rPr>
-        <w:t xml:space="preserve">single_pass</w:t>
-      </w:r>
-      <w:r>
-        <w:rPr>
-          <w:rFonts w:ascii="Helvetica Neue" w:hAnsi="Helvetica Neue" w:cs="Helvetica Neue"/>
-          <w:sz w:val="24"/>
-          <w:sz-cs w:val="24"/>
-          <w:spacing w:val="0"/>
-          <w:color w:val="181F26"/>
-        </w:rPr>
-        <w:t xml:space="preserve"> and </w:t>
-      </w:r>
-      <w:r>
-        <w:rPr>
-          <w:rFonts w:ascii="Menlo" w:hAnsi="Menlo" w:cs="Menlo"/>
-          <w:sz w:val="24"/>
-          <w:sz-cs w:val="24"/>
-          <w:spacing w:val="0"/>
-          <w:color w:val="181F26"/>
-        </w:rPr>
-        <w:t xml:space="preserve">verify_loop</w:t>
-      </w:r>
-      <w:r>
-        <w:rPr>
-          <w:rFonts w:ascii="Helvetica Neue" w:hAnsi="Helvetica Neue" w:cs="Helvetica Neue"/>
-          <w:sz w:val="24"/>
-          <w:sz-cs w:val="24"/>
-          <w:spacing w:val="0"/>
-          <w:color w:val="181F26"/>
-        </w:rPr>
-        <w:t xml:space="preserve"> are runtime patterns</w:t>
-      </w:r>
-    </w:p>
-    <w:p>
-      <w:pPr>
-        <w:ind w:left="720" w:first-line="-720"/>
-      </w:pPr>
-      <w:r>
-        <w:rPr>
-          <w:rFonts w:ascii="Helvetica Neue" w:hAnsi="Helvetica Neue" w:cs="Helvetica Neue"/>
-          <w:sz w:val="24"/>
-          <w:sz-cs w:val="24"/>
-          <w:color w:val="181F26"/>
-        </w:rPr>
-        <w:t xml:space="preserve"/>
-        <w:tab/>
-        <w:t xml:space="preserve">•</w:t>
-        <w:tab/>
-        <w:t xml:space="preserve"/>
-      </w:r>
-      <w:r>
-        <w:rPr>
-          <w:rFonts w:ascii="Helvetica Neue" w:hAnsi="Helvetica Neue" w:cs="Helvetica Neue"/>
-          <w:sz w:val="24"/>
-          <w:sz-cs w:val="24"/>
-          <w:spacing w:val="0"/>
-          <w:color w:val="181F26"/>
-        </w:rPr>
-        <w:t xml:space="preserve">OpenClaw, deterministic executors, and future adapters are execution surfaces</w:t>
-      </w:r>
-    </w:p>
-    <w:p>
-      <w:pPr>
-        <w:ind w:left="720" w:first-line="-720"/>
-      </w:pPr>
-      <w:r>
-        <w:rPr>
-          <w:rFonts w:ascii="Helvetica Neue" w:hAnsi="Helvetica Neue" w:cs="Helvetica Neue"/>
-          <w:sz w:val="24"/>
-          <w:sz-cs w:val="24"/>
-          <w:color w:val="181F26"/>
-        </w:rPr>
-        <w:t xml:space="preserve"/>
-        <w:tab/>
-        <w:t xml:space="preserve">•</w:t>
-        <w:tab/>
-        <w:t xml:space="preserve"/>
-      </w:r>
-      <w:r>
-        <w:rPr>
-          <w:rFonts w:ascii="Helvetica Neue" w:hAnsi="Helvetica Neue" w:cs="Helvetica Neue"/>
-          <w:sz w:val="24"/>
-          <w:sz-cs w:val="24"/>
-          <w:spacing w:val="0"/>
-          <w:color w:val="181F26"/>
-        </w:rPr>
-        <w:t xml:space="preserve">continuity and governance are product surfaces</w:t>
-      </w:r>
-    </w:p>
-    <w:p>
-      <w:pPr>
-        <w:ind w:left="720" w:first-line="-720"/>
-      </w:pPr>
-      <w:r>
-        <w:rPr>
-          <w:rFonts w:ascii="Helvetica Neue" w:hAnsi="Helvetica Neue" w:cs="Helvetica Neue"/>
-          <w:sz w:val="24"/>
-          <w:sz-cs w:val="24"/>
-          <w:color w:val="181F26"/>
-        </w:rPr>
-        <w:t xml:space="preserve"/>
-        <w:tab/>
-        <w:t xml:space="preserve">•</w:t>
-        <w:tab/>
-        <w:t xml:space="preserve"/>
-      </w:r>
-      <w:r>
-        <w:rPr>
-          <w:rFonts w:ascii="Helvetica Neue" w:hAnsi="Helvetica Neue" w:cs="Helvetica Neue"/>
-          <w:sz w:val="24"/>
-          <w:sz-cs w:val="24"/>
-          <w:spacing w:val="0"/>
-          <w:color w:val="181F26"/>
-        </w:rPr>
-        <w:t xml:space="preserve">not hidden in internal scripts</w:t>
-      </w:r>
-    </w:p>
-    <w:p>
-      <w:pPr>
-        <w:ind w:left="720" w:first-line="-720"/>
-      </w:pPr>
-      <w:r>
-        <w:rPr>
-          <w:rFonts w:ascii="Helvetica Neue" w:hAnsi="Helvetica Neue" w:cs="Helvetica Neue"/>
-          <w:sz w:val="24"/>
-          <w:sz-cs w:val="24"/>
-          <w:color w:val="181F26"/>
-        </w:rPr>
-        <w:t xml:space="preserve"/>
-        <w:tab/>
-        <w:t xml:space="preserve">•</w:t>
-        <w:tab/>
-        <w:t xml:space="preserve"/>
-      </w:r>
-      <w:r>
-        <w:rPr>
-          <w:rFonts w:ascii="Helvetica Neue" w:hAnsi="Helvetica Neue" w:cs="Helvetica Neue"/>
-          <w:sz w:val="24"/>
-          <w:sz-cs w:val="24"/>
-          <w:spacing w:val="0"/>
-          <w:color w:val="181F26"/>
-        </w:rPr>
-        <w:t xml:space="preserve">not left to application glue</w:t>
-      </w:r>
-    </w:p>
-    <w:p>
-      <w:pPr>
-        <w:ind w:left="720" w:first-line="-720"/>
-      </w:pPr>
-      <w:r>
-        <w:rPr>
-          <w:rFonts w:ascii="Helvetica Neue" w:hAnsi="Helvetica Neue" w:cs="Helvetica Neue"/>
-          <w:sz w:val="24"/>
-          <w:sz-cs w:val="24"/>
-          <w:color w:val="181F26"/>
-        </w:rPr>
-        <w:t xml:space="preserve"/>
-        <w:tab/>
-        <w:t xml:space="preserve">•</w:t>
-        <w:tab/>
-        <w:t xml:space="preserve"/>
-      </w:r>
-      <w:r>
-        <w:rPr>
-          <w:rFonts w:ascii="Helvetica Neue" w:hAnsi="Helvetica Neue" w:cs="Helvetica Neue"/>
-          <w:sz w:val="24"/>
-          <w:sz-cs w:val="24"/>
-          <w:spacing w:val="0"/>
-          <w:color w:val="181F26"/>
-        </w:rPr>
-        <w:t xml:space="preserve">doctrine and evaluation are runtime layers</w:t>
-      </w:r>
-    </w:p>
-    <w:p>
-      <w:pPr>
-        <w:ind w:left="720" w:first-line="-720"/>
-      </w:pPr>
-      <w:r>
-        <w:rPr>
-          <w:rFonts w:ascii="Helvetica Neue" w:hAnsi="Helvetica Neue" w:cs="Helvetica Neue"/>
-          <w:sz w:val="24"/>
-          <w:sz-cs w:val="24"/>
-          <w:color w:val="181F26"/>
-        </w:rPr>
-        <w:t xml:space="preserve"/>
-        <w:tab/>
-        <w:t xml:space="preserve">•</w:t>
-        <w:tab/>
-        <w:t xml:space="preserve"/>
-      </w:r>
-      <w:r>
-        <w:rPr>
-          <w:rFonts w:ascii="Helvetica Neue" w:hAnsi="Helvetica Neue" w:cs="Helvetica Neue"/>
-          <w:sz w:val="24"/>
-          <w:sz-cs w:val="24"/>
-          <w:spacing w:val="0"/>
-          <w:color w:val="181F26"/>
-        </w:rPr>
-        <w:t xml:space="preserve">not just documentation language</w:t>
-      </w:r>
-    </w:p>
-    <w:p>
-      <w:pPr>
-        <w:ind w:left="720" w:first-line="-720"/>
-      </w:pPr>
-      <w:r>
-        <w:rPr>
-          <w:rFonts w:ascii="Helvetica Neue" w:hAnsi="Helvetica Neue" w:cs="Helvetica Neue"/>
-          <w:sz w:val="24"/>
-          <w:sz-cs w:val="24"/>
-          <w:color w:val="181F26"/>
-        </w:rPr>
-        <w:t xml:space="preserve"/>
-        <w:tab/>
-        <w:t xml:space="preserve">•</w:t>
-        <w:tab/>
-        <w:t xml:space="preserve"/>
-      </w:r>
-      <w:r>
-        <w:rPr>
-          <w:rFonts w:ascii="Helvetica Neue" w:hAnsi="Helvetica Neue" w:cs="Helvetica Neue"/>
-          <w:sz w:val="24"/>
-          <w:sz-cs w:val="24"/>
-          <w:spacing w:val="0"/>
-          <w:color w:val="181F26"/>
-        </w:rPr>
-        <w:t xml:space="preserve">not only future UI ideas</w:t>
-      </w:r>
-    </w:p>
-    <w:p>
-      <w:pPr>
-        <w:ind w:left="720" w:first-line="-720"/>
-      </w:pPr>
-      <w:r>
-        <w:rPr>
-          <w:rFonts w:ascii="Helvetica Neue" w:hAnsi="Helvetica Neue" w:cs="Helvetica Neue"/>
-          <w:sz w:val="24"/>
-          <w:sz-cs w:val="24"/>
-          <w:color w:val="181F26"/>
-        </w:rPr>
-        <w:t xml:space="preserve"/>
-        <w:tab/>
-        <w:t xml:space="preserve">•</w:t>
-        <w:tab/>
-        <w:t xml:space="preserve"/>
-      </w:r>
-      <w:r>
-        <w:rPr>
-          <w:rFonts w:ascii="Helvetica Neue" w:hAnsi="Helvetica Neue" w:cs="Helvetica Neue"/>
-          <w:sz w:val="24"/>
-          <w:sz-cs w:val="24"/>
-          <w:spacing w:val="0"/>
-          <w:color w:val="181F26"/>
-        </w:rPr>
-        <w:t xml:space="preserve">public terminology should stay future-correct</w:t>
-      </w:r>
-    </w:p>
-    <w:p>
-      <w:pPr>
-        <w:ind w:left="720" w:first-line="-720"/>
-      </w:pPr>
-      <w:r>
-        <w:rPr>
-          <w:rFonts w:ascii="Menlo" w:hAnsi="Menlo" w:cs="Menlo"/>
-          <w:sz w:val="24"/>
-          <w:sz-cs w:val="24"/>
-          <w:color w:val="181F26"/>
-        </w:rPr>
-        <w:t xml:space="preserve"/>
-        <w:tab/>
-        <w:t xml:space="preserve">•</w:t>
-        <w:tab/>
-        <w:t xml:space="preserve"/>
-      </w:r>
-      <w:r>
-        <w:rPr>
-          <w:rFonts w:ascii="Menlo" w:hAnsi="Menlo" w:cs="Menlo"/>
-          <w:sz w:val="24"/>
-          <w:sz-cs w:val="24"/>
-          <w:spacing w:val="0"/>
-          <w:color w:val="181F26"/>
-        </w:rPr>
-        <w:t xml:space="preserve">swarm</w:t>
-      </w:r>
-      <w:r>
-        <w:rPr>
-          <w:rFonts w:ascii="Helvetica Neue" w:hAnsi="Helvetica Neue" w:cs="Helvetica Neue"/>
-          <w:sz w:val="24"/>
-          <w:sz-cs w:val="24"/>
-          <w:spacing w:val="0"/>
-          <w:color w:val="181F26"/>
-        </w:rPr>
-        <w:t xml:space="preserve">, not </w:t>
-      </w:r>
-      <w:r>
-        <w:rPr>
-          <w:rFonts w:ascii="Menlo" w:hAnsi="Menlo" w:cs="Menlo"/>
-          <w:sz w:val="24"/>
-          <w:sz-cs w:val="24"/>
-          <w:spacing w:val="0"/>
-          <w:color w:val="181F26"/>
-        </w:rPr>
-        <w:t xml:space="preserve">fleet</w:t>
-      </w:r>
-      <w:r>
-        <w:rPr>
-          <w:rFonts w:ascii="Helvetica Neue" w:hAnsi="Helvetica Neue" w:cs="Helvetica Neue"/>
-          <w:sz w:val="24"/>
-          <w:sz-cs w:val="24"/>
-          <w:spacing w:val="0"/>
-          <w:color w:val="181F26"/>
-        </w:rPr>
-        <w:t xml:space="preserve"/>
-      </w:r>
-    </w:p>
-    <w:p>
-      <w:pPr>
-        <w:ind w:left="720" w:first-line="-720"/>
-      </w:pPr>
-      <w:r>
-        <w:rPr>
-          <w:rFonts w:ascii="Menlo" w:hAnsi="Menlo" w:cs="Menlo"/>
-          <w:sz w:val="24"/>
-          <w:sz-cs w:val="24"/>
-          <w:color w:val="181F26"/>
-        </w:rPr>
-        <w:t xml:space="preserve"/>
-        <w:tab/>
-        <w:t xml:space="preserve">•</w:t>
-        <w:tab/>
-        <w:t xml:space="preserve"/>
-      </w:r>
-      <w:r>
-        <w:rPr>
-          <w:rFonts w:ascii="Menlo" w:hAnsi="Menlo" w:cs="Menlo"/>
-          <w:sz w:val="24"/>
-          <w:sz-cs w:val="24"/>
-          <w:spacing w:val="0"/>
-          <w:color w:val="181F26"/>
-        </w:rPr>
-        <w:t xml:space="preserve">general-purpose harness</w:t>
-      </w:r>
-      <w:r>
-        <w:rPr>
-          <w:rFonts w:ascii="Helvetica Neue" w:hAnsi="Helvetica Neue" w:cs="Helvetica Neue"/>
-          <w:sz w:val="24"/>
-          <w:sz-cs w:val="24"/>
-          <w:spacing w:val="0"/>
-          <w:color w:val="181F26"/>
-        </w:rPr>
-        <w:t xml:space="preserve">, not </w:t>
-      </w:r>
-      <w:r>
-        <w:rPr>
-          <w:rFonts w:ascii="Menlo" w:hAnsi="Menlo" w:cs="Menlo"/>
-          <w:sz w:val="24"/>
-          <w:sz-cs w:val="24"/>
-          <w:spacing w:val="0"/>
-          <w:color w:val="181F26"/>
-        </w:rPr>
-        <w:t xml:space="preserve">coding-only harness</w:t>
-      </w:r>
-      <w:r>
-        <w:rPr>
-          <w:rFonts w:ascii="Helvetica Neue" w:hAnsi="Helvetica Neue" w:cs="Helvetica Neue"/>
-          <w:sz w:val="24"/>
-          <w:sz-cs w:val="24"/>
-          <w:spacing w:val="0"/>
-          <w:color w:val="181F26"/>
-        </w:rPr>
-        <w:t xml:space="preserve"/>
+        <w:t xml:space="preserve">The same laptop is already a frontier.</w:t>
+      </w:r>
+    </w:p>
+    <w:p>
+      <w:pPr>
+        <w:spacing w:after="240"/>
+      </w:pPr>
+      <w:r>
+        <w:rPr>
+          <w:rFonts w:ascii="Helvetica Neue" w:hAnsi="Helvetica Neue" w:cs="Helvetica Neue"/>
+          <w:sz w:val="24"/>
+          <w:sz-cs w:val="24"/>
+          <w:spacing w:val="0"/>
+          <w:color w:val="181F26"/>
+        </w:rPr>
+        <w:t xml:space="preserve">A local swarm can contain a personal agent, a company-bound agent, a tool-driven ops agent, and a roaming harness-backed session, each with different owners, context, and rights. The runtime should therefore assume that future federation problems are already visible locally in smaller form.</w:t>
+      </w:r>
+    </w:p>
+    <w:p>
+      <w:pPr>
+        <w:spacing w:after="240"/>
+      </w:pPr>
+      <w:r>
+        <w:rPr>
+          <w:rFonts w:ascii="Helvetica Neue" w:hAnsi="Helvetica Neue" w:cs="Helvetica Neue"/>
+          <w:sz w:val="24"/>
+          <w:sz-cs w:val="24"/>
+          <w:spacing w:val="0"/>
+          <w:color w:val="181F26"/>
+        </w:rPr>
+        <w:t xml:space="preserve">That means:</w:t>
+      </w:r>
+    </w:p>
+    <w:p>
+      <w:pPr>
+        <w:ind w:left="720" w:first-line="-720"/>
+      </w:pPr>
+      <w:r>
+        <w:rPr>
+          <w:rFonts w:ascii="Helvetica Neue" w:hAnsi="Helvetica Neue" w:cs="Helvetica Neue"/>
+          <w:sz w:val="24"/>
+          <w:sz-cs w:val="24"/>
+          <w:color w:val="181F26"/>
+        </w:rPr>
+        <w:t xml:space="preserve"/>
+        <w:tab/>
+        <w:t xml:space="preserve">•</w:t>
+        <w:tab/>
+        <w:t xml:space="preserve"/>
+      </w:r>
+      <w:r>
+        <w:rPr>
+          <w:rFonts w:ascii="Helvetica Neue" w:hAnsi="Helvetica Neue" w:cs="Helvetica Neue"/>
+          <w:sz w:val="24"/>
+          <w:sz-cs w:val="24"/>
+          <w:spacing w:val="0"/>
+          <w:color w:val="181F26"/>
+        </w:rPr>
+        <w:t xml:space="preserve">same-device foreign-owner encounters are first-class</w:t>
+      </w:r>
+    </w:p>
+    <w:p>
+      <w:pPr>
+        <w:ind w:left="720" w:first-line="-720"/>
+      </w:pPr>
+      <w:r>
+        <w:rPr>
+          <w:rFonts w:ascii="Helvetica Neue" w:hAnsi="Helvetica Neue" w:cs="Helvetica Neue"/>
+          <w:sz w:val="24"/>
+          <w:sz-cs w:val="24"/>
+          <w:color w:val="181F26"/>
+        </w:rPr>
+        <w:t xml:space="preserve"/>
+        <w:tab/>
+        <w:t xml:space="preserve">•</w:t>
+        <w:tab/>
+        <w:t xml:space="preserve"/>
+      </w:r>
+      <w:r>
+        <w:rPr>
+          <w:rFonts w:ascii="Helvetica Neue" w:hAnsi="Helvetica Neue" w:cs="Helvetica Neue"/>
+          <w:sz w:val="24"/>
+          <w:sz-cs w:val="24"/>
+          <w:spacing w:val="0"/>
+          <w:color w:val="181F26"/>
+        </w:rPr>
+        <w:t xml:space="preserve">workspace, memory, secrets, and network access are boundary objects</w:t>
+      </w:r>
+    </w:p>
+    <w:p>
+      <w:pPr>
+        <w:ind w:left="720" w:first-line="-720"/>
+      </w:pPr>
+      <w:r>
+        <w:rPr>
+          <w:rFonts w:ascii="Helvetica Neue" w:hAnsi="Helvetica Neue" w:cs="Helvetica Neue"/>
+          <w:sz w:val="24"/>
+          <w:sz-cs w:val="24"/>
+          <w:color w:val="181F26"/>
+        </w:rPr>
+        <w:t xml:space="preserve"/>
+        <w:tab/>
+        <w:t xml:space="preserve">•</w:t>
+        <w:tab/>
+        <w:t xml:space="preserve"/>
+      </w:r>
+      <w:r>
+        <w:rPr>
+          <w:rFonts w:ascii="Helvetica Neue" w:hAnsi="Helvetica Neue" w:cs="Helvetica Neue"/>
+          <w:sz w:val="24"/>
+          <w:sz-cs w:val="24"/>
+          <w:spacing w:val="0"/>
+          <w:color w:val="181F26"/>
+        </w:rPr>
+        <w:t xml:space="preserve">cooperation is leased, not implied</w:t>
+      </w:r>
+    </w:p>
+    <w:p>
+      <w:pPr>
+        <w:ind w:left="720" w:first-line="-720"/>
+      </w:pPr>
+      <w:r>
+        <w:rPr>
+          <w:rFonts w:ascii="Helvetica Neue" w:hAnsi="Helvetica Neue" w:cs="Helvetica Neue"/>
+          <w:sz w:val="24"/>
+          <w:sz-cs w:val="24"/>
+          <w:color w:val="181F26"/>
+        </w:rPr>
+        <w:t xml:space="preserve"/>
+        <w:tab/>
+        <w:t xml:space="preserve">•</w:t>
+        <w:tab/>
+        <w:t xml:space="preserve"/>
+      </w:r>
+      <w:r>
+        <w:rPr>
+          <w:rFonts w:ascii="Helvetica Neue" w:hAnsi="Helvetica Neue" w:cs="Helvetica Neue"/>
+          <w:sz w:val="24"/>
+          <w:sz-cs w:val="24"/>
+          <w:spacing w:val="0"/>
+          <w:color w:val="181F26"/>
+        </w:rPr>
+        <w:t xml:space="preserve">inspection and audit are product behavior, not incident response afterthoughts</w:t>
+      </w:r>
+    </w:p>
+    <w:p>
+      <w:pPr>
+        <w:spacing w:after="240"/>
+      </w:pPr>
+      <w:r>
+        <w:rPr>
+          <w:rFonts w:ascii="Helvetica Neue" w:hAnsi="Helvetica Neue" w:cs="Helvetica Neue"/>
+          <w:sz w:val="24"/>
+          <w:sz-cs w:val="24"/>
+          <w:spacing w:val="0"/>
+          <w:color w:val="181F26"/>
+        </w:rPr>
+        <w:t xml:space="preserve">If the local model is coherent, it can extend outward. If it is not coherent locally, no federation story will save it later.</w:t>
       </w:r>
     </w:p>
     <w:p>
@@ -7374,6 +7362,568 @@
           <w:spacing w:val="0"/>
           <w:color w:val="102C4B"/>
         </w:rPr>
+        <w:t xml:space="preserve">Design Consequences</w:t>
+      </w:r>
+    </w:p>
+    <w:p>
+      <w:pPr>
+        <w:spacing w:after="240"/>
+      </w:pPr>
+      <w:r>
+        <w:rPr>
+          <w:rFonts w:ascii="Helvetica Neue" w:hAnsi="Helvetica Neue" w:cs="Helvetica Neue"/>
+          <w:sz w:val="24"/>
+          <w:sz-cs w:val="24"/>
+          <w:spacing w:val="0"/>
+          <w:color w:val="181F26"/>
+        </w:rPr>
+        <w:t xml:space="preserve">These principles imply concrete architectural choices:</w:t>
+      </w:r>
+    </w:p>
+    <w:p>
+      <w:pPr>
+        <w:ind w:left="720" w:first-line="-720"/>
+      </w:pPr>
+      <w:r>
+        <w:rPr>
+          <w:rFonts w:ascii="Helvetica Neue" w:hAnsi="Helvetica Neue" w:cs="Helvetica Neue"/>
+          <w:sz w:val="24"/>
+          <w:sz-cs w:val="24"/>
+          <w:color w:val="181F26"/>
+        </w:rPr>
+        <w:t xml:space="preserve"/>
+        <w:tab/>
+        <w:t xml:space="preserve">•</w:t>
+        <w:tab/>
+        <w:t xml:space="preserve"/>
+      </w:r>
+      <w:r>
+        <w:rPr>
+          <w:rFonts w:ascii="Helvetica Neue" w:hAnsi="Helvetica Neue" w:cs="Helvetica Neue"/>
+          <w:sz w:val="24"/>
+          <w:sz-cs w:val="24"/>
+          <w:spacing w:val="0"/>
+          <w:color w:val="181F26"/>
+        </w:rPr>
+        <w:t xml:space="preserve">Crawfish is </w:t>
+      </w:r>
+      <w:r>
+        <w:rPr>
+          <w:rFonts w:ascii="Helvetica Neue" w:hAnsi="Helvetica Neue" w:cs="Helvetica Neue"/>
+          <w:sz w:val="24"/>
+          <w:sz-cs w:val="24"/>
+          <w:b/>
+          <w:spacing w:val="0"/>
+          <w:color w:val="181F26"/>
+        </w:rPr>
+        <w:t xml:space="preserve">Rust-first, not Rust-only</w:t>
+      </w:r>
+      <w:r>
+        <w:rPr>
+          <w:rFonts w:ascii="Helvetica Neue" w:hAnsi="Helvetica Neue" w:cs="Helvetica Neue"/>
+          <w:sz w:val="24"/>
+          <w:sz-cs w:val="24"/>
+          <w:spacing w:val="0"/>
+          <w:color w:val="181F26"/>
+        </w:rPr>
+        <w:t xml:space="preserve"/>
+      </w:r>
+    </w:p>
+    <w:p>
+      <w:pPr>
+        <w:ind w:left="720" w:first-line="-720"/>
+      </w:pPr>
+      <w:r>
+        <w:rPr>
+          <w:rFonts w:ascii="Helvetica Neue" w:hAnsi="Helvetica Neue" w:cs="Helvetica Neue"/>
+          <w:sz w:val="24"/>
+          <w:sz-cs w:val="24"/>
+          <w:color w:val="181F26"/>
+        </w:rPr>
+        <w:t xml:space="preserve"/>
+        <w:tab/>
+        <w:t xml:space="preserve">•</w:t>
+        <w:tab/>
+        <w:t xml:space="preserve"/>
+      </w:r>
+      <w:r>
+        <w:rPr>
+          <w:rFonts w:ascii="Helvetica Neue" w:hAnsi="Helvetica Neue" w:cs="Helvetica Neue"/>
+          <w:sz w:val="24"/>
+          <w:sz-cs w:val="24"/>
+          <w:spacing w:val="0"/>
+          <w:color w:val="181F26"/>
+        </w:rPr>
+        <w:t xml:space="preserve">the runtime spine lives in Rust</w:t>
+      </w:r>
+    </w:p>
+    <w:p>
+      <w:pPr>
+        <w:ind w:left="720" w:first-line="-720"/>
+      </w:pPr>
+      <w:r>
+        <w:rPr>
+          <w:rFonts w:ascii="Helvetica Neue" w:hAnsi="Helvetica Neue" w:cs="Helvetica Neue"/>
+          <w:sz w:val="24"/>
+          <w:sz-cs w:val="24"/>
+          <w:color w:val="181F26"/>
+        </w:rPr>
+        <w:t xml:space="preserve"/>
+        <w:tab/>
+        <w:t xml:space="preserve">•</w:t>
+        <w:tab/>
+        <w:t xml:space="preserve"/>
+      </w:r>
+      <w:r>
+        <w:rPr>
+          <w:rFonts w:ascii="Helvetica Neue" w:hAnsi="Helvetica Neue" w:cs="Helvetica Neue"/>
+          <w:sz w:val="24"/>
+          <w:sz-cs w:val="24"/>
+          <w:spacing w:val="0"/>
+          <w:color w:val="181F26"/>
+        </w:rPr>
+        <w:t xml:space="preserve">isolated edge bridges may use other languages when that lowers integration friction</w:t>
+      </w:r>
+    </w:p>
+    <w:p>
+      <w:pPr>
+        <w:ind w:left="720" w:first-line="-720"/>
+      </w:pPr>
+      <w:r>
+        <w:rPr>
+          <w:rFonts w:ascii="Helvetica Neue" w:hAnsi="Helvetica Neue" w:cs="Helvetica Neue"/>
+          <w:sz w:val="24"/>
+          <w:sz-cs w:val="24"/>
+          <w:color w:val="181F26"/>
+        </w:rPr>
+        <w:t xml:space="preserve"/>
+        <w:tab/>
+        <w:t xml:space="preserve">•</w:t>
+        <w:tab/>
+        <w:t xml:space="preserve"/>
+      </w:r>
+      <w:r>
+        <w:rPr>
+          <w:rFonts w:ascii="Helvetica Neue" w:hAnsi="Helvetica Neue" w:cs="Helvetica Neue"/>
+          <w:sz w:val="24"/>
+          <w:sz-cs w:val="24"/>
+          <w:spacing w:val="0"/>
+          <w:color w:val="181F26"/>
+        </w:rPr>
+        <w:t xml:space="preserve">execution strategy is separate from harness selection</w:t>
+      </w:r>
+    </w:p>
+    <w:p>
+      <w:pPr>
+        <w:ind w:left="720" w:first-line="-720"/>
+      </w:pPr>
+      <w:r>
+        <w:rPr>
+          <w:rFonts w:ascii="Menlo" w:hAnsi="Menlo" w:cs="Menlo"/>
+          <w:sz w:val="24"/>
+          <w:sz-cs w:val="24"/>
+          <w:color w:val="181F26"/>
+        </w:rPr>
+        <w:t xml:space="preserve"/>
+        <w:tab/>
+        <w:t xml:space="preserve">•</w:t>
+        <w:tab/>
+        <w:t xml:space="preserve"/>
+      </w:r>
+      <w:r>
+        <w:rPr>
+          <w:rFonts w:ascii="Menlo" w:hAnsi="Menlo" w:cs="Menlo"/>
+          <w:sz w:val="24"/>
+          <w:sz-cs w:val="24"/>
+          <w:spacing w:val="0"/>
+          <w:color w:val="181F26"/>
+        </w:rPr>
+        <w:t xml:space="preserve">single_pass</w:t>
+      </w:r>
+      <w:r>
+        <w:rPr>
+          <w:rFonts w:ascii="Helvetica Neue" w:hAnsi="Helvetica Neue" w:cs="Helvetica Neue"/>
+          <w:sz w:val="24"/>
+          <w:sz-cs w:val="24"/>
+          <w:spacing w:val="0"/>
+          <w:color w:val="181F26"/>
+        </w:rPr>
+        <w:t xml:space="preserve"> and </w:t>
+      </w:r>
+      <w:r>
+        <w:rPr>
+          <w:rFonts w:ascii="Menlo" w:hAnsi="Menlo" w:cs="Menlo"/>
+          <w:sz w:val="24"/>
+          <w:sz-cs w:val="24"/>
+          <w:spacing w:val="0"/>
+          <w:color w:val="181F26"/>
+        </w:rPr>
+        <w:t xml:space="preserve">verify_loop</w:t>
+      </w:r>
+      <w:r>
+        <w:rPr>
+          <w:rFonts w:ascii="Helvetica Neue" w:hAnsi="Helvetica Neue" w:cs="Helvetica Neue"/>
+          <w:sz w:val="24"/>
+          <w:sz-cs w:val="24"/>
+          <w:spacing w:val="0"/>
+          <w:color w:val="181F26"/>
+        </w:rPr>
+        <w:t xml:space="preserve"> are runtime patterns</w:t>
+      </w:r>
+    </w:p>
+    <w:p>
+      <w:pPr>
+        <w:ind w:left="720" w:first-line="-720"/>
+      </w:pPr>
+      <w:r>
+        <w:rPr>
+          <w:rFonts w:ascii="Helvetica Neue" w:hAnsi="Helvetica Neue" w:cs="Helvetica Neue"/>
+          <w:sz w:val="24"/>
+          <w:sz-cs w:val="24"/>
+          <w:color w:val="181F26"/>
+        </w:rPr>
+        <w:t xml:space="preserve"/>
+        <w:tab/>
+        <w:t xml:space="preserve">•</w:t>
+        <w:tab/>
+        <w:t xml:space="preserve"/>
+      </w:r>
+      <w:r>
+        <w:rPr>
+          <w:rFonts w:ascii="Helvetica Neue" w:hAnsi="Helvetica Neue" w:cs="Helvetica Neue"/>
+          <w:sz w:val="24"/>
+          <w:sz-cs w:val="24"/>
+          <w:spacing w:val="0"/>
+          <w:color w:val="181F26"/>
+        </w:rPr>
+        <w:t xml:space="preserve">OpenClaw, deterministic executors, and future adapters are execution surfaces</w:t>
+      </w:r>
+    </w:p>
+    <w:p>
+      <w:pPr>
+        <w:ind w:left="720" w:first-line="-720"/>
+      </w:pPr>
+      <w:r>
+        <w:rPr>
+          <w:rFonts w:ascii="Helvetica Neue" w:hAnsi="Helvetica Neue" w:cs="Helvetica Neue"/>
+          <w:sz w:val="24"/>
+          <w:sz-cs w:val="24"/>
+          <w:color w:val="181F26"/>
+        </w:rPr>
+        <w:t xml:space="preserve"/>
+        <w:tab/>
+        <w:t xml:space="preserve">•</w:t>
+        <w:tab/>
+        <w:t xml:space="preserve"/>
+      </w:r>
+      <w:r>
+        <w:rPr>
+          <w:rFonts w:ascii="Helvetica Neue" w:hAnsi="Helvetica Neue" w:cs="Helvetica Neue"/>
+          <w:sz w:val="24"/>
+          <w:sz-cs w:val="24"/>
+          <w:spacing w:val="0"/>
+          <w:color w:val="181F26"/>
+        </w:rPr>
+        <w:t xml:space="preserve">continuity and governance are product surfaces</w:t>
+      </w:r>
+    </w:p>
+    <w:p>
+      <w:pPr>
+        <w:ind w:left="720" w:first-line="-720"/>
+      </w:pPr>
+      <w:r>
+        <w:rPr>
+          <w:rFonts w:ascii="Helvetica Neue" w:hAnsi="Helvetica Neue" w:cs="Helvetica Neue"/>
+          <w:sz w:val="24"/>
+          <w:sz-cs w:val="24"/>
+          <w:color w:val="181F26"/>
+        </w:rPr>
+        <w:t xml:space="preserve"/>
+        <w:tab/>
+        <w:t xml:space="preserve">•</w:t>
+        <w:tab/>
+        <w:t xml:space="preserve"/>
+      </w:r>
+      <w:r>
+        <w:rPr>
+          <w:rFonts w:ascii="Helvetica Neue" w:hAnsi="Helvetica Neue" w:cs="Helvetica Neue"/>
+          <w:sz w:val="24"/>
+          <w:sz-cs w:val="24"/>
+          <w:spacing w:val="0"/>
+          <w:color w:val="181F26"/>
+        </w:rPr>
+        <w:t xml:space="preserve">not hidden in internal scripts</w:t>
+      </w:r>
+    </w:p>
+    <w:p>
+      <w:pPr>
+        <w:ind w:left="720" w:first-line="-720"/>
+      </w:pPr>
+      <w:r>
+        <w:rPr>
+          <w:rFonts w:ascii="Helvetica Neue" w:hAnsi="Helvetica Neue" w:cs="Helvetica Neue"/>
+          <w:sz w:val="24"/>
+          <w:sz-cs w:val="24"/>
+          <w:color w:val="181F26"/>
+        </w:rPr>
+        <w:t xml:space="preserve"/>
+        <w:tab/>
+        <w:t xml:space="preserve">•</w:t>
+        <w:tab/>
+        <w:t xml:space="preserve"/>
+      </w:r>
+      <w:r>
+        <w:rPr>
+          <w:rFonts w:ascii="Helvetica Neue" w:hAnsi="Helvetica Neue" w:cs="Helvetica Neue"/>
+          <w:sz w:val="24"/>
+          <w:sz-cs w:val="24"/>
+          <w:spacing w:val="0"/>
+          <w:color w:val="181F26"/>
+        </w:rPr>
+        <w:t xml:space="preserve">not left to application glue</w:t>
+      </w:r>
+    </w:p>
+    <w:p>
+      <w:pPr>
+        <w:ind w:left="720" w:first-line="-720"/>
+      </w:pPr>
+      <w:r>
+        <w:rPr>
+          <w:rFonts w:ascii="Helvetica Neue" w:hAnsi="Helvetica Neue" w:cs="Helvetica Neue"/>
+          <w:sz w:val="24"/>
+          <w:sz-cs w:val="24"/>
+          <w:color w:val="181F26"/>
+        </w:rPr>
+        <w:t xml:space="preserve"/>
+        <w:tab/>
+        <w:t xml:space="preserve">•</w:t>
+        <w:tab/>
+        <w:t xml:space="preserve"/>
+      </w:r>
+      <w:r>
+        <w:rPr>
+          <w:rFonts w:ascii="Helvetica Neue" w:hAnsi="Helvetica Neue" w:cs="Helvetica Neue"/>
+          <w:sz w:val="24"/>
+          <w:sz-cs w:val="24"/>
+          <w:spacing w:val="0"/>
+          <w:color w:val="181F26"/>
+        </w:rPr>
+        <w:t xml:space="preserve">doctrine and evaluation are runtime layers</w:t>
+      </w:r>
+    </w:p>
+    <w:p>
+      <w:pPr>
+        <w:ind w:left="720" w:first-line="-720"/>
+      </w:pPr>
+      <w:r>
+        <w:rPr>
+          <w:rFonts w:ascii="Helvetica Neue" w:hAnsi="Helvetica Neue" w:cs="Helvetica Neue"/>
+          <w:sz w:val="24"/>
+          <w:sz-cs w:val="24"/>
+          <w:color w:val="181F26"/>
+        </w:rPr>
+        <w:t xml:space="preserve"/>
+        <w:tab/>
+        <w:t xml:space="preserve">•</w:t>
+        <w:tab/>
+        <w:t xml:space="preserve"/>
+      </w:r>
+      <w:r>
+        <w:rPr>
+          <w:rFonts w:ascii="Helvetica Neue" w:hAnsi="Helvetica Neue" w:cs="Helvetica Neue"/>
+          <w:sz w:val="24"/>
+          <w:sz-cs w:val="24"/>
+          <w:spacing w:val="0"/>
+          <w:color w:val="181F26"/>
+        </w:rPr>
+        <w:t xml:space="preserve">not just documentation language</w:t>
+      </w:r>
+    </w:p>
+    <w:p>
+      <w:pPr>
+        <w:ind w:left="720" w:first-line="-720"/>
+      </w:pPr>
+      <w:r>
+        <w:rPr>
+          <w:rFonts w:ascii="Helvetica Neue" w:hAnsi="Helvetica Neue" w:cs="Helvetica Neue"/>
+          <w:sz w:val="24"/>
+          <w:sz-cs w:val="24"/>
+          <w:color w:val="181F26"/>
+        </w:rPr>
+        <w:t xml:space="preserve"/>
+        <w:tab/>
+        <w:t xml:space="preserve">•</w:t>
+        <w:tab/>
+        <w:t xml:space="preserve"/>
+      </w:r>
+      <w:r>
+        <w:rPr>
+          <w:rFonts w:ascii="Helvetica Neue" w:hAnsi="Helvetica Neue" w:cs="Helvetica Neue"/>
+          <w:sz w:val="24"/>
+          <w:sz-cs w:val="24"/>
+          <w:spacing w:val="0"/>
+          <w:color w:val="181F26"/>
+        </w:rPr>
+        <w:t xml:space="preserve">not only future UI ideas</w:t>
+      </w:r>
+    </w:p>
+    <w:p>
+      <w:pPr>
+        <w:ind w:left="720" w:first-line="-720"/>
+      </w:pPr>
+      <w:r>
+        <w:rPr>
+          <w:rFonts w:ascii="Helvetica Neue" w:hAnsi="Helvetica Neue" w:cs="Helvetica Neue"/>
+          <w:sz w:val="24"/>
+          <w:sz-cs w:val="24"/>
+          <w:color w:val="181F26"/>
+        </w:rPr>
+        <w:t xml:space="preserve"/>
+        <w:tab/>
+        <w:t xml:space="preserve">•</w:t>
+        <w:tab/>
+        <w:t xml:space="preserve"/>
+      </w:r>
+      <w:r>
+        <w:rPr>
+          <w:rFonts w:ascii="Helvetica Neue" w:hAnsi="Helvetica Neue" w:cs="Helvetica Neue"/>
+          <w:sz w:val="24"/>
+          <w:sz-cs w:val="24"/>
+          <w:spacing w:val="0"/>
+          <w:color w:val="181F26"/>
+        </w:rPr>
+        <w:t xml:space="preserve">public terminology should stay future-correct</w:t>
+      </w:r>
+    </w:p>
+    <w:p>
+      <w:pPr>
+        <w:ind w:left="720" w:first-line="-720"/>
+      </w:pPr>
+      <w:r>
+        <w:rPr>
+          <w:rFonts w:ascii="Menlo" w:hAnsi="Menlo" w:cs="Menlo"/>
+          <w:sz w:val="24"/>
+          <w:sz-cs w:val="24"/>
+          <w:color w:val="181F26"/>
+        </w:rPr>
+        <w:t xml:space="preserve"/>
+        <w:tab/>
+        <w:t xml:space="preserve">•</w:t>
+        <w:tab/>
+        <w:t xml:space="preserve"/>
+      </w:r>
+      <w:r>
+        <w:rPr>
+          <w:rFonts w:ascii="Menlo" w:hAnsi="Menlo" w:cs="Menlo"/>
+          <w:sz w:val="24"/>
+          <w:sz-cs w:val="24"/>
+          <w:spacing w:val="0"/>
+          <w:color w:val="181F26"/>
+        </w:rPr>
+        <w:t xml:space="preserve">swarm</w:t>
+      </w:r>
+      <w:r>
+        <w:rPr>
+          <w:rFonts w:ascii="Helvetica Neue" w:hAnsi="Helvetica Neue" w:cs="Helvetica Neue"/>
+          <w:sz w:val="24"/>
+          <w:sz-cs w:val="24"/>
+          <w:spacing w:val="0"/>
+          <w:color w:val="181F26"/>
+        </w:rPr>
+        <w:t xml:space="preserve">, not </w:t>
+      </w:r>
+      <w:r>
+        <w:rPr>
+          <w:rFonts w:ascii="Menlo" w:hAnsi="Menlo" w:cs="Menlo"/>
+          <w:sz w:val="24"/>
+          <w:sz-cs w:val="24"/>
+          <w:spacing w:val="0"/>
+          <w:color w:val="181F26"/>
+        </w:rPr>
+        <w:t xml:space="preserve">fleet</w:t>
+      </w:r>
+      <w:r>
+        <w:rPr>
+          <w:rFonts w:ascii="Helvetica Neue" w:hAnsi="Helvetica Neue" w:cs="Helvetica Neue"/>
+          <w:sz w:val="24"/>
+          <w:sz-cs w:val="24"/>
+          <w:spacing w:val="0"/>
+          <w:color w:val="181F26"/>
+        </w:rPr>
+        <w:t xml:space="preserve"/>
+      </w:r>
+    </w:p>
+    <w:p>
+      <w:pPr>
+        <w:ind w:left="720" w:first-line="-720"/>
+      </w:pPr>
+      <w:r>
+        <w:rPr>
+          <w:rFonts w:ascii="Menlo" w:hAnsi="Menlo" w:cs="Menlo"/>
+          <w:sz w:val="24"/>
+          <w:sz-cs w:val="24"/>
+          <w:color w:val="181F26"/>
+        </w:rPr>
+        <w:t xml:space="preserve"/>
+        <w:tab/>
+        <w:t xml:space="preserve">•</w:t>
+        <w:tab/>
+        <w:t xml:space="preserve"/>
+      </w:r>
+      <w:r>
+        <w:rPr>
+          <w:rFonts w:ascii="Menlo" w:hAnsi="Menlo" w:cs="Menlo"/>
+          <w:sz w:val="24"/>
+          <w:sz-cs w:val="24"/>
+          <w:spacing w:val="0"/>
+          <w:color w:val="181F26"/>
+        </w:rPr>
+        <w:t xml:space="preserve">general-purpose harness</w:t>
+      </w:r>
+      <w:r>
+        <w:rPr>
+          <w:rFonts w:ascii="Helvetica Neue" w:hAnsi="Helvetica Neue" w:cs="Helvetica Neue"/>
+          <w:sz w:val="24"/>
+          <w:sz-cs w:val="24"/>
+          <w:spacing w:val="0"/>
+          <w:color w:val="181F26"/>
+        </w:rPr>
+        <w:t xml:space="preserve">, not </w:t>
+      </w:r>
+      <w:r>
+        <w:rPr>
+          <w:rFonts w:ascii="Menlo" w:hAnsi="Menlo" w:cs="Menlo"/>
+          <w:sz w:val="24"/>
+          <w:sz-cs w:val="24"/>
+          <w:spacing w:val="0"/>
+          <w:color w:val="181F26"/>
+        </w:rPr>
+        <w:t xml:space="preserve">coding-only harness</w:t>
+      </w:r>
+      <w:r>
+        <w:rPr>
+          <w:rFonts w:ascii="Helvetica Neue" w:hAnsi="Helvetica Neue" w:cs="Helvetica Neue"/>
+          <w:sz w:val="24"/>
+          <w:sz-cs w:val="24"/>
+          <w:spacing w:val="0"/>
+          <w:color w:val="181F26"/>
+        </w:rPr>
+        <w:t xml:space="preserve"/>
+      </w:r>
+    </w:p>
+    <w:p>
+      <w:pPr>
+        <w:spacing w:after="197"/>
+      </w:pPr>
+      <w:r>
+        <w:rPr>
+          <w:rFonts w:ascii="Helvetica Neue" w:hAnsi="Helvetica Neue" w:cs="Helvetica Neue"/>
+          <w:sz w:val="44"/>
+          <w:sz-cs w:val="44"/>
+          <w:b/>
+          <w:spacing w:val="0"/>
+          <w:color w:val="102C4B"/>
+        </w:rPr>
         <w:t xml:space="preserve">What This Means For The Roadmap</w:t>
       </w:r>
     </w:p>
@@ -8412,7 +8962,7 @@
           <w:spacing w:val="0"/>
           <w:color w:val="181F26"/>
         </w:rPr>
-        <w:t xml:space="preserve"> Traces, scorecards, review queues, and feedback loops should be runtime objects, not only analytics afterthoughts.</w:t>
+        <w:t xml:space="preserve"> Traces, scorecards, review queues, alerts, datasets, and replay loops should be runtime objects, not only analytics afterthoughts.</w:t>
       </w:r>
     </w:p>
     <w:p>
@@ -11010,7 +11560,49 @@
           <w:spacing w:val="0"/>
           <w:color w:val="181F26"/>
         </w:rPr>
-        <w:t xml:space="preserve"> is a useful reference because it shows the right operational shape: observability, evaluation, review, and feedback should be connected. Crawfish should absorb that lesson at the control-plane layer rather than copying a hosted UI directly.</w:t>
+        <w:t xml:space="preserve"> is a useful reference because it shows the right operational shape: observability, evaluation, review, and automation should be connected. Its </w:t>
+      </w:r>
+      <w:r>
+        <w:rPr>
+          <w:rFonts w:ascii="Helvetica Neue" w:hAnsi="Helvetica Neue" w:cs="Helvetica Neue"/>
+          <w:sz w:val="24"/>
+          <w:sz-cs w:val="24"/>
+          <w:u w:val="single"/>
+          <w:spacing w:val="0"/>
+          <w:color w:val="0000E9"/>
+        </w:rPr>
+        <w:t xml:space="preserve">annotation queues</w:t>
+      </w:r>
+      <w:r>
+        <w:rPr>
+          <w:rFonts w:ascii="Helvetica Neue" w:hAnsi="Helvetica Neue" w:cs="Helvetica Neue"/>
+          <w:sz w:val="24"/>
+          <w:sz-cs w:val="24"/>
+          <w:spacing w:val="0"/>
+          <w:color w:val="181F26"/>
+        </w:rPr>
+        <w:t xml:space="preserve"> and </w:t>
+      </w:r>
+      <w:r>
+        <w:rPr>
+          <w:rFonts w:ascii="Helvetica Neue" w:hAnsi="Helvetica Neue" w:cs="Helvetica Neue"/>
+          <w:sz w:val="24"/>
+          <w:sz-cs w:val="24"/>
+          <w:u w:val="single"/>
+          <w:spacing w:val="0"/>
+          <w:color w:val="0000E9"/>
+        </w:rPr>
+        <w:t xml:space="preserve">automation rules</w:t>
+      </w:r>
+      <w:r>
+        <w:rPr>
+          <w:rFonts w:ascii="Helvetica Neue" w:hAnsi="Helvetica Neue" w:cs="Helvetica Neue"/>
+          <w:sz w:val="24"/>
+          <w:sz-cs w:val="24"/>
+          <w:spacing w:val="0"/>
+          <w:color w:val="181F26"/>
+        </w:rPr>
+        <w:t xml:space="preserve"> are especially useful reference points. Crawfish should absorb that lesson at the control-plane layer rather than copying a hosted UI directly.</w:t>
       </w:r>
     </w:p>
     <w:p>
@@ -11142,6 +11734,62 @@
     </w:p>
     <w:p>
       <w:pPr>
+        <w:ind w:left="720" w:first-line="-720"/>
+      </w:pPr>
+      <w:r>
+        <w:rPr>
+          <w:rFonts w:ascii="Helvetica Neue" w:hAnsi="Helvetica Neue" w:cs="Helvetica Neue"/>
+          <w:sz w:val="24"/>
+          <w:sz-cs w:val="24"/>
+          <w:color w:val="181F26"/>
+        </w:rPr>
+        <w:t xml:space="preserve"/>
+        <w:tab/>
+        <w:t xml:space="preserve">•</w:t>
+        <w:tab/>
+        <w:t xml:space="preserve"/>
+      </w:r>
+      <w:r>
+        <w:rPr>
+          <w:rFonts w:ascii="Helvetica Neue" w:hAnsi="Helvetica Neue" w:cs="Helvetica Neue"/>
+          <w:sz w:val="24"/>
+          <w:sz-cs w:val="24"/>
+          <w:spacing w:val="0"/>
+          <w:color w:val="181F26"/>
+        </w:rPr>
+        <w:t xml:space="preserve">dataset capture should turn completed actions into replayable quality cases</w:t>
+      </w:r>
+    </w:p>
+    <w:p>
+      <w:pPr>
+        <w:ind w:left="720" w:first-line="-720"/>
+      </w:pPr>
+      <w:r>
+        <w:rPr>
+          <w:rFonts w:ascii="Helvetica Neue" w:hAnsi="Helvetica Neue" w:cs="Helvetica Neue"/>
+          <w:sz w:val="24"/>
+          <w:sz-cs w:val="24"/>
+          <w:color w:val="181F26"/>
+        </w:rPr>
+        <w:t xml:space="preserve"/>
+        <w:tab/>
+        <w:t xml:space="preserve">•</w:t>
+        <w:tab/>
+        <w:t xml:space="preserve"/>
+      </w:r>
+      <w:r>
+        <w:rPr>
+          <w:rFonts w:ascii="Helvetica Neue" w:hAnsi="Helvetica Neue" w:cs="Helvetica Neue"/>
+          <w:sz w:val="24"/>
+          <w:sz-cs w:val="24"/>
+          <w:spacing w:val="0"/>
+          <w:color w:val="181F26"/>
+        </w:rPr>
+        <w:t xml:space="preserve">replay experiments should compare execution surfaces without generating normal production noise</w:t>
+      </w:r>
+    </w:p>
+    <w:p>
+      <w:pPr>
         <w:spacing w:after="240"/>
       </w:pPr>
       <w:r>
@@ -11153,6 +11801,120 @@
           <w:color w:val="181F26"/>
         </w:rPr>
         <w:t xml:space="preserve">In other words, evaluation is how a swarm learns without becoming opaque.</w:t>
+      </w:r>
+    </w:p>
+    <w:p>
+      <w:pPr>
+        <w:spacing w:after="240"/>
+      </w:pPr>
+      <w:r>
+        <w:rPr>
+          <w:rFonts w:ascii="Helvetica Neue" w:hAnsi="Helvetica Neue" w:cs="Helvetica Neue"/>
+          <w:sz w:val="24"/>
+          <w:sz-cs w:val="24"/>
+          <w:spacing w:val="0"/>
+          <w:color w:val="181F26"/>
+        </w:rPr>
+        <w:t xml:space="preserve">This is also where the distinction between constitutional guidance and runtime governance becomes concrete:</w:t>
+      </w:r>
+    </w:p>
+    <w:p>
+      <w:pPr>
+        <w:ind w:left="720" w:first-line="-720"/>
+      </w:pPr>
+      <w:r>
+        <w:rPr>
+          <w:rFonts w:ascii="Helvetica Neue" w:hAnsi="Helvetica Neue" w:cs="Helvetica Neue"/>
+          <w:sz w:val="24"/>
+          <w:sz-cs w:val="24"/>
+          <w:color w:val="181F26"/>
+        </w:rPr>
+        <w:t xml:space="preserve"/>
+        <w:tab/>
+        <w:t xml:space="preserve">•</w:t>
+        <w:tab/>
+        <w:t xml:space="preserve"/>
+      </w:r>
+      <w:r>
+        <w:rPr>
+          <w:rFonts w:ascii="Helvetica Neue" w:hAnsi="Helvetica Neue" w:cs="Helvetica Neue"/>
+          <w:sz w:val="24"/>
+          <w:sz-cs w:val="24"/>
+          <w:spacing w:val="0"/>
+          <w:color w:val="181F26"/>
+        </w:rPr>
+        <w:t xml:space="preserve">Claude's Constitution can shape what a model prefers</w:t>
+      </w:r>
+    </w:p>
+    <w:p>
+      <w:pPr>
+        <w:ind w:left="720" w:first-line="-720"/>
+      </w:pPr>
+      <w:r>
+        <w:rPr>
+          <w:rFonts w:ascii="Helvetica Neue" w:hAnsi="Helvetica Neue" w:cs="Helvetica Neue"/>
+          <w:sz w:val="24"/>
+          <w:sz-cs w:val="24"/>
+          <w:color w:val="181F26"/>
+        </w:rPr>
+        <w:t xml:space="preserve"/>
+        <w:tab/>
+        <w:t xml:space="preserve">•</w:t>
+        <w:tab/>
+        <w:t xml:space="preserve"/>
+      </w:r>
+      <w:r>
+        <w:rPr>
+          <w:rFonts w:ascii="Helvetica Neue" w:hAnsi="Helvetica Neue" w:cs="Helvetica Neue"/>
+          <w:sz w:val="24"/>
+          <w:sz-cs w:val="24"/>
+          <w:spacing w:val="0"/>
+          <w:color w:val="181F26"/>
+        </w:rPr>
+        <w:t xml:space="preserve">it cannot by itself produce trace bundles, scorecards, annotation queues, or replayable datasets</w:t>
+      </w:r>
+    </w:p>
+    <w:p>
+      <w:pPr>
+        <w:ind w:left="720" w:first-line="-720"/>
+      </w:pPr>
+      <w:r>
+        <w:rPr>
+          <w:rFonts w:ascii="Helvetica Neue" w:hAnsi="Helvetica Neue" w:cs="Helvetica Neue"/>
+          <w:sz w:val="24"/>
+          <w:sz-cs w:val="24"/>
+          <w:color w:val="181F26"/>
+        </w:rPr>
+        <w:t xml:space="preserve"/>
+        <w:tab/>
+        <w:t xml:space="preserve">•</w:t>
+        <w:tab/>
+        <w:t xml:space="preserve"/>
+      </w:r>
+      <w:r>
+        <w:rPr>
+          <w:rFonts w:ascii="Helvetica Neue" w:hAnsi="Helvetica Neue" w:cs="Helvetica Neue"/>
+          <w:sz w:val="24"/>
+          <w:sz-cs w:val="24"/>
+          <w:spacing w:val="0"/>
+          <w:color w:val="181F26"/>
+        </w:rPr>
+        <w:t xml:space="preserve">it cannot tell an operator where doctrine failed to become enforcement</w:t>
+      </w:r>
+    </w:p>
+    <w:p>
+      <w:pPr>
+        <w:spacing w:after="240"/>
+      </w:pPr>
+      <w:r>
+        <w:rPr>
+          <w:rFonts w:ascii="Helvetica Neue" w:hAnsi="Helvetica Neue" w:cs="Helvetica Neue"/>
+          <w:sz w:val="24"/>
+          <w:sz-cs w:val="24"/>
+          <w:spacing w:val="0"/>
+          <w:color w:val="181F26"/>
+        </w:rPr>
+        <w:t xml:space="preserve">Crawfish exists to turn those missing institutional layers into runtime behavior.</w:t>
       </w:r>
     </w:p>
     <w:p>
@@ -28953,6 +29715,26 @@
           <w:spacing w:val="0"/>
           <w:color w:val="181F26"/>
         </w:rPr>
+        <w:t xml:space="preserve">evaluation_profile</w:t>
+      </w:r>
+      <w:r>
+        <w:rPr>
+          <w:rFonts w:ascii="Helvetica Neue" w:hAnsi="Helvetica Neue" w:cs="Helvetica Neue"/>
+          <w:sz w:val="26"/>
+          <w:sz-cs w:val="26"/>
+          <w:spacing w:val="0"/>
+          <w:color w:val="181F26"/>
+        </w:rPr>
+        <w:t xml:space="preserve">, </w:t>
+      </w:r>
+      <w:r>
+        <w:rPr>
+          <w:rFonts w:ascii="Menlo" w:hAnsi="Menlo" w:cs="Menlo"/>
+          <w:sz w:val="26"/>
+          <w:sz-cs w:val="26"/>
+          <w:spacing w:val="0"/>
+          <w:color w:val="181F26"/>
+        </w:rPr>
         <w:t xml:space="preserve">evaluation_hook</w:t>
       </w:r>
       <w:r>
@@ -29016,7 +29798,7 @@
           <w:spacing w:val="0"/>
           <w:color w:val="181F26"/>
         </w:rPr>
-        <w:t xml:space="preserve">escalation and review behavior</w:t>
+        <w:t xml:space="preserve">doctrine-aware evaluation, escalation, and review behavior</w:t>
       </w:r>
     </w:p>
     <w:p>
@@ -37302,7 +38084,27 @@
           <w:spacing w:val="0"/>
           <w:color w:val="181F26"/>
         </w:rPr>
-        <w:t xml:space="preserve">run deterministic evaluation hook</w:t>
+        <w:t xml:space="preserve">resolve </w:t>
+      </w:r>
+      <w:r>
+        <w:rPr>
+          <w:rFonts w:ascii="Menlo" w:hAnsi="Menlo" w:cs="Menlo"/>
+          <w:sz w:val="24"/>
+          <w:sz-cs w:val="24"/>
+          <w:spacing w:val="0"/>
+          <w:color w:val="181F26"/>
+        </w:rPr>
+        <w:t xml:space="preserve">EvaluationProfile</w:t>
+      </w:r>
+      <w:r>
+        <w:rPr>
+          <w:rFonts w:ascii="Helvetica Neue" w:hAnsi="Helvetica Neue" w:cs="Helvetica Neue"/>
+          <w:sz w:val="24"/>
+          <w:sz-cs w:val="24"/>
+          <w:spacing w:val="0"/>
+          <w:color w:val="181F26"/>
+        </w:rPr>
+        <w:t xml:space="preserve"/>
       </w:r>
     </w:p>
     <w:p>
@@ -37330,6 +38132,54 @@
           <w:spacing w:val="0"/>
           <w:color w:val="181F26"/>
         </w:rPr>
+        <w:t xml:space="preserve">execute </w:t>
+      </w:r>
+      <w:r>
+        <w:rPr>
+          <w:rFonts w:ascii="Menlo" w:hAnsi="Menlo" w:cs="Menlo"/>
+          <w:sz w:val="24"/>
+          <w:sz-cs w:val="24"/>
+          <w:spacing w:val="0"/>
+          <w:color w:val="181F26"/>
+        </w:rPr>
+        <w:t xml:space="preserve">ScorecardSpec</w:t>
+      </w:r>
+      <w:r>
+        <w:rPr>
+          <w:rFonts w:ascii="Helvetica Neue" w:hAnsi="Helvetica Neue" w:cs="Helvetica Neue"/>
+          <w:sz w:val="24"/>
+          <w:sz-cs w:val="24"/>
+          <w:spacing w:val="0"/>
+          <w:color w:val="181F26"/>
+        </w:rPr>
+        <w:t xml:space="preserve"/>
+      </w:r>
+    </w:p>
+    <w:p>
+      <w:pPr>
+        <w:ind w:left="720" w:first-line="-720"/>
+      </w:pPr>
+      <w:r>
+        <w:rPr>
+          <w:rFonts w:ascii="Helvetica Neue" w:hAnsi="Helvetica Neue" w:cs="Helvetica Neue"/>
+          <w:sz w:val="24"/>
+          <w:sz-cs w:val="24"/>
+          <w:color w:val="181F26"/>
+        </w:rPr>
+        <w:t xml:space="preserve"/>
+        <w:tab/>
+        <w:t xml:space="preserve">5</w:t>
+        <w:tab/>
+        <w:t xml:space="preserve"/>
+      </w:r>
+      <w:r>
+        <w:rPr>
+          <w:rFonts w:ascii="Helvetica Neue" w:hAnsi="Helvetica Neue" w:cs="Helvetica Neue"/>
+          <w:sz w:val="24"/>
+          <w:sz-cs w:val="24"/>
+          <w:spacing w:val="0"/>
+          <w:color w:val="181F26"/>
+        </w:rPr>
         <w:t xml:space="preserve">persist </w:t>
       </w:r>
       <w:r>
@@ -37366,7 +38216,7 @@
         </w:rPr>
         <w:t xml:space="preserve"/>
         <w:tab/>
-        <w:t xml:space="preserve">5</w:t>
+        <w:t xml:space="preserve">6</w:t>
         <w:tab/>
         <w:t xml:space="preserve"/>
       </w:r>
@@ -37414,7 +38264,103 @@
         </w:rPr>
         <w:t xml:space="preserve"/>
         <w:tab/>
-        <w:t xml:space="preserve">6</w:t>
+        <w:t xml:space="preserve">7</w:t>
+        <w:tab/>
+        <w:t xml:space="preserve"/>
+      </w:r>
+      <w:r>
+        <w:rPr>
+          <w:rFonts w:ascii="Helvetica Neue" w:hAnsi="Helvetica Neue" w:cs="Helvetica Neue"/>
+          <w:sz w:val="24"/>
+          <w:sz-cs w:val="24"/>
+          <w:spacing w:val="0"/>
+          <w:color w:val="181F26"/>
+        </w:rPr>
+        <w:t xml:space="preserve">emit </w:t>
+      </w:r>
+      <w:r>
+        <w:rPr>
+          <w:rFonts w:ascii="Menlo" w:hAnsi="Menlo" w:cs="Menlo"/>
+          <w:sz w:val="24"/>
+          <w:sz-cs w:val="24"/>
+          <w:spacing w:val="0"/>
+          <w:color w:val="181F26"/>
+        </w:rPr>
+        <w:t xml:space="preserve">AlertEvent</w:t>
+      </w:r>
+      <w:r>
+        <w:rPr>
+          <w:rFonts w:ascii="Helvetica Neue" w:hAnsi="Helvetica Neue" w:cs="Helvetica Neue"/>
+          <w:sz w:val="24"/>
+          <w:sz-cs w:val="24"/>
+          <w:spacing w:val="0"/>
+          <w:color w:val="181F26"/>
+        </w:rPr>
+        <w:t xml:space="preserve"> when doctrine or evaluation requires escalation</w:t>
+      </w:r>
+    </w:p>
+    <w:p>
+      <w:pPr>
+        <w:ind w:left="720" w:first-line="-720"/>
+      </w:pPr>
+      <w:r>
+        <w:rPr>
+          <w:rFonts w:ascii="Helvetica Neue" w:hAnsi="Helvetica Neue" w:cs="Helvetica Neue"/>
+          <w:sz w:val="24"/>
+          <w:sz-cs w:val="24"/>
+          <w:color w:val="181F26"/>
+        </w:rPr>
+        <w:t xml:space="preserve"/>
+        <w:tab/>
+        <w:t xml:space="preserve">8</w:t>
+        <w:tab/>
+        <w:t xml:space="preserve"/>
+      </w:r>
+      <w:r>
+        <w:rPr>
+          <w:rFonts w:ascii="Helvetica Neue" w:hAnsi="Helvetica Neue" w:cs="Helvetica Neue"/>
+          <w:sz w:val="24"/>
+          <w:sz-cs w:val="24"/>
+          <w:spacing w:val="0"/>
+          <w:color w:val="181F26"/>
+        </w:rPr>
+        <w:t xml:space="preserve">capture </w:t>
+      </w:r>
+      <w:r>
+        <w:rPr>
+          <w:rFonts w:ascii="Menlo" w:hAnsi="Menlo" w:cs="Menlo"/>
+          <w:sz w:val="24"/>
+          <w:sz-cs w:val="24"/>
+          <w:spacing w:val="0"/>
+          <w:color w:val="181F26"/>
+        </w:rPr>
+        <w:t xml:space="preserve">DatasetCase</w:t>
+      </w:r>
+      <w:r>
+        <w:rPr>
+          <w:rFonts w:ascii="Helvetica Neue" w:hAnsi="Helvetica Neue" w:cs="Helvetica Neue"/>
+          <w:sz w:val="24"/>
+          <w:sz-cs w:val="24"/>
+          <w:spacing w:val="0"/>
+          <w:color w:val="181F26"/>
+        </w:rPr>
+        <w:t xml:space="preserve"> when the profile enables dataset freezing</w:t>
+      </w:r>
+    </w:p>
+    <w:p>
+      <w:pPr>
+        <w:ind w:left="720" w:first-line="-720"/>
+      </w:pPr>
+      <w:r>
+        <w:rPr>
+          <w:rFonts w:ascii="Helvetica Neue" w:hAnsi="Helvetica Neue" w:cs="Helvetica Neue"/>
+          <w:sz w:val="24"/>
+          <w:sz-cs w:val="24"/>
+          <w:color w:val="181F26"/>
+        </w:rPr>
+        <w:t xml:space="preserve"/>
+        <w:tab/>
+        <w:t xml:space="preserve">9</w:t>
         <w:tab/>
         <w:t xml:space="preserve"/>
       </w:r>
@@ -37447,34 +38393,6 @@
           <w:color w:val="181F26"/>
         </w:rPr>
         <w:t xml:space="preserve"> and review resolution without rewriting action history</w:t>
-      </w:r>
-    </w:p>
-    <w:p>
-      <w:pPr>
-        <w:ind w:left="720" w:first-line="-720"/>
-      </w:pPr>
-      <w:r>
-        <w:rPr>
-          <w:rFonts w:ascii="Helvetica Neue" w:hAnsi="Helvetica Neue" w:cs="Helvetica Neue"/>
-          <w:sz w:val="24"/>
-          <w:sz-cs w:val="24"/>
-          <w:color w:val="181F26"/>
-        </w:rPr>
-        <w:t xml:space="preserve"/>
-        <w:tab/>
-        <w:t xml:space="preserve">7</w:t>
-        <w:tab/>
-        <w:t xml:space="preserve"/>
-      </w:r>
-      <w:r>
-        <w:rPr>
-          <w:rFonts w:ascii="Helvetica Neue" w:hAnsi="Helvetica Neue" w:cs="Helvetica Neue"/>
-          <w:sz w:val="24"/>
-          <w:sz-cs w:val="24"/>
-          <w:spacing w:val="0"/>
-          <w:color w:val="181F26"/>
-        </w:rPr>
-        <w:t xml:space="preserve">emit alert events when doctrine or evaluation requires escalation</w:t>
       </w:r>
     </w:p>
     <w:p>
@@ -37490,7 +38408,67 @@
           <w:spacing w:val="0"/>
           <w:color w:val="102C4B"/>
         </w:rPr>
-        <w:t xml:space="preserve">Initial Evaluation Hooks</w:t>
+        <w:t xml:space="preserve">Evaluation Profiles, Scorecards, And Datasets</w:t>
+      </w:r>
+    </w:p>
+    <w:p>
+      <w:pPr>
+        <w:spacing w:after="240"/>
+      </w:pPr>
+      <w:r>
+        <w:rPr>
+          <w:rFonts w:ascii="Menlo" w:hAnsi="Menlo" w:cs="Menlo"/>
+          <w:sz w:val="24"/>
+          <w:sz-cs w:val="24"/>
+          <w:spacing w:val="0"/>
+          <w:color w:val="181F26"/>
+        </w:rPr>
+        <w:t xml:space="preserve">evaluation_profile</w:t>
+      </w:r>
+      <w:r>
+        <w:rPr>
+          <w:rFonts w:ascii="Helvetica Neue" w:hAnsi="Helvetica Neue" w:cs="Helvetica Neue"/>
+          <w:sz w:val="24"/>
+          <w:sz-cs w:val="24"/>
+          <w:spacing w:val="0"/>
+          <w:color w:val="181F26"/>
+        </w:rPr>
+        <w:t xml:space="preserve"> is now the primary config selector. </w:t>
+      </w:r>
+      <w:r>
+        <w:rPr>
+          <w:rFonts w:ascii="Menlo" w:hAnsi="Menlo" w:cs="Menlo"/>
+          <w:sz w:val="24"/>
+          <w:sz-cs w:val="24"/>
+          <w:spacing w:val="0"/>
+          <w:color w:val="181F26"/>
+        </w:rPr>
+        <w:t xml:space="preserve">evaluation_hook</w:t>
+      </w:r>
+      <w:r>
+        <w:rPr>
+          <w:rFonts w:ascii="Helvetica Neue" w:hAnsi="Helvetica Neue" w:cs="Helvetica Neue"/>
+          <w:sz w:val="24"/>
+          <w:sz-cs w:val="24"/>
+          <w:spacing w:val="0"/>
+          <w:color w:val="181F26"/>
+        </w:rPr>
+        <w:t xml:space="preserve"> remains an alpha-era compatibility alias and should only normalize into built-in profiles.</w:t>
+      </w:r>
+    </w:p>
+    <w:p>
+      <w:pPr>
+        <w:spacing w:after="240"/>
+      </w:pPr>
+      <w:r>
+        <w:rPr>
+          <w:rFonts w:ascii="Helvetica Neue" w:hAnsi="Helvetica Neue" w:cs="Helvetica Neue"/>
+          <w:sz w:val="24"/>
+          <w:sz-cs w:val="24"/>
+          <w:spacing w:val="0"/>
+          <w:color w:val="181F26"/>
+        </w:rPr>
+        <w:t xml:space="preserve">The built-in defaults are:</w:t>
       </w:r>
     </w:p>
     <w:p>
@@ -37504,7 +38482,7 @@
           <w:spacing w:val="0"/>
           <w:color w:val="102C4B"/>
         </w:rPr>
-        <w:t xml:space="preserve">Hook</w:t>
+        <w:t xml:space="preserve">Capability</w:t>
       </w:r>
     </w:p>
     <w:p>
@@ -37518,79 +38496,311 @@
           <w:spacing w:val="0"/>
           <w:color w:val="102C4B"/>
         </w:rPr>
-        <w:t xml:space="preserve">Behavior</w:t>
-      </w:r>
-    </w:p>
-    <w:p>
-      <w:pPr/>
-      <w:r>
-        <w:rPr>
-          <w:rFonts w:ascii="Menlo" w:hAnsi="Menlo" w:cs="Menlo"/>
-          <w:sz w:val="26"/>
-          <w:sz-cs w:val="26"/>
-          <w:spacing w:val="0"/>
-          <w:color w:val="181F26"/>
-        </w:rPr>
-        <w:t xml:space="preserve">deterministic_scorecard</w:t>
-      </w:r>
-      <w:r>
-        <w:rPr>
-          <w:rFonts w:ascii="Helvetica Neue" w:hAnsi="Helvetica Neue" w:cs="Helvetica Neue"/>
-          <w:sz w:val="26"/>
-          <w:sz-cs w:val="26"/>
-          <w:spacing w:val="0"/>
-          <w:color w:val="181F26"/>
-        </w:rPr>
-        <w:t xml:space="preserve"/>
-      </w:r>
-    </w:p>
-    <w:p>
-      <w:pPr/>
-      <w:r>
-        <w:rPr>
-          <w:rFonts w:ascii="Helvetica Neue" w:hAnsi="Helvetica Neue" w:cs="Helvetica Neue"/>
-          <w:sz w:val="26"/>
-          <w:sz-cs w:val="26"/>
-          <w:spacing w:val="0"/>
-          <w:color w:val="181F26"/>
-        </w:rPr>
-        <w:t xml:space="preserve">emit a durable evaluation record immediately after completion</w:t>
-      </w:r>
-    </w:p>
-    <w:p>
-      <w:pPr/>
-      <w:r>
-        <w:rPr>
-          <w:rFonts w:ascii="Menlo" w:hAnsi="Menlo" w:cs="Menlo"/>
-          <w:sz w:val="26"/>
-          <w:sz-cs w:val="26"/>
-          <w:spacing w:val="0"/>
-          <w:color w:val="181F26"/>
-        </w:rPr>
-        <w:t xml:space="preserve">operator_review_queue</w:t>
-      </w:r>
-      <w:r>
-        <w:rPr>
-          <w:rFonts w:ascii="Helvetica Neue" w:hAnsi="Helvetica Neue" w:cs="Helvetica Neue"/>
-          <w:sz w:val="26"/>
-          <w:sz-cs w:val="26"/>
-          <w:spacing w:val="0"/>
-          <w:color w:val="181F26"/>
-        </w:rPr>
-        <w:t xml:space="preserve"/>
-      </w:r>
-    </w:p>
-    <w:p>
-      <w:pPr/>
-      <w:r>
-        <w:rPr>
-          <w:rFonts w:ascii="Helvetica Neue" w:hAnsi="Helvetica Neue" w:cs="Helvetica Neue"/>
-          <w:sz w:val="26"/>
-          <w:sz-cs w:val="26"/>
-          <w:spacing w:val="0"/>
-          <w:color w:val="181F26"/>
-        </w:rPr>
-        <w:t xml:space="preserve">emit an evaluation record and open a review item for operator action</w:t>
+        <w:t xml:space="preserve">Profile</w:t>
+      </w:r>
+    </w:p>
+    <w:p>
+      <w:pPr/>
+      <w:r>
+        <w:rPr>
+          <w:rFonts w:ascii="Helvetica Neue" w:hAnsi="Helvetica Neue" w:cs="Helvetica Neue"/>
+          <w:sz w:val="26"/>
+          <w:sz-cs w:val="26"/>
+          <w:b/>
+          <w:spacing w:val="0"/>
+          <w:color w:val="102C4B"/>
+        </w:rPr>
+        <w:t xml:space="preserve">Scorecard</w:t>
+      </w:r>
+    </w:p>
+    <w:p>
+      <w:pPr/>
+      <w:r>
+        <w:rPr>
+          <w:rFonts w:ascii="Helvetica Neue" w:hAnsi="Helvetica Neue" w:cs="Helvetica Neue"/>
+          <w:sz w:val="26"/>
+          <w:sz-cs w:val="26"/>
+          <w:b/>
+          <w:spacing w:val="0"/>
+          <w:color w:val="102C4B"/>
+        </w:rPr>
+        <w:t xml:space="preserve">Dataset</w:t>
+      </w:r>
+    </w:p>
+    <w:p>
+      <w:pPr/>
+      <w:r>
+        <w:rPr>
+          <w:rFonts w:ascii="Menlo" w:hAnsi="Menlo" w:cs="Menlo"/>
+          <w:sz w:val="26"/>
+          <w:sz-cs w:val="26"/>
+          <w:spacing w:val="0"/>
+          <w:color w:val="181F26"/>
+        </w:rPr>
+        <w:t xml:space="preserve">task.plan</w:t>
+      </w:r>
+      <w:r>
+        <w:rPr>
+          <w:rFonts w:ascii="Helvetica Neue" w:hAnsi="Helvetica Neue" w:cs="Helvetica Neue"/>
+          <w:sz w:val="26"/>
+          <w:sz-cs w:val="26"/>
+          <w:spacing w:val="0"/>
+          <w:color w:val="181F26"/>
+        </w:rPr>
+        <w:t xml:space="preserve"/>
+      </w:r>
+    </w:p>
+    <w:p>
+      <w:pPr/>
+      <w:r>
+        <w:rPr>
+          <w:rFonts w:ascii="Menlo" w:hAnsi="Menlo" w:cs="Menlo"/>
+          <w:sz w:val="26"/>
+          <w:sz-cs w:val="26"/>
+          <w:spacing w:val="0"/>
+          <w:color w:val="181F26"/>
+        </w:rPr>
+        <w:t xml:space="preserve">task_plan_default</w:t>
+      </w:r>
+      <w:r>
+        <w:rPr>
+          <w:rFonts w:ascii="Helvetica Neue" w:hAnsi="Helvetica Neue" w:cs="Helvetica Neue"/>
+          <w:sz w:val="26"/>
+          <w:sz-cs w:val="26"/>
+          <w:spacing w:val="0"/>
+          <w:color w:val="181F26"/>
+        </w:rPr>
+        <w:t xml:space="preserve"/>
+      </w:r>
+    </w:p>
+    <w:p>
+      <w:pPr/>
+      <w:r>
+        <w:rPr>
+          <w:rFonts w:ascii="Menlo" w:hAnsi="Menlo" w:cs="Menlo"/>
+          <w:sz w:val="26"/>
+          <w:sz-cs w:val="26"/>
+          <w:spacing w:val="0"/>
+          <w:color w:val="181F26"/>
+        </w:rPr>
+        <w:t xml:space="preserve">task_plan_scorecard</w:t>
+      </w:r>
+      <w:r>
+        <w:rPr>
+          <w:rFonts w:ascii="Helvetica Neue" w:hAnsi="Helvetica Neue" w:cs="Helvetica Neue"/>
+          <w:sz w:val="26"/>
+          <w:sz-cs w:val="26"/>
+          <w:spacing w:val="0"/>
+          <w:color w:val="181F26"/>
+        </w:rPr>
+        <w:t xml:space="preserve"/>
+      </w:r>
+    </w:p>
+    <w:p>
+      <w:pPr/>
+      <w:r>
+        <w:rPr>
+          <w:rFonts w:ascii="Menlo" w:hAnsi="Menlo" w:cs="Menlo"/>
+          <w:sz w:val="26"/>
+          <w:sz-cs w:val="26"/>
+          <w:spacing w:val="0"/>
+          <w:color w:val="181F26"/>
+        </w:rPr>
+        <w:t xml:space="preserve">task_plan_dataset</w:t>
+      </w:r>
+      <w:r>
+        <w:rPr>
+          <w:rFonts w:ascii="Helvetica Neue" w:hAnsi="Helvetica Neue" w:cs="Helvetica Neue"/>
+          <w:sz w:val="26"/>
+          <w:sz-cs w:val="26"/>
+          <w:spacing w:val="0"/>
+          <w:color w:val="181F26"/>
+        </w:rPr>
+        <w:t xml:space="preserve"/>
+      </w:r>
+    </w:p>
+    <w:p>
+      <w:pPr/>
+      <w:r>
+        <w:rPr>
+          <w:rFonts w:ascii="Menlo" w:hAnsi="Menlo" w:cs="Menlo"/>
+          <w:sz w:val="26"/>
+          <w:sz-cs w:val="26"/>
+          <w:spacing w:val="0"/>
+          <w:color w:val="181F26"/>
+        </w:rPr>
+        <w:t xml:space="preserve">repo.review</w:t>
+      </w:r>
+      <w:r>
+        <w:rPr>
+          <w:rFonts w:ascii="Helvetica Neue" w:hAnsi="Helvetica Neue" w:cs="Helvetica Neue"/>
+          <w:sz w:val="26"/>
+          <w:sz-cs w:val="26"/>
+          <w:spacing w:val="0"/>
+          <w:color w:val="181F26"/>
+        </w:rPr>
+        <w:t xml:space="preserve"/>
+      </w:r>
+    </w:p>
+    <w:p>
+      <w:pPr/>
+      <w:r>
+        <w:rPr>
+          <w:rFonts w:ascii="Menlo" w:hAnsi="Menlo" w:cs="Menlo"/>
+          <w:sz w:val="26"/>
+          <w:sz-cs w:val="26"/>
+          <w:spacing w:val="0"/>
+          <w:color w:val="181F26"/>
+        </w:rPr>
+        <w:t xml:space="preserve">repo_review_default</w:t>
+      </w:r>
+      <w:r>
+        <w:rPr>
+          <w:rFonts w:ascii="Helvetica Neue" w:hAnsi="Helvetica Neue" w:cs="Helvetica Neue"/>
+          <w:sz w:val="26"/>
+          <w:sz-cs w:val="26"/>
+          <w:spacing w:val="0"/>
+          <w:color w:val="181F26"/>
+        </w:rPr>
+        <w:t xml:space="preserve"/>
+      </w:r>
+    </w:p>
+    <w:p>
+      <w:pPr/>
+      <w:r>
+        <w:rPr>
+          <w:rFonts w:ascii="Menlo" w:hAnsi="Menlo" w:cs="Menlo"/>
+          <w:sz w:val="26"/>
+          <w:sz-cs w:val="26"/>
+          <w:spacing w:val="0"/>
+          <w:color w:val="181F26"/>
+        </w:rPr>
+        <w:t xml:space="preserve">repo_review_scorecard</w:t>
+      </w:r>
+      <w:r>
+        <w:rPr>
+          <w:rFonts w:ascii="Helvetica Neue" w:hAnsi="Helvetica Neue" w:cs="Helvetica Neue"/>
+          <w:sz w:val="26"/>
+          <w:sz-cs w:val="26"/>
+          <w:spacing w:val="0"/>
+          <w:color w:val="181F26"/>
+        </w:rPr>
+        <w:t xml:space="preserve"/>
+      </w:r>
+    </w:p>
+    <w:p>
+      <w:pPr/>
+      <w:r>
+        <w:rPr>
+          <w:rFonts w:ascii="Menlo" w:hAnsi="Menlo" w:cs="Menlo"/>
+          <w:sz w:val="26"/>
+          <w:sz-cs w:val="26"/>
+          <w:spacing w:val="0"/>
+          <w:color w:val="181F26"/>
+        </w:rPr>
+        <w:t xml:space="preserve">repo_review_dataset</w:t>
+      </w:r>
+      <w:r>
+        <w:rPr>
+          <w:rFonts w:ascii="Helvetica Neue" w:hAnsi="Helvetica Neue" w:cs="Helvetica Neue"/>
+          <w:sz w:val="26"/>
+          <w:sz-cs w:val="26"/>
+          <w:spacing w:val="0"/>
+          <w:color w:val="181F26"/>
+        </w:rPr>
+        <w:t xml:space="preserve"/>
+      </w:r>
+    </w:p>
+    <w:p>
+      <w:pPr/>
+      <w:r>
+        <w:rPr>
+          <w:rFonts w:ascii="Menlo" w:hAnsi="Menlo" w:cs="Menlo"/>
+          <w:sz w:val="26"/>
+          <w:sz-cs w:val="26"/>
+          <w:spacing w:val="0"/>
+          <w:color w:val="181F26"/>
+        </w:rPr>
+        <w:t xml:space="preserve">incident.enrich</w:t>
+      </w:r>
+      <w:r>
+        <w:rPr>
+          <w:rFonts w:ascii="Helvetica Neue" w:hAnsi="Helvetica Neue" w:cs="Helvetica Neue"/>
+          <w:sz w:val="26"/>
+          <w:sz-cs w:val="26"/>
+          <w:spacing w:val="0"/>
+          <w:color w:val="181F26"/>
+        </w:rPr>
+        <w:t xml:space="preserve"/>
+      </w:r>
+    </w:p>
+    <w:p>
+      <w:pPr/>
+      <w:r>
+        <w:rPr>
+          <w:rFonts w:ascii="Menlo" w:hAnsi="Menlo" w:cs="Menlo"/>
+          <w:sz w:val="26"/>
+          <w:sz-cs w:val="26"/>
+          <w:spacing w:val="0"/>
+          <w:color w:val="181F26"/>
+        </w:rPr>
+        <w:t xml:space="preserve">incident_enrich_default</w:t>
+      </w:r>
+      <w:r>
+        <w:rPr>
+          <w:rFonts w:ascii="Helvetica Neue" w:hAnsi="Helvetica Neue" w:cs="Helvetica Neue"/>
+          <w:sz w:val="26"/>
+          <w:sz-cs w:val="26"/>
+          <w:spacing w:val="0"/>
+          <w:color w:val="181F26"/>
+        </w:rPr>
+        <w:t xml:space="preserve"/>
+      </w:r>
+    </w:p>
+    <w:p>
+      <w:pPr/>
+      <w:r>
+        <w:rPr>
+          <w:rFonts w:ascii="Menlo" w:hAnsi="Menlo" w:cs="Menlo"/>
+          <w:sz w:val="26"/>
+          <w:sz-cs w:val="26"/>
+          <w:spacing w:val="0"/>
+          <w:color w:val="181F26"/>
+        </w:rPr>
+        <w:t xml:space="preserve">incident_enrich_scorecard</w:t>
+      </w:r>
+      <w:r>
+        <w:rPr>
+          <w:rFonts w:ascii="Helvetica Neue" w:hAnsi="Helvetica Neue" w:cs="Helvetica Neue"/>
+          <w:sz w:val="26"/>
+          <w:sz-cs w:val="26"/>
+          <w:spacing w:val="0"/>
+          <w:color w:val="181F26"/>
+        </w:rPr>
+        <w:t xml:space="preserve"/>
+      </w:r>
+    </w:p>
+    <w:p>
+      <w:pPr/>
+      <w:r>
+        <w:rPr>
+          <w:rFonts w:ascii="Menlo" w:hAnsi="Menlo" w:cs="Menlo"/>
+          <w:sz w:val="26"/>
+          <w:sz-cs w:val="26"/>
+          <w:spacing w:val="0"/>
+          <w:color w:val="181F26"/>
+        </w:rPr>
+        <w:t xml:space="preserve">incident_enrich_dataset</w:t>
+      </w:r>
+      <w:r>
+        <w:rPr>
+          <w:rFonts w:ascii="Helvetica Neue" w:hAnsi="Helvetica Neue" w:cs="Helvetica Neue"/>
+          <w:sz w:val="26"/>
+          <w:sz-cs w:val="26"/>
+          <w:spacing w:val="0"/>
+          <w:color w:val="181F26"/>
+        </w:rPr>
+        <w:t xml:space="preserve"/>
       </w:r>
     </w:p>
     <w:p>
@@ -37605,7 +38815,572 @@
           <w:spacing w:val="0"/>
           <w:color w:val="181F26"/>
         </w:rPr>
-        <w:t xml:space="preserve">The initial capability set is:</w:t>
+        <w:t xml:space="preserve">Each profile defines:</w:t>
+      </w:r>
+    </w:p>
+    <w:p>
+      <w:pPr>
+        <w:ind w:left="720" w:first-line="-720"/>
+      </w:pPr>
+      <w:r>
+        <w:rPr>
+          <w:rFonts w:ascii="Helvetica Neue" w:hAnsi="Helvetica Neue" w:cs="Helvetica Neue"/>
+          <w:sz w:val="24"/>
+          <w:sz-cs w:val="24"/>
+          <w:color w:val="181F26"/>
+        </w:rPr>
+        <w:t xml:space="preserve"/>
+        <w:tab/>
+        <w:t xml:space="preserve">•</w:t>
+        <w:tab/>
+        <w:t xml:space="preserve"/>
+      </w:r>
+      <w:r>
+        <w:rPr>
+          <w:rFonts w:ascii="Helvetica Neue" w:hAnsi="Helvetica Neue" w:cs="Helvetica Neue"/>
+          <w:sz w:val="24"/>
+          <w:sz-cs w:val="24"/>
+          <w:spacing w:val="0"/>
+          <w:color w:val="181F26"/>
+        </w:rPr>
+        <w:t xml:space="preserve">one scorecard</w:t>
+      </w:r>
+    </w:p>
+    <w:p>
+      <w:pPr>
+        <w:ind w:left="720" w:first-line="-720"/>
+      </w:pPr>
+      <w:r>
+        <w:rPr>
+          <w:rFonts w:ascii="Helvetica Neue" w:hAnsi="Helvetica Neue" w:cs="Helvetica Neue"/>
+          <w:sz w:val="24"/>
+          <w:sz-cs w:val="24"/>
+          <w:color w:val="181F26"/>
+        </w:rPr>
+        <w:t xml:space="preserve"/>
+        <w:tab/>
+        <w:t xml:space="preserve">•</w:t>
+        <w:tab/>
+        <w:t xml:space="preserve"/>
+      </w:r>
+      <w:r>
+        <w:rPr>
+          <w:rFonts w:ascii="Helvetica Neue" w:hAnsi="Helvetica Neue" w:cs="Helvetica Neue"/>
+          <w:sz w:val="24"/>
+          <w:sz-cs w:val="24"/>
+          <w:spacing w:val="0"/>
+          <w:color w:val="181F26"/>
+        </w:rPr>
+        <w:t xml:space="preserve">whether a review queue item should be created</w:t>
+      </w:r>
+    </w:p>
+    <w:p>
+      <w:pPr>
+        <w:ind w:left="720" w:first-line="-720"/>
+      </w:pPr>
+      <w:r>
+        <w:rPr>
+          <w:rFonts w:ascii="Helvetica Neue" w:hAnsi="Helvetica Neue" w:cs="Helvetica Neue"/>
+          <w:sz w:val="24"/>
+          <w:sz-cs w:val="24"/>
+          <w:color w:val="181F26"/>
+        </w:rPr>
+        <w:t xml:space="preserve"/>
+        <w:tab/>
+        <w:t xml:space="preserve">•</w:t>
+        <w:tab/>
+        <w:t xml:space="preserve"/>
+      </w:r>
+      <w:r>
+        <w:rPr>
+          <w:rFonts w:ascii="Helvetica Neue" w:hAnsi="Helvetica Neue" w:cs="Helvetica Neue"/>
+          <w:sz w:val="24"/>
+          <w:sz-cs w:val="24"/>
+          <w:spacing w:val="0"/>
+          <w:color w:val="181F26"/>
+        </w:rPr>
+        <w:t xml:space="preserve">which alert rules apply</w:t>
+      </w:r>
+    </w:p>
+    <w:p>
+      <w:pPr>
+        <w:ind w:left="720" w:first-line="-720"/>
+      </w:pPr>
+      <w:r>
+        <w:rPr>
+          <w:rFonts w:ascii="Helvetica Neue" w:hAnsi="Helvetica Neue" w:cs="Helvetica Neue"/>
+          <w:sz w:val="24"/>
+          <w:sz-cs w:val="24"/>
+          <w:color w:val="181F26"/>
+        </w:rPr>
+        <w:t xml:space="preserve"/>
+        <w:tab/>
+        <w:t xml:space="preserve">•</w:t>
+        <w:tab/>
+        <w:t xml:space="preserve"/>
+      </w:r>
+      <w:r>
+        <w:rPr>
+          <w:rFonts w:ascii="Helvetica Neue" w:hAnsi="Helvetica Neue" w:cs="Helvetica Neue"/>
+          <w:sz w:val="24"/>
+          <w:sz-cs w:val="24"/>
+          <w:spacing w:val="0"/>
+          <w:color w:val="181F26"/>
+        </w:rPr>
+        <w:t xml:space="preserve">whether dataset capture is enabled</w:t>
+      </w:r>
+    </w:p>
+    <w:p>
+      <w:pPr>
+        <w:ind w:left="720" w:first-line="-720"/>
+      </w:pPr>
+      <w:r>
+        <w:rPr>
+          <w:rFonts w:ascii="Helvetica Neue" w:hAnsi="Helvetica Neue" w:cs="Helvetica Neue"/>
+          <w:sz w:val="24"/>
+          <w:sz-cs w:val="24"/>
+          <w:color w:val="181F26"/>
+        </w:rPr>
+        <w:t xml:space="preserve"/>
+        <w:tab/>
+        <w:t xml:space="preserve">•</w:t>
+        <w:tab/>
+        <w:t xml:space="preserve"/>
+      </w:r>
+      <w:r>
+        <w:rPr>
+          <w:rFonts w:ascii="Helvetica Neue" w:hAnsi="Helvetica Neue" w:cs="Helvetica Neue"/>
+          <w:sz w:val="24"/>
+          <w:sz-cs w:val="24"/>
+          <w:spacing w:val="0"/>
+          <w:color w:val="181F26"/>
+        </w:rPr>
+        <w:t xml:space="preserve">whether post-result evaluation is required</w:t>
+      </w:r>
+    </w:p>
+    <w:p>
+      <w:pPr>
+        <w:spacing w:after="240"/>
+      </w:pPr>
+      <w:r>
+        <w:rPr>
+          <w:rFonts w:ascii="Helvetica Neue" w:hAnsi="Helvetica Neue" w:cs="Helvetica Neue"/>
+          <w:sz w:val="24"/>
+          <w:sz-cs w:val="24"/>
+          <w:spacing w:val="0"/>
+          <w:color w:val="181F26"/>
+        </w:rPr>
+        <w:t xml:space="preserve">The config surface for this layer is:</w:t>
+      </w:r>
+    </w:p>
+    <w:p>
+      <w:pPr>
+        <w:ind w:left="720" w:first-line="-720"/>
+      </w:pPr>
+      <w:r>
+        <w:rPr>
+          <w:rFonts w:ascii="Menlo" w:hAnsi="Menlo" w:cs="Menlo"/>
+          <w:sz w:val="24"/>
+          <w:sz-cs w:val="24"/>
+          <w:color w:val="181F26"/>
+        </w:rPr>
+        <w:t xml:space="preserve"/>
+        <w:tab/>
+        <w:t xml:space="preserve">•</w:t>
+        <w:tab/>
+        <w:t xml:space="preserve"/>
+      </w:r>
+      <w:r>
+        <w:rPr>
+          <w:rFonts w:ascii="Menlo" w:hAnsi="Menlo" w:cs="Menlo"/>
+          <w:sz w:val="24"/>
+          <w:sz-cs w:val="24"/>
+          <w:spacing w:val="0"/>
+          <w:color w:val="181F26"/>
+        </w:rPr>
+        <w:t xml:space="preserve">[evaluation.profiles.&lt;name&gt;]</w:t>
+      </w:r>
+      <w:r>
+        <w:rPr>
+          <w:rFonts w:ascii="Helvetica Neue" w:hAnsi="Helvetica Neue" w:cs="Helvetica Neue"/>
+          <w:sz w:val="24"/>
+          <w:sz-cs w:val="24"/>
+          <w:spacing w:val="0"/>
+          <w:color w:val="181F26"/>
+        </w:rPr>
+        <w:t xml:space="preserve"/>
+      </w:r>
+    </w:p>
+    <w:p>
+      <w:pPr>
+        <w:ind w:left="720" w:first-line="-720"/>
+      </w:pPr>
+      <w:r>
+        <w:rPr>
+          <w:rFonts w:ascii="Menlo" w:hAnsi="Menlo" w:cs="Menlo"/>
+          <w:sz w:val="24"/>
+          <w:sz-cs w:val="24"/>
+          <w:color w:val="181F26"/>
+        </w:rPr>
+        <w:t xml:space="preserve"/>
+        <w:tab/>
+        <w:t xml:space="preserve">•</w:t>
+        <w:tab/>
+        <w:t xml:space="preserve"/>
+      </w:r>
+      <w:r>
+        <w:rPr>
+          <w:rFonts w:ascii="Menlo" w:hAnsi="Menlo" w:cs="Menlo"/>
+          <w:sz w:val="24"/>
+          <w:sz-cs w:val="24"/>
+          <w:spacing w:val="0"/>
+          <w:color w:val="181F26"/>
+        </w:rPr>
+        <w:t xml:space="preserve">[evaluation.scorecards.&lt;name&gt;]</w:t>
+      </w:r>
+      <w:r>
+        <w:rPr>
+          <w:rFonts w:ascii="Helvetica Neue" w:hAnsi="Helvetica Neue" w:cs="Helvetica Neue"/>
+          <w:sz w:val="24"/>
+          <w:sz-cs w:val="24"/>
+          <w:spacing w:val="0"/>
+          <w:color w:val="181F26"/>
+        </w:rPr>
+        <w:t xml:space="preserve"/>
+      </w:r>
+    </w:p>
+    <w:p>
+      <w:pPr>
+        <w:ind w:left="720" w:first-line="-720"/>
+      </w:pPr>
+      <w:r>
+        <w:rPr>
+          <w:rFonts w:ascii="Menlo" w:hAnsi="Menlo" w:cs="Menlo"/>
+          <w:sz w:val="24"/>
+          <w:sz-cs w:val="24"/>
+          <w:color w:val="181F26"/>
+        </w:rPr>
+        <w:t xml:space="preserve"/>
+        <w:tab/>
+        <w:t xml:space="preserve">•</w:t>
+        <w:tab/>
+        <w:t xml:space="preserve"/>
+      </w:r>
+      <w:r>
+        <w:rPr>
+          <w:rFonts w:ascii="Menlo" w:hAnsi="Menlo" w:cs="Menlo"/>
+          <w:sz w:val="24"/>
+          <w:sz-cs w:val="24"/>
+          <w:spacing w:val="0"/>
+          <w:color w:val="181F26"/>
+        </w:rPr>
+        <w:t xml:space="preserve">[evaluation.datasets.&lt;name&gt;]</w:t>
+      </w:r>
+      <w:r>
+        <w:rPr>
+          <w:rFonts w:ascii="Helvetica Neue" w:hAnsi="Helvetica Neue" w:cs="Helvetica Neue"/>
+          <w:sz w:val="24"/>
+          <w:sz-cs w:val="24"/>
+          <w:spacing w:val="0"/>
+          <w:color w:val="181F26"/>
+        </w:rPr>
+        <w:t xml:space="preserve"/>
+      </w:r>
+    </w:p>
+    <w:p>
+      <w:pPr>
+        <w:ind w:left="720" w:first-line="-720"/>
+      </w:pPr>
+      <w:r>
+        <w:rPr>
+          <w:rFonts w:ascii="Menlo" w:hAnsi="Menlo" w:cs="Menlo"/>
+          <w:sz w:val="24"/>
+          <w:sz-cs w:val="24"/>
+          <w:color w:val="181F26"/>
+        </w:rPr>
+        <w:t xml:space="preserve"/>
+        <w:tab/>
+        <w:t xml:space="preserve">•</w:t>
+        <w:tab/>
+        <w:t xml:space="preserve"/>
+      </w:r>
+      <w:r>
+        <w:rPr>
+          <w:rFonts w:ascii="Menlo" w:hAnsi="Menlo" w:cs="Menlo"/>
+          <w:sz w:val="24"/>
+          <w:sz-cs w:val="24"/>
+          <w:spacing w:val="0"/>
+          <w:color w:val="181F26"/>
+        </w:rPr>
+        <w:t xml:space="preserve">[evaluation.alerts.&lt;name&gt;]</w:t>
+      </w:r>
+      <w:r>
+        <w:rPr>
+          <w:rFonts w:ascii="Helvetica Neue" w:hAnsi="Helvetica Neue" w:cs="Helvetica Neue"/>
+          <w:sz w:val="24"/>
+          <w:sz-cs w:val="24"/>
+          <w:spacing w:val="0"/>
+          <w:color w:val="181F26"/>
+        </w:rPr>
+        <w:t xml:space="preserve"/>
+      </w:r>
+    </w:p>
+    <w:p>
+      <w:pPr>
+        <w:spacing w:after="240"/>
+      </w:pPr>
+      <w:r>
+        <w:rPr>
+          <w:rFonts w:ascii="Helvetica Neue" w:hAnsi="Helvetica Neue" w:cs="Helvetica Neue"/>
+          <w:sz w:val="24"/>
+          <w:sz-cs w:val="24"/>
+          <w:spacing w:val="0"/>
+          <w:color w:val="181F26"/>
+        </w:rPr>
+        <w:t xml:space="preserve">The first deterministic criterion kinds are:</w:t>
+      </w:r>
+    </w:p>
+    <w:p>
+      <w:pPr>
+        <w:ind w:left="720" w:first-line="-720"/>
+      </w:pPr>
+      <w:r>
+        <w:rPr>
+          <w:rFonts w:ascii="Menlo" w:hAnsi="Menlo" w:cs="Menlo"/>
+          <w:sz w:val="24"/>
+          <w:sz-cs w:val="24"/>
+          <w:color w:val="181F26"/>
+        </w:rPr>
+        <w:t xml:space="preserve"/>
+        <w:tab/>
+        <w:t xml:space="preserve">•</w:t>
+        <w:tab/>
+        <w:t xml:space="preserve"/>
+      </w:r>
+      <w:r>
+        <w:rPr>
+          <w:rFonts w:ascii="Menlo" w:hAnsi="Menlo" w:cs="Menlo"/>
+          <w:sz w:val="24"/>
+          <w:sz-cs w:val="24"/>
+          <w:spacing w:val="0"/>
+          <w:color w:val="181F26"/>
+        </w:rPr>
+        <w:t xml:space="preserve">artifact_present</w:t>
+      </w:r>
+      <w:r>
+        <w:rPr>
+          <w:rFonts w:ascii="Helvetica Neue" w:hAnsi="Helvetica Neue" w:cs="Helvetica Neue"/>
+          <w:sz w:val="24"/>
+          <w:sz-cs w:val="24"/>
+          <w:spacing w:val="0"/>
+          <w:color w:val="181F26"/>
+        </w:rPr>
+        <w:t xml:space="preserve"/>
+      </w:r>
+    </w:p>
+    <w:p>
+      <w:pPr>
+        <w:ind w:left="720" w:first-line="-720"/>
+      </w:pPr>
+      <w:r>
+        <w:rPr>
+          <w:rFonts w:ascii="Menlo" w:hAnsi="Menlo" w:cs="Menlo"/>
+          <w:sz w:val="24"/>
+          <w:sz-cs w:val="24"/>
+          <w:color w:val="181F26"/>
+        </w:rPr>
+        <w:t xml:space="preserve"/>
+        <w:tab/>
+        <w:t xml:space="preserve">•</w:t>
+        <w:tab/>
+        <w:t xml:space="preserve"/>
+      </w:r>
+      <w:r>
+        <w:rPr>
+          <w:rFonts w:ascii="Menlo" w:hAnsi="Menlo" w:cs="Menlo"/>
+          <w:sz w:val="24"/>
+          <w:sz-cs w:val="24"/>
+          <w:spacing w:val="0"/>
+          <w:color w:val="181F26"/>
+        </w:rPr>
+        <w:t xml:space="preserve">json_field_nonempty</w:t>
+      </w:r>
+      <w:r>
+        <w:rPr>
+          <w:rFonts w:ascii="Helvetica Neue" w:hAnsi="Helvetica Neue" w:cs="Helvetica Neue"/>
+          <w:sz w:val="24"/>
+          <w:sz-cs w:val="24"/>
+          <w:spacing w:val="0"/>
+          <w:color w:val="181F26"/>
+        </w:rPr>
+        <w:t xml:space="preserve"/>
+      </w:r>
+    </w:p>
+    <w:p>
+      <w:pPr>
+        <w:ind w:left="720" w:first-line="-720"/>
+      </w:pPr>
+      <w:r>
+        <w:rPr>
+          <w:rFonts w:ascii="Menlo" w:hAnsi="Menlo" w:cs="Menlo"/>
+          <w:sz w:val="24"/>
+          <w:sz-cs w:val="24"/>
+          <w:color w:val="181F26"/>
+        </w:rPr>
+        <w:t xml:space="preserve"/>
+        <w:tab/>
+        <w:t xml:space="preserve">•</w:t>
+        <w:tab/>
+        <w:t xml:space="preserve"/>
+      </w:r>
+      <w:r>
+        <w:rPr>
+          <w:rFonts w:ascii="Menlo" w:hAnsi="Menlo" w:cs="Menlo"/>
+          <w:sz w:val="24"/>
+          <w:sz-cs w:val="24"/>
+          <w:spacing w:val="0"/>
+          <w:color w:val="181F26"/>
+        </w:rPr>
+        <w:t xml:space="preserve">list_min_len</w:t>
+      </w:r>
+      <w:r>
+        <w:rPr>
+          <w:rFonts w:ascii="Helvetica Neue" w:hAnsi="Helvetica Neue" w:cs="Helvetica Neue"/>
+          <w:sz w:val="24"/>
+          <w:sz-cs w:val="24"/>
+          <w:spacing w:val="0"/>
+          <w:color w:val="181F26"/>
+        </w:rPr>
+        <w:t xml:space="preserve"/>
+      </w:r>
+    </w:p>
+    <w:p>
+      <w:pPr>
+        <w:ind w:left="720" w:first-line="-720"/>
+      </w:pPr>
+      <w:r>
+        <w:rPr>
+          <w:rFonts w:ascii="Menlo" w:hAnsi="Menlo" w:cs="Menlo"/>
+          <w:sz w:val="24"/>
+          <w:sz-cs w:val="24"/>
+          <w:color w:val="181F26"/>
+        </w:rPr>
+        <w:t xml:space="preserve"/>
+        <w:tab/>
+        <w:t xml:space="preserve">•</w:t>
+        <w:tab/>
+        <w:t xml:space="preserve"/>
+      </w:r>
+      <w:r>
+        <w:rPr>
+          <w:rFonts w:ascii="Menlo" w:hAnsi="Menlo" w:cs="Menlo"/>
+          <w:sz w:val="24"/>
+          <w:sz-cs w:val="24"/>
+          <w:spacing w:val="0"/>
+          <w:color w:val="181F26"/>
+        </w:rPr>
+        <w:t xml:space="preserve">token_coverage</w:t>
+      </w:r>
+      <w:r>
+        <w:rPr>
+          <w:rFonts w:ascii="Helvetica Neue" w:hAnsi="Helvetica Neue" w:cs="Helvetica Neue"/>
+          <w:sz w:val="24"/>
+          <w:sz-cs w:val="24"/>
+          <w:spacing w:val="0"/>
+          <w:color w:val="181F26"/>
+        </w:rPr>
+        <w:t xml:space="preserve"/>
+      </w:r>
+    </w:p>
+    <w:p>
+      <w:pPr>
+        <w:ind w:left="720" w:first-line="-720"/>
+      </w:pPr>
+      <w:r>
+        <w:rPr>
+          <w:rFonts w:ascii="Menlo" w:hAnsi="Menlo" w:cs="Menlo"/>
+          <w:sz w:val="24"/>
+          <w:sz-cs w:val="24"/>
+          <w:color w:val="181F26"/>
+        </w:rPr>
+        <w:t xml:space="preserve"/>
+        <w:tab/>
+        <w:t xml:space="preserve">•</w:t>
+        <w:tab/>
+        <w:t xml:space="preserve"/>
+      </w:r>
+      <w:r>
+        <w:rPr>
+          <w:rFonts w:ascii="Menlo" w:hAnsi="Menlo" w:cs="Menlo"/>
+          <w:sz w:val="24"/>
+          <w:sz-cs w:val="24"/>
+          <w:spacing w:val="0"/>
+          <w:color w:val="181F26"/>
+        </w:rPr>
+        <w:t xml:space="preserve">checkpoint_passed</w:t>
+      </w:r>
+      <w:r>
+        <w:rPr>
+          <w:rFonts w:ascii="Helvetica Neue" w:hAnsi="Helvetica Neue" w:cs="Helvetica Neue"/>
+          <w:sz w:val="24"/>
+          <w:sz-cs w:val="24"/>
+          <w:spacing w:val="0"/>
+          <w:color w:val="181F26"/>
+        </w:rPr>
+        <w:t xml:space="preserve"/>
+      </w:r>
+    </w:p>
+    <w:p>
+      <w:pPr>
+        <w:ind w:left="720" w:first-line="-720"/>
+      </w:pPr>
+      <w:r>
+        <w:rPr>
+          <w:rFonts w:ascii="Menlo" w:hAnsi="Menlo" w:cs="Menlo"/>
+          <w:sz w:val="24"/>
+          <w:sz-cs w:val="24"/>
+          <w:color w:val="181F26"/>
+        </w:rPr>
+        <w:t xml:space="preserve"/>
+        <w:tab/>
+        <w:t xml:space="preserve">•</w:t>
+        <w:tab/>
+        <w:t xml:space="preserve"/>
+      </w:r>
+      <w:r>
+        <w:rPr>
+          <w:rFonts w:ascii="Menlo" w:hAnsi="Menlo" w:cs="Menlo"/>
+          <w:sz w:val="24"/>
+          <w:sz-cs w:val="24"/>
+          <w:spacing w:val="0"/>
+          <w:color w:val="181F26"/>
+        </w:rPr>
+        <w:t xml:space="preserve">incident_absent</w:t>
+      </w:r>
+      <w:r>
+        <w:rPr>
+          <w:rFonts w:ascii="Helvetica Neue" w:hAnsi="Helvetica Neue" w:cs="Helvetica Neue"/>
+          <w:sz w:val="24"/>
+          <w:sz-cs w:val="24"/>
+          <w:spacing w:val="0"/>
+          <w:color w:val="181F26"/>
+        </w:rPr>
+        <w:t xml:space="preserve"/>
+      </w:r>
+    </w:p>
+    <w:p>
+      <w:pPr>
+        <w:spacing w:after="240"/>
+      </w:pPr>
+      <w:r>
+        <w:rPr>
+          <w:rFonts w:ascii="Helvetica Neue" w:hAnsi="Helvetica Neue" w:cs="Helvetica Neue"/>
+          <w:sz w:val="24"/>
+          <w:sz-cs w:val="24"/>
+          <w:spacing w:val="0"/>
+          <w:color w:val="181F26"/>
+        </w:rPr>
+        <w:t xml:space="preserve">The initial capability set remains:</w:t>
       </w:r>
     </w:p>
     <w:p>
@@ -37770,7 +39545,70 @@
           <w:spacing w:val="0"/>
           <w:color w:val="0000E9"/>
         </w:rPr>
-        <w:t xml:space="preserve">observability</w:t>
+        <w:t xml:space="preserve">observability concepts</w:t>
+      </w:r>
+      <w:r>
+        <w:rPr>
+          <w:rFonts w:ascii="Helvetica Neue" w:hAnsi="Helvetica Neue" w:cs="Helvetica Neue"/>
+          <w:sz w:val="24"/>
+          <w:sz-cs w:val="24"/>
+          <w:spacing w:val="0"/>
+          <w:color w:val="181F26"/>
+        </w:rPr>
+        <w:t xml:space="preserve">, </w:t>
+      </w:r>
+      <w:r>
+        <w:rPr>
+          <w:rFonts w:ascii="Helvetica Neue" w:hAnsi="Helvetica Neue" w:cs="Helvetica Neue"/>
+          <w:sz w:val="24"/>
+          <w:sz-cs w:val="24"/>
+          <w:u w:val="single"/>
+          <w:spacing w:val="0"/>
+          <w:color w:val="0000E9"/>
+        </w:rPr>
+        <w:t xml:space="preserve">annotation queues</w:t>
+      </w:r>
+      <w:r>
+        <w:rPr>
+          <w:rFonts w:ascii="Helvetica Neue" w:hAnsi="Helvetica Neue" w:cs="Helvetica Neue"/>
+          <w:sz w:val="24"/>
+          <w:sz-cs w:val="24"/>
+          <w:spacing w:val="0"/>
+          <w:color w:val="181F26"/>
+        </w:rPr>
+        <w:t xml:space="preserve">, and </w:t>
+      </w:r>
+      <w:r>
+        <w:rPr>
+          <w:rFonts w:ascii="Helvetica Neue" w:hAnsi="Helvetica Neue" w:cs="Helvetica Neue"/>
+          <w:sz w:val="24"/>
+          <w:sz-cs w:val="24"/>
+          <w:u w:val="single"/>
+          <w:spacing w:val="0"/>
+          <w:color w:val="0000E9"/>
+        </w:rPr>
+        <w:t xml:space="preserve">automation rules</w:t>
+      </w:r>
+      <w:r>
+        <w:rPr>
+          <w:rFonts w:ascii="Helvetica Neue" w:hAnsi="Helvetica Neue" w:cs="Helvetica Neue"/>
+          <w:sz w:val="24"/>
+          <w:sz-cs w:val="24"/>
+          <w:spacing w:val="0"/>
+          <w:color w:val="181F26"/>
+        </w:rPr>
+        <w:t xml:space="preserve"> are useful reference shapes here. Anthropic's </w:t>
+      </w:r>
+      <w:r>
+        <w:rPr>
+          <w:rFonts w:ascii="Helvetica Neue" w:hAnsi="Helvetica Neue" w:cs="Helvetica Neue"/>
+          <w:sz w:val="24"/>
+          <w:sz-cs w:val="24"/>
+          <w:u w:val="single"/>
+          <w:spacing w:val="0"/>
+          <w:color w:val="0000E9"/>
+        </w:rPr>
+        <w:t xml:space="preserve">Claude's Constitution</w:t>
       </w:r>
       <w:r>
         <w:rPr>
@@ -37791,28 +39629,190 @@
           <w:spacing w:val="0"/>
           <w:color w:val="0000E9"/>
         </w:rPr>
-        <w:t xml:space="preserve">evaluation</w:t>
-      </w:r>
-      <w:r>
-        <w:rPr>
-          <w:rFonts w:ascii="Helvetica Neue" w:hAnsi="Helvetica Neue" w:cs="Helvetica Neue"/>
-          <w:sz w:val="24"/>
-          <w:sz-cs w:val="24"/>
-          <w:spacing w:val="0"/>
-          <w:color w:val="181F26"/>
-        </w:rPr>
-        <w:t xml:space="preserve"> are useful reference shapes here. Anthropic's </w:t>
-      </w:r>
-      <w:r>
-        <w:rPr>
-          <w:rFonts w:ascii="Helvetica Neue" w:hAnsi="Helvetica Neue" w:cs="Helvetica Neue"/>
-          <w:sz w:val="24"/>
-          <w:sz-cs w:val="24"/>
-          <w:u w:val="single"/>
-          <w:spacing w:val="0"/>
-          <w:color w:val="0000E9"/>
-        </w:rPr>
-        <w:t xml:space="preserve">Claude's Constitution</w:t>
+        <w:t xml:space="preserve">Constitutional AI</w:t>
+      </w:r>
+      <w:r>
+        <w:rPr>
+          <w:rFonts w:ascii="Helvetica Neue" w:hAnsi="Helvetica Neue" w:cs="Helvetica Neue"/>
+          <w:sz w:val="24"/>
+          <w:sz-cs w:val="24"/>
+          <w:spacing w:val="0"/>
+          <w:color w:val="181F26"/>
+        </w:rPr>
+        <w:t xml:space="preserve"> are useful reference shapes for rule-guided behavior. Crawfish lifts both ideas into runtime governance: checkpoints, evidence, incidents, review, escalation, datasets, and replay experiments.</w:t>
+      </w:r>
+    </w:p>
+    <w:p>
+      <w:pPr>
+        <w:spacing w:after="152"/>
+      </w:pPr>
+      <w:r>
+        <w:rPr>
+          <w:rFonts w:ascii="Helvetica Neue" w:hAnsi="Helvetica Neue" w:cs="Helvetica Neue"/>
+          <w:sz w:val="34"/>
+          <w:sz-cs w:val="34"/>
+          <w:b/>
+          <w:spacing w:val="0"/>
+          <w:color w:val="102C4B"/>
+        </w:rPr>
+        <w:t xml:space="preserve">Dataset Capture And Replay</w:t>
+      </w:r>
+    </w:p>
+    <w:p>
+      <w:pPr>
+        <w:spacing w:after="240"/>
+      </w:pPr>
+      <w:r>
+        <w:rPr>
+          <w:rFonts w:ascii="Helvetica Neue" w:hAnsi="Helvetica Neue" w:cs="Helvetica Neue"/>
+          <w:sz w:val="24"/>
+          <w:sz-cs w:val="24"/>
+          <w:spacing w:val="0"/>
+          <w:color w:val="181F26"/>
+        </w:rPr>
+        <w:t xml:space="preserve">The evaluation spine now extends beyond post-result scoring into reusable quality operations.</w:t>
+      </w:r>
+    </w:p>
+    <w:p>
+      <w:pPr>
+        <w:ind w:left="720" w:first-line="-720"/>
+      </w:pPr>
+      <w:r>
+        <w:rPr>
+          <w:rFonts w:ascii="Helvetica Neue" w:hAnsi="Helvetica Neue" w:cs="Helvetica Neue"/>
+          <w:sz w:val="24"/>
+          <w:sz-cs w:val="24"/>
+          <w:color w:val="181F26"/>
+        </w:rPr>
+        <w:t xml:space="preserve"/>
+        <w:tab/>
+        <w:t xml:space="preserve">•</w:t>
+        <w:tab/>
+        <w:t xml:space="preserve"/>
+      </w:r>
+      <w:r>
+        <w:rPr>
+          <w:rFonts w:ascii="Helvetica Neue" w:hAnsi="Helvetica Neue" w:cs="Helvetica Neue"/>
+          <w:sz w:val="24"/>
+          <w:sz-cs w:val="24"/>
+          <w:spacing w:val="0"/>
+          <w:color w:val="181F26"/>
+        </w:rPr>
+        <w:t xml:space="preserve">completed traces may be frozen as </w:t>
+      </w:r>
+      <w:r>
+        <w:rPr>
+          <w:rFonts w:ascii="Menlo" w:hAnsi="Menlo" w:cs="Menlo"/>
+          <w:sz w:val="24"/>
+          <w:sz-cs w:val="24"/>
+          <w:spacing w:val="0"/>
+          <w:color w:val="181F26"/>
+        </w:rPr>
+        <w:t xml:space="preserve">DatasetCase</w:t>
+      </w:r>
+      <w:r>
+        <w:rPr>
+          <w:rFonts w:ascii="Helvetica Neue" w:hAnsi="Helvetica Neue" w:cs="Helvetica Neue"/>
+          <w:sz w:val="24"/>
+          <w:sz-cs w:val="24"/>
+          <w:spacing w:val="0"/>
+          <w:color w:val="181F26"/>
+        </w:rPr>
+        <w:t xml:space="preserve">s</w:t>
+      </w:r>
+    </w:p>
+    <w:p>
+      <w:pPr>
+        <w:ind w:left="720" w:first-line="-720"/>
+      </w:pPr>
+      <w:r>
+        <w:rPr>
+          <w:rFonts w:ascii="Helvetica Neue" w:hAnsi="Helvetica Neue" w:cs="Helvetica Neue"/>
+          <w:sz w:val="24"/>
+          <w:sz-cs w:val="24"/>
+          <w:color w:val="181F26"/>
+        </w:rPr>
+        <w:t xml:space="preserve"/>
+        <w:tab/>
+        <w:t xml:space="preserve">•</w:t>
+        <w:tab/>
+        <w:t xml:space="preserve"/>
+      </w:r>
+      <w:r>
+        <w:rPr>
+          <w:rFonts w:ascii="Helvetica Neue" w:hAnsi="Helvetica Neue" w:cs="Helvetica Neue"/>
+          <w:sz w:val="24"/>
+          <w:sz-cs w:val="24"/>
+          <w:spacing w:val="0"/>
+          <w:color w:val="181F26"/>
+        </w:rPr>
+        <w:t xml:space="preserve">datasets are grouped by capability and carry doctrine, jurisdiction, checkpoint, and incident metadata</w:t>
+      </w:r>
+    </w:p>
+    <w:p>
+      <w:pPr>
+        <w:ind w:left="720" w:first-line="-720"/>
+      </w:pPr>
+      <w:r>
+        <w:rPr>
+          <w:rFonts w:ascii="Helvetica Neue" w:hAnsi="Helvetica Neue" w:cs="Helvetica Neue"/>
+          <w:sz w:val="24"/>
+          <w:sz-cs w:val="24"/>
+          <w:color w:val="181F26"/>
+        </w:rPr>
+        <w:t xml:space="preserve"/>
+        <w:tab/>
+        <w:t xml:space="preserve">•</w:t>
+        <w:tab/>
+        <w:t xml:space="preserve"/>
+      </w:r>
+      <w:r>
+        <w:rPr>
+          <w:rFonts w:ascii="Helvetica Neue" w:hAnsi="Helvetica Neue" w:cs="Helvetica Neue"/>
+          <w:sz w:val="24"/>
+          <w:sz-cs w:val="24"/>
+          <w:spacing w:val="0"/>
+          <w:color w:val="181F26"/>
+        </w:rPr>
+        <w:t xml:space="preserve">replay runs execute those cases against one explicit executor surface</w:t>
+      </w:r>
+    </w:p>
+    <w:p>
+      <w:pPr>
+        <w:ind w:left="720" w:first-line="-720"/>
+      </w:pPr>
+      <w:r>
+        <w:rPr>
+          <w:rFonts w:ascii="Helvetica Neue" w:hAnsi="Helvetica Neue" w:cs="Helvetica Neue"/>
+          <w:sz w:val="24"/>
+          <w:sz-cs w:val="24"/>
+          <w:color w:val="181F26"/>
+        </w:rPr>
+        <w:t xml:space="preserve"/>
+        <w:tab/>
+        <w:t xml:space="preserve">•</w:t>
+        <w:tab/>
+        <w:t xml:space="preserve"/>
+      </w:r>
+      <w:r>
+        <w:rPr>
+          <w:rFonts w:ascii="Helvetica Neue" w:hAnsi="Helvetica Neue" w:cs="Helvetica Neue"/>
+          <w:sz w:val="24"/>
+          <w:sz-cs w:val="24"/>
+          <w:spacing w:val="0"/>
+          <w:color w:val="181F26"/>
+        </w:rPr>
+        <w:t xml:space="preserve">replay results persist under </w:t>
+      </w:r>
+      <w:r>
+        <w:rPr>
+          <w:rFonts w:ascii="Menlo" w:hAnsi="Menlo" w:cs="Menlo"/>
+          <w:sz w:val="24"/>
+          <w:sz-cs w:val="24"/>
+          <w:spacing w:val="0"/>
+          <w:color w:val="181F26"/>
+        </w:rPr>
+        <w:t xml:space="preserve">ExperimentRun</w:t>
       </w:r>
       <w:r>
         <w:rPr>
@@ -37826,24 +39826,66 @@
       </w:r>
       <w:r>
         <w:rPr>
-          <w:rFonts w:ascii="Helvetica Neue" w:hAnsi="Helvetica Neue" w:cs="Helvetica Neue"/>
-          <w:sz w:val="24"/>
-          <w:sz-cs w:val="24"/>
-          <w:u w:val="single"/>
-          <w:spacing w:val="0"/>
-          <w:color w:val="0000E9"/>
-        </w:rPr>
-        <w:t xml:space="preserve">Constitutional AI</w:t>
-      </w:r>
-      <w:r>
-        <w:rPr>
-          <w:rFonts w:ascii="Helvetica Neue" w:hAnsi="Helvetica Neue" w:cs="Helvetica Neue"/>
-          <w:sz w:val="24"/>
-          <w:sz-cs w:val="24"/>
-          <w:spacing w:val="0"/>
-          <w:color w:val="181F26"/>
-        </w:rPr>
-        <w:t xml:space="preserve"> are useful reference shapes for rule-guided behavior. Crawfish lifts both ideas into runtime governance: checkpoints, evidence, incidents, review, and escalation.</w:t>
+          <w:rFonts w:ascii="Menlo" w:hAnsi="Menlo" w:cs="Menlo"/>
+          <w:sz w:val="24"/>
+          <w:sz-cs w:val="24"/>
+          <w:spacing w:val="0"/>
+          <w:color w:val="181F26"/>
+        </w:rPr>
+        <w:t xml:space="preserve">ExperimentCaseResult</w:t>
+      </w:r>
+      <w:r>
+        <w:rPr>
+          <w:rFonts w:ascii="Helvetica Neue" w:hAnsi="Helvetica Neue" w:cs="Helvetica Neue"/>
+          <w:sz w:val="24"/>
+          <w:sz-cs w:val="24"/>
+          <w:spacing w:val="0"/>
+          <w:color w:val="181F26"/>
+        </w:rPr>
+        <w:t xml:space="preserve"/>
+      </w:r>
+    </w:p>
+    <w:p>
+      <w:pPr>
+        <w:ind w:left="720" w:first-line="-720"/>
+      </w:pPr>
+      <w:r>
+        <w:rPr>
+          <w:rFonts w:ascii="Helvetica Neue" w:hAnsi="Helvetica Neue" w:cs="Helvetica Neue"/>
+          <w:sz w:val="24"/>
+          <w:sz-cs w:val="24"/>
+          <w:color w:val="181F26"/>
+        </w:rPr>
+        <w:t xml:space="preserve"/>
+        <w:tab/>
+        <w:t xml:space="preserve">•</w:t>
+        <w:tab/>
+        <w:t xml:space="preserve"/>
+      </w:r>
+      <w:r>
+        <w:rPr>
+          <w:rFonts w:ascii="Helvetica Neue" w:hAnsi="Helvetica Neue" w:cs="Helvetica Neue"/>
+          <w:sz w:val="24"/>
+          <w:sz-cs w:val="24"/>
+          <w:spacing w:val="0"/>
+          <w:color w:val="181F26"/>
+        </w:rPr>
+        <w:t xml:space="preserve">replay does not create normal production review queue noise or alert spam by default</w:t>
+      </w:r>
+    </w:p>
+    <w:p>
+      <w:pPr>
+        <w:spacing w:after="240"/>
+      </w:pPr>
+      <w:r>
+        <w:rPr>
+          <w:rFonts w:ascii="Helvetica Neue" w:hAnsi="Helvetica Neue" w:cs="Helvetica Neue"/>
+          <w:sz w:val="24"/>
+          <w:sz-cs w:val="24"/>
+          <w:spacing w:val="0"/>
+          <w:color w:val="181F26"/>
+        </w:rPr>
+        <w:t xml:space="preserve">This is how Crawfish turns trace history into institutional memory rather than an archive of unread logs.</w:t>
       </w:r>
     </w:p>
     <w:p>
@@ -38548,6 +40590,234 @@
           <w:spacing w:val="0"/>
           <w:color w:val="181F26"/>
         </w:rPr>
+        <w:t xml:space="preserve">crawfish eval dataset list</w:t>
+      </w:r>
+      <w:r>
+        <w:rPr>
+          <w:rFonts w:ascii="Helvetica Neue" w:hAnsi="Helvetica Neue" w:cs="Helvetica Neue"/>
+          <w:sz w:val="24"/>
+          <w:sz-cs w:val="24"/>
+          <w:spacing w:val="0"/>
+          <w:color w:val="181F26"/>
+        </w:rPr>
+        <w:t xml:space="preserve"/>
+      </w:r>
+    </w:p>
+    <w:p>
+      <w:pPr>
+        <w:ind w:left="720" w:first-line="-720"/>
+      </w:pPr>
+      <w:r>
+        <w:rPr>
+          <w:rFonts w:ascii="Menlo" w:hAnsi="Menlo" w:cs="Menlo"/>
+          <w:sz w:val="24"/>
+          <w:sz-cs w:val="24"/>
+          <w:color w:val="181F26"/>
+        </w:rPr>
+        <w:t xml:space="preserve"/>
+        <w:tab/>
+        <w:t xml:space="preserve">•</w:t>
+        <w:tab/>
+        <w:t xml:space="preserve"/>
+      </w:r>
+      <w:r>
+        <w:rPr>
+          <w:rFonts w:ascii="Menlo" w:hAnsi="Menlo" w:cs="Menlo"/>
+          <w:sz w:val="24"/>
+          <w:sz-cs w:val="24"/>
+          <w:spacing w:val="0"/>
+          <w:color w:val="181F26"/>
+        </w:rPr>
+        <w:t xml:space="preserve">crawfish eval dataset show</w:t>
+      </w:r>
+      <w:r>
+        <w:rPr>
+          <w:rFonts w:ascii="Helvetica Neue" w:hAnsi="Helvetica Neue" w:cs="Helvetica Neue"/>
+          <w:sz w:val="24"/>
+          <w:sz-cs w:val="24"/>
+          <w:spacing w:val="0"/>
+          <w:color w:val="181F26"/>
+        </w:rPr>
+        <w:t xml:space="preserve"/>
+      </w:r>
+    </w:p>
+    <w:p>
+      <w:pPr>
+        <w:ind w:left="720" w:first-line="-720"/>
+      </w:pPr>
+      <w:r>
+        <w:rPr>
+          <w:rFonts w:ascii="Menlo" w:hAnsi="Menlo" w:cs="Menlo"/>
+          <w:sz w:val="24"/>
+          <w:sz-cs w:val="24"/>
+          <w:color w:val="181F26"/>
+        </w:rPr>
+        <w:t xml:space="preserve"/>
+        <w:tab/>
+        <w:t xml:space="preserve">•</w:t>
+        <w:tab/>
+        <w:t xml:space="preserve"/>
+      </w:r>
+      <w:r>
+        <w:rPr>
+          <w:rFonts w:ascii="Menlo" w:hAnsi="Menlo" w:cs="Menlo"/>
+          <w:sz w:val="24"/>
+          <w:sz-cs w:val="24"/>
+          <w:spacing w:val="0"/>
+          <w:color w:val="181F26"/>
+        </w:rPr>
+        <w:t xml:space="preserve">crawfish eval run</w:t>
+      </w:r>
+      <w:r>
+        <w:rPr>
+          <w:rFonts w:ascii="Helvetica Neue" w:hAnsi="Helvetica Neue" w:cs="Helvetica Neue"/>
+          <w:sz w:val="24"/>
+          <w:sz-cs w:val="24"/>
+          <w:spacing w:val="0"/>
+          <w:color w:val="181F26"/>
+        </w:rPr>
+        <w:t xml:space="preserve"/>
+      </w:r>
+    </w:p>
+    <w:p>
+      <w:pPr>
+        <w:ind w:left="720" w:first-line="-720"/>
+      </w:pPr>
+      <w:r>
+        <w:rPr>
+          <w:rFonts w:ascii="Menlo" w:hAnsi="Menlo" w:cs="Menlo"/>
+          <w:sz w:val="24"/>
+          <w:sz-cs w:val="24"/>
+          <w:color w:val="181F26"/>
+        </w:rPr>
+        <w:t xml:space="preserve"/>
+        <w:tab/>
+        <w:t xml:space="preserve">•</w:t>
+        <w:tab/>
+        <w:t xml:space="preserve"/>
+      </w:r>
+      <w:r>
+        <w:rPr>
+          <w:rFonts w:ascii="Menlo" w:hAnsi="Menlo" w:cs="Menlo"/>
+          <w:sz w:val="24"/>
+          <w:sz-cs w:val="24"/>
+          <w:spacing w:val="0"/>
+          <w:color w:val="181F26"/>
+        </w:rPr>
+        <w:t xml:space="preserve">crawfish eval run-status</w:t>
+      </w:r>
+      <w:r>
+        <w:rPr>
+          <w:rFonts w:ascii="Helvetica Neue" w:hAnsi="Helvetica Neue" w:cs="Helvetica Neue"/>
+          <w:sz w:val="24"/>
+          <w:sz-cs w:val="24"/>
+          <w:spacing w:val="0"/>
+          <w:color w:val="181F26"/>
+        </w:rPr>
+        <w:t xml:space="preserve"/>
+      </w:r>
+    </w:p>
+    <w:p>
+      <w:pPr>
+        <w:ind w:left="720" w:first-line="-720"/>
+      </w:pPr>
+      <w:r>
+        <w:rPr>
+          <w:rFonts w:ascii="Menlo" w:hAnsi="Menlo" w:cs="Menlo"/>
+          <w:sz w:val="24"/>
+          <w:sz-cs w:val="24"/>
+          <w:color w:val="181F26"/>
+        </w:rPr>
+        <w:t xml:space="preserve"/>
+        <w:tab/>
+        <w:t xml:space="preserve">•</w:t>
+        <w:tab/>
+        <w:t xml:space="preserve"/>
+      </w:r>
+      <w:r>
+        <w:rPr>
+          <w:rFonts w:ascii="Menlo" w:hAnsi="Menlo" w:cs="Menlo"/>
+          <w:sz w:val="24"/>
+          <w:sz-cs w:val="24"/>
+          <w:spacing w:val="0"/>
+          <w:color w:val="181F26"/>
+        </w:rPr>
+        <w:t xml:space="preserve">crawfish alert list</w:t>
+      </w:r>
+      <w:r>
+        <w:rPr>
+          <w:rFonts w:ascii="Helvetica Neue" w:hAnsi="Helvetica Neue" w:cs="Helvetica Neue"/>
+          <w:sz w:val="24"/>
+          <w:sz-cs w:val="24"/>
+          <w:spacing w:val="0"/>
+          <w:color w:val="181F26"/>
+        </w:rPr>
+        <w:t xml:space="preserve"/>
+      </w:r>
+    </w:p>
+    <w:p>
+      <w:pPr>
+        <w:ind w:left="720" w:first-line="-720"/>
+      </w:pPr>
+      <w:r>
+        <w:rPr>
+          <w:rFonts w:ascii="Menlo" w:hAnsi="Menlo" w:cs="Menlo"/>
+          <w:sz w:val="24"/>
+          <w:sz-cs w:val="24"/>
+          <w:color w:val="181F26"/>
+        </w:rPr>
+        <w:t xml:space="preserve"/>
+        <w:tab/>
+        <w:t xml:space="preserve">•</w:t>
+        <w:tab/>
+        <w:t xml:space="preserve"/>
+      </w:r>
+      <w:r>
+        <w:rPr>
+          <w:rFonts w:ascii="Menlo" w:hAnsi="Menlo" w:cs="Menlo"/>
+          <w:sz w:val="24"/>
+          <w:sz-cs w:val="24"/>
+          <w:spacing w:val="0"/>
+          <w:color w:val="181F26"/>
+        </w:rPr>
+        <w:t xml:space="preserve">crawfish alert ack</w:t>
+      </w:r>
+      <w:r>
+        <w:rPr>
+          <w:rFonts w:ascii="Helvetica Neue" w:hAnsi="Helvetica Neue" w:cs="Helvetica Neue"/>
+          <w:sz w:val="24"/>
+          <w:sz-cs w:val="24"/>
+          <w:spacing w:val="0"/>
+          <w:color w:val="181F26"/>
+        </w:rPr>
+        <w:t xml:space="preserve"/>
+      </w:r>
+    </w:p>
+    <w:p>
+      <w:pPr>
+        <w:ind w:left="720" w:first-line="-720"/>
+      </w:pPr>
+      <w:r>
+        <w:rPr>
+          <w:rFonts w:ascii="Menlo" w:hAnsi="Menlo" w:cs="Menlo"/>
+          <w:sz w:val="24"/>
+          <w:sz-cs w:val="24"/>
+          <w:color w:val="181F26"/>
+        </w:rPr>
+        <w:t xml:space="preserve"/>
+        <w:tab/>
+        <w:t xml:space="preserve">•</w:t>
+        <w:tab/>
+        <w:t xml:space="preserve"/>
+      </w:r>
+      <w:r>
+        <w:rPr>
+          <w:rFonts w:ascii="Menlo" w:hAnsi="Menlo" w:cs="Menlo"/>
+          <w:sz w:val="24"/>
+          <w:sz-cs w:val="24"/>
+          <w:spacing w:val="0"/>
+          <w:color w:val="181F26"/>
+        </w:rPr>
         <w:t xml:space="preserve">crawfish drain</w:t>
       </w:r>
       <w:r>
@@ -38926,6 +41196,180 @@
           <w:spacing w:val="0"/>
           <w:color w:val="181F26"/>
         </w:rPr>
+        <w:t xml:space="preserve">eval dataset list</w:t>
+      </w:r>
+      <w:r>
+        <w:rPr>
+          <w:rFonts w:ascii="Helvetica Neue" w:hAnsi="Helvetica Neue" w:cs="Helvetica Neue"/>
+          <w:sz w:val="24"/>
+          <w:sz-cs w:val="24"/>
+          <w:spacing w:val="0"/>
+          <w:color w:val="181F26"/>
+        </w:rPr>
+        <w:t xml:space="preserve"> and </w:t>
+      </w:r>
+      <w:r>
+        <w:rPr>
+          <w:rFonts w:ascii="Menlo" w:hAnsi="Menlo" w:cs="Menlo"/>
+          <w:sz w:val="24"/>
+          <w:sz-cs w:val="24"/>
+          <w:spacing w:val="0"/>
+          <w:color w:val="181F26"/>
+        </w:rPr>
+        <w:t xml:space="preserve">eval dataset show</w:t>
+      </w:r>
+      <w:r>
+        <w:rPr>
+          <w:rFonts w:ascii="Helvetica Neue" w:hAnsi="Helvetica Neue" w:cs="Helvetica Neue"/>
+          <w:sz w:val="24"/>
+          <w:sz-cs w:val="24"/>
+          <w:spacing w:val="0"/>
+          <w:color w:val="181F26"/>
+        </w:rPr>
+        <w:t xml:space="preserve"> expose captured evaluation datasets and frozen cases</w:t>
+      </w:r>
+    </w:p>
+    <w:p>
+      <w:pPr>
+        <w:ind w:left="720" w:first-line="-720"/>
+      </w:pPr>
+      <w:r>
+        <w:rPr>
+          <w:rFonts w:ascii="Menlo" w:hAnsi="Menlo" w:cs="Menlo"/>
+          <w:sz w:val="24"/>
+          <w:sz-cs w:val="24"/>
+          <w:color w:val="181F26"/>
+        </w:rPr>
+        <w:t xml:space="preserve"/>
+        <w:tab/>
+        <w:t xml:space="preserve">•</w:t>
+        <w:tab/>
+        <w:t xml:space="preserve"/>
+      </w:r>
+      <w:r>
+        <w:rPr>
+          <w:rFonts w:ascii="Menlo" w:hAnsi="Menlo" w:cs="Menlo"/>
+          <w:sz w:val="24"/>
+          <w:sz-cs w:val="24"/>
+          <w:spacing w:val="0"/>
+          <w:color w:val="181F26"/>
+        </w:rPr>
+        <w:t xml:space="preserve">eval run</w:t>
+      </w:r>
+      <w:r>
+        <w:rPr>
+          <w:rFonts w:ascii="Helvetica Neue" w:hAnsi="Helvetica Neue" w:cs="Helvetica Neue"/>
+          <w:sz w:val="24"/>
+          <w:sz-cs w:val="24"/>
+          <w:spacing w:val="0"/>
+          <w:color w:val="181F26"/>
+        </w:rPr>
+        <w:t xml:space="preserve"> and </w:t>
+      </w:r>
+      <w:r>
+        <w:rPr>
+          <w:rFonts w:ascii="Menlo" w:hAnsi="Menlo" w:cs="Menlo"/>
+          <w:sz w:val="24"/>
+          <w:sz-cs w:val="24"/>
+          <w:spacing w:val="0"/>
+          <w:color w:val="181F26"/>
+        </w:rPr>
+        <w:t xml:space="preserve">eval run-status</w:t>
+      </w:r>
+      <w:r>
+        <w:rPr>
+          <w:rFonts w:ascii="Helvetica Neue" w:hAnsi="Helvetica Neue" w:cs="Helvetica Neue"/>
+          <w:sz w:val="24"/>
+          <w:sz-cs w:val="24"/>
+          <w:spacing w:val="0"/>
+          <w:color w:val="181F26"/>
+        </w:rPr>
+        <w:t xml:space="preserve"> expose isolated replay experiments per executor surface</w:t>
+      </w:r>
+    </w:p>
+    <w:p>
+      <w:pPr>
+        <w:ind w:left="720" w:first-line="-720"/>
+      </w:pPr>
+      <w:r>
+        <w:rPr>
+          <w:rFonts w:ascii="Menlo" w:hAnsi="Menlo" w:cs="Menlo"/>
+          <w:sz w:val="24"/>
+          <w:sz-cs w:val="24"/>
+          <w:color w:val="181F26"/>
+        </w:rPr>
+        <w:t xml:space="preserve"/>
+        <w:tab/>
+        <w:t xml:space="preserve">•</w:t>
+        <w:tab/>
+        <w:t xml:space="preserve"/>
+      </w:r>
+      <w:r>
+        <w:rPr>
+          <w:rFonts w:ascii="Menlo" w:hAnsi="Menlo" w:cs="Menlo"/>
+          <w:sz w:val="24"/>
+          <w:sz-cs w:val="24"/>
+          <w:spacing w:val="0"/>
+          <w:color w:val="181F26"/>
+        </w:rPr>
+        <w:t xml:space="preserve">alert list</w:t>
+      </w:r>
+      <w:r>
+        <w:rPr>
+          <w:rFonts w:ascii="Helvetica Neue" w:hAnsi="Helvetica Neue" w:cs="Helvetica Neue"/>
+          <w:sz w:val="24"/>
+          <w:sz-cs w:val="24"/>
+          <w:spacing w:val="0"/>
+          <w:color w:val="181F26"/>
+        </w:rPr>
+        <w:t xml:space="preserve"> and </w:t>
+      </w:r>
+      <w:r>
+        <w:rPr>
+          <w:rFonts w:ascii="Menlo" w:hAnsi="Menlo" w:cs="Menlo"/>
+          <w:sz w:val="24"/>
+          <w:sz-cs w:val="24"/>
+          <w:spacing w:val="0"/>
+          <w:color w:val="181F26"/>
+        </w:rPr>
+        <w:t xml:space="preserve">alert ack</w:t>
+      </w:r>
+      <w:r>
+        <w:rPr>
+          <w:rFonts w:ascii="Helvetica Neue" w:hAnsi="Helvetica Neue" w:cs="Helvetica Neue"/>
+          <w:sz w:val="24"/>
+          <w:sz-cs w:val="24"/>
+          <w:spacing w:val="0"/>
+          <w:color w:val="181F26"/>
+        </w:rPr>
+        <w:t xml:space="preserve"> expose doctrine and evaluation escalation signals</w:t>
+      </w:r>
+    </w:p>
+    <w:p>
+      <w:pPr>
+        <w:ind w:left="720" w:first-line="-720"/>
+      </w:pPr>
+      <w:r>
+        <w:rPr>
+          <w:rFonts w:ascii="Menlo" w:hAnsi="Menlo" w:cs="Menlo"/>
+          <w:sz w:val="24"/>
+          <w:sz-cs w:val="24"/>
+          <w:color w:val="181F26"/>
+        </w:rPr>
+        <w:t xml:space="preserve"/>
+        <w:tab/>
+        <w:t xml:space="preserve">•</w:t>
+        <w:tab/>
+        <w:t xml:space="preserve"/>
+      </w:r>
+      <w:r>
+        <w:rPr>
+          <w:rFonts w:ascii="Menlo" w:hAnsi="Menlo" w:cs="Menlo"/>
+          <w:sz w:val="24"/>
+          <w:sz-cs w:val="24"/>
+          <w:spacing w:val="0"/>
+          <w:color w:val="181F26"/>
+        </w:rPr>
         <w:t xml:space="preserve">drain</w:t>
       </w:r>
       <w:r>
@@ -42749,6 +45193,379 @@
     </w:p>
     <w:p>
       <w:pPr>
+        <w:spacing w:after="240"/>
+      </w:pPr>
+      <w:r>
+        <w:rPr>
+          <w:rFonts w:ascii="Helvetica Neue" w:hAnsi="Helvetica Neue" w:cs="Helvetica Neue"/>
+          <w:sz w:val="24"/>
+          <w:sz-cs w:val="24"/>
+          <w:spacing w:val="0"/>
+          <w:color w:val="181F26"/>
+        </w:rPr>
+        <w:t xml:space="preserve">The current </w:t>
+      </w:r>
+      <w:r>
+        <w:rPr>
+          <w:rFonts w:ascii="Menlo" w:hAnsi="Menlo" w:cs="Menlo"/>
+          <w:sz w:val="24"/>
+          <w:sz-cs w:val="24"/>
+          <w:spacing w:val="0"/>
+          <w:color w:val="181F26"/>
+        </w:rPr>
+        <w:t xml:space="preserve">P1g</w:t>
+      </w:r>
+      <w:r>
+        <w:rPr>
+          <w:rFonts w:ascii="Helvetica Neue" w:hAnsi="Helvetica Neue" w:cs="Helvetica Neue"/>
+          <w:sz w:val="24"/>
+          <w:sz-cs w:val="24"/>
+          <w:spacing w:val="0"/>
+          <w:color w:val="181F26"/>
+        </w:rPr>
+        <w:t xml:space="preserve"> dataset-backed evaluation-ops slice adds:</w:t>
+      </w:r>
+    </w:p>
+    <w:p>
+      <w:pPr>
+        <w:ind w:left="720" w:first-line="-720"/>
+      </w:pPr>
+      <w:r>
+        <w:rPr>
+          <w:rFonts w:ascii="Menlo" w:hAnsi="Menlo" w:cs="Menlo"/>
+          <w:sz w:val="24"/>
+          <w:sz-cs w:val="24"/>
+          <w:color w:val="181F26"/>
+        </w:rPr>
+        <w:t xml:space="preserve"/>
+        <w:tab/>
+        <w:t xml:space="preserve">•</w:t>
+        <w:tab/>
+        <w:t xml:space="preserve"/>
+      </w:r>
+      <w:r>
+        <w:rPr>
+          <w:rFonts w:ascii="Menlo" w:hAnsi="Menlo" w:cs="Menlo"/>
+          <w:sz w:val="24"/>
+          <w:sz-cs w:val="24"/>
+          <w:spacing w:val="0"/>
+          <w:color w:val="181F26"/>
+        </w:rPr>
+        <w:t xml:space="preserve">quality.evaluation_profile</w:t>
+      </w:r>
+      <w:r>
+        <w:rPr>
+          <w:rFonts w:ascii="Helvetica Neue" w:hAnsi="Helvetica Neue" w:cs="Helvetica Neue"/>
+          <w:sz w:val="24"/>
+          <w:sz-cs w:val="24"/>
+          <w:spacing w:val="0"/>
+          <w:color w:val="181F26"/>
+        </w:rPr>
+        <w:t xml:space="preserve"> as the new primary config surface, with </w:t>
+      </w:r>
+      <w:r>
+        <w:rPr>
+          <w:rFonts w:ascii="Menlo" w:hAnsi="Menlo" w:cs="Menlo"/>
+          <w:sz w:val="24"/>
+          <w:sz-cs w:val="24"/>
+          <w:spacing w:val="0"/>
+          <w:color w:val="181F26"/>
+        </w:rPr>
+        <w:t xml:space="preserve">evaluation_hook</w:t>
+      </w:r>
+      <w:r>
+        <w:rPr>
+          <w:rFonts w:ascii="Helvetica Neue" w:hAnsi="Helvetica Neue" w:cs="Helvetica Neue"/>
+          <w:sz w:val="24"/>
+          <w:sz-cs w:val="24"/>
+          <w:spacing w:val="0"/>
+          <w:color w:val="181F26"/>
+        </w:rPr>
+        <w:t xml:space="preserve"> retained as a deprecated alpha alias</w:t>
+      </w:r>
+    </w:p>
+    <w:p>
+      <w:pPr>
+        <w:ind w:left="720" w:first-line="-720"/>
+      </w:pPr>
+      <w:r>
+        <w:rPr>
+          <w:rFonts w:ascii="Helvetica Neue" w:hAnsi="Helvetica Neue" w:cs="Helvetica Neue"/>
+          <w:sz w:val="24"/>
+          <w:sz-cs w:val="24"/>
+          <w:color w:val="181F26"/>
+        </w:rPr>
+        <w:t xml:space="preserve"/>
+        <w:tab/>
+        <w:t xml:space="preserve">•</w:t>
+        <w:tab/>
+        <w:t xml:space="preserve"/>
+      </w:r>
+      <w:r>
+        <w:rPr>
+          <w:rFonts w:ascii="Helvetica Neue" w:hAnsi="Helvetica Neue" w:cs="Helvetica Neue"/>
+          <w:sz w:val="24"/>
+          <w:sz-cs w:val="24"/>
+          <w:spacing w:val="0"/>
+          <w:color w:val="181F26"/>
+        </w:rPr>
+        <w:t xml:space="preserve">named evaluation profiles, scorecards, datasets, replay experiments, and alert events in the runtime substrate</w:t>
+      </w:r>
+    </w:p>
+    <w:p>
+      <w:pPr>
+        <w:ind w:left="720" w:first-line="-720"/>
+      </w:pPr>
+      <w:r>
+        <w:rPr>
+          <w:rFonts w:ascii="Helvetica Neue" w:hAnsi="Helvetica Neue" w:cs="Helvetica Neue"/>
+          <w:sz w:val="24"/>
+          <w:sz-cs w:val="24"/>
+          <w:color w:val="181F26"/>
+        </w:rPr>
+        <w:t xml:space="preserve"/>
+        <w:tab/>
+        <w:t xml:space="preserve">•</w:t>
+        <w:tab/>
+        <w:t xml:space="preserve"/>
+      </w:r>
+      <w:r>
+        <w:rPr>
+          <w:rFonts w:ascii="Helvetica Neue" w:hAnsi="Helvetica Neue" w:cs="Helvetica Neue"/>
+          <w:sz w:val="24"/>
+          <w:sz-cs w:val="24"/>
+          <w:spacing w:val="0"/>
+          <w:color w:val="181F26"/>
+        </w:rPr>
+        <w:t xml:space="preserve">automatic </w:t>
+      </w:r>
+      <w:r>
+        <w:rPr>
+          <w:rFonts w:ascii="Menlo" w:hAnsi="Menlo" w:cs="Menlo"/>
+          <w:sz w:val="24"/>
+          <w:sz-cs w:val="24"/>
+          <w:spacing w:val="0"/>
+          <w:color w:val="181F26"/>
+        </w:rPr>
+        <w:t xml:space="preserve">TraceBundle -&gt; EvaluationRecord -&gt; ReviewQueueItem -&gt; AlertEvent -&gt; DatasetCase</w:t>
+      </w:r>
+      <w:r>
+        <w:rPr>
+          <w:rFonts w:ascii="Helvetica Neue" w:hAnsi="Helvetica Neue" w:cs="Helvetica Neue"/>
+          <w:sz w:val="24"/>
+          <w:sz-cs w:val="24"/>
+          <w:spacing w:val="0"/>
+          <w:color w:val="181F26"/>
+        </w:rPr>
+        <w:t xml:space="preserve"> post-result automation</w:t>
+      </w:r>
+    </w:p>
+    <w:p>
+      <w:pPr>
+        <w:ind w:left="720" w:first-line="-720"/>
+      </w:pPr>
+      <w:r>
+        <w:rPr>
+          <w:rFonts w:ascii="Helvetica Neue" w:hAnsi="Helvetica Neue" w:cs="Helvetica Neue"/>
+          <w:sz w:val="24"/>
+          <w:sz-cs w:val="24"/>
+          <w:color w:val="181F26"/>
+        </w:rPr>
+        <w:t xml:space="preserve"/>
+        <w:tab/>
+        <w:t xml:space="preserve">•</w:t>
+        <w:tab/>
+        <w:t xml:space="preserve"/>
+      </w:r>
+      <w:r>
+        <w:rPr>
+          <w:rFonts w:ascii="Helvetica Neue" w:hAnsi="Helvetica Neue" w:cs="Helvetica Neue"/>
+          <w:sz w:val="24"/>
+          <w:sz-cs w:val="24"/>
+          <w:spacing w:val="0"/>
+          <w:color w:val="181F26"/>
+        </w:rPr>
+        <w:t xml:space="preserve">operator surfaces for </w:t>
+      </w:r>
+      <w:r>
+        <w:rPr>
+          <w:rFonts w:ascii="Menlo" w:hAnsi="Menlo" w:cs="Menlo"/>
+          <w:sz w:val="24"/>
+          <w:sz-cs w:val="24"/>
+          <w:spacing w:val="0"/>
+          <w:color w:val="181F26"/>
+        </w:rPr>
+        <w:t xml:space="preserve">eval dataset list</w:t>
+      </w:r>
+      <w:r>
+        <w:rPr>
+          <w:rFonts w:ascii="Helvetica Neue" w:hAnsi="Helvetica Neue" w:cs="Helvetica Neue"/>
+          <w:sz w:val="24"/>
+          <w:sz-cs w:val="24"/>
+          <w:spacing w:val="0"/>
+          <w:color w:val="181F26"/>
+        </w:rPr>
+        <w:t xml:space="preserve">, </w:t>
+      </w:r>
+      <w:r>
+        <w:rPr>
+          <w:rFonts w:ascii="Menlo" w:hAnsi="Menlo" w:cs="Menlo"/>
+          <w:sz w:val="24"/>
+          <w:sz-cs w:val="24"/>
+          <w:spacing w:val="0"/>
+          <w:color w:val="181F26"/>
+        </w:rPr>
+        <w:t xml:space="preserve">eval dataset show</w:t>
+      </w:r>
+      <w:r>
+        <w:rPr>
+          <w:rFonts w:ascii="Helvetica Neue" w:hAnsi="Helvetica Neue" w:cs="Helvetica Neue"/>
+          <w:sz w:val="24"/>
+          <w:sz-cs w:val="24"/>
+          <w:spacing w:val="0"/>
+          <w:color w:val="181F26"/>
+        </w:rPr>
+        <w:t xml:space="preserve">, </w:t>
+      </w:r>
+      <w:r>
+        <w:rPr>
+          <w:rFonts w:ascii="Menlo" w:hAnsi="Menlo" w:cs="Menlo"/>
+          <w:sz w:val="24"/>
+          <w:sz-cs w:val="24"/>
+          <w:spacing w:val="0"/>
+          <w:color w:val="181F26"/>
+        </w:rPr>
+        <w:t xml:space="preserve">eval run</w:t>
+      </w:r>
+      <w:r>
+        <w:rPr>
+          <w:rFonts w:ascii="Helvetica Neue" w:hAnsi="Helvetica Neue" w:cs="Helvetica Neue"/>
+          <w:sz w:val="24"/>
+          <w:sz-cs w:val="24"/>
+          <w:spacing w:val="0"/>
+          <w:color w:val="181F26"/>
+        </w:rPr>
+        <w:t xml:space="preserve">, </w:t>
+      </w:r>
+      <w:r>
+        <w:rPr>
+          <w:rFonts w:ascii="Menlo" w:hAnsi="Menlo" w:cs="Menlo"/>
+          <w:sz w:val="24"/>
+          <w:sz-cs w:val="24"/>
+          <w:spacing w:val="0"/>
+          <w:color w:val="181F26"/>
+        </w:rPr>
+        <w:t xml:space="preserve">eval run-status</w:t>
+      </w:r>
+      <w:r>
+        <w:rPr>
+          <w:rFonts w:ascii="Helvetica Neue" w:hAnsi="Helvetica Neue" w:cs="Helvetica Neue"/>
+          <w:sz w:val="24"/>
+          <w:sz-cs w:val="24"/>
+          <w:spacing w:val="0"/>
+          <w:color w:val="181F26"/>
+        </w:rPr>
+        <w:t xml:space="preserve">, </w:t>
+      </w:r>
+      <w:r>
+        <w:rPr>
+          <w:rFonts w:ascii="Menlo" w:hAnsi="Menlo" w:cs="Menlo"/>
+          <w:sz w:val="24"/>
+          <w:sz-cs w:val="24"/>
+          <w:spacing w:val="0"/>
+          <w:color w:val="181F26"/>
+        </w:rPr>
+        <w:t xml:space="preserve">alert list</w:t>
+      </w:r>
+      <w:r>
+        <w:rPr>
+          <w:rFonts w:ascii="Helvetica Neue" w:hAnsi="Helvetica Neue" w:cs="Helvetica Neue"/>
+          <w:sz w:val="24"/>
+          <w:sz-cs w:val="24"/>
+          <w:spacing w:val="0"/>
+          <w:color w:val="181F26"/>
+        </w:rPr>
+        <w:t xml:space="preserve">, and </w:t>
+      </w:r>
+      <w:r>
+        <w:rPr>
+          <w:rFonts w:ascii="Menlo" w:hAnsi="Menlo" w:cs="Menlo"/>
+          <w:sz w:val="24"/>
+          <w:sz-cs w:val="24"/>
+          <w:spacing w:val="0"/>
+          <w:color w:val="181F26"/>
+        </w:rPr>
+        <w:t xml:space="preserve">alert ack</w:t>
+      </w:r>
+      <w:r>
+        <w:rPr>
+          <w:rFonts w:ascii="Helvetica Neue" w:hAnsi="Helvetica Neue" w:cs="Helvetica Neue"/>
+          <w:sz w:val="24"/>
+          <w:sz-cs w:val="24"/>
+          <w:spacing w:val="0"/>
+          <w:color w:val="181F26"/>
+        </w:rPr>
+        <w:t xml:space="preserve"/>
+      </w:r>
+    </w:p>
+    <w:p>
+      <w:pPr>
+        <w:ind w:left="720" w:first-line="-720"/>
+      </w:pPr>
+      <w:r>
+        <w:rPr>
+          <w:rFonts w:ascii="Helvetica Neue" w:hAnsi="Helvetica Neue" w:cs="Helvetica Neue"/>
+          <w:sz w:val="24"/>
+          <w:sz-cs w:val="24"/>
+          <w:color w:val="181F26"/>
+        </w:rPr>
+        <w:t xml:space="preserve"/>
+        <w:tab/>
+        <w:t xml:space="preserve">•</w:t>
+        <w:tab/>
+        <w:t xml:space="preserve"/>
+      </w:r>
+      <w:r>
+        <w:rPr>
+          <w:rFonts w:ascii="Helvetica Neue" w:hAnsi="Helvetica Neue" w:cs="Helvetica Neue"/>
+          <w:sz w:val="24"/>
+          <w:sz-cs w:val="24"/>
+          <w:spacing w:val="0"/>
+          <w:color w:val="181F26"/>
+        </w:rPr>
+        <w:t xml:space="preserve">replay isolation so experiment runs do not pollute production review queues or alert streams by default</w:t>
+      </w:r>
+    </w:p>
+    <w:p>
+      <w:pPr>
+        <w:ind w:left="720" w:first-line="-720"/>
+      </w:pPr>
+      <w:r>
+        <w:rPr>
+          <w:rFonts w:ascii="Helvetica Neue" w:hAnsi="Helvetica Neue" w:cs="Helvetica Neue"/>
+          <w:sz w:val="24"/>
+          <w:sz-cs w:val="24"/>
+          <w:color w:val="181F26"/>
+        </w:rPr>
+        <w:t xml:space="preserve"/>
+        <w:tab/>
+        <w:t xml:space="preserve">•</w:t>
+        <w:tab/>
+        <w:t xml:space="preserve"/>
+      </w:r>
+      <w:r>
+        <w:rPr>
+          <w:rFonts w:ascii="Helvetica Neue" w:hAnsi="Helvetica Neue" w:cs="Helvetica Neue"/>
+          <w:sz w:val="24"/>
+          <w:sz-cs w:val="24"/>
+          <w:spacing w:val="0"/>
+          <w:color w:val="181F26"/>
+        </w:rPr>
+        <w:t xml:space="preserve">explicit treatment of evaluation as institutional memory for the swarm rather than a future UI-only concern</w:t>
+      </w:r>
+    </w:p>
+    <w:p>
+      <w:pPr>
         <w:spacing w:after="197"/>
       </w:pPr>
       <w:r>
@@ -43396,7 +46213,7 @@
           <w:spacing w:val="0"/>
           <w:color w:val="181F26"/>
         </w:rPr>
-        <w:t xml:space="preserve">richer evaluators, dataset-backed review, and alert policies tied to quality policy</w:t>
+        <w:t xml:space="preserve">richer evaluators, dataset-backed review, pairwise experiments, and alert policies tied to quality policy</w:t>
       </w:r>
     </w:p>
     <w:p>
@@ -45935,6 +48752,162 @@
           <w:color w:val="181F26"/>
         </w:rPr>
         <w:t xml:space="preserve"> expose the operator review queue without mutating prior action history.</w:t>
+      </w:r>
+    </w:p>
+    <w:p>
+      <w:pPr>
+        <w:ind w:left="720" w:first-line="-720"/>
+      </w:pPr>
+      <w:r>
+        <w:rPr>
+          <w:rFonts w:ascii="Menlo" w:hAnsi="Menlo" w:cs="Menlo"/>
+          <w:sz w:val="24"/>
+          <w:sz-cs w:val="24"/>
+          <w:color w:val="181F26"/>
+        </w:rPr>
+        <w:t xml:space="preserve"/>
+        <w:tab/>
+        <w:t xml:space="preserve">•</w:t>
+        <w:tab/>
+        <w:t xml:space="preserve"/>
+      </w:r>
+      <w:r>
+        <w:rPr>
+          <w:rFonts w:ascii="Menlo" w:hAnsi="Menlo" w:cs="Menlo"/>
+          <w:sz w:val="24"/>
+          <w:sz-cs w:val="24"/>
+          <w:spacing w:val="0"/>
+          <w:color w:val="181F26"/>
+        </w:rPr>
+        <w:t xml:space="preserve">crawfish eval dataset list</w:t>
+      </w:r>
+      <w:r>
+        <w:rPr>
+          <w:rFonts w:ascii="Helvetica Neue" w:hAnsi="Helvetica Neue" w:cs="Helvetica Neue"/>
+          <w:sz w:val="24"/>
+          <w:sz-cs w:val="24"/>
+          <w:spacing w:val="0"/>
+          <w:color w:val="181F26"/>
+        </w:rPr>
+        <w:t xml:space="preserve">, </w:t>
+      </w:r>
+      <w:r>
+        <w:rPr>
+          <w:rFonts w:ascii="Menlo" w:hAnsi="Menlo" w:cs="Menlo"/>
+          <w:sz w:val="24"/>
+          <w:sz-cs w:val="24"/>
+          <w:spacing w:val="0"/>
+          <w:color w:val="181F26"/>
+        </w:rPr>
+        <w:t xml:space="preserve">eval dataset show</w:t>
+      </w:r>
+      <w:r>
+        <w:rPr>
+          <w:rFonts w:ascii="Helvetica Neue" w:hAnsi="Helvetica Neue" w:cs="Helvetica Neue"/>
+          <w:sz w:val="24"/>
+          <w:sz-cs w:val="24"/>
+          <w:spacing w:val="0"/>
+          <w:color w:val="181F26"/>
+        </w:rPr>
+        <w:t xml:space="preserve">, </w:t>
+      </w:r>
+      <w:r>
+        <w:rPr>
+          <w:rFonts w:ascii="Menlo" w:hAnsi="Menlo" w:cs="Menlo"/>
+          <w:sz w:val="24"/>
+          <w:sz-cs w:val="24"/>
+          <w:spacing w:val="0"/>
+          <w:color w:val="181F26"/>
+        </w:rPr>
+        <w:t xml:space="preserve">eval run</w:t>
+      </w:r>
+      <w:r>
+        <w:rPr>
+          <w:rFonts w:ascii="Helvetica Neue" w:hAnsi="Helvetica Neue" w:cs="Helvetica Neue"/>
+          <w:sz w:val="24"/>
+          <w:sz-cs w:val="24"/>
+          <w:spacing w:val="0"/>
+          <w:color w:val="181F26"/>
+        </w:rPr>
+        <w:t xml:space="preserve">, and </w:t>
+      </w:r>
+      <w:r>
+        <w:rPr>
+          <w:rFonts w:ascii="Menlo" w:hAnsi="Menlo" w:cs="Menlo"/>
+          <w:sz w:val="24"/>
+          <w:sz-cs w:val="24"/>
+          <w:spacing w:val="0"/>
+          <w:color w:val="181F26"/>
+        </w:rPr>
+        <w:t xml:space="preserve">eval run-status</w:t>
+      </w:r>
+      <w:r>
+        <w:rPr>
+          <w:rFonts w:ascii="Helvetica Neue" w:hAnsi="Helvetica Neue" w:cs="Helvetica Neue"/>
+          <w:sz w:val="24"/>
+          <w:sz-cs w:val="24"/>
+          <w:spacing w:val="0"/>
+          <w:color w:val="181F26"/>
+        </w:rPr>
+        <w:t xml:space="preserve"> expose dataset-backed evaluation ops without polluting production operator state.</w:t>
+      </w:r>
+    </w:p>
+    <w:p>
+      <w:pPr>
+        <w:ind w:left="720" w:first-line="-720"/>
+      </w:pPr>
+      <w:r>
+        <w:rPr>
+          <w:rFonts w:ascii="Menlo" w:hAnsi="Menlo" w:cs="Menlo"/>
+          <w:sz w:val="24"/>
+          <w:sz-cs w:val="24"/>
+          <w:color w:val="181F26"/>
+        </w:rPr>
+        <w:t xml:space="preserve"/>
+        <w:tab/>
+        <w:t xml:space="preserve">•</w:t>
+        <w:tab/>
+        <w:t xml:space="preserve"/>
+      </w:r>
+      <w:r>
+        <w:rPr>
+          <w:rFonts w:ascii="Menlo" w:hAnsi="Menlo" w:cs="Menlo"/>
+          <w:sz w:val="24"/>
+          <w:sz-cs w:val="24"/>
+          <w:spacing w:val="0"/>
+          <w:color w:val="181F26"/>
+        </w:rPr>
+        <w:t xml:space="preserve">crawfish alert list</w:t>
+      </w:r>
+      <w:r>
+        <w:rPr>
+          <w:rFonts w:ascii="Helvetica Neue" w:hAnsi="Helvetica Neue" w:cs="Helvetica Neue"/>
+          <w:sz w:val="24"/>
+          <w:sz-cs w:val="24"/>
+          <w:spacing w:val="0"/>
+          <w:color w:val="181F26"/>
+        </w:rPr>
+        <w:t xml:space="preserve"> and </w:t>
+      </w:r>
+      <w:r>
+        <w:rPr>
+          <w:rFonts w:ascii="Menlo" w:hAnsi="Menlo" w:cs="Menlo"/>
+          <w:sz w:val="24"/>
+          <w:sz-cs w:val="24"/>
+          <w:spacing w:val="0"/>
+          <w:color w:val="181F26"/>
+        </w:rPr>
+        <w:t xml:space="preserve">alert ack</w:t>
+      </w:r>
+      <w:r>
+        <w:rPr>
+          <w:rFonts w:ascii="Helvetica Neue" w:hAnsi="Helvetica Neue" w:cs="Helvetica Neue"/>
+          <w:sz w:val="24"/>
+          <w:sz-cs w:val="24"/>
+          <w:spacing w:val="0"/>
+          <w:color w:val="181F26"/>
+        </w:rPr>
+        <w:t xml:space="preserve"> expose doctrine and evaluation escalation signals with explicit acknowledgment state.</w:t>
       </w:r>
     </w:p>
     <w:p>

</xml_diff>

<commit_message>
docs: cite swarm reality and frontier doctrine
</commit_message>
<xml_diff>
--- a/docs/exports/Crawfish-PRD.docx
+++ b/docs/exports/Crawfish-PRD.docx
@@ -303,7 +303,28 @@
           <w:spacing w:val="0"/>
           <w:color w:val="181F26"/>
         </w:rPr>
-        <w:t xml:space="preserve">Most teams are still driving by the rear-view mirror: building with yesterday's application assumptions while swarm-scale agency is arriving with today's tools.</w:t>
+        <w:t xml:space="preserve">Most teams are still driving by the rear-view mirror, in the sense described by Notion's </w:t>
+      </w:r>
+      <w:r>
+        <w:rPr>
+          <w:rFonts w:ascii="Helvetica Neue" w:hAnsi="Helvetica Neue" w:cs="Helvetica Neue"/>
+          <w:sz w:val="24"/>
+          <w:sz-cs w:val="24"/>
+          <w:u w:val="single"/>
+          <w:spacing w:val="0"/>
+          <w:color w:val="0000E9"/>
+        </w:rPr>
+        <w:t xml:space="preserve">"Steam, Steel, and Infinite Minds"</w:t>
+      </w:r>
+      <w:r>
+        <w:rPr>
+          <w:rFonts w:ascii="Helvetica Neue" w:hAnsi="Helvetica Neue" w:cs="Helvetica Neue"/>
+          <w:sz w:val="24"/>
+          <w:sz-cs w:val="24"/>
+          <w:spacing w:val="0"/>
+          <w:color w:val="181F26"/>
+        </w:rPr>
+        <w:t xml:space="preserve">: building with yesterday's application assumptions while swarm-scale agency is arriving with today's tools.</w:t>
       </w:r>
     </w:p>
     <w:p>
@@ -945,7 +966,7 @@
           <w:spacing w:val="0"/>
           <w:color w:val="102C4B"/>
         </w:rPr>
-        <w:t xml:space="preserve">Why Crawfish Is Not Another Harness</w:t>
+        <w:t xml:space="preserve">Why Swarm, Not Role-Split Multi-Agent</w:t>
       </w:r>
     </w:p>
     <w:p>
@@ -960,119 +981,175 @@
           <w:spacing w:val="0"/>
           <w:color w:val="181F26"/>
         </w:rPr>
-        <w:t xml:space="preserve">Harnesses are execution surfaces. Crawfish governs them.</w:t>
-      </w:r>
-    </w:p>
-    <w:p>
-      <w:pPr>
-        <w:ind w:left="720" w:first-line="-720"/>
-      </w:pPr>
-      <w:r>
-        <w:rPr>
-          <w:rFonts w:ascii="Helvetica Neue" w:hAnsi="Helvetica Neue" w:cs="Helvetica Neue"/>
-          <w:sz w:val="24"/>
-          <w:sz-cs w:val="24"/>
-          <w:color w:val="181F26"/>
-        </w:rPr>
-        <w:t xml:space="preserve"/>
-        <w:tab/>
-        <w:t xml:space="preserve">•</w:t>
-        <w:tab/>
-        <w:t xml:space="preserve"/>
-      </w:r>
-      <w:r>
-        <w:rPr>
-          <w:rFonts w:ascii="Helvetica Neue" w:hAnsi="Helvetica Neue" w:cs="Helvetica Neue"/>
-          <w:sz w:val="24"/>
-          <w:sz-cs w:val="24"/>
-          <w:spacing w:val="0"/>
-          <w:color w:val="181F26"/>
-        </w:rPr>
-        <w:t xml:space="preserve">OpenClaw is an interactive gateway-native harness surface.</w:t>
-      </w:r>
-    </w:p>
-    <w:p>
-      <w:pPr>
-        <w:ind w:left="720" w:first-line="-720"/>
-      </w:pPr>
-      <w:r>
-        <w:rPr>
-          <w:rFonts w:ascii="Helvetica Neue" w:hAnsi="Helvetica Neue" w:cs="Helvetica Neue"/>
-          <w:sz w:val="24"/>
-          <w:sz-cs w:val="24"/>
-          <w:color w:val="181F26"/>
-        </w:rPr>
-        <w:t xml:space="preserve"/>
-        <w:tab/>
-        <w:t xml:space="preserve">•</w:t>
-        <w:tab/>
-        <w:t xml:space="preserve"/>
-      </w:r>
-      <w:r>
-        <w:rPr>
-          <w:rFonts w:ascii="Helvetica Neue" w:hAnsi="Helvetica Neue" w:cs="Helvetica Neue"/>
-          <w:sz w:val="24"/>
-          <w:sz-cs w:val="24"/>
-          <w:spacing w:val="0"/>
-          <w:color w:val="181F26"/>
-        </w:rPr>
-        <w:t xml:space="preserve">Codex, Claude Code, Gemini CLI, and future ACP-compatible adapters are specialized general-purpose harnesses.</w:t>
-      </w:r>
-    </w:p>
-    <w:p>
-      <w:pPr>
-        <w:ind w:left="720" w:first-line="-720"/>
-      </w:pPr>
-      <w:r>
-        <w:rPr>
-          <w:rFonts w:ascii="Helvetica Neue" w:hAnsi="Helvetica Neue" w:cs="Helvetica Neue"/>
-          <w:sz w:val="24"/>
-          <w:sz-cs w:val="24"/>
-          <w:color w:val="181F26"/>
-        </w:rPr>
-        <w:t xml:space="preserve"/>
-        <w:tab/>
-        <w:t xml:space="preserve">•</w:t>
-        <w:tab/>
-        <w:t xml:space="preserve"/>
-      </w:r>
-      <w:r>
-        <w:rPr>
-          <w:rFonts w:ascii="Helvetica Neue" w:hAnsi="Helvetica Neue" w:cs="Helvetica Neue"/>
-          <w:sz w:val="24"/>
-          <w:sz-cs w:val="24"/>
-          <w:spacing w:val="0"/>
-          <w:color w:val="181F26"/>
-        </w:rPr>
-        <w:t xml:space="preserve">MCP tools are tool-plane integrations.</w:t>
-      </w:r>
-    </w:p>
-    <w:p>
-      <w:pPr>
-        <w:ind w:left="720" w:first-line="-720"/>
-      </w:pPr>
-      <w:r>
-        <w:rPr>
-          <w:rFonts w:ascii="Helvetica Neue" w:hAnsi="Helvetica Neue" w:cs="Helvetica Neue"/>
-          <w:sz w:val="24"/>
-          <w:sz-cs w:val="24"/>
-          <w:color w:val="181F26"/>
-        </w:rPr>
-        <w:t xml:space="preserve"/>
-        <w:tab/>
-        <w:t xml:space="preserve">•</w:t>
-        <w:tab/>
-        <w:t xml:space="preserve"/>
-      </w:r>
-      <w:r>
-        <w:rPr>
-          <w:rFonts w:ascii="Helvetica Neue" w:hAnsi="Helvetica Neue" w:cs="Helvetica Neue"/>
-          <w:sz w:val="24"/>
-          <w:sz-cs w:val="24"/>
-          <w:spacing w:val="0"/>
-          <w:color w:val="181F26"/>
-        </w:rPr>
-        <w:t xml:space="preserve">A2A will be remote-agent interoperability.</w:t>
+        <w:t xml:space="preserve">Much earlier "multi-agent" work was often about splitting roles inside one application, not governing real encounters across owners, harnesses, and trust boundaries.</w:t>
+      </w:r>
+    </w:p>
+    <w:p>
+      <w:pPr>
+        <w:ind w:left="720" w:first-line="-720"/>
+      </w:pPr>
+      <w:r>
+        <w:rPr>
+          <w:rFonts w:ascii="Helvetica Neue" w:hAnsi="Helvetica Neue" w:cs="Helvetica Neue"/>
+          <w:sz w:val="24"/>
+          <w:sz-cs w:val="24"/>
+          <w:color w:val="181F26"/>
+        </w:rPr>
+        <w:t xml:space="preserve"/>
+        <w:tab/>
+        <w:t xml:space="preserve">•</w:t>
+        <w:tab/>
+        <w:t xml:space="preserve"/>
+      </w:r>
+      <w:r>
+        <w:rPr>
+          <w:rFonts w:ascii="Helvetica Neue" w:hAnsi="Helvetica Neue" w:cs="Helvetica Neue"/>
+          <w:sz w:val="24"/>
+          <w:sz-cs w:val="24"/>
+          <w:spacing w:val="0"/>
+          <w:color w:val="181F26"/>
+        </w:rPr>
+        <w:t xml:space="preserve">LangChain's multi-agent docs frame the problem primarily as </w:t>
+      </w:r>
+      <w:r>
+        <w:rPr>
+          <w:rFonts w:ascii="Helvetica Neue" w:hAnsi="Helvetica Neue" w:cs="Helvetica Neue"/>
+          <w:sz w:val="24"/>
+          <w:sz-cs w:val="24"/>
+          <w:u w:val="single"/>
+          <w:spacing w:val="0"/>
+          <w:color w:val="0000E9"/>
+        </w:rPr>
+        <w:t xml:space="preserve">context engineering</w:t>
+      </w:r>
+      <w:r>
+        <w:rPr>
+          <w:rFonts w:ascii="Helvetica Neue" w:hAnsi="Helvetica Neue" w:cs="Helvetica Neue"/>
+          <w:sz w:val="24"/>
+          <w:sz-cs w:val="24"/>
+          <w:spacing w:val="0"/>
+          <w:color w:val="181F26"/>
+        </w:rPr>
+        <w:t xml:space="preserve">: deciding what information each sub-agent should see and how much context to pass.</w:t>
+      </w:r>
+    </w:p>
+    <w:p>
+      <w:pPr>
+        <w:ind w:left="720" w:first-line="-720"/>
+      </w:pPr>
+      <w:r>
+        <w:rPr>
+          <w:rFonts w:ascii="Helvetica Neue" w:hAnsi="Helvetica Neue" w:cs="Helvetica Neue"/>
+          <w:sz w:val="24"/>
+          <w:sz-cs w:val="24"/>
+          <w:color w:val="181F26"/>
+        </w:rPr>
+        <w:t xml:space="preserve"/>
+        <w:tab/>
+        <w:t xml:space="preserve">•</w:t>
+        <w:tab/>
+        <w:t xml:space="preserve"/>
+      </w:r>
+      <w:r>
+        <w:rPr>
+          <w:rFonts w:ascii="Helvetica Neue" w:hAnsi="Helvetica Neue" w:cs="Helvetica Neue"/>
+          <w:sz w:val="24"/>
+          <w:sz-cs w:val="24"/>
+          <w:spacing w:val="0"/>
+          <w:color w:val="181F26"/>
+        </w:rPr>
+        <w:t xml:space="preserve">OpenAI's Agents SDK frames multi-agent coordination around </w:t>
+      </w:r>
+      <w:r>
+        <w:rPr>
+          <w:rFonts w:ascii="Helvetica Neue" w:hAnsi="Helvetica Neue" w:cs="Helvetica Neue"/>
+          <w:sz w:val="24"/>
+          <w:sz-cs w:val="24"/>
+          <w:u w:val="single"/>
+          <w:spacing w:val="0"/>
+          <w:color w:val="0000E9"/>
+        </w:rPr>
+        <w:t xml:space="preserve">handoffs</w:t>
+      </w:r>
+      <w:r>
+        <w:rPr>
+          <w:rFonts w:ascii="Helvetica Neue" w:hAnsi="Helvetica Neue" w:cs="Helvetica Neue"/>
+          <w:sz w:val="24"/>
+          <w:sz-cs w:val="24"/>
+          <w:spacing w:val="0"/>
+          <w:color w:val="181F26"/>
+        </w:rPr>
+        <w:t xml:space="preserve"> and shared run </w:t>
+      </w:r>
+      <w:r>
+        <w:rPr>
+          <w:rFonts w:ascii="Helvetica Neue" w:hAnsi="Helvetica Neue" w:cs="Helvetica Neue"/>
+          <w:sz w:val="24"/>
+          <w:sz-cs w:val="24"/>
+          <w:u w:val="single"/>
+          <w:spacing w:val="0"/>
+          <w:color w:val="0000E9"/>
+        </w:rPr>
+        <w:t xml:space="preserve">context</w:t>
+      </w:r>
+      <w:r>
+        <w:rPr>
+          <w:rFonts w:ascii="Helvetica Neue" w:hAnsi="Helvetica Neue" w:cs="Helvetica Neue"/>
+          <w:sz w:val="24"/>
+          <w:sz-cs w:val="24"/>
+          <w:spacing w:val="0"/>
+          <w:color w:val="181F26"/>
+        </w:rPr>
+        <w:t xml:space="preserve"> inside one agentic application.</w:t>
+      </w:r>
+    </w:p>
+    <w:p>
+      <w:pPr>
+        <w:ind w:left="720" w:first-line="-720"/>
+      </w:pPr>
+      <w:r>
+        <w:rPr>
+          <w:rFonts w:ascii="Helvetica Neue" w:hAnsi="Helvetica Neue" w:cs="Helvetica Neue"/>
+          <w:sz w:val="24"/>
+          <w:sz-cs w:val="24"/>
+          <w:color w:val="181F26"/>
+        </w:rPr>
+        <w:t xml:space="preserve"/>
+        <w:tab/>
+        <w:t xml:space="preserve">•</w:t>
+        <w:tab/>
+        <w:t xml:space="preserve"/>
+      </w:r>
+      <w:r>
+        <w:rPr>
+          <w:rFonts w:ascii="Helvetica Neue" w:hAnsi="Helvetica Neue" w:cs="Helvetica Neue"/>
+          <w:sz w:val="24"/>
+          <w:sz-cs w:val="24"/>
+          <w:spacing w:val="0"/>
+          <w:color w:val="181F26"/>
+        </w:rPr>
+        <w:t xml:space="preserve">AutoGen's Swarm docs explicitly describe agents that </w:t>
+      </w:r>
+      <w:r>
+        <w:rPr>
+          <w:rFonts w:ascii="Helvetica Neue" w:hAnsi="Helvetica Neue" w:cs="Helvetica Neue"/>
+          <w:sz w:val="24"/>
+          <w:sz-cs w:val="24"/>
+          <w:u w:val="single"/>
+          <w:spacing w:val="0"/>
+          <w:color w:val="0000E9"/>
+        </w:rPr>
+        <w:t xml:space="preserve">share the same message context</w:t>
+      </w:r>
+      <w:r>
+        <w:rPr>
+          <w:rFonts w:ascii="Helvetica Neue" w:hAnsi="Helvetica Neue" w:cs="Helvetica Neue"/>
+          <w:sz w:val="24"/>
+          <w:sz-cs w:val="24"/>
+          <w:spacing w:val="0"/>
+          <w:color w:val="181F26"/>
+        </w:rPr>
+        <w:t xml:space="preserve">.</w:t>
       </w:r>
     </w:p>
     <w:p>
@@ -1087,28 +1164,7 @@
           <w:spacing w:val="0"/>
           <w:color w:val="181F26"/>
         </w:rPr>
-        <w:t xml:space="preserve">Crawfish does not compete by being one more reasoning loop. It competes by making many volatile reasoning loops behave like </w:t>
-      </w:r>
-      <w:r>
-        <w:rPr>
-          <w:rFonts w:ascii="Helvetica Neue" w:hAnsi="Helvetica Neue" w:cs="Helvetica Neue"/>
-          <w:sz w:val="24"/>
-          <w:sz-cs w:val="24"/>
-          <w:b/>
-          <w:spacing w:val="0"/>
-          <w:color w:val="181F26"/>
-        </w:rPr>
-        <w:t xml:space="preserve">one inspectable system</w:t>
-      </w:r>
-      <w:r>
-        <w:rPr>
-          <w:rFonts w:ascii="Helvetica Neue" w:hAnsi="Helvetica Neue" w:cs="Helvetica Neue"/>
-          <w:sz w:val="24"/>
-          <w:sz-cs w:val="24"/>
-          <w:spacing w:val="0"/>
-          <w:color w:val="181F26"/>
-        </w:rPr>
-        <w:t xml:space="preserve">.</w:t>
+        <w:t xml:space="preserve">Those patterns are useful. They are not the same as the environment Crawfish is built for.</w:t>
       </w:r>
     </w:p>
     <w:p>
@@ -1123,153 +1179,134 @@
           <w:spacing w:val="0"/>
           <w:color w:val="181F26"/>
         </w:rPr>
-        <w:t xml:space="preserve">That is why the project is </w:t>
-      </w:r>
-      <w:r>
-        <w:rPr>
-          <w:rFonts w:ascii="Helvetica Neue" w:hAnsi="Helvetica Neue" w:cs="Helvetica Neue"/>
-          <w:sz w:val="24"/>
-          <w:sz-cs w:val="24"/>
-          <w:b/>
-          <w:spacing w:val="0"/>
-          <w:color w:val="181F26"/>
-        </w:rPr>
-        <w:t xml:space="preserve">Rust-first, not Rust-only</w:t>
-      </w:r>
-      <w:r>
-        <w:rPr>
-          <w:rFonts w:ascii="Helvetica Neue" w:hAnsi="Helvetica Neue" w:cs="Helvetica Neue"/>
-          <w:sz w:val="24"/>
-          <w:sz-cs w:val="24"/>
-          <w:spacing w:val="0"/>
-          <w:color w:val="181F26"/>
-        </w:rPr>
-        <w:t xml:space="preserve">:</w:t>
-      </w:r>
-    </w:p>
-    <w:p>
-      <w:pPr>
-        <w:ind w:left="720" w:first-line="-720"/>
-      </w:pPr>
-      <w:r>
-        <w:rPr>
-          <w:rFonts w:ascii="Menlo" w:hAnsi="Menlo" w:cs="Menlo"/>
-          <w:sz w:val="24"/>
-          <w:sz-cs w:val="24"/>
-          <w:color w:val="181F26"/>
-        </w:rPr>
-        <w:t xml:space="preserve"/>
-        <w:tab/>
-        <w:t xml:space="preserve">•</w:t>
-        <w:tab/>
-        <w:t xml:space="preserve"/>
-      </w:r>
-      <w:r>
-        <w:rPr>
-          <w:rFonts w:ascii="Menlo" w:hAnsi="Menlo" w:cs="Menlo"/>
-          <w:sz w:val="24"/>
-          <w:sz-cs w:val="24"/>
-          <w:spacing w:val="0"/>
-          <w:color w:val="181F26"/>
-        </w:rPr>
-        <w:t xml:space="preserve">crates/</w:t>
-      </w:r>
-      <w:r>
-        <w:rPr>
-          <w:rFonts w:ascii="Helvetica Neue" w:hAnsi="Helvetica Neue" w:cs="Helvetica Neue"/>
-          <w:sz w:val="24"/>
-          <w:sz-cs w:val="24"/>
-          <w:spacing w:val="0"/>
-          <w:color w:val="181F26"/>
-        </w:rPr>
-        <w:t xml:space="preserve"> is the implementation spine for the runtime, control plane, storage, and native outbound adapters.</w:t>
-      </w:r>
-    </w:p>
-    <w:p>
-      <w:pPr>
-        <w:ind w:left="720" w:first-line="-720"/>
-      </w:pPr>
-      <w:r>
-        <w:rPr>
-          <w:rFonts w:ascii="Menlo" w:hAnsi="Menlo" w:cs="Menlo"/>
-          <w:sz w:val="24"/>
-          <w:sz-cs w:val="24"/>
-          <w:color w:val="181F26"/>
-        </w:rPr>
-        <w:t xml:space="preserve"/>
-        <w:tab/>
-        <w:t xml:space="preserve">•</w:t>
-        <w:tab/>
-        <w:t xml:space="preserve"/>
-      </w:r>
-      <w:r>
-        <w:rPr>
-          <w:rFonts w:ascii="Menlo" w:hAnsi="Menlo" w:cs="Menlo"/>
-          <w:sz w:val="24"/>
-          <w:sz-cs w:val="24"/>
-          <w:spacing w:val="0"/>
-          <w:color w:val="181F26"/>
-        </w:rPr>
-        <w:t xml:space="preserve">integrations/</w:t>
-      </w:r>
-      <w:r>
-        <w:rPr>
-          <w:rFonts w:ascii="Helvetica Neue" w:hAnsi="Helvetica Neue" w:cs="Helvetica Neue"/>
-          <w:sz w:val="24"/>
-          <w:sz-cs w:val="24"/>
-          <w:spacing w:val="0"/>
-          <w:color w:val="181F26"/>
-        </w:rPr>
-        <w:t xml:space="preserve"> is the edge zone for isolated bridge packages where a non-Rust implementation is pragmatic.</w:t>
-      </w:r>
-    </w:p>
-    <w:p>
-      <w:pPr>
-        <w:ind w:left="720" w:first-line="-720"/>
-      </w:pPr>
-      <w:r>
-        <w:rPr>
-          <w:rFonts w:ascii="Helvetica Neue" w:hAnsi="Helvetica Neue" w:cs="Helvetica Neue"/>
-          <w:sz w:val="24"/>
-          <w:sz-cs w:val="24"/>
-          <w:color w:val="181F26"/>
-        </w:rPr>
-        <w:t xml:space="preserve"/>
-        <w:tab/>
-        <w:t xml:space="preserve">•</w:t>
-        <w:tab/>
-        <w:t xml:space="preserve"/>
-      </w:r>
-      <w:r>
-        <w:rPr>
-          <w:rFonts w:ascii="Helvetica Neue" w:hAnsi="Helvetica Neue" w:cs="Helvetica Neue"/>
-          <w:sz w:val="24"/>
-          <w:sz-cs w:val="24"/>
-          <w:spacing w:val="0"/>
-          <w:color w:val="181F26"/>
-        </w:rPr>
-        <w:t xml:space="preserve">The current example is </w:t>
-      </w:r>
-      <w:r>
-        <w:rPr>
-          <w:rFonts w:ascii="Menlo" w:hAnsi="Menlo" w:cs="Menlo"/>
-          <w:sz w:val="24"/>
-          <w:sz-cs w:val="24"/>
-          <w:u w:val="single"/>
-          <w:spacing w:val="0"/>
-          <w:color w:val="0000E9"/>
-        </w:rPr>
-        <w:t xml:space="preserve">integrations/openclaw-inbound/</w:t>
-      </w:r>
-      <w:r>
-        <w:rPr>
-          <w:rFonts w:ascii="Helvetica Neue" w:hAnsi="Helvetica Neue" w:cs="Helvetica Neue"/>
-          <w:sz w:val="24"/>
-          <w:sz-cs w:val="24"/>
-          <w:spacing w:val="0"/>
-          <w:color w:val="181F26"/>
-        </w:rPr>
-        <w:t xml:space="preserve">, a thin TypeScript ingress bridge. The policy engine, lifecycle authority, storage, and runtime decisions remain in Rust.</w:t>
+        <w:t xml:space="preserve">Crawfish targets the point where "many" stops meaning "more prompt wrappers inside one app" and starts meaning:</w:t>
+      </w:r>
+    </w:p>
+    <w:p>
+      <w:pPr>
+        <w:ind w:left="720" w:first-line="-720"/>
+      </w:pPr>
+      <w:r>
+        <w:rPr>
+          <w:rFonts w:ascii="Helvetica Neue" w:hAnsi="Helvetica Neue" w:cs="Helvetica Neue"/>
+          <w:sz w:val="24"/>
+          <w:sz-cs w:val="24"/>
+          <w:color w:val="181F26"/>
+        </w:rPr>
+        <w:t xml:space="preserve"/>
+        <w:tab/>
+        <w:t xml:space="preserve">•</w:t>
+        <w:tab/>
+        <w:t xml:space="preserve"/>
+      </w:r>
+      <w:r>
+        <w:rPr>
+          <w:rFonts w:ascii="Helvetica Neue" w:hAnsi="Helvetica Neue" w:cs="Helvetica Neue"/>
+          <w:sz w:val="24"/>
+          <w:sz-cs w:val="24"/>
+          <w:spacing w:val="0"/>
+          <w:color w:val="181F26"/>
+        </w:rPr>
+        <w:t xml:space="preserve">many bounded workers, not one conversation tree</w:t>
+      </w:r>
+    </w:p>
+    <w:p>
+      <w:pPr>
+        <w:ind w:left="720" w:first-line="-720"/>
+      </w:pPr>
+      <w:r>
+        <w:rPr>
+          <w:rFonts w:ascii="Helvetica Neue" w:hAnsi="Helvetica Neue" w:cs="Helvetica Neue"/>
+          <w:sz w:val="24"/>
+          <w:sz-cs w:val="24"/>
+          <w:color w:val="181F26"/>
+        </w:rPr>
+        <w:t xml:space="preserve"/>
+        <w:tab/>
+        <w:t xml:space="preserve">•</w:t>
+        <w:tab/>
+        <w:t xml:space="preserve"/>
+      </w:r>
+      <w:r>
+        <w:rPr>
+          <w:rFonts w:ascii="Helvetica Neue" w:hAnsi="Helvetica Neue" w:cs="Helvetica Neue"/>
+          <w:sz w:val="24"/>
+          <w:sz-cs w:val="24"/>
+          <w:spacing w:val="0"/>
+          <w:color w:val="181F26"/>
+        </w:rPr>
+        <w:t xml:space="preserve">many owners, not one ambient authority</w:t>
+      </w:r>
+    </w:p>
+    <w:p>
+      <w:pPr>
+        <w:ind w:left="720" w:first-line="-720"/>
+      </w:pPr>
+      <w:r>
+        <w:rPr>
+          <w:rFonts w:ascii="Helvetica Neue" w:hAnsi="Helvetica Neue" w:cs="Helvetica Neue"/>
+          <w:sz w:val="24"/>
+          <w:sz-cs w:val="24"/>
+          <w:color w:val="181F26"/>
+        </w:rPr>
+        <w:t xml:space="preserve"/>
+        <w:tab/>
+        <w:t xml:space="preserve">•</w:t>
+        <w:tab/>
+        <w:t xml:space="preserve"/>
+      </w:r>
+      <w:r>
+        <w:rPr>
+          <w:rFonts w:ascii="Helvetica Neue" w:hAnsi="Helvetica Neue" w:cs="Helvetica Neue"/>
+          <w:sz w:val="24"/>
+          <w:sz-cs w:val="24"/>
+          <w:spacing w:val="0"/>
+          <w:color w:val="181F26"/>
+        </w:rPr>
+        <w:t xml:space="preserve">many harness surfaces, not one centrally managed loop</w:t>
+      </w:r>
+    </w:p>
+    <w:p>
+      <w:pPr>
+        <w:ind w:left="720" w:first-line="-720"/>
+      </w:pPr>
+      <w:r>
+        <w:rPr>
+          <w:rFonts w:ascii="Helvetica Neue" w:hAnsi="Helvetica Neue" w:cs="Helvetica Neue"/>
+          <w:sz w:val="24"/>
+          <w:sz-cs w:val="24"/>
+          <w:color w:val="181F26"/>
+        </w:rPr>
+        <w:t xml:space="preserve"/>
+        <w:tab/>
+        <w:t xml:space="preserve">•</w:t>
+        <w:tab/>
+        <w:t xml:space="preserve"/>
+      </w:r>
+      <w:r>
+        <w:rPr>
+          <w:rFonts w:ascii="Helvetica Neue" w:hAnsi="Helvetica Neue" w:cs="Helvetica Neue"/>
+          <w:sz w:val="24"/>
+          <w:sz-cs w:val="24"/>
+          <w:spacing w:val="0"/>
+          <w:color w:val="181F26"/>
+        </w:rPr>
+        <w:t xml:space="preserve">many real encounter boundaries, not only context partitioning</w:t>
+      </w:r>
+    </w:p>
+    <w:p>
+      <w:pPr>
+        <w:spacing w:after="240"/>
+      </w:pPr>
+      <w:r>
+        <w:rPr>
+          <w:rFonts w:ascii="Helvetica Neue" w:hAnsi="Helvetica Neue" w:cs="Helvetica Neue"/>
+          <w:sz w:val="24"/>
+          <w:sz-cs w:val="24"/>
+          <w:spacing w:val="0"/>
+          <w:color w:val="181F26"/>
+        </w:rPr>
+        <w:t xml:space="preserve">That is why Crawfish needs doctrine, checkpoints, leases, evidence, evaluation, and escalation. Context split is coordination. Swarm governance is a different systems problem.</w:t>
       </w:r>
     </w:p>
     <w:p>
@@ -1285,7 +1322,7 @@
           <w:spacing w:val="0"/>
           <w:color w:val="102C4B"/>
         </w:rPr>
-        <w:t xml:space="preserve">What The Control Plane Enforces</w:t>
+        <w:t xml:space="preserve">Why Crawfish Is Not Another Harness</w:t>
       </w:r>
     </w:p>
     <w:p>
@@ -1300,26 +1337,170 @@
           <w:spacing w:val="0"/>
           <w:color w:val="181F26"/>
         </w:rPr>
-        <w:t xml:space="preserve">Crawfish is opinionated about what must survive model churn.</w:t>
-      </w:r>
-    </w:p>
-    <w:p>
-      <w:pPr>
-        <w:ind w:left="720" w:first-line="-720"/>
-      </w:pPr>
+        <w:t xml:space="preserve">Harnesses are execution surfaces. Crawfish governs them.</w:t>
+      </w:r>
+    </w:p>
+    <w:p>
+      <w:pPr>
+        <w:ind w:left="720" w:first-line="-720"/>
+      </w:pPr>
+      <w:r>
+        <w:rPr>
+          <w:rFonts w:ascii="Helvetica Neue" w:hAnsi="Helvetica Neue" w:cs="Helvetica Neue"/>
+          <w:sz w:val="24"/>
+          <w:sz-cs w:val="24"/>
+          <w:color w:val="181F26"/>
+        </w:rPr>
+        <w:t xml:space="preserve"/>
+        <w:tab/>
+        <w:t xml:space="preserve">•</w:t>
+        <w:tab/>
+        <w:t xml:space="preserve"/>
+      </w:r>
+      <w:r>
+        <w:rPr>
+          <w:rFonts w:ascii="Helvetica Neue" w:hAnsi="Helvetica Neue" w:cs="Helvetica Neue"/>
+          <w:sz w:val="24"/>
+          <w:sz-cs w:val="24"/>
+          <w:spacing w:val="0"/>
+          <w:color w:val="181F26"/>
+        </w:rPr>
+        <w:t xml:space="preserve">OpenClaw is an interactive gateway-native harness surface.</w:t>
+      </w:r>
+    </w:p>
+    <w:p>
+      <w:pPr>
+        <w:ind w:left="720" w:first-line="-720"/>
+      </w:pPr>
+      <w:r>
+        <w:rPr>
+          <w:rFonts w:ascii="Helvetica Neue" w:hAnsi="Helvetica Neue" w:cs="Helvetica Neue"/>
+          <w:sz w:val="24"/>
+          <w:sz-cs w:val="24"/>
+          <w:color w:val="181F26"/>
+        </w:rPr>
+        <w:t xml:space="preserve"/>
+        <w:tab/>
+        <w:t xml:space="preserve">•</w:t>
+        <w:tab/>
+        <w:t xml:space="preserve"/>
+      </w:r>
+      <w:r>
+        <w:rPr>
+          <w:rFonts w:ascii="Helvetica Neue" w:hAnsi="Helvetica Neue" w:cs="Helvetica Neue"/>
+          <w:sz w:val="24"/>
+          <w:sz-cs w:val="24"/>
+          <w:spacing w:val="0"/>
+          <w:color w:val="181F26"/>
+        </w:rPr>
+        <w:t xml:space="preserve">Codex, Claude Code, Gemini CLI, and future ACP-compatible adapters are specialized general-purpose harnesses.</w:t>
+      </w:r>
+    </w:p>
+    <w:p>
+      <w:pPr>
+        <w:ind w:left="720" w:first-line="-720"/>
+      </w:pPr>
+      <w:r>
+        <w:rPr>
+          <w:rFonts w:ascii="Helvetica Neue" w:hAnsi="Helvetica Neue" w:cs="Helvetica Neue"/>
+          <w:sz w:val="24"/>
+          <w:sz-cs w:val="24"/>
+          <w:color w:val="181F26"/>
+        </w:rPr>
+        <w:t xml:space="preserve"/>
+        <w:tab/>
+        <w:t xml:space="preserve">•</w:t>
+        <w:tab/>
+        <w:t xml:space="preserve"/>
+      </w:r>
+      <w:r>
+        <w:rPr>
+          <w:rFonts w:ascii="Helvetica Neue" w:hAnsi="Helvetica Neue" w:cs="Helvetica Neue"/>
+          <w:sz w:val="24"/>
+          <w:sz-cs w:val="24"/>
+          <w:spacing w:val="0"/>
+          <w:color w:val="181F26"/>
+        </w:rPr>
+        <w:t xml:space="preserve">MCP tools are tool-plane integrations.</w:t>
+      </w:r>
+    </w:p>
+    <w:p>
+      <w:pPr>
+        <w:ind w:left="720" w:first-line="-720"/>
+      </w:pPr>
+      <w:r>
+        <w:rPr>
+          <w:rFonts w:ascii="Helvetica Neue" w:hAnsi="Helvetica Neue" w:cs="Helvetica Neue"/>
+          <w:sz w:val="24"/>
+          <w:sz-cs w:val="24"/>
+          <w:color w:val="181F26"/>
+        </w:rPr>
+        <w:t xml:space="preserve"/>
+        <w:tab/>
+        <w:t xml:space="preserve">•</w:t>
+        <w:tab/>
+        <w:t xml:space="preserve"/>
+      </w:r>
+      <w:r>
+        <w:rPr>
+          <w:rFonts w:ascii="Helvetica Neue" w:hAnsi="Helvetica Neue" w:cs="Helvetica Neue"/>
+          <w:sz w:val="24"/>
+          <w:sz-cs w:val="24"/>
+          <w:spacing w:val="0"/>
+          <w:color w:val="181F26"/>
+        </w:rPr>
+        <w:t xml:space="preserve">A2A will be remote-agent interoperability.</w:t>
+      </w:r>
+    </w:p>
+    <w:p>
+      <w:pPr>
+        <w:spacing w:after="240"/>
+      </w:pPr>
+      <w:r>
+        <w:rPr>
+          <w:rFonts w:ascii="Helvetica Neue" w:hAnsi="Helvetica Neue" w:cs="Helvetica Neue"/>
+          <w:sz w:val="24"/>
+          <w:sz-cs w:val="24"/>
+          <w:spacing w:val="0"/>
+          <w:color w:val="181F26"/>
+        </w:rPr>
+        <w:t xml:space="preserve">Crawfish does not compete by being one more reasoning loop. It competes by making many volatile reasoning loops behave like </w:t>
+      </w:r>
       <w:r>
         <w:rPr>
           <w:rFonts w:ascii="Helvetica Neue" w:hAnsi="Helvetica Neue" w:cs="Helvetica Neue"/>
           <w:sz w:val="24"/>
           <w:sz-cs w:val="24"/>
           <w:b/>
-          <w:color w:val="181F26"/>
-        </w:rPr>
-        <w:t xml:space="preserve"/>
-        <w:tab/>
-        <w:t xml:space="preserve">•</w:t>
-        <w:tab/>
-        <w:t xml:space="preserve"/>
+          <w:spacing w:val="0"/>
+          <w:color w:val="181F26"/>
+        </w:rPr>
+        <w:t xml:space="preserve">one inspectable system</w:t>
+      </w:r>
+      <w:r>
+        <w:rPr>
+          <w:rFonts w:ascii="Helvetica Neue" w:hAnsi="Helvetica Neue" w:cs="Helvetica Neue"/>
+          <w:sz w:val="24"/>
+          <w:sz-cs w:val="24"/>
+          <w:spacing w:val="0"/>
+          <w:color w:val="181F26"/>
+        </w:rPr>
+        <w:t xml:space="preserve">.</w:t>
+      </w:r>
+    </w:p>
+    <w:p>
+      <w:pPr>
+        <w:spacing w:after="240"/>
+      </w:pPr>
+      <w:r>
+        <w:rPr>
+          <w:rFonts w:ascii="Helvetica Neue" w:hAnsi="Helvetica Neue" w:cs="Helvetica Neue"/>
+          <w:sz w:val="24"/>
+          <w:sz-cs w:val="24"/>
+          <w:spacing w:val="0"/>
+          <w:color w:val="181F26"/>
+        </w:rPr>
+        <w:t xml:space="preserve">That is why the project is </w:t>
       </w:r>
       <w:r>
         <w:rPr>
@@ -1330,217 +1511,142 @@
           <w:spacing w:val="0"/>
           <w:color w:val="181F26"/>
         </w:rPr>
-        <w:t xml:space="preserve">Lifecycle</w:t>
-      </w:r>
-      <w:r>
-        <w:rPr>
-          <w:rFonts w:ascii="Helvetica Neue" w:hAnsi="Helvetica Neue" w:cs="Helvetica Neue"/>
-          <w:sz w:val="24"/>
-          <w:sz-cs w:val="24"/>
-          <w:spacing w:val="0"/>
-          <w:color w:val="181F26"/>
-        </w:rPr>
-        <w:t xml:space="preserve">: agents are supervised resources with desired state, health, drain behavior, degraded profiles, and recovery rules.</w:t>
-      </w:r>
-    </w:p>
-    <w:p>
-      <w:pPr>
-        <w:ind w:left="720" w:first-line="-720"/>
-      </w:pPr>
-      <w:r>
-        <w:rPr>
-          <w:rFonts w:ascii="Helvetica Neue" w:hAnsi="Helvetica Neue" w:cs="Helvetica Neue"/>
-          <w:sz w:val="24"/>
-          <w:sz-cs w:val="24"/>
-          <w:b/>
-          <w:color w:val="181F26"/>
-        </w:rPr>
-        <w:t xml:space="preserve"/>
-        <w:tab/>
-        <w:t xml:space="preserve">•</w:t>
-        <w:tab/>
-        <w:t xml:space="preserve"/>
-      </w:r>
-      <w:r>
-        <w:rPr>
-          <w:rFonts w:ascii="Helvetica Neue" w:hAnsi="Helvetica Neue" w:cs="Helvetica Neue"/>
-          <w:sz w:val="24"/>
-          <w:sz-cs w:val="24"/>
-          <w:b/>
-          <w:spacing w:val="0"/>
-          <w:color w:val="181F26"/>
-        </w:rPr>
-        <w:t xml:space="preserve">Contracts</w:t>
-      </w:r>
-      <w:r>
-        <w:rPr>
-          <w:rFonts w:ascii="Helvetica Neue" w:hAnsi="Helvetica Neue" w:cs="Helvetica Neue"/>
-          <w:sz w:val="24"/>
-          <w:sz-cs w:val="24"/>
-          <w:spacing w:val="0"/>
-          <w:color w:val="181F26"/>
-        </w:rPr>
-        <w:t xml:space="preserve">: deadlines, budgets, approval rules, mutation mode, and fallback policy are compiled into runtime behavior.</w:t>
-      </w:r>
-    </w:p>
-    <w:p>
-      <w:pPr>
-        <w:ind w:left="720" w:first-line="-720"/>
-      </w:pPr>
-      <w:r>
-        <w:rPr>
-          <w:rFonts w:ascii="Helvetica Neue" w:hAnsi="Helvetica Neue" w:cs="Helvetica Neue"/>
-          <w:sz w:val="24"/>
-          <w:sz-cs w:val="24"/>
-          <w:b/>
-          <w:color w:val="181F26"/>
-        </w:rPr>
-        <w:t xml:space="preserve"/>
-        <w:tab/>
-        <w:t xml:space="preserve">•</w:t>
-        <w:tab/>
-        <w:t xml:space="preserve"/>
-      </w:r>
-      <w:r>
-        <w:rPr>
-          <w:rFonts w:ascii="Helvetica Neue" w:hAnsi="Helvetica Neue" w:cs="Helvetica Neue"/>
-          <w:sz w:val="24"/>
-          <w:sz-cs w:val="24"/>
-          <w:b/>
-          <w:spacing w:val="0"/>
-          <w:color w:val="181F26"/>
-        </w:rPr>
-        <w:t xml:space="preserve">Governance</w:t>
-      </w:r>
-      <w:r>
-        <w:rPr>
-          <w:rFonts w:ascii="Helvetica Neue" w:hAnsi="Helvetica Neue" w:cs="Helvetica Neue"/>
-          <w:sz w:val="24"/>
-          <w:sz-cs w:val="24"/>
-          <w:spacing w:val="0"/>
-          <w:color w:val="181F26"/>
-        </w:rPr>
-        <w:t xml:space="preserve">: same-device foreign-owner encounters are classified, constrained, auditable, and revocable.</w:t>
-      </w:r>
-    </w:p>
-    <w:p>
-      <w:pPr>
-        <w:ind w:left="720" w:first-line="-720"/>
-      </w:pPr>
-      <w:r>
-        <w:rPr>
-          <w:rFonts w:ascii="Helvetica Neue" w:hAnsi="Helvetica Neue" w:cs="Helvetica Neue"/>
-          <w:sz w:val="24"/>
-          <w:sz-cs w:val="24"/>
-          <w:b/>
-          <w:color w:val="181F26"/>
-        </w:rPr>
-        <w:t xml:space="preserve"/>
-        <w:tab/>
-        <w:t xml:space="preserve">•</w:t>
-        <w:tab/>
-        <w:t xml:space="preserve"/>
-      </w:r>
-      <w:r>
-        <w:rPr>
-          <w:rFonts w:ascii="Helvetica Neue" w:hAnsi="Helvetica Neue" w:cs="Helvetica Neue"/>
-          <w:sz w:val="24"/>
-          <w:sz-cs w:val="24"/>
-          <w:b/>
-          <w:spacing w:val="0"/>
-          <w:color w:val="181F26"/>
-        </w:rPr>
-        <w:t xml:space="preserve">Continuity</w:t>
-      </w:r>
-      <w:r>
-        <w:rPr>
-          <w:rFonts w:ascii="Helvetica Neue" w:hAnsi="Helvetica Neue" w:cs="Helvetica Neue"/>
-          <w:sz w:val="24"/>
-          <w:sz-cs w:val="24"/>
-          <w:spacing w:val="0"/>
-          <w:color w:val="181F26"/>
-        </w:rPr>
-        <w:t xml:space="preserve">: when a model route or harness disappears, the swarm contracts into deterministic work, store-and-forward, or handoff instead of vanishing behind retries.</w:t>
-      </w:r>
-    </w:p>
-    <w:p>
-      <w:pPr>
-        <w:ind w:left="720" w:first-line="-720"/>
-      </w:pPr>
-      <w:r>
-        <w:rPr>
-          <w:rFonts w:ascii="Helvetica Neue" w:hAnsi="Helvetica Neue" w:cs="Helvetica Neue"/>
-          <w:sz w:val="24"/>
-          <w:sz-cs w:val="24"/>
-          <w:b/>
-          <w:color w:val="181F26"/>
-        </w:rPr>
-        <w:t xml:space="preserve"/>
-        <w:tab/>
-        <w:t xml:space="preserve">•</w:t>
-        <w:tab/>
-        <w:t xml:space="preserve"/>
-      </w:r>
-      <w:r>
-        <w:rPr>
-          <w:rFonts w:ascii="Helvetica Neue" w:hAnsi="Helvetica Neue" w:cs="Helvetica Neue"/>
-          <w:sz w:val="24"/>
-          <w:sz-cs w:val="24"/>
-          <w:b/>
-          <w:spacing w:val="0"/>
-          <w:color w:val="181F26"/>
-        </w:rPr>
-        <w:t xml:space="preserve">Verification</w:t>
-      </w:r>
-      <w:r>
-        <w:rPr>
-          <w:rFonts w:ascii="Helvetica Neue" w:hAnsi="Helvetica Neue" w:cs="Helvetica Neue"/>
-          <w:sz w:val="24"/>
-          <w:sz-cs w:val="24"/>
-          <w:spacing w:val="0"/>
-          <w:color w:val="181F26"/>
-        </w:rPr>
-        <w:t xml:space="preserve">: success is not whatever a model claims. Verification-sensitive work runs under deterministic checks and bounded retry budgets.</w:t>
-      </w:r>
-    </w:p>
-    <w:p>
-      <w:pPr>
-        <w:ind w:left="720" w:first-line="-720"/>
-      </w:pPr>
-      <w:r>
-        <w:rPr>
-          <w:rFonts w:ascii="Helvetica Neue" w:hAnsi="Helvetica Neue" w:cs="Helvetica Neue"/>
-          <w:sz w:val="24"/>
-          <w:sz-cs w:val="24"/>
-          <w:b/>
-          <w:color w:val="181F26"/>
-        </w:rPr>
-        <w:t xml:space="preserve"/>
-        <w:tab/>
-        <w:t xml:space="preserve">•</w:t>
-        <w:tab/>
-        <w:t xml:space="preserve"/>
-      </w:r>
-      <w:r>
-        <w:rPr>
-          <w:rFonts w:ascii="Helvetica Neue" w:hAnsi="Helvetica Neue" w:cs="Helvetica Neue"/>
-          <w:sz w:val="24"/>
-          <w:sz-cs w:val="24"/>
-          <w:b/>
-          <w:spacing w:val="0"/>
-          <w:color w:val="181F26"/>
-        </w:rPr>
-        <w:t xml:space="preserve">Inspection</w:t>
-      </w:r>
-      <w:r>
-        <w:rPr>
-          <w:rFonts w:ascii="Helvetica Neue" w:hAnsi="Helvetica Neue" w:cs="Helvetica Neue"/>
-          <w:sz w:val="24"/>
-          <w:sz-cs w:val="24"/>
-          <w:spacing w:val="0"/>
-          <w:color w:val="181F26"/>
-        </w:rPr>
-        <w:t xml:space="preserve">: actions expose phase, artifacts, checkpoints, external refs, event lineage, governance metadata, and operator-readable failure codes.</w:t>
+        <w:t xml:space="preserve">Rust-first, not Rust-only</w:t>
+      </w:r>
+      <w:r>
+        <w:rPr>
+          <w:rFonts w:ascii="Helvetica Neue" w:hAnsi="Helvetica Neue" w:cs="Helvetica Neue"/>
+          <w:sz w:val="24"/>
+          <w:sz-cs w:val="24"/>
+          <w:spacing w:val="0"/>
+          <w:color w:val="181F26"/>
+        </w:rPr>
+        <w:t xml:space="preserve">:</w:t>
+      </w:r>
+    </w:p>
+    <w:p>
+      <w:pPr>
+        <w:ind w:left="720" w:first-line="-720"/>
+      </w:pPr>
+      <w:r>
+        <w:rPr>
+          <w:rFonts w:ascii="Menlo" w:hAnsi="Menlo" w:cs="Menlo"/>
+          <w:sz w:val="24"/>
+          <w:sz-cs w:val="24"/>
+          <w:color w:val="181F26"/>
+        </w:rPr>
+        <w:t xml:space="preserve"/>
+        <w:tab/>
+        <w:t xml:space="preserve">•</w:t>
+        <w:tab/>
+        <w:t xml:space="preserve"/>
+      </w:r>
+      <w:r>
+        <w:rPr>
+          <w:rFonts w:ascii="Menlo" w:hAnsi="Menlo" w:cs="Menlo"/>
+          <w:sz w:val="24"/>
+          <w:sz-cs w:val="24"/>
+          <w:spacing w:val="0"/>
+          <w:color w:val="181F26"/>
+        </w:rPr>
+        <w:t xml:space="preserve">crates/</w:t>
+      </w:r>
+      <w:r>
+        <w:rPr>
+          <w:rFonts w:ascii="Helvetica Neue" w:hAnsi="Helvetica Neue" w:cs="Helvetica Neue"/>
+          <w:sz w:val="24"/>
+          <w:sz-cs w:val="24"/>
+          <w:spacing w:val="0"/>
+          <w:color w:val="181F26"/>
+        </w:rPr>
+        <w:t xml:space="preserve"> is the implementation spine for the runtime, control plane, storage, and native outbound adapters.</w:t>
+      </w:r>
+    </w:p>
+    <w:p>
+      <w:pPr>
+        <w:ind w:left="720" w:first-line="-720"/>
+      </w:pPr>
+      <w:r>
+        <w:rPr>
+          <w:rFonts w:ascii="Menlo" w:hAnsi="Menlo" w:cs="Menlo"/>
+          <w:sz w:val="24"/>
+          <w:sz-cs w:val="24"/>
+          <w:color w:val="181F26"/>
+        </w:rPr>
+        <w:t xml:space="preserve"/>
+        <w:tab/>
+        <w:t xml:space="preserve">•</w:t>
+        <w:tab/>
+        <w:t xml:space="preserve"/>
+      </w:r>
+      <w:r>
+        <w:rPr>
+          <w:rFonts w:ascii="Menlo" w:hAnsi="Menlo" w:cs="Menlo"/>
+          <w:sz w:val="24"/>
+          <w:sz-cs w:val="24"/>
+          <w:spacing w:val="0"/>
+          <w:color w:val="181F26"/>
+        </w:rPr>
+        <w:t xml:space="preserve">integrations/</w:t>
+      </w:r>
+      <w:r>
+        <w:rPr>
+          <w:rFonts w:ascii="Helvetica Neue" w:hAnsi="Helvetica Neue" w:cs="Helvetica Neue"/>
+          <w:sz w:val="24"/>
+          <w:sz-cs w:val="24"/>
+          <w:spacing w:val="0"/>
+          <w:color w:val="181F26"/>
+        </w:rPr>
+        <w:t xml:space="preserve"> is the edge zone for isolated bridge packages where a non-Rust implementation is pragmatic.</w:t>
+      </w:r>
+    </w:p>
+    <w:p>
+      <w:pPr>
+        <w:ind w:left="720" w:first-line="-720"/>
+      </w:pPr>
+      <w:r>
+        <w:rPr>
+          <w:rFonts w:ascii="Helvetica Neue" w:hAnsi="Helvetica Neue" w:cs="Helvetica Neue"/>
+          <w:sz w:val="24"/>
+          <w:sz-cs w:val="24"/>
+          <w:color w:val="181F26"/>
+        </w:rPr>
+        <w:t xml:space="preserve"/>
+        <w:tab/>
+        <w:t xml:space="preserve">•</w:t>
+        <w:tab/>
+        <w:t xml:space="preserve"/>
+      </w:r>
+      <w:r>
+        <w:rPr>
+          <w:rFonts w:ascii="Helvetica Neue" w:hAnsi="Helvetica Neue" w:cs="Helvetica Neue"/>
+          <w:sz w:val="24"/>
+          <w:sz-cs w:val="24"/>
+          <w:spacing w:val="0"/>
+          <w:color w:val="181F26"/>
+        </w:rPr>
+        <w:t xml:space="preserve">The current example is </w:t>
+      </w:r>
+      <w:r>
+        <w:rPr>
+          <w:rFonts w:ascii="Menlo" w:hAnsi="Menlo" w:cs="Menlo"/>
+          <w:sz w:val="24"/>
+          <w:sz-cs w:val="24"/>
+          <w:u w:val="single"/>
+          <w:spacing w:val="0"/>
+          <w:color w:val="0000E9"/>
+        </w:rPr>
+        <w:t xml:space="preserve">integrations/openclaw-inbound/</w:t>
+      </w:r>
+      <w:r>
+        <w:rPr>
+          <w:rFonts w:ascii="Helvetica Neue" w:hAnsi="Helvetica Neue" w:cs="Helvetica Neue"/>
+          <w:sz w:val="24"/>
+          <w:sz-cs w:val="24"/>
+          <w:spacing w:val="0"/>
+          <w:color w:val="181F26"/>
+        </w:rPr>
+        <w:t xml:space="preserve">, a thin TypeScript ingress bridge. The policy engine, lifecycle authority, storage, and runtime decisions remain in Rust.</w:t>
       </w:r>
     </w:p>
     <w:p>
@@ -1556,6 +1662,277 @@
           <w:spacing w:val="0"/>
           <w:color w:val="102C4B"/>
         </w:rPr>
+        <w:t xml:space="preserve">What The Control Plane Enforces</w:t>
+      </w:r>
+    </w:p>
+    <w:p>
+      <w:pPr>
+        <w:spacing w:after="240"/>
+      </w:pPr>
+      <w:r>
+        <w:rPr>
+          <w:rFonts w:ascii="Helvetica Neue" w:hAnsi="Helvetica Neue" w:cs="Helvetica Neue"/>
+          <w:sz w:val="24"/>
+          <w:sz-cs w:val="24"/>
+          <w:spacing w:val="0"/>
+          <w:color w:val="181F26"/>
+        </w:rPr>
+        <w:t xml:space="preserve">Crawfish is opinionated about what must survive model churn.</w:t>
+      </w:r>
+    </w:p>
+    <w:p>
+      <w:pPr>
+        <w:ind w:left="720" w:first-line="-720"/>
+      </w:pPr>
+      <w:r>
+        <w:rPr>
+          <w:rFonts w:ascii="Helvetica Neue" w:hAnsi="Helvetica Neue" w:cs="Helvetica Neue"/>
+          <w:sz w:val="24"/>
+          <w:sz-cs w:val="24"/>
+          <w:b/>
+          <w:color w:val="181F26"/>
+        </w:rPr>
+        <w:t xml:space="preserve"/>
+        <w:tab/>
+        <w:t xml:space="preserve">•</w:t>
+        <w:tab/>
+        <w:t xml:space="preserve"/>
+      </w:r>
+      <w:r>
+        <w:rPr>
+          <w:rFonts w:ascii="Helvetica Neue" w:hAnsi="Helvetica Neue" w:cs="Helvetica Neue"/>
+          <w:sz w:val="24"/>
+          <w:sz-cs w:val="24"/>
+          <w:b/>
+          <w:spacing w:val="0"/>
+          <w:color w:val="181F26"/>
+        </w:rPr>
+        <w:t xml:space="preserve">Lifecycle</w:t>
+      </w:r>
+      <w:r>
+        <w:rPr>
+          <w:rFonts w:ascii="Helvetica Neue" w:hAnsi="Helvetica Neue" w:cs="Helvetica Neue"/>
+          <w:sz w:val="24"/>
+          <w:sz-cs w:val="24"/>
+          <w:spacing w:val="0"/>
+          <w:color w:val="181F26"/>
+        </w:rPr>
+        <w:t xml:space="preserve">: agents are supervised resources with desired state, health, drain behavior, degraded profiles, and recovery rules.</w:t>
+      </w:r>
+    </w:p>
+    <w:p>
+      <w:pPr>
+        <w:ind w:left="720" w:first-line="-720"/>
+      </w:pPr>
+      <w:r>
+        <w:rPr>
+          <w:rFonts w:ascii="Helvetica Neue" w:hAnsi="Helvetica Neue" w:cs="Helvetica Neue"/>
+          <w:sz w:val="24"/>
+          <w:sz-cs w:val="24"/>
+          <w:b/>
+          <w:color w:val="181F26"/>
+        </w:rPr>
+        <w:t xml:space="preserve"/>
+        <w:tab/>
+        <w:t xml:space="preserve">•</w:t>
+        <w:tab/>
+        <w:t xml:space="preserve"/>
+      </w:r>
+      <w:r>
+        <w:rPr>
+          <w:rFonts w:ascii="Helvetica Neue" w:hAnsi="Helvetica Neue" w:cs="Helvetica Neue"/>
+          <w:sz w:val="24"/>
+          <w:sz-cs w:val="24"/>
+          <w:b/>
+          <w:spacing w:val="0"/>
+          <w:color w:val="181F26"/>
+        </w:rPr>
+        <w:t xml:space="preserve">Contracts</w:t>
+      </w:r>
+      <w:r>
+        <w:rPr>
+          <w:rFonts w:ascii="Helvetica Neue" w:hAnsi="Helvetica Neue" w:cs="Helvetica Neue"/>
+          <w:sz w:val="24"/>
+          <w:sz-cs w:val="24"/>
+          <w:spacing w:val="0"/>
+          <w:color w:val="181F26"/>
+        </w:rPr>
+        <w:t xml:space="preserve">: deadlines, budgets, approval rules, mutation mode, and fallback policy are compiled into runtime behavior.</w:t>
+      </w:r>
+    </w:p>
+    <w:p>
+      <w:pPr>
+        <w:ind w:left="720" w:first-line="-720"/>
+      </w:pPr>
+      <w:r>
+        <w:rPr>
+          <w:rFonts w:ascii="Helvetica Neue" w:hAnsi="Helvetica Neue" w:cs="Helvetica Neue"/>
+          <w:sz w:val="24"/>
+          <w:sz-cs w:val="24"/>
+          <w:b/>
+          <w:color w:val="181F26"/>
+        </w:rPr>
+        <w:t xml:space="preserve"/>
+        <w:tab/>
+        <w:t xml:space="preserve">•</w:t>
+        <w:tab/>
+        <w:t xml:space="preserve"/>
+      </w:r>
+      <w:r>
+        <w:rPr>
+          <w:rFonts w:ascii="Helvetica Neue" w:hAnsi="Helvetica Neue" w:cs="Helvetica Neue"/>
+          <w:sz w:val="24"/>
+          <w:sz-cs w:val="24"/>
+          <w:b/>
+          <w:spacing w:val="0"/>
+          <w:color w:val="181F26"/>
+        </w:rPr>
+        <w:t xml:space="preserve">Governance</w:t>
+      </w:r>
+      <w:r>
+        <w:rPr>
+          <w:rFonts w:ascii="Helvetica Neue" w:hAnsi="Helvetica Neue" w:cs="Helvetica Neue"/>
+          <w:sz w:val="24"/>
+          <w:sz-cs w:val="24"/>
+          <w:spacing w:val="0"/>
+          <w:color w:val="181F26"/>
+        </w:rPr>
+        <w:t xml:space="preserve">: same-device foreign-owner encounters are classified, constrained, auditable, and revocable.</w:t>
+      </w:r>
+    </w:p>
+    <w:p>
+      <w:pPr>
+        <w:ind w:left="720" w:first-line="-720"/>
+      </w:pPr>
+      <w:r>
+        <w:rPr>
+          <w:rFonts w:ascii="Helvetica Neue" w:hAnsi="Helvetica Neue" w:cs="Helvetica Neue"/>
+          <w:sz w:val="24"/>
+          <w:sz-cs w:val="24"/>
+          <w:b/>
+          <w:color w:val="181F26"/>
+        </w:rPr>
+        <w:t xml:space="preserve"/>
+        <w:tab/>
+        <w:t xml:space="preserve">•</w:t>
+        <w:tab/>
+        <w:t xml:space="preserve"/>
+      </w:r>
+      <w:r>
+        <w:rPr>
+          <w:rFonts w:ascii="Helvetica Neue" w:hAnsi="Helvetica Neue" w:cs="Helvetica Neue"/>
+          <w:sz w:val="24"/>
+          <w:sz-cs w:val="24"/>
+          <w:b/>
+          <w:spacing w:val="0"/>
+          <w:color w:val="181F26"/>
+        </w:rPr>
+        <w:t xml:space="preserve">Continuity</w:t>
+      </w:r>
+      <w:r>
+        <w:rPr>
+          <w:rFonts w:ascii="Helvetica Neue" w:hAnsi="Helvetica Neue" w:cs="Helvetica Neue"/>
+          <w:sz w:val="24"/>
+          <w:sz-cs w:val="24"/>
+          <w:spacing w:val="0"/>
+          <w:color w:val="181F26"/>
+        </w:rPr>
+        <w:t xml:space="preserve">: when a model route or harness disappears, the swarm contracts into deterministic work, store-and-forward, or handoff instead of vanishing behind retries.</w:t>
+      </w:r>
+    </w:p>
+    <w:p>
+      <w:pPr>
+        <w:ind w:left="720" w:first-line="-720"/>
+      </w:pPr>
+      <w:r>
+        <w:rPr>
+          <w:rFonts w:ascii="Helvetica Neue" w:hAnsi="Helvetica Neue" w:cs="Helvetica Neue"/>
+          <w:sz w:val="24"/>
+          <w:sz-cs w:val="24"/>
+          <w:b/>
+          <w:color w:val="181F26"/>
+        </w:rPr>
+        <w:t xml:space="preserve"/>
+        <w:tab/>
+        <w:t xml:space="preserve">•</w:t>
+        <w:tab/>
+        <w:t xml:space="preserve"/>
+      </w:r>
+      <w:r>
+        <w:rPr>
+          <w:rFonts w:ascii="Helvetica Neue" w:hAnsi="Helvetica Neue" w:cs="Helvetica Neue"/>
+          <w:sz w:val="24"/>
+          <w:sz-cs w:val="24"/>
+          <w:b/>
+          <w:spacing w:val="0"/>
+          <w:color w:val="181F26"/>
+        </w:rPr>
+        <w:t xml:space="preserve">Verification</w:t>
+      </w:r>
+      <w:r>
+        <w:rPr>
+          <w:rFonts w:ascii="Helvetica Neue" w:hAnsi="Helvetica Neue" w:cs="Helvetica Neue"/>
+          <w:sz w:val="24"/>
+          <w:sz-cs w:val="24"/>
+          <w:spacing w:val="0"/>
+          <w:color w:val="181F26"/>
+        </w:rPr>
+        <w:t xml:space="preserve">: success is not whatever a model claims. Verification-sensitive work runs under deterministic checks and bounded retry budgets.</w:t>
+      </w:r>
+    </w:p>
+    <w:p>
+      <w:pPr>
+        <w:ind w:left="720" w:first-line="-720"/>
+      </w:pPr>
+      <w:r>
+        <w:rPr>
+          <w:rFonts w:ascii="Helvetica Neue" w:hAnsi="Helvetica Neue" w:cs="Helvetica Neue"/>
+          <w:sz w:val="24"/>
+          <w:sz-cs w:val="24"/>
+          <w:b/>
+          <w:color w:val="181F26"/>
+        </w:rPr>
+        <w:t xml:space="preserve"/>
+        <w:tab/>
+        <w:t xml:space="preserve">•</w:t>
+        <w:tab/>
+        <w:t xml:space="preserve"/>
+      </w:r>
+      <w:r>
+        <w:rPr>
+          <w:rFonts w:ascii="Helvetica Neue" w:hAnsi="Helvetica Neue" w:cs="Helvetica Neue"/>
+          <w:sz w:val="24"/>
+          <w:sz-cs w:val="24"/>
+          <w:b/>
+          <w:spacing w:val="0"/>
+          <w:color w:val="181F26"/>
+        </w:rPr>
+        <w:t xml:space="preserve">Inspection</w:t>
+      </w:r>
+      <w:r>
+        <w:rPr>
+          <w:rFonts w:ascii="Helvetica Neue" w:hAnsi="Helvetica Neue" w:cs="Helvetica Neue"/>
+          <w:sz w:val="24"/>
+          <w:sz-cs w:val="24"/>
+          <w:spacing w:val="0"/>
+          <w:color w:val="181F26"/>
+        </w:rPr>
+        <w:t xml:space="preserve">: actions expose phase, artifacts, checkpoints, external refs, event lineage, governance metadata, and operator-readable failure codes.</w:t>
+      </w:r>
+    </w:p>
+    <w:p>
+      <w:pPr>
+        <w:spacing w:after="197"/>
+      </w:pPr>
+      <w:r>
+        <w:rPr>
+          <w:rFonts w:ascii="Helvetica Neue" w:hAnsi="Helvetica Neue" w:cs="Helvetica Neue"/>
+          <w:sz w:val="44"/>
+          <w:sz-cs w:val="44"/>
+          <w:b/>
+          <w:spacing w:val="0"/>
+          <w:color w:val="102C4B"/>
+        </w:rPr>
         <w:t xml:space="preserve">What Runs Today</w:t>
       </w:r>
     </w:p>
@@ -3447,7 +3824,28 @@
           <w:spacing w:val="0"/>
           <w:color w:val="181F26"/>
         </w:rPr>
-        <w:t xml:space="preserve">institutions lag capability growth; runtime guardrails cannot</w:t>
+        <w:t xml:space="preserve">institutions lag capability growth, as argued in Notion's </w:t>
+      </w:r>
+      <w:r>
+        <w:rPr>
+          <w:rFonts w:ascii="Helvetica Neue" w:hAnsi="Helvetica Neue" w:cs="Helvetica Neue"/>
+          <w:sz w:val="24"/>
+          <w:sz-cs w:val="24"/>
+          <w:u w:val="single"/>
+          <w:spacing w:val="0"/>
+          <w:color w:val="0000E9"/>
+        </w:rPr>
+        <w:t xml:space="preserve">"Steam, Steel, and Infinite Minds"</w:t>
+      </w:r>
+      <w:r>
+        <w:rPr>
+          <w:rFonts w:ascii="Helvetica Neue" w:hAnsi="Helvetica Neue" w:cs="Helvetica Neue"/>
+          <w:sz w:val="24"/>
+          <w:sz-cs w:val="24"/>
+          <w:spacing w:val="0"/>
+          <w:color w:val="181F26"/>
+        </w:rPr>
+        <w:t xml:space="preserve">; runtime guardrails cannot</w:t>
       </w:r>
     </w:p>
     <w:p>
@@ -5262,7 +5660,28 @@
           <w:spacing w:val="0"/>
           <w:color w:val="181F26"/>
         </w:rPr>
-        <w:t xml:space="preserve">governance and institutions will lag behind capability growth</w:t>
+        <w:t xml:space="preserve">governance and institutions will lag behind capability growth, which is also the broader institutional-lag frame behind Notion's </w:t>
+      </w:r>
+      <w:r>
+        <w:rPr>
+          <w:rFonts w:ascii="Helvetica Neue" w:hAnsi="Helvetica Neue" w:cs="Helvetica Neue"/>
+          <w:sz w:val="24"/>
+          <w:sz-cs w:val="24"/>
+          <w:u w:val="single"/>
+          <w:spacing w:val="0"/>
+          <w:color w:val="0000E9"/>
+        </w:rPr>
+        <w:t xml:space="preserve">"Steam, Steel, and Infinite Minds"</w:t>
+      </w:r>
+      <w:r>
+        <w:rPr>
+          <w:rFonts w:ascii="Helvetica Neue" w:hAnsi="Helvetica Neue" w:cs="Helvetica Neue"/>
+          <w:sz w:val="24"/>
+          <w:sz-cs w:val="24"/>
+          <w:spacing w:val="0"/>
+          <w:color w:val="181F26"/>
+        </w:rPr>
+        <w:t xml:space="preserve"/>
       </w:r>
     </w:p>
     <w:p>
@@ -5366,6 +5785,105 @@
           <w:spacing w:val="0"/>
           <w:color w:val="181F26"/>
         </w:rPr>
+        <w:t xml:space="preserve">This is also where Crawfish breaks with much earlier "multi-agent" framing. A large share of earlier multi-agent systems focused on context-managed sub-agents inside one application: LangChain explicitly frames the problem around </w:t>
+      </w:r>
+      <w:r>
+        <w:rPr>
+          <w:rFonts w:ascii="Helvetica Neue" w:hAnsi="Helvetica Neue" w:cs="Helvetica Neue"/>
+          <w:sz w:val="24"/>
+          <w:sz-cs w:val="24"/>
+          <w:u w:val="single"/>
+          <w:spacing w:val="0"/>
+          <w:color w:val="0000E9"/>
+        </w:rPr>
+        <w:t xml:space="preserve">context engineering</w:t>
+      </w:r>
+      <w:r>
+        <w:rPr>
+          <w:rFonts w:ascii="Helvetica Neue" w:hAnsi="Helvetica Neue" w:cs="Helvetica Neue"/>
+          <w:sz w:val="24"/>
+          <w:sz-cs w:val="24"/>
+          <w:spacing w:val="0"/>
+          <w:color w:val="181F26"/>
+        </w:rPr>
+        <w:t xml:space="preserve">, OpenAI's Agents SDK centers </w:t>
+      </w:r>
+      <w:r>
+        <w:rPr>
+          <w:rFonts w:ascii="Helvetica Neue" w:hAnsi="Helvetica Neue" w:cs="Helvetica Neue"/>
+          <w:sz w:val="24"/>
+          <w:sz-cs w:val="24"/>
+          <w:u w:val="single"/>
+          <w:spacing w:val="0"/>
+          <w:color w:val="0000E9"/>
+        </w:rPr>
+        <w:t xml:space="preserve">handoffs</w:t>
+      </w:r>
+      <w:r>
+        <w:rPr>
+          <w:rFonts w:ascii="Helvetica Neue" w:hAnsi="Helvetica Neue" w:cs="Helvetica Neue"/>
+          <w:sz w:val="24"/>
+          <w:sz-cs w:val="24"/>
+          <w:spacing w:val="0"/>
+          <w:color w:val="181F26"/>
+        </w:rPr>
+        <w:t xml:space="preserve"> and shared run </w:t>
+      </w:r>
+      <w:r>
+        <w:rPr>
+          <w:rFonts w:ascii="Helvetica Neue" w:hAnsi="Helvetica Neue" w:cs="Helvetica Neue"/>
+          <w:sz w:val="24"/>
+          <w:sz-cs w:val="24"/>
+          <w:u w:val="single"/>
+          <w:spacing w:val="0"/>
+          <w:color w:val="0000E9"/>
+        </w:rPr>
+        <w:t xml:space="preserve">context</w:t>
+      </w:r>
+      <w:r>
+        <w:rPr>
+          <w:rFonts w:ascii="Helvetica Neue" w:hAnsi="Helvetica Neue" w:cs="Helvetica Neue"/>
+          <w:sz w:val="24"/>
+          <w:sz-cs w:val="24"/>
+          <w:spacing w:val="0"/>
+          <w:color w:val="181F26"/>
+        </w:rPr>
+        <w:t xml:space="preserve">, and AutoGen Swarm describes agents that </w:t>
+      </w:r>
+      <w:r>
+        <w:rPr>
+          <w:rFonts w:ascii="Helvetica Neue" w:hAnsi="Helvetica Neue" w:cs="Helvetica Neue"/>
+          <w:sz w:val="24"/>
+          <w:sz-cs w:val="24"/>
+          <w:u w:val="single"/>
+          <w:spacing w:val="0"/>
+          <w:color w:val="0000E9"/>
+        </w:rPr>
+        <w:t xml:space="preserve">share the same message context</w:t>
+      </w:r>
+      <w:r>
+        <w:rPr>
+          <w:rFonts w:ascii="Helvetica Neue" w:hAnsi="Helvetica Neue" w:cs="Helvetica Neue"/>
+          <w:sz w:val="24"/>
+          <w:sz-cs w:val="24"/>
+          <w:spacing w:val="0"/>
+          <w:color w:val="181F26"/>
+        </w:rPr>
+        <w:t xml:space="preserve">. Those patterns solve coordination inside one app. Crawfish targets the next problem: real encounters across owners, trust domains, and harness surfaces.</w:t>
+      </w:r>
+    </w:p>
+    <w:p>
+      <w:pPr>
+        <w:spacing w:after="240"/>
+      </w:pPr>
+      <w:r>
+        <w:rPr>
+          <w:rFonts w:ascii="Helvetica Neue" w:hAnsi="Helvetica Neue" w:cs="Helvetica Neue"/>
+          <w:sz w:val="24"/>
+          <w:sz-cs w:val="24"/>
+          <w:spacing w:val="0"/>
+          <w:color w:val="181F26"/>
+        </w:rPr>
         <w:t xml:space="preserve">That means Crawfish should optimize for:</w:t>
       </w:r>
     </w:p>
@@ -7163,6 +7681,21 @@
     </w:p>
     <w:p>
       <w:pPr>
+        <w:spacing w:after="240"/>
+      </w:pPr>
+      <w:r>
+        <w:rPr>
+          <w:rFonts w:ascii="Helvetica Neue" w:hAnsi="Helvetica Neue" w:cs="Helvetica Neue"/>
+          <w:sz w:val="24"/>
+          <w:sz-cs w:val="24"/>
+          <w:spacing w:val="0"/>
+          <w:color w:val="181F26"/>
+        </w:rPr>
+        <w:t xml:space="preserve">The reason is not just operational hygiene. It is institutional memory. If swarms are going to operate in frontier conditions before broader governance catches up, then traces, evaluations, review queues, and replay datasets become the runtime's way to remember, compare, and correct behavior without pretending the constitution enforced itself.</w:t>
+      </w:r>
+    </w:p>
+    <w:p>
+      <w:pPr>
         <w:spacing w:after="197"/>
       </w:pPr>
       <w:r>
@@ -8882,7 +9415,28 @@
           <w:spacing w:val="0"/>
           <w:color w:val="181F26"/>
         </w:rPr>
-        <w:t xml:space="preserve"> Runtime guardrails, encounter policy, and revocation semantics should arrive before the ecosystem feels fully comfortable with them.</w:t>
+        <w:t xml:space="preserve"> Runtime guardrails, encounter policy, and revocation semantics should arrive before the ecosystem feels fully comfortable with them, in the broader sense argued by Notion's </w:t>
+      </w:r>
+      <w:r>
+        <w:rPr>
+          <w:rFonts w:ascii="Helvetica Neue" w:hAnsi="Helvetica Neue" w:cs="Helvetica Neue"/>
+          <w:sz w:val="24"/>
+          <w:sz-cs w:val="24"/>
+          <w:u w:val="single"/>
+          <w:spacing w:val="0"/>
+          <w:color w:val="0000E9"/>
+        </w:rPr>
+        <w:t xml:space="preserve">"Steam, Steel, and Infinite Minds"</w:t>
+      </w:r>
+      <w:r>
+        <w:rPr>
+          <w:rFonts w:ascii="Helvetica Neue" w:hAnsi="Helvetica Neue" w:cs="Helvetica Neue"/>
+          <w:sz w:val="24"/>
+          <w:sz-cs w:val="24"/>
+          <w:spacing w:val="0"/>
+          <w:color w:val="181F26"/>
+        </w:rPr>
+        <w:t xml:space="preserve">.</w:t>
       </w:r>
     </w:p>
     <w:p>
@@ -9557,7 +10111,91 @@
           <w:spacing w:val="0"/>
           <w:color w:val="181F26"/>
         </w:rPr>
-        <w:t xml:space="preserve">The first generation of multi-agent systems mostly treated agents as task-level helpers. Multiple agents often meant little more than role separation or context isolation inside one application.</w:t>
+        <w:t xml:space="preserve">The first generation of multi-agent systems mostly treated agents as task-level helpers. Multiple agents often meant little more than role separation or context isolation inside one application. LangChain's multi-agent docs explicitly frame this around </w:t>
+      </w:r>
+      <w:r>
+        <w:rPr>
+          <w:rFonts w:ascii="Helvetica Neue" w:hAnsi="Helvetica Neue" w:cs="Helvetica Neue"/>
+          <w:sz w:val="24"/>
+          <w:sz-cs w:val="24"/>
+          <w:u w:val="single"/>
+          <w:spacing w:val="0"/>
+          <w:color w:val="0000E9"/>
+        </w:rPr>
+        <w:t xml:space="preserve">context engineering</w:t>
+      </w:r>
+      <w:r>
+        <w:rPr>
+          <w:rFonts w:ascii="Helvetica Neue" w:hAnsi="Helvetica Neue" w:cs="Helvetica Neue"/>
+          <w:sz w:val="24"/>
+          <w:sz-cs w:val="24"/>
+          <w:spacing w:val="0"/>
+          <w:color w:val="181F26"/>
+        </w:rPr>
+        <w:t xml:space="preserve">, OpenAI's Agents SDK frames it around </w:t>
+      </w:r>
+      <w:r>
+        <w:rPr>
+          <w:rFonts w:ascii="Helvetica Neue" w:hAnsi="Helvetica Neue" w:cs="Helvetica Neue"/>
+          <w:sz w:val="24"/>
+          <w:sz-cs w:val="24"/>
+          <w:u w:val="single"/>
+          <w:spacing w:val="0"/>
+          <w:color w:val="0000E9"/>
+        </w:rPr>
+        <w:t xml:space="preserve">handoffs</w:t>
+      </w:r>
+      <w:r>
+        <w:rPr>
+          <w:rFonts w:ascii="Helvetica Neue" w:hAnsi="Helvetica Neue" w:cs="Helvetica Neue"/>
+          <w:sz w:val="24"/>
+          <w:sz-cs w:val="24"/>
+          <w:spacing w:val="0"/>
+          <w:color w:val="181F26"/>
+        </w:rPr>
+        <w:t xml:space="preserve"> and shared run </w:t>
+      </w:r>
+      <w:r>
+        <w:rPr>
+          <w:rFonts w:ascii="Helvetica Neue" w:hAnsi="Helvetica Neue" w:cs="Helvetica Neue"/>
+          <w:sz w:val="24"/>
+          <w:sz-cs w:val="24"/>
+          <w:u w:val="single"/>
+          <w:spacing w:val="0"/>
+          <w:color w:val="0000E9"/>
+        </w:rPr>
+        <w:t xml:space="preserve">context</w:t>
+      </w:r>
+      <w:r>
+        <w:rPr>
+          <w:rFonts w:ascii="Helvetica Neue" w:hAnsi="Helvetica Neue" w:cs="Helvetica Neue"/>
+          <w:sz w:val="24"/>
+          <w:sz-cs w:val="24"/>
+          <w:spacing w:val="0"/>
+          <w:color w:val="181F26"/>
+        </w:rPr>
+        <w:t xml:space="preserve">, and AutoGen Swarm describes agents that </w:t>
+      </w:r>
+      <w:r>
+        <w:rPr>
+          <w:rFonts w:ascii="Helvetica Neue" w:hAnsi="Helvetica Neue" w:cs="Helvetica Neue"/>
+          <w:sz w:val="24"/>
+          <w:sz-cs w:val="24"/>
+          <w:u w:val="single"/>
+          <w:spacing w:val="0"/>
+          <w:color w:val="0000E9"/>
+        </w:rPr>
+        <w:t xml:space="preserve">share the same message context</w:t>
+      </w:r>
+      <w:r>
+        <w:rPr>
+          <w:rFonts w:ascii="Helvetica Neue" w:hAnsi="Helvetica Neue" w:cs="Helvetica Neue"/>
+          <w:sz w:val="24"/>
+          <w:sz-cs w:val="24"/>
+          <w:spacing w:val="0"/>
+          <w:color w:val="181F26"/>
+        </w:rPr>
+        <w:t xml:space="preserve">.</w:t>
       </w:r>
     </w:p>
     <w:p>
@@ -9715,6 +10353,77 @@
           <w:color w:val="181F26"/>
         </w:rPr>
         <w:t xml:space="preserve">At that point, governance is not a secondary security feature. It becomes part of the runtime's core job.</w:t>
+      </w:r>
+    </w:p>
+    <w:p>
+      <w:pPr>
+        <w:spacing w:after="240"/>
+      </w:pPr>
+      <w:r>
+        <w:rPr>
+          <w:rFonts w:ascii="Helvetica Neue" w:hAnsi="Helvetica Neue" w:cs="Helvetica Neue"/>
+          <w:sz w:val="24"/>
+          <w:sz-cs w:val="24"/>
+          <w:spacing w:val="0"/>
+          <w:color w:val="181F26"/>
+        </w:rPr>
+        <w:t xml:space="preserve">The distinction matters:</w:t>
+      </w:r>
+    </w:p>
+    <w:p>
+      <w:pPr>
+        <w:ind w:left="720" w:first-line="-720"/>
+      </w:pPr>
+      <w:r>
+        <w:rPr>
+          <w:rFonts w:ascii="Helvetica Neue" w:hAnsi="Helvetica Neue" w:cs="Helvetica Neue"/>
+          <w:sz w:val="24"/>
+          <w:sz-cs w:val="24"/>
+          <w:color w:val="181F26"/>
+        </w:rPr>
+        <w:t xml:space="preserve"/>
+        <w:tab/>
+        <w:t xml:space="preserve">•</w:t>
+        <w:tab/>
+        <w:t xml:space="preserve"/>
+      </w:r>
+      <w:r>
+        <w:rPr>
+          <w:rFonts w:ascii="Helvetica Neue" w:hAnsi="Helvetica Neue" w:cs="Helvetica Neue"/>
+          <w:sz w:val="24"/>
+          <w:sz-cs w:val="24"/>
+          <w:spacing w:val="0"/>
+          <w:color w:val="181F26"/>
+        </w:rPr>
+        <w:t xml:space="preserve">old multi-agent often meant context-managed sub-agents under one application authority</w:t>
+      </w:r>
+    </w:p>
+    <w:p>
+      <w:pPr>
+        <w:ind w:left="720" w:first-line="-720"/>
+      </w:pPr>
+      <w:r>
+        <w:rPr>
+          <w:rFonts w:ascii="Helvetica Neue" w:hAnsi="Helvetica Neue" w:cs="Helvetica Neue"/>
+          <w:sz w:val="24"/>
+          <w:sz-cs w:val="24"/>
+          <w:color w:val="181F26"/>
+        </w:rPr>
+        <w:t xml:space="preserve"/>
+        <w:tab/>
+        <w:t xml:space="preserve">•</w:t>
+        <w:tab/>
+        <w:t xml:space="preserve"/>
+      </w:r>
+      <w:r>
+        <w:rPr>
+          <w:rFonts w:ascii="Helvetica Neue" w:hAnsi="Helvetica Neue" w:cs="Helvetica Neue"/>
+          <w:sz w:val="24"/>
+          <w:sz-cs w:val="24"/>
+          <w:spacing w:val="0"/>
+          <w:color w:val="181F26"/>
+        </w:rPr>
+        <w:t xml:space="preserve">Crawfish targets true swarm governance across owners, trust domains, and harness surfaces</w:t>
       </w:r>
     </w:p>
     <w:p>
@@ -20208,6 +20917,110 @@
           <w:spacing w:val="0"/>
           <w:color w:val="DFE8F2"/>
         </w:rPr>
+        <w:t xml:space="preserve">pub enum InteractionModel {</w:t>
+      </w:r>
+    </w:p>
+    <w:p>
+      <w:pPr/>
+      <w:r>
+        <w:rPr>
+          <w:rFonts w:ascii="Menlo" w:hAnsi="Menlo" w:cs="Menlo"/>
+          <w:sz w:val="24"/>
+          <w:sz-cs w:val="24"/>
+          <w:spacing w:val="0"/>
+          <w:color w:val="DFE8F2"/>
+        </w:rPr>
+        <w:t xml:space="preserve">  ContextSplit,</w:t>
+      </w:r>
+    </w:p>
+    <w:p>
+      <w:pPr/>
+      <w:r>
+        <w:rPr>
+          <w:rFonts w:ascii="Menlo" w:hAnsi="Menlo" w:cs="Menlo"/>
+          <w:sz w:val="24"/>
+          <w:sz-cs w:val="24"/>
+          <w:spacing w:val="0"/>
+          <w:color w:val="DFE8F2"/>
+        </w:rPr>
+        <w:t xml:space="preserve">  SameOwnerSwarm,</w:t>
+      </w:r>
+    </w:p>
+    <w:p>
+      <w:pPr/>
+      <w:r>
+        <w:rPr>
+          <w:rFonts w:ascii="Menlo" w:hAnsi="Menlo" w:cs="Menlo"/>
+          <w:sz w:val="24"/>
+          <w:sz-cs w:val="24"/>
+          <w:spacing w:val="0"/>
+          <w:color w:val="DFE8F2"/>
+        </w:rPr>
+        <w:t xml:space="preserve">  SameDeviceMultiOwner,</w:t>
+      </w:r>
+    </w:p>
+    <w:p>
+      <w:pPr/>
+      <w:r>
+        <w:rPr>
+          <w:rFonts w:ascii="Menlo" w:hAnsi="Menlo" w:cs="Menlo"/>
+          <w:sz w:val="24"/>
+          <w:sz-cs w:val="24"/>
+          <w:spacing w:val="0"/>
+          <w:color w:val="DFE8F2"/>
+        </w:rPr>
+        <w:t xml:space="preserve">  RemoteHarness,</w:t>
+      </w:r>
+    </w:p>
+    <w:p>
+      <w:pPr/>
+      <w:r>
+        <w:rPr>
+          <w:rFonts w:ascii="Menlo" w:hAnsi="Menlo" w:cs="Menlo"/>
+          <w:sz w:val="24"/>
+          <w:sz-cs w:val="24"/>
+          <w:spacing w:val="0"/>
+          <w:color w:val="DFE8F2"/>
+        </w:rPr>
+        <w:t xml:space="preserve">  ExternalUnknown,</w:t>
+      </w:r>
+    </w:p>
+    <w:p>
+      <w:pPr/>
+      <w:r>
+        <w:rPr>
+          <w:rFonts w:ascii="Menlo" w:hAnsi="Menlo" w:cs="Menlo"/>
+          <w:sz w:val="24"/>
+          <w:sz-cs w:val="24"/>
+          <w:spacing w:val="0"/>
+          <w:color w:val="DFE8F2"/>
+        </w:rPr>
+        <w:t xml:space="preserve">}</w:t>
+      </w:r>
+    </w:p>
+    <w:p>
+      <w:pPr/>
+      <w:r>
+        <w:rPr>
+          <w:rFonts w:ascii="Menlo" w:hAnsi="Menlo" w:cs="Menlo"/>
+          <w:sz w:val="24"/>
+          <w:sz-cs w:val="24"/>
+          <w:spacing w:val="0"/>
+          <w:color w:val="DFE8F2"/>
+        </w:rPr>
+        <w:t xml:space="preserve"/>
+      </w:r>
+    </w:p>
+    <w:p>
+      <w:pPr/>
+      <w:r>
+        <w:rPr>
+          <w:rFonts w:ascii="Menlo" w:hAnsi="Menlo" w:cs="Menlo"/>
+          <w:sz w:val="24"/>
+          <w:sz-cs w:val="24"/>
+          <w:spacing w:val="0"/>
+          <w:color w:val="DFE8F2"/>
+        </w:rPr>
         <w:t xml:space="preserve">pub enum OversightCheckpoint {</w:t>
       </w:r>
     </w:p>
@@ -20481,7 +21294,7 @@
           <w:spacing w:val="0"/>
           <w:color w:val="DFE8F2"/>
         </w:rPr>
-        <w:t xml:space="preserve">  pub code: String,</w:t>
+        <w:t xml:space="preserve">  pub reason_code: String,</w:t>
       </w:r>
     </w:p>
     <w:p>
@@ -20612,6 +21425,19 @@
           <w:color w:val="DFE8F2"/>
         </w:rPr>
         <w:t xml:space="preserve">  pub capability: String,</w:t>
+      </w:r>
+    </w:p>
+    <w:p>
+      <w:pPr/>
+      <w:r>
+        <w:rPr>
+          <w:rFonts w:ascii="Menlo" w:hAnsi="Menlo" w:cs="Menlo"/>
+          <w:sz w:val="24"/>
+          <w:sz-cs w:val="24"/>
+          <w:spacing w:val="0"/>
+          <w:color w:val="DFE8F2"/>
+        </w:rPr>
+        <w:t xml:space="preserve">  pub interaction_model: InteractionModel,</w:t>
       </w:r>
     </w:p>
     <w:p>
@@ -30408,6 +31234,125 @@
           <w:spacing w:val="0"/>
           <w:color w:val="181F26"/>
         </w:rPr>
+        <w:t xml:space="preserve">This is also where Crawfish separates older context-split multi-agent patterns from real swarm encounters. LangChain's multi-agent framing is explicitly about </w:t>
+      </w:r>
+      <w:r>
+        <w:rPr>
+          <w:rFonts w:ascii="Helvetica Neue" w:hAnsi="Helvetica Neue" w:cs="Helvetica Neue"/>
+          <w:sz w:val="24"/>
+          <w:sz-cs w:val="24"/>
+          <w:u w:val="single"/>
+          <w:spacing w:val="0"/>
+          <w:color w:val="0000E9"/>
+        </w:rPr>
+        <w:t xml:space="preserve">context engineering</w:t>
+      </w:r>
+      <w:r>
+        <w:rPr>
+          <w:rFonts w:ascii="Helvetica Neue" w:hAnsi="Helvetica Neue" w:cs="Helvetica Neue"/>
+          <w:sz w:val="24"/>
+          <w:sz-cs w:val="24"/>
+          <w:spacing w:val="0"/>
+          <w:color w:val="181F26"/>
+        </w:rPr>
+        <w:t xml:space="preserve">, OpenAI's Agents SDK centers </w:t>
+      </w:r>
+      <w:r>
+        <w:rPr>
+          <w:rFonts w:ascii="Helvetica Neue" w:hAnsi="Helvetica Neue" w:cs="Helvetica Neue"/>
+          <w:sz w:val="24"/>
+          <w:sz-cs w:val="24"/>
+          <w:u w:val="single"/>
+          <w:spacing w:val="0"/>
+          <w:color w:val="0000E9"/>
+        </w:rPr>
+        <w:t xml:space="preserve">handoffs</w:t>
+      </w:r>
+      <w:r>
+        <w:rPr>
+          <w:rFonts w:ascii="Helvetica Neue" w:hAnsi="Helvetica Neue" w:cs="Helvetica Neue"/>
+          <w:sz w:val="24"/>
+          <w:sz-cs w:val="24"/>
+          <w:spacing w:val="0"/>
+          <w:color w:val="181F26"/>
+        </w:rPr>
+        <w:t xml:space="preserve"> and shared </w:t>
+      </w:r>
+      <w:r>
+        <w:rPr>
+          <w:rFonts w:ascii="Helvetica Neue" w:hAnsi="Helvetica Neue" w:cs="Helvetica Neue"/>
+          <w:sz w:val="24"/>
+          <w:sz-cs w:val="24"/>
+          <w:u w:val="single"/>
+          <w:spacing w:val="0"/>
+          <w:color w:val="0000E9"/>
+        </w:rPr>
+        <w:t xml:space="preserve">context</w:t>
+      </w:r>
+      <w:r>
+        <w:rPr>
+          <w:rFonts w:ascii="Helvetica Neue" w:hAnsi="Helvetica Neue" w:cs="Helvetica Neue"/>
+          <w:sz w:val="24"/>
+          <w:sz-cs w:val="24"/>
+          <w:spacing w:val="0"/>
+          <w:color w:val="181F26"/>
+        </w:rPr>
+        <w:t xml:space="preserve">, and AutoGen Swarm describes agents that </w:t>
+      </w:r>
+      <w:r>
+        <w:rPr>
+          <w:rFonts w:ascii="Helvetica Neue" w:hAnsi="Helvetica Neue" w:cs="Helvetica Neue"/>
+          <w:sz w:val="24"/>
+          <w:sz-cs w:val="24"/>
+          <w:u w:val="single"/>
+          <w:spacing w:val="0"/>
+          <w:color w:val="0000E9"/>
+        </w:rPr>
+        <w:t xml:space="preserve">share the same message context</w:t>
+      </w:r>
+      <w:r>
+        <w:rPr>
+          <w:rFonts w:ascii="Helvetica Neue" w:hAnsi="Helvetica Neue" w:cs="Helvetica Neue"/>
+          <w:sz w:val="24"/>
+          <w:sz-cs w:val="24"/>
+          <w:spacing w:val="0"/>
+          <w:color w:val="181F26"/>
+        </w:rPr>
+        <w:t xml:space="preserve">. Crawfish still supports that </w:t>
+      </w:r>
+      <w:r>
+        <w:rPr>
+          <w:rFonts w:ascii="Menlo" w:hAnsi="Menlo" w:cs="Menlo"/>
+          <w:sz w:val="24"/>
+          <w:sz-cs w:val="24"/>
+          <w:spacing w:val="0"/>
+          <w:color w:val="181F26"/>
+        </w:rPr>
+        <w:t xml:space="preserve">context_split</w:t>
+      </w:r>
+      <w:r>
+        <w:rPr>
+          <w:rFonts w:ascii="Helvetica Neue" w:hAnsi="Helvetica Neue" w:cs="Helvetica Neue"/>
+          <w:sz w:val="24"/>
+          <w:sz-cs w:val="24"/>
+          <w:spacing w:val="0"/>
+          <w:color w:val="181F26"/>
+        </w:rPr>
+        <w:t xml:space="preserve"> case as a derived interaction model, but the doctrine compiler treats everything outside that narrow class as frontier governance territory.</w:t>
+      </w:r>
+    </w:p>
+    <w:p>
+      <w:pPr>
+        <w:spacing w:after="240"/>
+      </w:pPr>
+      <w:r>
+        <w:rPr>
+          <w:rFonts w:ascii="Helvetica Neue" w:hAnsi="Helvetica Neue" w:cs="Helvetica Neue"/>
+          <w:sz w:val="24"/>
+          <w:sz-cs w:val="24"/>
+          <w:spacing w:val="0"/>
+          <w:color w:val="181F26"/>
+        </w:rPr>
         <w:t xml:space="preserve">This is the architecture-level answer to the frontier problem:</w:t>
       </w:r>
     </w:p>
@@ -30591,6 +31536,44 @@
           <w:spacing w:val="0"/>
           <w:color w:val="181F26"/>
         </w:rPr>
+        <w:t xml:space="preserve">InteractionModel</w:t>
+      </w:r>
+      <w:r>
+        <w:rPr>
+          <w:rFonts w:ascii="Helvetica Neue" w:hAnsi="Helvetica Neue" w:cs="Helvetica Neue"/>
+          <w:sz w:val="24"/>
+          <w:sz-cs w:val="24"/>
+          <w:spacing w:val="0"/>
+          <w:color w:val="181F26"/>
+        </w:rPr>
+        <w:t xml:space="preserve"/>
+      </w:r>
+    </w:p>
+    <w:p>
+      <w:pPr>
+        <w:ind w:left="720" w:first-line="-720"/>
+      </w:pPr>
+      <w:r>
+        <w:rPr>
+          <w:rFonts w:ascii="Menlo" w:hAnsi="Menlo" w:cs="Menlo"/>
+          <w:sz w:val="24"/>
+          <w:sz-cs w:val="24"/>
+          <w:color w:val="181F26"/>
+        </w:rPr>
+        <w:t xml:space="preserve"/>
+        <w:tab/>
+        <w:t xml:space="preserve">•</w:t>
+        <w:tab/>
+        <w:t xml:space="preserve"/>
+      </w:r>
+      <w:r>
+        <w:rPr>
+          <w:rFonts w:ascii="Menlo" w:hAnsi="Menlo" w:cs="Menlo"/>
+          <w:sz w:val="24"/>
+          <w:sz-cs w:val="24"/>
+          <w:spacing w:val="0"/>
+          <w:color w:val="181F26"/>
+        </w:rPr>
         <w:t xml:space="preserve">JurisdictionClass</w:t>
       </w:r>
       <w:r>
@@ -30769,6 +31752,286 @@
           <w:color w:val="181F26"/>
         </w:rPr>
         <w:t xml:space="preserve">If a required checkpoint cannot be satisfied, the action must not silently continue. The only legal exits are deny, store-and-forward, or human handoff.</w:t>
+      </w:r>
+    </w:p>
+    <w:p>
+      <w:pPr>
+        <w:spacing w:after="240"/>
+      </w:pPr>
+      <w:r>
+        <w:rPr>
+          <w:rFonts w:ascii="Helvetica Neue" w:hAnsi="Helvetica Neue" w:cs="Helvetica Neue"/>
+          <w:sz w:val="24"/>
+          <w:sz-cs w:val="24"/>
+          <w:spacing w:val="0"/>
+          <w:color w:val="181F26"/>
+        </w:rPr>
+        <w:t xml:space="preserve">In practice the doctrine compiler interprets the interaction classes this way:</w:t>
+      </w:r>
+    </w:p>
+    <w:p>
+      <w:pPr>
+        <w:ind w:left="720" w:first-line="-720"/>
+      </w:pPr>
+      <w:r>
+        <w:rPr>
+          <w:rFonts w:ascii="Menlo" w:hAnsi="Menlo" w:cs="Menlo"/>
+          <w:sz w:val="24"/>
+          <w:sz-cs w:val="24"/>
+          <w:color w:val="181F26"/>
+        </w:rPr>
+        <w:t xml:space="preserve"/>
+        <w:tab/>
+        <w:t xml:space="preserve">•</w:t>
+        <w:tab/>
+        <w:t xml:space="preserve"/>
+      </w:r>
+      <w:r>
+        <w:rPr>
+          <w:rFonts w:ascii="Menlo" w:hAnsi="Menlo" w:cs="Menlo"/>
+          <w:sz w:val="24"/>
+          <w:sz-cs w:val="24"/>
+          <w:spacing w:val="0"/>
+          <w:color w:val="181F26"/>
+        </w:rPr>
+        <w:t xml:space="preserve">context_split</w:t>
+      </w:r>
+      <w:r>
+        <w:rPr>
+          <w:rFonts w:ascii="Helvetica Neue" w:hAnsi="Helvetica Neue" w:cs="Helvetica Neue"/>
+          <w:sz w:val="24"/>
+          <w:sz-cs w:val="24"/>
+          <w:spacing w:val="0"/>
+          <w:color w:val="181F26"/>
+        </w:rPr>
+        <w:t xml:space="preserve">: multiple workers may coordinate inside one bounded application with no meaningful owner or harness boundary</w:t>
+      </w:r>
+    </w:p>
+    <w:p>
+      <w:pPr>
+        <w:ind w:left="720" w:first-line="-720"/>
+      </w:pPr>
+      <w:r>
+        <w:rPr>
+          <w:rFonts w:ascii="Menlo" w:hAnsi="Menlo" w:cs="Menlo"/>
+          <w:sz w:val="24"/>
+          <w:sz-cs w:val="24"/>
+          <w:color w:val="181F26"/>
+        </w:rPr>
+        <w:t xml:space="preserve"/>
+        <w:tab/>
+        <w:t xml:space="preserve">•</w:t>
+        <w:tab/>
+        <w:t xml:space="preserve"/>
+      </w:r>
+      <w:r>
+        <w:rPr>
+          <w:rFonts w:ascii="Menlo" w:hAnsi="Menlo" w:cs="Menlo"/>
+          <w:sz w:val="24"/>
+          <w:sz-cs w:val="24"/>
+          <w:spacing w:val="0"/>
+          <w:color w:val="181F26"/>
+        </w:rPr>
+        <w:t xml:space="preserve">same_owner_swarm</w:t>
+      </w:r>
+      <w:r>
+        <w:rPr>
+          <w:rFonts w:ascii="Helvetica Neue" w:hAnsi="Helvetica Neue" w:cs="Helvetica Neue"/>
+          <w:sz w:val="24"/>
+          <w:sz-cs w:val="24"/>
+          <w:spacing w:val="0"/>
+          <w:color w:val="181F26"/>
+        </w:rPr>
+        <w:t xml:space="preserve">: the control plane is already operating over multiple bounded workers under one owner</w:t>
+      </w:r>
+    </w:p>
+    <w:p>
+      <w:pPr>
+        <w:ind w:left="720" w:first-line="-720"/>
+      </w:pPr>
+      <w:r>
+        <w:rPr>
+          <w:rFonts w:ascii="Menlo" w:hAnsi="Menlo" w:cs="Menlo"/>
+          <w:sz w:val="24"/>
+          <w:sz-cs w:val="24"/>
+          <w:color w:val="181F26"/>
+        </w:rPr>
+        <w:t xml:space="preserve"/>
+        <w:tab/>
+        <w:t xml:space="preserve">•</w:t>
+        <w:tab/>
+        <w:t xml:space="preserve"/>
+      </w:r>
+      <w:r>
+        <w:rPr>
+          <w:rFonts w:ascii="Menlo" w:hAnsi="Menlo" w:cs="Menlo"/>
+          <w:sz w:val="24"/>
+          <w:sz-cs w:val="24"/>
+          <w:spacing w:val="0"/>
+          <w:color w:val="181F26"/>
+        </w:rPr>
+        <w:t xml:space="preserve">same_device_multi_owner</w:t>
+      </w:r>
+      <w:r>
+        <w:rPr>
+          <w:rFonts w:ascii="Helvetica Neue" w:hAnsi="Helvetica Neue" w:cs="Helvetica Neue"/>
+          <w:sz w:val="24"/>
+          <w:sz-cs w:val="24"/>
+          <w:spacing w:val="0"/>
+          <w:color w:val="181F26"/>
+        </w:rPr>
+        <w:t xml:space="preserve">: frontier territory on the same machine</w:t>
+      </w:r>
+    </w:p>
+    <w:p>
+      <w:pPr>
+        <w:ind w:left="720" w:first-line="-720"/>
+      </w:pPr>
+      <w:r>
+        <w:rPr>
+          <w:rFonts w:ascii="Menlo" w:hAnsi="Menlo" w:cs="Menlo"/>
+          <w:sz w:val="24"/>
+          <w:sz-cs w:val="24"/>
+          <w:color w:val="181F26"/>
+        </w:rPr>
+        <w:t xml:space="preserve"/>
+        <w:tab/>
+        <w:t xml:space="preserve">•</w:t>
+        <w:tab/>
+        <w:t xml:space="preserve"/>
+      </w:r>
+      <w:r>
+        <w:rPr>
+          <w:rFonts w:ascii="Menlo" w:hAnsi="Menlo" w:cs="Menlo"/>
+          <w:sz w:val="24"/>
+          <w:sz-cs w:val="24"/>
+          <w:spacing w:val="0"/>
+          <w:color w:val="181F26"/>
+        </w:rPr>
+        <w:t xml:space="preserve">remote_harness</w:t>
+      </w:r>
+      <w:r>
+        <w:rPr>
+          <w:rFonts w:ascii="Helvetica Neue" w:hAnsi="Helvetica Neue" w:cs="Helvetica Neue"/>
+          <w:sz w:val="24"/>
+          <w:sz-cs w:val="24"/>
+          <w:spacing w:val="0"/>
+          <w:color w:val="181F26"/>
+        </w:rPr>
+        <w:t xml:space="preserve">: frontier territory because execution crosses into a harness surface</w:t>
+      </w:r>
+    </w:p>
+    <w:p>
+      <w:pPr>
+        <w:ind w:left="720" w:first-line="-720"/>
+      </w:pPr>
+      <w:r>
+        <w:rPr>
+          <w:rFonts w:ascii="Menlo" w:hAnsi="Menlo" w:cs="Menlo"/>
+          <w:sz w:val="24"/>
+          <w:sz-cs w:val="24"/>
+          <w:color w:val="181F26"/>
+        </w:rPr>
+        <w:t xml:space="preserve"/>
+        <w:tab/>
+        <w:t xml:space="preserve">•</w:t>
+        <w:tab/>
+        <w:t xml:space="preserve"/>
+      </w:r>
+      <w:r>
+        <w:rPr>
+          <w:rFonts w:ascii="Menlo" w:hAnsi="Menlo" w:cs="Menlo"/>
+          <w:sz w:val="24"/>
+          <w:sz-cs w:val="24"/>
+          <w:spacing w:val="0"/>
+          <w:color w:val="181F26"/>
+        </w:rPr>
+        <w:t xml:space="preserve">external_unknown</w:t>
+      </w:r>
+      <w:r>
+        <w:rPr>
+          <w:rFonts w:ascii="Helvetica Neue" w:hAnsi="Helvetica Neue" w:cs="Helvetica Neue"/>
+          <w:sz w:val="24"/>
+          <w:sz-cs w:val="24"/>
+          <w:spacing w:val="0"/>
+          <w:color w:val="181F26"/>
+        </w:rPr>
+        <w:t xml:space="preserve">: frontier territory with insufficient authority or trust classification</w:t>
+      </w:r>
+    </w:p>
+    <w:p>
+      <w:pPr>
+        <w:spacing w:after="240"/>
+      </w:pPr>
+      <w:r>
+        <w:rPr>
+          <w:rFonts w:ascii="Helvetica Neue" w:hAnsi="Helvetica Neue" w:cs="Helvetica Neue"/>
+          <w:sz w:val="24"/>
+          <w:sz-cs w:val="24"/>
+          <w:spacing w:val="0"/>
+          <w:color w:val="181F26"/>
+        </w:rPr>
+        <w:t xml:space="preserve">Everything except </w:t>
+      </w:r>
+      <w:r>
+        <w:rPr>
+          <w:rFonts w:ascii="Menlo" w:hAnsi="Menlo" w:cs="Menlo"/>
+          <w:sz w:val="24"/>
+          <w:sz-cs w:val="24"/>
+          <w:spacing w:val="0"/>
+          <w:color w:val="181F26"/>
+        </w:rPr>
+        <w:t xml:space="preserve">context_split</w:t>
+      </w:r>
+      <w:r>
+        <w:rPr>
+          <w:rFonts w:ascii="Helvetica Neue" w:hAnsi="Helvetica Neue" w:cs="Helvetica Neue"/>
+          <w:sz w:val="24"/>
+          <w:sz-cs w:val="24"/>
+          <w:spacing w:val="0"/>
+          <w:color w:val="181F26"/>
+        </w:rPr>
+        <w:t xml:space="preserve"> must prove doctrine evidence at the relevant checkpoints. Missing evidence produces a </w:t>
+      </w:r>
+      <w:r>
+        <w:rPr>
+          <w:rFonts w:ascii="Menlo" w:hAnsi="Menlo" w:cs="Menlo"/>
+          <w:sz w:val="24"/>
+          <w:sz-cs w:val="24"/>
+          <w:spacing w:val="0"/>
+          <w:color w:val="181F26"/>
+        </w:rPr>
+        <w:t xml:space="preserve">PolicyIncident</w:t>
+      </w:r>
+      <w:r>
+        <w:rPr>
+          <w:rFonts w:ascii="Helvetica Neue" w:hAnsi="Helvetica Neue" w:cs="Helvetica Neue"/>
+          <w:sz w:val="24"/>
+          <w:sz-cs w:val="24"/>
+          <w:spacing w:val="0"/>
+          <w:color w:val="181F26"/>
+        </w:rPr>
+        <w:t xml:space="preserve"> with </w:t>
+      </w:r>
+      <w:r>
+        <w:rPr>
+          <w:rFonts w:ascii="Menlo" w:hAnsi="Menlo" w:cs="Menlo"/>
+          <w:sz w:val="24"/>
+          <w:sz-cs w:val="24"/>
+          <w:spacing w:val="0"/>
+          <w:color w:val="181F26"/>
+        </w:rPr>
+        <w:t xml:space="preserve">reason_code = "frontier_enforcement_gap"</w:t>
+      </w:r>
+      <w:r>
+        <w:rPr>
+          <w:rFonts w:ascii="Helvetica Neue" w:hAnsi="Helvetica Neue" w:cs="Helvetica Neue"/>
+          <w:sz w:val="24"/>
+          <w:sz-cs w:val="24"/>
+          <w:spacing w:val="0"/>
+          <w:color w:val="181F26"/>
+        </w:rPr>
+        <w:t xml:space="preserve">.</w:t>
       </w:r>
     </w:p>
     <w:p>
@@ -45566,6 +46829,301 @@
     </w:p>
     <w:p>
       <w:pPr>
+        <w:spacing w:after="240"/>
+      </w:pPr>
+      <w:r>
+        <w:rPr>
+          <w:rFonts w:ascii="Helvetica Neue" w:hAnsi="Helvetica Neue" w:cs="Helvetica Neue"/>
+          <w:sz w:val="24"/>
+          <w:sz-cs w:val="24"/>
+          <w:spacing w:val="0"/>
+          <w:color w:val="181F26"/>
+        </w:rPr>
+        <w:t xml:space="preserve">The current </w:t>
+      </w:r>
+      <w:r>
+        <w:rPr>
+          <w:rFonts w:ascii="Menlo" w:hAnsi="Menlo" w:cs="Menlo"/>
+          <w:sz w:val="24"/>
+          <w:sz-cs w:val="24"/>
+          <w:spacing w:val="0"/>
+          <w:color w:val="181F26"/>
+        </w:rPr>
+        <w:t xml:space="preserve">P1h</w:t>
+      </w:r>
+      <w:r>
+        <w:rPr>
+          <w:rFonts w:ascii="Helvetica Neue" w:hAnsi="Helvetica Neue" w:cs="Helvetica Neue"/>
+          <w:sz w:val="24"/>
+          <w:sz-cs w:val="24"/>
+          <w:spacing w:val="0"/>
+          <w:color w:val="181F26"/>
+        </w:rPr>
+        <w:t xml:space="preserve"> source-cited swarm-reality slice adds:</w:t>
+      </w:r>
+    </w:p>
+    <w:p>
+      <w:pPr>
+        <w:ind w:left="720" w:first-line="-720"/>
+      </w:pPr>
+      <w:r>
+        <w:rPr>
+          <w:rFonts w:ascii="Helvetica Neue" w:hAnsi="Helvetica Neue" w:cs="Helvetica Neue"/>
+          <w:sz w:val="24"/>
+          <w:sz-cs w:val="24"/>
+          <w:color w:val="181F26"/>
+        </w:rPr>
+        <w:t xml:space="preserve"/>
+        <w:tab/>
+        <w:t xml:space="preserve">•</w:t>
+        <w:tab/>
+        <w:t xml:space="preserve"/>
+      </w:r>
+      <w:r>
+        <w:rPr>
+          <w:rFonts w:ascii="Helvetica Neue" w:hAnsi="Helvetica Neue" w:cs="Helvetica Neue"/>
+          <w:sz w:val="24"/>
+          <w:sz-cs w:val="24"/>
+          <w:spacing w:val="0"/>
+          <w:color w:val="181F26"/>
+        </w:rPr>
+        <w:t xml:space="preserve">a new derived </w:t>
+      </w:r>
+      <w:r>
+        <w:rPr>
+          <w:rFonts w:ascii="Menlo" w:hAnsi="Menlo" w:cs="Menlo"/>
+          <w:sz w:val="24"/>
+          <w:sz-cs w:val="24"/>
+          <w:spacing w:val="0"/>
+          <w:color w:val="181F26"/>
+        </w:rPr>
+        <w:t xml:space="preserve">interaction_model</w:t>
+      </w:r>
+      <w:r>
+        <w:rPr>
+          <w:rFonts w:ascii="Helvetica Neue" w:hAnsi="Helvetica Neue" w:cs="Helvetica Neue"/>
+          <w:sz w:val="24"/>
+          <w:sz-cs w:val="24"/>
+          <w:spacing w:val="0"/>
+          <w:color w:val="181F26"/>
+        </w:rPr>
+        <w:t xml:space="preserve"> classification across action inspection, trace bundles, and dataset cases</w:t>
+      </w:r>
+    </w:p>
+    <w:p>
+      <w:pPr>
+        <w:ind w:left="720" w:first-line="-720"/>
+      </w:pPr>
+      <w:r>
+        <w:rPr>
+          <w:rFonts w:ascii="Helvetica Neue" w:hAnsi="Helvetica Neue" w:cs="Helvetica Neue"/>
+          <w:sz w:val="24"/>
+          <w:sz-cs w:val="24"/>
+          <w:color w:val="181F26"/>
+        </w:rPr>
+        <w:t xml:space="preserve"/>
+        <w:tab/>
+        <w:t xml:space="preserve">•</w:t>
+        <w:tab/>
+        <w:t xml:space="preserve"/>
+      </w:r>
+      <w:r>
+        <w:rPr>
+          <w:rFonts w:ascii="Helvetica Neue" w:hAnsi="Helvetica Neue" w:cs="Helvetica Neue"/>
+          <w:sz w:val="24"/>
+          <w:sz-cs w:val="24"/>
+          <w:spacing w:val="0"/>
+          <w:color w:val="181F26"/>
+        </w:rPr>
+        <w:t xml:space="preserve">an explicit runtime distinction between </w:t>
+      </w:r>
+      <w:r>
+        <w:rPr>
+          <w:rFonts w:ascii="Menlo" w:hAnsi="Menlo" w:cs="Menlo"/>
+          <w:sz w:val="24"/>
+          <w:sz-cs w:val="24"/>
+          <w:spacing w:val="0"/>
+          <w:color w:val="181F26"/>
+        </w:rPr>
+        <w:t xml:space="preserve">context_split</w:t>
+      </w:r>
+      <w:r>
+        <w:rPr>
+          <w:rFonts w:ascii="Helvetica Neue" w:hAnsi="Helvetica Neue" w:cs="Helvetica Neue"/>
+          <w:sz w:val="24"/>
+          <w:sz-cs w:val="24"/>
+          <w:spacing w:val="0"/>
+          <w:color w:val="181F26"/>
+        </w:rPr>
+        <w:t xml:space="preserve"> coordination and frontier governance territory such as </w:t>
+      </w:r>
+      <w:r>
+        <w:rPr>
+          <w:rFonts w:ascii="Menlo" w:hAnsi="Menlo" w:cs="Menlo"/>
+          <w:sz w:val="24"/>
+          <w:sz-cs w:val="24"/>
+          <w:spacing w:val="0"/>
+          <w:color w:val="181F26"/>
+        </w:rPr>
+        <w:t xml:space="preserve">same_device_multi_owner</w:t>
+      </w:r>
+      <w:r>
+        <w:rPr>
+          <w:rFonts w:ascii="Helvetica Neue" w:hAnsi="Helvetica Neue" w:cs="Helvetica Neue"/>
+          <w:sz w:val="24"/>
+          <w:sz-cs w:val="24"/>
+          <w:spacing w:val="0"/>
+          <w:color w:val="181F26"/>
+        </w:rPr>
+        <w:t xml:space="preserve"> and </w:t>
+      </w:r>
+      <w:r>
+        <w:rPr>
+          <w:rFonts w:ascii="Menlo" w:hAnsi="Menlo" w:cs="Menlo"/>
+          <w:sz w:val="24"/>
+          <w:sz-cs w:val="24"/>
+          <w:spacing w:val="0"/>
+          <w:color w:val="181F26"/>
+        </w:rPr>
+        <w:t xml:space="preserve">remote_harness</w:t>
+      </w:r>
+      <w:r>
+        <w:rPr>
+          <w:rFonts w:ascii="Helvetica Neue" w:hAnsi="Helvetica Neue" w:cs="Helvetica Neue"/>
+          <w:sz w:val="24"/>
+          <w:sz-cs w:val="24"/>
+          <w:spacing w:val="0"/>
+          <w:color w:val="181F26"/>
+        </w:rPr>
+        <w:t xml:space="preserve"/>
+      </w:r>
+    </w:p>
+    <w:p>
+      <w:pPr>
+        <w:ind w:left="720" w:first-line="-720"/>
+      </w:pPr>
+      <w:r>
+        <w:rPr>
+          <w:rFonts w:ascii="Helvetica Neue" w:hAnsi="Helvetica Neue" w:cs="Helvetica Neue"/>
+          <w:sz w:val="24"/>
+          <w:sz-cs w:val="24"/>
+          <w:color w:val="181F26"/>
+        </w:rPr>
+        <w:t xml:space="preserve"/>
+        <w:tab/>
+        <w:t xml:space="preserve">•</w:t>
+        <w:tab/>
+        <w:t xml:space="preserve"/>
+      </w:r>
+      <w:r>
+        <w:rPr>
+          <w:rFonts w:ascii="Helvetica Neue" w:hAnsi="Helvetica Neue" w:cs="Helvetica Neue"/>
+          <w:sz w:val="24"/>
+          <w:sz-cs w:val="24"/>
+          <w:spacing w:val="0"/>
+          <w:color w:val="181F26"/>
+        </w:rPr>
+        <w:t xml:space="preserve">stable </w:t>
+      </w:r>
+      <w:r>
+        <w:rPr>
+          <w:rFonts w:ascii="Menlo" w:hAnsi="Menlo" w:cs="Menlo"/>
+          <w:sz w:val="24"/>
+          <w:sz-cs w:val="24"/>
+          <w:spacing w:val="0"/>
+          <w:color w:val="181F26"/>
+        </w:rPr>
+        <w:t xml:space="preserve">PolicyIncident.reason_code</w:t>
+      </w:r>
+      <w:r>
+        <w:rPr>
+          <w:rFonts w:ascii="Helvetica Neue" w:hAnsi="Helvetica Neue" w:cs="Helvetica Neue"/>
+          <w:sz w:val="24"/>
+          <w:sz-cs w:val="24"/>
+          <w:spacing w:val="0"/>
+          <w:color w:val="181F26"/>
+        </w:rPr>
+        <w:t xml:space="preserve"> values, including </w:t>
+      </w:r>
+      <w:r>
+        <w:rPr>
+          <w:rFonts w:ascii="Menlo" w:hAnsi="Menlo" w:cs="Menlo"/>
+          <w:sz w:val="24"/>
+          <w:sz-cs w:val="24"/>
+          <w:spacing w:val="0"/>
+          <w:color w:val="181F26"/>
+        </w:rPr>
+        <w:t xml:space="preserve">frontier_enforcement_gap</w:t>
+      </w:r>
+      <w:r>
+        <w:rPr>
+          <w:rFonts w:ascii="Helvetica Neue" w:hAnsi="Helvetica Neue" w:cs="Helvetica Neue"/>
+          <w:sz w:val="24"/>
+          <w:sz-cs w:val="24"/>
+          <w:spacing w:val="0"/>
+          <w:color w:val="181F26"/>
+        </w:rPr>
+        <w:t xml:space="preserve"> when doctrine exists but checkpoint evidence is missing</w:t>
+      </w:r>
+    </w:p>
+    <w:p>
+      <w:pPr>
+        <w:ind w:left="720" w:first-line="-720"/>
+      </w:pPr>
+      <w:r>
+        <w:rPr>
+          <w:rFonts w:ascii="Helvetica Neue" w:hAnsi="Helvetica Neue" w:cs="Helvetica Neue"/>
+          <w:sz w:val="24"/>
+          <w:sz-cs w:val="24"/>
+          <w:color w:val="181F26"/>
+        </w:rPr>
+        <w:t xml:space="preserve"/>
+        <w:tab/>
+        <w:t xml:space="preserve">•</w:t>
+        <w:tab/>
+        <w:t xml:space="preserve"/>
+      </w:r>
+      <w:r>
+        <w:rPr>
+          <w:rFonts w:ascii="Helvetica Neue" w:hAnsi="Helvetica Neue" w:cs="Helvetica Neue"/>
+          <w:sz w:val="24"/>
+          <w:sz-cs w:val="24"/>
+          <w:spacing w:val="0"/>
+          <w:color w:val="181F26"/>
+        </w:rPr>
+        <w:t xml:space="preserve">richer inspect and trace surfaces that show doctrine summary, checkpoint status, interaction model, and frontier-gap visibility together</w:t>
+      </w:r>
+    </w:p>
+    <w:p>
+      <w:pPr>
+        <w:ind w:left="720" w:first-line="-720"/>
+      </w:pPr>
+      <w:r>
+        <w:rPr>
+          <w:rFonts w:ascii="Helvetica Neue" w:hAnsi="Helvetica Neue" w:cs="Helvetica Neue"/>
+          <w:sz w:val="24"/>
+          <w:sz-cs w:val="24"/>
+          <w:color w:val="181F26"/>
+        </w:rPr>
+        <w:t xml:space="preserve"/>
+        <w:tab/>
+        <w:t xml:space="preserve">•</w:t>
+        <w:tab/>
+        <w:t xml:space="preserve"/>
+      </w:r>
+      <w:r>
+        <w:rPr>
+          <w:rFonts w:ascii="Helvetica Neue" w:hAnsi="Helvetica Neue" w:cs="Helvetica Neue"/>
+          <w:sz w:val="24"/>
+          <w:sz-cs w:val="24"/>
+          <w:spacing w:val="0"/>
+          <w:color w:val="181F26"/>
+        </w:rPr>
+        <w:t xml:space="preserve">source-cited philosophy and product documents that distinguish older context-managed multi-agent patterns from true multi-owner swarm encounters</w:t>
+      </w:r>
+    </w:p>
+    <w:p>
+      <w:pPr>
         <w:spacing w:after="197"/>
       </w:pPr>
       <w:r>
@@ -53780,6 +55338,123 @@
           <w:spacing w:val="0"/>
           <w:color w:val="181F26"/>
         </w:rPr>
+        <w:t xml:space="preserve">interaction model</w:t>
+      </w:r>
+      <w:r>
+        <w:rPr>
+          <w:rFonts w:ascii="Helvetica Neue" w:hAnsi="Helvetica Neue" w:cs="Helvetica Neue"/>
+          <w:sz w:val="26"/>
+          <w:sz-cs w:val="26"/>
+          <w:spacing w:val="0"/>
+          <w:color w:val="181F26"/>
+        </w:rPr>
+        <w:t xml:space="preserve"/>
+      </w:r>
+    </w:p>
+    <w:p>
+      <w:pPr/>
+      <w:r>
+        <w:rPr>
+          <w:rFonts w:ascii="Helvetica Neue" w:hAnsi="Helvetica Neue" w:cs="Helvetica Neue"/>
+          <w:sz w:val="26"/>
+          <w:sz-cs w:val="26"/>
+          <w:spacing w:val="0"/>
+          <w:color w:val="181F26"/>
+        </w:rPr>
+        <w:t xml:space="preserve">A derived runtime classification describing what kind of boundary the action is actually crossing, such as </w:t>
+      </w:r>
+      <w:r>
+        <w:rPr>
+          <w:rFonts w:ascii="Menlo" w:hAnsi="Menlo" w:cs="Menlo"/>
+          <w:sz w:val="26"/>
+          <w:sz-cs w:val="26"/>
+          <w:spacing w:val="0"/>
+          <w:color w:val="181F26"/>
+        </w:rPr>
+        <w:t xml:space="preserve">context_split</w:t>
+      </w:r>
+      <w:r>
+        <w:rPr>
+          <w:rFonts w:ascii="Helvetica Neue" w:hAnsi="Helvetica Neue" w:cs="Helvetica Neue"/>
+          <w:sz w:val="26"/>
+          <w:sz-cs w:val="26"/>
+          <w:spacing w:val="0"/>
+          <w:color w:val="181F26"/>
+        </w:rPr>
+        <w:t xml:space="preserve">, </w:t>
+      </w:r>
+      <w:r>
+        <w:rPr>
+          <w:rFonts w:ascii="Menlo" w:hAnsi="Menlo" w:cs="Menlo"/>
+          <w:sz w:val="26"/>
+          <w:sz-cs w:val="26"/>
+          <w:spacing w:val="0"/>
+          <w:color w:val="181F26"/>
+        </w:rPr>
+        <w:t xml:space="preserve">same_owner_swarm</w:t>
+      </w:r>
+      <w:r>
+        <w:rPr>
+          <w:rFonts w:ascii="Helvetica Neue" w:hAnsi="Helvetica Neue" w:cs="Helvetica Neue"/>
+          <w:sz w:val="26"/>
+          <w:sz-cs w:val="26"/>
+          <w:spacing w:val="0"/>
+          <w:color w:val="181F26"/>
+        </w:rPr>
+        <w:t xml:space="preserve">, </w:t>
+      </w:r>
+      <w:r>
+        <w:rPr>
+          <w:rFonts w:ascii="Menlo" w:hAnsi="Menlo" w:cs="Menlo"/>
+          <w:sz w:val="26"/>
+          <w:sz-cs w:val="26"/>
+          <w:spacing w:val="0"/>
+          <w:color w:val="181F26"/>
+        </w:rPr>
+        <w:t xml:space="preserve">same_device_multi_owner</w:t>
+      </w:r>
+      <w:r>
+        <w:rPr>
+          <w:rFonts w:ascii="Helvetica Neue" w:hAnsi="Helvetica Neue" w:cs="Helvetica Neue"/>
+          <w:sz w:val="26"/>
+          <w:sz-cs w:val="26"/>
+          <w:spacing w:val="0"/>
+          <w:color w:val="181F26"/>
+        </w:rPr>
+        <w:t xml:space="preserve">, or </w:t>
+      </w:r>
+      <w:r>
+        <w:rPr>
+          <w:rFonts w:ascii="Menlo" w:hAnsi="Menlo" w:cs="Menlo"/>
+          <w:sz w:val="26"/>
+          <w:sz-cs w:val="26"/>
+          <w:spacing w:val="0"/>
+          <w:color w:val="181F26"/>
+        </w:rPr>
+        <w:t xml:space="preserve">remote_harness</w:t>
+      </w:r>
+      <w:r>
+        <w:rPr>
+          <w:rFonts w:ascii="Helvetica Neue" w:hAnsi="Helvetica Neue" w:cs="Helvetica Neue"/>
+          <w:sz w:val="26"/>
+          <w:sz-cs w:val="26"/>
+          <w:spacing w:val="0"/>
+          <w:color w:val="181F26"/>
+        </w:rPr>
+        <w:t xml:space="preserve">. It is not user-supplied configuration.</w:t>
+      </w:r>
+    </w:p>
+    <w:p>
+      <w:pPr/>
+      <w:r>
+        <w:rPr>
+          <w:rFonts w:ascii="Helvetica Neue" w:hAnsi="Helvetica Neue" w:cs="Helvetica Neue"/>
+          <w:sz w:val="26"/>
+          <w:sz-cs w:val="26"/>
+          <w:b/>
+          <w:spacing w:val="0"/>
+          <w:color w:val="181F26"/>
+        </w:rPr>
         <w:t xml:space="preserve">verification spec</w:t>
       </w:r>
       <w:r>
@@ -54748,6 +56423,43 @@
           <w:color w:val="181F26"/>
         </w:rPr>
         <w:t xml:space="preserve">A durable recovery record written at safe execution boundaries such as model turns, mutating tool calls, or explicit yield points.</w:t>
+      </w:r>
+    </w:p>
+    <w:p>
+      <w:pPr/>
+      <w:r>
+        <w:rPr>
+          <w:rFonts w:ascii="Helvetica Neue" w:hAnsi="Helvetica Neue" w:cs="Helvetica Neue"/>
+          <w:sz w:val="26"/>
+          <w:sz-cs w:val="26"/>
+          <w:b/>
+          <w:spacing w:val="0"/>
+          <w:color w:val="181F26"/>
+        </w:rPr>
+        <w:t xml:space="preserve">context split</w:t>
+      </w:r>
+      <w:r>
+        <w:rPr>
+          <w:rFonts w:ascii="Helvetica Neue" w:hAnsi="Helvetica Neue" w:cs="Helvetica Neue"/>
+          <w:sz w:val="26"/>
+          <w:sz-cs w:val="26"/>
+          <w:spacing w:val="0"/>
+          <w:color w:val="181F26"/>
+        </w:rPr>
+        <w:t xml:space="preserve"/>
+      </w:r>
+    </w:p>
+    <w:p>
+      <w:pPr/>
+      <w:r>
+        <w:rPr>
+          <w:rFonts w:ascii="Helvetica Neue" w:hAnsi="Helvetica Neue" w:cs="Helvetica Neue"/>
+          <w:sz w:val="26"/>
+          <w:sz-cs w:val="26"/>
+          <w:spacing w:val="0"/>
+          <w:color w:val="181F26"/>
+        </w:rPr>
+        <w:t xml:space="preserve">A narrow multi-agent pattern in which sub-agents or bounded workers coordinate inside one application authority without a meaningful owner, trust-domain, or external-harness boundary. Context split is coordination, not full swarm governance.</w:t>
       </w:r>
     </w:p>
     <w:p>

</xml_diff>

<commit_message>
docs: publish a2a treaty delegation narrative
</commit_message>
<xml_diff>
--- a/docs/exports/Crawfish-PRD.docx
+++ b/docs/exports/Crawfish-PRD.docx
@@ -1449,7 +1449,49 @@
           <w:spacing w:val="0"/>
           <w:color w:val="181F26"/>
         </w:rPr>
-        <w:t xml:space="preserve">A2A will be remote-agent interoperability.</w:t>
+        <w:t xml:space="preserve">A2A is the first real remote-agent plane in the current design, using </w:t>
+      </w:r>
+      <w:r>
+        <w:rPr>
+          <w:rFonts w:ascii="Helvetica Neue" w:hAnsi="Helvetica Neue" w:cs="Helvetica Neue"/>
+          <w:sz w:val="24"/>
+          <w:sz-cs w:val="24"/>
+          <w:u w:val="single"/>
+          <w:spacing w:val="0"/>
+          <w:color w:val="0000E9"/>
+        </w:rPr>
+        <w:t xml:space="preserve">Agent Cards and task-based delegation</w:t>
+      </w:r>
+      <w:r>
+        <w:rPr>
+          <w:rFonts w:ascii="Helvetica Neue" w:hAnsi="Helvetica Neue" w:cs="Helvetica Neue"/>
+          <w:sz w:val="24"/>
+          <w:sz-cs w:val="24"/>
+          <w:spacing w:val="0"/>
+          <w:color w:val="181F26"/>
+        </w:rPr>
+        <w:t xml:space="preserve"> in the shape introduced by Google's </w:t>
+      </w:r>
+      <w:r>
+        <w:rPr>
+          <w:rFonts w:ascii="Helvetica Neue" w:hAnsi="Helvetica Neue" w:cs="Helvetica Neue"/>
+          <w:sz w:val="24"/>
+          <w:sz-cs w:val="24"/>
+          <w:u w:val="single"/>
+          <w:spacing w:val="0"/>
+          <w:color w:val="0000E9"/>
+        </w:rPr>
+        <w:t xml:space="preserve">"A2A: A New Era of Agent Interoperability"</w:t>
+      </w:r>
+      <w:r>
+        <w:rPr>
+          <w:rFonts w:ascii="Helvetica Neue" w:hAnsi="Helvetica Neue" w:cs="Helvetica Neue"/>
+          <w:sz w:val="24"/>
+          <w:sz-cs w:val="24"/>
+          <w:spacing w:val="0"/>
+          <w:color w:val="181F26"/>
+        </w:rPr>
+        <w:t xml:space="preserve">.</w:t>
       </w:r>
     </w:p>
     <w:p>
@@ -1486,167 +1528,6 @@
           <w:color w:val="181F26"/>
         </w:rPr>
         <w:t xml:space="preserve">.</w:t>
-      </w:r>
-    </w:p>
-    <w:p>
-      <w:pPr>
-        <w:spacing w:after="240"/>
-      </w:pPr>
-      <w:r>
-        <w:rPr>
-          <w:rFonts w:ascii="Helvetica Neue" w:hAnsi="Helvetica Neue" w:cs="Helvetica Neue"/>
-          <w:sz w:val="24"/>
-          <w:sz-cs w:val="24"/>
-          <w:spacing w:val="0"/>
-          <w:color w:val="181F26"/>
-        </w:rPr>
-        <w:t xml:space="preserve">That is why the project is </w:t>
-      </w:r>
-      <w:r>
-        <w:rPr>
-          <w:rFonts w:ascii="Helvetica Neue" w:hAnsi="Helvetica Neue" w:cs="Helvetica Neue"/>
-          <w:sz w:val="24"/>
-          <w:sz-cs w:val="24"/>
-          <w:b/>
-          <w:spacing w:val="0"/>
-          <w:color w:val="181F26"/>
-        </w:rPr>
-        <w:t xml:space="preserve">Rust-first, not Rust-only</w:t>
-      </w:r>
-      <w:r>
-        <w:rPr>
-          <w:rFonts w:ascii="Helvetica Neue" w:hAnsi="Helvetica Neue" w:cs="Helvetica Neue"/>
-          <w:sz w:val="24"/>
-          <w:sz-cs w:val="24"/>
-          <w:spacing w:val="0"/>
-          <w:color w:val="181F26"/>
-        </w:rPr>
-        <w:t xml:space="preserve">:</w:t>
-      </w:r>
-    </w:p>
-    <w:p>
-      <w:pPr>
-        <w:ind w:left="720" w:first-line="-720"/>
-      </w:pPr>
-      <w:r>
-        <w:rPr>
-          <w:rFonts w:ascii="Menlo" w:hAnsi="Menlo" w:cs="Menlo"/>
-          <w:sz w:val="24"/>
-          <w:sz-cs w:val="24"/>
-          <w:color w:val="181F26"/>
-        </w:rPr>
-        <w:t xml:space="preserve"/>
-        <w:tab/>
-        <w:t xml:space="preserve">•</w:t>
-        <w:tab/>
-        <w:t xml:space="preserve"/>
-      </w:r>
-      <w:r>
-        <w:rPr>
-          <w:rFonts w:ascii="Menlo" w:hAnsi="Menlo" w:cs="Menlo"/>
-          <w:sz w:val="24"/>
-          <w:sz-cs w:val="24"/>
-          <w:spacing w:val="0"/>
-          <w:color w:val="181F26"/>
-        </w:rPr>
-        <w:t xml:space="preserve">crates/</w:t>
-      </w:r>
-      <w:r>
-        <w:rPr>
-          <w:rFonts w:ascii="Helvetica Neue" w:hAnsi="Helvetica Neue" w:cs="Helvetica Neue"/>
-          <w:sz w:val="24"/>
-          <w:sz-cs w:val="24"/>
-          <w:spacing w:val="0"/>
-          <w:color w:val="181F26"/>
-        </w:rPr>
-        <w:t xml:space="preserve"> is the implementation spine for the runtime, control plane, storage, and native outbound adapters.</w:t>
-      </w:r>
-    </w:p>
-    <w:p>
-      <w:pPr>
-        <w:ind w:left="720" w:first-line="-720"/>
-      </w:pPr>
-      <w:r>
-        <w:rPr>
-          <w:rFonts w:ascii="Menlo" w:hAnsi="Menlo" w:cs="Menlo"/>
-          <w:sz w:val="24"/>
-          <w:sz-cs w:val="24"/>
-          <w:color w:val="181F26"/>
-        </w:rPr>
-        <w:t xml:space="preserve"/>
-        <w:tab/>
-        <w:t xml:space="preserve">•</w:t>
-        <w:tab/>
-        <w:t xml:space="preserve"/>
-      </w:r>
-      <w:r>
-        <w:rPr>
-          <w:rFonts w:ascii="Menlo" w:hAnsi="Menlo" w:cs="Menlo"/>
-          <w:sz w:val="24"/>
-          <w:sz-cs w:val="24"/>
-          <w:spacing w:val="0"/>
-          <w:color w:val="181F26"/>
-        </w:rPr>
-        <w:t xml:space="preserve">integrations/</w:t>
-      </w:r>
-      <w:r>
-        <w:rPr>
-          <w:rFonts w:ascii="Helvetica Neue" w:hAnsi="Helvetica Neue" w:cs="Helvetica Neue"/>
-          <w:sz w:val="24"/>
-          <w:sz-cs w:val="24"/>
-          <w:spacing w:val="0"/>
-          <w:color w:val="181F26"/>
-        </w:rPr>
-        <w:t xml:space="preserve"> is the edge zone for isolated bridge packages where a non-Rust implementation is pragmatic.</w:t>
-      </w:r>
-    </w:p>
-    <w:p>
-      <w:pPr>
-        <w:ind w:left="720" w:first-line="-720"/>
-      </w:pPr>
-      <w:r>
-        <w:rPr>
-          <w:rFonts w:ascii="Helvetica Neue" w:hAnsi="Helvetica Neue" w:cs="Helvetica Neue"/>
-          <w:sz w:val="24"/>
-          <w:sz-cs w:val="24"/>
-          <w:color w:val="181F26"/>
-        </w:rPr>
-        <w:t xml:space="preserve"/>
-        <w:tab/>
-        <w:t xml:space="preserve">•</w:t>
-        <w:tab/>
-        <w:t xml:space="preserve"/>
-      </w:r>
-      <w:r>
-        <w:rPr>
-          <w:rFonts w:ascii="Helvetica Neue" w:hAnsi="Helvetica Neue" w:cs="Helvetica Neue"/>
-          <w:sz w:val="24"/>
-          <w:sz-cs w:val="24"/>
-          <w:spacing w:val="0"/>
-          <w:color w:val="181F26"/>
-        </w:rPr>
-        <w:t xml:space="preserve">The current example is </w:t>
-      </w:r>
-      <w:r>
-        <w:rPr>
-          <w:rFonts w:ascii="Menlo" w:hAnsi="Menlo" w:cs="Menlo"/>
-          <w:sz w:val="24"/>
-          <w:sz-cs w:val="24"/>
-          <w:u w:val="single"/>
-          <w:spacing w:val="0"/>
-          <w:color w:val="0000E9"/>
-        </w:rPr>
-        <w:t xml:space="preserve">integrations/openclaw-inbound/</w:t>
-      </w:r>
-      <w:r>
-        <w:rPr>
-          <w:rFonts w:ascii="Helvetica Neue" w:hAnsi="Helvetica Neue" w:cs="Helvetica Neue"/>
-          <w:sz w:val="24"/>
-          <w:sz-cs w:val="24"/>
-          <w:spacing w:val="0"/>
-          <w:color w:val="181F26"/>
-        </w:rPr>
-        <w:t xml:space="preserve">, a thin TypeScript ingress bridge. The policy engine, lifecycle authority, storage, and runtime decisions remain in Rust.</w:t>
       </w:r>
     </w:p>
     <w:p>
@@ -1662,7 +1543,7 @@
           <w:spacing w:val="0"/>
           <w:color w:val="102C4B"/>
         </w:rPr>
-        <w:t xml:space="preserve">What The Control Plane Enforces</w:t>
+        <w:t xml:space="preserve">Why Remote Agents Are Not Just Another Harness</w:t>
       </w:r>
     </w:p>
     <w:p>
@@ -1677,247 +1558,331 @@
           <w:spacing w:val="0"/>
           <w:color w:val="181F26"/>
         </w:rPr>
-        <w:t xml:space="preserve">Crawfish is opinionated about what must survive model churn.</w:t>
-      </w:r>
-    </w:p>
-    <w:p>
-      <w:pPr>
-        <w:ind w:left="720" w:first-line="-720"/>
-      </w:pPr>
+        <w:t xml:space="preserve">Remote agents are not only remote processes. They are separate authorities.</w:t>
+      </w:r>
+    </w:p>
+    <w:p>
+      <w:pPr>
+        <w:spacing w:after="240"/>
+      </w:pPr>
+      <w:r>
+        <w:rPr>
+          <w:rFonts w:ascii="Helvetica Neue" w:hAnsi="Helvetica Neue" w:cs="Helvetica Neue"/>
+          <w:sz w:val="24"/>
+          <w:sz-cs w:val="24"/>
+          <w:spacing w:val="0"/>
+          <w:color w:val="181F26"/>
+        </w:rPr>
+        <w:t xml:space="preserve">A harness crossing changes the execution surface. A remote-agent crossing changes the governance problem. A2A's </w:t>
+      </w:r>
+      <w:r>
+        <w:rPr>
+          <w:rFonts w:ascii="Helvetica Neue" w:hAnsi="Helvetica Neue" w:cs="Helvetica Neue"/>
+          <w:sz w:val="24"/>
+          <w:sz-cs w:val="24"/>
+          <w:u w:val="single"/>
+          <w:spacing w:val="0"/>
+          <w:color w:val="0000E9"/>
+        </w:rPr>
+        <w:t xml:space="preserve">Agent Card</w:t>
+      </w:r>
+      <w:r>
+        <w:rPr>
+          <w:rFonts w:ascii="Helvetica Neue" w:hAnsi="Helvetica Neue" w:cs="Helvetica Neue"/>
+          <w:sz w:val="24"/>
+          <w:sz-cs w:val="24"/>
+          <w:spacing w:val="0"/>
+          <w:color w:val="181F26"/>
+        </w:rPr>
+        <w:t xml:space="preserve"> model and task lifecycle make that explicit: the runtime is delegating work to another agent system, not just spawning another wrapper on the same machine.</w:t>
+      </w:r>
+    </w:p>
+    <w:p>
+      <w:pPr>
+        <w:spacing w:after="240"/>
+      </w:pPr>
+      <w:r>
+        <w:rPr>
+          <w:rFonts w:ascii="Helvetica Neue" w:hAnsi="Helvetica Neue" w:cs="Helvetica Neue"/>
+          <w:sz w:val="24"/>
+          <w:sz-cs w:val="24"/>
+          <w:spacing w:val="0"/>
+          <w:color w:val="181F26"/>
+        </w:rPr>
+        <w:t xml:space="preserve">That is why Crawfish treats remote delegation differently:</w:t>
+      </w:r>
+    </w:p>
+    <w:p>
+      <w:pPr>
+        <w:ind w:left="720" w:first-line="-720"/>
+      </w:pPr>
+      <w:r>
+        <w:rPr>
+          <w:rFonts w:ascii="Helvetica Neue" w:hAnsi="Helvetica Neue" w:cs="Helvetica Neue"/>
+          <w:sz w:val="24"/>
+          <w:sz-cs w:val="24"/>
+          <w:color w:val="181F26"/>
+        </w:rPr>
+        <w:t xml:space="preserve"/>
+        <w:tab/>
+        <w:t xml:space="preserve">•</w:t>
+        <w:tab/>
+        <w:t xml:space="preserve"/>
+      </w:r>
+      <w:r>
+        <w:rPr>
+          <w:rFonts w:ascii="Helvetica Neue" w:hAnsi="Helvetica Neue" w:cs="Helvetica Neue"/>
+          <w:sz w:val="24"/>
+          <w:sz-cs w:val="24"/>
+          <w:spacing w:val="0"/>
+          <w:color w:val="181F26"/>
+        </w:rPr>
+        <w:t xml:space="preserve">harnesses are selected execution surfaces</w:t>
+      </w:r>
+    </w:p>
+    <w:p>
+      <w:pPr>
+        <w:ind w:left="720" w:first-line="-720"/>
+      </w:pPr>
+      <w:r>
+        <w:rPr>
+          <w:rFonts w:ascii="Helvetica Neue" w:hAnsi="Helvetica Neue" w:cs="Helvetica Neue"/>
+          <w:sz w:val="24"/>
+          <w:sz-cs w:val="24"/>
+          <w:color w:val="181F26"/>
+        </w:rPr>
+        <w:t xml:space="preserve"/>
+        <w:tab/>
+        <w:t xml:space="preserve">•</w:t>
+        <w:tab/>
+        <w:t xml:space="preserve"/>
+      </w:r>
+      <w:r>
+        <w:rPr>
+          <w:rFonts w:ascii="Helvetica Neue" w:hAnsi="Helvetica Neue" w:cs="Helvetica Neue"/>
+          <w:sz w:val="24"/>
+          <w:sz-cs w:val="24"/>
+          <w:spacing w:val="0"/>
+          <w:color w:val="181F26"/>
+        </w:rPr>
+        <w:t xml:space="preserve">remote agents are treaty-governed delegation targets</w:t>
+      </w:r>
+    </w:p>
+    <w:p>
+      <w:pPr>
+        <w:ind w:left="720" w:first-line="-720"/>
+      </w:pPr>
+      <w:r>
+        <w:rPr>
+          <w:rFonts w:ascii="Helvetica Neue" w:hAnsi="Helvetica Neue" w:cs="Helvetica Neue"/>
+          <w:sz w:val="24"/>
+          <w:sz-cs w:val="24"/>
+          <w:color w:val="181F26"/>
+        </w:rPr>
+        <w:t xml:space="preserve"/>
+        <w:tab/>
+        <w:t xml:space="preserve">•</w:t>
+        <w:tab/>
+        <w:t xml:space="preserve"/>
+      </w:r>
+      <w:r>
+        <w:rPr>
+          <w:rFonts w:ascii="Helvetica Neue" w:hAnsi="Helvetica Neue" w:cs="Helvetica Neue"/>
+          <w:sz w:val="24"/>
+          <w:sz-cs w:val="24"/>
+          <w:spacing w:val="0"/>
+          <w:color w:val="181F26"/>
+        </w:rPr>
+        <w:t xml:space="preserve">doctrine still applies, but treaties decide whether cross-system delegation is allowed at all</w:t>
+      </w:r>
+    </w:p>
+    <w:p>
+      <w:pPr>
+        <w:ind w:left="720" w:first-line="-720"/>
+      </w:pPr>
+      <w:r>
+        <w:rPr>
+          <w:rFonts w:ascii="Helvetica Neue" w:hAnsi="Helvetica Neue" w:cs="Helvetica Neue"/>
+          <w:sz w:val="24"/>
+          <w:sz-cs w:val="24"/>
+          <w:color w:val="181F26"/>
+        </w:rPr>
+        <w:t xml:space="preserve"/>
+        <w:tab/>
+        <w:t xml:space="preserve">•</w:t>
+        <w:tab/>
+        <w:t xml:space="preserve"/>
+      </w:r>
+      <w:r>
+        <w:rPr>
+          <w:rFonts w:ascii="Helvetica Neue" w:hAnsi="Helvetica Neue" w:cs="Helvetica Neue"/>
+          <w:sz w:val="24"/>
+          <w:sz-cs w:val="24"/>
+          <w:spacing w:val="0"/>
+          <w:color w:val="181F26"/>
+        </w:rPr>
+        <w:t xml:space="preserve">remote task lineage, remote principal identity, and delegation receipts must remain inspectable</w:t>
+      </w:r>
+    </w:p>
+    <w:p>
+      <w:pPr>
+        <w:spacing w:after="240"/>
+      </w:pPr>
+      <w:r>
+        <w:rPr>
+          <w:rFonts w:ascii="Helvetica Neue" w:hAnsi="Helvetica Neue" w:cs="Helvetica Neue"/>
+          <w:sz w:val="24"/>
+          <w:sz-cs w:val="24"/>
+          <w:spacing w:val="0"/>
+          <w:color w:val="181F26"/>
+        </w:rPr>
+        <w:t xml:space="preserve">That is why the project is </w:t>
+      </w:r>
       <w:r>
         <w:rPr>
           <w:rFonts w:ascii="Helvetica Neue" w:hAnsi="Helvetica Neue" w:cs="Helvetica Neue"/>
           <w:sz w:val="24"/>
           <w:sz-cs w:val="24"/>
           <w:b/>
-          <w:color w:val="181F26"/>
-        </w:rPr>
-        <w:t xml:space="preserve"/>
-        <w:tab/>
-        <w:t xml:space="preserve">•</w:t>
-        <w:tab/>
-        <w:t xml:space="preserve"/>
-      </w:r>
-      <w:r>
-        <w:rPr>
-          <w:rFonts w:ascii="Helvetica Neue" w:hAnsi="Helvetica Neue" w:cs="Helvetica Neue"/>
-          <w:sz w:val="24"/>
-          <w:sz-cs w:val="24"/>
-          <w:b/>
-          <w:spacing w:val="0"/>
-          <w:color w:val="181F26"/>
-        </w:rPr>
-        <w:t xml:space="preserve">Lifecycle</w:t>
-      </w:r>
-      <w:r>
-        <w:rPr>
-          <w:rFonts w:ascii="Helvetica Neue" w:hAnsi="Helvetica Neue" w:cs="Helvetica Neue"/>
-          <w:sz w:val="24"/>
-          <w:sz-cs w:val="24"/>
-          <w:spacing w:val="0"/>
-          <w:color w:val="181F26"/>
-        </w:rPr>
-        <w:t xml:space="preserve">: agents are supervised resources with desired state, health, drain behavior, degraded profiles, and recovery rules.</w:t>
-      </w:r>
-    </w:p>
-    <w:p>
-      <w:pPr>
-        <w:ind w:left="720" w:first-line="-720"/>
-      </w:pPr>
-      <w:r>
-        <w:rPr>
-          <w:rFonts w:ascii="Helvetica Neue" w:hAnsi="Helvetica Neue" w:cs="Helvetica Neue"/>
-          <w:sz w:val="24"/>
-          <w:sz-cs w:val="24"/>
-          <w:b/>
-          <w:color w:val="181F26"/>
-        </w:rPr>
-        <w:t xml:space="preserve"/>
-        <w:tab/>
-        <w:t xml:space="preserve">•</w:t>
-        <w:tab/>
-        <w:t xml:space="preserve"/>
-      </w:r>
-      <w:r>
-        <w:rPr>
-          <w:rFonts w:ascii="Helvetica Neue" w:hAnsi="Helvetica Neue" w:cs="Helvetica Neue"/>
-          <w:sz w:val="24"/>
-          <w:sz-cs w:val="24"/>
-          <w:b/>
-          <w:spacing w:val="0"/>
-          <w:color w:val="181F26"/>
-        </w:rPr>
-        <w:t xml:space="preserve">Contracts</w:t>
-      </w:r>
-      <w:r>
-        <w:rPr>
-          <w:rFonts w:ascii="Helvetica Neue" w:hAnsi="Helvetica Neue" w:cs="Helvetica Neue"/>
-          <w:sz w:val="24"/>
-          <w:sz-cs w:val="24"/>
-          <w:spacing w:val="0"/>
-          <w:color w:val="181F26"/>
-        </w:rPr>
-        <w:t xml:space="preserve">: deadlines, budgets, approval rules, mutation mode, and fallback policy are compiled into runtime behavior.</w:t>
-      </w:r>
-    </w:p>
-    <w:p>
-      <w:pPr>
-        <w:ind w:left="720" w:first-line="-720"/>
-      </w:pPr>
-      <w:r>
-        <w:rPr>
-          <w:rFonts w:ascii="Helvetica Neue" w:hAnsi="Helvetica Neue" w:cs="Helvetica Neue"/>
-          <w:sz w:val="24"/>
-          <w:sz-cs w:val="24"/>
-          <w:b/>
-          <w:color w:val="181F26"/>
-        </w:rPr>
-        <w:t xml:space="preserve"/>
-        <w:tab/>
-        <w:t xml:space="preserve">•</w:t>
-        <w:tab/>
-        <w:t xml:space="preserve"/>
-      </w:r>
-      <w:r>
-        <w:rPr>
-          <w:rFonts w:ascii="Helvetica Neue" w:hAnsi="Helvetica Neue" w:cs="Helvetica Neue"/>
-          <w:sz w:val="24"/>
-          <w:sz-cs w:val="24"/>
-          <w:b/>
-          <w:spacing w:val="0"/>
-          <w:color w:val="181F26"/>
-        </w:rPr>
-        <w:t xml:space="preserve">Governance</w:t>
-      </w:r>
-      <w:r>
-        <w:rPr>
-          <w:rFonts w:ascii="Helvetica Neue" w:hAnsi="Helvetica Neue" w:cs="Helvetica Neue"/>
-          <w:sz w:val="24"/>
-          <w:sz-cs w:val="24"/>
-          <w:spacing w:val="0"/>
-          <w:color w:val="181F26"/>
-        </w:rPr>
-        <w:t xml:space="preserve">: same-device foreign-owner encounters are classified, constrained, auditable, and revocable.</w:t>
-      </w:r>
-    </w:p>
-    <w:p>
-      <w:pPr>
-        <w:ind w:left="720" w:first-line="-720"/>
-      </w:pPr>
-      <w:r>
-        <w:rPr>
-          <w:rFonts w:ascii="Helvetica Neue" w:hAnsi="Helvetica Neue" w:cs="Helvetica Neue"/>
-          <w:sz w:val="24"/>
-          <w:sz-cs w:val="24"/>
-          <w:b/>
-          <w:color w:val="181F26"/>
-        </w:rPr>
-        <w:t xml:space="preserve"/>
-        <w:tab/>
-        <w:t xml:space="preserve">•</w:t>
-        <w:tab/>
-        <w:t xml:space="preserve"/>
-      </w:r>
-      <w:r>
-        <w:rPr>
-          <w:rFonts w:ascii="Helvetica Neue" w:hAnsi="Helvetica Neue" w:cs="Helvetica Neue"/>
-          <w:sz w:val="24"/>
-          <w:sz-cs w:val="24"/>
-          <w:b/>
-          <w:spacing w:val="0"/>
-          <w:color w:val="181F26"/>
-        </w:rPr>
-        <w:t xml:space="preserve">Continuity</w:t>
-      </w:r>
-      <w:r>
-        <w:rPr>
-          <w:rFonts w:ascii="Helvetica Neue" w:hAnsi="Helvetica Neue" w:cs="Helvetica Neue"/>
-          <w:sz w:val="24"/>
-          <w:sz-cs w:val="24"/>
-          <w:spacing w:val="0"/>
-          <w:color w:val="181F26"/>
-        </w:rPr>
-        <w:t xml:space="preserve">: when a model route or harness disappears, the swarm contracts into deterministic work, store-and-forward, or handoff instead of vanishing behind retries.</w:t>
-      </w:r>
-    </w:p>
-    <w:p>
-      <w:pPr>
-        <w:ind w:left="720" w:first-line="-720"/>
-      </w:pPr>
-      <w:r>
-        <w:rPr>
-          <w:rFonts w:ascii="Helvetica Neue" w:hAnsi="Helvetica Neue" w:cs="Helvetica Neue"/>
-          <w:sz w:val="24"/>
-          <w:sz-cs w:val="24"/>
-          <w:b/>
-          <w:color w:val="181F26"/>
-        </w:rPr>
-        <w:t xml:space="preserve"/>
-        <w:tab/>
-        <w:t xml:space="preserve">•</w:t>
-        <w:tab/>
-        <w:t xml:space="preserve"/>
-      </w:r>
-      <w:r>
-        <w:rPr>
-          <w:rFonts w:ascii="Helvetica Neue" w:hAnsi="Helvetica Neue" w:cs="Helvetica Neue"/>
-          <w:sz w:val="24"/>
-          <w:sz-cs w:val="24"/>
-          <w:b/>
-          <w:spacing w:val="0"/>
-          <w:color w:val="181F26"/>
-        </w:rPr>
-        <w:t xml:space="preserve">Verification</w:t>
-      </w:r>
-      <w:r>
-        <w:rPr>
-          <w:rFonts w:ascii="Helvetica Neue" w:hAnsi="Helvetica Neue" w:cs="Helvetica Neue"/>
-          <w:sz w:val="24"/>
-          <w:sz-cs w:val="24"/>
-          <w:spacing w:val="0"/>
-          <w:color w:val="181F26"/>
-        </w:rPr>
-        <w:t xml:space="preserve">: success is not whatever a model claims. Verification-sensitive work runs under deterministic checks and bounded retry budgets.</w:t>
-      </w:r>
-    </w:p>
-    <w:p>
-      <w:pPr>
-        <w:ind w:left="720" w:first-line="-720"/>
-      </w:pPr>
-      <w:r>
-        <w:rPr>
-          <w:rFonts w:ascii="Helvetica Neue" w:hAnsi="Helvetica Neue" w:cs="Helvetica Neue"/>
-          <w:sz w:val="24"/>
-          <w:sz-cs w:val="24"/>
-          <w:b/>
-          <w:color w:val="181F26"/>
-        </w:rPr>
-        <w:t xml:space="preserve"/>
-        <w:tab/>
-        <w:t xml:space="preserve">•</w:t>
-        <w:tab/>
-        <w:t xml:space="preserve"/>
-      </w:r>
-      <w:r>
-        <w:rPr>
-          <w:rFonts w:ascii="Helvetica Neue" w:hAnsi="Helvetica Neue" w:cs="Helvetica Neue"/>
-          <w:sz w:val="24"/>
-          <w:sz-cs w:val="24"/>
-          <w:b/>
-          <w:spacing w:val="0"/>
-          <w:color w:val="181F26"/>
-        </w:rPr>
-        <w:t xml:space="preserve">Inspection</w:t>
-      </w:r>
-      <w:r>
-        <w:rPr>
-          <w:rFonts w:ascii="Helvetica Neue" w:hAnsi="Helvetica Neue" w:cs="Helvetica Neue"/>
-          <w:sz w:val="24"/>
-          <w:sz-cs w:val="24"/>
-          <w:spacing w:val="0"/>
-          <w:color w:val="181F26"/>
-        </w:rPr>
-        <w:t xml:space="preserve">: actions expose phase, artifacts, checkpoints, external refs, event lineage, governance metadata, and operator-readable failure codes.</w:t>
+          <w:spacing w:val="0"/>
+          <w:color w:val="181F26"/>
+        </w:rPr>
+        <w:t xml:space="preserve">Rust-first, not Rust-only</w:t>
+      </w:r>
+      <w:r>
+        <w:rPr>
+          <w:rFonts w:ascii="Helvetica Neue" w:hAnsi="Helvetica Neue" w:cs="Helvetica Neue"/>
+          <w:sz w:val="24"/>
+          <w:sz-cs w:val="24"/>
+          <w:spacing w:val="0"/>
+          <w:color w:val="181F26"/>
+        </w:rPr>
+        <w:t xml:space="preserve">:</w:t>
+      </w:r>
+    </w:p>
+    <w:p>
+      <w:pPr>
+        <w:ind w:left="720" w:first-line="-720"/>
+      </w:pPr>
+      <w:r>
+        <w:rPr>
+          <w:rFonts w:ascii="Menlo" w:hAnsi="Menlo" w:cs="Menlo"/>
+          <w:sz w:val="24"/>
+          <w:sz-cs w:val="24"/>
+          <w:color w:val="181F26"/>
+        </w:rPr>
+        <w:t xml:space="preserve"/>
+        <w:tab/>
+        <w:t xml:space="preserve">•</w:t>
+        <w:tab/>
+        <w:t xml:space="preserve"/>
+      </w:r>
+      <w:r>
+        <w:rPr>
+          <w:rFonts w:ascii="Menlo" w:hAnsi="Menlo" w:cs="Menlo"/>
+          <w:sz w:val="24"/>
+          <w:sz-cs w:val="24"/>
+          <w:spacing w:val="0"/>
+          <w:color w:val="181F26"/>
+        </w:rPr>
+        <w:t xml:space="preserve">crates/</w:t>
+      </w:r>
+      <w:r>
+        <w:rPr>
+          <w:rFonts w:ascii="Helvetica Neue" w:hAnsi="Helvetica Neue" w:cs="Helvetica Neue"/>
+          <w:sz w:val="24"/>
+          <w:sz-cs w:val="24"/>
+          <w:spacing w:val="0"/>
+          <w:color w:val="181F26"/>
+        </w:rPr>
+        <w:t xml:space="preserve"> is the implementation spine for the runtime, control plane, storage, and native outbound adapters.</w:t>
+      </w:r>
+    </w:p>
+    <w:p>
+      <w:pPr>
+        <w:ind w:left="720" w:first-line="-720"/>
+      </w:pPr>
+      <w:r>
+        <w:rPr>
+          <w:rFonts w:ascii="Menlo" w:hAnsi="Menlo" w:cs="Menlo"/>
+          <w:sz w:val="24"/>
+          <w:sz-cs w:val="24"/>
+          <w:color w:val="181F26"/>
+        </w:rPr>
+        <w:t xml:space="preserve"/>
+        <w:tab/>
+        <w:t xml:space="preserve">•</w:t>
+        <w:tab/>
+        <w:t xml:space="preserve"/>
+      </w:r>
+      <w:r>
+        <w:rPr>
+          <w:rFonts w:ascii="Menlo" w:hAnsi="Menlo" w:cs="Menlo"/>
+          <w:sz w:val="24"/>
+          <w:sz-cs w:val="24"/>
+          <w:spacing w:val="0"/>
+          <w:color w:val="181F26"/>
+        </w:rPr>
+        <w:t xml:space="preserve">integrations/</w:t>
+      </w:r>
+      <w:r>
+        <w:rPr>
+          <w:rFonts w:ascii="Helvetica Neue" w:hAnsi="Helvetica Neue" w:cs="Helvetica Neue"/>
+          <w:sz w:val="24"/>
+          <w:sz-cs w:val="24"/>
+          <w:spacing w:val="0"/>
+          <w:color w:val="181F26"/>
+        </w:rPr>
+        <w:t xml:space="preserve"> is the edge zone for isolated bridge packages where a non-Rust implementation is pragmatic.</w:t>
+      </w:r>
+    </w:p>
+    <w:p>
+      <w:pPr>
+        <w:ind w:left="720" w:first-line="-720"/>
+      </w:pPr>
+      <w:r>
+        <w:rPr>
+          <w:rFonts w:ascii="Helvetica Neue" w:hAnsi="Helvetica Neue" w:cs="Helvetica Neue"/>
+          <w:sz w:val="24"/>
+          <w:sz-cs w:val="24"/>
+          <w:color w:val="181F26"/>
+        </w:rPr>
+        <w:t xml:space="preserve"/>
+        <w:tab/>
+        <w:t xml:space="preserve">•</w:t>
+        <w:tab/>
+        <w:t xml:space="preserve"/>
+      </w:r>
+      <w:r>
+        <w:rPr>
+          <w:rFonts w:ascii="Helvetica Neue" w:hAnsi="Helvetica Neue" w:cs="Helvetica Neue"/>
+          <w:sz w:val="24"/>
+          <w:sz-cs w:val="24"/>
+          <w:spacing w:val="0"/>
+          <w:color w:val="181F26"/>
+        </w:rPr>
+        <w:t xml:space="preserve">The current example is </w:t>
+      </w:r>
+      <w:r>
+        <w:rPr>
+          <w:rFonts w:ascii="Menlo" w:hAnsi="Menlo" w:cs="Menlo"/>
+          <w:sz w:val="24"/>
+          <w:sz-cs w:val="24"/>
+          <w:u w:val="single"/>
+          <w:spacing w:val="0"/>
+          <w:color w:val="0000E9"/>
+        </w:rPr>
+        <w:t xml:space="preserve">integrations/openclaw-inbound/</w:t>
+      </w:r>
+      <w:r>
+        <w:rPr>
+          <w:rFonts w:ascii="Helvetica Neue" w:hAnsi="Helvetica Neue" w:cs="Helvetica Neue"/>
+          <w:sz w:val="24"/>
+          <w:sz-cs w:val="24"/>
+          <w:spacing w:val="0"/>
+          <w:color w:val="181F26"/>
+        </w:rPr>
+        <w:t xml:space="preserve">, a thin TypeScript ingress bridge. The policy engine, lifecycle authority, storage, and runtime decisions remain in Rust.</w:t>
       </w:r>
     </w:p>
     <w:p>
@@ -1933,6 +1898,277 @@
           <w:spacing w:val="0"/>
           <w:color w:val="102C4B"/>
         </w:rPr>
+        <w:t xml:space="preserve">What The Control Plane Enforces</w:t>
+      </w:r>
+    </w:p>
+    <w:p>
+      <w:pPr>
+        <w:spacing w:after="240"/>
+      </w:pPr>
+      <w:r>
+        <w:rPr>
+          <w:rFonts w:ascii="Helvetica Neue" w:hAnsi="Helvetica Neue" w:cs="Helvetica Neue"/>
+          <w:sz w:val="24"/>
+          <w:sz-cs w:val="24"/>
+          <w:spacing w:val="0"/>
+          <w:color w:val="181F26"/>
+        </w:rPr>
+        <w:t xml:space="preserve">Crawfish is opinionated about what must survive model churn.</w:t>
+      </w:r>
+    </w:p>
+    <w:p>
+      <w:pPr>
+        <w:ind w:left="720" w:first-line="-720"/>
+      </w:pPr>
+      <w:r>
+        <w:rPr>
+          <w:rFonts w:ascii="Helvetica Neue" w:hAnsi="Helvetica Neue" w:cs="Helvetica Neue"/>
+          <w:sz w:val="24"/>
+          <w:sz-cs w:val="24"/>
+          <w:b/>
+          <w:color w:val="181F26"/>
+        </w:rPr>
+        <w:t xml:space="preserve"/>
+        <w:tab/>
+        <w:t xml:space="preserve">•</w:t>
+        <w:tab/>
+        <w:t xml:space="preserve"/>
+      </w:r>
+      <w:r>
+        <w:rPr>
+          <w:rFonts w:ascii="Helvetica Neue" w:hAnsi="Helvetica Neue" w:cs="Helvetica Neue"/>
+          <w:sz w:val="24"/>
+          <w:sz-cs w:val="24"/>
+          <w:b/>
+          <w:spacing w:val="0"/>
+          <w:color w:val="181F26"/>
+        </w:rPr>
+        <w:t xml:space="preserve">Lifecycle</w:t>
+      </w:r>
+      <w:r>
+        <w:rPr>
+          <w:rFonts w:ascii="Helvetica Neue" w:hAnsi="Helvetica Neue" w:cs="Helvetica Neue"/>
+          <w:sz w:val="24"/>
+          <w:sz-cs w:val="24"/>
+          <w:spacing w:val="0"/>
+          <w:color w:val="181F26"/>
+        </w:rPr>
+        <w:t xml:space="preserve">: agents are supervised resources with desired state, health, drain behavior, degraded profiles, and recovery rules.</w:t>
+      </w:r>
+    </w:p>
+    <w:p>
+      <w:pPr>
+        <w:ind w:left="720" w:first-line="-720"/>
+      </w:pPr>
+      <w:r>
+        <w:rPr>
+          <w:rFonts w:ascii="Helvetica Neue" w:hAnsi="Helvetica Neue" w:cs="Helvetica Neue"/>
+          <w:sz w:val="24"/>
+          <w:sz-cs w:val="24"/>
+          <w:b/>
+          <w:color w:val="181F26"/>
+        </w:rPr>
+        <w:t xml:space="preserve"/>
+        <w:tab/>
+        <w:t xml:space="preserve">•</w:t>
+        <w:tab/>
+        <w:t xml:space="preserve"/>
+      </w:r>
+      <w:r>
+        <w:rPr>
+          <w:rFonts w:ascii="Helvetica Neue" w:hAnsi="Helvetica Neue" w:cs="Helvetica Neue"/>
+          <w:sz w:val="24"/>
+          <w:sz-cs w:val="24"/>
+          <w:b/>
+          <w:spacing w:val="0"/>
+          <w:color w:val="181F26"/>
+        </w:rPr>
+        <w:t xml:space="preserve">Contracts</w:t>
+      </w:r>
+      <w:r>
+        <w:rPr>
+          <w:rFonts w:ascii="Helvetica Neue" w:hAnsi="Helvetica Neue" w:cs="Helvetica Neue"/>
+          <w:sz w:val="24"/>
+          <w:sz-cs w:val="24"/>
+          <w:spacing w:val="0"/>
+          <w:color w:val="181F26"/>
+        </w:rPr>
+        <w:t xml:space="preserve">: deadlines, budgets, approval rules, mutation mode, and fallback policy are compiled into runtime behavior.</w:t>
+      </w:r>
+    </w:p>
+    <w:p>
+      <w:pPr>
+        <w:ind w:left="720" w:first-line="-720"/>
+      </w:pPr>
+      <w:r>
+        <w:rPr>
+          <w:rFonts w:ascii="Helvetica Neue" w:hAnsi="Helvetica Neue" w:cs="Helvetica Neue"/>
+          <w:sz w:val="24"/>
+          <w:sz-cs w:val="24"/>
+          <w:b/>
+          <w:color w:val="181F26"/>
+        </w:rPr>
+        <w:t xml:space="preserve"/>
+        <w:tab/>
+        <w:t xml:space="preserve">•</w:t>
+        <w:tab/>
+        <w:t xml:space="preserve"/>
+      </w:r>
+      <w:r>
+        <w:rPr>
+          <w:rFonts w:ascii="Helvetica Neue" w:hAnsi="Helvetica Neue" w:cs="Helvetica Neue"/>
+          <w:sz w:val="24"/>
+          <w:sz-cs w:val="24"/>
+          <w:b/>
+          <w:spacing w:val="0"/>
+          <w:color w:val="181F26"/>
+        </w:rPr>
+        <w:t xml:space="preserve">Governance</w:t>
+      </w:r>
+      <w:r>
+        <w:rPr>
+          <w:rFonts w:ascii="Helvetica Neue" w:hAnsi="Helvetica Neue" w:cs="Helvetica Neue"/>
+          <w:sz w:val="24"/>
+          <w:sz-cs w:val="24"/>
+          <w:spacing w:val="0"/>
+          <w:color w:val="181F26"/>
+        </w:rPr>
+        <w:t xml:space="preserve">: same-device foreign-owner encounters are classified, constrained, auditable, and revocable.</w:t>
+      </w:r>
+    </w:p>
+    <w:p>
+      <w:pPr>
+        <w:ind w:left="720" w:first-line="-720"/>
+      </w:pPr>
+      <w:r>
+        <w:rPr>
+          <w:rFonts w:ascii="Helvetica Neue" w:hAnsi="Helvetica Neue" w:cs="Helvetica Neue"/>
+          <w:sz w:val="24"/>
+          <w:sz-cs w:val="24"/>
+          <w:b/>
+          <w:color w:val="181F26"/>
+        </w:rPr>
+        <w:t xml:space="preserve"/>
+        <w:tab/>
+        <w:t xml:space="preserve">•</w:t>
+        <w:tab/>
+        <w:t xml:space="preserve"/>
+      </w:r>
+      <w:r>
+        <w:rPr>
+          <w:rFonts w:ascii="Helvetica Neue" w:hAnsi="Helvetica Neue" w:cs="Helvetica Neue"/>
+          <w:sz w:val="24"/>
+          <w:sz-cs w:val="24"/>
+          <w:b/>
+          <w:spacing w:val="0"/>
+          <w:color w:val="181F26"/>
+        </w:rPr>
+        <w:t xml:space="preserve">Continuity</w:t>
+      </w:r>
+      <w:r>
+        <w:rPr>
+          <w:rFonts w:ascii="Helvetica Neue" w:hAnsi="Helvetica Neue" w:cs="Helvetica Neue"/>
+          <w:sz w:val="24"/>
+          <w:sz-cs w:val="24"/>
+          <w:spacing w:val="0"/>
+          <w:color w:val="181F26"/>
+        </w:rPr>
+        <w:t xml:space="preserve">: when a model route or harness disappears, the swarm contracts into deterministic work, store-and-forward, or handoff instead of vanishing behind retries.</w:t>
+      </w:r>
+    </w:p>
+    <w:p>
+      <w:pPr>
+        <w:ind w:left="720" w:first-line="-720"/>
+      </w:pPr>
+      <w:r>
+        <w:rPr>
+          <w:rFonts w:ascii="Helvetica Neue" w:hAnsi="Helvetica Neue" w:cs="Helvetica Neue"/>
+          <w:sz w:val="24"/>
+          <w:sz-cs w:val="24"/>
+          <w:b/>
+          <w:color w:val="181F26"/>
+        </w:rPr>
+        <w:t xml:space="preserve"/>
+        <w:tab/>
+        <w:t xml:space="preserve">•</w:t>
+        <w:tab/>
+        <w:t xml:space="preserve"/>
+      </w:r>
+      <w:r>
+        <w:rPr>
+          <w:rFonts w:ascii="Helvetica Neue" w:hAnsi="Helvetica Neue" w:cs="Helvetica Neue"/>
+          <w:sz w:val="24"/>
+          <w:sz-cs w:val="24"/>
+          <w:b/>
+          <w:spacing w:val="0"/>
+          <w:color w:val="181F26"/>
+        </w:rPr>
+        <w:t xml:space="preserve">Verification</w:t>
+      </w:r>
+      <w:r>
+        <w:rPr>
+          <w:rFonts w:ascii="Helvetica Neue" w:hAnsi="Helvetica Neue" w:cs="Helvetica Neue"/>
+          <w:sz w:val="24"/>
+          <w:sz-cs w:val="24"/>
+          <w:spacing w:val="0"/>
+          <w:color w:val="181F26"/>
+        </w:rPr>
+        <w:t xml:space="preserve">: success is not whatever a model claims. Verification-sensitive work runs under deterministic checks and bounded retry budgets.</w:t>
+      </w:r>
+    </w:p>
+    <w:p>
+      <w:pPr>
+        <w:ind w:left="720" w:first-line="-720"/>
+      </w:pPr>
+      <w:r>
+        <w:rPr>
+          <w:rFonts w:ascii="Helvetica Neue" w:hAnsi="Helvetica Neue" w:cs="Helvetica Neue"/>
+          <w:sz w:val="24"/>
+          <w:sz-cs w:val="24"/>
+          <w:b/>
+          <w:color w:val="181F26"/>
+        </w:rPr>
+        <w:t xml:space="preserve"/>
+        <w:tab/>
+        <w:t xml:space="preserve">•</w:t>
+        <w:tab/>
+        <w:t xml:space="preserve"/>
+      </w:r>
+      <w:r>
+        <w:rPr>
+          <w:rFonts w:ascii="Helvetica Neue" w:hAnsi="Helvetica Neue" w:cs="Helvetica Neue"/>
+          <w:sz w:val="24"/>
+          <w:sz-cs w:val="24"/>
+          <w:b/>
+          <w:spacing w:val="0"/>
+          <w:color w:val="181F26"/>
+        </w:rPr>
+        <w:t xml:space="preserve">Inspection</w:t>
+      </w:r>
+      <w:r>
+        <w:rPr>
+          <w:rFonts w:ascii="Helvetica Neue" w:hAnsi="Helvetica Neue" w:cs="Helvetica Neue"/>
+          <w:sz w:val="24"/>
+          <w:sz-cs w:val="24"/>
+          <w:spacing w:val="0"/>
+          <w:color w:val="181F26"/>
+        </w:rPr>
+        <w:t xml:space="preserve">: actions expose phase, artifacts, checkpoints, external refs, event lineage, governance metadata, and operator-readable failure codes.</w:t>
+      </w:r>
+    </w:p>
+    <w:p>
+      <w:pPr>
+        <w:spacing w:after="197"/>
+      </w:pPr>
+      <w:r>
+        <w:rPr>
+          <w:rFonts w:ascii="Helvetica Neue" w:hAnsi="Helvetica Neue" w:cs="Helvetica Neue"/>
+          <w:sz w:val="44"/>
+          <w:sz-cs w:val="44"/>
+          <w:b/>
+          <w:spacing w:val="0"/>
+          <w:color w:val="102C4B"/>
+        </w:rPr>
         <w:t xml:space="preserve">What Runs Today</w:t>
       </w:r>
     </w:p>
@@ -2442,7 +2678,88 @@
           <w:spacing w:val="0"/>
           <w:color w:val="181F26"/>
         </w:rPr>
-        <w:t xml:space="preserve"> now prefers local Claude Code and Codex wrappers before any remote harness route</w:t>
+        <w:t xml:space="preserve"> now prefers local Claude Code and Codex wrappers before any remote route</w:t>
+      </w:r>
+    </w:p>
+    <w:p>
+      <w:pPr>
+        <w:ind w:left="720" w:first-line="-720"/>
+      </w:pPr>
+      <w:r>
+        <w:rPr>
+          <w:rFonts w:ascii="Helvetica Neue" w:hAnsi="Helvetica Neue" w:cs="Helvetica Neue"/>
+          <w:sz w:val="24"/>
+          <w:sz-cs w:val="24"/>
+          <w:b/>
+          <w:color w:val="181F26"/>
+        </w:rPr>
+        <w:t xml:space="preserve"/>
+        <w:tab/>
+        <w:t xml:space="preserve">•</w:t>
+        <w:tab/>
+        <w:t xml:space="preserve"/>
+      </w:r>
+      <w:r>
+        <w:rPr>
+          <w:rFonts w:ascii="Helvetica Neue" w:hAnsi="Helvetica Neue" w:cs="Helvetica Neue"/>
+          <w:sz w:val="24"/>
+          <w:sz-cs w:val="24"/>
+          <w:b/>
+          <w:spacing w:val="0"/>
+          <w:color w:val="181F26"/>
+        </w:rPr>
+        <w:t xml:space="preserve">A2A outbound remote delegation</w:t>
+      </w:r>
+      <w:r>
+        <w:rPr>
+          <w:rFonts w:ascii="Helvetica Neue" w:hAnsi="Helvetica Neue" w:cs="Helvetica Neue"/>
+          <w:sz w:val="24"/>
+          <w:sz-cs w:val="24"/>
+          <w:spacing w:val="0"/>
+          <w:color w:val="181F26"/>
+        </w:rPr>
+        <w:t xml:space="preserve">: </w:t>
+      </w:r>
+      <w:r>
+        <w:rPr>
+          <w:rFonts w:ascii="Menlo" w:hAnsi="Menlo" w:cs="Menlo"/>
+          <w:sz w:val="24"/>
+          <w:sz-cs w:val="24"/>
+          <w:spacing w:val="0"/>
+          <w:color w:val="181F26"/>
+        </w:rPr>
+        <w:t xml:space="preserve">task.plan</w:t>
+      </w:r>
+      <w:r>
+        <w:rPr>
+          <w:rFonts w:ascii="Helvetica Neue" w:hAnsi="Helvetica Neue" w:cs="Helvetica Neue"/>
+          <w:sz w:val="24"/>
+          <w:sz-cs w:val="24"/>
+          <w:spacing w:val="0"/>
+          <w:color w:val="181F26"/>
+        </w:rPr>
+        <w:t xml:space="preserve"> can delegate to a remote agent over </w:t>
+      </w:r>
+      <w:r>
+        <w:rPr>
+          <w:rFonts w:ascii="Helvetica Neue" w:hAnsi="Helvetica Neue" w:cs="Helvetica Neue"/>
+          <w:sz w:val="24"/>
+          <w:sz-cs w:val="24"/>
+          <w:u w:val="single"/>
+          <w:spacing w:val="0"/>
+          <w:color w:val="0000E9"/>
+        </w:rPr>
+        <w:t xml:space="preserve">A2A</w:t>
+      </w:r>
+      <w:r>
+        <w:rPr>
+          <w:rFonts w:ascii="Helvetica Neue" w:hAnsi="Helvetica Neue" w:cs="Helvetica Neue"/>
+          <w:sz w:val="24"/>
+          <w:sz-cs w:val="24"/>
+          <w:spacing w:val="0"/>
+          <w:color w:val="181F26"/>
+        </w:rPr>
+        <w:t xml:space="preserve"> when a treaty pack allows it</w:t>
       </w:r>
     </w:p>
     <w:p>
@@ -4722,7 +5039,7 @@
           <w:spacing w:val="0"/>
           <w:color w:val="181F26"/>
         </w:rPr>
-        <w:t xml:space="preserve"> will prefer those harnesses first. If neither local wrapper is available, Crawfish falls back to OpenClaw when configured, then to deterministic planning when the contract allows it.</w:t>
+        <w:t xml:space="preserve"> will prefer those harnesses first. If neither local wrapper is available, Crawfish now tries treaty-governed A2A remote delegation before OpenClaw, then falls back to deterministic planning when the contract allows it.</w:t>
       </w:r>
     </w:p>
     <w:p>
@@ -6072,6 +6389,63 @@
           <w:spacing w:val="0"/>
           <w:color w:val="181F26"/>
         </w:rPr>
+        <w:t xml:space="preserve">That also means distinguishing harnesses from remote agent planes. A2A's </w:t>
+      </w:r>
+      <w:r>
+        <w:rPr>
+          <w:rFonts w:ascii="Helvetica Neue" w:hAnsi="Helvetica Neue" w:cs="Helvetica Neue"/>
+          <w:sz w:val="24"/>
+          <w:sz-cs w:val="24"/>
+          <w:u w:val="single"/>
+          <w:spacing w:val="0"/>
+          <w:color w:val="0000E9"/>
+        </w:rPr>
+        <w:t xml:space="preserve">Agent Card</w:t>
+      </w:r>
+      <w:r>
+        <w:rPr>
+          <w:rFonts w:ascii="Helvetica Neue" w:hAnsi="Helvetica Neue" w:cs="Helvetica Neue"/>
+          <w:sz w:val="24"/>
+          <w:sz-cs w:val="24"/>
+          <w:spacing w:val="0"/>
+          <w:color w:val="181F26"/>
+        </w:rPr>
+        <w:t xml:space="preserve"> model and Google's </w:t>
+      </w:r>
+      <w:r>
+        <w:rPr>
+          <w:rFonts w:ascii="Helvetica Neue" w:hAnsi="Helvetica Neue" w:cs="Helvetica Neue"/>
+          <w:sz w:val="24"/>
+          <w:sz-cs w:val="24"/>
+          <w:u w:val="single"/>
+          <w:spacing w:val="0"/>
+          <w:color w:val="0000E9"/>
+        </w:rPr>
+        <w:t xml:space="preserve">"A2A: A New Era of Agent Interoperability"</w:t>
+      </w:r>
+      <w:r>
+        <w:rPr>
+          <w:rFonts w:ascii="Helvetica Neue" w:hAnsi="Helvetica Neue" w:cs="Helvetica Neue"/>
+          <w:sz w:val="24"/>
+          <w:sz-cs w:val="24"/>
+          <w:spacing w:val="0"/>
+          <w:color w:val="181F26"/>
+        </w:rPr>
+        <w:t xml:space="preserve"> launch framing matter here: remote delegation is not just another wrapper. It is a separate authority boundary that requires treaty scope and inspectable delegation evidence.</w:t>
+      </w:r>
+    </w:p>
+    <w:p>
+      <w:pPr>
+        <w:spacing w:after="240"/>
+      </w:pPr>
+      <w:r>
+        <w:rPr>
+          <w:rFonts w:ascii="Helvetica Neue" w:hAnsi="Helvetica Neue" w:cs="Helvetica Neue"/>
+          <w:sz w:val="24"/>
+          <w:sz-cs w:val="24"/>
+          <w:spacing w:val="0"/>
+          <w:color w:val="181F26"/>
+        </w:rPr>
         <w:t xml:space="preserve">This is why Crawfish treats harnesses as execution surfaces:</w:t>
       </w:r>
     </w:p>
@@ -7884,6 +8258,42 @@
     </w:p>
     <w:p>
       <w:pPr>
+        <w:spacing w:after="240"/>
+      </w:pPr>
+      <w:r>
+        <w:rPr>
+          <w:rFonts w:ascii="Helvetica Neue" w:hAnsi="Helvetica Neue" w:cs="Helvetica Neue"/>
+          <w:sz w:val="24"/>
+          <w:sz-cs w:val="24"/>
+          <w:spacing w:val="0"/>
+          <w:color w:val="181F26"/>
+        </w:rPr>
+        <w:t xml:space="preserve">The next frontier after same-device governance is treaty-governed remote delegation. The </w:t>
+      </w:r>
+      <w:r>
+        <w:rPr>
+          <w:rFonts w:ascii="Helvetica Neue" w:hAnsi="Helvetica Neue" w:cs="Helvetica Neue"/>
+          <w:sz w:val="24"/>
+          <w:sz-cs w:val="24"/>
+          <w:u w:val="single"/>
+          <w:spacing w:val="0"/>
+          <w:color w:val="0000E9"/>
+        </w:rPr>
+        <w:t xml:space="preserve">A2A project</w:t>
+      </w:r>
+      <w:r>
+        <w:rPr>
+          <w:rFonts w:ascii="Helvetica Neue" w:hAnsi="Helvetica Neue" w:cs="Helvetica Neue"/>
+          <w:sz w:val="24"/>
+          <w:sz-cs w:val="24"/>
+          <w:spacing w:val="0"/>
+          <w:color w:val="181F26"/>
+        </w:rPr>
+        <w:t xml:space="preserve"> is useful because it provides a task-oriented remote-agent plane, but the runtime still has to decide when delegation is lawful, which treaty pack applies, and which evidence proves the delegation stayed inside scope.</w:t>
+      </w:r>
+    </w:p>
+    <w:p>
+      <w:pPr>
         <w:spacing w:after="197"/>
       </w:pPr>
       <w:r>
@@ -10080,7 +10490,49 @@
           <w:spacing w:val="0"/>
           <w:color w:val="181F26"/>
         </w:rPr>
-        <w:t xml:space="preserve">This framing is more accurate than treating all integrations as generic subprocesses. It also matches the actual product problem: tools, harnesses, and remote agents have different semantics, risk envelopes, and scheduling implications.</w:t>
+        <w:t xml:space="preserve">This framing is more accurate than treating all integrations as generic subprocesses. It also matches the actual product problem: tools, harnesses, and remote agents have different semantics, risk envelopes, and scheduling implications. The </w:t>
+      </w:r>
+      <w:r>
+        <w:rPr>
+          <w:rFonts w:ascii="Helvetica Neue" w:hAnsi="Helvetica Neue" w:cs="Helvetica Neue"/>
+          <w:sz w:val="24"/>
+          <w:sz-cs w:val="24"/>
+          <w:u w:val="single"/>
+          <w:spacing w:val="0"/>
+          <w:color w:val="0000E9"/>
+        </w:rPr>
+        <w:t xml:space="preserve">A2A project</w:t>
+      </w:r>
+      <w:r>
+        <w:rPr>
+          <w:rFonts w:ascii="Helvetica Neue" w:hAnsi="Helvetica Neue" w:cs="Helvetica Neue"/>
+          <w:sz w:val="24"/>
+          <w:sz-cs w:val="24"/>
+          <w:spacing w:val="0"/>
+          <w:color w:val="181F26"/>
+        </w:rPr>
+        <w:t xml:space="preserve"> and Google's </w:t>
+      </w:r>
+      <w:r>
+        <w:rPr>
+          <w:rFonts w:ascii="Helvetica Neue" w:hAnsi="Helvetica Neue" w:cs="Helvetica Neue"/>
+          <w:sz w:val="24"/>
+          <w:sz-cs w:val="24"/>
+          <w:u w:val="single"/>
+          <w:spacing w:val="0"/>
+          <w:color w:val="0000E9"/>
+        </w:rPr>
+        <w:t xml:space="preserve">"A2A: A New Era of Agent Interoperability"</w:t>
+      </w:r>
+      <w:r>
+        <w:rPr>
+          <w:rFonts w:ascii="Helvetica Neue" w:hAnsi="Helvetica Neue" w:cs="Helvetica Neue"/>
+          <w:sz w:val="24"/>
+          <w:sz-cs w:val="24"/>
+          <w:spacing w:val="0"/>
+          <w:color w:val="181F26"/>
+        </w:rPr>
+        <w:t xml:space="preserve"> are the key reference anchors for the remote-agent plane.</w:t>
       </w:r>
     </w:p>
     <w:p>
@@ -10428,6 +10880,34 @@
     </w:p>
     <w:p>
       <w:pPr>
+        <w:ind w:left="720" w:first-line="-720"/>
+      </w:pPr>
+      <w:r>
+        <w:rPr>
+          <w:rFonts w:ascii="Helvetica Neue" w:hAnsi="Helvetica Neue" w:cs="Helvetica Neue"/>
+          <w:sz w:val="24"/>
+          <w:sz-cs w:val="24"/>
+          <w:color w:val="181F26"/>
+        </w:rPr>
+        <w:t xml:space="preserve"/>
+        <w:tab/>
+        <w:t xml:space="preserve">•</w:t>
+        <w:tab/>
+        <w:t xml:space="preserve"/>
+      </w:r>
+      <w:r>
+        <w:rPr>
+          <w:rFonts w:ascii="Helvetica Neue" w:hAnsi="Helvetica Neue" w:cs="Helvetica Neue"/>
+          <w:sz w:val="24"/>
+          <w:sz-cs w:val="24"/>
+          <w:spacing w:val="0"/>
+          <w:color w:val="181F26"/>
+        </w:rPr>
+        <w:t xml:space="preserve">remote delegation is governed separately from harness selection, because a remote agent is another authority boundary rather than just another execution wrapper</w:t>
+      </w:r>
+    </w:p>
+    <w:p>
+      <w:pPr>
         <w:spacing w:after="197"/>
       </w:pPr>
       <w:r>
@@ -22870,7 +23350,7 @@
           <w:spacing w:val="0"/>
           <w:color w:val="DFE8F2"/>
         </w:rPr>
-        <w:t xml:space="preserve">  endpoint: string;</w:t>
+        <w:t xml:space="preserve">  agent_card_url: string;</w:t>
       </w:r>
     </w:p>
     <w:p>
@@ -22883,7 +23363,59 @@
           <w:spacing w:val="0"/>
           <w:color w:val="DFE8F2"/>
         </w:rPr>
-        <w:t xml:space="preserve">  trust_domain: TrustDomain;</w:t>
+        <w:t xml:space="preserve">  auth_ref?: string;</w:t>
+      </w:r>
+    </w:p>
+    <w:p>
+      <w:pPr/>
+      <w:r>
+        <w:rPr>
+          <w:rFonts w:ascii="Menlo" w:hAnsi="Menlo" w:cs="Menlo"/>
+          <w:sz w:val="24"/>
+          <w:sz-cs w:val="24"/>
+          <w:spacing w:val="0"/>
+          <w:color w:val="DFE8F2"/>
+        </w:rPr>
+        <w:t xml:space="preserve">  treaty_pack: string;</w:t>
+      </w:r>
+    </w:p>
+    <w:p>
+      <w:pPr/>
+      <w:r>
+        <w:rPr>
+          <w:rFonts w:ascii="Menlo" w:hAnsi="Menlo" w:cs="Menlo"/>
+          <w:sz w:val="24"/>
+          <w:sz-cs w:val="24"/>
+          <w:spacing w:val="0"/>
+          <w:color w:val="DFE8F2"/>
+        </w:rPr>
+        <w:t xml:space="preserve">  required_scopes: string[];</w:t>
+      </w:r>
+    </w:p>
+    <w:p>
+      <w:pPr/>
+      <w:r>
+        <w:rPr>
+          <w:rFonts w:ascii="Menlo" w:hAnsi="Menlo" w:cs="Menlo"/>
+          <w:sz w:val="24"/>
+          <w:sz-cs w:val="24"/>
+          <w:spacing w:val="0"/>
+          <w:color w:val="DFE8F2"/>
+        </w:rPr>
+        <w:t xml:space="preserve">  streaming_mode: "prefer_streaming" | "poll_only";</w:t>
+      </w:r>
+    </w:p>
+    <w:p>
+      <w:pPr/>
+      <w:r>
+        <w:rPr>
+          <w:rFonts w:ascii="Menlo" w:hAnsi="Menlo" w:cs="Menlo"/>
+          <w:sz w:val="24"/>
+          <w:sz-cs w:val="24"/>
+          <w:spacing w:val="0"/>
+          <w:color w:val="DFE8F2"/>
+        </w:rPr>
+        <w:t xml:space="preserve">  allow_in_task_auth: boolean;</w:t>
       </w:r>
     </w:p>
     <w:p>
@@ -35106,7 +35638,7 @@
           <w:spacing w:val="0"/>
           <w:color w:val="181F26"/>
         </w:rPr>
-        <w:t xml:space="preserve">OpenClaw inbound and outbound paths must reuse the same governance model as future A2A and other remote-agent systems:</w:t>
+        <w:t xml:space="preserve">OpenClaw inbound and outbound paths must reuse the same governance model as A2A and other remote-agent systems:</w:t>
       </w:r>
     </w:p>
     <w:p>
@@ -35262,6 +35794,939 @@
           <w:spacing w:val="0"/>
           <w:color w:val="102C4B"/>
         </w:rPr>
+        <w:t xml:space="preserve">A2A Remote-Agent Delegation</w:t>
+      </w:r>
+    </w:p>
+    <w:p>
+      <w:pPr>
+        <w:spacing w:after="240"/>
+      </w:pPr>
+      <w:r>
+        <w:rPr>
+          <w:rFonts w:ascii="Helvetica Neue" w:hAnsi="Helvetica Neue" w:cs="Helvetica Neue"/>
+          <w:sz w:val="24"/>
+          <w:sz-cs w:val="24"/>
+          <w:spacing w:val="0"/>
+          <w:color w:val="181F26"/>
+        </w:rPr>
+        <w:t xml:space="preserve">A2A is the first implemented remote-agent plane, using the </w:t>
+      </w:r>
+      <w:r>
+        <w:rPr>
+          <w:rFonts w:ascii="Helvetica Neue" w:hAnsi="Helvetica Neue" w:cs="Helvetica Neue"/>
+          <w:sz w:val="24"/>
+          <w:sz-cs w:val="24"/>
+          <w:u w:val="single"/>
+          <w:spacing w:val="0"/>
+          <w:color w:val="0000E9"/>
+        </w:rPr>
+        <w:t xml:space="preserve">A2A project</w:t>
+      </w:r>
+      <w:r>
+        <w:rPr>
+          <w:rFonts w:ascii="Helvetica Neue" w:hAnsi="Helvetica Neue" w:cs="Helvetica Neue"/>
+          <w:sz w:val="24"/>
+          <w:sz-cs w:val="24"/>
+          <w:spacing w:val="0"/>
+          <w:color w:val="181F26"/>
+        </w:rPr>
+        <w:t xml:space="preserve"> and Google's </w:t>
+      </w:r>
+      <w:r>
+        <w:rPr>
+          <w:rFonts w:ascii="Helvetica Neue" w:hAnsi="Helvetica Neue" w:cs="Helvetica Neue"/>
+          <w:sz w:val="24"/>
+          <w:sz-cs w:val="24"/>
+          <w:u w:val="single"/>
+          <w:spacing w:val="0"/>
+          <w:color w:val="0000E9"/>
+        </w:rPr>
+        <w:t xml:space="preserve">"A2A: A New Era of Agent Interoperability"</w:t>
+      </w:r>
+      <w:r>
+        <w:rPr>
+          <w:rFonts w:ascii="Helvetica Neue" w:hAnsi="Helvetica Neue" w:cs="Helvetica Neue"/>
+          <w:sz w:val="24"/>
+          <w:sz-cs w:val="24"/>
+          <w:spacing w:val="0"/>
+          <w:color w:val="181F26"/>
+        </w:rPr>
+        <w:t xml:space="preserve"> as the reference shape.</w:t>
+      </w:r>
+    </w:p>
+    <w:p>
+      <w:pPr>
+        <w:spacing w:after="240"/>
+      </w:pPr>
+      <w:r>
+        <w:rPr>
+          <w:rFonts w:ascii="Helvetica Neue" w:hAnsi="Helvetica Neue" w:cs="Helvetica Neue"/>
+          <w:sz w:val="24"/>
+          <w:sz-cs w:val="24"/>
+          <w:spacing w:val="0"/>
+          <w:color w:val="181F26"/>
+        </w:rPr>
+        <w:t xml:space="preserve">The distinction from the harness plane is intentional:</w:t>
+      </w:r>
+    </w:p>
+    <w:p>
+      <w:pPr>
+        <w:ind w:left="720" w:first-line="-720"/>
+      </w:pPr>
+      <w:r>
+        <w:rPr>
+          <w:rFonts w:ascii="Helvetica Neue" w:hAnsi="Helvetica Neue" w:cs="Helvetica Neue"/>
+          <w:sz w:val="24"/>
+          <w:sz-cs w:val="24"/>
+          <w:color w:val="181F26"/>
+        </w:rPr>
+        <w:t xml:space="preserve"/>
+        <w:tab/>
+        <w:t xml:space="preserve">•</w:t>
+        <w:tab/>
+        <w:t xml:space="preserve"/>
+      </w:r>
+      <w:r>
+        <w:rPr>
+          <w:rFonts w:ascii="Helvetica Neue" w:hAnsi="Helvetica Neue" w:cs="Helvetica Neue"/>
+          <w:sz w:val="24"/>
+          <w:sz-cs w:val="24"/>
+          <w:spacing w:val="0"/>
+          <w:color w:val="181F26"/>
+        </w:rPr>
+        <w:t xml:space="preserve">harness crossing changes execution surface semantics</w:t>
+      </w:r>
+    </w:p>
+    <w:p>
+      <w:pPr>
+        <w:ind w:left="720" w:first-line="-720"/>
+      </w:pPr>
+      <w:r>
+        <w:rPr>
+          <w:rFonts w:ascii="Helvetica Neue" w:hAnsi="Helvetica Neue" w:cs="Helvetica Neue"/>
+          <w:sz w:val="24"/>
+          <w:sz-cs w:val="24"/>
+          <w:color w:val="181F26"/>
+        </w:rPr>
+        <w:t xml:space="preserve"/>
+        <w:tab/>
+        <w:t xml:space="preserve">•</w:t>
+        <w:tab/>
+        <w:t xml:space="preserve"/>
+      </w:r>
+      <w:r>
+        <w:rPr>
+          <w:rFonts w:ascii="Helvetica Neue" w:hAnsi="Helvetica Neue" w:cs="Helvetica Neue"/>
+          <w:sz w:val="24"/>
+          <w:sz-cs w:val="24"/>
+          <w:spacing w:val="0"/>
+          <w:color w:val="181F26"/>
+        </w:rPr>
+        <w:t xml:space="preserve">remote-agent delegation crosses an authority boundary</w:t>
+      </w:r>
+    </w:p>
+    <w:p>
+      <w:pPr>
+        <w:ind w:left="720" w:first-line="-720"/>
+      </w:pPr>
+      <w:r>
+        <w:rPr>
+          <w:rFonts w:ascii="Helvetica Neue" w:hAnsi="Helvetica Neue" w:cs="Helvetica Neue"/>
+          <w:sz w:val="24"/>
+          <w:sz-cs w:val="24"/>
+          <w:color w:val="181F26"/>
+        </w:rPr>
+        <w:t xml:space="preserve"/>
+        <w:tab/>
+        <w:t xml:space="preserve">•</w:t>
+        <w:tab/>
+        <w:t xml:space="preserve"/>
+      </w:r>
+      <w:r>
+        <w:rPr>
+          <w:rFonts w:ascii="Helvetica Neue" w:hAnsi="Helvetica Neue" w:cs="Helvetica Neue"/>
+          <w:sz w:val="24"/>
+          <w:sz-cs w:val="24"/>
+          <w:spacing w:val="0"/>
+          <w:color w:val="181F26"/>
+        </w:rPr>
+        <w:t xml:space="preserve">remote delegation therefore requires treaty scope, delegation receipts, and frontier checkpoint evidence</w:t>
+      </w:r>
+    </w:p>
+    <w:p>
+      <w:pPr>
+        <w:spacing w:after="240"/>
+      </w:pPr>
+      <w:r>
+        <w:rPr>
+          <w:rFonts w:ascii="Helvetica Neue" w:hAnsi="Helvetica Neue" w:cs="Helvetica Neue"/>
+          <w:sz w:val="24"/>
+          <w:sz-cs w:val="24"/>
+          <w:spacing w:val="0"/>
+          <w:color w:val="181F26"/>
+        </w:rPr>
+        <w:t xml:space="preserve">Current </w:t>
+      </w:r>
+      <w:r>
+        <w:rPr>
+          <w:rFonts w:ascii="Menlo" w:hAnsi="Menlo" w:cs="Menlo"/>
+          <w:sz w:val="24"/>
+          <w:sz-cs w:val="24"/>
+          <w:spacing w:val="0"/>
+          <w:color w:val="181F26"/>
+        </w:rPr>
+        <w:t xml:space="preserve">P1i</w:t>
+      </w:r>
+      <w:r>
+        <w:rPr>
+          <w:rFonts w:ascii="Helvetica Neue" w:hAnsi="Helvetica Neue" w:cs="Helvetica Neue"/>
+          <w:sz w:val="24"/>
+          <w:sz-cs w:val="24"/>
+          <w:spacing w:val="0"/>
+          <w:color w:val="181F26"/>
+        </w:rPr>
+        <w:t xml:space="preserve"> rules:</w:t>
+      </w:r>
+    </w:p>
+    <w:p>
+      <w:pPr>
+        <w:ind w:left="720" w:first-line="-720"/>
+      </w:pPr>
+      <w:r>
+        <w:rPr>
+          <w:rFonts w:ascii="Helvetica Neue" w:hAnsi="Helvetica Neue" w:cs="Helvetica Neue"/>
+          <w:sz w:val="24"/>
+          <w:sz-cs w:val="24"/>
+          <w:color w:val="181F26"/>
+        </w:rPr>
+        <w:t xml:space="preserve"/>
+        <w:tab/>
+        <w:t xml:space="preserve">•</w:t>
+        <w:tab/>
+        <w:t xml:space="preserve"/>
+      </w:r>
+      <w:r>
+        <w:rPr>
+          <w:rFonts w:ascii="Helvetica Neue" w:hAnsi="Helvetica Neue" w:cs="Helvetica Neue"/>
+          <w:sz w:val="24"/>
+          <w:sz-cs w:val="24"/>
+          <w:spacing w:val="0"/>
+          <w:color w:val="181F26"/>
+        </w:rPr>
+        <w:t xml:space="preserve">outbound only</w:t>
+      </w:r>
+    </w:p>
+    <w:p>
+      <w:pPr>
+        <w:ind w:left="720" w:first-line="-720"/>
+      </w:pPr>
+      <w:r>
+        <w:rPr>
+          <w:rFonts w:ascii="Menlo" w:hAnsi="Menlo" w:cs="Menlo"/>
+          <w:sz w:val="24"/>
+          <w:sz-cs w:val="24"/>
+          <w:color w:val="181F26"/>
+        </w:rPr>
+        <w:t xml:space="preserve"/>
+        <w:tab/>
+        <w:t xml:space="preserve">•</w:t>
+        <w:tab/>
+        <w:t xml:space="preserve"/>
+      </w:r>
+      <w:r>
+        <w:rPr>
+          <w:rFonts w:ascii="Menlo" w:hAnsi="Menlo" w:cs="Menlo"/>
+          <w:sz w:val="24"/>
+          <w:sz-cs w:val="24"/>
+          <w:spacing w:val="0"/>
+          <w:color w:val="181F26"/>
+        </w:rPr>
+        <w:t xml:space="preserve">task.plan</w:t>
+      </w:r>
+      <w:r>
+        <w:rPr>
+          <w:rFonts w:ascii="Helvetica Neue" w:hAnsi="Helvetica Neue" w:cs="Helvetica Neue"/>
+          <w:sz w:val="24"/>
+          <w:sz-cs w:val="24"/>
+          <w:spacing w:val="0"/>
+          <w:color w:val="181F26"/>
+        </w:rPr>
+        <w:t xml:space="preserve"> only</w:t>
+      </w:r>
+    </w:p>
+    <w:p>
+      <w:pPr>
+        <w:ind w:left="720" w:first-line="-720"/>
+      </w:pPr>
+      <w:r>
+        <w:rPr>
+          <w:rFonts w:ascii="Helvetica Neue" w:hAnsi="Helvetica Neue" w:cs="Helvetica Neue"/>
+          <w:sz w:val="24"/>
+          <w:sz-cs w:val="24"/>
+          <w:color w:val="181F26"/>
+        </w:rPr>
+        <w:t xml:space="preserve"/>
+        <w:tab/>
+        <w:t xml:space="preserve">•</w:t>
+        <w:tab/>
+        <w:t xml:space="preserve"/>
+      </w:r>
+      <w:r>
+        <w:rPr>
+          <w:rFonts w:ascii="Helvetica Neue" w:hAnsi="Helvetica Neue" w:cs="Helvetica Neue"/>
+          <w:sz w:val="24"/>
+          <w:sz-cs w:val="24"/>
+          <w:spacing w:val="0"/>
+          <w:color w:val="181F26"/>
+        </w:rPr>
+        <w:t xml:space="preserve">one-hop delegation only</w:t>
+      </w:r>
+    </w:p>
+    <w:p>
+      <w:pPr>
+        <w:ind w:left="720" w:first-line="-720"/>
+      </w:pPr>
+      <w:r>
+        <w:rPr>
+          <w:rFonts w:ascii="Helvetica Neue" w:hAnsi="Helvetica Neue" w:cs="Helvetica Neue"/>
+          <w:sz w:val="24"/>
+          <w:sz-cs w:val="24"/>
+          <w:color w:val="181F26"/>
+        </w:rPr>
+        <w:t xml:space="preserve"/>
+        <w:tab/>
+        <w:t xml:space="preserve">•</w:t>
+        <w:tab/>
+        <w:t xml:space="preserve"/>
+      </w:r>
+      <w:r>
+        <w:rPr>
+          <w:rFonts w:ascii="Helvetica Neue" w:hAnsi="Helvetica Neue" w:cs="Helvetica Neue"/>
+          <w:sz w:val="24"/>
+          <w:sz-cs w:val="24"/>
+          <w:spacing w:val="0"/>
+          <w:color w:val="181F26"/>
+        </w:rPr>
+        <w:t xml:space="preserve">treaty required before dispatch</w:t>
+      </w:r>
+    </w:p>
+    <w:p>
+      <w:pPr>
+        <w:ind w:left="720" w:first-line="-720"/>
+      </w:pPr>
+      <w:r>
+        <w:rPr>
+          <w:rFonts w:ascii="Helvetica Neue" w:hAnsi="Helvetica Neue" w:cs="Helvetica Neue"/>
+          <w:sz w:val="24"/>
+          <w:sz-cs w:val="24"/>
+          <w:color w:val="181F26"/>
+        </w:rPr>
+        <w:t xml:space="preserve"/>
+        <w:tab/>
+        <w:t xml:space="preserve">•</w:t>
+        <w:tab/>
+        <w:t xml:space="preserve"/>
+      </w:r>
+      <w:r>
+        <w:rPr>
+          <w:rFonts w:ascii="Helvetica Neue" w:hAnsi="Helvetica Neue" w:cs="Helvetica Neue"/>
+          <w:sz w:val="24"/>
+          <w:sz-cs w:val="24"/>
+          <w:spacing w:val="0"/>
+          <w:color w:val="181F26"/>
+        </w:rPr>
+        <w:t xml:space="preserve">no in-task auth forwarding</w:t>
+      </w:r>
+    </w:p>
+    <w:p>
+      <w:pPr>
+        <w:ind w:left="720" w:first-line="-720"/>
+      </w:pPr>
+      <w:r>
+        <w:rPr>
+          <w:rFonts w:ascii="Helvetica Neue" w:hAnsi="Helvetica Neue" w:cs="Helvetica Neue"/>
+          <w:sz w:val="24"/>
+          <w:sz-cs w:val="24"/>
+          <w:color w:val="181F26"/>
+        </w:rPr>
+        <w:t xml:space="preserve"/>
+        <w:tab/>
+        <w:t xml:space="preserve">•</w:t>
+        <w:tab/>
+        <w:t xml:space="preserve"/>
+      </w:r>
+      <w:r>
+        <w:rPr>
+          <w:rFonts w:ascii="Helvetica Neue" w:hAnsi="Helvetica Neue" w:cs="Helvetica Neue"/>
+          <w:sz w:val="24"/>
+          <w:sz-cs w:val="24"/>
+          <w:spacing w:val="0"/>
+          <w:color w:val="181F26"/>
+        </w:rPr>
+        <w:t xml:space="preserve">no mutation over A2A</w:t>
+      </w:r>
+    </w:p>
+    <w:p>
+      <w:pPr>
+        <w:ind w:left="720" w:first-line="-720"/>
+      </w:pPr>
+      <w:r>
+        <w:rPr>
+          <w:rFonts w:ascii="Helvetica Neue" w:hAnsi="Helvetica Neue" w:cs="Helvetica Neue"/>
+          <w:sz w:val="24"/>
+          <w:sz-cs w:val="24"/>
+          <w:color w:val="181F26"/>
+        </w:rPr>
+        <w:t xml:space="preserve"/>
+        <w:tab/>
+        <w:t xml:space="preserve">•</w:t>
+        <w:tab/>
+        <w:t xml:space="preserve"/>
+      </w:r>
+      <w:r>
+        <w:rPr>
+          <w:rFonts w:ascii="Helvetica Neue" w:hAnsi="Helvetica Neue" w:cs="Helvetica Neue"/>
+          <w:sz w:val="24"/>
+          <w:sz-cs w:val="24"/>
+          <w:spacing w:val="0"/>
+          <w:color w:val="181F26"/>
+        </w:rPr>
+        <w:t xml:space="preserve">prefer streaming when available, otherwise submit plus poll</w:t>
+      </w:r>
+    </w:p>
+    <w:p>
+      <w:pPr>
+        <w:spacing w:after="240"/>
+      </w:pPr>
+      <w:r>
+        <w:rPr>
+          <w:rFonts w:ascii="Helvetica Neue" w:hAnsi="Helvetica Neue" w:cs="Helvetica Neue"/>
+          <w:sz w:val="24"/>
+          <w:sz-cs w:val="24"/>
+          <w:spacing w:val="0"/>
+          <w:color w:val="181F26"/>
+        </w:rPr>
+        <w:t xml:space="preserve">Remote state mapping is normalized into the normal Crawfish action model:</w:t>
+      </w:r>
+    </w:p>
+    <w:p>
+      <w:pPr>
+        <w:ind w:left="720" w:first-line="-720"/>
+      </w:pPr>
+      <w:r>
+        <w:rPr>
+          <w:rFonts w:ascii="Menlo" w:hAnsi="Menlo" w:cs="Menlo"/>
+          <w:sz w:val="24"/>
+          <w:sz-cs w:val="24"/>
+          <w:color w:val="181F26"/>
+        </w:rPr>
+        <w:t xml:space="preserve"/>
+        <w:tab/>
+        <w:t xml:space="preserve">•</w:t>
+        <w:tab/>
+        <w:t xml:space="preserve"/>
+      </w:r>
+      <w:r>
+        <w:rPr>
+          <w:rFonts w:ascii="Menlo" w:hAnsi="Menlo" w:cs="Menlo"/>
+          <w:sz w:val="24"/>
+          <w:sz-cs w:val="24"/>
+          <w:spacing w:val="0"/>
+          <w:color w:val="181F26"/>
+        </w:rPr>
+        <w:t xml:space="preserve">submitted</w:t>
+      </w:r>
+      <w:r>
+        <w:rPr>
+          <w:rFonts w:ascii="Helvetica Neue" w:hAnsi="Helvetica Neue" w:cs="Helvetica Neue"/>
+          <w:sz w:val="24"/>
+          <w:sz-cs w:val="24"/>
+          <w:spacing w:val="0"/>
+          <w:color w:val="181F26"/>
+        </w:rPr>
+        <w:t xml:space="preserve"> or </w:t>
+      </w:r>
+      <w:r>
+        <w:rPr>
+          <w:rFonts w:ascii="Menlo" w:hAnsi="Menlo" w:cs="Menlo"/>
+          <w:sz w:val="24"/>
+          <w:sz-cs w:val="24"/>
+          <w:spacing w:val="0"/>
+          <w:color w:val="181F26"/>
+        </w:rPr>
+        <w:t xml:space="preserve">working</w:t>
+      </w:r>
+      <w:r>
+        <w:rPr>
+          <w:rFonts w:ascii="Helvetica Neue" w:hAnsi="Helvetica Neue" w:cs="Helvetica Neue"/>
+          <w:sz w:val="24"/>
+          <w:sz-cs w:val="24"/>
+          <w:spacing w:val="0"/>
+          <w:color w:val="181F26"/>
+        </w:rPr>
+        <w:t xml:space="preserve"> -&gt; </w:t>
+      </w:r>
+      <w:r>
+        <w:rPr>
+          <w:rFonts w:ascii="Menlo" w:hAnsi="Menlo" w:cs="Menlo"/>
+          <w:sz w:val="24"/>
+          <w:sz-cs w:val="24"/>
+          <w:spacing w:val="0"/>
+          <w:color w:val="181F26"/>
+        </w:rPr>
+        <w:t xml:space="preserve">running</w:t>
+      </w:r>
+      <w:r>
+        <w:rPr>
+          <w:rFonts w:ascii="Helvetica Neue" w:hAnsi="Helvetica Neue" w:cs="Helvetica Neue"/>
+          <w:sz w:val="24"/>
+          <w:sz-cs w:val="24"/>
+          <w:spacing w:val="0"/>
+          <w:color w:val="181F26"/>
+        </w:rPr>
+        <w:t xml:space="preserve"/>
+      </w:r>
+    </w:p>
+    <w:p>
+      <w:pPr>
+        <w:ind w:left="720" w:first-line="-720"/>
+      </w:pPr>
+      <w:r>
+        <w:rPr>
+          <w:rFonts w:ascii="Menlo" w:hAnsi="Menlo" w:cs="Menlo"/>
+          <w:sz w:val="24"/>
+          <w:sz-cs w:val="24"/>
+          <w:color w:val="181F26"/>
+        </w:rPr>
+        <w:t xml:space="preserve"/>
+        <w:tab/>
+        <w:t xml:space="preserve">•</w:t>
+        <w:tab/>
+        <w:t xml:space="preserve"/>
+      </w:r>
+      <w:r>
+        <w:rPr>
+          <w:rFonts w:ascii="Menlo" w:hAnsi="Menlo" w:cs="Menlo"/>
+          <w:sz w:val="24"/>
+          <w:sz-cs w:val="24"/>
+          <w:spacing w:val="0"/>
+          <w:color w:val="181F26"/>
+        </w:rPr>
+        <w:t xml:space="preserve">input-required</w:t>
+      </w:r>
+      <w:r>
+        <w:rPr>
+          <w:rFonts w:ascii="Helvetica Neue" w:hAnsi="Helvetica Neue" w:cs="Helvetica Neue"/>
+          <w:sz w:val="24"/>
+          <w:sz-cs w:val="24"/>
+          <w:spacing w:val="0"/>
+          <w:color w:val="181F26"/>
+        </w:rPr>
+        <w:t xml:space="preserve"> -&gt; </w:t>
+      </w:r>
+      <w:r>
+        <w:rPr>
+          <w:rFonts w:ascii="Menlo" w:hAnsi="Menlo" w:cs="Menlo"/>
+          <w:sz w:val="24"/>
+          <w:sz-cs w:val="24"/>
+          <w:spacing w:val="0"/>
+          <w:color w:val="181F26"/>
+        </w:rPr>
+        <w:t xml:space="preserve">blocked</w:t>
+      </w:r>
+      <w:r>
+        <w:rPr>
+          <w:rFonts w:ascii="Helvetica Neue" w:hAnsi="Helvetica Neue" w:cs="Helvetica Neue"/>
+          <w:sz w:val="24"/>
+          <w:sz-cs w:val="24"/>
+          <w:spacing w:val="0"/>
+          <w:color w:val="181F26"/>
+        </w:rPr>
+        <w:t xml:space="preserve"/>
+      </w:r>
+    </w:p>
+    <w:p>
+      <w:pPr>
+        <w:ind w:left="720" w:first-line="-720"/>
+      </w:pPr>
+      <w:r>
+        <w:rPr>
+          <w:rFonts w:ascii="Menlo" w:hAnsi="Menlo" w:cs="Menlo"/>
+          <w:sz w:val="24"/>
+          <w:sz-cs w:val="24"/>
+          <w:color w:val="181F26"/>
+        </w:rPr>
+        <w:t xml:space="preserve"/>
+        <w:tab/>
+        <w:t xml:space="preserve">•</w:t>
+        <w:tab/>
+        <w:t xml:space="preserve"/>
+      </w:r>
+      <w:r>
+        <w:rPr>
+          <w:rFonts w:ascii="Menlo" w:hAnsi="Menlo" w:cs="Menlo"/>
+          <w:sz w:val="24"/>
+          <w:sz-cs w:val="24"/>
+          <w:spacing w:val="0"/>
+          <w:color w:val="181F26"/>
+        </w:rPr>
+        <w:t xml:space="preserve">auth-required</w:t>
+      </w:r>
+      <w:r>
+        <w:rPr>
+          <w:rFonts w:ascii="Helvetica Neue" w:hAnsi="Helvetica Neue" w:cs="Helvetica Neue"/>
+          <w:sz w:val="24"/>
+          <w:sz-cs w:val="24"/>
+          <w:spacing w:val="0"/>
+          <w:color w:val="181F26"/>
+        </w:rPr>
+        <w:t xml:space="preserve"> -&gt; </w:t>
+      </w:r>
+      <w:r>
+        <w:rPr>
+          <w:rFonts w:ascii="Menlo" w:hAnsi="Menlo" w:cs="Menlo"/>
+          <w:sz w:val="24"/>
+          <w:sz-cs w:val="24"/>
+          <w:spacing w:val="0"/>
+          <w:color w:val="181F26"/>
+        </w:rPr>
+        <w:t xml:space="preserve">awaiting_approval</w:t>
+      </w:r>
+      <w:r>
+        <w:rPr>
+          <w:rFonts w:ascii="Helvetica Neue" w:hAnsi="Helvetica Neue" w:cs="Helvetica Neue"/>
+          <w:sz w:val="24"/>
+          <w:sz-cs w:val="24"/>
+          <w:spacing w:val="0"/>
+          <w:color w:val="181F26"/>
+        </w:rPr>
+        <w:t xml:space="preserve"/>
+      </w:r>
+    </w:p>
+    <w:p>
+      <w:pPr>
+        <w:ind w:left="720" w:first-line="-720"/>
+      </w:pPr>
+      <w:r>
+        <w:rPr>
+          <w:rFonts w:ascii="Menlo" w:hAnsi="Menlo" w:cs="Menlo"/>
+          <w:sz w:val="24"/>
+          <w:sz-cs w:val="24"/>
+          <w:color w:val="181F26"/>
+        </w:rPr>
+        <w:t xml:space="preserve"/>
+        <w:tab/>
+        <w:t xml:space="preserve">•</w:t>
+        <w:tab/>
+        <w:t xml:space="preserve"/>
+      </w:r>
+      <w:r>
+        <w:rPr>
+          <w:rFonts w:ascii="Menlo" w:hAnsi="Menlo" w:cs="Menlo"/>
+          <w:sz w:val="24"/>
+          <w:sz-cs w:val="24"/>
+          <w:spacing w:val="0"/>
+          <w:color w:val="181F26"/>
+        </w:rPr>
+        <w:t xml:space="preserve">completed</w:t>
+      </w:r>
+      <w:r>
+        <w:rPr>
+          <w:rFonts w:ascii="Helvetica Neue" w:hAnsi="Helvetica Neue" w:cs="Helvetica Neue"/>
+          <w:sz w:val="24"/>
+          <w:sz-cs w:val="24"/>
+          <w:spacing w:val="0"/>
+          <w:color w:val="181F26"/>
+        </w:rPr>
+        <w:t xml:space="preserve"> -&gt; </w:t>
+      </w:r>
+      <w:r>
+        <w:rPr>
+          <w:rFonts w:ascii="Menlo" w:hAnsi="Menlo" w:cs="Menlo"/>
+          <w:sz w:val="24"/>
+          <w:sz-cs w:val="24"/>
+          <w:spacing w:val="0"/>
+          <w:color w:val="181F26"/>
+        </w:rPr>
+        <w:t xml:space="preserve">completed</w:t>
+      </w:r>
+      <w:r>
+        <w:rPr>
+          <w:rFonts w:ascii="Helvetica Neue" w:hAnsi="Helvetica Neue" w:cs="Helvetica Neue"/>
+          <w:sz w:val="24"/>
+          <w:sz-cs w:val="24"/>
+          <w:spacing w:val="0"/>
+          <w:color w:val="181F26"/>
+        </w:rPr>
+        <w:t xml:space="preserve"/>
+      </w:r>
+    </w:p>
+    <w:p>
+      <w:pPr>
+        <w:ind w:left="720" w:first-line="-720"/>
+      </w:pPr>
+      <w:r>
+        <w:rPr>
+          <w:rFonts w:ascii="Menlo" w:hAnsi="Menlo" w:cs="Menlo"/>
+          <w:sz w:val="24"/>
+          <w:sz-cs w:val="24"/>
+          <w:color w:val="181F26"/>
+        </w:rPr>
+        <w:t xml:space="preserve"/>
+        <w:tab/>
+        <w:t xml:space="preserve">•</w:t>
+        <w:tab/>
+        <w:t xml:space="preserve"/>
+      </w:r>
+      <w:r>
+        <w:rPr>
+          <w:rFonts w:ascii="Menlo" w:hAnsi="Menlo" w:cs="Menlo"/>
+          <w:sz w:val="24"/>
+          <w:sz-cs w:val="24"/>
+          <w:spacing w:val="0"/>
+          <w:color w:val="181F26"/>
+        </w:rPr>
+        <w:t xml:space="preserve">failed</w:t>
+      </w:r>
+      <w:r>
+        <w:rPr>
+          <w:rFonts w:ascii="Helvetica Neue" w:hAnsi="Helvetica Neue" w:cs="Helvetica Neue"/>
+          <w:sz w:val="24"/>
+          <w:sz-cs w:val="24"/>
+          <w:spacing w:val="0"/>
+          <w:color w:val="181F26"/>
+        </w:rPr>
+        <w:t xml:space="preserve">, </w:t>
+      </w:r>
+      <w:r>
+        <w:rPr>
+          <w:rFonts w:ascii="Menlo" w:hAnsi="Menlo" w:cs="Menlo"/>
+          <w:sz w:val="24"/>
+          <w:sz-cs w:val="24"/>
+          <w:spacing w:val="0"/>
+          <w:color w:val="181F26"/>
+        </w:rPr>
+        <w:t xml:space="preserve">rejected</w:t>
+      </w:r>
+      <w:r>
+        <w:rPr>
+          <w:rFonts w:ascii="Helvetica Neue" w:hAnsi="Helvetica Neue" w:cs="Helvetica Neue"/>
+          <w:sz w:val="24"/>
+          <w:sz-cs w:val="24"/>
+          <w:spacing w:val="0"/>
+          <w:color w:val="181F26"/>
+        </w:rPr>
+        <w:t xml:space="preserve">, or </w:t>
+      </w:r>
+      <w:r>
+        <w:rPr>
+          <w:rFonts w:ascii="Menlo" w:hAnsi="Menlo" w:cs="Menlo"/>
+          <w:sz w:val="24"/>
+          <w:sz-cs w:val="24"/>
+          <w:spacing w:val="0"/>
+          <w:color w:val="181F26"/>
+        </w:rPr>
+        <w:t xml:space="preserve">canceled</w:t>
+      </w:r>
+      <w:r>
+        <w:rPr>
+          <w:rFonts w:ascii="Helvetica Neue" w:hAnsi="Helvetica Neue" w:cs="Helvetica Neue"/>
+          <w:sz w:val="24"/>
+          <w:sz-cs w:val="24"/>
+          <w:spacing w:val="0"/>
+          <w:color w:val="181F26"/>
+        </w:rPr>
+        <w:t xml:space="preserve"> -&gt; </w:t>
+      </w:r>
+      <w:r>
+        <w:rPr>
+          <w:rFonts w:ascii="Menlo" w:hAnsi="Menlo" w:cs="Menlo"/>
+          <w:sz w:val="24"/>
+          <w:sz-cs w:val="24"/>
+          <w:spacing w:val="0"/>
+          <w:color w:val="181F26"/>
+        </w:rPr>
+        <w:t xml:space="preserve">failed</w:t>
+      </w:r>
+      <w:r>
+        <w:rPr>
+          <w:rFonts w:ascii="Helvetica Neue" w:hAnsi="Helvetica Neue" w:cs="Helvetica Neue"/>
+          <w:sz w:val="24"/>
+          <w:sz-cs w:val="24"/>
+          <w:spacing w:val="0"/>
+          <w:color w:val="181F26"/>
+        </w:rPr>
+        <w:t xml:space="preserve"/>
+      </w:r>
+    </w:p>
+    <w:p>
+      <w:pPr>
+        <w:spacing w:after="240"/>
+      </w:pPr>
+      <w:r>
+        <w:rPr>
+          <w:rFonts w:ascii="Helvetica Neue" w:hAnsi="Helvetica Neue" w:cs="Helvetica Neue"/>
+          <w:sz w:val="24"/>
+          <w:sz-cs w:val="24"/>
+          <w:spacing w:val="0"/>
+          <w:color w:val="181F26"/>
+        </w:rPr>
+        <w:t xml:space="preserve">Remote lineage remains inspectable through:</w:t>
+      </w:r>
+    </w:p>
+    <w:p>
+      <w:pPr>
+        <w:ind w:left="720" w:first-line="-720"/>
+      </w:pPr>
+      <w:r>
+        <w:rPr>
+          <w:rFonts w:ascii="Helvetica Neue" w:hAnsi="Helvetica Neue" w:cs="Helvetica Neue"/>
+          <w:sz w:val="24"/>
+          <w:sz-cs w:val="24"/>
+          <w:color w:val="181F26"/>
+        </w:rPr>
+        <w:t xml:space="preserve"/>
+        <w:tab/>
+        <w:t xml:space="preserve">•</w:t>
+        <w:tab/>
+        <w:t xml:space="preserve"/>
+      </w:r>
+      <w:r>
+        <w:rPr>
+          <w:rFonts w:ascii="Helvetica Neue" w:hAnsi="Helvetica Neue" w:cs="Helvetica Neue"/>
+          <w:sz w:val="24"/>
+          <w:sz-cs w:val="24"/>
+          <w:spacing w:val="0"/>
+          <w:color w:val="181F26"/>
+        </w:rPr>
+        <w:t xml:space="preserve">remote principal</w:t>
+      </w:r>
+    </w:p>
+    <w:p>
+      <w:pPr>
+        <w:ind w:left="720" w:first-line="-720"/>
+      </w:pPr>
+      <w:r>
+        <w:rPr>
+          <w:rFonts w:ascii="Helvetica Neue" w:hAnsi="Helvetica Neue" w:cs="Helvetica Neue"/>
+          <w:sz w:val="24"/>
+          <w:sz-cs w:val="24"/>
+          <w:color w:val="181F26"/>
+        </w:rPr>
+        <w:t xml:space="preserve"/>
+        <w:tab/>
+        <w:t xml:space="preserve">•</w:t>
+        <w:tab/>
+        <w:t xml:space="preserve"/>
+      </w:r>
+      <w:r>
+        <w:rPr>
+          <w:rFonts w:ascii="Helvetica Neue" w:hAnsi="Helvetica Neue" w:cs="Helvetica Neue"/>
+          <w:sz w:val="24"/>
+          <w:sz-cs w:val="24"/>
+          <w:spacing w:val="0"/>
+          <w:color w:val="181F26"/>
+        </w:rPr>
+        <w:t xml:space="preserve">remote task id</w:t>
+      </w:r>
+    </w:p>
+    <w:p>
+      <w:pPr>
+        <w:ind w:left="720" w:first-line="-720"/>
+      </w:pPr>
+      <w:r>
+        <w:rPr>
+          <w:rFonts w:ascii="Helvetica Neue" w:hAnsi="Helvetica Neue" w:cs="Helvetica Neue"/>
+          <w:sz w:val="24"/>
+          <w:sz-cs w:val="24"/>
+          <w:color w:val="181F26"/>
+        </w:rPr>
+        <w:t xml:space="preserve"/>
+        <w:tab/>
+        <w:t xml:space="preserve">•</w:t>
+        <w:tab/>
+        <w:t xml:space="preserve"/>
+      </w:r>
+      <w:r>
+        <w:rPr>
+          <w:rFonts w:ascii="Helvetica Neue" w:hAnsi="Helvetica Neue" w:cs="Helvetica Neue"/>
+          <w:sz w:val="24"/>
+          <w:sz-cs w:val="24"/>
+          <w:spacing w:val="0"/>
+          <w:color w:val="181F26"/>
+        </w:rPr>
+        <w:t xml:space="preserve">treaty pack</w:t>
+      </w:r>
+    </w:p>
+    <w:p>
+      <w:pPr>
+        <w:ind w:left="720" w:first-line="-720"/>
+      </w:pPr>
+      <w:r>
+        <w:rPr>
+          <w:rFonts w:ascii="Helvetica Neue" w:hAnsi="Helvetica Neue" w:cs="Helvetica Neue"/>
+          <w:sz w:val="24"/>
+          <w:sz-cs w:val="24"/>
+          <w:color w:val="181F26"/>
+        </w:rPr>
+        <w:t xml:space="preserve"/>
+        <w:tab/>
+        <w:t xml:space="preserve">•</w:t>
+        <w:tab/>
+        <w:t xml:space="preserve"/>
+      </w:r>
+      <w:r>
+        <w:rPr>
+          <w:rFonts w:ascii="Helvetica Neue" w:hAnsi="Helvetica Neue" w:cs="Helvetica Neue"/>
+          <w:sz w:val="24"/>
+          <w:sz-cs w:val="24"/>
+          <w:spacing w:val="0"/>
+          <w:color w:val="181F26"/>
+        </w:rPr>
+        <w:t xml:space="preserve">delegation receipt</w:t>
+      </w:r>
+    </w:p>
+    <w:p>
+      <w:pPr>
+        <w:ind w:left="720" w:first-line="-720"/>
+      </w:pPr>
+      <w:r>
+        <w:rPr>
+          <w:rFonts w:ascii="Helvetica Neue" w:hAnsi="Helvetica Neue" w:cs="Helvetica Neue"/>
+          <w:sz w:val="24"/>
+          <w:sz-cs w:val="24"/>
+          <w:color w:val="181F26"/>
+        </w:rPr>
+        <w:t xml:space="preserve"/>
+        <w:tab/>
+        <w:t xml:space="preserve">•</w:t>
+        <w:tab/>
+        <w:t xml:space="preserve"/>
+      </w:r>
+      <w:r>
+        <w:rPr>
+          <w:rFonts w:ascii="Helvetica Neue" w:hAnsi="Helvetica Neue" w:cs="Helvetica Neue"/>
+          <w:sz w:val="24"/>
+          <w:sz-cs w:val="24"/>
+          <w:spacing w:val="0"/>
+          <w:color w:val="181F26"/>
+        </w:rPr>
+        <w:t xml:space="preserve">doctrine checkpoint status</w:t>
+      </w:r>
+    </w:p>
+    <w:p>
+      <w:pPr>
+        <w:spacing w:after="197"/>
+      </w:pPr>
+      <w:r>
+        <w:rPr>
+          <w:rFonts w:ascii="Helvetica Neue" w:hAnsi="Helvetica Neue" w:cs="Helvetica Neue"/>
+          <w:sz w:val="44"/>
+          <w:sz-cs w:val="44"/>
+          <w:b/>
+          <w:spacing w:val="0"/>
+          <w:color w:val="102C4B"/>
+        </w:rPr>
         <w:t xml:space="preserve">Execution Strategies</w:t>
       </w:r>
     </w:p>
@@ -41400,7 +42865,7 @@
           <w:spacing w:val="0"/>
           <w:color w:val="181F26"/>
         </w:rPr>
-        <w:t xml:space="preserve">MCP in P0, OpenClaw inbound and outbound in P1, ACP-compatible harness adapters and A2A deferred</w:t>
+        <w:t xml:space="preserve">MCP in P0, OpenClaw inbound/outbound and A2A outbound in P1, ACP-compatible harness adapters phased after</w:t>
       </w:r>
     </w:p>
     <w:p>
@@ -47499,6 +48964,54 @@
           <w:spacing w:val="0"/>
           <w:color w:val="181F26"/>
         </w:rPr>
+        <w:t xml:space="preserve">A2A outbound remote-agent delegation for treaty-governed </w:t>
+      </w:r>
+      <w:r>
+        <w:rPr>
+          <w:rFonts w:ascii="Menlo" w:hAnsi="Menlo" w:cs="Menlo"/>
+          <w:sz w:val="24"/>
+          <w:sz-cs w:val="24"/>
+          <w:spacing w:val="0"/>
+          <w:color w:val="181F26"/>
+        </w:rPr>
+        <w:t xml:space="preserve">task.plan</w:t>
+      </w:r>
+      <w:r>
+        <w:rPr>
+          <w:rFonts w:ascii="Helvetica Neue" w:hAnsi="Helvetica Neue" w:cs="Helvetica Neue"/>
+          <w:sz w:val="24"/>
+          <w:sz-cs w:val="24"/>
+          <w:spacing w:val="0"/>
+          <w:color w:val="181F26"/>
+        </w:rPr>
+        <w:t xml:space="preserve"/>
+      </w:r>
+    </w:p>
+    <w:p>
+      <w:pPr>
+        <w:ind w:left="720" w:first-line="-720"/>
+      </w:pPr>
+      <w:r>
+        <w:rPr>
+          <w:rFonts w:ascii="Helvetica Neue" w:hAnsi="Helvetica Neue" w:cs="Helvetica Neue"/>
+          <w:sz w:val="24"/>
+          <w:sz-cs w:val="24"/>
+          <w:color w:val="181F26"/>
+        </w:rPr>
+        <w:t xml:space="preserve"/>
+        <w:tab/>
+        <w:t xml:space="preserve">•</w:t>
+        <w:tab/>
+        <w:t xml:space="preserve"/>
+      </w:r>
+      <w:r>
+        <w:rPr>
+          <w:rFonts w:ascii="Helvetica Neue" w:hAnsi="Helvetica Neue" w:cs="Helvetica Neue"/>
+          <w:sz w:val="24"/>
+          <w:sz-cs w:val="24"/>
+          <w:spacing w:val="0"/>
+          <w:color w:val="181F26"/>
+        </w:rPr>
         <w:t xml:space="preserve">verified execution strategies beyond </w:t>
       </w:r>
       <w:r>
@@ -47604,34 +49117,6 @@
           <w:color w:val="181F26"/>
         </w:rPr>
         <w:t xml:space="preserve">ACPX-like harness router or broker integration pattern</w:t>
-      </w:r>
-    </w:p>
-    <w:p>
-      <w:pPr>
-        <w:ind w:left="720" w:first-line="-720"/>
-      </w:pPr>
-      <w:r>
-        <w:rPr>
-          <w:rFonts w:ascii="Helvetica Neue" w:hAnsi="Helvetica Neue" w:cs="Helvetica Neue"/>
-          <w:sz w:val="24"/>
-          <w:sz-cs w:val="24"/>
-          <w:color w:val="181F26"/>
-        </w:rPr>
-        <w:t xml:space="preserve"/>
-        <w:tab/>
-        <w:t xml:space="preserve">•</w:t>
-        <w:tab/>
-        <w:t xml:space="preserve"/>
-      </w:r>
-      <w:r>
-        <w:rPr>
-          <w:rFonts w:ascii="Helvetica Neue" w:hAnsi="Helvetica Neue" w:cs="Helvetica Neue"/>
-          <w:sz w:val="24"/>
-          <w:sz-cs w:val="24"/>
-          <w:spacing w:val="0"/>
-          <w:color w:val="181F26"/>
-        </w:rPr>
-        <w:t xml:space="preserve">A2A connector with policy-preserving remote delegation</w:t>
       </w:r>
     </w:p>
     <w:p>
@@ -48139,35 +49624,35 @@
           <w:spacing w:val="0"/>
           <w:color w:val="181F26"/>
         </w:rPr>
-        <w:t xml:space="preserve">ACP or A2A execution in production paths</w:t>
-      </w:r>
-    </w:p>
-    <w:p>
-      <w:pPr>
-        <w:ind w:left="720" w:first-line="-720"/>
-      </w:pPr>
-      <w:r>
-        <w:rPr>
-          <w:rFonts w:ascii="Helvetica Neue" w:hAnsi="Helvetica Neue" w:cs="Helvetica Neue"/>
-          <w:sz w:val="24"/>
-          <w:sz-cs w:val="24"/>
-          <w:color w:val="181F26"/>
-        </w:rPr>
-        <w:t xml:space="preserve"/>
-        <w:tab/>
-        <w:t xml:space="preserve">•</w:t>
-        <w:tab/>
-        <w:t xml:space="preserve"/>
-      </w:r>
-      <w:r>
-        <w:rPr>
-          <w:rFonts w:ascii="Helvetica Neue" w:hAnsi="Helvetica Neue" w:cs="Helvetica Neue"/>
-          <w:sz w:val="24"/>
-          <w:sz-cs w:val="24"/>
-          <w:spacing w:val="0"/>
-          <w:color w:val="181F26"/>
-        </w:rPr>
         <w:t xml:space="preserve">broader OpenClaw production semantics such as sticky sessions, openclaw-managed workspaces, or action-level cancel and remote resume</w:t>
+      </w:r>
+    </w:p>
+    <w:p>
+      <w:pPr>
+        <w:ind w:left="720" w:first-line="-720"/>
+      </w:pPr>
+      <w:r>
+        <w:rPr>
+          <w:rFonts w:ascii="Helvetica Neue" w:hAnsi="Helvetica Neue" w:cs="Helvetica Neue"/>
+          <w:sz w:val="24"/>
+          <w:sz-cs w:val="24"/>
+          <w:color w:val="181F26"/>
+        </w:rPr>
+        <w:t xml:space="preserve"/>
+        <w:tab/>
+        <w:t xml:space="preserve">•</w:t>
+        <w:tab/>
+        <w:t xml:space="preserve"/>
+      </w:r>
+      <w:r>
+        <w:rPr>
+          <w:rFonts w:ascii="Helvetica Neue" w:hAnsi="Helvetica Neue" w:cs="Helvetica Neue"/>
+          <w:sz w:val="24"/>
+          <w:sz-cs w:val="24"/>
+          <w:spacing w:val="0"/>
+          <w:color w:val="181F26"/>
+        </w:rPr>
+        <w:t xml:space="preserve">A2A inbound server behavior, multi-hop delegation, mutation over A2A, or secret forwarding</w:t>
       </w:r>
     </w:p>
     <w:p>
@@ -48891,7 +50376,7 @@
           <w:spacing w:val="0"/>
           <w:color w:val="181F26"/>
         </w:rPr>
-        <w:t xml:space="preserve">, can route into OpenClaw or another harness and run under a verified execution strategy when deterministic proof is required</w:t>
+        <w:t xml:space="preserve">, can route into local harnesses, treaty-governed remote A2A agents, or OpenClaw and still run under the same verified execution strategy when deterministic proof is required</w:t>
       </w:r>
     </w:p>
     <w:p>

</xml_diff>